<commit_message>
Starting a markdown to put this all together
</commit_message>
<xml_diff>
--- a/Docs/Working_SMH2.docx
+++ b/Docs/Working_SMH2.docx
@@ -71,9 +71,6 @@
         <w:pStyle w:val="font-claude-response-body"/>
         <w:spacing w:line="480" w:lineRule="auto"/>
         <w:ind w:firstLine="360"/>
-        <w:rPr>
-          <w:rFonts w:ascii="Garamond" w:hAnsi="Garamond"/>
-        </w:rPr>
       </w:pPr>
       <w:r>
         <w:rPr>
@@ -155,10 +152,50 @@
         <w:t xml:space="preserve"> </w:t>
       </w:r>
       <w:r>
-        <w:t>Effective restoration of degraded ecosystems at scale requires an understanding of the processes that promote resilience and maintain reliable ecosystem resource delivery</w:t>
-      </w:r>
+        <w:t xml:space="preserve">Human impacts, alongside climate change related changes to local climate conditions, have created systems which are poorly </w:t>
+      </w:r>
+      <w:proofErr w:type="spellStart"/>
+      <w:r>
+        <w:t>equipt</w:t>
+      </w:r>
+      <w:proofErr w:type="spellEnd"/>
+      <w:r>
+        <w:t xml:space="preserve"> to adapt and do not reliably deliver ecosystem services. However, there are efforts to develop strategies to restore healthy and </w:t>
+      </w:r>
+      <w:proofErr w:type="spellStart"/>
+      <w:r>
+        <w:t>resilliant</w:t>
+      </w:r>
+      <w:proofErr w:type="spellEnd"/>
+      <w:r>
+        <w:t xml:space="preserve"> salmon </w:t>
+      </w:r>
+      <w:proofErr w:type="spellStart"/>
+      <w:r>
+        <w:t>ecossytems</w:t>
+      </w:r>
+      <w:proofErr w:type="spellEnd"/>
+      <w:r>
+        <w:t xml:space="preserve"> throughout their range. To do so as scale requires an understanding of the processes that </w:t>
+      </w:r>
+      <w:r>
+        <w:t>processes that promote resilience and maintain reliable ecosystem resource delivery</w:t>
+      </w:r>
+      <w:r>
+        <w:t xml:space="preserve"> in systems that are presumed to be relatively </w:t>
+      </w:r>
+      <w:proofErr w:type="spellStart"/>
+      <w:proofErr w:type="gramStart"/>
+      <w:r>
+        <w:t>in tact</w:t>
+      </w:r>
+      <w:proofErr w:type="spellEnd"/>
+      <w:proofErr w:type="gramEnd"/>
       <w:r>
         <w:t xml:space="preserve">. </w:t>
+      </w:r>
+      <w:r>
+        <w:t xml:space="preserve"> </w:t>
       </w:r>
     </w:p>
     <w:p>
@@ -224,7 +261,14 @@
         <w:rPr>
           <w:rFonts w:ascii="Garamond" w:hAnsi="Garamond"/>
         </w:rPr>
-        <w:t xml:space="preserve">habitat patches that differ in their suitability at any given time. </w:t>
+        <w:t xml:space="preserve">habitat patches that differ in their </w:t>
+      </w:r>
+      <w:r>
+        <w:rPr>
+          <w:rFonts w:ascii="Garamond" w:hAnsi="Garamond"/>
+        </w:rPr>
+        <w:lastRenderedPageBreak/>
+        <w:t xml:space="preserve">suitability at any given time. </w:t>
       </w:r>
       <w:r>
         <w:rPr>
@@ -248,14 +292,7 @@
         <w:rPr>
           <w:rFonts w:ascii="Garamond" w:hAnsi="Garamond"/>
         </w:rPr>
-        <w:t xml:space="preserve">substantial variation in habitat suitability can occur even among spatially proximate reaches. For example, a single precipitation event may produce hydrological conditions that are unsuitable for spawning in </w:t>
-      </w:r>
-      <w:r>
-        <w:rPr>
-          <w:rFonts w:ascii="Garamond" w:hAnsi="Garamond"/>
-        </w:rPr>
-        <w:lastRenderedPageBreak/>
-        <w:t xml:space="preserve">one tributary </w:t>
+        <w:t xml:space="preserve">substantial variation in habitat suitability can occur even among spatially proximate reaches. For example, a single precipitation event may produce hydrological conditions that are unsuitable for spawning in one tributary </w:t>
       </w:r>
       <w:r>
         <w:rPr>
@@ -502,7 +539,14 @@
         <w:rPr>
           <w:rFonts w:ascii="Garamond" w:hAnsi="Garamond"/>
         </w:rPr>
-        <w:t xml:space="preserve">This “diversification” maximizes the likelihood that suitable habitat conditions exist in some combination across the landscape under several potential environmental scenarios, thereby buffering aggregate population returns to conditions which are suboptimal for some portion of the population. </w:t>
+        <w:t xml:space="preserve">This “diversification” maximizes the likelihood that suitable habitat conditions exist in some combination across the landscape under several potential environmental scenarios, thereby </w:t>
+      </w:r>
+      <w:r>
+        <w:rPr>
+          <w:rFonts w:ascii="Garamond" w:hAnsi="Garamond"/>
+        </w:rPr>
+        <w:lastRenderedPageBreak/>
+        <w:t xml:space="preserve">buffering aggregate population returns to conditions which are suboptimal for some portion of the population. </w:t>
       </w:r>
     </w:p>
     <w:p>

</xml_diff>

<commit_message>
reworked intro first paragraph
</commit_message>
<xml_diff>
--- a/Docs/Working_SMH2.docx
+++ b/Docs/Working_SMH2.docx
@@ -76,22 +76,55 @@
         <w:rPr>
           <w:rFonts w:ascii="Garamond" w:hAnsi="Garamond"/>
         </w:rPr>
-        <w:t>Developing effective strategies to sustain healthy ecosystem function and restore it in degraded systems requires a clear understanding of the ecological processes operating in intact ecosystems.</w:t>
-      </w:r>
-      <w:r>
+        <w:t xml:space="preserve">Effective restoration of </w:t>
+      </w:r>
+      <w:r>
+        <w:rPr>
+          <w:rFonts w:ascii="Garamond" w:hAnsi="Garamond"/>
+        </w:rPr>
+        <w:t xml:space="preserve">aquatic </w:t>
+      </w:r>
+      <w:r>
+        <w:rPr>
+          <w:rFonts w:ascii="Garamond" w:hAnsi="Garamond"/>
+        </w:rPr>
+        <w:t>ecosystems depends on a clear understanding of the ecological processes that sustain healthy, intact systems. However, as the effects of human resource use and climate change intensify, healthy and fully functioning ecosystems are becoming increasingly rare as their global extent continues to decline.</w:t>
+      </w:r>
+      <w:r>
+        <w:rPr>
+          <w:rFonts w:ascii="Garamond" w:hAnsi="Garamond"/>
+        </w:rPr>
         <w:t xml:space="preserve"> </w:t>
       </w:r>
       <w:r>
         <w:rPr>
           <w:rFonts w:ascii="Garamond" w:hAnsi="Garamond"/>
         </w:rPr>
-        <w:t xml:space="preserve">However, intact and healthy functioning ecosystems are increasingly difficult to observe as their global extent diminishes. </w:t>
-      </w:r>
-      <w:r>
-        <w:rPr>
-          <w:rFonts w:ascii="Garamond" w:hAnsi="Garamond"/>
-        </w:rPr>
-        <w:t>Ecosystems that support Pacific salmon (</w:t>
+        <w:t>North America</w:t>
+      </w:r>
+      <w:r>
+        <w:rPr>
+          <w:rFonts w:ascii="Garamond" w:hAnsi="Garamond"/>
+        </w:rPr>
+        <w:t xml:space="preserve"> freshwater ecosystems</w:t>
+      </w:r>
+      <w:r>
+        <w:rPr>
+          <w:rFonts w:ascii="Garamond" w:hAnsi="Garamond"/>
+        </w:rPr>
+        <w:t xml:space="preserve"> have been affected by widespread changes to habitat quality and hydrological connectivity in recent decades, leading to declines in species that rely on healthy, free-flowing systems</w:t>
+      </w:r>
+      <w:r>
+        <w:rPr>
+          <w:rFonts w:ascii="Garamond" w:hAnsi="Garamond"/>
+        </w:rPr>
+        <w:t xml:space="preserve">. </w:t>
+      </w:r>
+      <w:r>
+        <w:rPr>
+          <w:rFonts w:ascii="Garamond" w:hAnsi="Garamond"/>
+        </w:rPr>
+        <w:t>Pacific salmon (</w:t>
       </w:r>
       <w:r>
         <w:rPr>
@@ -104,98 +137,112 @@
         <w:rPr>
           <w:rFonts w:ascii="Garamond" w:hAnsi="Garamond"/>
         </w:rPr>
-        <w:t>) have been affected by widespread habitat degradation and alterations to hydrological regimes across much of their range.</w:t>
-      </w:r>
-      <w:r>
-        <w:rPr>
-          <w:rFonts w:ascii="Garamond" w:hAnsi="Garamond"/>
-        </w:rPr>
-        <w:t xml:space="preserve"> As h</w:t>
-      </w:r>
-      <w:r>
-        <w:rPr>
-          <w:rFonts w:ascii="Garamond" w:hAnsi="Garamond"/>
-        </w:rPr>
-        <w:t xml:space="preserve">uman development </w:t>
-      </w:r>
-      <w:r>
-        <w:rPr>
-          <w:rFonts w:ascii="Garamond" w:hAnsi="Garamond"/>
-        </w:rPr>
-        <w:t>continues to expand</w:t>
-      </w:r>
-      <w:r>
-        <w:rPr>
-          <w:rFonts w:ascii="Garamond" w:hAnsi="Garamond"/>
-        </w:rPr>
-        <w:t xml:space="preserve">, </w:t>
-      </w:r>
-      <w:r>
-        <w:rPr>
-          <w:rFonts w:ascii="Garamond" w:hAnsi="Garamond"/>
-        </w:rPr>
-        <w:t xml:space="preserve">so too do the </w:t>
-      </w:r>
-      <w:r>
-        <w:rPr>
-          <w:rFonts w:ascii="Garamond" w:hAnsi="Garamond"/>
-        </w:rPr>
-        <w:t>consequences for the functioning of salmon ecosystems</w:t>
-      </w:r>
-      <w:r>
-        <w:rPr>
-          <w:rFonts w:ascii="Garamond" w:hAnsi="Garamond"/>
-        </w:rPr>
-        <w:t>.</w:t>
-      </w:r>
-      <w:r>
+        <w:t>) are particularly vulnerable to changes in habitat quality and connectivity because they depend on access to multiple, distinct habitat types within fully connected river networks to complete their life cycle.</w:t>
+      </w:r>
+      <w:r>
+        <w:rPr>
+          <w:rFonts w:ascii="Garamond" w:hAnsi="Garamond"/>
+        </w:rPr>
         <w:t xml:space="preserve"> </w:t>
       </w:r>
       <w:r>
-        <w:t xml:space="preserve">Human impacts, alongside climate change related changes to local climate conditions, have created systems which are poorly </w:t>
-      </w:r>
-      <w:proofErr w:type="spellStart"/>
-      <w:r>
-        <w:t>equipt</w:t>
-      </w:r>
-      <w:proofErr w:type="spellEnd"/>
-      <w:r>
-        <w:t xml:space="preserve"> to adapt and do not reliably deliver ecosystem services. However, there are efforts to develop strategies to restore healthy and </w:t>
-      </w:r>
-      <w:proofErr w:type="spellStart"/>
-      <w:r>
-        <w:t>resilliant</w:t>
-      </w:r>
-      <w:proofErr w:type="spellEnd"/>
-      <w:r>
-        <w:t xml:space="preserve"> salmon </w:t>
-      </w:r>
-      <w:proofErr w:type="spellStart"/>
-      <w:r>
-        <w:t>ecossytems</w:t>
-      </w:r>
-      <w:proofErr w:type="spellEnd"/>
-      <w:r>
-        <w:t xml:space="preserve"> throughout their range. To do so as scale requires an understanding of the processes that </w:t>
-      </w:r>
-      <w:r>
-        <w:t>processes that promote resilience and maintain reliable ecosystem resource delivery</w:t>
-      </w:r>
-      <w:r>
-        <w:t xml:space="preserve"> in systems that are presumed to be relatively </w:t>
-      </w:r>
-      <w:proofErr w:type="spellStart"/>
-      <w:proofErr w:type="gramStart"/>
-      <w:r>
-        <w:t>in tact</w:t>
-      </w:r>
-      <w:proofErr w:type="spellEnd"/>
-      <w:proofErr w:type="gramEnd"/>
-      <w:r>
-        <w:t xml:space="preserve">. </w:t>
-      </w:r>
-      <w:r>
+        <w:rPr>
+          <w:rFonts w:ascii="Garamond" w:hAnsi="Garamond"/>
+        </w:rPr>
+        <w:t>Many populations of Pacific salmon have experienced precipitous and sustained declines, particularly at the southern extent of their range, where the combined effects of human development and climate change have been most pronounced.</w:t>
+      </w:r>
+      <w:r>
+        <w:rPr>
+          <w:rFonts w:ascii="Garamond" w:hAnsi="Garamond"/>
+        </w:rPr>
+        <w:t xml:space="preserve"> S</w:t>
+      </w:r>
+      <w:r>
+        <w:rPr>
+          <w:rFonts w:ascii="Garamond" w:hAnsi="Garamond"/>
+        </w:rPr>
+        <w:t xml:space="preserve">almon are </w:t>
+      </w:r>
+      <w:r>
+        <w:rPr>
+          <w:rFonts w:ascii="Garamond" w:hAnsi="Garamond"/>
+        </w:rPr>
+        <w:t xml:space="preserve">an important </w:t>
+      </w:r>
+      <w:r>
+        <w:rPr>
+          <w:rFonts w:ascii="Garamond" w:hAnsi="Garamond"/>
+        </w:rPr>
+        <w:t xml:space="preserve">cultural, subsistence, and economic </w:t>
+      </w:r>
+      <w:r>
+        <w:rPr>
+          <w:rFonts w:ascii="Garamond" w:hAnsi="Garamond"/>
+        </w:rPr>
+        <w:t xml:space="preserve">resource to </w:t>
+      </w:r>
+      <w:r>
+        <w:rPr>
+          <w:rFonts w:ascii="Garamond" w:hAnsi="Garamond"/>
+        </w:rPr>
+        <w:t>many communities</w:t>
+      </w:r>
+      <w:r>
+        <w:rPr>
+          <w:rFonts w:ascii="Garamond" w:hAnsi="Garamond"/>
+        </w:rPr>
         <w:t xml:space="preserve"> </w:t>
+      </w:r>
+      <w:r>
+        <w:rPr>
+          <w:rFonts w:ascii="Garamond" w:hAnsi="Garamond"/>
+        </w:rPr>
+        <w:t>and play a</w:t>
+      </w:r>
+      <w:r>
+        <w:rPr>
+          <w:rFonts w:ascii="Garamond" w:hAnsi="Garamond"/>
+        </w:rPr>
+        <w:t xml:space="preserve">n important ecological </w:t>
+      </w:r>
+      <w:r>
+        <w:rPr>
+          <w:rFonts w:ascii="Garamond" w:hAnsi="Garamond"/>
+        </w:rPr>
+        <w:t>role in</w:t>
+      </w:r>
+      <w:r>
+        <w:rPr>
+          <w:rFonts w:ascii="Garamond" w:hAnsi="Garamond"/>
+        </w:rPr>
+        <w:t xml:space="preserve"> both freshwater and marine ecosystems.</w:t>
+      </w:r>
+      <w:r>
+        <w:t xml:space="preserve"> </w:t>
+      </w:r>
+      <w:r>
+        <w:rPr>
+          <w:rFonts w:ascii="Garamond" w:hAnsi="Garamond"/>
+        </w:rPr>
+        <w:t xml:space="preserve">As a result, large-scale and widespread efforts have been undertaken to restore salmon ecosystems and </w:t>
+      </w:r>
+      <w:r>
+        <w:rPr>
+          <w:rFonts w:ascii="Garamond" w:hAnsi="Garamond"/>
+        </w:rPr>
+        <w:t xml:space="preserve">to </w:t>
+      </w:r>
+      <w:r>
+        <w:rPr>
+          <w:rFonts w:ascii="Garamond" w:hAnsi="Garamond"/>
+        </w:rPr>
+        <w:t>recover healthy salmon populations</w:t>
+      </w:r>
+      <w:r>
+        <w:rPr>
+          <w:rFonts w:ascii="Garamond" w:hAnsi="Garamond"/>
+        </w:rPr>
+        <w:t xml:space="preserve"> in degraded ecosystems. </w:t>
       </w:r>
     </w:p>
     <w:p>
@@ -207,6 +254,80 @@
           <w:rFonts w:ascii="Garamond" w:hAnsi="Garamond"/>
         </w:rPr>
       </w:pPr>
+      <w:r>
+        <w:rPr>
+          <w:rFonts w:ascii="Garamond" w:hAnsi="Garamond"/>
+        </w:rPr>
+        <w:t>In contrast</w:t>
+      </w:r>
+      <w:r>
+        <w:rPr>
+          <w:rFonts w:ascii="Garamond" w:hAnsi="Garamond"/>
+        </w:rPr>
+        <w:t xml:space="preserve">, </w:t>
+      </w:r>
+      <w:r>
+        <w:rPr>
+          <w:rFonts w:ascii="Garamond" w:hAnsi="Garamond"/>
+        </w:rPr>
+        <w:t xml:space="preserve">watersheds in the </w:t>
+      </w:r>
+      <w:r>
+        <w:rPr>
+          <w:rFonts w:ascii="Garamond" w:hAnsi="Garamond"/>
+        </w:rPr>
+        <w:t xml:space="preserve">furthest </w:t>
+      </w:r>
+      <w:r>
+        <w:rPr>
+          <w:rFonts w:ascii="Garamond" w:hAnsi="Garamond"/>
+        </w:rPr>
+        <w:t xml:space="preserve">northern extent of the </w:t>
+      </w:r>
+      <w:r>
+        <w:rPr>
+          <w:rFonts w:ascii="Garamond" w:hAnsi="Garamond"/>
+        </w:rPr>
+        <w:t xml:space="preserve">range for pacific </w:t>
+      </w:r>
+      <w:r>
+        <w:rPr>
+          <w:rFonts w:ascii="Garamond" w:hAnsi="Garamond"/>
+        </w:rPr>
+        <w:t xml:space="preserve">salmon have </w:t>
+      </w:r>
+      <w:r>
+        <w:rPr>
+          <w:rFonts w:ascii="Garamond" w:hAnsi="Garamond"/>
+        </w:rPr>
+        <w:t xml:space="preserve">experienced far less anthropogenic impacts and less acute impacts of climate warming. Large, relatively free flowing watersheds in Alaska produce support the largest populations of </w:t>
+      </w:r>
+      <w:proofErr w:type="gramStart"/>
+      <w:r>
+        <w:rPr>
+          <w:rFonts w:ascii="Garamond" w:hAnsi="Garamond"/>
+        </w:rPr>
+        <w:t>salmon, and</w:t>
+      </w:r>
+      <w:proofErr w:type="gramEnd"/>
+      <w:r>
+        <w:rPr>
+          <w:rFonts w:ascii="Garamond" w:hAnsi="Garamond"/>
+        </w:rPr>
+        <w:t xml:space="preserve"> </w:t>
+      </w:r>
+      <w:r>
+        <w:rPr>
+          <w:rFonts w:ascii="Garamond" w:hAnsi="Garamond"/>
+        </w:rPr>
+        <w:t>contain some of the last remaining pristine habitat.</w:t>
+      </w:r>
+      <w:r>
+        <w:rPr>
+          <w:rFonts w:ascii="Garamond" w:hAnsi="Garamond"/>
+        </w:rPr>
+        <w:t xml:space="preserve"> </w:t>
+      </w:r>
     </w:p>
     <w:p>
       <w:pPr>
@@ -221,7 +342,8 @@
         <w:rPr>
           <w:rFonts w:ascii="Garamond" w:hAnsi="Garamond"/>
         </w:rPr>
-        <w:t>In contrast, many large Alaskan watersheds remain largely intact and contain some of the last pristine habitat available for Chinook salmon. These systems therefore provide a rare opportunity to investigate the ecological function of an unimpaired, functioning ecosystem.</w:t>
+        <w:lastRenderedPageBreak/>
+        <w:t>many large Alaskan watersheds remain largely intact and contain some of the last pristine habitat available for Chinook salmon. These systems therefore provide a rare opportunity to investigate the ecological function of an unimpaired, functioning ecosystem.</w:t>
       </w:r>
     </w:p>
     <w:p>
@@ -261,14 +383,7 @@
         <w:rPr>
           <w:rFonts w:ascii="Garamond" w:hAnsi="Garamond"/>
         </w:rPr>
-        <w:t xml:space="preserve">habitat patches that differ in their </w:t>
-      </w:r>
-      <w:r>
-        <w:rPr>
-          <w:rFonts w:ascii="Garamond" w:hAnsi="Garamond"/>
-        </w:rPr>
-        <w:lastRenderedPageBreak/>
-        <w:t xml:space="preserve">suitability at any given time. </w:t>
+        <w:t xml:space="preserve">habitat patches that differ in their suitability at any given time. </w:t>
       </w:r>
       <w:r>
         <w:rPr>
@@ -363,7 +478,23 @@
         <w:rPr>
           <w:rFonts w:ascii="Garamond" w:hAnsi="Garamond"/>
         </w:rPr>
-        <w:t xml:space="preserve">Understanding the ecological function of healthy ecosystem is important for designing management and conservation strategies which can repair healthy ecosystem function for impacted systems </w:t>
+        <w:t xml:space="preserve">Alaskan watersheds may be (largely) the exception, as many remain in relatively </w:t>
+      </w:r>
+      <w:proofErr w:type="spellStart"/>
+      <w:proofErr w:type="gramStart"/>
+      <w:r>
+        <w:rPr>
+          <w:rFonts w:ascii="Garamond" w:hAnsi="Garamond"/>
+        </w:rPr>
+        <w:t>in tact</w:t>
+      </w:r>
+      <w:proofErr w:type="spellEnd"/>
+      <w:proofErr w:type="gramEnd"/>
+      <w:r>
+        <w:rPr>
+          <w:rFonts w:ascii="Garamond" w:hAnsi="Garamond"/>
+        </w:rPr>
+        <w:t xml:space="preserve"> and free flowing. These are some of the best remaining examples of pristine Chinook salmon habitat </w:t>
       </w:r>
     </w:p>
     <w:p>
@@ -381,27 +512,7 @@
         <w:rPr>
           <w:rFonts w:ascii="Garamond" w:hAnsi="Garamond"/>
         </w:rPr>
-        <w:t xml:space="preserve">However, </w:t>
-      </w:r>
-      <w:r>
-        <w:rPr>
-          <w:rFonts w:ascii="Garamond" w:hAnsi="Garamond"/>
-        </w:rPr>
-        <w:t xml:space="preserve">intact and healthy functioning ecosystems are increasingly hard to observe, as there are </w:t>
-      </w:r>
-      <w:proofErr w:type="gramStart"/>
-      <w:r>
-        <w:rPr>
-          <w:rFonts w:ascii="Garamond" w:hAnsi="Garamond"/>
-        </w:rPr>
-        <w:t>less and less</w:t>
-      </w:r>
-      <w:proofErr w:type="gramEnd"/>
-      <w:r>
-        <w:rPr>
-          <w:rFonts w:ascii="Garamond" w:hAnsi="Garamond"/>
-        </w:rPr>
-        <w:t xml:space="preserve"> of them and the remaining systems are often in remote locations with very little human infrastructure. </w:t>
+        <w:t xml:space="preserve">Healthy salmon populations are comprised of several locally adapted subpopulations, each with variable habitat use in space and time </w:t>
       </w:r>
     </w:p>
     <w:p>
@@ -419,21 +530,7 @@
         <w:rPr>
           <w:rFonts w:ascii="Garamond" w:hAnsi="Garamond"/>
         </w:rPr>
-        <w:t xml:space="preserve">Chinook salmon ecosystems in the western Pacific rim are largely </w:t>
-      </w:r>
-      <w:proofErr w:type="spellStart"/>
-      <w:r>
-        <w:rPr>
-          <w:rFonts w:ascii="Garamond" w:hAnsi="Garamond"/>
-        </w:rPr>
-        <w:t>anthropagenically</w:t>
-      </w:r>
-      <w:proofErr w:type="spellEnd"/>
-      <w:r>
-        <w:rPr>
-          <w:rFonts w:ascii="Garamond" w:hAnsi="Garamond"/>
-        </w:rPr>
-        <w:t xml:space="preserve"> impacted, i.e. habitat degradation, dams</w:t>
+        <w:t xml:space="preserve">Across the landscape, local landscape features from geomorphological and successional processes filter prevailing environmental conditions into patches of habitat, which vary in their suitability as the interaction between environmental conditions, geomorphological processes, and local environmental conditions shift over space and time. </w:t>
       </w:r>
     </w:p>
     <w:p>
@@ -451,23 +548,7 @@
         <w:rPr>
           <w:rFonts w:ascii="Garamond" w:hAnsi="Garamond"/>
         </w:rPr>
-        <w:t xml:space="preserve">Alaskan watersheds may be (largely) the exception, as many remain in relatively </w:t>
-      </w:r>
-      <w:proofErr w:type="spellStart"/>
-      <w:proofErr w:type="gramStart"/>
-      <w:r>
-        <w:rPr>
-          <w:rFonts w:ascii="Garamond" w:hAnsi="Garamond"/>
-        </w:rPr>
-        <w:t>in tact</w:t>
-      </w:r>
-      <w:proofErr w:type="spellEnd"/>
-      <w:proofErr w:type="gramEnd"/>
-      <w:r>
-        <w:rPr>
-          <w:rFonts w:ascii="Garamond" w:hAnsi="Garamond"/>
-        </w:rPr>
-        <w:t xml:space="preserve"> and free flowing. These are some of the best remaining examples of pristine Chinook salmon habitat </w:t>
+        <w:t xml:space="preserve">This biocomplexity distributes overall population risk across a mosaic of habitat conditions and life histories, which are loosely or negatively correlated in their response to prevailing climate conditions. </w:t>
       </w:r>
     </w:p>
     <w:p>
@@ -485,68 +566,8 @@
         <w:rPr>
           <w:rFonts w:ascii="Garamond" w:hAnsi="Garamond"/>
         </w:rPr>
-        <w:t xml:space="preserve">Healthy salmon populations are comprised of several locally adapted subpopulations, each with variable habitat use in space and time </w:t>
-      </w:r>
-    </w:p>
-    <w:p>
-      <w:pPr>
-        <w:pStyle w:val="ListParagraph"/>
-        <w:numPr>
-          <w:ilvl w:val="0"/>
-          <w:numId w:val="1"/>
-        </w:numPr>
-        <w:rPr>
-          <w:rFonts w:ascii="Garamond" w:hAnsi="Garamond"/>
-        </w:rPr>
-      </w:pPr>
-      <w:r>
-        <w:rPr>
-          <w:rFonts w:ascii="Garamond" w:hAnsi="Garamond"/>
-        </w:rPr>
-        <w:t xml:space="preserve">Across the landscape, local landscape features from geomorphological and successional processes filter prevailing environmental conditions into patches of habitat, which vary in their suitability as the interaction between environmental conditions, geomorphological processes, and local environmental conditions shift over space and time. </w:t>
-      </w:r>
-    </w:p>
-    <w:p>
-      <w:pPr>
-        <w:pStyle w:val="ListParagraph"/>
-        <w:numPr>
-          <w:ilvl w:val="0"/>
-          <w:numId w:val="1"/>
-        </w:numPr>
-        <w:rPr>
-          <w:rFonts w:ascii="Garamond" w:hAnsi="Garamond"/>
-        </w:rPr>
-      </w:pPr>
-      <w:r>
-        <w:rPr>
-          <w:rFonts w:ascii="Garamond" w:hAnsi="Garamond"/>
-        </w:rPr>
-        <w:t xml:space="preserve">This biocomplexity distributes overall population risk across a mosaic of habitat conditions and life histories, which are loosely or negatively correlated in their response to prevailing climate conditions. </w:t>
-      </w:r>
-    </w:p>
-    <w:p>
-      <w:pPr>
-        <w:pStyle w:val="ListParagraph"/>
-        <w:numPr>
-          <w:ilvl w:val="0"/>
-          <w:numId w:val="1"/>
-        </w:numPr>
-        <w:rPr>
-          <w:rFonts w:ascii="Garamond" w:hAnsi="Garamond"/>
-        </w:rPr>
-      </w:pPr>
-      <w:r>
-        <w:rPr>
-          <w:rFonts w:ascii="Garamond" w:hAnsi="Garamond"/>
-        </w:rPr>
-        <w:t xml:space="preserve">This “diversification” maximizes the likelihood that suitable habitat conditions exist in some combination across the landscape under several potential environmental scenarios, thereby </w:t>
-      </w:r>
-      <w:r>
-        <w:rPr>
-          <w:rFonts w:ascii="Garamond" w:hAnsi="Garamond"/>
-        </w:rPr>
         <w:lastRenderedPageBreak/>
-        <w:t xml:space="preserve">buffering aggregate population returns to conditions which are suboptimal for some portion of the population. </w:t>
+        <w:t xml:space="preserve">This “diversification” maximizes the likelihood that suitable habitat conditions exist in some combination across the landscape under several potential environmental scenarios, thereby buffering aggregate population returns to conditions which are suboptimal for some portion of the population. </w:t>
       </w:r>
     </w:p>
     <w:p>

</xml_diff>

<commit_message>
three paragraphs into intro
</commit_message>
<xml_diff>
--- a/Docs/Working_SMH2.docx
+++ b/Docs/Working_SMH2.docx
@@ -11,6 +11,16 @@
           <w:szCs w:val="36"/>
         </w:rPr>
       </w:pPr>
+    </w:p>
+    <w:p>
+      <w:pPr>
+        <w:jc w:val="center"/>
+        <w:rPr>
+          <w:rFonts w:ascii="Garamond" w:hAnsi="Garamond"/>
+          <w:sz w:val="36"/>
+          <w:szCs w:val="36"/>
+        </w:rPr>
+      </w:pPr>
       <w:r>
         <w:rPr>
           <w:rFonts w:ascii="Garamond" w:hAnsi="Garamond"/>
@@ -71,6 +81,9 @@
         <w:pStyle w:val="font-claude-response-body"/>
         <w:spacing w:line="480" w:lineRule="auto"/>
         <w:ind w:firstLine="360"/>
+        <w:rPr>
+          <w:rFonts w:ascii="Garamond" w:hAnsi="Garamond"/>
+        </w:rPr>
       </w:pPr>
       <w:r>
         <w:rPr>
@@ -149,13 +162,31 @@
         <w:rPr>
           <w:rFonts w:ascii="Garamond" w:hAnsi="Garamond"/>
         </w:rPr>
-        <w:t>Many populations of Pacific salmon have experienced precipitous and sustained declines, particularly at the southern extent of their range, where the combined effects of human development and climate change have been most pronounced.</w:t>
-      </w:r>
-      <w:r>
-        <w:rPr>
-          <w:rFonts w:ascii="Garamond" w:hAnsi="Garamond"/>
-        </w:rPr>
-        <w:t xml:space="preserve"> S</w:t>
+        <w:t>Many populations of Pacific salmon have experienced precipitous and sustained declines</w:t>
+      </w:r>
+      <w:r>
+        <w:rPr>
+          <w:rFonts w:ascii="Garamond" w:hAnsi="Garamond"/>
+        </w:rPr>
+        <w:t xml:space="preserve"> </w:t>
+      </w:r>
+      <w:r>
+        <w:rPr>
+          <w:rFonts w:ascii="Garamond" w:hAnsi="Garamond"/>
+        </w:rPr>
+        <w:t>where the combined effects of human development and climate change have been most pronounced.</w:t>
+      </w:r>
+      <w:r>
+        <w:rPr>
+          <w:rFonts w:ascii="Garamond" w:hAnsi="Garamond"/>
+        </w:rPr>
+        <w:t xml:space="preserve"> </w:t>
+      </w:r>
+      <w:r>
+        <w:rPr>
+          <w:rFonts w:ascii="Garamond" w:hAnsi="Garamond"/>
+        </w:rPr>
+        <w:t>However, s</w:t>
       </w:r>
       <w:r>
         <w:rPr>
@@ -215,16 +246,25 @@
         <w:rPr>
           <w:rFonts w:ascii="Garamond" w:hAnsi="Garamond"/>
         </w:rPr>
-        <w:t xml:space="preserve"> both freshwater and marine ecosystems.</w:t>
-      </w:r>
-      <w:r>
-        <w:t xml:space="preserve"> </w:t>
-      </w:r>
-      <w:r>
-        <w:rPr>
-          <w:rFonts w:ascii="Garamond" w:hAnsi="Garamond"/>
-        </w:rPr>
-        <w:t xml:space="preserve">As a result, large-scale and widespread efforts have been undertaken to restore salmon ecosystems and </w:t>
+        <w:t xml:space="preserve"> both freshwater and marine ecosystems. </w:t>
+      </w:r>
+      <w:r>
+        <w:rPr>
+          <w:rFonts w:ascii="Garamond" w:hAnsi="Garamond"/>
+        </w:rPr>
+        <w:t xml:space="preserve">As a result, large-scale and widespread efforts have been undertaken to restore salmon </w:t>
+      </w:r>
+      <w:r>
+        <w:rPr>
+          <w:rFonts w:ascii="Garamond" w:hAnsi="Garamond"/>
+        </w:rPr>
+        <w:t xml:space="preserve">habitat </w:t>
+      </w:r>
+      <w:r>
+        <w:rPr>
+          <w:rFonts w:ascii="Garamond" w:hAnsi="Garamond"/>
+        </w:rPr>
+        <w:t xml:space="preserve">and </w:t>
       </w:r>
       <w:r>
         <w:rPr>
@@ -258,75 +298,80 @@
         <w:rPr>
           <w:rFonts w:ascii="Garamond" w:hAnsi="Garamond"/>
         </w:rPr>
-        <w:t>In contrast</w:t>
-      </w:r>
-      <w:r>
-        <w:rPr>
-          <w:rFonts w:ascii="Garamond" w:hAnsi="Garamond"/>
-        </w:rPr>
-        <w:t xml:space="preserve">, </w:t>
-      </w:r>
-      <w:r>
-        <w:rPr>
-          <w:rFonts w:ascii="Garamond" w:hAnsi="Garamond"/>
-        </w:rPr>
-        <w:t xml:space="preserve">watersheds in the </w:t>
-      </w:r>
-      <w:r>
-        <w:rPr>
-          <w:rFonts w:ascii="Garamond" w:hAnsi="Garamond"/>
-        </w:rPr>
-        <w:t xml:space="preserve">furthest </w:t>
-      </w:r>
-      <w:r>
-        <w:rPr>
-          <w:rFonts w:ascii="Garamond" w:hAnsi="Garamond"/>
-        </w:rPr>
-        <w:t xml:space="preserve">northern extent of the </w:t>
-      </w:r>
-      <w:r>
-        <w:rPr>
-          <w:rFonts w:ascii="Garamond" w:hAnsi="Garamond"/>
-        </w:rPr>
-        <w:t xml:space="preserve">range for pacific </w:t>
-      </w:r>
-      <w:r>
-        <w:rPr>
-          <w:rFonts w:ascii="Garamond" w:hAnsi="Garamond"/>
-        </w:rPr>
-        <w:t xml:space="preserve">salmon have </w:t>
-      </w:r>
-      <w:r>
-        <w:rPr>
-          <w:rFonts w:ascii="Garamond" w:hAnsi="Garamond"/>
-        </w:rPr>
-        <w:t xml:space="preserve">experienced far less anthropogenic impacts and less acute impacts of climate warming. Large, relatively free flowing watersheds in Alaska produce support the largest populations of </w:t>
-      </w:r>
-      <w:proofErr w:type="gramStart"/>
-      <w:r>
-        <w:rPr>
-          <w:rFonts w:ascii="Garamond" w:hAnsi="Garamond"/>
-        </w:rPr>
-        <w:t>salmon, and</w:t>
-      </w:r>
-      <w:proofErr w:type="gramEnd"/>
-      <w:r>
-        <w:rPr>
-          <w:rFonts w:ascii="Garamond" w:hAnsi="Garamond"/>
-        </w:rPr>
-        <w:t xml:space="preserve"> </w:t>
-      </w:r>
-      <w:r>
-        <w:rPr>
-          <w:rFonts w:ascii="Garamond" w:hAnsi="Garamond"/>
-        </w:rPr>
-        <w:t>contain some of the last remaining pristine habitat.</w:t>
-      </w:r>
-      <w:r>
-        <w:rPr>
-          <w:rFonts w:ascii="Garamond" w:hAnsi="Garamond"/>
-        </w:rPr>
-        <w:t xml:space="preserve"> </w:t>
+        <w:t>W</w:t>
+      </w:r>
+      <w:r>
+        <w:rPr>
+          <w:rFonts w:ascii="Garamond" w:hAnsi="Garamond"/>
+        </w:rPr>
+        <w:t xml:space="preserve">atersheds at the northernmost extent of the Pacific salmon range have experienced substantially fewer anthropogenic impacts and, because they remain farther from thermal tolerance limits, have </w:t>
+      </w:r>
+      <w:r>
+        <w:rPr>
+          <w:rFonts w:ascii="Garamond" w:hAnsi="Garamond"/>
+        </w:rPr>
+        <w:t xml:space="preserve">experienced less acute negative impacts of climate warming in the freshwater environment. </w:t>
+      </w:r>
+      <w:r>
+        <w:rPr>
+          <w:rFonts w:ascii="Garamond" w:hAnsi="Garamond"/>
+        </w:rPr>
+        <w:t xml:space="preserve">Large, relatively free-flowing watersheds in Alaska support the largest remaining </w:t>
+      </w:r>
+      <w:r>
+        <w:rPr>
+          <w:rFonts w:ascii="Garamond" w:hAnsi="Garamond"/>
+        </w:rPr>
+        <w:lastRenderedPageBreak/>
+        <w:t xml:space="preserve">salmon populations and contain some of the last remaining pristine </w:t>
+      </w:r>
+      <w:r>
+        <w:rPr>
+          <w:rFonts w:ascii="Garamond" w:hAnsi="Garamond"/>
+        </w:rPr>
+        <w:t>habitats. As</w:t>
+      </w:r>
+      <w:r>
+        <w:rPr>
+          <w:rFonts w:ascii="Garamond" w:hAnsi="Garamond"/>
+        </w:rPr>
+        <w:t xml:space="preserve"> such, </w:t>
+      </w:r>
+      <w:r>
+        <w:rPr>
+          <w:rFonts w:ascii="Garamond" w:hAnsi="Garamond"/>
+        </w:rPr>
+        <w:t xml:space="preserve">salmon populations in these ecosystems are expected to </w:t>
+      </w:r>
+      <w:r>
+        <w:rPr>
+          <w:rFonts w:ascii="Garamond" w:hAnsi="Garamond"/>
+        </w:rPr>
+        <w:t xml:space="preserve">function in ways that reflect the natural ecological processes of healthy </w:t>
+      </w:r>
+      <w:r>
+        <w:rPr>
+          <w:rFonts w:ascii="Garamond" w:hAnsi="Garamond"/>
+        </w:rPr>
+        <w:t xml:space="preserve">populations. </w:t>
+      </w:r>
+      <w:r>
+        <w:rPr>
+          <w:rFonts w:ascii="Garamond" w:hAnsi="Garamond"/>
+        </w:rPr>
+        <w:t xml:space="preserve">These systems therefore offer a rare opportunity to study salmon ecology without the confounding effects of human impacts, providing insights into the natural functioning of </w:t>
+      </w:r>
+      <w:r>
+        <w:rPr>
+          <w:rFonts w:ascii="Garamond" w:hAnsi="Garamond"/>
+        </w:rPr>
+        <w:t xml:space="preserve">salmon ecology </w:t>
+      </w:r>
+      <w:r>
+        <w:rPr>
+          <w:rFonts w:ascii="Garamond" w:hAnsi="Garamond"/>
+        </w:rPr>
+        <w:t>and establishing a baseline for restoring impacted watersheds.</w:t>
       </w:r>
     </w:p>
     <w:p>
@@ -342,8 +387,129 @@
         <w:rPr>
           <w:rFonts w:ascii="Garamond" w:hAnsi="Garamond"/>
         </w:rPr>
-        <w:lastRenderedPageBreak/>
-        <w:t>many large Alaskan watersheds remain largely intact and contain some of the last pristine habitat available for Chinook salmon. These systems therefore provide a rare opportunity to investigate the ecological function of an unimpaired, functioning ecosystem.</w:t>
+        <w:t>The roles of both habitat heterogeneity [ref] and intrapopulation trait variability in maintaining healthy salmon watersheds are well established [ref, ref, ref]. Natural geomorphological and successional processes within a healthy floodplain create a diversity of habitat types at the reach scale</w:t>
+      </w:r>
+      <w:r>
+        <w:rPr>
+          <w:rFonts w:ascii="Garamond" w:hAnsi="Garamond"/>
+        </w:rPr>
+        <w:t xml:space="preserve"> (</w:t>
+      </w:r>
+      <w:proofErr w:type="spellStart"/>
+      <w:r>
+        <w:rPr>
+          <w:rFonts w:ascii="Garamond" w:hAnsi="Garamond"/>
+        </w:rPr>
+        <w:t>e.g</w:t>
+      </w:r>
+      <w:proofErr w:type="spellEnd"/>
+      <w:r>
+        <w:rPr>
+          <w:rFonts w:ascii="Garamond" w:hAnsi="Garamond"/>
+        </w:rPr>
+        <w:t xml:space="preserve"> </w:t>
+      </w:r>
+      <w:r>
+        <w:rPr>
+          <w:rFonts w:ascii="Garamond" w:hAnsi="Garamond"/>
+        </w:rPr>
+        <w:t>shallow</w:t>
+      </w:r>
+      <w:r>
+        <w:rPr>
+          <w:rFonts w:ascii="Garamond" w:hAnsi="Garamond"/>
+        </w:rPr>
+        <w:t xml:space="preserve"> off channel habitat</w:t>
+      </w:r>
+      <w:r>
+        <w:rPr>
+          <w:rFonts w:ascii="Garamond" w:hAnsi="Garamond"/>
+        </w:rPr>
+        <w:t>, riffles, and pools</w:t>
+      </w:r>
+      <w:r>
+        <w:rPr>
+          <w:rFonts w:ascii="Garamond" w:hAnsi="Garamond"/>
+        </w:rPr>
+        <w:t>) which offer</w:t>
+      </w:r>
+      <w:r>
+        <w:rPr>
+          <w:rFonts w:ascii="Garamond" w:hAnsi="Garamond"/>
+        </w:rPr>
+        <w:t xml:space="preserve"> a suite of potential </w:t>
+      </w:r>
+      <w:r>
+        <w:rPr>
+          <w:rFonts w:ascii="Garamond" w:hAnsi="Garamond"/>
+        </w:rPr>
+        <w:t xml:space="preserve">microhabitats necessary for different salmon life stages. </w:t>
+      </w:r>
+      <w:r>
+        <w:rPr>
+          <w:rFonts w:ascii="Garamond" w:hAnsi="Garamond"/>
+        </w:rPr>
+        <w:t>These processes also operate at broader spatial scales, generating variability among tributaries and sub-basins (e.g., hydrology, mean temperature) that differentially filter prevailing local environmental conditions (e.g., precipitation, temperature), producing a continuum of habitat types across the basin. As the features driving landscape heterogeneity develop and local environmental conditions shift across space and time, they create a</w:t>
+      </w:r>
+      <w:r>
+        <w:rPr>
+          <w:rFonts w:ascii="Garamond" w:hAnsi="Garamond"/>
+        </w:rPr>
+        <w:t xml:space="preserve"> so-called</w:t>
+      </w:r>
+      <w:r>
+        <w:rPr>
+          <w:rFonts w:ascii="Garamond" w:hAnsi="Garamond"/>
+        </w:rPr>
+        <w:t xml:space="preserve"> “shifting habitat mosaic” in which </w:t>
+      </w:r>
+      <w:r>
+        <w:rPr>
+          <w:rFonts w:ascii="Garamond" w:hAnsi="Garamond"/>
+        </w:rPr>
+        <w:t xml:space="preserve">patches of localized habitat types and suitability </w:t>
+      </w:r>
+      <w:r>
+        <w:rPr>
+          <w:rFonts w:ascii="Garamond" w:hAnsi="Garamond"/>
+        </w:rPr>
+        <w:t xml:space="preserve">vary in </w:t>
+      </w:r>
+      <w:r>
+        <w:rPr>
+          <w:rFonts w:ascii="Garamond" w:hAnsi="Garamond"/>
+        </w:rPr>
+        <w:t xml:space="preserve">their </w:t>
+      </w:r>
+      <w:r>
+        <w:rPr>
+          <w:rFonts w:ascii="Garamond" w:hAnsi="Garamond"/>
+        </w:rPr>
+        <w:t xml:space="preserve">spatial configuration across </w:t>
+      </w:r>
+      <w:r>
+        <w:rPr>
+          <w:rFonts w:ascii="Garamond" w:hAnsi="Garamond"/>
+        </w:rPr>
+        <w:t xml:space="preserve">several </w:t>
+      </w:r>
+      <w:r>
+        <w:rPr>
+          <w:rFonts w:ascii="Garamond" w:hAnsi="Garamond"/>
+        </w:rPr>
+        <w:t>temporal and spatial scales.</w:t>
+      </w:r>
+      <w:r>
+        <w:rPr>
+          <w:rFonts w:ascii="Garamond" w:hAnsi="Garamond"/>
+        </w:rPr>
+        <w:t xml:space="preserve"> </w:t>
+      </w:r>
+      <w:r>
+        <w:rPr>
+          <w:rFonts w:ascii="Garamond" w:hAnsi="Garamond"/>
+        </w:rPr>
+        <w:t>This mosaic, in turn, interacts with locally adapted sub-populations, which differ in both the timing and spatial distribution of their habitat use, resulting in dynamic patterns of production at annual timesteps and spatial variability in growth, life-history strategies, and genetic diversity across the basin.</w:t>
       </w:r>
     </w:p>
     <w:p>
@@ -351,99 +517,33 @@
         <w:pStyle w:val="font-claude-response-body"/>
         <w:spacing w:line="480" w:lineRule="auto"/>
         <w:ind w:firstLine="360"/>
-        <w:rPr>
-          <w:rFonts w:ascii="Garamond" w:hAnsi="Garamond"/>
-        </w:rPr>
-      </w:pPr>
-      <w:r>
-        <w:rPr>
-          <w:rFonts w:ascii="Garamond" w:hAnsi="Garamond"/>
-        </w:rPr>
-        <w:t xml:space="preserve">In well-functioning salmon ecosystems, variation in local geomorphic features </w:t>
-      </w:r>
-      <w:r>
-        <w:rPr>
-          <w:rFonts w:ascii="Garamond" w:hAnsi="Garamond"/>
-        </w:rPr>
-        <w:t xml:space="preserve">differentially filters </w:t>
-      </w:r>
-      <w:r>
-        <w:rPr>
-          <w:rFonts w:ascii="Garamond" w:hAnsi="Garamond"/>
-        </w:rPr>
-        <w:t xml:space="preserve">prevailing environmental conditions to generate </w:t>
-      </w:r>
-      <w:r>
-        <w:rPr>
-          <w:rFonts w:ascii="Garamond" w:hAnsi="Garamond"/>
-        </w:rPr>
-        <w:t xml:space="preserve">local </w:t>
-      </w:r>
-      <w:r>
-        <w:rPr>
-          <w:rFonts w:ascii="Garamond" w:hAnsi="Garamond"/>
-        </w:rPr>
-        <w:t xml:space="preserve">habitat patches that differ in their suitability at any given time. </w:t>
-      </w:r>
-      <w:r>
-        <w:rPr>
-          <w:rFonts w:ascii="Garamond" w:hAnsi="Garamond"/>
-        </w:rPr>
-        <w:t xml:space="preserve">This </w:t>
-      </w:r>
-      <w:r>
-        <w:rPr>
-          <w:rFonts w:ascii="Garamond" w:hAnsi="Garamond"/>
-        </w:rPr>
-        <w:t xml:space="preserve">process operates across multiple spatial scales, </w:t>
-      </w:r>
-      <w:r>
-        <w:rPr>
-          <w:rFonts w:ascii="Garamond" w:hAnsi="Garamond"/>
-        </w:rPr>
-        <w:t xml:space="preserve">and </w:t>
-      </w:r>
-      <w:r>
-        <w:rPr>
-          <w:rFonts w:ascii="Garamond" w:hAnsi="Garamond"/>
-        </w:rPr>
-        <w:t xml:space="preserve">substantial variation in habitat suitability can occur even among spatially proximate reaches. For example, a single precipitation event may produce hydrological conditions that are unsuitable for spawning in one tributary </w:t>
-      </w:r>
-      <w:r>
-        <w:rPr>
-          <w:rFonts w:ascii="Garamond" w:hAnsi="Garamond"/>
-        </w:rPr>
-        <w:t>while</w:t>
-      </w:r>
-      <w:r>
-        <w:rPr>
-          <w:rFonts w:ascii="Garamond" w:hAnsi="Garamond"/>
-        </w:rPr>
-        <w:t xml:space="preserve"> simultaneously creat</w:t>
-      </w:r>
-      <w:r>
-        <w:rPr>
-          <w:rFonts w:ascii="Garamond" w:hAnsi="Garamond"/>
-        </w:rPr>
-        <w:t>ing</w:t>
-      </w:r>
-      <w:r>
-        <w:rPr>
-          <w:rFonts w:ascii="Garamond" w:hAnsi="Garamond"/>
-        </w:rPr>
-        <w:t xml:space="preserve"> favorable conditions in an adjacent tributary shaped by distinct geomorphological and successional histories. </w:t>
-      </w:r>
-      <w:r>
-        <w:rPr>
-          <w:rFonts w:ascii="Garamond" w:hAnsi="Garamond"/>
-        </w:rPr>
-        <w:t>As prevailing local climate conditions vary, they are filtered through this landscape heterogeneity to produce a continuum of habitat conditions, which vary in space and time.</w:t>
-      </w:r>
-      <w:r>
-        <w:rPr>
-          <w:rFonts w:ascii="Garamond" w:hAnsi="Garamond"/>
-        </w:rPr>
-        <w:t xml:space="preserve"> This, in turn, increases the likelihood that favorable conditions will exist somewhere in the landscape but will vary in space and time reflecting these shifting conditions. </w:t>
+      </w:pPr>
+    </w:p>
+    <w:p>
+      <w:pPr>
+        <w:pStyle w:val="font-claude-response-body"/>
+        <w:spacing w:line="480" w:lineRule="auto"/>
+        <w:ind w:firstLine="360"/>
+        <w:rPr>
+          <w:rFonts w:ascii="Garamond" w:hAnsi="Garamond"/>
+        </w:rPr>
+      </w:pPr>
+    </w:p>
+    <w:p>
+      <w:pPr>
+        <w:pStyle w:val="font-claude-response-body"/>
+        <w:spacing w:line="480" w:lineRule="auto"/>
+        <w:ind w:firstLine="360"/>
+        <w:rPr>
+          <w:rFonts w:ascii="Garamond" w:hAnsi="Garamond"/>
+        </w:rPr>
+      </w:pPr>
+      <w:r>
+        <w:rPr>
+          <w:rFonts w:ascii="Garamond" w:hAnsi="Garamond"/>
+        </w:rPr>
+        <w:lastRenderedPageBreak/>
+        <w:t xml:space="preserve">This, in turn, increases the likelihood that favorable conditions will exist somewhere in the landscape but will vary in space and time reflecting these shifting conditions. </w:t>
       </w:r>
     </w:p>
     <w:p>
@@ -566,7 +666,6 @@
         <w:rPr>
           <w:rFonts w:ascii="Garamond" w:hAnsi="Garamond"/>
         </w:rPr>
-        <w:lastRenderedPageBreak/>
         <w:t xml:space="preserve">This “diversification” maximizes the likelihood that suitable habitat conditions exist in some combination across the landscape under several potential environmental scenarios, thereby buffering aggregate population returns to conditions which are suboptimal for some portion of the population. </w:t>
       </w:r>
     </w:p>
@@ -1681,6 +1780,74 @@
       <w:iCs/>
     </w:rPr>
   </w:style>
+  <w:style w:type="character" w:styleId="CommentReference">
+    <w:name w:val="annotation reference"/>
+    <w:basedOn w:val="DefaultParagraphFont"/>
+    <w:uiPriority w:val="99"/>
+    <w:semiHidden/>
+    <w:unhideWhenUsed/>
+    <w:rsid w:val="00E225FA"/>
+    <w:rPr>
+      <w:sz w:val="16"/>
+      <w:szCs w:val="16"/>
+    </w:rPr>
+  </w:style>
+  <w:style w:type="paragraph" w:styleId="CommentText">
+    <w:name w:val="annotation text"/>
+    <w:basedOn w:val="Normal"/>
+    <w:link w:val="CommentTextChar"/>
+    <w:uiPriority w:val="99"/>
+    <w:semiHidden/>
+    <w:unhideWhenUsed/>
+    <w:rsid w:val="00E225FA"/>
+    <w:pPr>
+      <w:spacing w:line="240" w:lineRule="auto"/>
+    </w:pPr>
+    <w:rPr>
+      <w:sz w:val="20"/>
+      <w:szCs w:val="20"/>
+    </w:rPr>
+  </w:style>
+  <w:style w:type="character" w:customStyle="1" w:styleId="CommentTextChar">
+    <w:name w:val="Comment Text Char"/>
+    <w:basedOn w:val="DefaultParagraphFont"/>
+    <w:link w:val="CommentText"/>
+    <w:uiPriority w:val="99"/>
+    <w:semiHidden/>
+    <w:rsid w:val="00E225FA"/>
+    <w:rPr>
+      <w:sz w:val="20"/>
+      <w:szCs w:val="20"/>
+    </w:rPr>
+  </w:style>
+  <w:style w:type="paragraph" w:styleId="CommentSubject">
+    <w:name w:val="annotation subject"/>
+    <w:basedOn w:val="CommentText"/>
+    <w:next w:val="CommentText"/>
+    <w:link w:val="CommentSubjectChar"/>
+    <w:uiPriority w:val="99"/>
+    <w:semiHidden/>
+    <w:unhideWhenUsed/>
+    <w:rsid w:val="00E225FA"/>
+    <w:rPr>
+      <w:b/>
+      <w:bCs/>
+    </w:rPr>
+  </w:style>
+  <w:style w:type="character" w:customStyle="1" w:styleId="CommentSubjectChar">
+    <w:name w:val="Comment Subject Char"/>
+    <w:basedOn w:val="CommentTextChar"/>
+    <w:link w:val="CommentSubject"/>
+    <w:uiPriority w:val="99"/>
+    <w:semiHidden/>
+    <w:rsid w:val="00E225FA"/>
+    <w:rPr>
+      <w:b/>
+      <w:bCs/>
+      <w:sz w:val="20"/>
+      <w:szCs w:val="20"/>
+    </w:rPr>
+  </w:style>
 </w:styles>
 </file>
 

</xml_diff>

<commit_message>
full walkthrough of the introduction
</commit_message>
<xml_diff>
--- a/Docs/Working_SMH2.docx
+++ b/Docs/Working_SMH2.docx
@@ -543,71 +543,71 @@
         <w:rPr>
           <w:rFonts w:ascii="Garamond" w:hAnsi="Garamond"/>
         </w:rPr>
-        <w:t xml:space="preserve">Over time, the dynamic interplay between environmental conditions and landscape features produces a </w:t>
-      </w:r>
-      <w:r>
-        <w:rPr>
-          <w:rFonts w:ascii="Garamond" w:hAnsi="Garamond"/>
-        </w:rPr>
-        <w:t>so called “</w:t>
+        <w:t>T</w:t>
+      </w:r>
+      <w:r>
+        <w:rPr>
+          <w:rFonts w:ascii="Garamond" w:hAnsi="Garamond"/>
+        </w:rPr>
+        <w:t>he dynamic interplay between environmental conditions and landscape features</w:t>
+      </w:r>
+      <w:r>
+        <w:rPr>
+          <w:rFonts w:ascii="Garamond" w:hAnsi="Garamond"/>
+        </w:rPr>
+        <w:t xml:space="preserve"> over time</w:t>
+      </w:r>
+      <w:r>
+        <w:rPr>
+          <w:rFonts w:ascii="Garamond" w:hAnsi="Garamond"/>
+        </w:rPr>
+        <w:t xml:space="preserve"> produces a</w:t>
+      </w:r>
+      <w:r>
+        <w:rPr>
+          <w:rFonts w:ascii="Garamond" w:hAnsi="Garamond"/>
+        </w:rPr>
+        <w:t xml:space="preserve"> shifting</w:t>
       </w:r>
       <w:r>
         <w:rPr>
           <w:rStyle w:val="Emphasis"/>
           <w:rFonts w:ascii="Garamond" w:eastAsiaTheme="majorEastAsia" w:hAnsi="Garamond"/>
         </w:rPr>
-        <w:t>shifting habitat mosaic</w:t>
+        <w:t xml:space="preserve"> </w:t>
       </w:r>
       <w:r>
         <w:rPr>
           <w:rStyle w:val="Emphasis"/>
           <w:rFonts w:ascii="Garamond" w:eastAsiaTheme="majorEastAsia" w:hAnsi="Garamond"/>
-        </w:rPr>
-        <w:t>”</w:t>
-      </w:r>
-      <w:r>
-        <w:rPr>
-          <w:rFonts w:ascii="Garamond" w:hAnsi="Garamond"/>
-        </w:rPr>
-        <w:t xml:space="preserve">, in </w:t>
-      </w:r>
-      <w:r>
-        <w:rPr>
-          <w:rFonts w:ascii="Garamond" w:hAnsi="Garamond"/>
-        </w:rPr>
-        <w:t>which a</w:t>
-      </w:r>
-      <w:r>
-        <w:rPr>
-          <w:rFonts w:ascii="Garamond" w:hAnsi="Garamond"/>
-        </w:rPr>
-        <w:t xml:space="preserve"> </w:t>
-      </w:r>
-      <w:r>
-        <w:rPr>
-          <w:rFonts w:ascii="Garamond" w:hAnsi="Garamond"/>
-        </w:rPr>
-        <w:t>continuum</w:t>
-      </w:r>
-      <w:r>
-        <w:rPr>
-          <w:rFonts w:ascii="Garamond" w:hAnsi="Garamond"/>
-        </w:rPr>
-        <w:t xml:space="preserve"> of habitat types </w:t>
-      </w:r>
-      <w:proofErr w:type="gramStart"/>
-      <w:r>
-        <w:rPr>
-          <w:rFonts w:ascii="Garamond" w:hAnsi="Garamond"/>
-        </w:rPr>
-        <w:t>are</w:t>
-      </w:r>
-      <w:proofErr w:type="gramEnd"/>
-      <w:r>
-        <w:rPr>
-          <w:rFonts w:ascii="Garamond" w:hAnsi="Garamond"/>
-        </w:rPr>
-        <w:t xml:space="preserve"> expressed throughout the watershed which </w:t>
+          <w:i w:val="0"/>
+          <w:iCs w:val="0"/>
+        </w:rPr>
+        <w:t>mosaic</w:t>
+      </w:r>
+      <w:r>
+        <w:rPr>
+          <w:rFonts w:ascii="Garamond" w:hAnsi="Garamond"/>
+        </w:rPr>
+        <w:t xml:space="preserve"> of </w:t>
+      </w:r>
+      <w:r>
+        <w:rPr>
+          <w:rFonts w:ascii="Garamond" w:hAnsi="Garamond"/>
+        </w:rPr>
+        <w:t xml:space="preserve">habitat types </w:t>
+      </w:r>
+      <w:r>
+        <w:rPr>
+          <w:rFonts w:ascii="Garamond" w:hAnsi="Garamond"/>
+        </w:rPr>
+        <w:t xml:space="preserve">across </w:t>
+      </w:r>
+      <w:r>
+        <w:rPr>
+          <w:rFonts w:ascii="Garamond" w:hAnsi="Garamond"/>
+        </w:rPr>
+        <w:t xml:space="preserve">the watershed which </w:t>
       </w:r>
       <w:r>
         <w:rPr>
@@ -625,7 +625,43 @@
         <w:rPr>
           <w:rFonts w:ascii="Garamond" w:hAnsi="Garamond"/>
         </w:rPr>
-        <w:t>nd spatial arrangement and are continually reorganized across multiple spatial and temporal scales</w:t>
+        <w:t xml:space="preserve">nd spatial arrangement and are continually reorganized across multiple spatial and temporal scales. </w:t>
+      </w:r>
+      <w:r>
+        <w:rPr>
+          <w:rFonts w:ascii="Garamond" w:hAnsi="Garamond"/>
+        </w:rPr>
+        <w:t xml:space="preserve">In healthy, well-functioning watersheds, this process is expected to produce spatially heterogeneous patterns of ecological performance (e.g., growth and production) </w:t>
+      </w:r>
+      <w:r>
+        <w:rPr>
+          <w:rFonts w:ascii="Garamond" w:hAnsi="Garamond"/>
+        </w:rPr>
+        <w:t xml:space="preserve">that shift in their spatial configuration </w:t>
+      </w:r>
+      <w:r>
+        <w:rPr>
+          <w:rFonts w:ascii="Garamond" w:hAnsi="Garamond"/>
+        </w:rPr>
+        <w:t xml:space="preserve">as </w:t>
+      </w:r>
+      <w:r>
+        <w:rPr>
+          <w:rFonts w:ascii="Garamond" w:hAnsi="Garamond"/>
+        </w:rPr>
+        <w:t xml:space="preserve">locally adapted subpopulations </w:t>
+      </w:r>
+      <w:r>
+        <w:rPr>
+          <w:rFonts w:ascii="Garamond" w:hAnsi="Garamond"/>
+        </w:rPr>
+        <w:t>interact with variable</w:t>
+      </w:r>
+      <w:r>
+        <w:rPr>
+          <w:rFonts w:ascii="Garamond" w:hAnsi="Garamond"/>
+        </w:rPr>
+        <w:t xml:space="preserve"> habitat suitability through space and time</w:t>
       </w:r>
       <w:r>
         <w:rPr>
@@ -636,40 +672,10 @@
       <w:r>
         <w:rPr>
           <w:rFonts w:ascii="Garamond" w:hAnsi="Garamond"/>
-        </w:rPr>
-        <w:t>In healthy, well-functioning watersheds, this process is expected to produce spatially heterogeneous patterns of ecological performance (e.g., growth and production) that emerge, shift, and reconfigure across the basin as interactions between locally adapted subpopulations and habitat suitability vary through space and time</w:t>
-      </w:r>
-      <w:r>
-        <w:rPr>
-          <w:rFonts w:ascii="Garamond" w:hAnsi="Garamond"/>
-        </w:rPr>
-        <w:t xml:space="preserve">. </w:t>
-      </w:r>
-      <w:proofErr w:type="spellStart"/>
-      <w:r>
-        <w:rPr>
-          <w:rFonts w:ascii="Garamond" w:hAnsi="Garamond"/>
-        </w:rPr>
-        <w:t>By</w:t>
-      </w:r>
-      <w:proofErr w:type="spellEnd"/>
-      <w:r>
-        <w:rPr>
-          <w:rFonts w:ascii="Garamond" w:hAnsi="Garamond"/>
-        </w:rPr>
-        <w:t xml:space="preserve"> maintaining hydrological connectivity and processes that generate landscape heterogeneity, these systems are expected to buffer watershed-scale salmon returns by increasing the likelihood that favorable combinations of habitat features and environmental conditions occur somewhere in the basin under variable climate and local conditions.</w:t>
-      </w:r>
-      <w:r>
-        <w:rPr>
-          <w:rFonts w:ascii="Garamond" w:hAnsi="Garamond"/>
-        </w:rPr>
-        <w:t xml:space="preserve"> </w:t>
-      </w:r>
-      <w:r>
-        <w:rPr>
-          <w:rFonts w:ascii="Garamond" w:hAnsi="Garamond"/>
-        </w:rPr>
-        <w:t>This pattern has been observed in the Nushagak River, a large salmon-bearing watershed in western Alaska, but it has not yet been empirically tested at larger spatial scales or over longer timeframes in Alaska’s most productive watersheds.</w:t>
+          <w:sz w:val="22"/>
+          <w:szCs w:val="22"/>
+        </w:rPr>
+        <w:t>Despite variability among tributaries and sub-basin regions, this pattern is expected to stabilize ecosystem-scale performance (i.e., total salmon returns) by maintaining a diverse set of habitat conditions whose performance is weakly or negatively correlated under varying environmental conditions.</w:t>
       </w:r>
     </w:p>
     <w:p>
@@ -681,6 +687,12 @@
           <w:rFonts w:ascii="Garamond" w:hAnsi="Garamond"/>
         </w:rPr>
       </w:pPr>
+      <w:r>
+        <w:rPr>
+          <w:rFonts w:ascii="Garamond" w:hAnsi="Garamond"/>
+        </w:rPr>
+        <w:t>Although the “shifting habitat mosaic” has been extensively described in relatively small ecosystems, it has only recently been empirically tested at the watershed scale in salmon systems, and then over relatively short timeframes (≤3 years; Brennan et al., 2019). To date, this pattern has not been examined in the world’s largest salmon-bearing watersheds or over longer temporal scales. Here, we reconstruct spatiotemporal patterns of watershed-scale production in the Yukon and Kuskokwim river basins—the largest salmon-bearing watersheds in North America—over a six-year period using otolith microchemistry, providing a framework for evaluating shifting habitat mosaics across large spatial extents and multi-year timescales.</w:t>
+      </w:r>
     </w:p>
     <w:p>
       <w:pPr>
@@ -707,6 +719,7 @@
       <w:pPr>
         <w:pStyle w:val="font-claude-response-body"/>
         <w:spacing w:line="360" w:lineRule="auto"/>
+        <w:ind w:left="1080"/>
         <w:rPr>
           <w:rFonts w:ascii="Garamond" w:hAnsi="Garamond"/>
           <w:b/>
@@ -715,7 +728,11 @@
           <w:szCs w:val="22"/>
         </w:rPr>
       </w:pPr>
-      <w:r>
+    </w:p>
+    <w:p>
+      <w:pPr>
+        <w:pStyle w:val="font-claude-response-body"/>
+        <w:spacing w:line="360" w:lineRule="auto"/>
         <w:rPr>
           <w:rFonts w:ascii="Garamond" w:hAnsi="Garamond"/>
           <w:b/>
@@ -723,17 +740,8 @@
           <w:sz w:val="22"/>
           <w:szCs w:val="22"/>
         </w:rPr>
-        <w:t xml:space="preserve">** Why does this matter </w:t>
-      </w:r>
-    </w:p>
-    <w:p>
-      <w:pPr>
-        <w:pStyle w:val="font-claude-response-body"/>
-        <w:numPr>
-          <w:ilvl w:val="0"/>
-          <w:numId w:val="2"/>
-        </w:numPr>
-        <w:spacing w:line="360" w:lineRule="auto"/>
+      </w:pPr>
+      <w:r>
         <w:rPr>
           <w:rFonts w:ascii="Garamond" w:hAnsi="Garamond"/>
           <w:b/>
@@ -741,213 +749,7 @@
           <w:sz w:val="22"/>
           <w:szCs w:val="22"/>
         </w:rPr>
-      </w:pPr>
-      <w:r>
-        <w:rPr>
-          <w:rFonts w:ascii="Garamond" w:hAnsi="Garamond"/>
-          <w:b/>
-          <w:bCs/>
-          <w:sz w:val="22"/>
-          <w:szCs w:val="22"/>
-        </w:rPr>
-        <w:t xml:space="preserve">This process arises from an ecosystem which has maintained hydrological connectivity and processes that generate landscape heterogeneity. </w:t>
-      </w:r>
-    </w:p>
-    <w:p>
-      <w:pPr>
-        <w:pStyle w:val="font-claude-response-body"/>
-        <w:numPr>
-          <w:ilvl w:val="0"/>
-          <w:numId w:val="2"/>
-        </w:numPr>
-        <w:spacing w:line="360" w:lineRule="auto"/>
-        <w:rPr>
-          <w:rFonts w:ascii="Garamond" w:hAnsi="Garamond"/>
-          <w:sz w:val="22"/>
-          <w:szCs w:val="22"/>
-        </w:rPr>
-      </w:pPr>
-      <w:r>
-        <w:rPr>
-          <w:rFonts w:ascii="Garamond" w:hAnsi="Garamond"/>
-          <w:sz w:val="22"/>
-          <w:szCs w:val="22"/>
-        </w:rPr>
         <w:lastRenderedPageBreak/>
-        <w:t>P</w:t>
-      </w:r>
-      <w:r>
-        <w:rPr>
-          <w:rFonts w:ascii="Garamond" w:hAnsi="Garamond"/>
-          <w:sz w:val="22"/>
-          <w:szCs w:val="22"/>
-        </w:rPr>
-        <w:t xml:space="preserve">ortfolio effect, shifting production patterns among years reflects the capacity of the shifting habitat mosaic to produce favorable conditions somewhere in the basin despite variability in prevailing climate conditions among years. </w:t>
-      </w:r>
-    </w:p>
-    <w:p>
-      <w:pPr>
-        <w:pStyle w:val="font-claude-response-body"/>
-        <w:numPr>
-          <w:ilvl w:val="0"/>
-          <w:numId w:val="2"/>
-        </w:numPr>
-        <w:spacing w:line="360" w:lineRule="auto"/>
-        <w:rPr>
-          <w:rFonts w:ascii="Garamond" w:hAnsi="Garamond"/>
-          <w:sz w:val="22"/>
-          <w:szCs w:val="22"/>
-        </w:rPr>
-      </w:pPr>
-      <w:r>
-        <w:rPr>
-          <w:rFonts w:ascii="Garamond" w:hAnsi="Garamond"/>
-          <w:sz w:val="22"/>
-          <w:szCs w:val="22"/>
-        </w:rPr>
-        <w:t xml:space="preserve"> This ability to compensate (weak or negative covariance) means that variability in returns at larger aggregate spatial scales is buffered (lower CV at larger spatial scales) </w:t>
-      </w:r>
-    </w:p>
-    <w:p>
-      <w:pPr>
-        <w:pStyle w:val="font-claude-response-body"/>
-        <w:spacing w:line="360" w:lineRule="auto"/>
-        <w:rPr>
-          <w:rFonts w:ascii="Garamond" w:hAnsi="Garamond"/>
-          <w:b/>
-          <w:bCs/>
-          <w:sz w:val="22"/>
-          <w:szCs w:val="22"/>
-        </w:rPr>
-      </w:pPr>
-    </w:p>
-    <w:p>
-      <w:pPr>
-        <w:pStyle w:val="font-claude-response-body"/>
-        <w:spacing w:line="360" w:lineRule="auto"/>
-        <w:rPr>
-          <w:rFonts w:ascii="Garamond" w:hAnsi="Garamond"/>
-          <w:b/>
-          <w:bCs/>
-          <w:sz w:val="22"/>
-          <w:szCs w:val="22"/>
-        </w:rPr>
-      </w:pPr>
-      <w:r>
-        <w:rPr>
-          <w:rFonts w:ascii="Garamond" w:hAnsi="Garamond"/>
-          <w:b/>
-          <w:bCs/>
-          <w:sz w:val="22"/>
-          <w:szCs w:val="22"/>
-        </w:rPr>
-        <w:t xml:space="preserve">Why is this different? </w:t>
-      </w:r>
-    </w:p>
-    <w:p>
-      <w:pPr>
-        <w:pStyle w:val="font-claude-response-body"/>
-        <w:numPr>
-          <w:ilvl w:val="0"/>
-          <w:numId w:val="2"/>
-        </w:numPr>
-        <w:spacing w:line="360" w:lineRule="auto"/>
-        <w:rPr>
-          <w:rFonts w:ascii="Garamond" w:hAnsi="Garamond"/>
-          <w:sz w:val="22"/>
-          <w:szCs w:val="22"/>
-        </w:rPr>
-      </w:pPr>
-      <w:r>
-        <w:rPr>
-          <w:rFonts w:ascii="Garamond" w:hAnsi="Garamond"/>
-          <w:sz w:val="22"/>
-          <w:szCs w:val="22"/>
-        </w:rPr>
-        <w:t xml:space="preserve">These patterns have been suggested at smaller spatial scales, and validated with limited years of data in a smaller Alaska river basin (Nush) </w:t>
-      </w:r>
-    </w:p>
-    <w:p>
-      <w:pPr>
-        <w:pStyle w:val="font-claude-response-body"/>
-        <w:numPr>
-          <w:ilvl w:val="0"/>
-          <w:numId w:val="2"/>
-        </w:numPr>
-        <w:spacing w:line="360" w:lineRule="auto"/>
-        <w:rPr>
-          <w:rFonts w:ascii="Garamond" w:hAnsi="Garamond"/>
-          <w:sz w:val="22"/>
-          <w:szCs w:val="22"/>
-        </w:rPr>
-      </w:pPr>
-      <w:r>
-        <w:rPr>
-          <w:rFonts w:ascii="Garamond" w:hAnsi="Garamond"/>
-          <w:sz w:val="22"/>
-          <w:szCs w:val="22"/>
-        </w:rPr>
-        <w:t xml:space="preserve">But the question is </w:t>
-      </w:r>
-      <w:r>
-        <w:rPr>
-          <w:rFonts w:ascii="Garamond" w:hAnsi="Garamond"/>
-          <w:sz w:val="22"/>
-          <w:szCs w:val="22"/>
-        </w:rPr>
-        <w:t>whether</w:t>
-      </w:r>
-      <w:r>
-        <w:rPr>
-          <w:rFonts w:ascii="Garamond" w:hAnsi="Garamond"/>
-          <w:sz w:val="22"/>
-          <w:szCs w:val="22"/>
-        </w:rPr>
-        <w:t xml:space="preserve"> this pattern holds in the world’s largest salmon producing watersheds (Yukon and Kusko) </w:t>
-      </w:r>
-      <w:r>
-        <w:rPr>
-          <w:rFonts w:ascii="Garamond" w:hAnsi="Garamond"/>
-          <w:sz w:val="22"/>
-          <w:szCs w:val="22"/>
-        </w:rPr>
-        <w:t xml:space="preserve">and over a longer timescale </w:t>
-      </w:r>
-    </w:p>
-    <w:p>
-      <w:pPr>
-        <w:pStyle w:val="font-claude-response-body"/>
-        <w:spacing w:line="360" w:lineRule="auto"/>
-        <w:ind w:left="1080"/>
-        <w:rPr>
-          <w:rFonts w:ascii="Garamond" w:hAnsi="Garamond"/>
-          <w:b/>
-          <w:bCs/>
-          <w:sz w:val="22"/>
-          <w:szCs w:val="22"/>
-        </w:rPr>
-      </w:pPr>
-    </w:p>
-    <w:p>
-      <w:pPr>
-        <w:pStyle w:val="font-claude-response-body"/>
-        <w:spacing w:line="360" w:lineRule="auto"/>
-        <w:rPr>
-          <w:rFonts w:ascii="Garamond" w:hAnsi="Garamond"/>
-          <w:b/>
-          <w:bCs/>
-          <w:sz w:val="22"/>
-          <w:szCs w:val="22"/>
-        </w:rPr>
-      </w:pPr>
-      <w:r>
-        <w:rPr>
-          <w:rFonts w:ascii="Garamond" w:hAnsi="Garamond"/>
-          <w:b/>
-          <w:bCs/>
-          <w:sz w:val="22"/>
-          <w:szCs w:val="22"/>
-        </w:rPr>
         <w:t xml:space="preserve">Here, we will… </w:t>
       </w:r>
     </w:p>
@@ -1292,6 +1094,118 @@
     </w:lvl>
   </w:abstractNum>
   <w:abstractNum w:abstractNumId="1" w15:restartNumberingAfterBreak="0">
+    <w:nsid w:val="0ADB168A"/>
+    <w:multiLevelType w:val="hybridMultilevel"/>
+    <w:tmpl w:val="76425974"/>
+    <w:lvl w:ilvl="0" w:tplc="73783AFE">
+      <w:numFmt w:val="bullet"/>
+      <w:lvlText w:val="-"/>
+      <w:lvlJc w:val="left"/>
+      <w:pPr>
+        <w:ind w:left="720" w:hanging="360"/>
+      </w:pPr>
+      <w:rPr>
+        <w:rFonts w:ascii="Garamond" w:eastAsia="Times New Roman" w:hAnsi="Garamond" w:cs="Times New Roman" w:hint="default"/>
+      </w:rPr>
+    </w:lvl>
+    <w:lvl w:ilvl="1" w:tplc="04090003" w:tentative="1">
+      <w:start w:val="1"/>
+      <w:numFmt w:val="bullet"/>
+      <w:lvlText w:val="o"/>
+      <w:lvlJc w:val="left"/>
+      <w:pPr>
+        <w:ind w:left="1440" w:hanging="360"/>
+      </w:pPr>
+      <w:rPr>
+        <w:rFonts w:ascii="Courier New" w:hAnsi="Courier New" w:cs="Courier New" w:hint="default"/>
+      </w:rPr>
+    </w:lvl>
+    <w:lvl w:ilvl="2" w:tplc="04090005" w:tentative="1">
+      <w:start w:val="1"/>
+      <w:numFmt w:val="bullet"/>
+      <w:lvlText w:val=""/>
+      <w:lvlJc w:val="left"/>
+      <w:pPr>
+        <w:ind w:left="2160" w:hanging="360"/>
+      </w:pPr>
+      <w:rPr>
+        <w:rFonts w:ascii="Wingdings" w:hAnsi="Wingdings" w:hint="default"/>
+      </w:rPr>
+    </w:lvl>
+    <w:lvl w:ilvl="3" w:tplc="04090001" w:tentative="1">
+      <w:start w:val="1"/>
+      <w:numFmt w:val="bullet"/>
+      <w:lvlText w:val=""/>
+      <w:lvlJc w:val="left"/>
+      <w:pPr>
+        <w:ind w:left="2880" w:hanging="360"/>
+      </w:pPr>
+      <w:rPr>
+        <w:rFonts w:ascii="Symbol" w:hAnsi="Symbol" w:hint="default"/>
+      </w:rPr>
+    </w:lvl>
+    <w:lvl w:ilvl="4" w:tplc="04090003" w:tentative="1">
+      <w:start w:val="1"/>
+      <w:numFmt w:val="bullet"/>
+      <w:lvlText w:val="o"/>
+      <w:lvlJc w:val="left"/>
+      <w:pPr>
+        <w:ind w:left="3600" w:hanging="360"/>
+      </w:pPr>
+      <w:rPr>
+        <w:rFonts w:ascii="Courier New" w:hAnsi="Courier New" w:cs="Courier New" w:hint="default"/>
+      </w:rPr>
+    </w:lvl>
+    <w:lvl w:ilvl="5" w:tplc="04090005" w:tentative="1">
+      <w:start w:val="1"/>
+      <w:numFmt w:val="bullet"/>
+      <w:lvlText w:val=""/>
+      <w:lvlJc w:val="left"/>
+      <w:pPr>
+        <w:ind w:left="4320" w:hanging="360"/>
+      </w:pPr>
+      <w:rPr>
+        <w:rFonts w:ascii="Wingdings" w:hAnsi="Wingdings" w:hint="default"/>
+      </w:rPr>
+    </w:lvl>
+    <w:lvl w:ilvl="6" w:tplc="04090001" w:tentative="1">
+      <w:start w:val="1"/>
+      <w:numFmt w:val="bullet"/>
+      <w:lvlText w:val=""/>
+      <w:lvlJc w:val="left"/>
+      <w:pPr>
+        <w:ind w:left="5040" w:hanging="360"/>
+      </w:pPr>
+      <w:rPr>
+        <w:rFonts w:ascii="Symbol" w:hAnsi="Symbol" w:hint="default"/>
+      </w:rPr>
+    </w:lvl>
+    <w:lvl w:ilvl="7" w:tplc="04090003" w:tentative="1">
+      <w:start w:val="1"/>
+      <w:numFmt w:val="bullet"/>
+      <w:lvlText w:val="o"/>
+      <w:lvlJc w:val="left"/>
+      <w:pPr>
+        <w:ind w:left="5760" w:hanging="360"/>
+      </w:pPr>
+      <w:rPr>
+        <w:rFonts w:ascii="Courier New" w:hAnsi="Courier New" w:cs="Courier New" w:hint="default"/>
+      </w:rPr>
+    </w:lvl>
+    <w:lvl w:ilvl="8" w:tplc="04090005" w:tentative="1">
+      <w:start w:val="1"/>
+      <w:numFmt w:val="bullet"/>
+      <w:lvlText w:val=""/>
+      <w:lvlJc w:val="left"/>
+      <w:pPr>
+        <w:ind w:left="6480" w:hanging="360"/>
+      </w:pPr>
+      <w:rPr>
+        <w:rFonts w:ascii="Wingdings" w:hAnsi="Wingdings" w:hint="default"/>
+      </w:rPr>
+    </w:lvl>
+  </w:abstractNum>
+  <w:abstractNum w:abstractNumId="2" w15:restartNumberingAfterBreak="0">
     <w:nsid w:val="0ED529C1"/>
     <w:multiLevelType w:val="hybridMultilevel"/>
     <w:tmpl w:val="BEB237CA"/>
@@ -1403,7 +1317,7 @@
       </w:rPr>
     </w:lvl>
   </w:abstractNum>
-  <w:abstractNum w:abstractNumId="2" w15:restartNumberingAfterBreak="0">
+  <w:abstractNum w:abstractNumId="3" w15:restartNumberingAfterBreak="0">
     <w:nsid w:val="27BF7E25"/>
     <w:multiLevelType w:val="hybridMultilevel"/>
     <w:tmpl w:val="F3E8A09A"/>
@@ -1519,10 +1433,13 @@
     <w:abstractNumId w:val="0"/>
   </w:num>
   <w:num w:numId="2" w16cid:durableId="1274706172">
-    <w:abstractNumId w:val="1"/>
+    <w:abstractNumId w:val="2"/>
   </w:num>
   <w:num w:numId="3" w16cid:durableId="1027416018">
-    <w:abstractNumId w:val="2"/>
+    <w:abstractNumId w:val="3"/>
+  </w:num>
+  <w:num w:numId="4" w16cid:durableId="673529083">
+    <w:abstractNumId w:val="1"/>
   </w:num>
 </w:numbering>
 </file>

</xml_diff>

<commit_message>
added some brief outline for methods
</commit_message>
<xml_diff>
--- a/Docs/Working_SMH2.docx
+++ b/Docs/Working_SMH2.docx
@@ -697,157 +697,6 @@
     <w:p>
       <w:pPr>
         <w:pStyle w:val="font-claude-response-body"/>
-        <w:spacing w:line="360" w:lineRule="auto"/>
-        <w:ind w:firstLine="360"/>
-        <w:rPr>
-          <w:rFonts w:ascii="Garamond" w:hAnsi="Garamond"/>
-        </w:rPr>
-      </w:pPr>
-    </w:p>
-    <w:p>
-      <w:pPr>
-        <w:pStyle w:val="font-claude-response-body"/>
-        <w:spacing w:line="360" w:lineRule="auto"/>
-        <w:ind w:firstLine="360"/>
-        <w:rPr>
-          <w:sz w:val="22"/>
-          <w:szCs w:val="22"/>
-        </w:rPr>
-      </w:pPr>
-    </w:p>
-    <w:p>
-      <w:pPr>
-        <w:pStyle w:val="font-claude-response-body"/>
-        <w:spacing w:line="360" w:lineRule="auto"/>
-        <w:ind w:left="1080"/>
-        <w:rPr>
-          <w:rFonts w:ascii="Garamond" w:hAnsi="Garamond"/>
-          <w:b/>
-          <w:bCs/>
-          <w:sz w:val="22"/>
-          <w:szCs w:val="22"/>
-        </w:rPr>
-      </w:pPr>
-    </w:p>
-    <w:p>
-      <w:pPr>
-        <w:pStyle w:val="font-claude-response-body"/>
-        <w:spacing w:line="360" w:lineRule="auto"/>
-        <w:rPr>
-          <w:rFonts w:ascii="Garamond" w:hAnsi="Garamond"/>
-          <w:b/>
-          <w:bCs/>
-          <w:sz w:val="22"/>
-          <w:szCs w:val="22"/>
-        </w:rPr>
-      </w:pPr>
-      <w:r>
-        <w:rPr>
-          <w:rFonts w:ascii="Garamond" w:hAnsi="Garamond"/>
-          <w:b/>
-          <w:bCs/>
-          <w:sz w:val="22"/>
-          <w:szCs w:val="22"/>
-        </w:rPr>
-        <w:lastRenderedPageBreak/>
-        <w:t xml:space="preserve">Here, we will… </w:t>
-      </w:r>
-    </w:p>
-    <w:p>
-      <w:pPr>
-        <w:pStyle w:val="font-claude-response-body"/>
-        <w:numPr>
-          <w:ilvl w:val="0"/>
-          <w:numId w:val="2"/>
-        </w:numPr>
-        <w:spacing w:line="360" w:lineRule="auto"/>
-        <w:rPr>
-          <w:rFonts w:ascii="Garamond" w:hAnsi="Garamond"/>
-          <w:sz w:val="22"/>
-          <w:szCs w:val="22"/>
-        </w:rPr>
-      </w:pPr>
-      <w:r>
-        <w:rPr>
-          <w:rFonts w:ascii="Garamond" w:hAnsi="Garamond"/>
-          <w:sz w:val="22"/>
-          <w:szCs w:val="22"/>
-        </w:rPr>
-        <w:t xml:space="preserve">Reconstruct basin-wide patterns of natal origins in the Yukon and Kuskokwim river basin using otolith isotope approaches </w:t>
-      </w:r>
-    </w:p>
-    <w:p>
-      <w:pPr>
-        <w:pStyle w:val="font-claude-response-body"/>
-        <w:numPr>
-          <w:ilvl w:val="0"/>
-          <w:numId w:val="2"/>
-        </w:numPr>
-        <w:spacing w:line="360" w:lineRule="auto"/>
-        <w:rPr>
-          <w:rFonts w:ascii="Garamond" w:hAnsi="Garamond"/>
-          <w:sz w:val="22"/>
-          <w:szCs w:val="22"/>
-        </w:rPr>
-      </w:pPr>
-      <w:r>
-        <w:rPr>
-          <w:rFonts w:ascii="Garamond" w:hAnsi="Garamond"/>
-          <w:sz w:val="22"/>
-          <w:szCs w:val="22"/>
-        </w:rPr>
-        <w:t xml:space="preserve">Explore the variability in these patterns among several years in both river basins </w:t>
-      </w:r>
-    </w:p>
-    <w:p>
-      <w:pPr>
-        <w:pStyle w:val="font-claude-response-body"/>
-        <w:numPr>
-          <w:ilvl w:val="0"/>
-          <w:numId w:val="2"/>
-        </w:numPr>
-        <w:spacing w:line="360" w:lineRule="auto"/>
-        <w:rPr>
-          <w:rFonts w:ascii="Garamond" w:hAnsi="Garamond"/>
-          <w:sz w:val="22"/>
-          <w:szCs w:val="22"/>
-        </w:rPr>
-      </w:pPr>
-      <w:r>
-        <w:rPr>
-          <w:rFonts w:ascii="Garamond" w:hAnsi="Garamond"/>
-          <w:sz w:val="22"/>
-          <w:szCs w:val="22"/>
-        </w:rPr>
-        <w:t>Explore whether this variability reduces overall basin-wide productivity at several spatial scale</w:t>
-      </w:r>
-      <w:r>
-        <w:rPr>
-          <w:rFonts w:ascii="Garamond" w:hAnsi="Garamond"/>
-          <w:sz w:val="22"/>
-          <w:szCs w:val="22"/>
-        </w:rPr>
-        <w:t>s</w:t>
-      </w:r>
-    </w:p>
-    <w:p>
-      <w:pPr>
-        <w:pStyle w:val="font-claude-response-body"/>
-        <w:numPr>
-          <w:ilvl w:val="0"/>
-          <w:numId w:val="2"/>
-        </w:numPr>
-        <w:spacing w:line="360" w:lineRule="auto"/>
-        <w:rPr>
-          <w:rFonts w:ascii="Garamond" w:hAnsi="Garamond"/>
-          <w:sz w:val="22"/>
-          <w:szCs w:val="22"/>
-        </w:rPr>
-      </w:pPr>
-    </w:p>
-    <w:p>
-      <w:pPr>
-        <w:pStyle w:val="font-claude-response-body"/>
         <w:numPr>
           <w:ilvl w:val="0"/>
           <w:numId w:val="2"/>
@@ -895,6 +744,665 @@
         </w:rPr>
         <w:t xml:space="preserve">: </w:t>
       </w:r>
+    </w:p>
+    <w:p>
+      <w:pPr>
+        <w:pStyle w:val="font-claude-response-body"/>
+        <w:spacing w:line="360" w:lineRule="auto"/>
+        <w:rPr>
+          <w:rFonts w:ascii="Garamond" w:hAnsi="Garamond"/>
+          <w:b/>
+          <w:bCs/>
+          <w:sz w:val="32"/>
+          <w:szCs w:val="32"/>
+          <w:u w:val="single"/>
+        </w:rPr>
+      </w:pPr>
+    </w:p>
+    <w:p>
+      <w:pPr>
+        <w:pStyle w:val="font-claude-response-body"/>
+        <w:spacing w:line="360" w:lineRule="auto"/>
+        <w:rPr>
+          <w:rFonts w:ascii="Garamond" w:hAnsi="Garamond"/>
+          <w:b/>
+          <w:bCs/>
+          <w:sz w:val="32"/>
+          <w:szCs w:val="32"/>
+          <w:u w:val="single"/>
+        </w:rPr>
+      </w:pPr>
+    </w:p>
+    <w:p>
+      <w:pPr>
+        <w:pStyle w:val="font-claude-response-body"/>
+        <w:spacing w:line="360" w:lineRule="auto"/>
+        <w:rPr>
+          <w:rFonts w:ascii="Garamond" w:hAnsi="Garamond"/>
+          <w:b/>
+          <w:bCs/>
+          <w:sz w:val="32"/>
+          <w:szCs w:val="32"/>
+          <w:u w:val="single"/>
+        </w:rPr>
+      </w:pPr>
+    </w:p>
+    <w:p>
+      <w:pPr>
+        <w:pStyle w:val="font-claude-response-body"/>
+        <w:spacing w:line="360" w:lineRule="auto"/>
+        <w:rPr>
+          <w:rFonts w:ascii="Garamond" w:hAnsi="Garamond"/>
+          <w:b/>
+          <w:bCs/>
+          <w:sz w:val="32"/>
+          <w:szCs w:val="32"/>
+          <w:u w:val="single"/>
+        </w:rPr>
+      </w:pPr>
+    </w:p>
+    <w:p>
+      <w:pPr>
+        <w:pStyle w:val="font-claude-response-body"/>
+        <w:spacing w:line="360" w:lineRule="auto"/>
+        <w:rPr>
+          <w:rFonts w:ascii="Garamond" w:hAnsi="Garamond"/>
+          <w:b/>
+          <w:bCs/>
+          <w:sz w:val="32"/>
+          <w:szCs w:val="32"/>
+          <w:u w:val="single"/>
+        </w:rPr>
+      </w:pPr>
+    </w:p>
+    <w:p>
+      <w:pPr>
+        <w:pStyle w:val="font-claude-response-body"/>
+        <w:spacing w:line="360" w:lineRule="auto"/>
+        <w:rPr>
+          <w:rFonts w:ascii="Garamond" w:hAnsi="Garamond"/>
+          <w:b/>
+          <w:bCs/>
+          <w:sz w:val="32"/>
+          <w:szCs w:val="32"/>
+          <w:u w:val="single"/>
+        </w:rPr>
+      </w:pPr>
+      <w:r>
+        <w:rPr>
+          <w:rFonts w:ascii="Garamond" w:hAnsi="Garamond"/>
+          <w:b/>
+          <w:bCs/>
+          <w:sz w:val="32"/>
+          <w:szCs w:val="32"/>
+          <w:u w:val="single"/>
+        </w:rPr>
+        <w:t xml:space="preserve">Otolith </w:t>
+      </w:r>
+      <w:r>
+        <w:rPr>
+          <w:rFonts w:ascii="Garamond" w:hAnsi="Garamond"/>
+          <w:b/>
+          <w:bCs/>
+          <w:sz w:val="32"/>
+          <w:szCs w:val="32"/>
+          <w:u w:val="single"/>
+        </w:rPr>
+        <w:t xml:space="preserve">and Genetic Sample set </w:t>
+      </w:r>
+    </w:p>
+    <w:p>
+      <w:pPr>
+        <w:pStyle w:val="font-claude-response-body"/>
+        <w:numPr>
+          <w:ilvl w:val="0"/>
+          <w:numId w:val="2"/>
+        </w:numPr>
+        <w:spacing w:line="360" w:lineRule="auto"/>
+        <w:rPr>
+          <w:rFonts w:ascii="Garamond" w:hAnsi="Garamond"/>
+        </w:rPr>
+      </w:pPr>
+      <w:r>
+        <w:rPr>
+          <w:rFonts w:ascii="Garamond" w:hAnsi="Garamond"/>
+        </w:rPr>
+        <w:t xml:space="preserve">Otoliths (get N) were collected for the </w:t>
+      </w:r>
+      <w:r>
+        <w:rPr>
+          <w:rFonts w:ascii="Garamond" w:hAnsi="Garamond"/>
+        </w:rPr>
+        <w:t>Yukon River</w:t>
+      </w:r>
+      <w:r>
+        <w:rPr>
+          <w:rFonts w:ascii="Garamond" w:hAnsi="Garamond"/>
+        </w:rPr>
+        <w:t xml:space="preserve"> in (2015,2016,2017,2018,2019,2021) from the Lower Yukon Test fishery near </w:t>
+      </w:r>
+      <w:proofErr w:type="gramStart"/>
+      <w:r>
+        <w:rPr>
+          <w:rFonts w:ascii="Garamond" w:hAnsi="Garamond"/>
+        </w:rPr>
+        <w:t>Emmonak ,</w:t>
+      </w:r>
+      <w:proofErr w:type="gramEnd"/>
+      <w:r>
+        <w:rPr>
+          <w:rFonts w:ascii="Garamond" w:hAnsi="Garamond"/>
+        </w:rPr>
+        <w:t xml:space="preserve"> AK. </w:t>
+      </w:r>
+    </w:p>
+    <w:p>
+      <w:pPr>
+        <w:pStyle w:val="font-claude-response-body"/>
+        <w:numPr>
+          <w:ilvl w:val="0"/>
+          <w:numId w:val="2"/>
+        </w:numPr>
+        <w:spacing w:line="360" w:lineRule="auto"/>
+        <w:rPr>
+          <w:rFonts w:ascii="Garamond" w:hAnsi="Garamond"/>
+        </w:rPr>
+      </w:pPr>
+      <w:r>
+        <w:rPr>
+          <w:rFonts w:ascii="Garamond" w:hAnsi="Garamond"/>
+        </w:rPr>
+        <w:t xml:space="preserve">Otoliths (get N) were collected from the ONC on the </w:t>
+      </w:r>
+      <w:r>
+        <w:rPr>
+          <w:rFonts w:ascii="Garamond" w:hAnsi="Garamond"/>
+        </w:rPr>
+        <w:t>Kuskokwim River</w:t>
+      </w:r>
+      <w:r>
+        <w:rPr>
+          <w:rFonts w:ascii="Garamond" w:hAnsi="Garamond"/>
+        </w:rPr>
+        <w:t xml:space="preserve"> near Bethel, Alaska. </w:t>
+      </w:r>
+    </w:p>
+    <w:p>
+      <w:pPr>
+        <w:pStyle w:val="font-claude-response-body"/>
+        <w:numPr>
+          <w:ilvl w:val="0"/>
+          <w:numId w:val="2"/>
+        </w:numPr>
+        <w:spacing w:line="360" w:lineRule="auto"/>
+        <w:rPr>
+          <w:rFonts w:ascii="Garamond" w:hAnsi="Garamond"/>
+        </w:rPr>
+      </w:pPr>
+      <w:r>
+        <w:rPr>
+          <w:rFonts w:ascii="Garamond" w:hAnsi="Garamond"/>
+        </w:rPr>
+        <w:t>Otoliths were cut along the transverse plane to reveal the core, mounted on a mi</w:t>
+      </w:r>
+      <w:r>
+        <w:rPr>
+          <w:rFonts w:ascii="Garamond" w:hAnsi="Garamond"/>
+        </w:rPr>
+        <w:t xml:space="preserve">croscope slide, and polished. </w:t>
+      </w:r>
+    </w:p>
+    <w:p>
+      <w:pPr>
+        <w:pStyle w:val="font-claude-response-body"/>
+        <w:numPr>
+          <w:ilvl w:val="0"/>
+          <w:numId w:val="2"/>
+        </w:numPr>
+        <w:spacing w:line="360" w:lineRule="auto"/>
+        <w:rPr>
+          <w:rFonts w:ascii="Garamond" w:hAnsi="Garamond"/>
+        </w:rPr>
+      </w:pPr>
+      <w:r>
+        <w:rPr>
+          <w:rFonts w:ascii="Garamond" w:hAnsi="Garamond"/>
+        </w:rPr>
+        <w:t xml:space="preserve">LA-ICPMS was used at the University of Utah Strontium metals lab, where Sr87876 and Sr88 were collected </w:t>
+      </w:r>
+      <w:r>
+        <w:rPr>
+          <w:rFonts w:ascii="Garamond" w:hAnsi="Garamond"/>
+        </w:rPr>
+        <w:t>from the otolith core to just after marine entry.</w:t>
+      </w:r>
+    </w:p>
+    <w:p>
+      <w:pPr>
+        <w:pStyle w:val="font-claude-response-body"/>
+        <w:numPr>
+          <w:ilvl w:val="0"/>
+          <w:numId w:val="2"/>
+        </w:numPr>
+        <w:spacing w:line="360" w:lineRule="auto"/>
+        <w:rPr>
+          <w:rFonts w:ascii="Garamond" w:hAnsi="Garamond"/>
+        </w:rPr>
+      </w:pPr>
+      <w:r>
+        <w:rPr>
+          <w:rFonts w:ascii="Garamond" w:hAnsi="Garamond"/>
+        </w:rPr>
+        <w:t xml:space="preserve">Natal Origin was identified as the first stable region after the departure from the core region (Closest the marine value), a mean value was taken from this region by manual identification. </w:t>
+      </w:r>
+    </w:p>
+    <w:p>
+      <w:pPr>
+        <w:pStyle w:val="font-claude-response-body"/>
+        <w:spacing w:line="360" w:lineRule="auto"/>
+        <w:rPr>
+          <w:rFonts w:ascii="Garamond" w:hAnsi="Garamond"/>
+          <w:b/>
+          <w:bCs/>
+          <w:sz w:val="32"/>
+          <w:szCs w:val="32"/>
+          <w:u w:val="single"/>
+        </w:rPr>
+      </w:pPr>
+      <w:r>
+        <w:rPr>
+          <w:rFonts w:ascii="Garamond" w:hAnsi="Garamond"/>
+          <w:b/>
+          <w:bCs/>
+          <w:sz w:val="32"/>
+          <w:szCs w:val="32"/>
+          <w:u w:val="single"/>
+        </w:rPr>
+        <w:t>Provenance estimates</w:t>
+      </w:r>
+    </w:p>
+    <w:p>
+      <w:pPr>
+        <w:pStyle w:val="font-claude-response-body"/>
+        <w:numPr>
+          <w:ilvl w:val="0"/>
+          <w:numId w:val="2"/>
+        </w:numPr>
+        <w:spacing w:line="360" w:lineRule="auto"/>
+        <w:rPr>
+          <w:rFonts w:ascii="Garamond" w:hAnsi="Garamond"/>
+          <w:b/>
+          <w:bCs/>
+          <w:u w:val="single"/>
+        </w:rPr>
+      </w:pPr>
+      <w:r>
+        <w:rPr>
+          <w:rFonts w:ascii="Garamond" w:hAnsi="Garamond"/>
+        </w:rPr>
+        <w:t xml:space="preserve">Kuskokwim </w:t>
+      </w:r>
+      <w:proofErr w:type="spellStart"/>
+      <w:r>
+        <w:rPr>
+          <w:rFonts w:ascii="Garamond" w:hAnsi="Garamond"/>
+        </w:rPr>
+        <w:t>isoscape</w:t>
+      </w:r>
+      <w:proofErr w:type="spellEnd"/>
+      <w:r>
+        <w:rPr>
+          <w:rFonts w:ascii="Garamond" w:hAnsi="Garamond"/>
+        </w:rPr>
+        <w:t xml:space="preserve"> </w:t>
+      </w:r>
+      <w:r>
+        <w:rPr>
+          <w:rFonts w:ascii="Garamond" w:hAnsi="Garamond"/>
+        </w:rPr>
+        <w:t>(</w:t>
+      </w:r>
+      <w:r>
+        <w:rPr>
+          <w:rFonts w:ascii="Garamond" w:hAnsi="Garamond"/>
+        </w:rPr>
+        <w:t xml:space="preserve">French et al., 2016) </w:t>
+      </w:r>
+    </w:p>
+    <w:p>
+      <w:pPr>
+        <w:pStyle w:val="font-claude-response-body"/>
+        <w:numPr>
+          <w:ilvl w:val="0"/>
+          <w:numId w:val="2"/>
+        </w:numPr>
+        <w:spacing w:line="360" w:lineRule="auto"/>
+        <w:rPr>
+          <w:rFonts w:ascii="Garamond" w:hAnsi="Garamond"/>
+          <w:b/>
+          <w:bCs/>
+          <w:u w:val="single"/>
+        </w:rPr>
+      </w:pPr>
+      <w:r>
+        <w:rPr>
+          <w:rFonts w:ascii="Garamond" w:hAnsi="Garamond"/>
+        </w:rPr>
+        <w:t xml:space="preserve">Yukon </w:t>
+      </w:r>
+      <w:proofErr w:type="spellStart"/>
+      <w:r>
+        <w:rPr>
+          <w:rFonts w:ascii="Garamond" w:hAnsi="Garamond"/>
+        </w:rPr>
+        <w:t>isoscape</w:t>
+      </w:r>
+      <w:proofErr w:type="spellEnd"/>
+      <w:r>
+        <w:rPr>
+          <w:rFonts w:ascii="Garamond" w:hAnsi="Garamond"/>
+        </w:rPr>
+        <w:t xml:space="preserve"> (Makhlouf et al., 2025) </w:t>
+      </w:r>
+    </w:p>
+    <w:p>
+      <w:pPr>
+        <w:pStyle w:val="font-claude-response-body"/>
+        <w:numPr>
+          <w:ilvl w:val="0"/>
+          <w:numId w:val="2"/>
+        </w:numPr>
+        <w:spacing w:line="360" w:lineRule="auto"/>
+        <w:rPr>
+          <w:rFonts w:ascii="Garamond" w:hAnsi="Garamond"/>
+          <w:b/>
+          <w:bCs/>
+          <w:u w:val="single"/>
+        </w:rPr>
+      </w:pPr>
+      <w:proofErr w:type="spellStart"/>
+      <w:r>
+        <w:rPr>
+          <w:rFonts w:ascii="Garamond" w:hAnsi="Garamond"/>
+        </w:rPr>
+        <w:t>Mimimum</w:t>
+      </w:r>
+      <w:proofErr w:type="spellEnd"/>
+      <w:r>
+        <w:rPr>
+          <w:rFonts w:ascii="Garamond" w:hAnsi="Garamond"/>
+        </w:rPr>
+        <w:t xml:space="preserve"> error values for the </w:t>
+      </w:r>
+      <w:proofErr w:type="spellStart"/>
+      <w:r>
+        <w:rPr>
+          <w:rFonts w:ascii="Garamond" w:hAnsi="Garamond"/>
+        </w:rPr>
+        <w:t>isoscapes</w:t>
+      </w:r>
+      <w:proofErr w:type="spellEnd"/>
+      <w:r>
+        <w:rPr>
+          <w:rFonts w:ascii="Garamond" w:hAnsi="Garamond"/>
+        </w:rPr>
+        <w:t xml:space="preserve"> were bumped up to .003 and .0005 for the Yukon and Kusko, respectively. </w:t>
+      </w:r>
+    </w:p>
+    <w:p>
+      <w:pPr>
+        <w:pStyle w:val="font-claude-response-body"/>
+        <w:numPr>
+          <w:ilvl w:val="0"/>
+          <w:numId w:val="2"/>
+        </w:numPr>
+        <w:spacing w:line="360" w:lineRule="auto"/>
+        <w:rPr>
+          <w:rFonts w:ascii="Garamond" w:hAnsi="Garamond"/>
+          <w:b/>
+          <w:bCs/>
+          <w:u w:val="single"/>
+        </w:rPr>
+      </w:pPr>
+      <w:r>
+        <w:rPr>
+          <w:rFonts w:ascii="Garamond" w:hAnsi="Garamond"/>
+        </w:rPr>
+        <w:t xml:space="preserve">Natal Origin was used to assign using a </w:t>
+      </w:r>
+      <w:proofErr w:type="spellStart"/>
+      <w:r>
+        <w:rPr>
+          <w:rFonts w:ascii="Garamond" w:hAnsi="Garamond"/>
+        </w:rPr>
+        <w:t>probabalitic</w:t>
+      </w:r>
+      <w:proofErr w:type="spellEnd"/>
+      <w:r>
+        <w:rPr>
+          <w:rFonts w:ascii="Garamond" w:hAnsi="Garamond"/>
+        </w:rPr>
+        <w:t xml:space="preserve"> Bayesian framework (describe or point to previous papers). </w:t>
+      </w:r>
+    </w:p>
+    <w:p>
+      <w:pPr>
+        <w:pStyle w:val="font-claude-response-body"/>
+        <w:numPr>
+          <w:ilvl w:val="0"/>
+          <w:numId w:val="2"/>
+        </w:numPr>
+        <w:spacing w:line="360" w:lineRule="auto"/>
+        <w:rPr>
+          <w:rFonts w:ascii="Garamond" w:hAnsi="Garamond"/>
+          <w:b/>
+          <w:bCs/>
+          <w:u w:val="single"/>
+        </w:rPr>
+      </w:pPr>
+      <w:r>
+        <w:rPr>
+          <w:rFonts w:ascii="Garamond" w:hAnsi="Garamond"/>
+        </w:rPr>
+        <w:t xml:space="preserve">Updated and consistent “habitat prior” </w:t>
+      </w:r>
+    </w:p>
+    <w:p>
+      <w:pPr>
+        <w:pStyle w:val="font-claude-response-body"/>
+        <w:numPr>
+          <w:ilvl w:val="0"/>
+          <w:numId w:val="2"/>
+        </w:numPr>
+        <w:spacing w:line="360" w:lineRule="auto"/>
+        <w:rPr>
+          <w:rFonts w:ascii="Garamond" w:hAnsi="Garamond"/>
+          <w:b/>
+          <w:bCs/>
+          <w:u w:val="single"/>
+        </w:rPr>
+      </w:pPr>
+      <w:r>
+        <w:rPr>
+          <w:rFonts w:ascii="Garamond" w:hAnsi="Garamond"/>
+        </w:rPr>
+        <w:t>“Presence prior” in the mainstem (maybe the 2</w:t>
+      </w:r>
+      <w:r>
+        <w:rPr>
+          <w:rFonts w:ascii="Garamond" w:hAnsi="Garamond"/>
+          <w:vertAlign w:val="superscript"/>
+        </w:rPr>
+        <w:t>nd</w:t>
+      </w:r>
+      <w:r>
+        <w:rPr>
+          <w:rFonts w:ascii="Garamond" w:hAnsi="Garamond"/>
+        </w:rPr>
+        <w:t xml:space="preserve"> highest)</w:t>
+      </w:r>
+    </w:p>
+    <w:p>
+      <w:pPr>
+        <w:pStyle w:val="font-claude-response-body"/>
+        <w:numPr>
+          <w:ilvl w:val="0"/>
+          <w:numId w:val="2"/>
+        </w:numPr>
+        <w:spacing w:line="360" w:lineRule="auto"/>
+        <w:rPr>
+          <w:rFonts w:ascii="Garamond" w:hAnsi="Garamond"/>
+          <w:b/>
+          <w:bCs/>
+          <w:u w:val="single"/>
+        </w:rPr>
+      </w:pPr>
+      <w:r>
+        <w:rPr>
+          <w:rFonts w:ascii="Garamond" w:hAnsi="Garamond"/>
+        </w:rPr>
+        <w:lastRenderedPageBreak/>
+        <w:t>The Yukon has much higher error and potential area, therefore, to constrain assignments we only looked at the top .3 of assignments</w:t>
+      </w:r>
+    </w:p>
+    <w:p>
+      <w:pPr>
+        <w:pStyle w:val="font-claude-response-body"/>
+        <w:numPr>
+          <w:ilvl w:val="0"/>
+          <w:numId w:val="2"/>
+        </w:numPr>
+        <w:spacing w:line="360" w:lineRule="auto"/>
+        <w:rPr>
+          <w:rFonts w:ascii="Garamond" w:hAnsi="Garamond"/>
+          <w:b/>
+          <w:bCs/>
+          <w:u w:val="single"/>
+        </w:rPr>
+      </w:pPr>
+      <w:r>
+        <w:rPr>
+          <w:rFonts w:ascii="Garamond" w:hAnsi="Garamond"/>
+        </w:rPr>
+        <w:t xml:space="preserve">Summed across all individuals and rescaled to sum to 1 across the basin. </w:t>
+      </w:r>
+    </w:p>
+    <w:p>
+      <w:pPr>
+        <w:pStyle w:val="font-claude-response-body"/>
+        <w:numPr>
+          <w:ilvl w:val="0"/>
+          <w:numId w:val="2"/>
+        </w:numPr>
+        <w:spacing w:line="360" w:lineRule="auto"/>
+        <w:rPr>
+          <w:rFonts w:ascii="Garamond" w:hAnsi="Garamond"/>
+          <w:b/>
+          <w:bCs/>
+          <w:u w:val="single"/>
+        </w:rPr>
+      </w:pPr>
+      <w:r>
+        <w:rPr>
+          <w:rFonts w:ascii="Garamond" w:hAnsi="Garamond"/>
+        </w:rPr>
+        <w:t xml:space="preserve">In each year, these values were then </w:t>
+      </w:r>
+      <w:proofErr w:type="spellStart"/>
+      <w:r>
+        <w:rPr>
+          <w:rFonts w:ascii="Garamond" w:hAnsi="Garamond"/>
+        </w:rPr>
+        <w:t>multipled</w:t>
+      </w:r>
+      <w:proofErr w:type="spellEnd"/>
+      <w:r>
+        <w:rPr>
+          <w:rFonts w:ascii="Garamond" w:hAnsi="Garamond"/>
+        </w:rPr>
+        <w:t xml:space="preserve"> by the total *Escapement or return* to estimate the number of individuals. </w:t>
+      </w:r>
+    </w:p>
+    <w:p>
+      <w:pPr>
+        <w:pStyle w:val="font-claude-response-body"/>
+        <w:numPr>
+          <w:ilvl w:val="0"/>
+          <w:numId w:val="2"/>
+        </w:numPr>
+        <w:spacing w:line="360" w:lineRule="auto"/>
+        <w:rPr>
+          <w:rFonts w:ascii="Garamond" w:hAnsi="Garamond"/>
+          <w:b/>
+          <w:bCs/>
+          <w:u w:val="single"/>
+        </w:rPr>
+      </w:pPr>
+      <w:r>
+        <w:rPr>
+          <w:rFonts w:ascii="Garamond" w:hAnsi="Garamond"/>
+        </w:rPr>
+        <w:t xml:space="preserve">For years where we don’t have all the Yukon data, we did 50% of the total CPUE. </w:t>
+      </w:r>
+    </w:p>
+    <w:p>
+      <w:pPr>
+        <w:pStyle w:val="font-claude-response-body"/>
+        <w:spacing w:line="360" w:lineRule="auto"/>
+        <w:rPr>
+          <w:rFonts w:ascii="Garamond" w:hAnsi="Garamond"/>
+        </w:rPr>
+      </w:pPr>
+      <w:r>
+        <w:rPr>
+          <w:rFonts w:ascii="Garamond" w:hAnsi="Garamond"/>
+        </w:rPr>
+        <w:t xml:space="preserve">Age class and top growth analysis. </w:t>
+      </w:r>
+    </w:p>
+    <w:p>
+      <w:pPr>
+        <w:pStyle w:val="font-claude-response-body"/>
+        <w:spacing w:line="360" w:lineRule="auto"/>
+        <w:rPr>
+          <w:rFonts w:ascii="Garamond" w:hAnsi="Garamond"/>
+        </w:rPr>
+      </w:pPr>
+      <w:r>
+        <w:rPr>
+          <w:rFonts w:ascii="Garamond" w:hAnsi="Garamond"/>
+        </w:rPr>
+        <w:t xml:space="preserve">Spatial production pattern Analysis </w:t>
+      </w:r>
+    </w:p>
+    <w:p>
+      <w:pPr>
+        <w:pStyle w:val="font-claude-response-body"/>
+        <w:spacing w:line="360" w:lineRule="auto"/>
+        <w:rPr>
+          <w:rFonts w:ascii="Garamond" w:hAnsi="Garamond"/>
+        </w:rPr>
+      </w:pPr>
+      <w:r>
+        <w:rPr>
+          <w:rFonts w:ascii="Garamond" w:hAnsi="Garamond"/>
+        </w:rPr>
+        <w:t xml:space="preserve">Variability at spatial scales </w:t>
+      </w:r>
+    </w:p>
+    <w:p>
+      <w:pPr>
+        <w:pStyle w:val="font-claude-response-body"/>
+        <w:spacing w:line="360" w:lineRule="auto"/>
+        <w:rPr>
+          <w:rFonts w:ascii="Garamond" w:hAnsi="Garamond"/>
+          <w:b/>
+          <w:bCs/>
+          <w:sz w:val="32"/>
+          <w:szCs w:val="32"/>
+          <w:u w:val="single"/>
+        </w:rPr>
+      </w:pPr>
     </w:p>
     <w:p>
       <w:pPr>

</xml_diff>

<commit_message>
moved tonsof things around
</commit_message>
<xml_diff>
--- a/Docs/Working_SMH2.docx
+++ b/Docs/Working_SMH2.docx
@@ -18,48 +18,1386 @@
         <w:jc w:val="center"/>
         <w:rPr>
           <w:rFonts w:ascii="Garamond" w:hAnsi="Garamond"/>
-          <w:sz w:val="36"/>
-          <w:szCs w:val="36"/>
-        </w:rPr>
-      </w:pPr>
-      <w:r>
-        <w:rPr>
-          <w:rFonts w:ascii="Garamond" w:hAnsi="Garamond"/>
-          <w:sz w:val="36"/>
-          <w:szCs w:val="36"/>
-        </w:rPr>
-        <w:t>Shifting Habitat Mosaics in Alaska’s largest river basins</w:t>
-      </w:r>
-    </w:p>
-    <w:p>
-      <w:pPr>
-        <w:spacing w:line="360" w:lineRule="auto"/>
-        <w:jc w:val="center"/>
-        <w:rPr>
-          <w:rFonts w:ascii="Garamond" w:hAnsi="Garamond"/>
-        </w:rPr>
-      </w:pPr>
-      <w:r>
-        <w:rPr>
-          <w:rFonts w:ascii="Garamond" w:hAnsi="Garamond"/>
-        </w:rPr>
-        <w:t>Ben Makhlouf, Daniel E. Schindler, Timothy J Cline</w:t>
-      </w:r>
-    </w:p>
-    <w:p>
-      <w:pPr>
-        <w:spacing w:line="360" w:lineRule="auto"/>
-        <w:rPr>
-          <w:rFonts w:ascii="Garamond" w:hAnsi="Garamond"/>
           <w:b/>
           <w:bCs/>
-          <w:sz w:val="28"/>
-          <w:szCs w:val="28"/>
-        </w:rPr>
-      </w:pPr>
-    </w:p>
-    <w:p>
-      <w:pPr>
+          <w:sz w:val="32"/>
+          <w:szCs w:val="32"/>
+        </w:rPr>
+      </w:pPr>
+      <w:r>
+        <w:rPr>
+          <w:rFonts w:ascii="Garamond" w:hAnsi="Garamond"/>
+          <w:b/>
+          <w:bCs/>
+          <w:sz w:val="32"/>
+          <w:szCs w:val="32"/>
+        </w:rPr>
+        <w:t>Shifting Habitat Mosaics in Alaska’s largest river basins</w:t>
+      </w:r>
+    </w:p>
+    <w:p>
+      <w:pPr>
+        <w:spacing w:line="360" w:lineRule="auto"/>
+        <w:jc w:val="center"/>
+        <w:rPr>
+          <w:rFonts w:ascii="Garamond" w:hAnsi="Garamond"/>
+        </w:rPr>
+      </w:pPr>
+      <w:r>
+        <w:rPr>
+          <w:rFonts w:ascii="Garamond" w:hAnsi="Garamond"/>
+        </w:rPr>
+        <w:t>Ben Makhlouf, Daniel E. Schindler, Timothy J Cline</w:t>
+      </w:r>
+    </w:p>
+    <w:p>
+      <w:pPr>
+        <w:spacing w:line="360" w:lineRule="auto"/>
+        <w:rPr>
+          <w:rFonts w:ascii="Garamond" w:hAnsi="Garamond"/>
+          <w:b/>
+          <w:bCs/>
+        </w:rPr>
+      </w:pPr>
+    </w:p>
+    <w:p>
+      <w:pPr>
+        <w:spacing w:line="360" w:lineRule="auto"/>
+        <w:rPr>
+          <w:rFonts w:ascii="Garamond" w:hAnsi="Garamond"/>
+          <w:b/>
+          <w:bCs/>
+          <w:u w:val="single"/>
+        </w:rPr>
+      </w:pPr>
+      <w:r>
+        <w:rPr>
+          <w:rFonts w:ascii="Garamond" w:hAnsi="Garamond"/>
+          <w:b/>
+          <w:bCs/>
+          <w:u w:val="single"/>
+        </w:rPr>
+        <w:t xml:space="preserve">Introduction: </w:t>
+      </w:r>
+    </w:p>
+    <w:p>
+      <w:pPr>
+        <w:pStyle w:val="font-claude-response-body"/>
+        <w:spacing w:line="360" w:lineRule="auto"/>
+        <w:ind w:firstLine="360"/>
+        <w:rPr>
+          <w:rFonts w:ascii="Garamond" w:hAnsi="Garamond"/>
+        </w:rPr>
+      </w:pPr>
+      <w:r>
+        <w:rPr>
+          <w:rFonts w:ascii="Garamond" w:hAnsi="Garamond"/>
+        </w:rPr>
+        <w:t xml:space="preserve">Effective restoration of aquatic ecosystems depends on a clear understanding of the ecological processes that sustain healthy, intact systems. However, as the effects of human resource use and climate change intensify, healthy and fully functioning ecosystems are becoming increasingly rare as their global extent continues to decline. North America freshwater ecosystems have been affected by widespread changes to habitat quality and hydrological connectivity in recent decades, leading to </w:t>
+      </w:r>
+      <w:r>
+        <w:rPr>
+          <w:rFonts w:ascii="Garamond" w:hAnsi="Garamond"/>
+        </w:rPr>
+        <w:t xml:space="preserve">population </w:t>
+      </w:r>
+      <w:r>
+        <w:rPr>
+          <w:rFonts w:ascii="Garamond" w:hAnsi="Garamond"/>
+        </w:rPr>
+        <w:t>declines in species that rely on healthy, free-flowing systems</w:t>
+      </w:r>
+      <w:r>
+        <w:rPr>
+          <w:rFonts w:ascii="Garamond" w:hAnsi="Garamond"/>
+        </w:rPr>
+        <w:t>. Pacific salmon (</w:t>
+      </w:r>
+      <w:r>
+        <w:rPr>
+          <w:rStyle w:val="Emphasis"/>
+          <w:rFonts w:ascii="Garamond" w:eastAsiaTheme="majorEastAsia" w:hAnsi="Garamond"/>
+        </w:rPr>
+        <w:t>spp.</w:t>
+      </w:r>
+      <w:r>
+        <w:rPr>
+          <w:rFonts w:ascii="Garamond" w:hAnsi="Garamond"/>
+        </w:rPr>
+        <w:t>) are particularly vulnerable to changes in habitat quality and connectivity because they depend on access to multiple, distinct habitat types within fully connected river networks to complete their life cycle. Many populations of Pacific salmon have experienced precipitous and sustained declines</w:t>
+      </w:r>
+      <w:r>
+        <w:rPr>
+          <w:rFonts w:ascii="Garamond" w:hAnsi="Garamond"/>
+        </w:rPr>
+        <w:t xml:space="preserve"> </w:t>
+      </w:r>
+      <w:r>
+        <w:rPr>
+          <w:rFonts w:ascii="Garamond" w:hAnsi="Garamond"/>
+        </w:rPr>
+        <w:t>where the combined effects of human development and climate change have been most pronounced</w:t>
+      </w:r>
+      <w:r>
+        <w:rPr>
+          <w:rFonts w:ascii="Garamond" w:hAnsi="Garamond"/>
+        </w:rPr>
+        <w:t xml:space="preserve">, such as in the southern extent of their range in the continental U.S and southern Canada. </w:t>
+      </w:r>
+      <w:r>
+        <w:rPr>
+          <w:rFonts w:ascii="Garamond" w:hAnsi="Garamond"/>
+        </w:rPr>
+        <w:t>However, s</w:t>
+      </w:r>
+      <w:r>
+        <w:rPr>
+          <w:rFonts w:ascii="Garamond" w:hAnsi="Garamond"/>
+        </w:rPr>
+        <w:t>almon are a</w:t>
+      </w:r>
+      <w:r>
+        <w:rPr>
+          <w:rFonts w:ascii="Garamond" w:hAnsi="Garamond"/>
+        </w:rPr>
+        <w:t xml:space="preserve"> critically </w:t>
+      </w:r>
+      <w:r>
+        <w:rPr>
+          <w:rFonts w:ascii="Garamond" w:hAnsi="Garamond"/>
+        </w:rPr>
+        <w:t>important cultural, subsistence, and economic resource to many</w:t>
+      </w:r>
+      <w:r>
+        <w:rPr>
+          <w:rFonts w:ascii="Garamond" w:hAnsi="Garamond"/>
+        </w:rPr>
+        <w:t xml:space="preserve"> </w:t>
+      </w:r>
+      <w:r>
+        <w:rPr>
+          <w:rFonts w:ascii="Garamond" w:hAnsi="Garamond"/>
+        </w:rPr>
+        <w:t>communities</w:t>
+      </w:r>
+      <w:r>
+        <w:rPr>
+          <w:rFonts w:ascii="Garamond" w:hAnsi="Garamond"/>
+        </w:rPr>
+        <w:t xml:space="preserve"> </w:t>
+      </w:r>
+      <w:r>
+        <w:rPr>
+          <w:rFonts w:ascii="Garamond" w:hAnsi="Garamond"/>
+        </w:rPr>
+        <w:t xml:space="preserve">and play an important ecological role in both freshwater and marine ecosystems. As </w:t>
+      </w:r>
+      <w:r>
+        <w:rPr>
+          <w:rFonts w:ascii="Garamond" w:hAnsi="Garamond"/>
+        </w:rPr>
+        <w:t xml:space="preserve">such, these population declines have led to </w:t>
+      </w:r>
+      <w:r>
+        <w:rPr>
+          <w:rFonts w:ascii="Garamond" w:hAnsi="Garamond"/>
+        </w:rPr>
+        <w:t xml:space="preserve">widespread efforts to restore </w:t>
+      </w:r>
+      <w:r>
+        <w:rPr>
+          <w:rFonts w:ascii="Garamond" w:hAnsi="Garamond"/>
+        </w:rPr>
+        <w:t xml:space="preserve">aquatic </w:t>
+      </w:r>
+      <w:r>
+        <w:rPr>
+          <w:rFonts w:ascii="Garamond" w:hAnsi="Garamond"/>
+        </w:rPr>
+        <w:t>habitat</w:t>
+      </w:r>
+      <w:r>
+        <w:rPr>
+          <w:rFonts w:ascii="Garamond" w:hAnsi="Garamond"/>
+        </w:rPr>
+        <w:t>s</w:t>
+      </w:r>
+      <w:r>
+        <w:rPr>
+          <w:rFonts w:ascii="Garamond" w:hAnsi="Garamond"/>
+        </w:rPr>
+        <w:t xml:space="preserve"> </w:t>
+      </w:r>
+      <w:r>
+        <w:rPr>
+          <w:rFonts w:ascii="Garamond" w:hAnsi="Garamond"/>
+        </w:rPr>
+        <w:t xml:space="preserve">and </w:t>
+      </w:r>
+      <w:r>
+        <w:rPr>
+          <w:rFonts w:ascii="Garamond" w:hAnsi="Garamond"/>
+        </w:rPr>
+        <w:t xml:space="preserve">to </w:t>
+      </w:r>
+      <w:r>
+        <w:rPr>
+          <w:rFonts w:ascii="Garamond" w:hAnsi="Garamond"/>
+        </w:rPr>
+        <w:t>recover healthy salmon populations</w:t>
+      </w:r>
+      <w:r>
+        <w:rPr>
+          <w:rFonts w:ascii="Garamond" w:hAnsi="Garamond"/>
+        </w:rPr>
+        <w:t xml:space="preserve"> in degraded ecosystems. </w:t>
+      </w:r>
+    </w:p>
+    <w:p>
+      <w:pPr>
+        <w:pStyle w:val="font-claude-response-body"/>
+        <w:spacing w:line="360" w:lineRule="auto"/>
+        <w:ind w:firstLine="360"/>
+        <w:rPr>
+          <w:rFonts w:ascii="Garamond" w:hAnsi="Garamond"/>
+        </w:rPr>
+      </w:pPr>
+      <w:r>
+        <w:rPr>
+          <w:rFonts w:ascii="Garamond" w:hAnsi="Garamond"/>
+        </w:rPr>
+        <w:t>W</w:t>
+      </w:r>
+      <w:r>
+        <w:rPr>
+          <w:rFonts w:ascii="Garamond" w:hAnsi="Garamond"/>
+        </w:rPr>
+        <w:t>atersheds at the northernmost extent of the</w:t>
+      </w:r>
+      <w:r>
+        <w:rPr>
+          <w:rFonts w:ascii="Garamond" w:hAnsi="Garamond"/>
+        </w:rPr>
+        <w:t xml:space="preserve"> natural range of pacific</w:t>
+      </w:r>
+      <w:r>
+        <w:rPr>
+          <w:rFonts w:ascii="Garamond" w:hAnsi="Garamond"/>
+        </w:rPr>
+        <w:t xml:space="preserve"> salmon have experienced substantially fewer anthropogenic </w:t>
+      </w:r>
+      <w:r>
+        <w:rPr>
+          <w:rFonts w:ascii="Garamond" w:hAnsi="Garamond"/>
+        </w:rPr>
+        <w:t xml:space="preserve">than their southern counterparts. </w:t>
+      </w:r>
+      <w:r>
+        <w:rPr>
+          <w:rFonts w:ascii="Garamond" w:hAnsi="Garamond"/>
+        </w:rPr>
+        <w:t xml:space="preserve">Large, relatively free-flowing watersheds in Alaska support the largest remaining </w:t>
+      </w:r>
+      <w:r>
+        <w:rPr>
+          <w:rFonts w:ascii="Garamond" w:hAnsi="Garamond"/>
+        </w:rPr>
+        <w:t xml:space="preserve">pacific salmon populations </w:t>
+      </w:r>
+      <w:r>
+        <w:rPr>
+          <w:rFonts w:ascii="Garamond" w:hAnsi="Garamond"/>
+        </w:rPr>
+        <w:t>and contain some of the last remaining pristine habitats. As</w:t>
+      </w:r>
+      <w:r>
+        <w:rPr>
+          <w:rFonts w:ascii="Garamond" w:hAnsi="Garamond"/>
+        </w:rPr>
+        <w:t xml:space="preserve"> such, </w:t>
+      </w:r>
+      <w:r>
+        <w:rPr>
+          <w:rFonts w:ascii="Garamond" w:hAnsi="Garamond"/>
+        </w:rPr>
+        <w:t xml:space="preserve">these </w:t>
+      </w:r>
+      <w:r>
+        <w:rPr>
+          <w:rFonts w:ascii="Garamond" w:hAnsi="Garamond"/>
+        </w:rPr>
+        <w:t xml:space="preserve">ecosystems are expected to </w:t>
+      </w:r>
+      <w:r>
+        <w:rPr>
+          <w:rFonts w:ascii="Garamond" w:hAnsi="Garamond"/>
+        </w:rPr>
+        <w:t xml:space="preserve">function in ways that </w:t>
+      </w:r>
+      <w:r>
+        <w:rPr>
+          <w:rFonts w:ascii="Garamond" w:hAnsi="Garamond"/>
+        </w:rPr>
+        <w:t xml:space="preserve">more closely </w:t>
+      </w:r>
+      <w:r>
+        <w:rPr>
+          <w:rFonts w:ascii="Garamond" w:hAnsi="Garamond"/>
+        </w:rPr>
+        <w:t xml:space="preserve">reflect the natural ecological processes of healthy </w:t>
+      </w:r>
+      <w:r>
+        <w:rPr>
+          <w:rFonts w:ascii="Garamond" w:hAnsi="Garamond"/>
+        </w:rPr>
+        <w:t>populations.</w:t>
+      </w:r>
+      <w:r>
+        <w:rPr>
+          <w:rFonts w:ascii="Garamond" w:hAnsi="Garamond"/>
+        </w:rPr>
+        <w:t xml:space="preserve"> </w:t>
+      </w:r>
+      <w:r>
+        <w:rPr>
+          <w:rFonts w:ascii="Garamond" w:hAnsi="Garamond"/>
+        </w:rPr>
+        <w:t>These systems therefore offer a</w:t>
+      </w:r>
+      <w:r>
+        <w:rPr>
+          <w:rFonts w:ascii="Garamond" w:hAnsi="Garamond"/>
+        </w:rPr>
+        <w:t xml:space="preserve">n </w:t>
+      </w:r>
+      <w:r>
+        <w:rPr>
+          <w:rFonts w:ascii="Garamond" w:hAnsi="Garamond"/>
+        </w:rPr>
+        <w:t xml:space="preserve">opportunity to </w:t>
+      </w:r>
+      <w:r>
+        <w:rPr>
+          <w:rFonts w:ascii="Garamond" w:hAnsi="Garamond"/>
+        </w:rPr>
+        <w:t xml:space="preserve">explore the natural ecological processes which govern </w:t>
+      </w:r>
+      <w:r>
+        <w:rPr>
+          <w:rFonts w:ascii="Garamond" w:hAnsi="Garamond"/>
+        </w:rPr>
+        <w:t>wild populations of salmon</w:t>
+      </w:r>
+      <w:r>
+        <w:rPr>
+          <w:rFonts w:ascii="Garamond" w:hAnsi="Garamond"/>
+        </w:rPr>
+        <w:t xml:space="preserve">, providing insights into the </w:t>
+      </w:r>
+      <w:r>
+        <w:rPr>
+          <w:rFonts w:ascii="Garamond" w:hAnsi="Garamond"/>
+        </w:rPr>
+        <w:t>ways in which salmon ecology and ecosystem processes interact to sustain healthy populations and providing</w:t>
+      </w:r>
+      <w:r>
+        <w:rPr>
+          <w:rFonts w:ascii="Garamond" w:hAnsi="Garamond"/>
+        </w:rPr>
+        <w:t xml:space="preserve"> a baseline for restoring impacted watersheds</w:t>
+      </w:r>
+      <w:r>
+        <w:rPr>
+          <w:rFonts w:ascii="Garamond" w:hAnsi="Garamond"/>
+        </w:rPr>
+        <w:t xml:space="preserve"> elsewhere. </w:t>
+      </w:r>
+    </w:p>
+    <w:p>
+      <w:pPr>
+        <w:pStyle w:val="font-claude-response-body"/>
+        <w:spacing w:line="360" w:lineRule="auto"/>
+        <w:ind w:firstLine="360"/>
+        <w:rPr>
+          <w:rFonts w:ascii="Garamond" w:hAnsi="Garamond"/>
+        </w:rPr>
+      </w:pPr>
+      <w:r>
+        <w:rPr>
+          <w:rFonts w:ascii="Garamond" w:hAnsi="Garamond"/>
+        </w:rPr>
+        <w:lastRenderedPageBreak/>
+        <w:t xml:space="preserve">The roles of both habitat heterogeneity [ref] and intrapopulation trait variability in maintaining healthy salmon watersheds are well established [ref, ref, ref]. </w:t>
+      </w:r>
+      <w:r>
+        <w:rPr>
+          <w:rFonts w:ascii="Garamond" w:hAnsi="Garamond"/>
+        </w:rPr>
+        <w:t>G</w:t>
+      </w:r>
+      <w:r>
+        <w:rPr>
+          <w:rFonts w:ascii="Garamond" w:hAnsi="Garamond"/>
+        </w:rPr>
+        <w:t>eomorphological and successional processes</w:t>
+      </w:r>
+      <w:r>
+        <w:rPr>
+          <w:rFonts w:ascii="Garamond" w:hAnsi="Garamond"/>
+        </w:rPr>
+        <w:t xml:space="preserve"> operating across the landscape</w:t>
+      </w:r>
+      <w:r>
+        <w:rPr>
+          <w:rFonts w:ascii="Garamond" w:hAnsi="Garamond"/>
+        </w:rPr>
+        <w:t xml:space="preserve"> </w:t>
+      </w:r>
+      <w:r>
+        <w:rPr>
+          <w:rFonts w:ascii="Garamond" w:hAnsi="Garamond"/>
+        </w:rPr>
+        <w:t>generate a diversity of biophysical conditions (e.g., variation in hydrology, temperature, and depth) across multiple spatial scales</w:t>
+      </w:r>
+      <w:r>
+        <w:rPr>
+          <w:rFonts w:ascii="Garamond" w:hAnsi="Garamond"/>
+        </w:rPr>
+        <w:t xml:space="preserve"> which </w:t>
+      </w:r>
+      <w:r>
+        <w:rPr>
+          <w:rFonts w:ascii="Garamond" w:hAnsi="Garamond"/>
+        </w:rPr>
+        <w:t xml:space="preserve">differentially filter prevailing local environmental conditions </w:t>
+      </w:r>
+      <w:r>
+        <w:rPr>
+          <w:rFonts w:ascii="Garamond" w:hAnsi="Garamond"/>
+        </w:rPr>
+        <w:t>(e.g., precipitation, temperature)</w:t>
+      </w:r>
+      <w:r>
+        <w:rPr>
+          <w:rFonts w:ascii="Garamond" w:hAnsi="Garamond"/>
+        </w:rPr>
+        <w:t xml:space="preserve"> to </w:t>
+      </w:r>
+      <w:r>
+        <w:rPr>
+          <w:rFonts w:ascii="Garamond" w:hAnsi="Garamond"/>
+        </w:rPr>
+        <w:t>produc</w:t>
+      </w:r>
+      <w:r>
+        <w:rPr>
+          <w:rFonts w:ascii="Garamond" w:hAnsi="Garamond"/>
+        </w:rPr>
+        <w:t>e</w:t>
+      </w:r>
+      <w:r>
+        <w:rPr>
+          <w:rFonts w:ascii="Garamond" w:hAnsi="Garamond"/>
+        </w:rPr>
+        <w:t xml:space="preserve"> a </w:t>
+      </w:r>
+      <w:r>
+        <w:rPr>
+          <w:rFonts w:ascii="Garamond" w:hAnsi="Garamond"/>
+        </w:rPr>
+        <w:t xml:space="preserve">continuum </w:t>
+      </w:r>
+      <w:r>
+        <w:rPr>
+          <w:rFonts w:ascii="Garamond" w:hAnsi="Garamond"/>
+        </w:rPr>
+        <w:t>of habitat types</w:t>
+      </w:r>
+      <w:r>
+        <w:rPr>
+          <w:rFonts w:ascii="Garamond" w:hAnsi="Garamond"/>
+        </w:rPr>
+        <w:t xml:space="preserve"> </w:t>
+      </w:r>
+      <w:r>
+        <w:rPr>
+          <w:rFonts w:ascii="Garamond" w:hAnsi="Garamond"/>
+        </w:rPr>
+        <w:t>throughout the basin.</w:t>
+      </w:r>
+      <w:r>
+        <w:rPr>
+          <w:rFonts w:ascii="Garamond" w:hAnsi="Garamond"/>
+        </w:rPr>
+        <w:t xml:space="preserve"> </w:t>
+      </w:r>
+      <w:r>
+        <w:rPr>
+          <w:rFonts w:ascii="Garamond" w:hAnsi="Garamond"/>
+        </w:rPr>
+        <w:t>T</w:t>
+      </w:r>
+      <w:r>
+        <w:rPr>
+          <w:rFonts w:ascii="Garamond" w:hAnsi="Garamond"/>
+        </w:rPr>
+        <w:t>he dynamic interplay between environmental conditions and landscape features</w:t>
+      </w:r>
+      <w:r>
+        <w:rPr>
+          <w:rFonts w:ascii="Garamond" w:hAnsi="Garamond"/>
+        </w:rPr>
+        <w:t xml:space="preserve"> over time</w:t>
+      </w:r>
+      <w:r>
+        <w:rPr>
+          <w:rFonts w:ascii="Garamond" w:hAnsi="Garamond"/>
+        </w:rPr>
+        <w:t xml:space="preserve"> produces a</w:t>
+      </w:r>
+      <w:r>
+        <w:rPr>
+          <w:rFonts w:ascii="Garamond" w:hAnsi="Garamond"/>
+        </w:rPr>
+        <w:t xml:space="preserve"> shifting</w:t>
+      </w:r>
+      <w:r>
+        <w:rPr>
+          <w:rStyle w:val="Emphasis"/>
+          <w:rFonts w:ascii="Garamond" w:eastAsiaTheme="majorEastAsia" w:hAnsi="Garamond"/>
+        </w:rPr>
+        <w:t xml:space="preserve"> </w:t>
+      </w:r>
+      <w:r>
+        <w:rPr>
+          <w:rStyle w:val="Emphasis"/>
+          <w:rFonts w:ascii="Garamond" w:eastAsiaTheme="majorEastAsia" w:hAnsi="Garamond"/>
+          <w:i w:val="0"/>
+          <w:iCs w:val="0"/>
+        </w:rPr>
+        <w:t>mosaic</w:t>
+      </w:r>
+      <w:r>
+        <w:rPr>
+          <w:rFonts w:ascii="Garamond" w:hAnsi="Garamond"/>
+        </w:rPr>
+        <w:t xml:space="preserve"> of </w:t>
+      </w:r>
+      <w:r>
+        <w:rPr>
+          <w:rFonts w:ascii="Garamond" w:hAnsi="Garamond"/>
+        </w:rPr>
+        <w:t xml:space="preserve">habitat types </w:t>
+      </w:r>
+      <w:r>
+        <w:rPr>
+          <w:rFonts w:ascii="Garamond" w:hAnsi="Garamond"/>
+        </w:rPr>
+        <w:t xml:space="preserve">across </w:t>
+      </w:r>
+      <w:r>
+        <w:rPr>
+          <w:rFonts w:ascii="Garamond" w:hAnsi="Garamond"/>
+        </w:rPr>
+        <w:t xml:space="preserve">the watershed which </w:t>
+      </w:r>
+      <w:r>
+        <w:rPr>
+          <w:rFonts w:ascii="Garamond" w:hAnsi="Garamond"/>
+        </w:rPr>
+        <w:t xml:space="preserve">differ in </w:t>
+      </w:r>
+      <w:r>
+        <w:rPr>
+          <w:rFonts w:ascii="Garamond" w:hAnsi="Garamond"/>
+        </w:rPr>
+        <w:t>suitability a</w:t>
+      </w:r>
+      <w:r>
+        <w:rPr>
+          <w:rFonts w:ascii="Garamond" w:hAnsi="Garamond"/>
+        </w:rPr>
+        <w:t xml:space="preserve">nd spatial arrangement and are continually reorganized across multiple spatial and temporal scales. </w:t>
+      </w:r>
+      <w:r>
+        <w:rPr>
+          <w:rFonts w:ascii="Garamond" w:hAnsi="Garamond"/>
+        </w:rPr>
+        <w:t xml:space="preserve">In healthy, well-functioning watersheds, this process is expected to produce spatially heterogeneous patterns of ecological performance (e.g., growth and production) </w:t>
+      </w:r>
+      <w:r>
+        <w:rPr>
+          <w:rFonts w:ascii="Garamond" w:hAnsi="Garamond"/>
+        </w:rPr>
+        <w:t xml:space="preserve">that shift in their spatial configuration </w:t>
+      </w:r>
+      <w:r>
+        <w:rPr>
+          <w:rFonts w:ascii="Garamond" w:hAnsi="Garamond"/>
+        </w:rPr>
+        <w:t xml:space="preserve">as </w:t>
+      </w:r>
+      <w:r>
+        <w:rPr>
+          <w:rFonts w:ascii="Garamond" w:hAnsi="Garamond"/>
+        </w:rPr>
+        <w:t xml:space="preserve">locally adapted subpopulations </w:t>
+      </w:r>
+      <w:r>
+        <w:rPr>
+          <w:rFonts w:ascii="Garamond" w:hAnsi="Garamond"/>
+        </w:rPr>
+        <w:t>interact with variable</w:t>
+      </w:r>
+      <w:r>
+        <w:rPr>
+          <w:rFonts w:ascii="Garamond" w:hAnsi="Garamond"/>
+        </w:rPr>
+        <w:t xml:space="preserve"> habitat suitability through space and time</w:t>
+      </w:r>
+      <w:r>
+        <w:rPr>
+          <w:rFonts w:ascii="Garamond" w:hAnsi="Garamond"/>
+        </w:rPr>
+        <w:t xml:space="preserve">. </w:t>
+      </w:r>
+      <w:r>
+        <w:rPr>
+          <w:rFonts w:ascii="Garamond" w:hAnsi="Garamond"/>
+        </w:rPr>
+        <w:t>Despite variability among tributaries and sub-basin regions, this pattern is expected to stabilize ecosystem-scale performance (i.e., total salmon returns) by maintaining a diverse set of habitat conditions whose performance is weakly or negatively correlated under varying environmental conditions.</w:t>
+      </w:r>
+    </w:p>
+    <w:p>
+      <w:pPr>
+        <w:pStyle w:val="font-claude-response-body"/>
+        <w:spacing w:line="360" w:lineRule="auto"/>
+        <w:ind w:firstLine="360"/>
+        <w:rPr>
+          <w:rFonts w:ascii="Garamond" w:hAnsi="Garamond"/>
+        </w:rPr>
+      </w:pPr>
+      <w:r>
+        <w:rPr>
+          <w:rFonts w:ascii="Garamond" w:hAnsi="Garamond"/>
+        </w:rPr>
+        <w:t>Although the “shifting habitat mosaic” has been extensively described in relatively small ecosystems, it has only recently been empirically tested at the watershed scale in salmon systems, and then over relatively short timeframes (≤3 years; Brennan et al., 2019). To date, this pattern has not been examined in the world’s largest salmon-bearing watersheds or over longer temporal scales. Here, we reconstruct spatiotemporal patterns of watershed-scale production in the Yukon and Kuskokwim river basins—the largest salmon-bearing watersheds in North America—over a six-year period using otolith microchemistry, providing a framework for evaluating shifting habitat mosaics across large spatial extents and multi-year timescales.</w:t>
+      </w:r>
+    </w:p>
+    <w:p>
+      <w:pPr>
+        <w:pStyle w:val="font-claude-response-body"/>
+        <w:numPr>
+          <w:ilvl w:val="0"/>
+          <w:numId w:val="2"/>
+        </w:numPr>
+        <w:spacing w:line="360" w:lineRule="auto"/>
+        <w:rPr>
+          <w:rFonts w:ascii="Garamond" w:hAnsi="Garamond"/>
+        </w:rPr>
+      </w:pPr>
+    </w:p>
+    <w:p>
+      <w:pPr>
+        <w:pStyle w:val="font-claude-response-body"/>
+        <w:spacing w:line="360" w:lineRule="auto"/>
+        <w:rPr>
+          <w:rFonts w:ascii="Garamond" w:hAnsi="Garamond"/>
+          <w:b/>
+          <w:bCs/>
+          <w:u w:val="single"/>
+        </w:rPr>
+      </w:pPr>
+    </w:p>
+    <w:p>
+      <w:pPr>
+        <w:pStyle w:val="font-claude-response-body"/>
+        <w:spacing w:line="360" w:lineRule="auto"/>
+        <w:rPr>
+          <w:rFonts w:ascii="Garamond" w:hAnsi="Garamond"/>
+          <w:b/>
+          <w:bCs/>
+          <w:u w:val="single"/>
+        </w:rPr>
+      </w:pPr>
+    </w:p>
+    <w:p>
+      <w:pPr>
+        <w:pStyle w:val="font-claude-response-body"/>
+        <w:spacing w:line="360" w:lineRule="auto"/>
+        <w:rPr>
+          <w:rFonts w:ascii="Garamond" w:hAnsi="Garamond"/>
+          <w:b/>
+          <w:bCs/>
+          <w:u w:val="single"/>
+        </w:rPr>
+      </w:pPr>
+      <w:r>
+        <w:rPr>
+          <w:rFonts w:ascii="Garamond" w:hAnsi="Garamond"/>
+          <w:b/>
+          <w:bCs/>
+          <w:u w:val="single"/>
+        </w:rPr>
+        <w:t>Methods</w:t>
+      </w:r>
+      <w:r>
+        <w:rPr>
+          <w:rFonts w:ascii="Garamond" w:hAnsi="Garamond"/>
+          <w:b/>
+          <w:bCs/>
+          <w:u w:val="single"/>
+        </w:rPr>
+        <w:t xml:space="preserve">: </w:t>
+      </w:r>
+    </w:p>
+    <w:p>
+      <w:pPr>
+        <w:pStyle w:val="font-claude-response-body"/>
+        <w:spacing w:line="360" w:lineRule="auto"/>
+        <w:rPr>
+          <w:rFonts w:ascii="Garamond" w:hAnsi="Garamond"/>
+          <w:b/>
+          <w:bCs/>
+          <w:u w:val="single"/>
+        </w:rPr>
+      </w:pPr>
+      <w:r>
+        <w:rPr>
+          <w:rFonts w:ascii="Garamond" w:hAnsi="Garamond"/>
+          <w:b/>
+          <w:bCs/>
+          <w:u w:val="single"/>
+        </w:rPr>
+        <w:t xml:space="preserve">Otolith and Genetic Data: </w:t>
+      </w:r>
+    </w:p>
+    <w:p>
+      <w:pPr>
+        <w:pStyle w:val="font-claude-response-body"/>
+        <w:spacing w:line="360" w:lineRule="auto"/>
+        <w:ind w:firstLine="720"/>
+        <w:rPr>
+          <w:rFonts w:ascii="Garamond" w:hAnsi="Garamond"/>
+        </w:rPr>
+      </w:pPr>
+      <w:r>
+        <w:rPr>
+          <w:rFonts w:ascii="Garamond" w:hAnsi="Garamond"/>
+        </w:rPr>
+        <w:lastRenderedPageBreak/>
+        <w:t xml:space="preserve">Chinook salmon otoliths were collected from the Yukon (2015, 2016, 2019–2021) and Kuskokwim (2017–2022) rivers over several years from the downstream terminus of both rivers. Yukon otoliths were collected from the Lower Yukon Test Fishery (LYTF) operated by the Alaska Department of Fish and Game near </w:t>
+      </w:r>
+      <w:proofErr w:type="spellStart"/>
+      <w:r>
+        <w:rPr>
+          <w:rFonts w:ascii="Garamond" w:hAnsi="Garamond"/>
+        </w:rPr>
+        <w:t>Emmonok</w:t>
+      </w:r>
+      <w:proofErr w:type="spellEnd"/>
+      <w:r>
+        <w:rPr>
+          <w:rFonts w:ascii="Garamond" w:hAnsi="Garamond"/>
+        </w:rPr>
+        <w:t xml:space="preserve">, Ak and Kuskokwim otoliths were collected by collaborators at the </w:t>
+      </w:r>
+      <w:proofErr w:type="spellStart"/>
+      <w:r>
+        <w:rPr>
+          <w:rFonts w:ascii="Garamond" w:hAnsi="Garamond"/>
+        </w:rPr>
+        <w:t>Orutsararmiut</w:t>
+      </w:r>
+      <w:proofErr w:type="spellEnd"/>
+      <w:r>
+        <w:rPr>
+          <w:rFonts w:ascii="Garamond" w:hAnsi="Garamond"/>
+        </w:rPr>
+        <w:t xml:space="preserve"> Native Council at the Bethel Test Fishery (BTF) near Bethel, AK (Figure _). It is assumed that fish caught in each test fishery reared in their respective river and were therefore returning to their natal spawning grounds on capture. Both test fisheries are designed to </w:t>
+      </w:r>
+      <w:r>
+        <w:rPr>
+          <w:rFonts w:ascii="Garamond" w:hAnsi="Garamond"/>
+        </w:rPr>
+        <w:t xml:space="preserve">sample throughout the run to gain insight on the timing of individual stocks throughout the basin. </w:t>
+      </w:r>
+      <w:r>
+        <w:rPr>
+          <w:rFonts w:ascii="Garamond" w:hAnsi="Garamond"/>
+        </w:rPr>
+        <w:t xml:space="preserve">Roughly 500 otoliths were collected from each sample site and in each year, </w:t>
+      </w:r>
+      <w:proofErr w:type="gramStart"/>
+      <w:r>
+        <w:rPr>
+          <w:rFonts w:ascii="Garamond" w:hAnsi="Garamond"/>
+        </w:rPr>
+        <w:t>with the exception of</w:t>
+      </w:r>
+      <w:commentRangeStart w:id="0"/>
+      <w:proofErr w:type="gramEnd"/>
+      <w:r>
+        <w:rPr>
+          <w:rFonts w:ascii="Garamond" w:hAnsi="Garamond"/>
+        </w:rPr>
+        <w:t xml:space="preserve"> ________________. </w:t>
+      </w:r>
+      <w:commentRangeEnd w:id="0"/>
+      <w:r>
+        <w:rPr>
+          <w:rStyle w:val="CommentReference"/>
+          <w:rFonts w:ascii="Garamond" w:eastAsiaTheme="minorHAnsi" w:hAnsi="Garamond" w:cstheme="minorBidi"/>
+          <w:kern w:val="2"/>
+          <w:sz w:val="24"/>
+          <w:szCs w:val="24"/>
+          <w14:ligatures w14:val="standardContextual"/>
+        </w:rPr>
+        <w:commentReference w:id="0"/>
+      </w:r>
+      <w:r>
+        <w:rPr>
+          <w:rFonts w:ascii="Garamond" w:hAnsi="Garamond"/>
+        </w:rPr>
+        <w:t xml:space="preserve">From these, ~250 otoliths per river and per year were selected for further analysis, ensuring relatively equal representation relative to CPUE across the full year. </w:t>
+      </w:r>
+      <w:r>
+        <w:rPr>
+          <w:rFonts w:ascii="Garamond" w:hAnsi="Garamond"/>
+        </w:rPr>
+        <w:t>Selected otoliths wer</w:t>
+      </w:r>
+      <w:r>
+        <w:rPr>
+          <w:rFonts w:ascii="Garamond" w:hAnsi="Garamond"/>
+        </w:rPr>
+        <w:t xml:space="preserve">e cut along the transverse plane using a low speed </w:t>
+      </w:r>
+      <w:proofErr w:type="spellStart"/>
+      <w:r>
+        <w:rPr>
+          <w:rFonts w:ascii="Garamond" w:hAnsi="Garamond"/>
+        </w:rPr>
+        <w:t>isomet</w:t>
+      </w:r>
+      <w:proofErr w:type="spellEnd"/>
+      <w:r>
+        <w:rPr>
+          <w:rFonts w:ascii="Garamond" w:hAnsi="Garamond"/>
+        </w:rPr>
+        <w:t xml:space="preserve"> saw to reveal the core and growth structure of the otolith, mounted on a microscope slide, and polished. </w:t>
+      </w:r>
+      <w:r>
+        <w:rPr>
+          <w:rFonts w:ascii="Garamond" w:hAnsi="Garamond"/>
+        </w:rPr>
+        <w:fldChar w:fldCharType="begin"/>
+      </w:r>
+      <w:r>
+        <w:rPr>
+          <w:rFonts w:ascii="Garamond" w:hAnsi="Garamond"/>
+        </w:rPr>
+        <w:instrText xml:space="preserve"> ADDIN ZOTERO_ITEM CSL_CITATION {"citationID":"UdeDBfeN","properties":{"formattedCitation":"(Donohoe &amp; Zimmerman, 2010; Zimmerman &amp; Reeves, 2002)","plainCitation":"(Donohoe &amp; Zimmerman, 2010; Zimmerman &amp; Reeves, 2002)","noteIndex":0},"citationItems":[{"id":4778,"uris":["http://zotero.org/users/8421274/items/QJZIBTQC"],"itemData":{"id":4778,"type":"article-journal","abstract":"Beam-based analytical methods are widely used to measure the concentrations of elements and isotopes in otoliths. These methods usually require that otoliths be individually mounted and prepared to properly expose the desired growth region to the analytical beam. Most analytical instruments, such as LA-ICPMS and ion and electron microprobes, have sample holders that will accept only one to six slides or mounts at a time. We describe a method of mounting otoliths that allows for easy transfer of many otoliths to a single mount after they have been prepared. Such an approach increases the number of otoliths that can be analyzed in a single session by reducing the need open the sample chamber to exchange slides—a particularly time consuming step on instruments that operate under vacuum. For ion and electron microprobes, the method also greatly reduces the number of slides that must be coated with an electrical conductor prior to analysis. In this method, a narrow strip of cover glass is first glued at one end to a standard microscope slide. The otolith is then mounted in thermoplastic resin on the opposite, free end of the strip. The otolith can then be ground and flipped, if needed, by reheating the mounting medium. After otolith preparation is complete, the cover glass is cut with a scribe to free the otolith and up to 20 small otoliths can be arranged on a single petrographic slide.","container-title":"Environmental Biology of Fishes","DOI":"10.1007/s10641-010-9680-3","ISSN":"1573-5133","issue":"3","journalAbbreviation":"Environ Biol Fish","language":"en","page":"473-477","source":"Springer Link","title":"A method of mounting multiple otoliths for beam-based microchemical analyses","volume":"89","author":[{"family":"Donohoe","given":"Christopher J."},{"family":"Zimmerman","given":"Christian E."}],"issued":{"date-parts":[["2010",11,1]]}}},{"id":4132,"uris":["http://zotero.org/users/8421274/items/5YINANGC"],"itemData":{"id":4132,"type":"article-journal","abstract":"Comparisons of strontium:calcium (Sr: Ca) ratios in otolith primordia and freshwater growth regions were used to identify the progeny of steelhead Oncorhynchus mykiss (anadromous rainbow trout) and resident rainbow trout in the Deschutes River, Oregon. We cultured progeny of known adult steelhead and resident rainbow trout to confirm the relationship between Sr:Ca ratios in otolith primordia and the life history of the maternal parent. The mean (±SD) Sr:Ca ratio was significantly higher in the otolith primordia of the progeny of steelhead (0.001461 ± 0.00029; n = 100) than in those of the progeny of resident rainbow trout (0.000829 ± 0.000012; n = 100). We used comparisons of Sr:Ca ratios in the primordia and first-summer growth regions of otoliths to determine the maternal origin of unknown O. mykiss juveniles (n = 272) collected from rearing habitats within the main-stem Deschutes River and tributary rearing habitats and thus to ascertain the relative proportion of each life history morph in each rearing habitat. Resident rainbow trout fry dominated the bimonthly samples collected from main-stem rearing habitats between May and November 1995. Steelhead fry dominated samples collected from below waterfalls on two tributaries in 1996 and 1998.","container-title":"Transactions of the American Fisheries Society","DOI":"10.1577/1548-8659(2002)131&lt;0986:IOSARR&gt;2.0.CO;2","ISSN":"0002-8487","issue":"5","note":"publisher: Taylor &amp; Francis\n_eprint: https://doi.org/10.1577/1548-8659(2002)131&lt;0986:IOSARR&gt;2.0.CO;2","page":"986-993","source":"Taylor and Francis+NEJM","title":"Identification of Steelhead and Resident Rainbow Trout Progeny in the Deschutes River, Oregon, Revealed with Otolith Microchemistry","volume":"131","author":[{"family":"Zimmerman","given":"Christian E."},{"family":"Reeves","given":"Gordon H."}],"issued":{"date-parts":[["2002",9,1]]}}}],"schema":"https://github.com/citation-style-language/schema/raw/master/csl-citation.json"} </w:instrText>
+      </w:r>
+      <w:r>
+        <w:rPr>
+          <w:rFonts w:ascii="Garamond" w:hAnsi="Garamond"/>
+        </w:rPr>
+        <w:fldChar w:fldCharType="separate"/>
+      </w:r>
+      <w:r>
+        <w:rPr>
+          <w:rFonts w:ascii="Garamond" w:hAnsi="Garamond"/>
+          <w:noProof/>
+        </w:rPr>
+        <w:t>(Donohoe &amp; Zimmerman, 2010; Zimmerman &amp; Reeves, 2002)</w:t>
+      </w:r>
+      <w:r>
+        <w:rPr>
+          <w:rFonts w:ascii="Garamond" w:hAnsi="Garamond"/>
+        </w:rPr>
+        <w:fldChar w:fldCharType="end"/>
+      </w:r>
+      <w:r>
+        <w:rPr>
+          <w:rFonts w:ascii="Garamond" w:hAnsi="Garamond"/>
+        </w:rPr>
+        <w:t xml:space="preserve">. Samples were then analyzed for Sr8786 and Sr88 using Laser Ablation Inductively Coupled Plasma Mass Spectrometry (LA-ICP-MS) at the University of Utah Strontium Metals Lab. Laser ablation was performed from the otolith core to just after the onset of the marine signature along the dorsal lobe scanning at 2 microns/second. </w:t>
+      </w:r>
+      <w:r>
+        <w:rPr>
+          <w:rFonts w:ascii="Garamond" w:hAnsi="Garamond"/>
+        </w:rPr>
+        <w:t xml:space="preserve">The Sr87/Sr86 value from the natal rearing location was identified manually by examining the first stable value following the rapid decrease from that of the core, which was identified both by examining the position of the ablation transect relative to the visible core region on the otolith as well as a general </w:t>
+      </w:r>
+      <w:r>
+        <w:rPr>
+          <w:rFonts w:ascii="Garamond" w:hAnsi="Garamond"/>
+        </w:rPr>
+        <w:t>convergence</w:t>
+      </w:r>
+      <w:r>
+        <w:rPr>
+          <w:rFonts w:ascii="Garamond" w:hAnsi="Garamond"/>
+        </w:rPr>
+        <w:t xml:space="preserve"> towards the global marine Sr8786 value (0.70819</w:t>
+      </w:r>
+      <w:r>
+        <w:rPr>
+          <w:rFonts w:ascii="Garamond" w:hAnsi="Garamond"/>
+        </w:rPr>
+        <w:t xml:space="preserve">). Fin clip samples were taken from as many Yukon individuals as possible and genetic stock identification (GSI) assignments were estimated based on methods in Makhlouf et al., 2025 using X genetic baselines </w:t>
+      </w:r>
+      <w:proofErr w:type="gramStart"/>
+      <w:r>
+        <w:rPr>
+          <w:rFonts w:ascii="Garamond" w:hAnsi="Garamond"/>
+        </w:rPr>
+        <w:t>( cites</w:t>
+      </w:r>
+      <w:proofErr w:type="gramEnd"/>
+      <w:r>
+        <w:rPr>
+          <w:rFonts w:ascii="Garamond" w:hAnsi="Garamond"/>
+        </w:rPr>
+        <w:t xml:space="preserve"> from there here). </w:t>
+      </w:r>
+    </w:p>
+    <w:p>
+      <w:pPr>
+        <w:pStyle w:val="font-claude-response-body"/>
+        <w:spacing w:line="360" w:lineRule="auto"/>
+        <w:rPr>
+          <w:rFonts w:ascii="Garamond" w:hAnsi="Garamond"/>
+          <w:b/>
+          <w:bCs/>
+          <w:u w:val="single"/>
+        </w:rPr>
+      </w:pPr>
+    </w:p>
+    <w:p>
+      <w:pPr>
+        <w:pStyle w:val="font-claude-response-body"/>
+        <w:spacing w:line="360" w:lineRule="auto"/>
+        <w:rPr>
+          <w:rFonts w:ascii="Garamond" w:hAnsi="Garamond"/>
+          <w:b/>
+          <w:bCs/>
+          <w:u w:val="single"/>
+        </w:rPr>
+      </w:pPr>
+    </w:p>
+    <w:p>
+      <w:pPr>
+        <w:pStyle w:val="font-claude-response-body"/>
+        <w:spacing w:line="360" w:lineRule="auto"/>
+        <w:rPr>
+          <w:rFonts w:ascii="Garamond" w:hAnsi="Garamond"/>
+          <w:b/>
+          <w:bCs/>
+          <w:u w:val="single"/>
+        </w:rPr>
+      </w:pPr>
+      <w:r>
+        <w:rPr>
+          <w:rFonts w:ascii="Garamond" w:hAnsi="Garamond"/>
+          <w:b/>
+          <w:bCs/>
+          <w:u w:val="single"/>
+        </w:rPr>
+        <w:t>Provenance estimates</w:t>
+      </w:r>
+    </w:p>
+    <w:p>
+      <w:pPr>
+        <w:pStyle w:val="font-claude-response-body"/>
+        <w:spacing w:line="360" w:lineRule="auto"/>
+        <w:ind w:firstLine="720"/>
+        <w:rPr>
+          <w:rFonts w:ascii="Garamond" w:hAnsi="Garamond"/>
+          <w:b/>
+          <w:bCs/>
+          <w:u w:val="single"/>
+        </w:rPr>
+      </w:pPr>
+      <w:r>
+        <w:rPr>
+          <w:rFonts w:ascii="Garamond" w:hAnsi="Garamond"/>
+        </w:rPr>
+        <w:t>Maps of the spatial distribution of ^87Sr/^86Sr (i.e., “</w:t>
+      </w:r>
+      <w:proofErr w:type="spellStart"/>
+      <w:r>
+        <w:rPr>
+          <w:rFonts w:ascii="Garamond" w:hAnsi="Garamond"/>
+        </w:rPr>
+        <w:t>isoscapes</w:t>
+      </w:r>
+      <w:proofErr w:type="spellEnd"/>
+      <w:r>
+        <w:rPr>
+          <w:rFonts w:ascii="Garamond" w:hAnsi="Garamond"/>
+        </w:rPr>
+        <w:t xml:space="preserve">”) have been developed for both the Kuskokwim and Yukon river basins using spatial stream network modeling (SSNM). This </w:t>
+      </w:r>
+      <w:r>
+        <w:rPr>
+          <w:rFonts w:ascii="Garamond" w:hAnsi="Garamond"/>
+        </w:rPr>
+        <w:lastRenderedPageBreak/>
+        <w:t xml:space="preserve">approach accounts for both Euclidean and flow-connected spatial autocorrelation, as well as the influence of multiple reach-scale covariates on strontium isotope ratios (French et al., X; Makhlouf et al., 2025). Both </w:t>
+      </w:r>
+      <w:proofErr w:type="spellStart"/>
+      <w:r>
+        <w:rPr>
+          <w:rFonts w:ascii="Garamond" w:hAnsi="Garamond"/>
+        </w:rPr>
+        <w:t>isoscapes</w:t>
+      </w:r>
+      <w:proofErr w:type="spellEnd"/>
+      <w:r>
+        <w:rPr>
+          <w:rFonts w:ascii="Garamond" w:hAnsi="Garamond"/>
+        </w:rPr>
+        <w:t xml:space="preserve"> include reach-specific estimates of model uncertainty. Because the Yukon </w:t>
+      </w:r>
+      <w:proofErr w:type="spellStart"/>
+      <w:r>
+        <w:rPr>
+          <w:rFonts w:ascii="Garamond" w:hAnsi="Garamond"/>
+        </w:rPr>
+        <w:t>isoscape</w:t>
+      </w:r>
+      <w:proofErr w:type="spellEnd"/>
+      <w:r>
+        <w:rPr>
+          <w:rFonts w:ascii="Garamond" w:hAnsi="Garamond"/>
+        </w:rPr>
+        <w:t xml:space="preserve"> encompasses a substantially larger spatial extent and has lower sampling density per river kilometer, associated prediction error is considerably higher than in the Kuskokwim (add error range). In both systems, however, reaches with exceptionally low prediction error—typically those closest to sampling locations—are relatively rare and tend to receive a disproportionate number of assignments.</w:t>
+      </w:r>
+      <w:r>
+        <w:rPr>
+          <w:rFonts w:ascii="Garamond" w:hAnsi="Garamond"/>
+        </w:rPr>
+        <w:t xml:space="preserve"> To avoid this, minimum error values for each </w:t>
+      </w:r>
+      <w:proofErr w:type="spellStart"/>
+      <w:r>
+        <w:rPr>
+          <w:rFonts w:ascii="Garamond" w:hAnsi="Garamond"/>
+        </w:rPr>
+        <w:t>isoscape</w:t>
+      </w:r>
+      <w:proofErr w:type="spellEnd"/>
+      <w:r>
+        <w:rPr>
+          <w:rFonts w:ascii="Garamond" w:hAnsi="Garamond"/>
+        </w:rPr>
+        <w:t xml:space="preserve"> were adjusted to .003 and .00003 for the Yukon and Kuskokwim </w:t>
+      </w:r>
+      <w:proofErr w:type="spellStart"/>
+      <w:r>
+        <w:rPr>
+          <w:rFonts w:ascii="Garamond" w:hAnsi="Garamond"/>
+        </w:rPr>
+        <w:t>isoscape</w:t>
+      </w:r>
+      <w:proofErr w:type="spellEnd"/>
+      <w:r>
+        <w:rPr>
+          <w:rFonts w:ascii="Garamond" w:hAnsi="Garamond"/>
+        </w:rPr>
+        <w:t xml:space="preserve">, respectively. All reaches with error values below this were assigned this value. </w:t>
+      </w:r>
+    </w:p>
+    <w:p>
+      <w:pPr>
+        <w:pStyle w:val="font-claude-response-body"/>
+        <w:spacing w:line="360" w:lineRule="auto"/>
+        <w:rPr>
+          <w:rFonts w:ascii="Garamond" w:hAnsi="Garamond"/>
+        </w:rPr>
+      </w:pPr>
+      <w:r>
+        <w:rPr>
+          <w:rFonts w:ascii="Garamond" w:hAnsi="Garamond"/>
+        </w:rPr>
+        <w:tab/>
+      </w:r>
+      <w:r>
+        <w:rPr>
+          <w:rFonts w:ascii="Garamond" w:hAnsi="Garamond"/>
+        </w:rPr>
+        <w:t xml:space="preserve">From the extracted natal-origin values, the likelihood of provenance was estimated for all reaches within each basin using a probabilistic Bayesian framework (Makhlouf et al., 2025). For Yukon samples, a genetic prior was incorporated based on posterior probabilities from genetic stock identification assignments (Makhlouf et al., 2025). In addition, three spatial priors were applied to reduce assignment to reaches with low likelihood of occupancy by spawning adult Chinook salmon. </w:t>
+      </w:r>
+      <w:r>
+        <w:rPr>
+          <w:rFonts w:ascii="Garamond" w:hAnsi="Garamond"/>
+        </w:rPr>
+        <w:t>Specifically, assignments were constrained to streams of order X or greater, and a habitat prior assigned zero probability to reaches with average channel gradients &gt; X. Together, these constraints reflect the preference of Chinook salmon for spawning in larger tributaries and the observed unsuitability of both extremely low-gradient and steep reaches. Finally, a “presence prior” was derived from USGS intrinsic potential mapping, which identifies reaches where spawning Chinook salmon have been observed based on multiple data sources [ref]. This prior was applied to mainstem tributaries in both river basins, assigning zero probability to reaches with no documented evidence of spawning Chinook salmon. We restricted application of this prior to mainstem reaches to avoid unduly limiting assignments in more remote tributaries where the absence of observations likely reflects limited sampling effort rather than true absence, while still incorporating available presence information into the assignment framework.</w:t>
+      </w:r>
+      <w:r>
+        <w:rPr>
+          <w:rFonts w:ascii="Garamond" w:hAnsi="Garamond"/>
+        </w:rPr>
+        <w:t xml:space="preserve"> </w:t>
+      </w:r>
+      <w:r>
+        <w:rPr>
+          <w:rFonts w:ascii="Garamond" w:hAnsi="Garamond"/>
+        </w:rPr>
+        <w:t xml:space="preserve">For </w:t>
+      </w:r>
+      <w:proofErr w:type="gramStart"/>
+      <w:r>
+        <w:rPr>
+          <w:rFonts w:ascii="Garamond" w:hAnsi="Garamond"/>
+        </w:rPr>
+        <w:t>each individual</w:t>
+      </w:r>
+      <w:proofErr w:type="gramEnd"/>
+      <w:r>
+        <w:rPr>
+          <w:rFonts w:ascii="Garamond" w:hAnsi="Garamond"/>
+        </w:rPr>
+        <w:t xml:space="preserve">, the result is a posterior probability of provenance for all tributaries in the basin. These data were then normalized to sum to 1 across the basin and rescaled to range from 0-1, thereby indicating relative probability of provenance across the basin. </w:t>
+      </w:r>
+    </w:p>
+    <w:p>
+      <w:pPr>
+        <w:pStyle w:val="font-claude-response-body"/>
+        <w:spacing w:line="360" w:lineRule="auto"/>
+        <w:rPr>
+          <w:rFonts w:ascii="Garamond" w:hAnsi="Garamond"/>
+        </w:rPr>
+      </w:pPr>
+    </w:p>
+    <w:p>
+      <w:pPr>
+        <w:pStyle w:val="font-claude-response-body"/>
+        <w:spacing w:line="360" w:lineRule="auto"/>
+        <w:rPr>
+          <w:rFonts w:ascii="Garamond" w:hAnsi="Garamond"/>
+          <w:b/>
+          <w:bCs/>
+        </w:rPr>
+      </w:pPr>
+      <w:r>
+        <w:rPr>
+          <w:rFonts w:ascii="Garamond" w:hAnsi="Garamond"/>
+          <w:b/>
+          <w:bCs/>
+        </w:rPr>
+        <w:lastRenderedPageBreak/>
+        <w:t xml:space="preserve">Population scale provenance Estimates </w:t>
+      </w:r>
+    </w:p>
+    <w:p>
+      <w:pPr>
+        <w:pStyle w:val="font-claude-response-body"/>
+        <w:spacing w:line="360" w:lineRule="auto"/>
+        <w:ind w:firstLine="720"/>
+        <w:rPr>
+          <w:rFonts w:ascii="Garamond" w:hAnsi="Garamond"/>
+        </w:rPr>
+      </w:pPr>
+      <w:r>
+        <w:rPr>
+          <w:rFonts w:ascii="Garamond" w:hAnsi="Garamond"/>
+        </w:rPr>
+        <w:t xml:space="preserve">To estimate the spatial distribution of natal origin locations across the full year, normalized individual probabilities were summed across all locations. Before summing, </w:t>
+      </w:r>
+      <w:proofErr w:type="gramStart"/>
+      <w:r>
+        <w:rPr>
+          <w:rFonts w:ascii="Garamond" w:hAnsi="Garamond"/>
+        </w:rPr>
+        <w:t>each individual’s</w:t>
+      </w:r>
+      <w:proofErr w:type="gramEnd"/>
+      <w:r>
+        <w:rPr>
+          <w:rFonts w:ascii="Garamond" w:hAnsi="Garamond"/>
+        </w:rPr>
+        <w:t xml:space="preserve"> normalized provenance assignment was weighted by the ratio of the catch-per-unit-effort (CPUE) proportion to the proportion of the total otolith dataset within five equally spaced seasonal strata. This weighting ensured that otolith-based assignments proportionally represented the number of fish entering the river throughout the season. Summed basin-scale estimates of natal origin were then rescaled to sum to 1 and normalized to range from 0 to 1, reflecting relative production across the basin. Finally, these rescaled basin-scale assignments were multiplied by </w:t>
+      </w:r>
+      <w:r>
+        <w:rPr>
+          <w:rStyle w:val="Emphasis"/>
+          <w:rFonts w:ascii="Garamond" w:eastAsiaTheme="majorEastAsia" w:hAnsi="Garamond"/>
+        </w:rPr>
+        <w:t>Total escapement</w:t>
+      </w:r>
+      <w:r>
+        <w:rPr>
+          <w:rFonts w:ascii="Garamond" w:hAnsi="Garamond"/>
+        </w:rPr>
+        <w:t xml:space="preserve"> to convert relative production estimates into the estimated number of individuals originating from each reach.</w:t>
+      </w:r>
+    </w:p>
+    <w:p>
+      <w:pPr>
+        <w:pStyle w:val="font-claude-response-body"/>
+        <w:spacing w:line="360" w:lineRule="auto"/>
+        <w:rPr>
+          <w:rFonts w:ascii="Garamond" w:hAnsi="Garamond"/>
+        </w:rPr>
+      </w:pPr>
+    </w:p>
+    <w:p>
+      <w:pPr>
+        <w:pStyle w:val="font-claude-response-body"/>
+        <w:spacing w:line="360" w:lineRule="auto"/>
+        <w:rPr>
+          <w:rFonts w:ascii="Garamond" w:hAnsi="Garamond"/>
+        </w:rPr>
+      </w:pPr>
+      <w:r>
+        <w:rPr>
+          <w:rFonts w:ascii="Garamond" w:hAnsi="Garamond"/>
+        </w:rPr>
+        <w:t xml:space="preserve">Spatial distribution of Age class and top growth </w:t>
+      </w:r>
+    </w:p>
+    <w:p>
+      <w:pPr>
+        <w:pStyle w:val="font-claude-response-body"/>
+        <w:spacing w:line="360" w:lineRule="auto"/>
+        <w:rPr>
+          <w:rFonts w:ascii="Garamond" w:hAnsi="Garamond"/>
+        </w:rPr>
+      </w:pPr>
+    </w:p>
+    <w:p>
+      <w:pPr>
+        <w:pStyle w:val="font-claude-response-body"/>
+        <w:spacing w:line="360" w:lineRule="auto"/>
+        <w:rPr>
+          <w:rFonts w:ascii="Garamond" w:hAnsi="Garamond"/>
+        </w:rPr>
+      </w:pPr>
+    </w:p>
+    <w:p>
+      <w:pPr>
+        <w:pStyle w:val="font-claude-response-body"/>
+        <w:spacing w:line="360" w:lineRule="auto"/>
+        <w:rPr>
+          <w:rFonts w:ascii="Garamond" w:hAnsi="Garamond"/>
+        </w:rPr>
+      </w:pPr>
+    </w:p>
+    <w:p>
+      <w:pPr>
+        <w:pStyle w:val="font-claude-response-body"/>
+        <w:spacing w:line="360" w:lineRule="auto"/>
+        <w:rPr>
+          <w:rFonts w:ascii="Garamond" w:hAnsi="Garamond"/>
+        </w:rPr>
+      </w:pPr>
+    </w:p>
+    <w:p>
+      <w:pPr>
+        <w:pStyle w:val="font-claude-response-body"/>
+        <w:spacing w:line="360" w:lineRule="auto"/>
+        <w:rPr>
+          <w:rFonts w:ascii="Garamond" w:hAnsi="Garamond"/>
+        </w:rPr>
+      </w:pPr>
+    </w:p>
+    <w:p>
+      <w:pPr>
+        <w:pStyle w:val="font-claude-response-body"/>
+        <w:spacing w:line="360" w:lineRule="auto"/>
+        <w:rPr>
+          <w:rFonts w:ascii="Garamond" w:hAnsi="Garamond"/>
+        </w:rPr>
+      </w:pPr>
+    </w:p>
+    <w:p>
+      <w:pPr>
+        <w:pStyle w:val="font-claude-response-body"/>
+        <w:spacing w:line="360" w:lineRule="auto"/>
+        <w:rPr>
+          <w:rFonts w:ascii="Garamond" w:hAnsi="Garamond"/>
+        </w:rPr>
+      </w:pPr>
+    </w:p>
+    <w:p>
+      <w:pPr>
+        <w:pStyle w:val="font-claude-response-body"/>
+        <w:spacing w:line="360" w:lineRule="auto"/>
+        <w:rPr>
+          <w:rFonts w:ascii="Garamond" w:hAnsi="Garamond"/>
+        </w:rPr>
+      </w:pPr>
+    </w:p>
+    <w:p>
+      <w:pPr>
+        <w:pStyle w:val="font-claude-response-body"/>
+        <w:spacing w:line="360" w:lineRule="auto"/>
+        <w:rPr>
+          <w:rFonts w:ascii="Garamond" w:hAnsi="Garamond"/>
+          <w:b/>
+          <w:bCs/>
+          <w:u w:val="single"/>
+        </w:rPr>
+      </w:pPr>
+      <w:r>
+        <w:rPr>
+          <w:rFonts w:ascii="Garamond" w:hAnsi="Garamond"/>
+        </w:rPr>
+        <w:t xml:space="preserve">For years where we don’t have all the Yukon data, we did 50% of the total CPUE. </w:t>
+      </w:r>
+    </w:p>
+    <w:p>
+      <w:pPr>
+        <w:pStyle w:val="font-claude-response-body"/>
+        <w:spacing w:line="360" w:lineRule="auto"/>
+        <w:rPr>
+          <w:rFonts w:ascii="Garamond" w:hAnsi="Garamond"/>
+        </w:rPr>
+      </w:pPr>
+      <w:r>
+        <w:rPr>
+          <w:rFonts w:ascii="Garamond" w:hAnsi="Garamond"/>
+        </w:rPr>
+        <w:t xml:space="preserve">Age class and top growth analysis. </w:t>
+      </w:r>
+    </w:p>
+    <w:p>
+      <w:pPr>
+        <w:pStyle w:val="font-claude-response-body"/>
+        <w:spacing w:line="360" w:lineRule="auto"/>
+        <w:rPr>
+          <w:rFonts w:ascii="Garamond" w:hAnsi="Garamond"/>
+        </w:rPr>
+      </w:pPr>
+      <w:r>
+        <w:rPr>
+          <w:rFonts w:ascii="Garamond" w:hAnsi="Garamond"/>
+        </w:rPr>
+        <w:lastRenderedPageBreak/>
+        <w:t xml:space="preserve">Spatial production pattern Analysis </w:t>
+      </w:r>
+    </w:p>
+    <w:p>
+      <w:pPr>
+        <w:pStyle w:val="font-claude-response-body"/>
+        <w:spacing w:line="360" w:lineRule="auto"/>
+        <w:rPr>
+          <w:rFonts w:ascii="Garamond" w:hAnsi="Garamond"/>
+        </w:rPr>
+      </w:pPr>
+      <w:r>
+        <w:rPr>
+          <w:rFonts w:ascii="Garamond" w:hAnsi="Garamond"/>
+        </w:rPr>
+        <w:t xml:space="preserve">Variability at spatial scales </w:t>
+      </w:r>
+    </w:p>
+    <w:p>
+      <w:pPr>
+        <w:pStyle w:val="font-claude-response-body"/>
         <w:spacing w:line="360" w:lineRule="auto"/>
         <w:rPr>
           <w:rFonts w:ascii="Garamond" w:hAnsi="Garamond"/>
@@ -70,7 +1408,11 @@
           <w:u w:val="single"/>
         </w:rPr>
       </w:pPr>
-      <w:r>
+    </w:p>
+    <w:p>
+      <w:pPr>
+        <w:pStyle w:val="font-claude-response-body"/>
+        <w:spacing w:line="360" w:lineRule="auto"/>
         <w:rPr>
           <w:rFonts w:ascii="Garamond" w:hAnsi="Garamond"/>
           <w:b/>
@@ -79,634 +1421,6 @@
           <w:szCs w:val="32"/>
           <w:u w:val="single"/>
         </w:rPr>
-        <w:t xml:space="preserve">Introduction: </w:t>
-      </w:r>
-    </w:p>
-    <w:p>
-      <w:pPr>
-        <w:pStyle w:val="font-claude-response-body"/>
-        <w:spacing w:line="360" w:lineRule="auto"/>
-        <w:ind w:firstLine="360"/>
-        <w:rPr>
-          <w:rFonts w:ascii="Garamond" w:hAnsi="Garamond"/>
-        </w:rPr>
-      </w:pPr>
-      <w:r>
-        <w:rPr>
-          <w:rFonts w:ascii="Garamond" w:hAnsi="Garamond"/>
-        </w:rPr>
-        <w:t xml:space="preserve">Effective restoration of aquatic ecosystems depends on a clear understanding of the ecological processes that sustain healthy, intact systems. However, as the effects of human resource use and climate change intensify, healthy and fully functioning ecosystems are becoming increasingly rare as their global extent continues to decline. North America freshwater ecosystems have been affected by widespread changes to habitat quality and hydrological connectivity in recent decades, leading to </w:t>
-      </w:r>
-      <w:r>
-        <w:rPr>
-          <w:rFonts w:ascii="Garamond" w:hAnsi="Garamond"/>
-        </w:rPr>
-        <w:t xml:space="preserve">population </w:t>
-      </w:r>
-      <w:r>
-        <w:rPr>
-          <w:rFonts w:ascii="Garamond" w:hAnsi="Garamond"/>
-        </w:rPr>
-        <w:t>declines in species that rely on healthy, free-flowing systems</w:t>
-      </w:r>
-      <w:r>
-        <w:rPr>
-          <w:rFonts w:ascii="Garamond" w:hAnsi="Garamond"/>
-        </w:rPr>
-        <w:t>. Pacific salmon (</w:t>
-      </w:r>
-      <w:r>
-        <w:rPr>
-          <w:rStyle w:val="Emphasis"/>
-          <w:rFonts w:ascii="Garamond" w:eastAsiaTheme="majorEastAsia" w:hAnsi="Garamond"/>
-        </w:rPr>
-        <w:t>spp.</w:t>
-      </w:r>
-      <w:r>
-        <w:rPr>
-          <w:rFonts w:ascii="Garamond" w:hAnsi="Garamond"/>
-        </w:rPr>
-        <w:t>) are particularly vulnerable to changes in habitat quality and connectivity because they depend on access to multiple, distinct habitat types within fully connected river networks to complete their life cycle. Many populations of Pacific salmon have experienced precipitous and sustained declines</w:t>
-      </w:r>
-      <w:r>
-        <w:rPr>
-          <w:rFonts w:ascii="Garamond" w:hAnsi="Garamond"/>
-        </w:rPr>
-        <w:t xml:space="preserve"> </w:t>
-      </w:r>
-      <w:r>
-        <w:rPr>
-          <w:rFonts w:ascii="Garamond" w:hAnsi="Garamond"/>
-        </w:rPr>
-        <w:t>where the combined effects of human development and climate change have been most pronounced</w:t>
-      </w:r>
-      <w:r>
-        <w:rPr>
-          <w:rFonts w:ascii="Garamond" w:hAnsi="Garamond"/>
-        </w:rPr>
-        <w:t xml:space="preserve">, such as in the southern extent of their range in the continental U.S and southern Canada. </w:t>
-      </w:r>
-      <w:r>
-        <w:rPr>
-          <w:rFonts w:ascii="Garamond" w:hAnsi="Garamond"/>
-        </w:rPr>
-        <w:t>However, s</w:t>
-      </w:r>
-      <w:r>
-        <w:rPr>
-          <w:rFonts w:ascii="Garamond" w:hAnsi="Garamond"/>
-        </w:rPr>
-        <w:t>almon are a</w:t>
-      </w:r>
-      <w:r>
-        <w:rPr>
-          <w:rFonts w:ascii="Garamond" w:hAnsi="Garamond"/>
-        </w:rPr>
-        <w:t xml:space="preserve"> critically </w:t>
-      </w:r>
-      <w:r>
-        <w:rPr>
-          <w:rFonts w:ascii="Garamond" w:hAnsi="Garamond"/>
-        </w:rPr>
-        <w:t>important cultural, subsistence, and economic resource to many</w:t>
-      </w:r>
-      <w:r>
-        <w:rPr>
-          <w:rFonts w:ascii="Garamond" w:hAnsi="Garamond"/>
-        </w:rPr>
-        <w:t xml:space="preserve"> </w:t>
-      </w:r>
-      <w:r>
-        <w:rPr>
-          <w:rFonts w:ascii="Garamond" w:hAnsi="Garamond"/>
-        </w:rPr>
-        <w:t>communities</w:t>
-      </w:r>
-      <w:r>
-        <w:rPr>
-          <w:rFonts w:ascii="Garamond" w:hAnsi="Garamond"/>
-        </w:rPr>
-        <w:t xml:space="preserve"> </w:t>
-      </w:r>
-      <w:r>
-        <w:rPr>
-          <w:rFonts w:ascii="Garamond" w:hAnsi="Garamond"/>
-        </w:rPr>
-        <w:t xml:space="preserve">and play an important ecological role in both freshwater and marine ecosystems. As </w:t>
-      </w:r>
-      <w:r>
-        <w:rPr>
-          <w:rFonts w:ascii="Garamond" w:hAnsi="Garamond"/>
-        </w:rPr>
-        <w:t xml:space="preserve">such, these population declines have led to </w:t>
-      </w:r>
-      <w:r>
-        <w:rPr>
-          <w:rFonts w:ascii="Garamond" w:hAnsi="Garamond"/>
-        </w:rPr>
-        <w:t xml:space="preserve">widespread efforts to restore </w:t>
-      </w:r>
-      <w:r>
-        <w:rPr>
-          <w:rFonts w:ascii="Garamond" w:hAnsi="Garamond"/>
-        </w:rPr>
-        <w:t xml:space="preserve">aquatic </w:t>
-      </w:r>
-      <w:r>
-        <w:rPr>
-          <w:rFonts w:ascii="Garamond" w:hAnsi="Garamond"/>
-        </w:rPr>
-        <w:t>habitat</w:t>
-      </w:r>
-      <w:r>
-        <w:rPr>
-          <w:rFonts w:ascii="Garamond" w:hAnsi="Garamond"/>
-        </w:rPr>
-        <w:t>s</w:t>
-      </w:r>
-      <w:r>
-        <w:rPr>
-          <w:rFonts w:ascii="Garamond" w:hAnsi="Garamond"/>
-        </w:rPr>
-        <w:t xml:space="preserve"> </w:t>
-      </w:r>
-      <w:r>
-        <w:rPr>
-          <w:rFonts w:ascii="Garamond" w:hAnsi="Garamond"/>
-        </w:rPr>
-        <w:t xml:space="preserve">and </w:t>
-      </w:r>
-      <w:r>
-        <w:rPr>
-          <w:rFonts w:ascii="Garamond" w:hAnsi="Garamond"/>
-        </w:rPr>
-        <w:t xml:space="preserve">to </w:t>
-      </w:r>
-      <w:r>
-        <w:rPr>
-          <w:rFonts w:ascii="Garamond" w:hAnsi="Garamond"/>
-        </w:rPr>
-        <w:t>recover healthy salmon populations</w:t>
-      </w:r>
-      <w:r>
-        <w:rPr>
-          <w:rFonts w:ascii="Garamond" w:hAnsi="Garamond"/>
-        </w:rPr>
-        <w:t xml:space="preserve"> in degraded ecosystems. </w:t>
-      </w:r>
-    </w:p>
-    <w:p>
-      <w:pPr>
-        <w:pStyle w:val="font-claude-response-body"/>
-        <w:spacing w:line="360" w:lineRule="auto"/>
-        <w:ind w:firstLine="360"/>
-        <w:rPr>
-          <w:rFonts w:ascii="Garamond" w:hAnsi="Garamond"/>
-        </w:rPr>
-      </w:pPr>
-      <w:r>
-        <w:rPr>
-          <w:rFonts w:ascii="Garamond" w:hAnsi="Garamond"/>
-        </w:rPr>
-        <w:t>W</w:t>
-      </w:r>
-      <w:r>
-        <w:rPr>
-          <w:rFonts w:ascii="Garamond" w:hAnsi="Garamond"/>
-        </w:rPr>
-        <w:t>atersheds at the northernmost extent of the</w:t>
-      </w:r>
-      <w:r>
-        <w:rPr>
-          <w:rFonts w:ascii="Garamond" w:hAnsi="Garamond"/>
-        </w:rPr>
-        <w:t xml:space="preserve"> natural range of pacific</w:t>
-      </w:r>
-      <w:r>
-        <w:rPr>
-          <w:rFonts w:ascii="Garamond" w:hAnsi="Garamond"/>
-        </w:rPr>
-        <w:t xml:space="preserve"> salmon have experienced substantially fewer anthropogenic </w:t>
-      </w:r>
-      <w:r>
-        <w:rPr>
-          <w:rFonts w:ascii="Garamond" w:hAnsi="Garamond"/>
-        </w:rPr>
-        <w:t xml:space="preserve">than their southern counterparts. </w:t>
-      </w:r>
-      <w:r>
-        <w:rPr>
-          <w:rFonts w:ascii="Garamond" w:hAnsi="Garamond"/>
-        </w:rPr>
-        <w:t xml:space="preserve">Large, relatively free-flowing watersheds in Alaska support the largest remaining </w:t>
-      </w:r>
-      <w:r>
-        <w:rPr>
-          <w:rFonts w:ascii="Garamond" w:hAnsi="Garamond"/>
-        </w:rPr>
-        <w:t xml:space="preserve">pacific salmon populations </w:t>
-      </w:r>
-      <w:r>
-        <w:rPr>
-          <w:rFonts w:ascii="Garamond" w:hAnsi="Garamond"/>
-        </w:rPr>
-        <w:t>and contain some of the last remaining pristine habitats. As</w:t>
-      </w:r>
-      <w:r>
-        <w:rPr>
-          <w:rFonts w:ascii="Garamond" w:hAnsi="Garamond"/>
-        </w:rPr>
-        <w:t xml:space="preserve"> such, </w:t>
-      </w:r>
-      <w:r>
-        <w:rPr>
-          <w:rFonts w:ascii="Garamond" w:hAnsi="Garamond"/>
-        </w:rPr>
-        <w:t xml:space="preserve">these </w:t>
-      </w:r>
-      <w:r>
-        <w:rPr>
-          <w:rFonts w:ascii="Garamond" w:hAnsi="Garamond"/>
-        </w:rPr>
-        <w:t xml:space="preserve">ecosystems are expected to </w:t>
-      </w:r>
-      <w:r>
-        <w:rPr>
-          <w:rFonts w:ascii="Garamond" w:hAnsi="Garamond"/>
-        </w:rPr>
-        <w:t xml:space="preserve">function in ways that </w:t>
-      </w:r>
-      <w:r>
-        <w:rPr>
-          <w:rFonts w:ascii="Garamond" w:hAnsi="Garamond"/>
-        </w:rPr>
-        <w:t xml:space="preserve">more closely </w:t>
-      </w:r>
-      <w:r>
-        <w:rPr>
-          <w:rFonts w:ascii="Garamond" w:hAnsi="Garamond"/>
-        </w:rPr>
-        <w:t xml:space="preserve">reflect the natural ecological processes of healthy </w:t>
-      </w:r>
-      <w:r>
-        <w:rPr>
-          <w:rFonts w:ascii="Garamond" w:hAnsi="Garamond"/>
-        </w:rPr>
-        <w:t>populations.</w:t>
-      </w:r>
-      <w:r>
-        <w:rPr>
-          <w:rFonts w:ascii="Garamond" w:hAnsi="Garamond"/>
-        </w:rPr>
-        <w:t xml:space="preserve"> </w:t>
-      </w:r>
-      <w:r>
-        <w:rPr>
-          <w:rFonts w:ascii="Garamond" w:hAnsi="Garamond"/>
-        </w:rPr>
-        <w:t>These systems therefore offer a</w:t>
-      </w:r>
-      <w:r>
-        <w:rPr>
-          <w:rFonts w:ascii="Garamond" w:hAnsi="Garamond"/>
-        </w:rPr>
-        <w:t xml:space="preserve">n </w:t>
-      </w:r>
-      <w:r>
-        <w:rPr>
-          <w:rFonts w:ascii="Garamond" w:hAnsi="Garamond"/>
-        </w:rPr>
-        <w:t xml:space="preserve">opportunity to </w:t>
-      </w:r>
-      <w:r>
-        <w:rPr>
-          <w:rFonts w:ascii="Garamond" w:hAnsi="Garamond"/>
-        </w:rPr>
-        <w:t xml:space="preserve">explore the natural ecological processes which govern </w:t>
-      </w:r>
-      <w:r>
-        <w:rPr>
-          <w:rFonts w:ascii="Garamond" w:hAnsi="Garamond"/>
-        </w:rPr>
-        <w:t xml:space="preserve">wild populations of </w:t>
-      </w:r>
-      <w:r>
-        <w:rPr>
-          <w:rFonts w:ascii="Garamond" w:hAnsi="Garamond"/>
-        </w:rPr>
-        <w:lastRenderedPageBreak/>
-        <w:t>salmon</w:t>
-      </w:r>
-      <w:r>
-        <w:rPr>
-          <w:rFonts w:ascii="Garamond" w:hAnsi="Garamond"/>
-        </w:rPr>
-        <w:t xml:space="preserve">, providing insights into the </w:t>
-      </w:r>
-      <w:r>
-        <w:rPr>
-          <w:rFonts w:ascii="Garamond" w:hAnsi="Garamond"/>
-        </w:rPr>
-        <w:t>ways in which salmon ecology and ecosystem processes interact to sustain healthy populations and providing</w:t>
-      </w:r>
-      <w:r>
-        <w:rPr>
-          <w:rFonts w:ascii="Garamond" w:hAnsi="Garamond"/>
-        </w:rPr>
-        <w:t xml:space="preserve"> a baseline for restoring impacted watersheds</w:t>
-      </w:r>
-      <w:r>
-        <w:rPr>
-          <w:rFonts w:ascii="Garamond" w:hAnsi="Garamond"/>
-        </w:rPr>
-        <w:t xml:space="preserve"> elsewhere. </w:t>
-      </w:r>
-    </w:p>
-    <w:p>
-      <w:pPr>
-        <w:pStyle w:val="font-claude-response-body"/>
-        <w:spacing w:line="360" w:lineRule="auto"/>
-        <w:ind w:firstLine="360"/>
-        <w:rPr>
-          <w:rFonts w:ascii="Garamond" w:hAnsi="Garamond"/>
-        </w:rPr>
-      </w:pPr>
-      <w:r>
-        <w:rPr>
-          <w:rFonts w:ascii="Garamond" w:hAnsi="Garamond"/>
-        </w:rPr>
-        <w:t xml:space="preserve">The roles of both habitat heterogeneity [ref] and intrapopulation trait variability in maintaining healthy salmon watersheds are well established [ref, ref, ref]. </w:t>
-      </w:r>
-      <w:r>
-        <w:rPr>
-          <w:rFonts w:ascii="Garamond" w:hAnsi="Garamond"/>
-        </w:rPr>
-        <w:t>G</w:t>
-      </w:r>
-      <w:r>
-        <w:rPr>
-          <w:rFonts w:ascii="Garamond" w:hAnsi="Garamond"/>
-        </w:rPr>
-        <w:t>eomorphological and successional processes</w:t>
-      </w:r>
-      <w:r>
-        <w:rPr>
-          <w:rFonts w:ascii="Garamond" w:hAnsi="Garamond"/>
-        </w:rPr>
-        <w:t xml:space="preserve"> operating across the landscape</w:t>
-      </w:r>
-      <w:r>
-        <w:rPr>
-          <w:rFonts w:ascii="Garamond" w:hAnsi="Garamond"/>
-        </w:rPr>
-        <w:t xml:space="preserve"> </w:t>
-      </w:r>
-      <w:r>
-        <w:rPr>
-          <w:rFonts w:ascii="Garamond" w:hAnsi="Garamond"/>
-        </w:rPr>
-        <w:t>generate a diversity of biophysical conditions (e.g., variation in hydrology, temperature, and depth) across multiple spatial scales</w:t>
-      </w:r>
-      <w:r>
-        <w:rPr>
-          <w:rFonts w:ascii="Garamond" w:hAnsi="Garamond"/>
-        </w:rPr>
-        <w:t xml:space="preserve"> which </w:t>
-      </w:r>
-      <w:r>
-        <w:rPr>
-          <w:rFonts w:ascii="Garamond" w:hAnsi="Garamond"/>
-        </w:rPr>
-        <w:t xml:space="preserve">differentially filter prevailing local environmental conditions </w:t>
-      </w:r>
-      <w:r>
-        <w:rPr>
-          <w:rFonts w:ascii="Garamond" w:hAnsi="Garamond"/>
-        </w:rPr>
-        <w:t>(e.g., precipitation, temperature)</w:t>
-      </w:r>
-      <w:r>
-        <w:rPr>
-          <w:rFonts w:ascii="Garamond" w:hAnsi="Garamond"/>
-        </w:rPr>
-        <w:t xml:space="preserve"> to </w:t>
-      </w:r>
-      <w:r>
-        <w:rPr>
-          <w:rFonts w:ascii="Garamond" w:hAnsi="Garamond"/>
-        </w:rPr>
-        <w:t>produc</w:t>
-      </w:r>
-      <w:r>
-        <w:rPr>
-          <w:rFonts w:ascii="Garamond" w:hAnsi="Garamond"/>
-        </w:rPr>
-        <w:t>e</w:t>
-      </w:r>
-      <w:r>
-        <w:rPr>
-          <w:rFonts w:ascii="Garamond" w:hAnsi="Garamond"/>
-        </w:rPr>
-        <w:t xml:space="preserve"> a </w:t>
-      </w:r>
-      <w:r>
-        <w:rPr>
-          <w:rFonts w:ascii="Garamond" w:hAnsi="Garamond"/>
-        </w:rPr>
-        <w:t xml:space="preserve">continuum </w:t>
-      </w:r>
-      <w:r>
-        <w:rPr>
-          <w:rFonts w:ascii="Garamond" w:hAnsi="Garamond"/>
-        </w:rPr>
-        <w:t>of habitat types</w:t>
-      </w:r>
-      <w:r>
-        <w:rPr>
-          <w:rFonts w:ascii="Garamond" w:hAnsi="Garamond"/>
-        </w:rPr>
-        <w:t xml:space="preserve"> </w:t>
-      </w:r>
-      <w:r>
-        <w:rPr>
-          <w:rFonts w:ascii="Garamond" w:hAnsi="Garamond"/>
-        </w:rPr>
-        <w:t>throughout the basin.</w:t>
-      </w:r>
-      <w:r>
-        <w:rPr>
-          <w:rFonts w:ascii="Garamond" w:hAnsi="Garamond"/>
-        </w:rPr>
-        <w:t xml:space="preserve"> </w:t>
-      </w:r>
-      <w:r>
-        <w:rPr>
-          <w:rFonts w:ascii="Garamond" w:hAnsi="Garamond"/>
-        </w:rPr>
-        <w:t>T</w:t>
-      </w:r>
-      <w:r>
-        <w:rPr>
-          <w:rFonts w:ascii="Garamond" w:hAnsi="Garamond"/>
-        </w:rPr>
-        <w:t>he dynamic interplay between environmental conditions and landscape features</w:t>
-      </w:r>
-      <w:r>
-        <w:rPr>
-          <w:rFonts w:ascii="Garamond" w:hAnsi="Garamond"/>
-        </w:rPr>
-        <w:t xml:space="preserve"> over time</w:t>
-      </w:r>
-      <w:r>
-        <w:rPr>
-          <w:rFonts w:ascii="Garamond" w:hAnsi="Garamond"/>
-        </w:rPr>
-        <w:t xml:space="preserve"> produces a</w:t>
-      </w:r>
-      <w:r>
-        <w:rPr>
-          <w:rFonts w:ascii="Garamond" w:hAnsi="Garamond"/>
-        </w:rPr>
-        <w:t xml:space="preserve"> shifting</w:t>
-      </w:r>
-      <w:r>
-        <w:rPr>
-          <w:rStyle w:val="Emphasis"/>
-          <w:rFonts w:ascii="Garamond" w:eastAsiaTheme="majorEastAsia" w:hAnsi="Garamond"/>
-        </w:rPr>
-        <w:t xml:space="preserve"> </w:t>
-      </w:r>
-      <w:r>
-        <w:rPr>
-          <w:rStyle w:val="Emphasis"/>
-          <w:rFonts w:ascii="Garamond" w:eastAsiaTheme="majorEastAsia" w:hAnsi="Garamond"/>
-          <w:i w:val="0"/>
-          <w:iCs w:val="0"/>
-        </w:rPr>
-        <w:t>mosaic</w:t>
-      </w:r>
-      <w:r>
-        <w:rPr>
-          <w:rFonts w:ascii="Garamond" w:hAnsi="Garamond"/>
-        </w:rPr>
-        <w:t xml:space="preserve"> of </w:t>
-      </w:r>
-      <w:r>
-        <w:rPr>
-          <w:rFonts w:ascii="Garamond" w:hAnsi="Garamond"/>
-        </w:rPr>
-        <w:t xml:space="preserve">habitat types </w:t>
-      </w:r>
-      <w:r>
-        <w:rPr>
-          <w:rFonts w:ascii="Garamond" w:hAnsi="Garamond"/>
-        </w:rPr>
-        <w:t xml:space="preserve">across </w:t>
-      </w:r>
-      <w:r>
-        <w:rPr>
-          <w:rFonts w:ascii="Garamond" w:hAnsi="Garamond"/>
-        </w:rPr>
-        <w:t xml:space="preserve">the watershed which </w:t>
-      </w:r>
-      <w:r>
-        <w:rPr>
-          <w:rFonts w:ascii="Garamond" w:hAnsi="Garamond"/>
-        </w:rPr>
-        <w:t xml:space="preserve">differ in </w:t>
-      </w:r>
-      <w:r>
-        <w:rPr>
-          <w:rFonts w:ascii="Garamond" w:hAnsi="Garamond"/>
-        </w:rPr>
-        <w:t>suitability a</w:t>
-      </w:r>
-      <w:r>
-        <w:rPr>
-          <w:rFonts w:ascii="Garamond" w:hAnsi="Garamond"/>
-        </w:rPr>
-        <w:t xml:space="preserve">nd spatial arrangement and are continually reorganized across multiple spatial and temporal scales. </w:t>
-      </w:r>
-      <w:r>
-        <w:rPr>
-          <w:rFonts w:ascii="Garamond" w:hAnsi="Garamond"/>
-        </w:rPr>
-        <w:t xml:space="preserve">In healthy, well-functioning watersheds, this process is expected to produce spatially heterogeneous patterns of ecological performance (e.g., growth and production) </w:t>
-      </w:r>
-      <w:r>
-        <w:rPr>
-          <w:rFonts w:ascii="Garamond" w:hAnsi="Garamond"/>
-        </w:rPr>
-        <w:t xml:space="preserve">that shift in their spatial configuration </w:t>
-      </w:r>
-      <w:r>
-        <w:rPr>
-          <w:rFonts w:ascii="Garamond" w:hAnsi="Garamond"/>
-        </w:rPr>
-        <w:t xml:space="preserve">as </w:t>
-      </w:r>
-      <w:r>
-        <w:rPr>
-          <w:rFonts w:ascii="Garamond" w:hAnsi="Garamond"/>
-        </w:rPr>
-        <w:t xml:space="preserve">locally adapted subpopulations </w:t>
-      </w:r>
-      <w:r>
-        <w:rPr>
-          <w:rFonts w:ascii="Garamond" w:hAnsi="Garamond"/>
-        </w:rPr>
-        <w:t>interact with variable</w:t>
-      </w:r>
-      <w:r>
-        <w:rPr>
-          <w:rFonts w:ascii="Garamond" w:hAnsi="Garamond"/>
-        </w:rPr>
-        <w:t xml:space="preserve"> habitat suitability through space and time</w:t>
-      </w:r>
-      <w:r>
-        <w:rPr>
-          <w:rFonts w:ascii="Garamond" w:hAnsi="Garamond"/>
-        </w:rPr>
-        <w:t xml:space="preserve">. </w:t>
-      </w:r>
-      <w:r>
-        <w:rPr>
-          <w:rFonts w:ascii="Garamond" w:hAnsi="Garamond"/>
-          <w:sz w:val="22"/>
-          <w:szCs w:val="22"/>
-        </w:rPr>
-        <w:t>Despite variability among tributaries and sub-basin regions, this pattern is expected to stabilize ecosystem-scale performance (i.e., total salmon returns) by maintaining a diverse set of habitat conditions whose performance is weakly or negatively correlated under varying environmental conditions.</w:t>
-      </w:r>
-    </w:p>
-    <w:p>
-      <w:pPr>
-        <w:pStyle w:val="font-claude-response-body"/>
-        <w:spacing w:line="360" w:lineRule="auto"/>
-        <w:ind w:firstLine="360"/>
-        <w:rPr>
-          <w:rFonts w:ascii="Garamond" w:hAnsi="Garamond"/>
-        </w:rPr>
-      </w:pPr>
-      <w:r>
-        <w:rPr>
-          <w:rFonts w:ascii="Garamond" w:hAnsi="Garamond"/>
-        </w:rPr>
-        <w:t>Although the “shifting habitat mosaic” has been extensively described in relatively small ecosystems, it has only recently been empirically tested at the watershed scale in salmon systems, and then over relatively short timeframes (≤3 years; Brennan et al., 2019). To date, this pattern has not been examined in the world’s largest salmon-bearing watersheds or over longer temporal scales. Here, we reconstruct spatiotemporal patterns of watershed-scale production in the Yukon and Kuskokwim river basins—the largest salmon-bearing watersheds in North America—over a six-year period using otolith microchemistry, providing a framework for evaluating shifting habitat mosaics across large spatial extents and multi-year timescales.</w:t>
-      </w:r>
-    </w:p>
-    <w:p>
-      <w:pPr>
-        <w:pStyle w:val="font-claude-response-body"/>
-        <w:numPr>
-          <w:ilvl w:val="0"/>
-          <w:numId w:val="2"/>
-        </w:numPr>
-        <w:spacing w:line="360" w:lineRule="auto"/>
-        <w:rPr>
-          <w:rFonts w:ascii="Garamond" w:hAnsi="Garamond"/>
-          <w:sz w:val="22"/>
-          <w:szCs w:val="22"/>
-        </w:rPr>
       </w:pPr>
     </w:p>
     <w:p>
@@ -750,7 +1464,11 @@
           <w:u w:val="single"/>
         </w:rPr>
       </w:pPr>
-      <w:r>
+    </w:p>
+    <w:p>
+      <w:pPr>
+        <w:pStyle w:val="font-claude-response-body"/>
+        <w:spacing w:line="360" w:lineRule="auto"/>
         <w:rPr>
           <w:rFonts w:ascii="Garamond" w:hAnsi="Garamond"/>
           <w:b/>
@@ -759,598 +1477,7 @@
           <w:szCs w:val="32"/>
           <w:u w:val="single"/>
         </w:rPr>
-        <w:lastRenderedPageBreak/>
-        <w:t>Methods</w:t>
-      </w:r>
-      <w:r>
-        <w:rPr>
-          <w:rFonts w:ascii="Garamond" w:hAnsi="Garamond"/>
-          <w:b/>
-          <w:bCs/>
-          <w:sz w:val="32"/>
-          <w:szCs w:val="32"/>
-          <w:u w:val="single"/>
-        </w:rPr>
-        <w:t xml:space="preserve">: </w:t>
-      </w:r>
-    </w:p>
-    <w:p>
-      <w:pPr>
-        <w:pStyle w:val="font-claude-response-body"/>
-        <w:spacing w:line="360" w:lineRule="auto"/>
-        <w:rPr>
-          <w:b/>
-          <w:bCs/>
-          <w:u w:val="single"/>
-        </w:rPr>
-      </w:pPr>
-      <w:r>
-        <w:rPr>
-          <w:b/>
-          <w:bCs/>
-          <w:u w:val="single"/>
-        </w:rPr>
-        <w:t xml:space="preserve">Otolith and Genetic Data: </w:t>
-      </w:r>
-    </w:p>
-    <w:p>
-      <w:pPr>
-        <w:pStyle w:val="font-claude-response-body"/>
-        <w:spacing w:line="360" w:lineRule="auto"/>
-        <w:ind w:firstLine="720"/>
-      </w:pPr>
-      <w:r>
-        <w:t>Chinook salmon otoliths were collected from the Yukon (2015, 2016, 2019–2021)</w:t>
-      </w:r>
-      <w:r>
-        <w:t xml:space="preserve"> and </w:t>
-      </w:r>
-      <w:r>
-        <w:t>Kuskokwim (2017–2022)</w:t>
-      </w:r>
-      <w:r>
-        <w:t xml:space="preserve"> rivers over several years from the downstream terminus of both rivers. Yukon otoliths were collected from the Lower Yukon Test Fishery (LYTF) operated by the Alaska Department of Fish and Game near </w:t>
-      </w:r>
-      <w:proofErr w:type="spellStart"/>
-      <w:r>
-        <w:t>Emmonok</w:t>
-      </w:r>
-      <w:proofErr w:type="spellEnd"/>
-      <w:r>
-        <w:t xml:space="preserve">, Ak and Kuskokwim otoliths were collected by collaborators at the </w:t>
-      </w:r>
-      <w:proofErr w:type="spellStart"/>
-      <w:r>
-        <w:t>Orutsararmiut</w:t>
-      </w:r>
-      <w:proofErr w:type="spellEnd"/>
-      <w:r>
-        <w:t xml:space="preserve"> Native Council at the Bethel Test Fishery</w:t>
-      </w:r>
-      <w:r>
-        <w:t xml:space="preserve"> (BTF) near Bethel, AK (Figure _). It is assumed that fish caught in each test fishery reared in their respective river and were therefore returning to their natal spawning grounds on capture. Both test fisheries are designed to </w:t>
-      </w:r>
-      <w:r>
-        <w:t xml:space="preserve">sample throughout the run to gain insight on the timing of individual stocks throughout the basin. </w:t>
-      </w:r>
-      <w:r>
-        <w:t xml:space="preserve">Roughly 500 otoliths were collected from each sample site and in each year, </w:t>
-      </w:r>
-      <w:proofErr w:type="gramStart"/>
-      <w:r>
-        <w:t>with the exception of</w:t>
-      </w:r>
-      <w:commentRangeStart w:id="0"/>
-      <w:proofErr w:type="gramEnd"/>
-      <w:r>
-        <w:t xml:space="preserve"> ________________. </w:t>
-      </w:r>
-      <w:commentRangeEnd w:id="0"/>
-      <w:r>
-        <w:rPr>
-          <w:rStyle w:val="CommentReference"/>
-          <w:rFonts w:asciiTheme="minorHAnsi" w:eastAsiaTheme="minorHAnsi" w:hAnsiTheme="minorHAnsi" w:cstheme="minorBidi"/>
-          <w:kern w:val="2"/>
-          <w14:ligatures w14:val="standardContextual"/>
-        </w:rPr>
-        <w:commentReference w:id="0"/>
-      </w:r>
-      <w:r>
-        <w:t xml:space="preserve">From these, ~250 otoliths per river and per year were selected for further analysis, ensuring relatively equal representation relative to CPUE across the full year. </w:t>
-      </w:r>
-      <w:r>
-        <w:t>Selected otoliths wer</w:t>
-      </w:r>
-      <w:r>
-        <w:t xml:space="preserve">e cut along the transverse plane using a low speed </w:t>
-      </w:r>
-      <w:proofErr w:type="spellStart"/>
-      <w:r>
-        <w:t>isomet</w:t>
-      </w:r>
-      <w:proofErr w:type="spellEnd"/>
-      <w:r>
-        <w:t xml:space="preserve"> saw to reveal the core and growth structure of the otolith, mounted on a microscope slide, and polished. </w:t>
-      </w:r>
-      <w:r>
-        <w:fldChar w:fldCharType="begin"/>
-      </w:r>
-      <w:r>
-        <w:instrText xml:space="preserve"> ADDIN ZOTERO_ITEM CSL_CITATION {"citationID":"UdeDBfeN","properties":{"formattedCitation":"(Donohoe &amp; Zimmerman, 2010; Zimmerman &amp; Reeves, 2002)","plainCitation":"(Donohoe &amp; Zimmerman, 2010; Zimmerman &amp; Reeves, 2002)","noteIndex":0},"citationItems":[{"id":4778,"uris":["http://zotero.org/users/8421274/items/QJZIBTQC"],"itemData":{"id":4778,"type":"article-journal","abstract":"Beam-based analytical methods are widely used to measure the concentrations of elements and isotopes in otoliths. These methods usually require that otoliths be individually mounted and prepared to properly expose the desired growth region to the analytical beam. Most analytical instruments, such as LA-ICPMS and ion and electron microprobes, have sample holders that will accept only one to six slides or mounts at a time. We describe a method of mounting otoliths that allows for easy transfer of many otoliths to a single mount after they have been prepared. Such an approach increases the number of otoliths that can be analyzed in a single session by reducing the need open the sample chamber to exchange slides—a particularly time consuming step on instruments that operate under vacuum. For ion and electron microprobes, the method also greatly reduces the number of slides that must be coated with an electrical conductor prior to analysis. In this method, a narrow strip of cover glass is first glued at one end to a standard microscope slide. The otolith is then mounted in thermoplastic resin on the opposite, free end of the strip. The otolith can then be ground and flipped, if needed, by reheating the mounting medium. After otolith preparation is complete, the cover glass is cut with a scribe to free the otolith and up to 20 small otoliths can be arranged on a single petrographic slide.","container-title":"Environmental Biology of Fishes","DOI":"10.1007/s10641-010-9680-3","ISSN":"1573-5133","issue":"3","journalAbbreviation":"Environ Biol Fish","language":"en","page":"473-477","source":"Springer Link","title":"A method of mounting multiple otoliths for beam-based microchemical analyses","volume":"89","author":[{"family":"Donohoe","given":"Christopher J."},{"family":"Zimmerman","given":"Christian E."}],"issued":{"date-parts":[["2010",11,1]]}}},{"id":4132,"uris":["http://zotero.org/users/8421274/items/5YINANGC"],"itemData":{"id":4132,"type":"article-journal","abstract":"Comparisons of strontium:calcium (Sr: Ca) ratios in otolith primordia and freshwater growth regions were used to identify the progeny of steelhead Oncorhynchus mykiss (anadromous rainbow trout) and resident rainbow trout in the Deschutes River, Oregon. We cultured progeny of known adult steelhead and resident rainbow trout to confirm the relationship between Sr:Ca ratios in otolith primordia and the life history of the maternal parent. The mean (±SD) Sr:Ca ratio was significantly higher in the otolith primordia of the progeny of steelhead (0.001461 ± 0.00029; n = 100) than in those of the progeny of resident rainbow trout (0.000829 ± 0.000012; n = 100). We used comparisons of Sr:Ca ratios in the primordia and first-summer growth regions of otoliths to determine the maternal origin of unknown O. mykiss juveniles (n = 272) collected from rearing habitats within the main-stem Deschutes River and tributary rearing habitats and thus to ascertain the relative proportion of each life history morph in each rearing habitat. Resident rainbow trout fry dominated the bimonthly samples collected from main-stem rearing habitats between May and November 1995. Steelhead fry dominated samples collected from below waterfalls on two tributaries in 1996 and 1998.","container-title":"Transactions of the American Fisheries Society","DOI":"10.1577/1548-8659(2002)131&lt;0986:IOSARR&gt;2.0.CO;2","ISSN":"0002-8487","issue":"5","note":"publisher: Taylor &amp; Francis\n_eprint: https://doi.org/10.1577/1548-8659(2002)131&lt;0986:IOSARR&gt;2.0.CO;2","page":"986-993","source":"Taylor and Francis+NEJM","title":"Identification of Steelhead and Resident Rainbow Trout Progeny in the Deschutes River, Oregon, Revealed with Otolith Microchemistry","volume":"131","author":[{"family":"Zimmerman","given":"Christian E."},{"family":"Reeves","given":"Gordon H."}],"issued":{"date-parts":[["2002",9,1]]}}}],"schema":"https://github.com/citation-style-language/schema/raw/master/csl-citation.json"} </w:instrText>
-      </w:r>
-      <w:r>
-        <w:fldChar w:fldCharType="separate"/>
-      </w:r>
-      <w:r>
-        <w:rPr>
-          <w:noProof/>
-        </w:rPr>
-        <w:t>(Donohoe &amp; Zimmerman, 2010; Zimmerman &amp; Reeves, 2002)</w:t>
-      </w:r>
-      <w:r>
-        <w:fldChar w:fldCharType="end"/>
-      </w:r>
-      <w:r>
-        <w:t xml:space="preserve">. Samples were then analyzed </w:t>
-      </w:r>
-      <w:r>
-        <w:t xml:space="preserve">for Sr8786 and Sr88 </w:t>
-      </w:r>
-      <w:r>
-        <w:t>using Laser Ablation Inductively Coupled Plasma Mass Spectrometry (LA-ICP-MS) at the University of Utah Strontium Metals Lab</w:t>
-      </w:r>
-      <w:r>
-        <w:t xml:space="preserve">. </w:t>
-      </w:r>
-      <w:r>
-        <w:t xml:space="preserve">Laser ablation was performed from the otolith core to just after the onset of the marine signature along the dorsal lobe scanning at 2 microns/second. </w:t>
-      </w:r>
-      <w:r>
-        <w:t xml:space="preserve">The Sr87/Sr86 value from the natal rearing location was identified manually by examining the first stable value following the rapid decrease from that of the core, which was identified both by examining the position of the ablation transect relative to the visible core region on the otolith as well as a general </w:t>
-      </w:r>
-      <w:r>
-        <w:t>convergence</w:t>
-      </w:r>
-      <w:r>
-        <w:t xml:space="preserve"> towards the global marine Sr8786 value (0.70819</w:t>
-      </w:r>
-      <w:r>
-        <w:t xml:space="preserve">). Fin clip samples were taken from as many Yukon individuals as possible and genetic stock identification (GSI) assignments were estimated based on methods in Makhlouf et al., 2025 using X genetic baselines </w:t>
-      </w:r>
-      <w:proofErr w:type="gramStart"/>
-      <w:r>
-        <w:t>( cites</w:t>
-      </w:r>
-      <w:proofErr w:type="gramEnd"/>
-      <w:r>
-        <w:t xml:space="preserve"> from there here). </w:t>
-      </w:r>
-    </w:p>
-    <w:p>
-      <w:pPr>
-        <w:pStyle w:val="font-claude-response-body"/>
-        <w:spacing w:line="360" w:lineRule="auto"/>
-        <w:ind w:firstLine="720"/>
-      </w:pPr>
-    </w:p>
-    <w:p>
-      <w:pPr>
-        <w:pStyle w:val="font-claude-response-body"/>
-        <w:spacing w:line="360" w:lineRule="auto"/>
-      </w:pPr>
-    </w:p>
-    <w:p>
-      <w:pPr>
-        <w:pStyle w:val="font-claude-response-body"/>
-        <w:spacing w:line="360" w:lineRule="auto"/>
-      </w:pPr>
-    </w:p>
-    <w:p>
-      <w:pPr>
-        <w:pStyle w:val="font-claude-response-body"/>
-        <w:spacing w:line="360" w:lineRule="auto"/>
-        <w:ind w:firstLine="720"/>
-      </w:pPr>
-    </w:p>
-    <w:p>
-      <w:pPr>
-        <w:pStyle w:val="font-claude-response-body"/>
-        <w:spacing w:line="360" w:lineRule="auto"/>
-        <w:ind w:firstLine="720"/>
-      </w:pPr>
-    </w:p>
-    <w:p>
-      <w:pPr>
-        <w:pStyle w:val="font-claude-response-body"/>
-        <w:spacing w:line="360" w:lineRule="auto"/>
-        <w:rPr>
-          <w:rFonts w:ascii="Garamond" w:hAnsi="Garamond"/>
-          <w:b/>
-          <w:bCs/>
-          <w:sz w:val="32"/>
-          <w:szCs w:val="32"/>
-          <w:u w:val="single"/>
-        </w:rPr>
-      </w:pPr>
-      <w:r>
-        <w:rPr>
-          <w:rFonts w:ascii="Garamond" w:hAnsi="Garamond"/>
-          <w:b/>
-          <w:bCs/>
-          <w:sz w:val="32"/>
-          <w:szCs w:val="32"/>
-          <w:u w:val="single"/>
-        </w:rPr>
-        <w:t>Provenance estimates</w:t>
-      </w:r>
-    </w:p>
-    <w:p>
-      <w:pPr>
-        <w:pStyle w:val="font-claude-response-body"/>
-        <w:numPr>
-          <w:ilvl w:val="0"/>
-          <w:numId w:val="2"/>
-        </w:numPr>
-        <w:spacing w:line="360" w:lineRule="auto"/>
-        <w:rPr>
-          <w:rFonts w:ascii="Garamond" w:hAnsi="Garamond"/>
-          <w:b/>
-          <w:bCs/>
-          <w:u w:val="single"/>
-        </w:rPr>
-      </w:pPr>
-      <w:r>
-        <w:rPr>
-          <w:rFonts w:ascii="Garamond" w:hAnsi="Garamond"/>
-        </w:rPr>
-        <w:t xml:space="preserve">Kuskokwim </w:t>
-      </w:r>
-      <w:proofErr w:type="spellStart"/>
-      <w:r>
-        <w:rPr>
-          <w:rFonts w:ascii="Garamond" w:hAnsi="Garamond"/>
-        </w:rPr>
-        <w:t>isoscape</w:t>
-      </w:r>
-      <w:proofErr w:type="spellEnd"/>
-      <w:r>
-        <w:rPr>
-          <w:rFonts w:ascii="Garamond" w:hAnsi="Garamond"/>
-        </w:rPr>
-        <w:t xml:space="preserve"> </w:t>
-      </w:r>
-      <w:r>
-        <w:rPr>
-          <w:rFonts w:ascii="Garamond" w:hAnsi="Garamond"/>
-        </w:rPr>
-        <w:t>(</w:t>
-      </w:r>
-      <w:r>
-        <w:rPr>
-          <w:rFonts w:ascii="Garamond" w:hAnsi="Garamond"/>
-        </w:rPr>
-        <w:t xml:space="preserve">French et al., 2016) </w:t>
-      </w:r>
-    </w:p>
-    <w:p>
-      <w:pPr>
-        <w:pStyle w:val="font-claude-response-body"/>
-        <w:numPr>
-          <w:ilvl w:val="0"/>
-          <w:numId w:val="2"/>
-        </w:numPr>
-        <w:spacing w:line="360" w:lineRule="auto"/>
-        <w:rPr>
-          <w:rFonts w:ascii="Garamond" w:hAnsi="Garamond"/>
-          <w:b/>
-          <w:bCs/>
-          <w:u w:val="single"/>
-        </w:rPr>
-      </w:pPr>
-      <w:r>
-        <w:rPr>
-          <w:rFonts w:ascii="Garamond" w:hAnsi="Garamond"/>
-        </w:rPr>
-        <w:t xml:space="preserve">Yukon </w:t>
-      </w:r>
-      <w:proofErr w:type="spellStart"/>
-      <w:r>
-        <w:rPr>
-          <w:rFonts w:ascii="Garamond" w:hAnsi="Garamond"/>
-        </w:rPr>
-        <w:t>isoscape</w:t>
-      </w:r>
-      <w:proofErr w:type="spellEnd"/>
-      <w:r>
-        <w:rPr>
-          <w:rFonts w:ascii="Garamond" w:hAnsi="Garamond"/>
-        </w:rPr>
-        <w:t xml:space="preserve"> (Makhlouf et al., 2025) </w:t>
-      </w:r>
-    </w:p>
-    <w:p>
-      <w:pPr>
-        <w:pStyle w:val="font-claude-response-body"/>
-        <w:numPr>
-          <w:ilvl w:val="0"/>
-          <w:numId w:val="2"/>
-        </w:numPr>
-        <w:spacing w:line="360" w:lineRule="auto"/>
-        <w:rPr>
-          <w:rFonts w:ascii="Garamond" w:hAnsi="Garamond"/>
-          <w:b/>
-          <w:bCs/>
-          <w:u w:val="single"/>
-        </w:rPr>
-      </w:pPr>
-      <w:proofErr w:type="spellStart"/>
-      <w:r>
-        <w:rPr>
-          <w:rFonts w:ascii="Garamond" w:hAnsi="Garamond"/>
-        </w:rPr>
-        <w:t>Mimimum</w:t>
-      </w:r>
-      <w:proofErr w:type="spellEnd"/>
-      <w:r>
-        <w:rPr>
-          <w:rFonts w:ascii="Garamond" w:hAnsi="Garamond"/>
-        </w:rPr>
-        <w:t xml:space="preserve"> error values for the </w:t>
-      </w:r>
-      <w:proofErr w:type="spellStart"/>
-      <w:r>
-        <w:rPr>
-          <w:rFonts w:ascii="Garamond" w:hAnsi="Garamond"/>
-        </w:rPr>
-        <w:t>isoscapes</w:t>
-      </w:r>
-      <w:proofErr w:type="spellEnd"/>
-      <w:r>
-        <w:rPr>
-          <w:rFonts w:ascii="Garamond" w:hAnsi="Garamond"/>
-        </w:rPr>
-        <w:t xml:space="preserve"> were bumped up to .003 and .0005 for the Yukon and Kusko, respectively. </w:t>
-      </w:r>
-    </w:p>
-    <w:p>
-      <w:pPr>
-        <w:pStyle w:val="font-claude-response-body"/>
-        <w:numPr>
-          <w:ilvl w:val="0"/>
-          <w:numId w:val="2"/>
-        </w:numPr>
-        <w:spacing w:line="360" w:lineRule="auto"/>
-        <w:rPr>
-          <w:rFonts w:ascii="Garamond" w:hAnsi="Garamond"/>
-          <w:b/>
-          <w:bCs/>
-          <w:u w:val="single"/>
-        </w:rPr>
-      </w:pPr>
-      <w:r>
-        <w:rPr>
-          <w:rFonts w:ascii="Garamond" w:hAnsi="Garamond"/>
-        </w:rPr>
-        <w:t xml:space="preserve">Natal Origin was used to assign using a </w:t>
-      </w:r>
-      <w:proofErr w:type="spellStart"/>
-      <w:r>
-        <w:rPr>
-          <w:rFonts w:ascii="Garamond" w:hAnsi="Garamond"/>
-        </w:rPr>
-        <w:t>probabalitic</w:t>
-      </w:r>
-      <w:proofErr w:type="spellEnd"/>
-      <w:r>
-        <w:rPr>
-          <w:rFonts w:ascii="Garamond" w:hAnsi="Garamond"/>
-        </w:rPr>
-        <w:t xml:space="preserve"> Bayesian framework (describe or point to previous papers). </w:t>
-      </w:r>
-    </w:p>
-    <w:p>
-      <w:pPr>
-        <w:pStyle w:val="font-claude-response-body"/>
-        <w:numPr>
-          <w:ilvl w:val="0"/>
-          <w:numId w:val="2"/>
-        </w:numPr>
-        <w:spacing w:line="360" w:lineRule="auto"/>
-        <w:rPr>
-          <w:rFonts w:ascii="Garamond" w:hAnsi="Garamond"/>
-          <w:b/>
-          <w:bCs/>
-          <w:u w:val="single"/>
-        </w:rPr>
-      </w:pPr>
-      <w:r>
-        <w:rPr>
-          <w:rFonts w:ascii="Garamond" w:hAnsi="Garamond"/>
-        </w:rPr>
-        <w:t xml:space="preserve">Updated and consistent “habitat prior” </w:t>
-      </w:r>
-    </w:p>
-    <w:p>
-      <w:pPr>
-        <w:pStyle w:val="font-claude-response-body"/>
-        <w:numPr>
-          <w:ilvl w:val="0"/>
-          <w:numId w:val="2"/>
-        </w:numPr>
-        <w:spacing w:line="360" w:lineRule="auto"/>
-        <w:rPr>
-          <w:rFonts w:ascii="Garamond" w:hAnsi="Garamond"/>
-          <w:b/>
-          <w:bCs/>
-          <w:u w:val="single"/>
-        </w:rPr>
-      </w:pPr>
-      <w:r>
-        <w:rPr>
-          <w:rFonts w:ascii="Garamond" w:hAnsi="Garamond"/>
-        </w:rPr>
-        <w:t>“Presence prior” in the mainstem (maybe the 2</w:t>
-      </w:r>
-      <w:r>
-        <w:rPr>
-          <w:rFonts w:ascii="Garamond" w:hAnsi="Garamond"/>
-          <w:vertAlign w:val="superscript"/>
-        </w:rPr>
-        <w:t>nd</w:t>
-      </w:r>
-      <w:r>
-        <w:rPr>
-          <w:rFonts w:ascii="Garamond" w:hAnsi="Garamond"/>
-        </w:rPr>
-        <w:t xml:space="preserve"> highest)</w:t>
-      </w:r>
-    </w:p>
-    <w:p>
-      <w:pPr>
-        <w:pStyle w:val="font-claude-response-body"/>
-        <w:numPr>
-          <w:ilvl w:val="0"/>
-          <w:numId w:val="2"/>
-        </w:numPr>
-        <w:spacing w:line="360" w:lineRule="auto"/>
-        <w:rPr>
-          <w:rFonts w:ascii="Garamond" w:hAnsi="Garamond"/>
-          <w:b/>
-          <w:bCs/>
-          <w:u w:val="single"/>
-        </w:rPr>
-      </w:pPr>
-      <w:r>
-        <w:rPr>
-          <w:rFonts w:ascii="Garamond" w:hAnsi="Garamond"/>
-        </w:rPr>
-        <w:t>The Yukon has much higher error and potential area, therefore, to constrain assignments we only looked at the top .3 of assignments</w:t>
-      </w:r>
-    </w:p>
-    <w:p>
-      <w:pPr>
-        <w:pStyle w:val="font-claude-response-body"/>
-        <w:numPr>
-          <w:ilvl w:val="0"/>
-          <w:numId w:val="2"/>
-        </w:numPr>
-        <w:spacing w:line="360" w:lineRule="auto"/>
-        <w:rPr>
-          <w:rFonts w:ascii="Garamond" w:hAnsi="Garamond"/>
-          <w:b/>
-          <w:bCs/>
-          <w:u w:val="single"/>
-        </w:rPr>
-      </w:pPr>
-      <w:r>
-        <w:rPr>
-          <w:rFonts w:ascii="Garamond" w:hAnsi="Garamond"/>
-        </w:rPr>
-        <w:t xml:space="preserve">Summed across all individuals and rescaled to sum to 1 across the basin. </w:t>
-      </w:r>
-    </w:p>
-    <w:p>
-      <w:pPr>
-        <w:pStyle w:val="font-claude-response-body"/>
-        <w:numPr>
-          <w:ilvl w:val="0"/>
-          <w:numId w:val="2"/>
-        </w:numPr>
-        <w:spacing w:line="360" w:lineRule="auto"/>
-        <w:rPr>
-          <w:rFonts w:ascii="Garamond" w:hAnsi="Garamond"/>
-          <w:b/>
-          <w:bCs/>
-          <w:u w:val="single"/>
-        </w:rPr>
-      </w:pPr>
-      <w:r>
-        <w:rPr>
-          <w:rFonts w:ascii="Garamond" w:hAnsi="Garamond"/>
-        </w:rPr>
-        <w:t xml:space="preserve">In each year, these values were then </w:t>
-      </w:r>
-      <w:proofErr w:type="spellStart"/>
-      <w:r>
-        <w:rPr>
-          <w:rFonts w:ascii="Garamond" w:hAnsi="Garamond"/>
-        </w:rPr>
-        <w:t>multipled</w:t>
-      </w:r>
-      <w:proofErr w:type="spellEnd"/>
-      <w:r>
-        <w:rPr>
-          <w:rFonts w:ascii="Garamond" w:hAnsi="Garamond"/>
-        </w:rPr>
-        <w:t xml:space="preserve"> by the total *Escapement or return* to estimate the number of individuals. </w:t>
-      </w:r>
-    </w:p>
-    <w:p>
-      <w:pPr>
-        <w:pStyle w:val="font-claude-response-body"/>
-        <w:numPr>
-          <w:ilvl w:val="0"/>
-          <w:numId w:val="2"/>
-        </w:numPr>
-        <w:spacing w:line="360" w:lineRule="auto"/>
-        <w:rPr>
-          <w:rFonts w:ascii="Garamond" w:hAnsi="Garamond"/>
-          <w:b/>
-          <w:bCs/>
-          <w:u w:val="single"/>
-        </w:rPr>
-      </w:pPr>
-      <w:r>
-        <w:rPr>
-          <w:rFonts w:ascii="Garamond" w:hAnsi="Garamond"/>
-        </w:rPr>
-        <w:t xml:space="preserve">For years where we don’t have all the Yukon data, we did 50% of the total CPUE. </w:t>
-      </w:r>
-    </w:p>
-    <w:p>
-      <w:pPr>
-        <w:pStyle w:val="font-claude-response-body"/>
-        <w:spacing w:line="360" w:lineRule="auto"/>
-        <w:rPr>
-          <w:rFonts w:ascii="Garamond" w:hAnsi="Garamond"/>
-        </w:rPr>
-      </w:pPr>
-      <w:r>
-        <w:rPr>
-          <w:rFonts w:ascii="Garamond" w:hAnsi="Garamond"/>
-        </w:rPr>
-        <w:t xml:space="preserve">Age class and top growth analysis. </w:t>
-      </w:r>
-    </w:p>
-    <w:p>
-      <w:pPr>
-        <w:pStyle w:val="font-claude-response-body"/>
-        <w:spacing w:line="360" w:lineRule="auto"/>
-        <w:rPr>
-          <w:rFonts w:ascii="Garamond" w:hAnsi="Garamond"/>
-        </w:rPr>
-      </w:pPr>
-      <w:r>
-        <w:rPr>
-          <w:rFonts w:ascii="Garamond" w:hAnsi="Garamond"/>
-        </w:rPr>
-        <w:t xml:space="preserve">Spatial production pattern Analysis </w:t>
-      </w:r>
-    </w:p>
-    <w:p>
-      <w:pPr>
-        <w:pStyle w:val="font-claude-response-body"/>
-        <w:spacing w:line="360" w:lineRule="auto"/>
-        <w:rPr>
-          <w:rFonts w:ascii="Garamond" w:hAnsi="Garamond"/>
-        </w:rPr>
-      </w:pPr>
-      <w:r>
-        <w:rPr>
-          <w:rFonts w:ascii="Garamond" w:hAnsi="Garamond"/>
-        </w:rPr>
-        <w:t xml:space="preserve">Variability at spatial scales </w:t>
-      </w:r>
+      </w:pPr>
     </w:p>
     <w:p>
       <w:pPr>

</xml_diff>

<commit_message>
working through intro to add citations
</commit_message>
<xml_diff>
--- a/Docs/Working_SMH2.docx
+++ b/Docs/Working_SMH2.docx
@@ -93,7 +93,105 @@
         <w:rPr>
           <w:rFonts w:ascii="Garamond" w:hAnsi="Garamond"/>
         </w:rPr>
-        <w:t xml:space="preserve">Effective restoration of aquatic ecosystems depends on a clear understanding of the ecological processes that sustain healthy, intact systems. However, as the effects of human resource use and climate change intensify, healthy and fully functioning ecosystems are becoming increasingly rare as their global extent continues to decline. North America freshwater ecosystems have been affected by widespread changes to habitat quality and hydrological connectivity in recent decades, leading to </w:t>
+        <w:t>Effective restoration of aquatic ecosystems depends on a clear understanding of the ecological processes that sustain healthy, intact systems</w:t>
+      </w:r>
+      <w:r>
+        <w:rPr>
+          <w:rFonts w:ascii="Garamond" w:hAnsi="Garamond"/>
+        </w:rPr>
+        <w:t xml:space="preserve"> </w:t>
+      </w:r>
+      <w:r>
+        <w:rPr>
+          <w:rFonts w:ascii="Garamond" w:hAnsi="Garamond"/>
+        </w:rPr>
+        <w:fldChar w:fldCharType="begin"/>
+      </w:r>
+      <w:r>
+        <w:rPr>
+          <w:rFonts w:ascii="Garamond" w:hAnsi="Garamond"/>
+        </w:rPr>
+        <w:instrText xml:space="preserve"> ADDIN ZOTERO_ITEM CSL_CITATION {"citationID":"qPxuaRiG","properties":{"formattedCitation":"(Jackson &amp; Hobbs, 2009; Menden-Deuer et al., 2023; Schoen et al., 2017; Wang et al., 2021)","plainCitation":"(Jackson &amp; Hobbs, 2009; Menden-Deuer et al., 2023; Schoen et al., 2017; Wang et al., 2021)","noteIndex":0},"citationItems":[{"id":6027,"uris":["http://zotero.org/users/8421274/items/QP3NBY2P"],"itemData":{"id":6027,"type":"article-journal","abstract":"Ecological history plays many roles in ecological restoration, most notably as a tool to identify and characterize appropriate targets for restoration efforts. However, ecological history also reveals deep human imprints on many ecological systems and indicates that secular climate change has kept many targets moving at centennial to millennial time scales. Past and ongoing environmental changes ensure that many historical restoration targets will be unsustainable in the coming decades. Ecological restoration efforts should aim to conserve and restore historical ecosystems where viable, while simultaneously preparing to design or steer emerging novel ecosystems to ensure maintenance of ecological goods and services.","container-title":"Science","DOI":"10.1126/science.1172977","issue":"5940","note":"publisher: American Association for the Advancement of Science","page":"567-569","source":"science.org (Atypon)","title":"Ecological Restoration in the Light of Ecological History","volume":"325","author":[{"family":"Jackson","given":"Stephen T."},{"family":"Hobbs","given":"Richard J."}],"issued":{"date-parts":[["2009",7,31]]}}},{"id":6032,"uris":["http://zotero.org/users/8421274/items/CCV5QFSN"],"itemData":{"id":6032,"type":"article-journal","abstract":"Climate-change is rapidly and intensively altering aquatic communities and habitats. While previous work has focused on direct effects of potential drivers, indirect and interactive effects on organisms and ecosystems have received less attention. Here, we give an overview of contributions to a special issue in Limnology and Oceanography that addresses this knowledge gap. Contributions covered diverse habitats, from polar to tropical regions, alpine streams to coral reefs. Several studies relied on time-series to identify indirect effects, thus emphasizing our need to maintain high-quality time-series data. Time-series are particularly crucial now that the pace of climate-change on aquatic-ecosystems is accelerating. Another common theme is the role of species-specific characteristics in physiology, behavior or genetics in aquatic ecosystem function. The addition of inter- and intra-specific variability to investigations of climate-change may be challenging particularly since ecosystem studies typically involve a large parameter space of environmental and biological variables across spatial and temporal scales. However, the results demonstrate that inclusion of species-specific dynamics, although challenging, can deliver mechanistic insights into aquatic ecosystem patterns and processes. Some contributions leverage habitat changes from disturbances or climate shifts to document capacity for resilience or recovery of pelagic and benthic communities. Jointly, the results in this special issue document fruitful approaches and provide urgent information needed for deciphering aquatic ecosystem responses to climate forcings. This information is foundational if we wish to tackle the combined effects of climate change and other human impacts with maximum efficacy and minimize unintended consequences for biodiversity and ecosystem functioning.","container-title":"Limnology and Oceanography","DOI":"10.1002/lno.12384","ISSN":"1939-5590","issue":"S1","language":"en","license":"© 2023 Association for the Sciences of Limnology and Oceanography.","note":"_eprint: https://aslopubs.onlinelibrary.wiley.com/doi/pdf/10.1002/lno.12384","page":"S1-S7","source":"Wiley Online Library","title":"Cascading, interactive, and indirect effects of climate change on aquatic communities, habitats, and ecosystems","volume":"68","author":[{"family":"Menden-Deuer","given":"Susanne"},{"family":"Mullarney","given":"Julia C."},{"family":"Boersma","given":"Maarten"},{"family":"Grossart","given":"Hans-Peter"},{"family":"Sponseller","given":"Ryan"},{"family":"Woodin","given":"Sarah Ann"}],"issued":{"date-parts":[["2023"]]}}},{"id":6051,"uris":["http://zotero.org/users/8421274/items/UPNXXHTQ"],"itemData":{"id":6051,"type":"article-journal","abstract":"Pacific salmon Oncorhynchus spp. face serious challenges from climate and landscape change, particularly in the southern portion of their native range. Conversely, climate warming appears to be allowing salmon to expand northwards into the Arctic. Between these geographic extremes, in the Gulf of Alaska region, salmon are at historically high abundances but face an uncertain future due to rapid environmental change. We examined changes in climate, hydrology, land cover, salmon populations, and fisheries over the past 30–70 years in this region. We focused on the Kenai River, which supports world-famous fisheries but where Chinook Salmon O. tshawytscha populations have declined, raising concerns about their future resilience. The region is warming and experiencing drier summers and wetter autumns. The landscape is also changing, with melting glaciers, wetland loss, wildfires, and human development. This environmental transformation will likely harm some salmon populations while benefiting others. Lowland salmon streams are especially vulnerable, but retreating glaciers may allow production gains in other streams. Some fishing communities harvest a diverse portfolio of fluctuating resources, whereas others have specialized over time, potentially limiting their resilience. Maintaining diverse habitats and salmon runs may allow ecosystems and fisheries to continue to thrive amidst these changes.","container-title":"Fisheries","DOI":"10.1080/03632415.2017.1374251","ISSN":"0363-2415","issue":"10","note":"publisher: Taylor &amp; Francis\n_eprint: https://doi.org/10.1080/03632415.2017.1374251","page":"538-553","source":"Taylor and Francis+NEJM","title":"Future of Pacific Salmon in the Face of Environmental Change: Lessons from One of the World's Remaining Productive Salmon Regions","title-short":"Future of Pacific Salmon in the Face of Environmental Change","volume":"42","author":[{"family":"Schoen","given":"Erik R."},{"family":"Wipfli","given":"Mark S."},{"family":"Trammell","given":"E. Jamie"},{"family":"Rinella","given":"Daniel J."},{"family":"Floyd","given":"Angelica L."},{"family":"Grunblatt","given":"Jess"},{"family":"McCarthy","given":"Molly D."},{"family":"Meyer","given":"Benjamin E."},{"family":"Morton","given":"John M."},{"family":"Powell","given":"James E."},{"family":"Prakash","given":"Anupma"},{"family":"Reimer","given":"Matthew N."},{"family":"Stuefer","given":"Svetlana L."},{"family":"Toniolo","given":"Horacio"},{"family":"Wells","given":"Brett M."},{"family":"Witmer","given":"Frank D. W."}],"issued":{"date-parts":[["2017",10,3]]}}},{"id":6029,"uris":["http://zotero.org/users/8421274/items/6FRQA8JV"],"itemData":{"id":6029,"type":"article-journal","abstract":"Inland aquatic ecosystems, such as streams, rivers, ponds and lakes, play an important role in maintaining global aquatic biodiversity and ecosystem services. They have been increasingly influenced by environmental change such as global warming, dam construction, habitat fragmentation, eutrophication and urbanization. However, our understanding of the impact of global change on aquatic biodiversity and ecosystem functions remains elusive. The aim of this special issue is to highlight the ecological indicators of aquatic biodiversity and ecosystem functions under global change. The special issue comprises 18 papers including both review and research articles. These papers cover a wide range of research topics, including testing ecological theory, environmental indicator development, biodiversity monitoring and bioassessment. By covering a broad taxonomic range from bacteria and phytoplankton to fish and spanning large spatial (much of Eurasia) and temporal scales (from one season to 25-years observations and 100-years paleo-reconstruction), these articles provide an overview of ecological phenomena from population and community perspectives. Several important implications emerged from these studies: (1) The studies of the long-term succession of biotic community provide important insights into the impacts of human activities and climatic changes on conservation and management of aquatic ecosystems; (2) Anthropogenic activities strongly affect aquatic biodiversity via modifying aquatic habitats and reducing habitat heterogeneity; (3) Biotic assemblages are valuable to for assessing the ecological status of freshwater ecosystems; (4) Aquatic ecosystems have unique characteristics different from other ecosystems, as the underlying drivers and assembly mechanisms of community structure in these ecosystems are highly distinct. Together, the selection of studies reinforces the importance of long-term monitoring, ecological indicator development, and applications of ecological theory in helping us to understand the response of aquatic biodiversity and ecosystem functioning to global change.","container-title":"Ecological Indicators","DOI":"10.1016/j.ecolind.2021.108250","ISSN":"1470-160X","journalAbbreviation":"Ecological Indicators","page":"108250","source":"ScienceDirect","title":"Ecological indicators for aquatic biodiversity, ecosystem functions, human activities and climate change","volume":"132","author":[{"family":"Wang","given":"Jianjun"},{"family":"Soininen","given":"Janne"},{"family":"Heino","given":"Jani"}],"issued":{"date-parts":[["2021",12,1]]}}}],"schema":"https://github.com/citation-style-language/schema/raw/master/csl-citation.json"} </w:instrText>
+      </w:r>
+      <w:r>
+        <w:rPr>
+          <w:rFonts w:ascii="Garamond" w:hAnsi="Garamond"/>
+        </w:rPr>
+        <w:fldChar w:fldCharType="separate"/>
+      </w:r>
+      <w:r>
+        <w:rPr>
+          <w:rFonts w:ascii="Garamond" w:hAnsi="Garamond"/>
+          <w:noProof/>
+        </w:rPr>
+        <w:t>(Jackson &amp; Hobbs, 2009; Menden-Deuer et al., 2023; Schoen et al., 2017; Wang et al., 2021)</w:t>
+      </w:r>
+      <w:r>
+        <w:rPr>
+          <w:rFonts w:ascii="Garamond" w:hAnsi="Garamond"/>
+        </w:rPr>
+        <w:fldChar w:fldCharType="end"/>
+      </w:r>
+      <w:r>
+        <w:rPr>
+          <w:rFonts w:ascii="Garamond" w:hAnsi="Garamond"/>
+        </w:rPr>
+        <w:t>.</w:t>
+      </w:r>
+      <w:r>
+        <w:rPr>
+          <w:rFonts w:ascii="Garamond" w:hAnsi="Garamond"/>
+        </w:rPr>
+        <w:t xml:space="preserve"> However, as the effects of human resource use and climate change intensify, healthy and fully functioning ecosystems are becoming increasingly rare as their global extent continues to decline</w:t>
+      </w:r>
+      <w:r>
+        <w:rPr>
+          <w:rFonts w:ascii="Garamond" w:hAnsi="Garamond"/>
+        </w:rPr>
+        <w:t xml:space="preserve"> </w:t>
+      </w:r>
+      <w:r>
+        <w:rPr>
+          <w:rFonts w:ascii="Garamond" w:hAnsi="Garamond"/>
+        </w:rPr>
+        <w:fldChar w:fldCharType="begin"/>
+      </w:r>
+      <w:r>
+        <w:rPr>
+          <w:rFonts w:ascii="Garamond" w:hAnsi="Garamond"/>
+        </w:rPr>
+        <w:instrText xml:space="preserve"> ADDIN ZOTERO_ITEM CSL_CITATION {"citationID":"5N2rvLcH","properties":{"formattedCitation":"(Castello &amp; Macedo, 2016; Finn et al., 2021)","plainCitation":"(Castello &amp; Macedo, 2016; Finn et al., 2021)","noteIndex":0},"citationItems":[{"id":6035,"uris":["http://zotero.org/users/8421274/items/868PSQ3D"],"itemData":{"id":6035,"type":"article-journal","abstract":"Hydrological connectivity regulates the structure and function of Amazonian freshwater ecosystems and the provisioning of services that sustain local populations. This connectivity is increasingly being disrupted by the construction of dams, mining, land-cover changes, and global climate change. This review analyzes these drivers of degradation, evaluates their impacts on hydrological connectivity, and identifies policy deficiencies that hinder freshwater ecosystem protection. There are 154 large hydroelectric dams in operation today, and 21 dams under construction. The current trajectory of dam construction will leave only three free-flowing tributaries in the next few decades if all 277 planned dams are completed. Land-cover changes driven by mining, dam and road construction, agriculture and cattle ranching have already affected similar to 20% of the Basin and up to similar to 50% of riparian forests in some regions. Global climate change will likely exacerbate these impacts by creating warmer and dryer conditions, with less predictable rainfall and more extreme events (e.g., droughts and floods). The resulting hydrological alterations are rapidly degrading freshwater ecosystems, both independently and via complex feedbacks and synergistic interactions. The ecosystem impacts include biodiversity loss, warmer stream temperatures, stronger and more frequent floodplain fires, and changes to biogeochemical cycles, transport of organic and inorganic materials, and freshwater community structure and function. The impacts also include reductions in water quality, fish yields, and availability of water for navigation, power generation, and human use. This degradation of Amazonian freshwater ecosystems cannot be curbed presently because existing policies are inconsistent across the Basin, ignore cumulative effects, and overlook the hydrological connectivity of freshwater ecosystems. Maintaining the integrity of these freshwater ecosystems requires a basinwide research and policy framework to understand and manage hydrological connectivity across multiple spatial scales and jurisdictional boundaries.","container-title":"Global Change Biology","DOI":"10.1111/gcb.13173","ISSN":"1354-1013, 1365-2486","issue":"3","journalAbbreviation":"Glob. Change Biol.","language":"English","note":"number-of-pages: 18\npublisher-place: Hoboken\npublisher: Wiley\nWeb of Science ID: WOS:000370491400005","page":"990-1007","source":"Clarivate Analytics Web of Science","title":"Large-scale degradation of Amazonian freshwater ecosystems","volume":"22","author":[{"family":"Castello","given":"Leandro"},{"family":"Macedo","given":"Marcia N."}],"issued":{"date-parts":[["2016",3]]}}},{"id":6048,"uris":["http://zotero.org/users/8421274/items/7GIZ8JXZ"],"itemData":{"id":6048,"type":"article-journal","abstract":"Loss of connectivity caused by anthropogenic barriers is a key threat for migratory freshwater species. The anadromous life history of salmonids means that barriers on streams can decrease the amount of habitat available for spawning and rearing. To set appropriate targets for restoration, it is important to know how different populations have been impacted in terms of the location and extent of historically available habitat that has been lost or has become inaccessible. Using mapped and predicted barriers to fish passage in streams and diking infrastructure, the amount of both floodplain and linear stream habitat that remains accessible today was estimated for 14 populations of salmon in the Lower Fraser River, British Columbia, Canada’s most productive salmon river. To place these estimates within a historical context, the floodplain area was estimated using vegetation records from the 1850s, and lost streams were estimated using a digital elevation model-derived stream network. To bolster areas where little mapping has been done, current barrier data were used to predict locations likely to have barriers. Accessibility to floodplain was poor across the entire region with only 15% of the historical floodplain remaining accessible. Linear stream habitat ranged in accessibility from 28% to 99% across populations based on mapped barriers. Inclusion of predicted barriers revealed an additional 33 km of potentially inaccessible stream habitat and the modeled stream network located approximately 1700 km of stream length that has been completely lost. Comparing habitat accessibility and barrier density against the assessed status of populations revealed insights useful for understanding the impact of barriers on spawning and rearing and guiding the allocation of restoration effort. Applying methods for addressing missing data, such as lost streams and unmapped barriers, was essential for estimating the accessibility of habitat within a historical context. While much emphasis has been placed on the role of marine conditions in wild Pacific salmon recovery, the magnitude of habitat loss in the Fraser cannot be ignored and suggests it is a major driver of observed salmon declines.","container-title":"Ecosphere","DOI":"10.1002/ecs2.3646","ISSN":"2150-8925","issue":"7","language":"en","license":"© 2021 The Authors.","note":"_eprint: https://esajournals.onlinelibrary.wiley.com/doi/pdf/10.1002/ecs2.3646","page":"e03646","source":"Wiley Online Library","title":"Quantifying lost and inaccessible habitat for Pacific salmon in Canada’s Lower Fraser River","volume":"12","author":[{"family":"Finn","given":"Riley J. R."},{"family":"Chalifour","given":"Lia"},{"family":"Gergel","given":"Sarah E."},{"family":"Hinch","given":"Scott G."},{"family":"Scott","given":"David C."},{"family":"Martin","given":"Tara G."}],"issued":{"date-parts":[["2021"]]}}}],"schema":"https://github.com/citation-style-language/schema/raw/master/csl-citation.json"} </w:instrText>
+      </w:r>
+      <w:r>
+        <w:rPr>
+          <w:rFonts w:ascii="Garamond" w:hAnsi="Garamond"/>
+        </w:rPr>
+        <w:fldChar w:fldCharType="separate"/>
+      </w:r>
+      <w:r>
+        <w:rPr>
+          <w:rFonts w:ascii="Garamond" w:hAnsi="Garamond"/>
+          <w:noProof/>
+        </w:rPr>
+        <w:t>(Castello &amp; Macedo, 2016; Finn et al., 2021)</w:t>
+      </w:r>
+      <w:r>
+        <w:rPr>
+          <w:rFonts w:ascii="Garamond" w:hAnsi="Garamond"/>
+        </w:rPr>
+        <w:fldChar w:fldCharType="end"/>
+      </w:r>
+      <w:r>
+        <w:rPr>
+          <w:rFonts w:ascii="Garamond" w:hAnsi="Garamond"/>
+        </w:rPr>
+        <w:t>.</w:t>
+      </w:r>
+      <w:r>
+        <w:rPr>
+          <w:rFonts w:ascii="Garamond" w:hAnsi="Garamond"/>
+        </w:rPr>
+        <w:t xml:space="preserve"> North America freshwater ecosystems have been affected by widespread changes to habitat quality and hydrological connectivity in recent decades, leading to </w:t>
       </w:r>
       <w:r>
         <w:rPr>
@@ -111,20 +209,78 @@
         <w:rPr>
           <w:rFonts w:ascii="Garamond" w:hAnsi="Garamond"/>
         </w:rPr>
-        <w:t>. Pacific salmon (</w:t>
+        <w:t xml:space="preserve"> </w:t>
+      </w:r>
+      <w:r>
+        <w:rPr>
+          <w:rFonts w:ascii="Garamond" w:hAnsi="Garamond"/>
+        </w:rPr>
+        <w:fldChar w:fldCharType="begin"/>
+      </w:r>
+      <w:r>
+        <w:rPr>
+          <w:rFonts w:ascii="Garamond" w:hAnsi="Garamond"/>
+        </w:rPr>
+        <w:instrText xml:space="preserve"> ADDIN ZOTERO_ITEM CSL_CITATION {"citationID":"owk5iFbj","properties":{"formattedCitation":"(Dudgeon et al., 2006; Reid et al., 2019)","plainCitation":"(Dudgeon et al., 2006; Reid et al., 2019)","noteIndex":0},"citationItems":[{"id":6036,"uris":["http://zotero.org/users/8421274/items/VTFP5ZZE"],"itemData":{"id":6036,"type":"article-journal","abstract":"Freshwater biodiversity is the over-riding conservation priority during the International Decade for Action – ‘Water for Life’ – 2005 to 2015. Fresh water makes up only 0.01% of the World's water and approximately 0.8% of the Earth's surface, yet this tiny fraction of global water supports at least 100000 species out of approximately 1.8 million – almost 6% of all described species. Inland waters and freshwater biodiversity constitute a valuable natural resource, in economic, cultural, aesthetic, scientific and educational terms. Their conservation and management are critical to the interests of all humans, nations and governments. Yet this precious heritage is in crisis. Fresh waters are experiencing declines in biodiversity far greater than those in the most affected terrestrial ecosystems, and if trends in human demands for water remain unaltered and species losses continue at current rates, the opportunity to conserve much of the remaining biodiversity in fresh water will vanish before the ‘Water for Life’ decade ends in 2015. Why is this so, and what is being done about it? This article explores the special features of freshwater habitats and the biodiversity they support that makes them especially vulnerable to human activities. We document threats to global freshwater biodiversity under five headings: overexploitation; water pollution; flow modification; destruction or degradation of habitat; and invasion by exotic species. Their combined and interacting influences have resulted in population declines and range reduction of freshwater biodiversity worldwide. Conservation of biodiversity is complicated by the landscape position of rivers and wetlands as ‘receivers’ of land-use effluents, and the problems posed by endemism and thus non-substitutability. In addition, in many parts of the world, fresh water is subject to severe competition among multiple human stakeholders. Protection of freshwater biodiversity is perhaps the ultimate conservation challenge because it is influenced by the upstream drainage network, the surrounding land, the riparian zone, and – in the case of migrating aquatic fauna – downstream reaches. Such prerequisites are hardly ever met. Immediate action is needed where opportunities exist to set aside intact lake and river ecosystems within large protected areas. For most of the global land surface, trade-offs between conservation of freshwater biodiversity and human use of ecosystem goods and services are necessary. We advocate continuing attempts to check species loss but, in many situations, urge adoption of a compromise position of management for biodiversity conservation, ecosystem functioning and resilience, and human livelihoods in order to provide a viable long-term basis for freshwater conservation. Recognition of this need will require adoption of a new paradigm for biodiversity protection and freshwater ecosystem management – one that has been appropriately termed ‘reconciliation ecology’.","container-title":"Biological Reviews","DOI":"10.1017/S1464793105006950","ISSN":"1469-185X, 1464-7931","issue":"2","language":"en","page":"163-182","source":"Cambridge University Press","title":"Freshwater biodiversity: importance, threats, status and conservation challenges","title-short":"Freshwater biodiversity","volume":"81","author":[{"family":"Dudgeon","given":"David"},{"family":"Arthington","given":"Angela H."},{"family":"Gessner","given":"Mark O."},{"family":"Kawabata","given":"Zen-Ichiro"},{"family":"Knowler","given":"Duncan J."},{"family":"Lévêque","given":"Christian"},{"family":"Naiman","given":"Robert J."},{"family":"Prieur-Richard","given":"Anne-Hélène"},{"family":"Soto","given":"Doris"},{"family":"Stiassny","given":"Melanie L. J."},{"family":"Sullivan","given":"Caroline A."}],"issued":{"date-parts":[["2006",5]]}}},{"id":6037,"uris":["http://zotero.org/users/8421274/items/7AHZ6K4K"],"itemData":{"id":6037,"type":"article-journal","abstract":"In the 12 years since Dudgeon et al. (2006) reviewed major pressures on freshwater ecosystems, the biodiversity crisis in the world's lakes, reservoirs, rivers, streams and wetlands has deepened. While lakes, reservoirs and rivers cover only 2.3% of the Earth's surface, these ecosystems host at least 9.5% of the Earth's described animal species. Furthermore, using the World Wide Fund for Nature's Living Planet Index, freshwater population declines (83% between 1970 and 2014) continue to outpace contemporaneous declines in marine or terrestrial systems. The Anthropocene has brought multiple new and varied threats that disproportionately impact freshwater systems. We document 12 emerging threats to freshwater biodiversity that are either entirely new since 2006 or have since intensified: (i) changing climates; (ii) e-commerce and invasions; (iii) infectious diseases; (iv) harmful algal blooms; (v) expanding hydropower; (vi) emerging contaminants; (vii) engineered nanomaterials; (viii) microplastic pollution; (ix) light and noise; (x) freshwater salinisation; (xi) declining calcium; and (xii) cumulative stressors. Effects are evidenced for amphibians, fishes, invertebrates, microbes, plants, turtles and waterbirds, with potential for ecosystem-level changes through bottom-up and top-down processes. In our highly uncertain future, the net effects of these threats raise serious concerns for freshwater ecosystems. However, we also highlight opportunities for conservation gains as a result of novel management tools (e.g. environmental flows, environmental DNA) and specific conservation-oriented actions (e.g. dam removal, habitat protection policies, managed relocation of species) that have been met with varying levels of success. Moving forward, we advocate hybrid approaches that manage fresh waters as crucial ecosystems for human life support as well as essential hotspots of biodiversity and ecological function. Efforts to reverse global trends in freshwater degradation now depend on bridging an immense gap between the aspirations of conservation biologists and the accelerating rate of species endangerment.","container-title":"Biological Reviews","DOI":"10.1111/brv.12480","ISSN":"1464-7931, 1469-185X","issue":"3","journalAbbreviation":"Biol. Rev.","language":"English","note":"number-of-pages: 25\npublisher-place: Hoboken\npublisher: Wiley\nWeb of Science ID: WOS:000467422400006","page":"849-873","source":"Clarivate Analytics Web of Science","title":"Emerging threats and persistent conservation challenges for freshwater biodiversity","volume":"94","author":[{"family":"Reid","given":"Andrea J."},{"family":"Carlson","given":"Andrew K."},{"family":"Creed","given":"Irena F."},{"family":"Eliason","given":"Erika J."},{"family":"Gell","given":"Peter A."},{"family":"Johnson","given":"Pieter T. J."},{"family":"Kidd","given":"Karen A."},{"family":"MacCormack","given":"Tyson J."},{"family":"Olden","given":"Julian D."},{"family":"Ormerod","given":"Steve J."},{"family":"Smol","given":"John P."},{"family":"Taylor","given":"William W."},{"family":"Tockner","given":"Klement"},{"family":"Vermaire","given":"Jesse C."},{"family":"Dudgeon","given":"David"},{"family":"Cooke","given":"Steven J."}],"issued":{"date-parts":[["2019",6]]}}}],"schema":"https://github.com/citation-style-language/schema/raw/master/csl-citation.json"} </w:instrText>
+      </w:r>
+      <w:r>
+        <w:rPr>
+          <w:rFonts w:ascii="Garamond" w:hAnsi="Garamond"/>
+        </w:rPr>
+        <w:fldChar w:fldCharType="separate"/>
+      </w:r>
+      <w:r>
+        <w:rPr>
+          <w:rFonts w:ascii="Garamond" w:hAnsi="Garamond"/>
+          <w:noProof/>
+        </w:rPr>
+        <w:t>(Dudgeon et al., 2006; Reid et al., 2019)</w:t>
+      </w:r>
+      <w:r>
+        <w:rPr>
+          <w:rFonts w:ascii="Garamond" w:hAnsi="Garamond"/>
+        </w:rPr>
+        <w:fldChar w:fldCharType="end"/>
+      </w:r>
+      <w:r>
+        <w:rPr>
+          <w:rFonts w:ascii="Garamond" w:hAnsi="Garamond"/>
+        </w:rPr>
+        <w:t xml:space="preserve">. Migratory species such as </w:t>
+      </w:r>
+      <w:r>
+        <w:rPr>
+          <w:rFonts w:ascii="Garamond" w:hAnsi="Garamond"/>
+        </w:rPr>
+        <w:t xml:space="preserve">Pacific salmon </w:t>
+      </w:r>
+      <w:r>
+        <w:rPr>
+          <w:rFonts w:ascii="Garamond" w:hAnsi="Garamond"/>
+          <w:highlight w:val="yellow"/>
+        </w:rPr>
+        <w:t>(</w:t>
       </w:r>
       <w:r>
         <w:rPr>
           <w:rStyle w:val="Emphasis"/>
           <w:rFonts w:ascii="Garamond" w:eastAsiaTheme="majorEastAsia" w:hAnsi="Garamond"/>
+          <w:highlight w:val="yellow"/>
         </w:rPr>
         <w:t>spp.</w:t>
       </w:r>
       <w:r>
         <w:rPr>
           <w:rFonts w:ascii="Garamond" w:hAnsi="Garamond"/>
-        </w:rPr>
-        <w:t>) are particularly vulnerable to changes in habitat quality and connectivity because they depend on access to multiple, distinct habitat types within fully connected river networks to complete their life cycle. Many populations of Pacific salmon have experienced precipitous and sustained declines</w:t>
+          <w:highlight w:val="yellow"/>
+        </w:rPr>
+        <w:t>)</w:t>
+      </w:r>
+      <w:r>
+        <w:rPr>
+          <w:rFonts w:ascii="Garamond" w:hAnsi="Garamond"/>
+        </w:rPr>
+        <w:t xml:space="preserve"> are particularly vulnerable to changes in habitat quality and connectivity because they depend on access to multiple, distinct habitat types within fully connected river networks to complete their life cycle</w:t>
       </w:r>
       <w:r>
         <w:rPr>
@@ -136,37 +292,38 @@
         <w:rPr>
           <w:rFonts w:ascii="Garamond" w:hAnsi="Garamond"/>
         </w:rPr>
-        <w:t>where the combined effects of human development and climate change have been most pronounced</w:t>
-      </w:r>
-      <w:r>
-        <w:rPr>
-          <w:rFonts w:ascii="Garamond" w:hAnsi="Garamond"/>
-        </w:rPr>
-        <w:t xml:space="preserve">, such as in the southern extent of their range in the continental U.S and southern Canada. </w:t>
-      </w:r>
-      <w:r>
-        <w:rPr>
-          <w:rFonts w:ascii="Garamond" w:hAnsi="Garamond"/>
-        </w:rPr>
-        <w:t>However, s</w:t>
-      </w:r>
-      <w:r>
-        <w:rPr>
-          <w:rFonts w:ascii="Garamond" w:hAnsi="Garamond"/>
-        </w:rPr>
-        <w:t>almon are a</w:t>
-      </w:r>
-      <w:r>
-        <w:rPr>
-          <w:rFonts w:ascii="Garamond" w:hAnsi="Garamond"/>
-        </w:rPr>
-        <w:t xml:space="preserve"> critically </w:t>
-      </w:r>
-      <w:r>
-        <w:rPr>
-          <w:rFonts w:ascii="Garamond" w:hAnsi="Garamond"/>
-        </w:rPr>
-        <w:t>important cultural, subsistence, and economic resource to many</w:t>
+        <w:fldChar w:fldCharType="begin"/>
+      </w:r>
+      <w:r>
+        <w:rPr>
+          <w:rFonts w:ascii="Garamond" w:hAnsi="Garamond"/>
+        </w:rPr>
+        <w:instrText xml:space="preserve"> ADDIN ZOTERO_ITEM CSL_CITATION {"citationID":"aBTCoXji","properties":{"formattedCitation":"(Quinn, 2018; Robinson et al., 2009; Waldman &amp; Quinn, 2022)","plainCitation":"(Quinn, 2018; Robinson et al., 2009; Waldman &amp; Quinn, 2022)","noteIndex":0},"citationItems":[{"id":5568,"uris":["http://zotero.org/users/8421274/items/TBWE7PX7"],"itemData":{"id":5568,"type":"book","publisher":"American Fisheries Society, University of Washington Press","title":"The Behavior and Ecology of Pacific Salmon and Trout","author":[{"family":"Quinn","given":"Thomas P"}],"issued":{"date-parts":[["2018",10]]}}},{"id":3518,"uris":["http://zotero.org/users/8421274/items/LJAKI7SR"],"itemData":{"id":3518,"type":"article-journal","abstract":"Long-distance migrations are among the wonders of the natural world, but this multitaxon review shows that the characteristics of species that undertake such movements appear to make them particularly vulnerable to detrimental impacts of climate change. Migrants are key components of biological systems in high latitude regions, where the speed and magnitude of climate change impacts are greatest. They also rely on highly productive seasonal habitats, including wetlands and ocean upwellings that, with climate change, may become less food-rich and predictable in space and time. While migrants are adapted to adjust their behaviour with annual changes in the weather, the decoupling of climatic variables between geographically separate breeding and nonbreeding grounds is beginning to result in mistimed migration. Furthermore, human land-use and activity patterns will constrain the ability of many species to modify their migratory routes and may increase the stress induced by climate change. Adapting conservation strategies for migrants in the light of climate change will require substantial shifts in site designation policies, flexibility of management strategies and the integration of forward planning for both people and wildlife. While adaptation to changes may be feasible for some terrestrial systems, wildlife in the marine ecosystem may be more dependent on the degree of climate change mitigation that is achievable.","container-title":"Endangered Species Research","DOI":"10.3354/esr00095","ISSN":"1863-5407, 1613-4796","journalAbbreviation":"Endang. Species. Res.","language":"en","page":"87-99","source":"DOI.org (Crossref)","title":"Travelling through a warming world: climate change and migratory species","title-short":"Travelling through a warming world","volume":"7","author":[{"family":"Robinson","given":"Ra"},{"family":"Crick","given":"Hqp"},{"family":"Learmonth","given":"Ja"},{"family":"Maclean","given":"Imd"},{"family":"Thomas","given":"Cd"},{"family":"Bairlein","given":"F"},{"family":"Forchhammer","given":"Mc"},{"family":"Francis","given":"Cm"},{"family":"Gill","given":"Ja"},{"family":"Godley","given":"Bj"},{"family":"Harwood","given":"J"},{"family":"Hays","given":"Gc"},{"family":"Huntley","given":"B"},{"family":"Hutson","given":"Am"},{"family":"Pierce","given":"Gj"},{"family":"Rehfisch","given":"Mm"},{"family":"Sims","given":"Dw"},{"family":"Santos","given":"Bm"},{"family":"Sparks","given":"Th"},{"family":"Stroud","given":"Da"},{"family":"Visser","given":"Me"}],"issued":{"date-parts":[["2009",6,17]]}}},{"id":6038,"uris":["http://zotero.org/users/8421274/items/XVWURZLC"],"itemData":{"id":6038,"type":"article-journal","abstract":"Diadromous fishes migrate between freshwater and marine habitats to complete their life cycle, a complexity that makes them vulnerable to the adverse effects of current and past human activities on land and in the oceans. Many North American species are critically endangered, and entire populations have been lost. Major factors driving declines include overfishing, pollution, water withdrawals, aquaculture, non-native species, habitat degradation, over-zealous application of hatcheries designed to mitigate effects of other factors, and effects of climate change. Perhaps, the most broadly tractable and effective factors affecting diadromous fishes are removals of the dams that prevent or hinder their migrations, alter their environment, and often favor non-native biotic communities. Future survival of many diadromous fish populations may depend on this.","container-title":"Science Advances","DOI":"10.1126/sciadv.abl5486","issue":"4","note":"publisher: American Association for the Advancement of Science","page":"eabl5486","source":"science.org (Atypon)","title":"North American diadromous fishes: Drivers of decline and potential for recovery in the Anthropocene","title-short":"North American diadromous fishes","volume":"8","author":[{"family":"Waldman","given":"John R."},{"family":"Quinn","given":"Thomas P."}],"issued":{"date-parts":[["2022",1,28]]}}}],"schema":"https://github.com/citation-style-language/schema/raw/master/csl-citation.json"} </w:instrText>
+      </w:r>
+      <w:r>
+        <w:rPr>
+          <w:rFonts w:ascii="Garamond" w:hAnsi="Garamond"/>
+        </w:rPr>
+        <w:fldChar w:fldCharType="separate"/>
+      </w:r>
+      <w:r>
+        <w:rPr>
+          <w:rFonts w:ascii="Garamond" w:hAnsi="Garamond"/>
+          <w:noProof/>
+        </w:rPr>
+        <w:t>(Quinn, 2018; Robinson et al., 2009; Waldman &amp; Quinn, 2022)</w:t>
+      </w:r>
+      <w:r>
+        <w:rPr>
+          <w:rFonts w:ascii="Garamond" w:hAnsi="Garamond"/>
+        </w:rPr>
+        <w:fldChar w:fldCharType="end"/>
+      </w:r>
+      <w:r>
+        <w:rPr>
+          <w:rFonts w:ascii="Garamond" w:hAnsi="Garamond"/>
+        </w:rPr>
+        <w:t>.</w:t>
       </w:r>
       <w:r>
         <w:rPr>
@@ -178,6 +335,54 @@
         <w:rPr>
           <w:rFonts w:ascii="Garamond" w:hAnsi="Garamond"/>
         </w:rPr>
+        <w:t>However,</w:t>
+      </w:r>
+      <w:r>
+        <w:rPr>
+          <w:rFonts w:ascii="Garamond" w:hAnsi="Garamond"/>
+        </w:rPr>
+        <w:t xml:space="preserve"> these species </w:t>
+      </w:r>
+      <w:r>
+        <w:rPr>
+          <w:rFonts w:ascii="Garamond" w:hAnsi="Garamond"/>
+        </w:rPr>
+        <w:t xml:space="preserve">are </w:t>
+      </w:r>
+      <w:r>
+        <w:rPr>
+          <w:rFonts w:ascii="Garamond" w:hAnsi="Garamond"/>
+        </w:rPr>
+        <w:t xml:space="preserve">critically </w:t>
+      </w:r>
+      <w:r>
+        <w:rPr>
+          <w:rFonts w:ascii="Garamond" w:hAnsi="Garamond"/>
+        </w:rPr>
+        <w:t>important cultural, subsistence, and economic resource</w:t>
+      </w:r>
+      <w:r>
+        <w:rPr>
+          <w:rFonts w:ascii="Garamond" w:hAnsi="Garamond"/>
+        </w:rPr>
+        <w:t xml:space="preserve">s </w:t>
+      </w:r>
+      <w:r>
+        <w:rPr>
+          <w:rFonts w:ascii="Garamond" w:hAnsi="Garamond"/>
+        </w:rPr>
+        <w:t>to many</w:t>
+      </w:r>
+      <w:r>
+        <w:rPr>
+          <w:rFonts w:ascii="Garamond" w:hAnsi="Garamond"/>
+        </w:rPr>
+        <w:t xml:space="preserve"> </w:t>
+      </w:r>
+      <w:r>
+        <w:rPr>
+          <w:rFonts w:ascii="Garamond" w:hAnsi="Garamond"/>
+        </w:rPr>
         <w:t>communities</w:t>
       </w:r>
       <w:r>
@@ -190,13 +395,68 @@
         <w:rPr>
           <w:rFonts w:ascii="Garamond" w:hAnsi="Garamond"/>
         </w:rPr>
-        <w:t xml:space="preserve">and play an important ecological role in both freshwater and marine ecosystems. As </w:t>
-      </w:r>
-      <w:r>
-        <w:rPr>
-          <w:rFonts w:ascii="Garamond" w:hAnsi="Garamond"/>
-        </w:rPr>
-        <w:t xml:space="preserve">such, these population declines have led to </w:t>
+        <w:t>and play an important ecological role in both freshwater and marine ecosystems</w:t>
+      </w:r>
+      <w:r>
+        <w:rPr>
+          <w:rFonts w:ascii="Garamond" w:hAnsi="Garamond"/>
+        </w:rPr>
+        <w:t xml:space="preserve"> </w:t>
+      </w:r>
+      <w:r>
+        <w:rPr>
+          <w:rFonts w:ascii="Garamond" w:hAnsi="Garamond"/>
+        </w:rPr>
+        <w:fldChar w:fldCharType="begin"/>
+      </w:r>
+      <w:r>
+        <w:rPr>
+          <w:rFonts w:ascii="Garamond" w:hAnsi="Garamond"/>
+        </w:rPr>
+        <w:instrText xml:space="preserve"> ADDIN ZOTERO_ITEM CSL_CITATION {"citationID":"jlKlHXQ7","properties":{"formattedCitation":"(Reid et al., 2022; Schindler et al., 2003)","plainCitation":"(Reid et al., 2022; Schindler et al., 2003)","noteIndex":0},"citationItems":[{"id":6046,"uris":["http://zotero.org/users/8421274/items/TNPTITZA"],"itemData":{"id":6046,"type":"article-journal","abstract":"In response to colonial research paradigms that have subjugated Indigenous Peoples, knowledges, lands, and waters, Indigenous research methodologies have emerged to center Indigenous visions and voices in research practice. Here, we employ such methodologies to improve collective understanding of the state and future of wild Pacific salmon (Oncorhynchus spp.) and fish–people–place relationships across British Columbia’s three largest salmon-producing rivers: the Fraser, Skeena, and Nass. Through partnerships with 18 communities of “Salmon People” and semi-structured interviews with 48 knowledge holders (i.e., Elders), we learned that, on average, Elders spent more than half of a century actively engaged in salmon fishing and processing. Modern salmon catches are reported to be approximately one-sixth of what they were estimated to be five to seven decades ago, and the top five threats to salmon identified by Elders included (i) aquaculture, (ii) climate change, (iii) contaminants, (iv) industrial development, and (v) infectious diseases. Threat priorities varied regionally, reflecting distinct lived experiences and regional variation in the prevalence and impact of different threats. Elders perceived threats to salmon equally as threats to aquatic health and human well-being, with evidence that the relationships between people and water, and salmon and people, are being profoundly transformed.","container-title":"FACETS","DOI":"10.1139/facets-2021-0089","note":"publisher: Canadian Science Publishing","page":"718-740","source":"facetsjournal.com (Atypon)","title":"Learning from Indigenous knowledge holders on the state and future of wild Pacific salmon","volume":"7","author":[{"family":"Reid","given":"Andrea J."},{"family":"Young","given":"Nathan"},{"family":"Hinch","given":"Scott G."},{"family":"Cooke","given":"Steven J."}],"issued":{"date-parts":[["2022",1]]}}},{"id":6040,"uris":["http://zotero.org/users/8421274/items/NXKCYMTT"],"itemData":{"id":6040,"type":"article-journal","abstract":"One of the most spectacular phenomena in nature is the annual return of millions of salmon to spawn in their natal streams and lakes along the Pacific coast of North America. The salmon die after spawning, and the nutrients and energy in their bodies, derived almost entirely from marine sources, are deposited in the freshwater ecosystems. This represents a vital input to the ecosystems used as spawning grounds. Salmon-derived nutrients make up a substantial fraction of the plants and animals in aquatic and terrestrial habitats associated with healthy salmon populations. The decline of salmon numbers throughout much of their southern range in North America has prompted concern that the elimination of this “conveyor belt” of nutrients and energy may fundamentally change the productivity of these coastal freshwater and terrestrial ecosystems, and consequently their ability to support wildlife, including salmon. If progress is to be made towards understanding and conserving the connection between migratory salmon and coastal ecosystems, scientists and decision-makers must explore and understand the vast temporal and spatial scales that characterize this relationship.","container-title":"Frontiers in Ecology and the Environment","DOI":"10.1890/1540-9295(2003)001[0031:PSATEO]2.0.CO;2","ISSN":"1540-9309","issue":"1","language":"en","license":"© The Ecological Society of America","note":"_eprint: https://esajournals.onlinelibrary.wiley.com/doi/pdf/10.1890/1540-9295%282003%29001%5B0031%3APSATEO%5D2.0.CO%3B2","page":"31-37","source":"Wiley Online Library","title":"Pacific salmon and the ecology of coastal ecosystems","volume":"1","author":[{"family":"Schindler","given":"Daniel E."},{"family":"Scheuerell","given":"Mark D."},{"family":"Moore","given":"Jonathan W."},{"family":"Gende","given":"Scott M."},{"family":"Francis","given":"Tessa B."},{"family":"Palen","given":"Wendy J."}],"issued":{"date-parts":[["2003"]]}}}],"schema":"https://github.com/citation-style-language/schema/raw/master/csl-citation.json"} </w:instrText>
+      </w:r>
+      <w:r>
+        <w:rPr>
+          <w:rFonts w:ascii="Garamond" w:hAnsi="Garamond"/>
+        </w:rPr>
+        <w:fldChar w:fldCharType="separate"/>
+      </w:r>
+      <w:r>
+        <w:rPr>
+          <w:rFonts w:ascii="Garamond" w:hAnsi="Garamond"/>
+          <w:noProof/>
+        </w:rPr>
+        <w:t>(Reid et al., 2022; Schindler et al., 2003)</w:t>
+      </w:r>
+      <w:r>
+        <w:rPr>
+          <w:rFonts w:ascii="Garamond" w:hAnsi="Garamond"/>
+        </w:rPr>
+        <w:fldChar w:fldCharType="end"/>
+      </w:r>
+      <w:r>
+        <w:rPr>
+          <w:rFonts w:ascii="Garamond" w:hAnsi="Garamond"/>
+        </w:rPr>
+        <w:t xml:space="preserve">. As </w:t>
+      </w:r>
+      <w:r>
+        <w:rPr>
+          <w:rFonts w:ascii="Garamond" w:hAnsi="Garamond"/>
+        </w:rPr>
+        <w:t xml:space="preserve">such, </w:t>
+      </w:r>
+      <w:r>
+        <w:rPr>
+          <w:rFonts w:ascii="Garamond" w:hAnsi="Garamond"/>
+        </w:rPr>
+        <w:t xml:space="preserve">population declines </w:t>
+      </w:r>
+      <w:r>
+        <w:rPr>
+          <w:rFonts w:ascii="Garamond" w:hAnsi="Garamond"/>
+        </w:rPr>
+        <w:t xml:space="preserve">have led to </w:t>
       </w:r>
       <w:r>
         <w:rPr>
@@ -250,7 +510,44 @@
         <w:rPr>
           <w:rFonts w:ascii="Garamond" w:hAnsi="Garamond"/>
         </w:rPr>
-        <w:t xml:space="preserve"> in degraded ecosystems. </w:t>
+        <w:t xml:space="preserve"> in degraded ecosystems</w:t>
+      </w:r>
+      <w:r>
+        <w:rPr>
+          <w:rFonts w:ascii="Garamond" w:hAnsi="Garamond"/>
+        </w:rPr>
+        <w:t xml:space="preserve"> </w:t>
+      </w:r>
+      <w:r>
+        <w:rPr>
+          <w:rFonts w:ascii="Garamond" w:hAnsi="Garamond"/>
+        </w:rPr>
+        <w:fldChar w:fldCharType="begin"/>
+      </w:r>
+      <w:r>
+        <w:rPr>
+          <w:rFonts w:ascii="Garamond" w:hAnsi="Garamond"/>
+        </w:rPr>
+        <w:instrText xml:space="preserve"> ADDIN ZOTERO_ITEM CSL_CITATION {"citationID":"CYzx2Nyz","properties":{"formattedCitation":"(Cordoleani et al., 2024; Rahr et al., 2025)","plainCitation":"(Cordoleani et al., 2024; Rahr et al., 2025)","noteIndex":0},"citationItems":[{"id":5990,"uris":["http://zotero.org/users/8421274/items/BGVZ7ZLQ"],"itemData":{"id":5990,"type":"article-journal","abstract":"Phenotypic diversity and abundance drive salmon resilience in the face of increasing environmental variability. But what happens when human activities fundamentally alter the habitat complexity that drives this diversity? And how can we restore habitats to recover both diversity and abundance to support salmon persistence in a warming climate? Here, we looked at the impact of a large watershed restoration effort on the abundance and climate resilience of the three remaining core natural spring-run Chinook Salmon populations in the California Central Valley (Butte, Mill, and Deer Creek). Butte Creek fish, which have floodplain access, had higher overall productivity and faster juvenile growth compared with Mill and Deer Creek populations, and the proportion of floodplain inundation was positively correlated with Butte Creek adult abundance two years later. While Butte Creek exhibited significant increases in abundance post-restoration (similar to 000%), it generally exhibited lower phenotypic diversity and only a marginal increase in population stability after restoration based on the coefficient of variation (CV). In particular, Butte Creek salmon tended to exhibit larger drops in escapement following dry years (e.g., return years 2010, 2017) compared with Mill and Deer Creek populations, presumably due to limited inundation of its downstream floodplain. The late-migrating juvenile strategy (i.e., yearling), which disproportionately supported Mill and Deer Creek populations during droughts, was uncommon among Butte Creek adults (averaging 60% of returns for Mill and Deer Creek vs. 0.3% for Butte Creek). Increased spring-run stock complex stability was found, post-restoration, when combining the three spring-run populations (i.e., lower aggregate CV). However, among-river pairwise correlations also suggested increased synchronization in population abundances post-restoration, potentially due to increasing frequency and severity of extreme climatic events (e.g., droughts and ocean warming). This study underscores the importance of restoring a connected mosaic of aquatic habitats across modified landscapes, such as cold water refugia and floodplains, to preserve multiple (across-population) life history pathways for increasing salmon stock complex stability and abundance. These landscape-scale process-based habitat restoration efforts are likely to be crucial for the successful long-term recovery of vulnerable species in a rapidly changing climate.","container-title":"Ecosphere","DOI":"10.1002/ecs2.4803","ISSN":"2150-8925","issue":"3","journalAbbreviation":"Ecosphere","language":"English","note":"number-of-pages: 18\npublisher-place: Hoboken\npublisher: Wiley\nWeb of Science ID: WOS:001182186400001","page":"e4803","source":"Clarivate Analytics Web of Science","title":"Restoring freshwater habitat mosaics to promote resilience of vulnerable salmon populations","volume":"15","author":[{"family":"Cordoleani","given":"Flora"},{"family":"Phillis","given":"Corey C."},{"family":"Sturrock","given":"Anna M."},{"family":"Willmes","given":"Malte"},{"family":"Whitman","given":"George"},{"family":"Holmes","given":"Eric"},{"family":"Weber","given":"Peter K."},{"family":"Jeffres","given":"Carson"},{"family":"Johnson","given":"Rachel C."}],"issued":{"date-parts":[["2024",3]]}}},{"id":6043,"uris":["http://zotero.org/users/8421274/items/C2HKLHLY"],"itemData":{"id":6043,"type":"article-journal","abstract":"Nested within the linked global crises of biodiversity loss and climate change are threats to cultural and ecological keystones such as Pacific salmon Oncorhynchus spp., a group of species with widespread ecological, cultural, and economic value. Wild salmon can rally public support for ecosystem protection and link place-based conservation efforts to global biodiversity and climate benefits. Realizing these benefits depends on leveraging broad support for salmon conservation to advance forward-looking approaches that safeguard food security, biodiversity, and climate resilience. Here we provide insights from the multidecadal implementation of a proactive wild salmon ecosystem conservation strategy at the scale of the North Pacific Rim. This approach is a necessary complement to policies focused on preventing species extinction after populations and habitats are degraded and it provides globally significant contributions to biodiversity and climate targets including recent 30 × 30 goals of the Convention on Biological Diversity.","container-title":"Fisheries","DOI":"10.1093/fshmag/vuaf011","ISSN":"0363-2415","issue":"9","page":"399-415","source":"Silverchair","title":"Strongholds for Pacific salmon: A proactive conservation strategy for ecosystem health, food security, biodiversity, and climate resilience","title-short":"Strongholds for Pacific salmon","volume":"50","author":[{"family":"Rahr","given":"Guido R","suffix":"III"},{"family":"Sloat","given":"Matthew R"},{"family":"Atlas","given":"William I"},{"family":"Hart","given":"Jonathan L"}],"issued":{"date-parts":[["2025",9,1]]}}}],"schema":"https://github.com/citation-style-language/schema/raw/master/csl-citation.json"} </w:instrText>
+      </w:r>
+      <w:r>
+        <w:rPr>
+          <w:rFonts w:ascii="Garamond" w:hAnsi="Garamond"/>
+        </w:rPr>
+        <w:fldChar w:fldCharType="separate"/>
+      </w:r>
+      <w:r>
+        <w:rPr>
+          <w:rFonts w:ascii="Garamond" w:hAnsi="Garamond"/>
+          <w:noProof/>
+        </w:rPr>
+        <w:t>(Cordoleani et al., 2024; Rahr et al., 2025)</w:t>
+      </w:r>
+      <w:r>
+        <w:rPr>
+          <w:rFonts w:ascii="Garamond" w:hAnsi="Garamond"/>
+        </w:rPr>
+        <w:fldChar w:fldCharType="end"/>
       </w:r>
     </w:p>
     <w:p>
@@ -266,13 +563,13 @@
         <w:rPr>
           <w:rFonts w:ascii="Garamond" w:hAnsi="Garamond"/>
         </w:rPr>
-        <w:t>W</w:t>
-      </w:r>
-      <w:r>
-        <w:rPr>
-          <w:rFonts w:ascii="Garamond" w:hAnsi="Garamond"/>
-        </w:rPr>
-        <w:t>atersheds at the northernmost extent of the</w:t>
+        <w:t>Alaska watersheds,</w:t>
+      </w:r>
+      <w:r>
+        <w:rPr>
+          <w:rFonts w:ascii="Garamond" w:hAnsi="Garamond"/>
+        </w:rPr>
+        <w:t xml:space="preserve"> at the northernmost extent of the</w:t>
       </w:r>
       <w:r>
         <w:rPr>
@@ -284,13 +581,194 @@
         <w:rPr>
           <w:rFonts w:ascii="Garamond" w:hAnsi="Garamond"/>
         </w:rPr>
-        <w:t xml:space="preserve"> salmon have experienced substantially fewer anthropogenic </w:t>
-      </w:r>
-      <w:r>
-        <w:rPr>
-          <w:rFonts w:ascii="Garamond" w:hAnsi="Garamond"/>
-        </w:rPr>
-        <w:t xml:space="preserve">than their southern counterparts. </w:t>
+        <w:t xml:space="preserve"> salmon</w:t>
+      </w:r>
+      <w:r>
+        <w:rPr>
+          <w:rFonts w:ascii="Garamond" w:hAnsi="Garamond"/>
+        </w:rPr>
+        <w:t>,</w:t>
+      </w:r>
+      <w:r>
+        <w:rPr>
+          <w:rFonts w:ascii="Garamond" w:hAnsi="Garamond"/>
+        </w:rPr>
+        <w:t xml:space="preserve"> have experienced substantially</w:t>
+      </w:r>
+      <w:r>
+        <w:rPr>
+          <w:rFonts w:ascii="Garamond" w:hAnsi="Garamond"/>
+        </w:rPr>
+        <w:t xml:space="preserve"> fewer</w:t>
+      </w:r>
+      <w:r>
+        <w:rPr>
+          <w:rFonts w:ascii="Garamond" w:hAnsi="Garamond"/>
+        </w:rPr>
+        <w:t xml:space="preserve"> </w:t>
+      </w:r>
+      <w:r>
+        <w:rPr>
+          <w:rFonts w:ascii="Garamond" w:hAnsi="Garamond"/>
+        </w:rPr>
+        <w:t xml:space="preserve">negative impacts to salmon ecosystems </w:t>
+      </w:r>
+      <w:r>
+        <w:rPr>
+          <w:rFonts w:ascii="Garamond" w:hAnsi="Garamond"/>
+        </w:rPr>
+        <w:t xml:space="preserve">than </w:t>
+      </w:r>
+      <w:r>
+        <w:rPr>
+          <w:rFonts w:ascii="Garamond" w:hAnsi="Garamond"/>
+        </w:rPr>
+        <w:t xml:space="preserve">those </w:t>
+      </w:r>
+      <w:r>
+        <w:rPr>
+          <w:rFonts w:ascii="Garamond" w:hAnsi="Garamond"/>
+        </w:rPr>
+        <w:t>in the U.S. Pacific Northwest, California, and southern British Columbia</w:t>
+      </w:r>
+      <w:r>
+        <w:rPr>
+          <w:rFonts w:ascii="Garamond" w:hAnsi="Garamond"/>
+        </w:rPr>
+        <w:t xml:space="preserve"> </w:t>
+      </w:r>
+      <w:r>
+        <w:rPr>
+          <w:rFonts w:ascii="Garamond" w:hAnsi="Garamond"/>
+        </w:rPr>
+        <w:fldChar w:fldCharType="begin"/>
+      </w:r>
+      <w:r>
+        <w:rPr>
+          <w:rFonts w:ascii="Garamond" w:hAnsi="Garamond"/>
+        </w:rPr>
+        <w:instrText xml:space="preserve"> ADDIN ZOTERO_ITEM CSL_CITATION {"citationID":"xRsa1svq","properties":{"formattedCitation":"(Schoen et al., 2017; Williams, 2006; Yoshiyama et al., 1998)","plainCitation":"(Schoen et al., 2017; Williams, 2006; Yoshiyama et al., 1998)","noteIndex":0},"citationItems":[{"id":6051,"uris":["http://zotero.org/users/8421274/items/UPNXXHTQ"],"itemData":{"id":6051,"type":"article-journal","abstract":"Pacific salmon Oncorhynchus spp. face serious challenges from climate and landscape change, particularly in the southern portion of their native range. Conversely, climate warming appears to be allowing salmon to expand northwards into the Arctic. Between these geographic extremes, in the Gulf of Alaska region, salmon are at historically high abundances but face an uncertain future due to rapid environmental change. We examined changes in climate, hydrology, land cover, salmon populations, and fisheries over the past 30–70 years in this region. We focused on the Kenai River, which supports world-famous fisheries but where Chinook Salmon O. tshawytscha populations have declined, raising concerns about their future resilience. The region is warming and experiencing drier summers and wetter autumns. The landscape is also changing, with melting glaciers, wetland loss, wildfires, and human development. This environmental transformation will likely harm some salmon populations while benefiting others. Lowland salmon streams are especially vulnerable, but retreating glaciers may allow production gains in other streams. Some fishing communities harvest a diverse portfolio of fluctuating resources, whereas others have specialized over time, potentially limiting their resilience. Maintaining diverse habitats and salmon runs may allow ecosystems and fisheries to continue to thrive amidst these changes.","container-title":"Fisheries","DOI":"10.1080/03632415.2017.1374251","ISSN":"0363-2415","issue":"10","note":"publisher: Taylor &amp; Francis\n_eprint: https://doi.org/10.1080/03632415.2017.1374251","page":"538-553","source":"Taylor and Francis+NEJM","title":"Future of Pacific Salmon in the Face of Environmental Change: Lessons from One of the World's Remaining Productive Salmon Regions","title-short":"Future of Pacific Salmon in the Face of Environmental Change","volume":"42","author":[{"family":"Schoen","given":"Erik R."},{"family":"Wipfli","given":"Mark S."},{"family":"Trammell","given":"E. Jamie"},{"family":"Rinella","given":"Daniel J."},{"family":"Floyd","given":"Angelica L."},{"family":"Grunblatt","given":"Jess"},{"family":"McCarthy","given":"Molly D."},{"family":"Meyer","given":"Benjamin E."},{"family":"Morton","given":"John M."},{"family":"Powell","given":"James E."},{"family":"Prakash","given":"Anupma"},{"family":"Reimer","given":"Matthew N."},{"family":"Stuefer","given":"Svetlana L."},{"family":"Toniolo","given":"Horacio"},{"family":"Wells","given":"Brett M."},{"family":"Witmer","given":"Frank D. W."}],"issued":{"date-parts":[["2017",10,3]]}}},{"id":6057,"uris":["http://zotero.org/users/8421274/items/MWDVQVR3"],"itemData":{"id":6057,"type":"article-journal","abstract":"This monograph presents an extensive review of the biology and management of Chinook salmon and steelhead in the Central Valley of California. Relevant data and publications on these populations are summarized and discussed in the context of the wider professional literature, with emphasis on the importance of evolutionary considerations in the assessment of populations and in their management, the need to manage populations together with their environments, and the contradiction between maintaining a major hatchery program to support a mixed-stock ocean fishery and trying to maintain or restore populations adapted to natural or semi-natural habitats. Recommendations are presented for management and monitoring—for example for a thorough review of hatchery operations, for more emphasis on monitoring individual-based factors such the physiological condition and growth rates of juveniles, and for simulation of major restoration actions and monitoring programs. The 17 chapters cover major conceptsin salmon biology and conceptual foundations for management, and Central Valley Chinook and steelhead populations and their habitat, growth and migration, habitat use, harvest, hatcheries, modeling, monitoring, and management.","container-title":"San Francisco Estuary and Watershed Science","DOI":"10.15447/sfews.2006v4iss3art2","issue":"3","language":"en","source":"escholarship.org","title":"Central Valley Salmon: A Perspective on Chinook and Steelhead in the Central Valley of California","title-short":"Central Valley Salmon","URL":"https://escholarship.org/uc/item/21v9x1t7","volume":"4","author":[{"family":"Williams","given":"John G."}],"accessed":{"date-parts":[["2026",1,5]]},"issued":{"date-parts":[["2006"]]}}},{"id":5348,"uris":["http://zotero.org/users/8421274/items/VU4C5NC2"],"itemData":{"id":5348,"type":"article-journal","abstract":"The Central Valley drainage of California formerly produced immense numbers of chinook salmon Oncorhynchus tshawytscha. Four seasonal runs occur in this system—fall, late</w:instrText>
+      </w:r>
+      <w:r>
+        <w:rPr>
+          <w:rFonts w:ascii="Cambria Math" w:hAnsi="Cambria Math" w:cs="Cambria Math"/>
+        </w:rPr>
+        <w:instrText>‐</w:instrText>
+      </w:r>
+      <w:r>
+        <w:rPr>
+          <w:rFonts w:ascii="Garamond" w:hAnsi="Garamond"/>
+        </w:rPr>
+        <w:instrText>fall, winter, and spring runs. Differences in life history timing and spatial distribution enabled the four runs to use the drainage to the fullest possible extent and once made it one of the richest regions in the world for chinook salmon production. Native American fishers within the Central Valley drainage harvested chinook salmon at estimated levels that reached 8.5 million pounds or more annually. Native harvests, therefore, were roughly comparable to the peak commercial harvests taken later by Euro</w:instrText>
+      </w:r>
+      <w:r>
+        <w:rPr>
+          <w:rFonts w:ascii="Cambria Math" w:hAnsi="Cambria Math" w:cs="Cambria Math"/>
+        </w:rPr>
+        <w:instrText>‐</w:instrText>
+      </w:r>
+      <w:r>
+        <w:rPr>
+          <w:rFonts w:ascii="Garamond" w:hAnsi="Garamond"/>
+        </w:rPr>
+        <w:instrText>American fishers, but whether or not native fishing depressed the productive capacities of the salmon populations to any substantial degree is not known. The commercial chinook salmon fishery in California started about 1850 in the San Francisco Bay and Sacramento–San Joaquin Delta region, where it formed the nucleus of the first major fishery conducted by Euro</w:instrText>
+      </w:r>
+      <w:r>
+        <w:rPr>
+          <w:rFonts w:ascii="Cambria Math" w:hAnsi="Cambria Math" w:cs="Cambria Math"/>
+        </w:rPr>
+        <w:instrText>‐</w:instrText>
+      </w:r>
+      <w:r>
+        <w:rPr>
+          <w:rFonts w:ascii="Garamond" w:hAnsi="Garamond"/>
+        </w:rPr>
+        <w:instrText>American immigrants in the state. This fishery was one of the important early industries that supported the Euro</w:instrText>
+      </w:r>
+      <w:r>
+        <w:rPr>
+          <w:rFonts w:ascii="Cambria Math" w:hAnsi="Cambria Math" w:cs="Cambria Math"/>
+        </w:rPr>
+        <w:instrText>‐</w:instrText>
+      </w:r>
+      <w:r>
+        <w:rPr>
+          <w:rFonts w:ascii="Garamond" w:hAnsi="Garamond"/>
+        </w:rPr>
+        <w:instrText>American settlement of the Central Valley region. The salmon fishery remained centered there until the early 1900s, when ocean salmon fishing began to expand and eventually came to dominate the fishery. Annual catches by the early Sacramento–San Joaquin in</w:instrText>
+      </w:r>
+      <w:r>
+        <w:rPr>
+          <w:rFonts w:ascii="Cambria Math" w:hAnsi="Cambria Math" w:cs="Cambria Math"/>
+        </w:rPr>
+        <w:instrText>‐</w:instrText>
+      </w:r>
+      <w:r>
+        <w:rPr>
+          <w:rFonts w:ascii="Garamond" w:hAnsi="Garamond"/>
+        </w:rPr>
+        <w:instrText>river fishery commonly reached 4–10 million pounds and generally were higher than the total statewide catches made during the most recent several decades. The historical abundances of Central Valley chinook salmon before large</w:instrText>
+      </w:r>
+      <w:r>
+        <w:rPr>
+          <w:rFonts w:ascii="Cambria Math" w:hAnsi="Cambria Math" w:cs="Cambria Math"/>
+        </w:rPr>
+        <w:instrText>‐</w:instrText>
+      </w:r>
+      <w:r>
+        <w:rPr>
+          <w:rFonts w:ascii="Garamond" w:hAnsi="Garamond"/>
+        </w:rPr>
+        <w:instrText>scale commercial exploitation and depletion of the runs cannot be determined with certainty. However, on the basis of early commercial catch records, the maximal production levels of the Central Valley chinook salmon stocks in aggregate may be conservatively estimated to have reached approximately 1–2 million spawners annually. Although substantial investment has been made by the state of California in managing the chinook salmon resource since the early years of the commercial fishery, chinook salmon have declined over the decades to small fractions of their previous numbers. The decline of the Central Valley chinook salmon resource was caused by several factors: overfishing, blockage and degradation of streams by mining activities, and reduction of salmon habitat and streamflows by dams and water diversions. Differences between the four chinook salmon runs in life history timing and habitat requirements partly account for their different population histories; the winter run is now threatened with extinction, the spring run recently has approached a similarly imperiled state, and the late</w:instrText>
+      </w:r>
+      <w:r>
+        <w:rPr>
+          <w:rFonts w:ascii="Cambria Math" w:hAnsi="Cambria Math" w:cs="Cambria Math"/>
+        </w:rPr>
+        <w:instrText>‐</w:instrText>
+      </w:r>
+      <w:r>
+        <w:rPr>
+          <w:rFonts w:ascii="Garamond" w:hAnsi="Garamond"/>
+        </w:rPr>
+        <w:instrText>fall run has been at moderately low population levels for the past two decades. Only the fall run, in aggregate, can be regarded as secure, but it too has undergone substantial reductions in abundance. Fall</w:instrText>
+      </w:r>
+      <w:r>
+        <w:rPr>
+          <w:rFonts w:ascii="Cambria Math" w:hAnsi="Cambria Math" w:cs="Cambria Math"/>
+        </w:rPr>
+        <w:instrText>‐</w:instrText>
+      </w:r>
+      <w:r>
+        <w:rPr>
+          <w:rFonts w:ascii="Garamond" w:hAnsi="Garamond"/>
+        </w:rPr>
+        <w:instrText xml:space="preserve">run spawner numbers were especially low in the San Joaquin River basin in recent years, and in Sacramento River basin streams their numbers have been heavily influenced by production of hatchery fish.","container-title":"North American Journal of Fisheries Management","DOI":"10.1577/1548-8675(1998)018&lt;0487:HAADOC&gt;2.0.CO;2","ISSN":"0275-5947","issue":"3","journalAbbreviation":"North American Journal of Fisheries Management","page":"487-521","source":"Silverchair","title":"Historical Abundance and Decline of Chinook Salmon in the Central Valley Region of California","volume":"18","author":[{"family":"Yoshiyama","given":"Ronald M."},{"family":"Fisher","given":"Frank W."},{"family":"Moyle","given":"Peter B."}],"issued":{"date-parts":[["1998",8,1]]}}}],"schema":"https://github.com/citation-style-language/schema/raw/master/csl-citation.json"} </w:instrText>
+      </w:r>
+      <w:r>
+        <w:rPr>
+          <w:rFonts w:ascii="Garamond" w:hAnsi="Garamond"/>
+        </w:rPr>
+        <w:fldChar w:fldCharType="separate"/>
+      </w:r>
+      <w:r>
+        <w:rPr>
+          <w:rFonts w:ascii="Garamond" w:hAnsi="Garamond"/>
+          <w:noProof/>
+        </w:rPr>
+        <w:t>(Schoen et al., 2017; Williams, 2006; Yoshiyama et al., 1998)</w:t>
+      </w:r>
+      <w:r>
+        <w:rPr>
+          <w:rFonts w:ascii="Garamond" w:hAnsi="Garamond"/>
+        </w:rPr>
+        <w:fldChar w:fldCharType="end"/>
+      </w:r>
+      <w:r>
+        <w:rPr>
+          <w:rFonts w:ascii="Garamond" w:hAnsi="Garamond"/>
+        </w:rPr>
+        <w:t xml:space="preserve">. </w:t>
       </w:r>
       <w:r>
         <w:rPr>
@@ -308,25 +786,19 @@
         <w:rPr>
           <w:rFonts w:ascii="Garamond" w:hAnsi="Garamond"/>
         </w:rPr>
-        <w:t>and contain some of the last remaining pristine habitats. As</w:t>
-      </w:r>
-      <w:r>
-        <w:rPr>
-          <w:rFonts w:ascii="Garamond" w:hAnsi="Garamond"/>
-        </w:rPr>
-        <w:t xml:space="preserve"> such, </w:t>
-      </w:r>
-      <w:r>
-        <w:rPr>
-          <w:rFonts w:ascii="Garamond" w:hAnsi="Garamond"/>
-        </w:rPr>
-        <w:t xml:space="preserve">these </w:t>
-      </w:r>
-      <w:r>
-        <w:rPr>
-          <w:rFonts w:ascii="Garamond" w:hAnsi="Garamond"/>
-        </w:rPr>
-        <w:t xml:space="preserve">ecosystems are expected to </w:t>
+        <w:t>and contain some of the last remaining pristine habitats</w:t>
+      </w:r>
+      <w:r>
+        <w:rPr>
+          <w:rFonts w:ascii="Garamond" w:hAnsi="Garamond"/>
+        </w:rPr>
+        <w:t xml:space="preserve">, which are </w:t>
+      </w:r>
+      <w:r>
+        <w:rPr>
+          <w:rFonts w:ascii="Garamond" w:hAnsi="Garamond"/>
+        </w:rPr>
+        <w:t xml:space="preserve">expected to </w:t>
       </w:r>
       <w:r>
         <w:rPr>
@@ -350,7 +822,7 @@
         <w:rPr>
           <w:rFonts w:ascii="Garamond" w:hAnsi="Garamond"/>
         </w:rPr>
-        <w:t>populations.</w:t>
+        <w:t>populations</w:t>
       </w:r>
       <w:r>
         <w:rPr>
@@ -362,6 +834,49 @@
         <w:rPr>
           <w:rFonts w:ascii="Garamond" w:hAnsi="Garamond"/>
         </w:rPr>
+        <w:fldChar w:fldCharType="begin"/>
+      </w:r>
+      <w:r>
+        <w:rPr>
+          <w:rFonts w:ascii="Garamond" w:hAnsi="Garamond"/>
+        </w:rPr>
+        <w:instrText xml:space="preserve"> ADDIN ZOTERO_ITEM CSL_CITATION {"citationID":"OBNj6FQs","properties":{"formattedCitation":"(Schoen et al., 2017)","plainCitation":"(Schoen et al., 2017)","noteIndex":0},"citationItems":[{"id":6051,"uris":["http://zotero.org/users/8421274/items/UPNXXHTQ"],"itemData":{"id":6051,"type":"article-journal","abstract":"Pacific salmon Oncorhynchus spp. face serious challenges from climate and landscape change, particularly in the southern portion of their native range. Conversely, climate warming appears to be allowing salmon to expand northwards into the Arctic. Between these geographic extremes, in the Gulf of Alaska region, salmon are at historically high abundances but face an uncertain future due to rapid environmental change. We examined changes in climate, hydrology, land cover, salmon populations, and fisheries over the past 30–70 years in this region. We focused on the Kenai River, which supports world-famous fisheries but where Chinook Salmon O. tshawytscha populations have declined, raising concerns about their future resilience. The region is warming and experiencing drier summers and wetter autumns. The landscape is also changing, with melting glaciers, wetland loss, wildfires, and human development. This environmental transformation will likely harm some salmon populations while benefiting others. Lowland salmon streams are especially vulnerable, but retreating glaciers may allow production gains in other streams. Some fishing communities harvest a diverse portfolio of fluctuating resources, whereas others have specialized over time, potentially limiting their resilience. Maintaining diverse habitats and salmon runs may allow ecosystems and fisheries to continue to thrive amidst these changes.","container-title":"Fisheries","DOI":"10.1080/03632415.2017.1374251","ISSN":"0363-2415","issue":"10","note":"publisher: Taylor &amp; Francis\n_eprint: https://doi.org/10.1080/03632415.2017.1374251","page":"538-553","source":"Taylor and Francis+NEJM","title":"Future of Pacific Salmon in the Face of Environmental Change: Lessons from One of the World's Remaining Productive Salmon Regions","title-short":"Future of Pacific Salmon in the Face of Environmental Change","volume":"42","author":[{"family":"Schoen","given":"Erik R."},{"family":"Wipfli","given":"Mark S."},{"family":"Trammell","given":"E. Jamie"},{"family":"Rinella","given":"Daniel J."},{"family":"Floyd","given":"Angelica L."},{"family":"Grunblatt","given":"Jess"},{"family":"McCarthy","given":"Molly D."},{"family":"Meyer","given":"Benjamin E."},{"family":"Morton","given":"John M."},{"family":"Powell","given":"James E."},{"family":"Prakash","given":"Anupma"},{"family":"Reimer","given":"Matthew N."},{"family":"Stuefer","given":"Svetlana L."},{"family":"Toniolo","given":"Horacio"},{"family":"Wells","given":"Brett M."},{"family":"Witmer","given":"Frank D. W."}],"issued":{"date-parts":[["2017",10,3]]}}}],"schema":"https://github.com/citation-style-language/schema/raw/master/csl-citation.json"} </w:instrText>
+      </w:r>
+      <w:r>
+        <w:rPr>
+          <w:rFonts w:ascii="Garamond" w:hAnsi="Garamond"/>
+        </w:rPr>
+        <w:fldChar w:fldCharType="separate"/>
+      </w:r>
+      <w:r>
+        <w:rPr>
+          <w:rFonts w:ascii="Garamond" w:hAnsi="Garamond"/>
+          <w:noProof/>
+        </w:rPr>
+        <w:t>(Schoen et al., 2017)</w:t>
+      </w:r>
+      <w:r>
+        <w:rPr>
+          <w:rFonts w:ascii="Garamond" w:hAnsi="Garamond"/>
+        </w:rPr>
+        <w:fldChar w:fldCharType="end"/>
+      </w:r>
+      <w:r>
+        <w:rPr>
+          <w:rFonts w:ascii="Garamond" w:hAnsi="Garamond"/>
+        </w:rPr>
+        <w:t>.</w:t>
+      </w:r>
+      <w:r>
+        <w:rPr>
+          <w:rFonts w:ascii="Garamond" w:hAnsi="Garamond"/>
+        </w:rPr>
+        <w:t xml:space="preserve"> </w:t>
+      </w:r>
+      <w:r>
+        <w:rPr>
+          <w:rFonts w:ascii="Garamond" w:hAnsi="Garamond"/>
+        </w:rPr>
         <w:t>These systems therefore offer a</w:t>
       </w:r>
       <w:r>
@@ -380,7 +895,14 @@
         <w:rPr>
           <w:rFonts w:ascii="Garamond" w:hAnsi="Garamond"/>
         </w:rPr>
-        <w:t xml:space="preserve">explore the natural ecological processes which govern </w:t>
+        <w:t xml:space="preserve">explore the </w:t>
+      </w:r>
+      <w:r>
+        <w:rPr>
+          <w:rFonts w:ascii="Garamond" w:hAnsi="Garamond"/>
+        </w:rPr>
+        <w:lastRenderedPageBreak/>
+        <w:t xml:space="preserve">ecological processes which govern </w:t>
       </w:r>
       <w:r>
         <w:rPr>
@@ -392,13 +914,19 @@
         <w:rPr>
           <w:rFonts w:ascii="Garamond" w:hAnsi="Garamond"/>
         </w:rPr>
-        <w:t xml:space="preserve">, providing insights into the </w:t>
-      </w:r>
-      <w:r>
-        <w:rPr>
-          <w:rFonts w:ascii="Garamond" w:hAnsi="Garamond"/>
-        </w:rPr>
-        <w:t>ways in which salmon ecology and ecosystem processes interact to sustain healthy populations and providing</w:t>
+        <w:t xml:space="preserve">, </w:t>
+      </w:r>
+      <w:r>
+        <w:rPr>
+          <w:rFonts w:ascii="Garamond" w:hAnsi="Garamond"/>
+        </w:rPr>
+        <w:t xml:space="preserve">which may </w:t>
+      </w:r>
+      <w:r>
+        <w:rPr>
+          <w:rFonts w:ascii="Garamond" w:hAnsi="Garamond"/>
+        </w:rPr>
+        <w:t>provide</w:t>
       </w:r>
       <w:r>
         <w:rPr>
@@ -426,9 +954,108 @@
         <w:rPr>
           <w:rFonts w:ascii="Garamond" w:hAnsi="Garamond"/>
         </w:rPr>
-        <w:lastRenderedPageBreak/>
-        <w:t xml:space="preserve">The roles of both habitat heterogeneity [ref] and intrapopulation trait variability in maintaining healthy salmon watersheds are well established [ref, ref, ref]. </w:t>
-      </w:r>
+        <w:t xml:space="preserve">The roles of both habitat heterogeneity </w:t>
+      </w:r>
+      <w:r>
+        <w:rPr>
+          <w:rFonts w:ascii="Garamond" w:hAnsi="Garamond"/>
+        </w:rPr>
+        <w:fldChar w:fldCharType="begin"/>
+      </w:r>
+      <w:r>
+        <w:rPr>
+          <w:rFonts w:ascii="Garamond" w:hAnsi="Garamond"/>
+        </w:rPr>
+        <w:instrText xml:space="preserve"> ADDIN ZOTERO_ITEM CSL_CITATION {"citationID":"KD5YUNyC","properties":{"formattedCitation":"(Brennan et al., 2019)","plainCitation":"(Brennan et al., 2019)","noteIndex":0},"citationItems":[{"id":3844,"uris":["http://zotero.org/users/8421274/items/RXD5IA9D"],"itemData":{"id":3844,"type":"article-journal","abstract":"Watersheds are complex mosaics of habitats whose conditions vary across space and time as landscape features filter overriding climate forcing, yet the extent to which the reliability of ecosystem services depends on these dynamics remains unknown. We quantified how shifting habitat mosaics are expressed across a range of spatial scales within a large, free-flowing river, and how they stabilize the production of Pacific salmon that support valuable fisheries. The strontium isotope records of ear stones (otoliths) show that the relative productivity of locations across the river network, as both natal- and juvenile-rearing habitat, varies widely among years and that this variability is expressed across a broad range of spatial scales, ultimately stabilizing the interannual production of fish at the scale of the entire basin.","container-title":"Science","DOI":"10.1126/science.aav4313","issue":"6442","note":"publisher: American Association for the Advancement of Science","page":"783-786","source":"science.org (Atypon)","title":"Shifting habitat mosaics and fish production across river basins","volume":"364","author":[{"family":"Brennan","given":"Sean R."},{"family":"Schindler","given":"Daniel E."},{"family":"Cline","given":"Timothy J."},{"family":"Walsworth","given":"Timothy E."},{"family":"Buck","given":"Greg"},{"family":"Fernandez","given":"Diego P."}],"issued":{"date-parts":[["2019"]]}}}],"schema":"https://github.com/citation-style-language/schema/raw/master/csl-citation.json"} </w:instrText>
+      </w:r>
+      <w:r>
+        <w:rPr>
+          <w:rFonts w:ascii="Garamond" w:hAnsi="Garamond"/>
+        </w:rPr>
+        <w:fldChar w:fldCharType="separate"/>
+      </w:r>
+      <w:r>
+        <w:rPr>
+          <w:rFonts w:ascii="Garamond" w:hAnsi="Garamond"/>
+          <w:noProof/>
+        </w:rPr>
+        <w:t>(Brennan et al., 2019)</w:t>
+      </w:r>
+      <w:r>
+        <w:rPr>
+          <w:rFonts w:ascii="Garamond" w:hAnsi="Garamond"/>
+        </w:rPr>
+        <w:fldChar w:fldCharType="end"/>
+      </w:r>
+      <w:r>
+        <w:rPr>
+          <w:rFonts w:ascii="Garamond" w:hAnsi="Garamond"/>
+        </w:rPr>
+        <w:t xml:space="preserve"> </w:t>
+      </w:r>
+      <w:r>
+        <w:rPr>
+          <w:rFonts w:ascii="Garamond" w:hAnsi="Garamond"/>
+        </w:rPr>
+        <w:t xml:space="preserve">and intrapopulation trait variability in maintaining healthy salmon watersheds are well established </w:t>
+      </w:r>
+      <w:r>
+        <w:rPr>
+          <w:rFonts w:ascii="Garamond" w:hAnsi="Garamond"/>
+        </w:rPr>
+        <w:fldChar w:fldCharType="begin"/>
+      </w:r>
+      <w:r>
+        <w:rPr>
+          <w:rFonts w:ascii="Garamond" w:hAnsi="Garamond"/>
+        </w:rPr>
+        <w:instrText xml:space="preserve"> ADDIN ZOTERO_ITEM CSL_CITATION {"citationID":"SfBuYKJ0","properties":{"formattedCitation":"(Connors et al., 2022; Moore et al., 2021; Schindler et al., 2010)","plainCitation":"(Connors et al., 2022; Moore et al., 2021; Schindler et al., 2010)","noteIndex":0},"citationItems":[{"id":4144,"uris":["http://zotero.org/users/8421274/items/M4DUIZ82"],"itemData":{"id":4144,"type":"article-journal","abstract":"Variation among populations in life history and intrinsic population characteristics (i.e., population diversity) helps maintain resilience to environmental change and dampen interannual variability in ecosystem services. As a result, ecological variation, and the processes that generate it, is considered central to strategies for managing risks to ecosystems in an increasingly variable and uncertain world. However, characterizing population diversity is difficult, particularly in large and remote regions, which often prevents its formal consideration in management advice. We combined genetic stock identification of archived scale and tissue samples with state-space run-reconstruction models to estimate migration timing and annual return abundance for eight geographically and genetically distinct Chinook salmon populations within the Canadian portion of the Yukon River. We found that among-population variation in migration timing and return abundances resulted in aggregate return migrations that were 2.1 times longer and 1.4 times more stable than if they had composed a single homogeneous population. We then fit state-space spawner–recruitment models to the annual return abundances to characterize among-population diversity in intrinsic productivity and population size and their consequences for the fisheries they support. Productivity and carrying capacity varied among populations by approximately 2.4-fold (2.9 to 6.9 recruits per spawner) and three-fold (8800 to 27,000 spawners), respectively. This diversity implies an equilibrium trade-off between harvesting of the population aggregate and the conservation of individual populations whereby the harvest rate predicted to maximize aggregate harvests comes at the cost of overfishing 40% of the populations but with a relatively low risk of extirpating the weakest ones. Our findings illustrate how population diversity in one of the largest salmon-producing river basins in the world contributes to fishery stability and food security in a region where salmon have high cultural and subsistence value. More generally, our work demonstrates the utility of molecular analyses of archived biological material for characterizing diversity in biological systems and its benefits and consequences for trade-offs in decision-making.","container-title":"Ecological Applications","DOI":"10.1002/eap.2709","ISSN":"1939-5582","issue":"8","language":"en","license":"© 2022 The Ecological Society of America.","note":"_eprint: https://onlinelibrary.wiley.com/doi/pdf/10.1002/eap.2709","page":"e2709","source":"Wiley Online Library","title":"Chinook salmon diversity contributes to fishery stability and trade-offs with mixed-stock harvest","volume":"32","author":[{"family":"Connors","given":"Brendan M."},{"family":"Siegle","given":"Matthew R."},{"family":"Harding","given":"Joel"},{"family":"Rossi","given":"Steven"},{"family":"Staton","given":"Benjamin A."},{"family":"Jones","given":"Michael L."},{"family":"Bradford","given":"Michael J."},{"family":"Brown","given":"Randy"},{"family":"Bechtol","given":"Bill"},{"family":"Doherty","given":"Beau"},{"family":"Cox","given":"Sean"},{"family":"Sutherland","given":"Ben J. G."}],"issued":{"date-parts":[["2022"]]}}},{"id":247,"uris":["http://zotero.org/users/8421274/items/V286BS7F"],"itemData":{"id":247,"type":"article-journal","abstract":"Fish biodiversity sustains the resilience and productivity of fisheries, yet this biodiversity can be threatened by overharvest and depletion in mixed-stock fisheries. Thus, the biodiversity that provides benefits may also make sustainable resource extraction more difficult, a key challenge in fisheries management. We simulated a mixed-stock fishery to explore relationships between different dimensions of biodiversity and fishery performance relative to conservation and fishery objectives. Different dimensions of biodiversity (number of stocks, evenness, asynchrony among stocks, heterogeneity in stock productivity) exacerbated trade-offs between fishery and conservation objectives. For example, fisheries targeting stock-complexes with greater asynchrony, and to a lesser extent richness, had greater stability in harvest through time but also greater risks of overfishing weak stocks and reduced yield compared to less biodiverse stock-complexes. These trade-offs were ameliorated by increasing management control—the capacity of fishery managers to harvest specific stocks. To explore these trade-offs in real-world fisheries, we contrasted the fishing and population status of individual stocks within three major mixed-stock sockeye salmon (Oncorhynchus nerka, Salmonidae) fisheries—Bristol Bay, Fraser River, and Skeena River. In general, the fisheries with lower management control had individual stocks that were more often being over- or under-fished, compared with those with higher management control, though variation among regions in biodiversity, scale of management, and magnitude of habitat alteration likely also contribute to these relationships. Collectively, our findings emphasize that there is a need to extract less or regulate better in order to conserve and benefit from biodiversity in fisheries and other natural resource management systems.","container-title":"Fish and Fisheries","DOI":"10.1111/faf.12567","ISSN":"1467-2979","issue":"5","language":"en","note":"_eprint: https://onlinelibrary.wiley.com/doi/pdf/10.1111/faf.12567","page":"1024-1040","source":"Wiley Online Library","title":"Conservation risks and portfolio effects in mixed-stock fisheries","volume":"22","author":[{"family":"Moore","given":"Jonathan W."},{"family":"Connors","given":"Brendan M."},{"family":"Hodgson","given":"Emma E."}],"issued":{"date-parts":[["2021"]]}}},{"id":272,"uris":["http://zotero.org/users/8421274/items/24NDGS7V"],"itemData":{"id":272,"type":"article-journal","abstract":"One of the most pervasive themes in ecology is that biological diversity stabilizes ecosystem processes and the services they provide to society, a concept that has become a common argument for biodiversity conservation. Species-rich communities are thought to produce more temporally stable ecosystem services because of the complementary or independent dynamics among species that perform similar ecosystem functions. Such variance dampening within communities is referred to as a portfolio effect and is analogous to the effects of asset diversity on the stability of financial portfolios. In ecology, these arguments have focused on the effects of species diversity on ecosystem stability but have not considered the importance of biologically relevant diversity within individual species. Current rates of population extirpation are probably at least three orders of magnitude higher than species extinction rates, so there is a pressing need to clarify how population and life history diversity affect the performance of individual species in providing important ecosystem services. Here we use five decades of data from Oncorhynchus nerka (sockeye salmon) in Bristol Bay, Alaska, to provide the first quantification of portfolio effects that derive from population and life history diversity in an important and heavily exploited species. Variability in annual Bristol Bay salmon returns is 2.2 times lower than it would be if the system consisted of a single homogenous population rather than the several hundred discrete populations it currently consists of. Furthermore, if it were a single homogeneous population, such increased variability would lead to ten times more frequent fisheries closures. Portfolio effects are also evident in watershed food webs, where they stabilize and extend predator access to salmon resources. Our results demonstrate the critical importance of maintaining population diversity for stabilizing ecosystem services and securing the economies and livelihoods that depend on them. The reliability of ecosystem services will erode faster than indicated by species loss alone. [PUBLICATION ABSTRACT]","container-title":"Nature","DOI":"https://doi-org.prox.lib.ncsu.edu/10.1038/nature09060","ISSN":"00280836","issue":"7298","language":"English","license":"Copyright Nature Publishing Group Jun 3, 2010","note":"number-of-pages: 5\npublisher-place: London, United States\npublisher: Nature Publishing Group\nsection: LETTERS","source":"ProQuest","title":"Population diversity and the portfolio effect in an exploited species","URL":"http://www.proquest.com/docview/375318240/abstract/317AC81E34EB4163PQ/1","volume":"465","author":[{"family":"Schindler","given":"Daniel E."},{"family":"Hilborn","given":"Ray"},{"family":"Chasco","given":"Brandon"},{"family":"Boatright","given":"Christopher P."},{"family":"Quinn","given":"Thomas P."},{"family":"Rogers","given":"Lauren A."},{"family":"Webster","given":"Michael S."}],"accessed":{"date-parts":[["2022",5,12]]},"issued":{"date-parts":[["2010",6,3]]}}}],"schema":"https://github.com/citation-style-language/schema/raw/master/csl-citation.json"} </w:instrText>
+      </w:r>
+      <w:r>
+        <w:rPr>
+          <w:rFonts w:ascii="Garamond" w:hAnsi="Garamond"/>
+        </w:rPr>
+        <w:fldChar w:fldCharType="separate"/>
+      </w:r>
+      <w:r>
+        <w:rPr>
+          <w:rFonts w:ascii="Garamond" w:hAnsi="Garamond"/>
+          <w:noProof/>
+        </w:rPr>
+        <w:t>(Connors et al., 2022; Moore et al., 2021; Schindler et al., 2010)</w:t>
+      </w:r>
+      <w:r>
+        <w:rPr>
+          <w:rFonts w:ascii="Garamond" w:hAnsi="Garamond"/>
+        </w:rPr>
+        <w:fldChar w:fldCharType="end"/>
+      </w:r>
+      <w:r>
+        <w:rPr>
+          <w:rFonts w:ascii="Garamond" w:hAnsi="Garamond"/>
+        </w:rPr>
+        <w:t xml:space="preserve">.     </w:t>
+      </w:r>
+    </w:p>
+    <w:p>
+      <w:pPr>
+        <w:pStyle w:val="font-claude-response-body"/>
+        <w:spacing w:line="360" w:lineRule="auto"/>
+        <w:ind w:firstLine="360"/>
+        <w:rPr>
+          <w:rFonts w:ascii="Garamond" w:hAnsi="Garamond"/>
+        </w:rPr>
+      </w:pPr>
+    </w:p>
+    <w:p>
+      <w:pPr>
+        <w:pStyle w:val="font-claude-response-body"/>
+        <w:spacing w:line="360" w:lineRule="auto"/>
+        <w:ind w:firstLine="360"/>
+        <w:rPr>
+          <w:rFonts w:ascii="Garamond" w:hAnsi="Garamond"/>
+        </w:rPr>
+      </w:pPr>
       <w:r>
         <w:rPr>
           <w:rFonts w:ascii="Garamond" w:hAnsi="Garamond"/>
@@ -785,7 +1412,6 @@
         <w:rPr>
           <w:rFonts w:ascii="Garamond" w:hAnsi="Garamond"/>
         </w:rPr>
-        <w:lastRenderedPageBreak/>
         <w:t xml:space="preserve">Chinook salmon otoliths were collected from the Yukon (2015, 2016, 2019–2021) and Kuskokwim (2017–2022) rivers over several years from the downstream terminus of both rivers. Yukon otoliths were collected from the Lower Yukon Test Fishery (LYTF) operated by the Alaska Department of Fish and Game near </w:t>
       </w:r>
       <w:proofErr w:type="spellStart"/>
@@ -946,7 +1572,14 @@
         <w:rPr>
           <w:rFonts w:ascii="Garamond" w:hAnsi="Garamond"/>
         </w:rPr>
-        <w:t xml:space="preserve">). Fin clip samples were taken from as many Yukon individuals as possible and genetic stock identification (GSI) assignments were estimated based on methods in Makhlouf et al., 2025 using X genetic baselines </w:t>
+        <w:t xml:space="preserve">). Fin clip samples were taken from as many Yukon individuals as possible and genetic stock identification (GSI) assignments were </w:t>
+      </w:r>
+      <w:r>
+        <w:rPr>
+          <w:rFonts w:ascii="Garamond" w:hAnsi="Garamond"/>
+        </w:rPr>
+        <w:lastRenderedPageBreak/>
+        <w:t xml:space="preserve">estimated based on methods in Makhlouf et al., 2025 using X genetic baselines </w:t>
       </w:r>
       <w:proofErr w:type="gramStart"/>
       <w:r>
@@ -1038,103 +1671,103 @@
         <w:rPr>
           <w:rFonts w:ascii="Garamond" w:hAnsi="Garamond"/>
         </w:rPr>
-        <w:t xml:space="preserve">”) have been developed for both the Kuskokwim and Yukon river basins using spatial stream network modeling (SSNM). This </w:t>
+        <w:t xml:space="preserve">”) have been developed for both the Kuskokwim and Yukon river basins using spatial stream network modeling (SSNM). This approach accounts for both Euclidean and flow-connected spatial autocorrelation, as well as the influence of multiple reach-scale covariates on strontium isotope ratios (French et al., X; Makhlouf et al., 2025). Both </w:t>
+      </w:r>
+      <w:proofErr w:type="spellStart"/>
+      <w:r>
+        <w:rPr>
+          <w:rFonts w:ascii="Garamond" w:hAnsi="Garamond"/>
+        </w:rPr>
+        <w:t>isoscapes</w:t>
+      </w:r>
+      <w:proofErr w:type="spellEnd"/>
+      <w:r>
+        <w:rPr>
+          <w:rFonts w:ascii="Garamond" w:hAnsi="Garamond"/>
+        </w:rPr>
+        <w:t xml:space="preserve"> include reach-specific estimates of model uncertainty. Because the Yukon </w:t>
+      </w:r>
+      <w:proofErr w:type="spellStart"/>
+      <w:r>
+        <w:rPr>
+          <w:rFonts w:ascii="Garamond" w:hAnsi="Garamond"/>
+        </w:rPr>
+        <w:t>isoscape</w:t>
+      </w:r>
+      <w:proofErr w:type="spellEnd"/>
+      <w:r>
+        <w:rPr>
+          <w:rFonts w:ascii="Garamond" w:hAnsi="Garamond"/>
+        </w:rPr>
+        <w:t xml:space="preserve"> encompasses a substantially larger spatial extent and has lower sampling density per river kilometer, associated prediction error is considerably higher than in the Kuskokwim (add error range). In both systems, however, reaches with exceptionally low prediction error—typically those closest to sampling locations—are relatively rare and tend to receive a disproportionate number of assignments.</w:t>
+      </w:r>
+      <w:r>
+        <w:rPr>
+          <w:rFonts w:ascii="Garamond" w:hAnsi="Garamond"/>
+        </w:rPr>
+        <w:t xml:space="preserve"> To avoid this, minimum error values for each </w:t>
+      </w:r>
+      <w:proofErr w:type="spellStart"/>
+      <w:r>
+        <w:rPr>
+          <w:rFonts w:ascii="Garamond" w:hAnsi="Garamond"/>
+        </w:rPr>
+        <w:t>isoscape</w:t>
+      </w:r>
+      <w:proofErr w:type="spellEnd"/>
+      <w:r>
+        <w:rPr>
+          <w:rFonts w:ascii="Garamond" w:hAnsi="Garamond"/>
+        </w:rPr>
+        <w:t xml:space="preserve"> were adjusted to .003 and .00003 for the Yukon and Kuskokwim </w:t>
+      </w:r>
+      <w:proofErr w:type="spellStart"/>
+      <w:r>
+        <w:rPr>
+          <w:rFonts w:ascii="Garamond" w:hAnsi="Garamond"/>
+        </w:rPr>
+        <w:t>isoscape</w:t>
+      </w:r>
+      <w:proofErr w:type="spellEnd"/>
+      <w:r>
+        <w:rPr>
+          <w:rFonts w:ascii="Garamond" w:hAnsi="Garamond"/>
+        </w:rPr>
+        <w:t xml:space="preserve">, respectively. All reaches with error values below this were assigned this value. </w:t>
+      </w:r>
+    </w:p>
+    <w:p>
+      <w:pPr>
+        <w:pStyle w:val="font-claude-response-body"/>
+        <w:spacing w:line="360" w:lineRule="auto"/>
+        <w:rPr>
+          <w:rFonts w:ascii="Garamond" w:hAnsi="Garamond"/>
+        </w:rPr>
+      </w:pPr>
+      <w:r>
+        <w:rPr>
+          <w:rFonts w:ascii="Garamond" w:hAnsi="Garamond"/>
+        </w:rPr>
+        <w:tab/>
+      </w:r>
+      <w:r>
+        <w:rPr>
+          <w:rFonts w:ascii="Garamond" w:hAnsi="Garamond"/>
+        </w:rPr>
+        <w:t xml:space="preserve">From the extracted natal-origin values, the likelihood of provenance was estimated for all reaches within each basin using a probabilistic Bayesian framework (Makhlouf et al., 2025). For Yukon samples, a genetic prior was incorporated based on posterior probabilities from genetic stock identification assignments (Makhlouf et al., 2025). In addition, three spatial priors were applied to reduce assignment to reaches with low likelihood of occupancy by spawning adult Chinook salmon. </w:t>
+      </w:r>
+      <w:r>
+        <w:rPr>
+          <w:rFonts w:ascii="Garamond" w:hAnsi="Garamond"/>
+        </w:rPr>
+        <w:t xml:space="preserve">Specifically, assignments were constrained to streams of order X or greater, and a habitat prior assigned zero probability to reaches with average channel gradients &gt; X. Together, these constraints reflect the preference of Chinook salmon for spawning in larger tributaries and the observed unsuitability of both extremely low-gradient and steep reaches. Finally, a “presence prior” was derived from USGS intrinsic potential mapping, which identifies reaches where spawning Chinook salmon have been observed based on multiple data sources [ref]. This prior was applied to mainstem </w:t>
       </w:r>
       <w:r>
         <w:rPr>
           <w:rFonts w:ascii="Garamond" w:hAnsi="Garamond"/>
         </w:rPr>
         <w:lastRenderedPageBreak/>
-        <w:t xml:space="preserve">approach accounts for both Euclidean and flow-connected spatial autocorrelation, as well as the influence of multiple reach-scale covariates on strontium isotope ratios (French et al., X; Makhlouf et al., 2025). Both </w:t>
-      </w:r>
-      <w:proofErr w:type="spellStart"/>
-      <w:r>
-        <w:rPr>
-          <w:rFonts w:ascii="Garamond" w:hAnsi="Garamond"/>
-        </w:rPr>
-        <w:t>isoscapes</w:t>
-      </w:r>
-      <w:proofErr w:type="spellEnd"/>
-      <w:r>
-        <w:rPr>
-          <w:rFonts w:ascii="Garamond" w:hAnsi="Garamond"/>
-        </w:rPr>
-        <w:t xml:space="preserve"> include reach-specific estimates of model uncertainty. Because the Yukon </w:t>
-      </w:r>
-      <w:proofErr w:type="spellStart"/>
-      <w:r>
-        <w:rPr>
-          <w:rFonts w:ascii="Garamond" w:hAnsi="Garamond"/>
-        </w:rPr>
-        <w:t>isoscape</w:t>
-      </w:r>
-      <w:proofErr w:type="spellEnd"/>
-      <w:r>
-        <w:rPr>
-          <w:rFonts w:ascii="Garamond" w:hAnsi="Garamond"/>
-        </w:rPr>
-        <w:t xml:space="preserve"> encompasses a substantially larger spatial extent and has lower sampling density per river kilometer, associated prediction error is considerably higher than in the Kuskokwim (add error range). In both systems, however, reaches with exceptionally low prediction error—typically those closest to sampling locations—are relatively rare and tend to receive a disproportionate number of assignments.</w:t>
-      </w:r>
-      <w:r>
-        <w:rPr>
-          <w:rFonts w:ascii="Garamond" w:hAnsi="Garamond"/>
-        </w:rPr>
-        <w:t xml:space="preserve"> To avoid this, minimum error values for each </w:t>
-      </w:r>
-      <w:proofErr w:type="spellStart"/>
-      <w:r>
-        <w:rPr>
-          <w:rFonts w:ascii="Garamond" w:hAnsi="Garamond"/>
-        </w:rPr>
-        <w:t>isoscape</w:t>
-      </w:r>
-      <w:proofErr w:type="spellEnd"/>
-      <w:r>
-        <w:rPr>
-          <w:rFonts w:ascii="Garamond" w:hAnsi="Garamond"/>
-        </w:rPr>
-        <w:t xml:space="preserve"> were adjusted to .003 and .00003 for the Yukon and Kuskokwim </w:t>
-      </w:r>
-      <w:proofErr w:type="spellStart"/>
-      <w:r>
-        <w:rPr>
-          <w:rFonts w:ascii="Garamond" w:hAnsi="Garamond"/>
-        </w:rPr>
-        <w:t>isoscape</w:t>
-      </w:r>
-      <w:proofErr w:type="spellEnd"/>
-      <w:r>
-        <w:rPr>
-          <w:rFonts w:ascii="Garamond" w:hAnsi="Garamond"/>
-        </w:rPr>
-        <w:t xml:space="preserve">, respectively. All reaches with error values below this were assigned this value. </w:t>
-      </w:r>
-    </w:p>
-    <w:p>
-      <w:pPr>
-        <w:pStyle w:val="font-claude-response-body"/>
-        <w:spacing w:line="360" w:lineRule="auto"/>
-        <w:rPr>
-          <w:rFonts w:ascii="Garamond" w:hAnsi="Garamond"/>
-        </w:rPr>
-      </w:pPr>
-      <w:r>
-        <w:rPr>
-          <w:rFonts w:ascii="Garamond" w:hAnsi="Garamond"/>
-        </w:rPr>
-        <w:tab/>
-      </w:r>
-      <w:r>
-        <w:rPr>
-          <w:rFonts w:ascii="Garamond" w:hAnsi="Garamond"/>
-        </w:rPr>
-        <w:t xml:space="preserve">From the extracted natal-origin values, the likelihood of provenance was estimated for all reaches within each basin using a probabilistic Bayesian framework (Makhlouf et al., 2025). For Yukon samples, a genetic prior was incorporated based on posterior probabilities from genetic stock identification assignments (Makhlouf et al., 2025). In addition, three spatial priors were applied to reduce assignment to reaches with low likelihood of occupancy by spawning adult Chinook salmon. </w:t>
-      </w:r>
-      <w:r>
-        <w:rPr>
-          <w:rFonts w:ascii="Garamond" w:hAnsi="Garamond"/>
-        </w:rPr>
-        <w:t>Specifically, assignments were constrained to streams of order X or greater, and a habitat prior assigned zero probability to reaches with average channel gradients &gt; X. Together, these constraints reflect the preference of Chinook salmon for spawning in larger tributaries and the observed unsuitability of both extremely low-gradient and steep reaches. Finally, a “presence prior” was derived from USGS intrinsic potential mapping, which identifies reaches where spawning Chinook salmon have been observed based on multiple data sources [ref]. This prior was applied to mainstem tributaries in both river basins, assigning zero probability to reaches with no documented evidence of spawning Chinook salmon. We restricted application of this prior to mainstem reaches to avoid unduly limiting assignments in more remote tributaries where the absence of observations likely reflects limited sampling effort rather than true absence, while still incorporating available presence information into the assignment framework.</w:t>
+        <w:t>tributaries in both river basins, assigning zero probability to reaches with no documented evidence of spawning Chinook salmon. We restricted application of this prior to mainstem reaches to avoid unduly limiting assignments in more remote tributaries where the absence of observations likely reflects limited sampling effort rather than true absence, while still incorporating available presence information into the assignment framework.</w:t>
       </w:r>
       <w:r>
         <w:rPr>
@@ -1188,7 +1821,6 @@
           <w:b/>
           <w:bCs/>
         </w:rPr>
-        <w:lastRenderedPageBreak/>
         <w:t xml:space="preserve">Population scale provenance Estimates </w:t>
       </w:r>
     </w:p>
@@ -1376,7 +2008,6 @@
         <w:rPr>
           <w:rFonts w:ascii="Garamond" w:hAnsi="Garamond"/>
         </w:rPr>
-        <w:lastRenderedPageBreak/>
         <w:t xml:space="preserve">Spatial production pattern Analysis </w:t>
       </w:r>
     </w:p>

</xml_diff>

<commit_message>
started a script for the heatmaps
</commit_message>
<xml_diff>
--- a/Docs/Working_SMH2.docx
+++ b/Docs/Working_SMH2.docx
@@ -142,7 +142,19 @@
         <w:rPr>
           <w:rFonts w:ascii="Garamond" w:hAnsi="Garamond"/>
         </w:rPr>
-        <w:t xml:space="preserve"> However, as the effects of human resource use and climate change intensify, healthy and fully functioning ecosystems are becoming increasingly rare as their global extent continues to decline</w:t>
+        <w:t xml:space="preserve"> However, as the effects of human resource use and climate change intensify, healthy and fully functioning</w:t>
+      </w:r>
+      <w:r>
+        <w:rPr>
+          <w:rFonts w:ascii="Garamond" w:hAnsi="Garamond"/>
+        </w:rPr>
+        <w:t xml:space="preserve"> aquatic</w:t>
+      </w:r>
+      <w:r>
+        <w:rPr>
+          <w:rFonts w:ascii="Garamond" w:hAnsi="Garamond"/>
+        </w:rPr>
+        <w:t xml:space="preserve"> ecosystems are becoming increasingly rare as their global extent continues to decline</w:t>
       </w:r>
       <w:r>
         <w:rPr>
@@ -450,19 +462,19 @@
         <w:rPr>
           <w:rFonts w:ascii="Garamond" w:hAnsi="Garamond"/>
         </w:rPr>
-        <w:t xml:space="preserve">population declines </w:t>
-      </w:r>
-      <w:r>
-        <w:rPr>
-          <w:rFonts w:ascii="Garamond" w:hAnsi="Garamond"/>
-        </w:rPr>
-        <w:t xml:space="preserve">have led to </w:t>
-      </w:r>
-      <w:r>
-        <w:rPr>
-          <w:rFonts w:ascii="Garamond" w:hAnsi="Garamond"/>
-        </w:rPr>
-        <w:t xml:space="preserve">widespread efforts to restore </w:t>
+        <w:t xml:space="preserve">widespread efforts </w:t>
+      </w:r>
+      <w:r>
+        <w:rPr>
+          <w:rFonts w:ascii="Garamond" w:hAnsi="Garamond"/>
+        </w:rPr>
+        <w:t xml:space="preserve">have been undertaken </w:t>
+      </w:r>
+      <w:r>
+        <w:rPr>
+          <w:rFonts w:ascii="Garamond" w:hAnsi="Garamond"/>
+        </w:rPr>
+        <w:t xml:space="preserve">to restore </w:t>
       </w:r>
       <w:r>
         <w:rPr>
@@ -599,19 +611,19 @@
         <w:rPr>
           <w:rFonts w:ascii="Garamond" w:hAnsi="Garamond"/>
         </w:rPr>
-        <w:t xml:space="preserve"> fewer</w:t>
-      </w:r>
-      <w:r>
-        <w:rPr>
-          <w:rFonts w:ascii="Garamond" w:hAnsi="Garamond"/>
-        </w:rPr>
         <w:t xml:space="preserve"> </w:t>
       </w:r>
       <w:r>
         <w:rPr>
           <w:rFonts w:ascii="Garamond" w:hAnsi="Garamond"/>
         </w:rPr>
-        <w:t xml:space="preserve">negative impacts to salmon ecosystems </w:t>
+        <w:t xml:space="preserve">less anthropogenic </w:t>
+      </w:r>
+      <w:r>
+        <w:rPr>
+          <w:rFonts w:ascii="Garamond" w:hAnsi="Garamond"/>
+        </w:rPr>
+        <w:t xml:space="preserve">impacts to salmon ecosystems </w:t>
       </w:r>
       <w:r>
         <w:rPr>
@@ -629,7 +641,13 @@
         <w:rPr>
           <w:rFonts w:ascii="Garamond" w:hAnsi="Garamond"/>
         </w:rPr>
-        <w:t>in the U.S. Pacific Northwest, California, and southern British Columbia</w:t>
+        <w:t>in the Pacific Northwest</w:t>
+      </w:r>
+      <w:r>
+        <w:rPr>
+          <w:rFonts w:ascii="Garamond" w:hAnsi="Garamond"/>
+        </w:rPr>
+        <w:t xml:space="preserve"> and California</w:t>
       </w:r>
       <w:r>
         <w:rPr>
@@ -871,74 +889,234 @@
         <w:rPr>
           <w:rFonts w:ascii="Garamond" w:hAnsi="Garamond"/>
         </w:rPr>
+        <w:t>These systems therefore offer a</w:t>
+      </w:r>
+      <w:r>
+        <w:rPr>
+          <w:rFonts w:ascii="Garamond" w:hAnsi="Garamond"/>
+        </w:rPr>
+        <w:t xml:space="preserve">n </w:t>
+      </w:r>
+      <w:r>
+        <w:rPr>
+          <w:rFonts w:ascii="Garamond" w:hAnsi="Garamond"/>
+        </w:rPr>
+        <w:t xml:space="preserve">opportunity to </w:t>
+      </w:r>
+      <w:r>
+        <w:rPr>
+          <w:rFonts w:ascii="Garamond" w:hAnsi="Garamond"/>
+        </w:rPr>
+        <w:t xml:space="preserve">explore the ecological processes which </w:t>
+      </w:r>
+      <w:r>
+        <w:rPr>
+          <w:rFonts w:ascii="Garamond" w:hAnsi="Garamond"/>
+        </w:rPr>
+        <w:lastRenderedPageBreak/>
+        <w:t xml:space="preserve">govern </w:t>
+      </w:r>
+      <w:r>
+        <w:rPr>
+          <w:rFonts w:ascii="Garamond" w:hAnsi="Garamond"/>
+        </w:rPr>
+        <w:t>wil</w:t>
+      </w:r>
+      <w:r>
+        <w:rPr>
+          <w:rFonts w:ascii="Garamond" w:hAnsi="Garamond"/>
+        </w:rPr>
+        <w:t>d salmon populations</w:t>
+      </w:r>
+      <w:r>
+        <w:rPr>
+          <w:rFonts w:ascii="Garamond" w:hAnsi="Garamond"/>
+        </w:rPr>
+        <w:t xml:space="preserve">, </w:t>
+      </w:r>
+      <w:r>
+        <w:rPr>
+          <w:rFonts w:ascii="Garamond" w:hAnsi="Garamond"/>
+        </w:rPr>
+        <w:t xml:space="preserve">which may </w:t>
+      </w:r>
+      <w:r>
+        <w:rPr>
+          <w:rFonts w:ascii="Garamond" w:hAnsi="Garamond"/>
+        </w:rPr>
+        <w:t>provide</w:t>
+      </w:r>
+      <w:r>
+        <w:rPr>
+          <w:rFonts w:ascii="Garamond" w:hAnsi="Garamond"/>
+        </w:rPr>
+        <w:t xml:space="preserve"> a baseline for restoring impacted watersheds</w:t>
+      </w:r>
+      <w:r>
+        <w:rPr>
+          <w:rFonts w:ascii="Garamond" w:hAnsi="Garamond"/>
+        </w:rPr>
+        <w:t xml:space="preserve"> elsewhere. </w:t>
+      </w:r>
+    </w:p>
+    <w:p>
+      <w:pPr>
+        <w:pStyle w:val="font-claude-response-body"/>
+        <w:spacing w:line="360" w:lineRule="auto"/>
+        <w:ind w:firstLine="360"/>
+        <w:rPr>
+          <w:rFonts w:ascii="Garamond" w:hAnsi="Garamond"/>
+        </w:rPr>
+      </w:pPr>
+      <w:r>
+        <w:rPr>
+          <w:rFonts w:ascii="Garamond" w:hAnsi="Garamond"/>
+        </w:rPr>
+        <w:t xml:space="preserve">In recent years, </w:t>
+      </w:r>
+      <w:r>
+        <w:rPr>
+          <w:rFonts w:ascii="Garamond" w:hAnsi="Garamond"/>
+        </w:rPr>
+        <w:t xml:space="preserve">the role of </w:t>
+      </w:r>
+      <w:r>
+        <w:rPr>
+          <w:rFonts w:ascii="Garamond" w:hAnsi="Garamond"/>
+        </w:rPr>
+        <w:t xml:space="preserve">landscape heterogeneity and </w:t>
+      </w:r>
+      <w:r>
+        <w:rPr>
+          <w:rFonts w:ascii="Garamond" w:hAnsi="Garamond"/>
+        </w:rPr>
+        <w:t xml:space="preserve">hydrological </w:t>
+      </w:r>
+      <w:r>
+        <w:rPr>
+          <w:rFonts w:ascii="Garamond" w:hAnsi="Garamond"/>
+        </w:rPr>
+        <w:t xml:space="preserve">connectivity have emerged as key factors underlying the </w:t>
+      </w:r>
+      <w:proofErr w:type="gramStart"/>
+      <w:r>
+        <w:rPr>
+          <w:rFonts w:ascii="Garamond" w:hAnsi="Garamond"/>
+        </w:rPr>
+        <w:t>long term</w:t>
+      </w:r>
+      <w:proofErr w:type="gramEnd"/>
+      <w:r>
+        <w:rPr>
+          <w:rFonts w:ascii="Garamond" w:hAnsi="Garamond"/>
+        </w:rPr>
         <w:t xml:space="preserve"> </w:t>
       </w:r>
       <w:r>
         <w:rPr>
           <w:rFonts w:ascii="Garamond" w:hAnsi="Garamond"/>
         </w:rPr>
-        <w:t>These systems therefore offer a</w:t>
-      </w:r>
-      <w:r>
-        <w:rPr>
-          <w:rFonts w:ascii="Garamond" w:hAnsi="Garamond"/>
-        </w:rPr>
-        <w:t xml:space="preserve">n </w:t>
-      </w:r>
-      <w:r>
-        <w:rPr>
-          <w:rFonts w:ascii="Garamond" w:hAnsi="Garamond"/>
-        </w:rPr>
-        <w:t xml:space="preserve">opportunity to </w:t>
-      </w:r>
-      <w:r>
-        <w:rPr>
-          <w:rFonts w:ascii="Garamond" w:hAnsi="Garamond"/>
-        </w:rPr>
-        <w:t xml:space="preserve">explore the </w:t>
-      </w:r>
-      <w:r>
-        <w:rPr>
-          <w:rFonts w:ascii="Garamond" w:hAnsi="Garamond"/>
-        </w:rPr>
-        <w:lastRenderedPageBreak/>
-        <w:t xml:space="preserve">ecological processes which govern </w:t>
-      </w:r>
-      <w:r>
-        <w:rPr>
-          <w:rFonts w:ascii="Garamond" w:hAnsi="Garamond"/>
-        </w:rPr>
-        <w:t>wild populations of salmon</w:t>
-      </w:r>
-      <w:r>
-        <w:rPr>
-          <w:rFonts w:ascii="Garamond" w:hAnsi="Garamond"/>
-        </w:rPr>
-        <w:t xml:space="preserve">, </w:t>
-      </w:r>
-      <w:r>
-        <w:rPr>
-          <w:rFonts w:ascii="Garamond" w:hAnsi="Garamond"/>
-        </w:rPr>
-        <w:t xml:space="preserve">which may </w:t>
-      </w:r>
-      <w:r>
-        <w:rPr>
-          <w:rFonts w:ascii="Garamond" w:hAnsi="Garamond"/>
-        </w:rPr>
-        <w:t>provide</w:t>
-      </w:r>
-      <w:r>
-        <w:rPr>
-          <w:rFonts w:ascii="Garamond" w:hAnsi="Garamond"/>
-        </w:rPr>
-        <w:t xml:space="preserve"> a baseline for restoring impacted watersheds</w:t>
-      </w:r>
-      <w:r>
-        <w:rPr>
-          <w:rFonts w:ascii="Garamond" w:hAnsi="Garamond"/>
-        </w:rPr>
-        <w:t xml:space="preserve"> elsewhere. </w:t>
+        <w:t xml:space="preserve">stability of salmon </w:t>
+      </w:r>
+      <w:r>
+        <w:rPr>
+          <w:rFonts w:ascii="Garamond" w:hAnsi="Garamond"/>
+        </w:rPr>
+        <w:t xml:space="preserve">in freshwater ecosystems. In </w:t>
+      </w:r>
+      <w:proofErr w:type="spellStart"/>
+      <w:r>
+        <w:rPr>
+          <w:rFonts w:ascii="Garamond" w:hAnsi="Garamond"/>
+        </w:rPr>
+        <w:t>well functioning</w:t>
+      </w:r>
+      <w:proofErr w:type="spellEnd"/>
+      <w:r>
+        <w:rPr>
+          <w:rFonts w:ascii="Garamond" w:hAnsi="Garamond"/>
+        </w:rPr>
+        <w:t xml:space="preserve"> systems processed which generate landscape </w:t>
+      </w:r>
+      <w:r>
+        <w:rPr>
+          <w:rFonts w:ascii="Garamond" w:hAnsi="Garamond"/>
+        </w:rPr>
+        <w:t>heterogeneity (</w:t>
+      </w:r>
+      <w:r>
+        <w:rPr>
+          <w:rFonts w:ascii="Garamond" w:hAnsi="Garamond"/>
+        </w:rPr>
+        <w:t xml:space="preserve">e.g. </w:t>
+      </w:r>
+      <w:r>
+        <w:rPr>
+          <w:rFonts w:ascii="Garamond" w:hAnsi="Garamond"/>
+        </w:rPr>
+        <w:t>G</w:t>
+      </w:r>
+      <w:r>
+        <w:rPr>
+          <w:rFonts w:ascii="Garamond" w:hAnsi="Garamond"/>
+        </w:rPr>
+        <w:t>eomorphological and successional processes</w:t>
+      </w:r>
+      <w:r>
+        <w:rPr>
+          <w:rFonts w:ascii="Garamond" w:hAnsi="Garamond"/>
+        </w:rPr>
+        <w:t>)</w:t>
+      </w:r>
+      <w:r>
+        <w:rPr>
+          <w:rFonts w:ascii="Garamond" w:hAnsi="Garamond"/>
+        </w:rPr>
+        <w:t xml:space="preserve"> </w:t>
+      </w:r>
+      <w:r>
+        <w:rPr>
+          <w:rFonts w:ascii="Garamond" w:hAnsi="Garamond"/>
+        </w:rPr>
+        <w:t xml:space="preserve">operate at several spatial and temporal scales to </w:t>
+      </w:r>
+      <w:r>
+        <w:rPr>
+          <w:rFonts w:ascii="Garamond" w:hAnsi="Garamond"/>
+        </w:rPr>
+        <w:t xml:space="preserve">generate </w:t>
+      </w:r>
+      <w:r>
+        <w:rPr>
+          <w:rFonts w:ascii="Garamond" w:hAnsi="Garamond"/>
+        </w:rPr>
+        <w:t xml:space="preserve">a </w:t>
+      </w:r>
+      <w:proofErr w:type="gramStart"/>
+      <w:r>
+        <w:rPr>
+          <w:rFonts w:ascii="Garamond" w:hAnsi="Garamond"/>
+        </w:rPr>
+        <w:t xml:space="preserve">variable </w:t>
+      </w:r>
+      <w:r>
+        <w:rPr>
+          <w:rFonts w:ascii="Garamond" w:hAnsi="Garamond"/>
+        </w:rPr>
+        <w:t>biophysical conditions</w:t>
+      </w:r>
+      <w:proofErr w:type="gramEnd"/>
+      <w:r>
+        <w:rPr>
+          <w:rFonts w:ascii="Garamond" w:hAnsi="Garamond"/>
+        </w:rPr>
+        <w:t xml:space="preserve"> (e.g., variation in hydrology, temperature, and depth) across multiple spatial scales</w:t>
+      </w:r>
+      <w:r>
+        <w:rPr>
+          <w:rFonts w:ascii="Garamond" w:hAnsi="Garamond"/>
+        </w:rPr>
+        <w:t xml:space="preserve">. </w:t>
       </w:r>
     </w:p>
     <w:p>
@@ -950,42 +1128,60 @@
           <w:rFonts w:ascii="Garamond" w:hAnsi="Garamond"/>
         </w:rPr>
       </w:pPr>
-      <w:r>
-        <w:rPr>
-          <w:rFonts w:ascii="Garamond" w:hAnsi="Garamond"/>
-        </w:rPr>
-        <w:t xml:space="preserve">The roles of both habitat heterogeneity </w:t>
-      </w:r>
-      <w:r>
-        <w:rPr>
-          <w:rFonts w:ascii="Garamond" w:hAnsi="Garamond"/>
-        </w:rPr>
-        <w:fldChar w:fldCharType="begin"/>
-      </w:r>
-      <w:r>
-        <w:rPr>
-          <w:rFonts w:ascii="Garamond" w:hAnsi="Garamond"/>
-        </w:rPr>
-        <w:instrText xml:space="preserve"> ADDIN ZOTERO_ITEM CSL_CITATION {"citationID":"KD5YUNyC","properties":{"formattedCitation":"(Brennan et al., 2019)","plainCitation":"(Brennan et al., 2019)","noteIndex":0},"citationItems":[{"id":3844,"uris":["http://zotero.org/users/8421274/items/RXD5IA9D"],"itemData":{"id":3844,"type":"article-journal","abstract":"Watersheds are complex mosaics of habitats whose conditions vary across space and time as landscape features filter overriding climate forcing, yet the extent to which the reliability of ecosystem services depends on these dynamics remains unknown. We quantified how shifting habitat mosaics are expressed across a range of spatial scales within a large, free-flowing river, and how they stabilize the production of Pacific salmon that support valuable fisheries. The strontium isotope records of ear stones (otoliths) show that the relative productivity of locations across the river network, as both natal- and juvenile-rearing habitat, varies widely among years and that this variability is expressed across a broad range of spatial scales, ultimately stabilizing the interannual production of fish at the scale of the entire basin.","container-title":"Science","DOI":"10.1126/science.aav4313","issue":"6442","note":"publisher: American Association for the Advancement of Science","page":"783-786","source":"science.org (Atypon)","title":"Shifting habitat mosaics and fish production across river basins","volume":"364","author":[{"family":"Brennan","given":"Sean R."},{"family":"Schindler","given":"Daniel E."},{"family":"Cline","given":"Timothy J."},{"family":"Walsworth","given":"Timothy E."},{"family":"Buck","given":"Greg"},{"family":"Fernandez","given":"Diego P."}],"issued":{"date-parts":[["2019"]]}}}],"schema":"https://github.com/citation-style-language/schema/raw/master/csl-citation.json"} </w:instrText>
-      </w:r>
-      <w:r>
-        <w:rPr>
-          <w:rFonts w:ascii="Garamond" w:hAnsi="Garamond"/>
-        </w:rPr>
-        <w:fldChar w:fldCharType="separate"/>
-      </w:r>
-      <w:r>
-        <w:rPr>
-          <w:rFonts w:ascii="Garamond" w:hAnsi="Garamond"/>
-          <w:noProof/>
-        </w:rPr>
-        <w:t>(Brennan et al., 2019)</w:t>
-      </w:r>
-      <w:r>
-        <w:rPr>
-          <w:rFonts w:ascii="Garamond" w:hAnsi="Garamond"/>
-        </w:rPr>
-        <w:fldChar w:fldCharType="end"/>
+    </w:p>
+    <w:p>
+      <w:pPr>
+        <w:pStyle w:val="font-claude-response-body"/>
+        <w:spacing w:line="360" w:lineRule="auto"/>
+        <w:ind w:firstLine="360"/>
+      </w:pPr>
+      <w:r>
+        <w:rPr>
+          <w:rFonts w:ascii="Garamond" w:hAnsi="Garamond"/>
+        </w:rPr>
+        <w:t xml:space="preserve">These local conditions differentially filter the prevailing local environmental conditions </w:t>
+      </w:r>
+      <w:r>
+        <w:rPr>
+          <w:rFonts w:ascii="Garamond" w:hAnsi="Garamond"/>
+        </w:rPr>
+        <w:t>(e.g., precipitation, temperature)</w:t>
+      </w:r>
+      <w:r>
+        <w:rPr>
+          <w:rFonts w:ascii="Garamond" w:hAnsi="Garamond"/>
+        </w:rPr>
+        <w:t xml:space="preserve"> to </w:t>
+      </w:r>
+      <w:r>
+        <w:rPr>
+          <w:rFonts w:ascii="Garamond" w:hAnsi="Garamond"/>
+        </w:rPr>
+        <w:t>produc</w:t>
+      </w:r>
+      <w:r>
+        <w:rPr>
+          <w:rFonts w:ascii="Garamond" w:hAnsi="Garamond"/>
+        </w:rPr>
+        <w:t>e</w:t>
+      </w:r>
+      <w:r>
+        <w:rPr>
+          <w:rFonts w:ascii="Garamond" w:hAnsi="Garamond"/>
+        </w:rPr>
+        <w:t xml:space="preserve"> a </w:t>
+      </w:r>
+      <w:r>
+        <w:rPr>
+          <w:rFonts w:ascii="Garamond" w:hAnsi="Garamond"/>
+        </w:rPr>
+        <w:t xml:space="preserve">continuum </w:t>
+      </w:r>
+      <w:r>
+        <w:rPr>
+          <w:rFonts w:ascii="Garamond" w:hAnsi="Garamond"/>
+        </w:rPr>
+        <w:t>of habitat types</w:t>
       </w:r>
       <w:r>
         <w:rPr>
@@ -997,44 +1193,13 @@
         <w:rPr>
           <w:rFonts w:ascii="Garamond" w:hAnsi="Garamond"/>
         </w:rPr>
-        <w:t xml:space="preserve">and intrapopulation trait variability in maintaining healthy salmon watersheds are well established </w:t>
-      </w:r>
-      <w:r>
-        <w:rPr>
-          <w:rFonts w:ascii="Garamond" w:hAnsi="Garamond"/>
-        </w:rPr>
-        <w:fldChar w:fldCharType="begin"/>
-      </w:r>
-      <w:r>
-        <w:rPr>
-          <w:rFonts w:ascii="Garamond" w:hAnsi="Garamond"/>
-        </w:rPr>
-        <w:instrText xml:space="preserve"> ADDIN ZOTERO_ITEM CSL_CITATION {"citationID":"SfBuYKJ0","properties":{"formattedCitation":"(Connors et al., 2022; Moore et al., 2021; Schindler et al., 2010)","plainCitation":"(Connors et al., 2022; Moore et al., 2021; Schindler et al., 2010)","noteIndex":0},"citationItems":[{"id":4144,"uris":["http://zotero.org/users/8421274/items/M4DUIZ82"],"itemData":{"id":4144,"type":"article-journal","abstract":"Variation among populations in life history and intrinsic population characteristics (i.e., population diversity) helps maintain resilience to environmental change and dampen interannual variability in ecosystem services. As a result, ecological variation, and the processes that generate it, is considered central to strategies for managing risks to ecosystems in an increasingly variable and uncertain world. However, characterizing population diversity is difficult, particularly in large and remote regions, which often prevents its formal consideration in management advice. We combined genetic stock identification of archived scale and tissue samples with state-space run-reconstruction models to estimate migration timing and annual return abundance for eight geographically and genetically distinct Chinook salmon populations within the Canadian portion of the Yukon River. We found that among-population variation in migration timing and return abundances resulted in aggregate return migrations that were 2.1 times longer and 1.4 times more stable than if they had composed a single homogeneous population. We then fit state-space spawner–recruitment models to the annual return abundances to characterize among-population diversity in intrinsic productivity and population size and their consequences for the fisheries they support. Productivity and carrying capacity varied among populations by approximately 2.4-fold (2.9 to 6.9 recruits per spawner) and three-fold (8800 to 27,000 spawners), respectively. This diversity implies an equilibrium trade-off between harvesting of the population aggregate and the conservation of individual populations whereby the harvest rate predicted to maximize aggregate harvests comes at the cost of overfishing 40% of the populations but with a relatively low risk of extirpating the weakest ones. Our findings illustrate how population diversity in one of the largest salmon-producing river basins in the world contributes to fishery stability and food security in a region where salmon have high cultural and subsistence value. More generally, our work demonstrates the utility of molecular analyses of archived biological material for characterizing diversity in biological systems and its benefits and consequences for trade-offs in decision-making.","container-title":"Ecological Applications","DOI":"10.1002/eap.2709","ISSN":"1939-5582","issue":"8","language":"en","license":"© 2022 The Ecological Society of America.","note":"_eprint: https://onlinelibrary.wiley.com/doi/pdf/10.1002/eap.2709","page":"e2709","source":"Wiley Online Library","title":"Chinook salmon diversity contributes to fishery stability and trade-offs with mixed-stock harvest","volume":"32","author":[{"family":"Connors","given":"Brendan M."},{"family":"Siegle","given":"Matthew R."},{"family":"Harding","given":"Joel"},{"family":"Rossi","given":"Steven"},{"family":"Staton","given":"Benjamin A."},{"family":"Jones","given":"Michael L."},{"family":"Bradford","given":"Michael J."},{"family":"Brown","given":"Randy"},{"family":"Bechtol","given":"Bill"},{"family":"Doherty","given":"Beau"},{"family":"Cox","given":"Sean"},{"family":"Sutherland","given":"Ben J. G."}],"issued":{"date-parts":[["2022"]]}}},{"id":247,"uris":["http://zotero.org/users/8421274/items/V286BS7F"],"itemData":{"id":247,"type":"article-journal","abstract":"Fish biodiversity sustains the resilience and productivity of fisheries, yet this biodiversity can be threatened by overharvest and depletion in mixed-stock fisheries. Thus, the biodiversity that provides benefits may also make sustainable resource extraction more difficult, a key challenge in fisheries management. We simulated a mixed-stock fishery to explore relationships between different dimensions of biodiversity and fishery performance relative to conservation and fishery objectives. Different dimensions of biodiversity (number of stocks, evenness, asynchrony among stocks, heterogeneity in stock productivity) exacerbated trade-offs between fishery and conservation objectives. For example, fisheries targeting stock-complexes with greater asynchrony, and to a lesser extent richness, had greater stability in harvest through time but also greater risks of overfishing weak stocks and reduced yield compared to less biodiverse stock-complexes. These trade-offs were ameliorated by increasing management control—the capacity of fishery managers to harvest specific stocks. To explore these trade-offs in real-world fisheries, we contrasted the fishing and population status of individual stocks within three major mixed-stock sockeye salmon (Oncorhynchus nerka, Salmonidae) fisheries—Bristol Bay, Fraser River, and Skeena River. In general, the fisheries with lower management control had individual stocks that were more often being over- or under-fished, compared with those with higher management control, though variation among regions in biodiversity, scale of management, and magnitude of habitat alteration likely also contribute to these relationships. Collectively, our findings emphasize that there is a need to extract less or regulate better in order to conserve and benefit from biodiversity in fisheries and other natural resource management systems.","container-title":"Fish and Fisheries","DOI":"10.1111/faf.12567","ISSN":"1467-2979","issue":"5","language":"en","note":"_eprint: https://onlinelibrary.wiley.com/doi/pdf/10.1111/faf.12567","page":"1024-1040","source":"Wiley Online Library","title":"Conservation risks and portfolio effects in mixed-stock fisheries","volume":"22","author":[{"family":"Moore","given":"Jonathan W."},{"family":"Connors","given":"Brendan M."},{"family":"Hodgson","given":"Emma E."}],"issued":{"date-parts":[["2021"]]}}},{"id":272,"uris":["http://zotero.org/users/8421274/items/24NDGS7V"],"itemData":{"id":272,"type":"article-journal","abstract":"One of the most pervasive themes in ecology is that biological diversity stabilizes ecosystem processes and the services they provide to society, a concept that has become a common argument for biodiversity conservation. Species-rich communities are thought to produce more temporally stable ecosystem services because of the complementary or independent dynamics among species that perform similar ecosystem functions. Such variance dampening within communities is referred to as a portfolio effect and is analogous to the effects of asset diversity on the stability of financial portfolios. In ecology, these arguments have focused on the effects of species diversity on ecosystem stability but have not considered the importance of biologically relevant diversity within individual species. Current rates of population extirpation are probably at least three orders of magnitude higher than species extinction rates, so there is a pressing need to clarify how population and life history diversity affect the performance of individual species in providing important ecosystem services. Here we use five decades of data from Oncorhynchus nerka (sockeye salmon) in Bristol Bay, Alaska, to provide the first quantification of portfolio effects that derive from population and life history diversity in an important and heavily exploited species. Variability in annual Bristol Bay salmon returns is 2.2 times lower than it would be if the system consisted of a single homogenous population rather than the several hundred discrete populations it currently consists of. Furthermore, if it were a single homogeneous population, such increased variability would lead to ten times more frequent fisheries closures. Portfolio effects are also evident in watershed food webs, where they stabilize and extend predator access to salmon resources. Our results demonstrate the critical importance of maintaining population diversity for stabilizing ecosystem services and securing the economies and livelihoods that depend on them. The reliability of ecosystem services will erode faster than indicated by species loss alone. [PUBLICATION ABSTRACT]","container-title":"Nature","DOI":"https://doi-org.prox.lib.ncsu.edu/10.1038/nature09060","ISSN":"00280836","issue":"7298","language":"English","license":"Copyright Nature Publishing Group Jun 3, 2010","note":"number-of-pages: 5\npublisher-place: London, United States\npublisher: Nature Publishing Group\nsection: LETTERS","source":"ProQuest","title":"Population diversity and the portfolio effect in an exploited species","URL":"http://www.proquest.com/docview/375318240/abstract/317AC81E34EB4163PQ/1","volume":"465","author":[{"family":"Schindler","given":"Daniel E."},{"family":"Hilborn","given":"Ray"},{"family":"Chasco","given":"Brandon"},{"family":"Boatright","given":"Christopher P."},{"family":"Quinn","given":"Thomas P."},{"family":"Rogers","given":"Lauren A."},{"family":"Webster","given":"Michael S."}],"accessed":{"date-parts":[["2022",5,12]]},"issued":{"date-parts":[["2010",6,3]]}}}],"schema":"https://github.com/citation-style-language/schema/raw/master/csl-citation.json"} </w:instrText>
-      </w:r>
-      <w:r>
-        <w:rPr>
-          <w:rFonts w:ascii="Garamond" w:hAnsi="Garamond"/>
-        </w:rPr>
-        <w:fldChar w:fldCharType="separate"/>
-      </w:r>
-      <w:r>
-        <w:rPr>
-          <w:rFonts w:ascii="Garamond" w:hAnsi="Garamond"/>
-          <w:noProof/>
-        </w:rPr>
-        <w:t>(Connors et al., 2022; Moore et al., 2021; Schindler et al., 2010)</w:t>
-      </w:r>
-      <w:r>
-        <w:rPr>
-          <w:rFonts w:ascii="Garamond" w:hAnsi="Garamond"/>
-        </w:rPr>
-        <w:fldChar w:fldCharType="end"/>
-      </w:r>
-      <w:r>
-        <w:rPr>
-          <w:rFonts w:ascii="Garamond" w:hAnsi="Garamond"/>
-        </w:rPr>
-        <w:t xml:space="preserve">.     </w:t>
+        <w:t>throughout the basin.</w:t>
+      </w:r>
+      <w:r>
+        <w:rPr>
+          <w:rFonts w:ascii="Garamond" w:hAnsi="Garamond"/>
+        </w:rPr>
+        <w:t xml:space="preserve"> </w:t>
       </w:r>
     </w:p>
     <w:p>
@@ -1056,108 +1221,16 @@
           <w:rFonts w:ascii="Garamond" w:hAnsi="Garamond"/>
         </w:rPr>
       </w:pPr>
-      <w:r>
-        <w:rPr>
-          <w:rFonts w:ascii="Garamond" w:hAnsi="Garamond"/>
-        </w:rPr>
-        <w:t>G</w:t>
-      </w:r>
-      <w:r>
-        <w:rPr>
-          <w:rFonts w:ascii="Garamond" w:hAnsi="Garamond"/>
-        </w:rPr>
-        <w:t>eomorphological and successional processes</w:t>
-      </w:r>
-      <w:r>
-        <w:rPr>
-          <w:rFonts w:ascii="Garamond" w:hAnsi="Garamond"/>
-        </w:rPr>
-        <w:t xml:space="preserve"> operating across the landscape</w:t>
-      </w:r>
-      <w:r>
-        <w:rPr>
-          <w:rFonts w:ascii="Garamond" w:hAnsi="Garamond"/>
-        </w:rPr>
-        <w:t xml:space="preserve"> </w:t>
-      </w:r>
-      <w:r>
-        <w:rPr>
-          <w:rFonts w:ascii="Garamond" w:hAnsi="Garamond"/>
-        </w:rPr>
-        <w:t>generate a diversity of biophysical conditions (e.g., variation in hydrology, temperature, and depth) across multiple spatial scales</w:t>
-      </w:r>
-      <w:r>
-        <w:rPr>
-          <w:rFonts w:ascii="Garamond" w:hAnsi="Garamond"/>
-        </w:rPr>
-        <w:t xml:space="preserve"> which </w:t>
-      </w:r>
-      <w:r>
-        <w:rPr>
-          <w:rFonts w:ascii="Garamond" w:hAnsi="Garamond"/>
-        </w:rPr>
-        <w:t xml:space="preserve">differentially filter prevailing local environmental conditions </w:t>
-      </w:r>
-      <w:r>
-        <w:rPr>
-          <w:rFonts w:ascii="Garamond" w:hAnsi="Garamond"/>
-        </w:rPr>
-        <w:t>(e.g., precipitation, temperature)</w:t>
-      </w:r>
-      <w:r>
-        <w:rPr>
-          <w:rFonts w:ascii="Garamond" w:hAnsi="Garamond"/>
-        </w:rPr>
-        <w:t xml:space="preserve"> to </w:t>
-      </w:r>
-      <w:r>
-        <w:rPr>
-          <w:rFonts w:ascii="Garamond" w:hAnsi="Garamond"/>
-        </w:rPr>
-        <w:t>produc</w:t>
-      </w:r>
-      <w:r>
-        <w:rPr>
-          <w:rFonts w:ascii="Garamond" w:hAnsi="Garamond"/>
-        </w:rPr>
-        <w:t>e</w:t>
-      </w:r>
-      <w:r>
-        <w:rPr>
-          <w:rFonts w:ascii="Garamond" w:hAnsi="Garamond"/>
-        </w:rPr>
-        <w:t xml:space="preserve"> a </w:t>
-      </w:r>
-      <w:r>
-        <w:rPr>
-          <w:rFonts w:ascii="Garamond" w:hAnsi="Garamond"/>
-        </w:rPr>
-        <w:t xml:space="preserve">continuum </w:t>
-      </w:r>
-      <w:r>
-        <w:rPr>
-          <w:rFonts w:ascii="Garamond" w:hAnsi="Garamond"/>
-        </w:rPr>
-        <w:t>of habitat types</w:t>
-      </w:r>
-      <w:r>
-        <w:rPr>
-          <w:rFonts w:ascii="Garamond" w:hAnsi="Garamond"/>
-        </w:rPr>
-        <w:t xml:space="preserve"> </w:t>
-      </w:r>
-      <w:r>
-        <w:rPr>
-          <w:rFonts w:ascii="Garamond" w:hAnsi="Garamond"/>
-        </w:rPr>
-        <w:t>throughout the basin.</w:t>
-      </w:r>
-      <w:r>
-        <w:rPr>
-          <w:rFonts w:ascii="Garamond" w:hAnsi="Garamond"/>
-        </w:rPr>
-        <w:t xml:space="preserve"> </w:t>
-      </w:r>
+    </w:p>
+    <w:p>
+      <w:pPr>
+        <w:pStyle w:val="font-claude-response-body"/>
+        <w:spacing w:line="360" w:lineRule="auto"/>
+        <w:ind w:firstLine="360"/>
+        <w:rPr>
+          <w:rFonts w:ascii="Garamond" w:hAnsi="Garamond"/>
+        </w:rPr>
+      </w:pPr>
       <w:r>
         <w:rPr>
           <w:rFonts w:ascii="Garamond" w:hAnsi="Garamond"/>
@@ -1308,7 +1381,14 @@
         <w:rPr>
           <w:rFonts w:ascii="Garamond" w:hAnsi="Garamond"/>
         </w:rPr>
-        <w:t>Although the “shifting habitat mosaic” has been extensively described in relatively small ecosystems, it has only recently been empirically tested at the watershed scale in salmon systems, and then over relatively short timeframes (≤3 years; Brennan et al., 2019). To date, this pattern has not been examined in the world’s largest salmon-bearing watersheds or over longer temporal scales. Here, we reconstruct spatiotemporal patterns of watershed-scale production in the Yukon and Kuskokwim river basins—the largest salmon-bearing watersheds in North America—over a six-year period using otolith microchemistry, providing a framework for evaluating shifting habitat mosaics across large spatial extents and multi-year timescales.</w:t>
+        <w:t xml:space="preserve">Although the “shifting habitat mosaic” has been extensively described in relatively small ecosystems, it has only recently been empirically tested at the watershed scale in salmon systems, and then over relatively short timeframes (≤3 years; Brennan et al., 2019). To date, this pattern has not been examined in the world’s largest salmon-bearing watersheds or over longer temporal scales. </w:t>
+      </w:r>
+      <w:r>
+        <w:rPr>
+          <w:rFonts w:ascii="Garamond" w:hAnsi="Garamond"/>
+        </w:rPr>
+        <w:lastRenderedPageBreak/>
+        <w:t>Here, we reconstruct spatiotemporal patterns of watershed-scale production in the Yukon and Kuskokwim river basins—the largest salmon-bearing watersheds in North America—over a six-year period using otolith microchemistry, providing a framework for evaluating shifting habitat mosaics across large spatial extents and multi-year timescales.</w:t>
       </w:r>
     </w:p>
     <w:p>
@@ -1554,7 +1634,14 @@
         <w:rPr>
           <w:rFonts w:ascii="Garamond" w:hAnsi="Garamond"/>
         </w:rPr>
-        <w:t xml:space="preserve">The Sr87/Sr86 value from the natal rearing location was identified manually by examining the first stable value following the rapid decrease from that of the core, which was identified both by examining the position of the ablation transect relative to the visible core region on the otolith as well as a general </w:t>
+        <w:t xml:space="preserve">The Sr87/Sr86 value from the natal rearing location was identified manually by examining the first stable value following the rapid decrease from that of the core, which was identified both by examining the </w:t>
+      </w:r>
+      <w:r>
+        <w:rPr>
+          <w:rFonts w:ascii="Garamond" w:hAnsi="Garamond"/>
+        </w:rPr>
+        <w:lastRenderedPageBreak/>
+        <w:t xml:space="preserve">position of the ablation transect relative to the visible core region on the otolith as well as a general </w:t>
       </w:r>
       <w:r>
         <w:rPr>
@@ -1572,14 +1659,7 @@
         <w:rPr>
           <w:rFonts w:ascii="Garamond" w:hAnsi="Garamond"/>
         </w:rPr>
-        <w:t xml:space="preserve">). Fin clip samples were taken from as many Yukon individuals as possible and genetic stock identification (GSI) assignments were </w:t>
-      </w:r>
-      <w:r>
-        <w:rPr>
-          <w:rFonts w:ascii="Garamond" w:hAnsi="Garamond"/>
-        </w:rPr>
-        <w:lastRenderedPageBreak/>
-        <w:t xml:space="preserve">estimated based on methods in Makhlouf et al., 2025 using X genetic baselines </w:t>
+        <w:t xml:space="preserve">). Fin clip samples were taken from as many Yukon individuals as possible and genetic stock identification (GSI) assignments were estimated based on methods in Makhlouf et al., 2025 using X genetic baselines </w:t>
       </w:r>
       <w:proofErr w:type="gramStart"/>
       <w:r>
@@ -1760,14 +1840,14 @@
         <w:rPr>
           <w:rFonts w:ascii="Garamond" w:hAnsi="Garamond"/>
         </w:rPr>
-        <w:t xml:space="preserve">Specifically, assignments were constrained to streams of order X or greater, and a habitat prior assigned zero probability to reaches with average channel gradients &gt; X. Together, these constraints reflect the preference of Chinook salmon for spawning in larger tributaries and the observed unsuitability of both extremely low-gradient and steep reaches. Finally, a “presence prior” was derived from USGS intrinsic potential mapping, which identifies reaches where spawning Chinook salmon have been observed based on multiple data sources [ref]. This prior was applied to mainstem </w:t>
+        <w:t xml:space="preserve">Specifically, assignments were constrained to streams of order X or greater, and a habitat prior assigned zero probability to reaches with average channel gradients &gt; X. Together, these constraints reflect the preference of Chinook salmon for spawning in larger tributaries and the observed </w:t>
       </w:r>
       <w:r>
         <w:rPr>
           <w:rFonts w:ascii="Garamond" w:hAnsi="Garamond"/>
         </w:rPr>
         <w:lastRenderedPageBreak/>
-        <w:t>tributaries in both river basins, assigning zero probability to reaches with no documented evidence of spawning Chinook salmon. We restricted application of this prior to mainstem reaches to avoid unduly limiting assignments in more remote tributaries where the absence of observations likely reflects limited sampling effort rather than true absence, while still incorporating available presence information into the assignment framework.</w:t>
+        <w:t>unsuitability of both extremely low-gradient and steep reaches. Finally, a “presence prior” was derived from USGS intrinsic potential mapping, which identifies reaches where spawning Chinook salmon have been observed based on multiple data sources [ref]. This prior was applied to mainstem tributaries in both river basins, assigning zero probability to reaches with no documented evidence of spawning Chinook salmon. We restricted application of this prior to mainstem reaches to avoid unduly limiting assignments in more remote tributaries where the absence of observations likely reflects limited sampling effort rather than true absence, while still incorporating available presence information into the assignment framework.</w:t>
       </w:r>
       <w:r>
         <w:rPr>
@@ -2182,6 +2262,7 @@
           <w:szCs w:val="32"/>
           <w:u w:val="single"/>
         </w:rPr>
+        <w:lastRenderedPageBreak/>
         <w:t>Discussion</w:t>
       </w:r>
       <w:r>

</xml_diff>

<commit_message>
more work on intro
</commit_message>
<xml_diff>
--- a/Docs/Working_SMH2.docx
+++ b/Docs/Working_SMH2.docx
@@ -111,7 +111,7 @@
         <w:rPr>
           <w:rFonts w:ascii="Garamond" w:hAnsi="Garamond"/>
         </w:rPr>
-        <w:instrText xml:space="preserve"> ADDIN ZOTERO_ITEM CSL_CITATION {"citationID":"qPxuaRiG","properties":{"formattedCitation":"(Jackson &amp; Hobbs, 2009; Menden-Deuer et al., 2023; Schoen et al., 2017; Wang et al., 2021)","plainCitation":"(Jackson &amp; Hobbs, 2009; Menden-Deuer et al., 2023; Schoen et al., 2017; Wang et al., 2021)","noteIndex":0},"citationItems":[{"id":6027,"uris":["http://zotero.org/users/8421274/items/QP3NBY2P"],"itemData":{"id":6027,"type":"article-journal","abstract":"Ecological history plays many roles in ecological restoration, most notably as a tool to identify and characterize appropriate targets for restoration efforts. However, ecological history also reveals deep human imprints on many ecological systems and indicates that secular climate change has kept many targets moving at centennial to millennial time scales. Past and ongoing environmental changes ensure that many historical restoration targets will be unsustainable in the coming decades. Ecological restoration efforts should aim to conserve and restore historical ecosystems where viable, while simultaneously preparing to design or steer emerging novel ecosystems to ensure maintenance of ecological goods and services.","container-title":"Science","DOI":"10.1126/science.1172977","issue":"5940","note":"publisher: American Association for the Advancement of Science","page":"567-569","source":"science.org (Atypon)","title":"Ecological Restoration in the Light of Ecological History","volume":"325","author":[{"family":"Jackson","given":"Stephen T."},{"family":"Hobbs","given":"Richard J."}],"issued":{"date-parts":[["2009",7,31]]}}},{"id":6032,"uris":["http://zotero.org/users/8421274/items/CCV5QFSN"],"itemData":{"id":6032,"type":"article-journal","abstract":"Climate-change is rapidly and intensively altering aquatic communities and habitats. While previous work has focused on direct effects of potential drivers, indirect and interactive effects on organisms and ecosystems have received less attention. Here, we give an overview of contributions to a special issue in Limnology and Oceanography that addresses this knowledge gap. Contributions covered diverse habitats, from polar to tropical regions, alpine streams to coral reefs. Several studies relied on time-series to identify indirect effects, thus emphasizing our need to maintain high-quality time-series data. Time-series are particularly crucial now that the pace of climate-change on aquatic-ecosystems is accelerating. Another common theme is the role of species-specific characteristics in physiology, behavior or genetics in aquatic ecosystem function. The addition of inter- and intra-specific variability to investigations of climate-change may be challenging particularly since ecosystem studies typically involve a large parameter space of environmental and biological variables across spatial and temporal scales. However, the results demonstrate that inclusion of species-specific dynamics, although challenging, can deliver mechanistic insights into aquatic ecosystem patterns and processes. Some contributions leverage habitat changes from disturbances or climate shifts to document capacity for resilience or recovery of pelagic and benthic communities. Jointly, the results in this special issue document fruitful approaches and provide urgent information needed for deciphering aquatic ecosystem responses to climate forcings. This information is foundational if we wish to tackle the combined effects of climate change and other human impacts with maximum efficacy and minimize unintended consequences for biodiversity and ecosystem functioning.","container-title":"Limnology and Oceanography","DOI":"10.1002/lno.12384","ISSN":"1939-5590","issue":"S1","language":"en","license":"© 2023 Association for the Sciences of Limnology and Oceanography.","note":"_eprint: https://aslopubs.onlinelibrary.wiley.com/doi/pdf/10.1002/lno.12384","page":"S1-S7","source":"Wiley Online Library","title":"Cascading, interactive, and indirect effects of climate change on aquatic communities, habitats, and ecosystems","volume":"68","author":[{"family":"Menden-Deuer","given":"Susanne"},{"family":"Mullarney","given":"Julia C."},{"family":"Boersma","given":"Maarten"},{"family":"Grossart","given":"Hans-Peter"},{"family":"Sponseller","given":"Ryan"},{"family":"Woodin","given":"Sarah Ann"}],"issued":{"date-parts":[["2023"]]}}},{"id":6051,"uris":["http://zotero.org/users/8421274/items/UPNXXHTQ"],"itemData":{"id":6051,"type":"article-journal","abstract":"Pacific salmon Oncorhynchus spp. face serious challenges from climate and landscape change, particularly in the southern portion of their native range. Conversely, climate warming appears to be allowing salmon to expand northwards into the Arctic. Between these geographic extremes, in the Gulf of Alaska region, salmon are at historically high abundances but face an uncertain future due to rapid environmental change. We examined changes in climate, hydrology, land cover, salmon populations, and fisheries over the past 30–70 years in this region. We focused on the Kenai River, which supports world-famous fisheries but where Chinook Salmon O. tshawytscha populations have declined, raising concerns about their future resilience. The region is warming and experiencing drier summers and wetter autumns. The landscape is also changing, with melting glaciers, wetland loss, wildfires, and human development. This environmental transformation will likely harm some salmon populations while benefiting others. Lowland salmon streams are especially vulnerable, but retreating glaciers may allow production gains in other streams. Some fishing communities harvest a diverse portfolio of fluctuating resources, whereas others have specialized over time, potentially limiting their resilience. Maintaining diverse habitats and salmon runs may allow ecosystems and fisheries to continue to thrive amidst these changes.","container-title":"Fisheries","DOI":"10.1080/03632415.2017.1374251","ISSN":"0363-2415","issue":"10","note":"publisher: Taylor &amp; Francis\n_eprint: https://doi.org/10.1080/03632415.2017.1374251","page":"538-553","source":"Taylor and Francis+NEJM","title":"Future of Pacific Salmon in the Face of Environmental Change: Lessons from One of the World's Remaining Productive Salmon Regions","title-short":"Future of Pacific Salmon in the Face of Environmental Change","volume":"42","author":[{"family":"Schoen","given":"Erik R."},{"family":"Wipfli","given":"Mark S."},{"family":"Trammell","given":"E. Jamie"},{"family":"Rinella","given":"Daniel J."},{"family":"Floyd","given":"Angelica L."},{"family":"Grunblatt","given":"Jess"},{"family":"McCarthy","given":"Molly D."},{"family":"Meyer","given":"Benjamin E."},{"family":"Morton","given":"John M."},{"family":"Powell","given":"James E."},{"family":"Prakash","given":"Anupma"},{"family":"Reimer","given":"Matthew N."},{"family":"Stuefer","given":"Svetlana L."},{"family":"Toniolo","given":"Horacio"},{"family":"Wells","given":"Brett M."},{"family":"Witmer","given":"Frank D. W."}],"issued":{"date-parts":[["2017",10,3]]}}},{"id":6029,"uris":["http://zotero.org/users/8421274/items/6FRQA8JV"],"itemData":{"id":6029,"type":"article-journal","abstract":"Inland aquatic ecosystems, such as streams, rivers, ponds and lakes, play an important role in maintaining global aquatic biodiversity and ecosystem services. They have been increasingly influenced by environmental change such as global warming, dam construction, habitat fragmentation, eutrophication and urbanization. However, our understanding of the impact of global change on aquatic biodiversity and ecosystem functions remains elusive. The aim of this special issue is to highlight the ecological indicators of aquatic biodiversity and ecosystem functions under global change. The special issue comprises 18 papers including both review and research articles. These papers cover a wide range of research topics, including testing ecological theory, environmental indicator development, biodiversity monitoring and bioassessment. By covering a broad taxonomic range from bacteria and phytoplankton to fish and spanning large spatial (much of Eurasia) and temporal scales (from one season to 25-years observations and 100-years paleo-reconstruction), these articles provide an overview of ecological phenomena from population and community perspectives. Several important implications emerged from these studies: (1) The studies of the long-term succession of biotic community provide important insights into the impacts of human activities and climatic changes on conservation and management of aquatic ecosystems; (2) Anthropogenic activities strongly affect aquatic biodiversity via modifying aquatic habitats and reducing habitat heterogeneity; (3) Biotic assemblages are valuable to for assessing the ecological status of freshwater ecosystems; (4) Aquatic ecosystems have unique characteristics different from other ecosystems, as the underlying drivers and assembly mechanisms of community structure in these ecosystems are highly distinct. Together, the selection of studies reinforces the importance of long-term monitoring, ecological indicator development, and applications of ecological theory in helping us to understand the response of aquatic biodiversity and ecosystem functioning to global change.","container-title":"Ecological Indicators","DOI":"10.1016/j.ecolind.2021.108250","ISSN":"1470-160X","journalAbbreviation":"Ecological Indicators","page":"108250","source":"ScienceDirect","title":"Ecological indicators for aquatic biodiversity, ecosystem functions, human activities and climate change","volume":"132","author":[{"family":"Wang","given":"Jianjun"},{"family":"Soininen","given":"Janne"},{"family":"Heino","given":"Jani"}],"issued":{"date-parts":[["2021",12,1]]}}}],"schema":"https://github.com/citation-style-language/schema/raw/master/csl-citation.json"} </w:instrText>
+        <w:instrText xml:space="preserve"> ADDIN ZOTERO_ITEM CSL_CITATION {"citationID":"qPxuaRiG","properties":{"formattedCitation":"(Jackson &amp; Hobbs, 2009; Menden-Deuer et al., 2023; Schoen et al., 2017; Wang et al., 2021)","plainCitation":"(Jackson &amp; Hobbs, 2009; Menden-Deuer et al., 2023; Schoen et al., 2017; Wang et al., 2021)","noteIndex":0},"citationItems":[{"id":6027,"uris":["http://zotero.org/users/8421274/items/QP3NBY2P"],"itemData":{"id":6027,"type":"article-journal","abstract":"Ecological history plays many roles in ecological restoration, most notably as a tool to identify and characterize appropriate targets for restoration efforts. However, ecological history also reveals deep human imprints on many ecological systems and indicates that secular climate change has kept many targets moving at centennial to millennial time scales. Past and ongoing environmental changes ensure that many historical restoration targets will be unsustainable in the coming decades. Ecological restoration efforts should aim to conserve and restore historical ecosystems where viable, while simultaneously preparing to design or steer emerging novel ecosystems to ensure maintenance of ecological goods and services.","container-title":"Science","DOI":"10.1126/science.1172977","issue":"5940","page":"567-569","publisher":"American Association for the Advancement of Science","source":"science.org (Atypon)","title":"Ecological Restoration in the Light of Ecological History","volume":"325","author":[{"family":"Jackson","given":"Stephen T."},{"family":"Hobbs","given":"Richard J."}],"issued":{"date-parts":[["2009",7,31]]}}},{"id":6032,"uris":["http://zotero.org/users/8421274/items/CCV5QFSN"],"itemData":{"id":6032,"type":"article-journal","abstract":"Climate-change is rapidly and intensively altering aquatic communities and habitats. While previous work has focused on direct effects of potential drivers, indirect and interactive effects on organisms and ecosystems have received less attention. Here, we give an overview of contributions to a special issue in Limnology and Oceanography that addresses this knowledge gap. Contributions covered diverse habitats, from polar to tropical regions, alpine streams to coral reefs. Several studies relied on time-series to identify indirect effects, thus emphasizing our need to maintain high-quality time-series data. Time-series are particularly crucial now that the pace of climate-change on aquatic-ecosystems is accelerating. Another common theme is the role of species-specific characteristics in physiology, behavior or genetics in aquatic ecosystem function. The addition of inter- and intra-specific variability to investigations of climate-change may be challenging particularly since ecosystem studies typically involve a large parameter space of environmental and biological variables across spatial and temporal scales. However, the results demonstrate that inclusion of species-specific dynamics, although challenging, can deliver mechanistic insights into aquatic ecosystem patterns and processes. Some contributions leverage habitat changes from disturbances or climate shifts to document capacity for resilience or recovery of pelagic and benthic communities. Jointly, the results in this special issue document fruitful approaches and provide urgent information needed for deciphering aquatic ecosystem responses to climate forcings. This information is foundational if we wish to tackle the combined effects of climate change and other human impacts with maximum efficacy and minimize unintended consequences for biodiversity and ecosystem functioning.","container-title":"Limnology and Oceanography","DOI":"10.1002/lno.12384","ISSN":"1939-5590","issue":"S1","language":"en","license":"© 2023 Association for the Sciences of Limnology and Oceanography.","note":"_eprint: https://aslopubs.onlinelibrary.wiley.com/doi/pdf/10.1002/lno.12384","page":"S1-S7","source":"Wiley Online Library","title":"Cascading, interactive, and indirect effects of climate change on aquatic communities, habitats, and ecosystems","volume":"68","author":[{"family":"Menden-Deuer","given":"Susanne"},{"family":"Mullarney","given":"Julia C."},{"family":"Boersma","given":"Maarten"},{"family":"Grossart","given":"Hans-Peter"},{"family":"Sponseller","given":"Ryan"},{"family":"Woodin","given":"Sarah Ann"}],"issued":{"date-parts":[["2023"]]}}},{"id":6051,"uris":["http://zotero.org/users/8421274/items/UPNXXHTQ"],"itemData":{"id":6051,"type":"article-journal","abstract":"Pacific salmon Oncorhynchus spp. face serious challenges from climate and landscape change, particularly in the southern portion of their native range. Conversely, climate warming appears to be allowing salmon to expand northwards into the Arctic. Between these geographic extremes, in the Gulf of Alaska region, salmon are at historically high abundances but face an uncertain future due to rapid environmental change. We examined changes in climate, hydrology, land cover, salmon populations, and fisheries over the past 30–70 years in this region. We focused on the Kenai River, which supports world-famous fisheries but where Chinook Salmon O. tshawytscha populations have declined, raising concerns about their future resilience. The region is warming and experiencing drier summers and wetter autumns. The landscape is also changing, with melting glaciers, wetland loss, wildfires, and human development. This environmental transformation will likely harm some salmon populations while benefiting others. Lowland salmon streams are especially vulnerable, but retreating glaciers may allow production gains in other streams. Some fishing communities harvest a diverse portfolio of fluctuating resources, whereas others have specialized over time, potentially limiting their resilience. Maintaining diverse habitats and salmon runs may allow ecosystems and fisheries to continue to thrive amidst these changes.","container-title":"Fisheries","DOI":"10.1080/03632415.2017.1374251","ISSN":"0363-2415","issue":"10","note":"_eprint: https://doi.org/10.1080/03632415.2017.1374251","page":"538-553","publisher":"Taylor &amp; Francis","source":"Taylor and Francis+NEJM","title":"Future of Pacific Salmon in the Face of Environmental Change: Lessons from One of the World's Remaining Productive Salmon Regions","title-short":"Future of Pacific Salmon in the Face of Environmental Change","volume":"42","author":[{"family":"Schoen","given":"Erik R."},{"family":"Wipfli","given":"Mark S."},{"family":"Trammell","given":"E. Jamie"},{"family":"Rinella","given":"Daniel J."},{"family":"Floyd","given":"Angelica L."},{"family":"Grunblatt","given":"Jess"},{"family":"McCarthy","given":"Molly D."},{"family":"Meyer","given":"Benjamin E."},{"family":"Morton","given":"John M."},{"family":"Powell","given":"James E."},{"family":"Prakash","given":"Anupma"},{"family":"Reimer","given":"Matthew N."},{"family":"Stuefer","given":"Svetlana L."},{"family":"Toniolo","given":"Horacio"},{"family":"Wells","given":"Brett M."},{"family":"Witmer","given":"Frank D. W."}],"issued":{"date-parts":[["2017",10,3]]}}},{"id":6029,"uris":["http://zotero.org/users/8421274/items/6FRQA8JV"],"itemData":{"id":6029,"type":"article-journal","abstract":"Inland aquatic ecosystems, such as streams, rivers, ponds and lakes, play an important role in maintaining global aquatic biodiversity and ecosystem services. They have been increasingly influenced by environmental change such as global warming, dam construction, habitat fragmentation, eutrophication and urbanization. However, our understanding of the impact of global change on aquatic biodiversity and ecosystem functions remains elusive. The aim of this special issue is to highlight the ecological indicators of aquatic biodiversity and ecosystem functions under global change. The special issue comprises 18 papers including both review and research articles. These papers cover a wide range of research topics, including testing ecological theory, environmental indicator development, biodiversity monitoring and bioassessment. By covering a broad taxonomic range from bacteria and phytoplankton to fish and spanning large spatial (much of Eurasia) and temporal scales (from one season to 25-years observations and 100-years paleo-reconstruction), these articles provide an overview of ecological phenomena from population and community perspectives. Several important implications emerged from these studies: (1) The studies of the long-term succession of biotic community provide important insights into the impacts of human activities and climatic changes on conservation and management of aquatic ecosystems; (2) Anthropogenic activities strongly affect aquatic biodiversity via modifying aquatic habitats and reducing habitat heterogeneity; (3) Biotic assemblages are valuable to for assessing the ecological status of freshwater ecosystems; (4) Aquatic ecosystems have unique characteristics different from other ecosystems, as the underlying drivers and assembly mechanisms of community structure in these ecosystems are highly distinct. Together, the selection of studies reinforces the importance of long-term monitoring, ecological indicator development, and applications of ecological theory in helping us to understand the response of aquatic biodiversity and ecosystem functioning to global change.","container-title":"Ecological Indicators","DOI":"10.1016/j.ecolind.2021.108250","ISSN":"1470-160X","journalAbbreviation":"Ecological Indicators","page":"108250","source":"ScienceDirect","title":"Ecological indicators for aquatic biodiversity, ecosystem functions, human activities and climate change","volume":"132","author":[{"family":"Wang","given":"Jianjun"},{"family":"Soininen","given":"Janne"},{"family":"Heino","given":"Jani"}],"issued":{"date-parts":[["2021",12,1]]}}}],"schema":"https://github.com/citation-style-language/schema/raw/master/csl-citation.json"} </w:instrText>
       </w:r>
       <w:r>
         <w:rPr>
@@ -172,7 +172,7 @@
         <w:rPr>
           <w:rFonts w:ascii="Garamond" w:hAnsi="Garamond"/>
         </w:rPr>
-        <w:instrText xml:space="preserve"> ADDIN ZOTERO_ITEM CSL_CITATION {"citationID":"5N2rvLcH","properties":{"formattedCitation":"(Castello &amp; Macedo, 2016; Finn et al., 2021)","plainCitation":"(Castello &amp; Macedo, 2016; Finn et al., 2021)","noteIndex":0},"citationItems":[{"id":6035,"uris":["http://zotero.org/users/8421274/items/868PSQ3D"],"itemData":{"id":6035,"type":"article-journal","abstract":"Hydrological connectivity regulates the structure and function of Amazonian freshwater ecosystems and the provisioning of services that sustain local populations. This connectivity is increasingly being disrupted by the construction of dams, mining, land-cover changes, and global climate change. This review analyzes these drivers of degradation, evaluates their impacts on hydrological connectivity, and identifies policy deficiencies that hinder freshwater ecosystem protection. There are 154 large hydroelectric dams in operation today, and 21 dams under construction. The current trajectory of dam construction will leave only three free-flowing tributaries in the next few decades if all 277 planned dams are completed. Land-cover changes driven by mining, dam and road construction, agriculture and cattle ranching have already affected similar to 20% of the Basin and up to similar to 50% of riparian forests in some regions. Global climate change will likely exacerbate these impacts by creating warmer and dryer conditions, with less predictable rainfall and more extreme events (e.g., droughts and floods). The resulting hydrological alterations are rapidly degrading freshwater ecosystems, both independently and via complex feedbacks and synergistic interactions. The ecosystem impacts include biodiversity loss, warmer stream temperatures, stronger and more frequent floodplain fires, and changes to biogeochemical cycles, transport of organic and inorganic materials, and freshwater community structure and function. The impacts also include reductions in water quality, fish yields, and availability of water for navigation, power generation, and human use. This degradation of Amazonian freshwater ecosystems cannot be curbed presently because existing policies are inconsistent across the Basin, ignore cumulative effects, and overlook the hydrological connectivity of freshwater ecosystems. Maintaining the integrity of these freshwater ecosystems requires a basinwide research and policy framework to understand and manage hydrological connectivity across multiple spatial scales and jurisdictional boundaries.","container-title":"Global Change Biology","DOI":"10.1111/gcb.13173","ISSN":"1354-1013, 1365-2486","issue":"3","journalAbbreviation":"Glob. Change Biol.","language":"English","note":"number-of-pages: 18\npublisher-place: Hoboken\npublisher: Wiley\nWeb of Science ID: WOS:000370491400005","page":"990-1007","source":"Clarivate Analytics Web of Science","title":"Large-scale degradation of Amazonian freshwater ecosystems","volume":"22","author":[{"family":"Castello","given":"Leandro"},{"family":"Macedo","given":"Marcia N."}],"issued":{"date-parts":[["2016",3]]}}},{"id":6048,"uris":["http://zotero.org/users/8421274/items/7GIZ8JXZ"],"itemData":{"id":6048,"type":"article-journal","abstract":"Loss of connectivity caused by anthropogenic barriers is a key threat for migratory freshwater species. The anadromous life history of salmonids means that barriers on streams can decrease the amount of habitat available for spawning and rearing. To set appropriate targets for restoration, it is important to know how different populations have been impacted in terms of the location and extent of historically available habitat that has been lost or has become inaccessible. Using mapped and predicted barriers to fish passage in streams and diking infrastructure, the amount of both floodplain and linear stream habitat that remains accessible today was estimated for 14 populations of salmon in the Lower Fraser River, British Columbia, Canada’s most productive salmon river. To place these estimates within a historical context, the floodplain area was estimated using vegetation records from the 1850s, and lost streams were estimated using a digital elevation model-derived stream network. To bolster areas where little mapping has been done, current barrier data were used to predict locations likely to have barriers. Accessibility to floodplain was poor across the entire region with only 15% of the historical floodplain remaining accessible. Linear stream habitat ranged in accessibility from 28% to 99% across populations based on mapped barriers. Inclusion of predicted barriers revealed an additional 33 km of potentially inaccessible stream habitat and the modeled stream network located approximately 1700 km of stream length that has been completely lost. Comparing habitat accessibility and barrier density against the assessed status of populations revealed insights useful for understanding the impact of barriers on spawning and rearing and guiding the allocation of restoration effort. Applying methods for addressing missing data, such as lost streams and unmapped barriers, was essential for estimating the accessibility of habitat within a historical context. While much emphasis has been placed on the role of marine conditions in wild Pacific salmon recovery, the magnitude of habitat loss in the Fraser cannot be ignored and suggests it is a major driver of observed salmon declines.","container-title":"Ecosphere","DOI":"10.1002/ecs2.3646","ISSN":"2150-8925","issue":"7","language":"en","license":"© 2021 The Authors.","note":"_eprint: https://esajournals.onlinelibrary.wiley.com/doi/pdf/10.1002/ecs2.3646","page":"e03646","source":"Wiley Online Library","title":"Quantifying lost and inaccessible habitat for Pacific salmon in Canada’s Lower Fraser River","volume":"12","author":[{"family":"Finn","given":"Riley J. R."},{"family":"Chalifour","given":"Lia"},{"family":"Gergel","given":"Sarah E."},{"family":"Hinch","given":"Scott G."},{"family":"Scott","given":"David C."},{"family":"Martin","given":"Tara G."}],"issued":{"date-parts":[["2021"]]}}}],"schema":"https://github.com/citation-style-language/schema/raw/master/csl-citation.json"} </w:instrText>
+        <w:instrText xml:space="preserve"> ADDIN ZOTERO_ITEM CSL_CITATION {"citationID":"5N2rvLcH","properties":{"formattedCitation":"(Castello &amp; Macedo, 2016; Finn et al., 2021)","plainCitation":"(Castello &amp; Macedo, 2016; Finn et al., 2021)","noteIndex":0},"citationItems":[{"id":6035,"uris":["http://zotero.org/users/8421274/items/868PSQ3D"],"itemData":{"id":6035,"type":"article-journal","abstract":"Hydrological connectivity regulates the structure and function of Amazonian freshwater ecosystems and the provisioning of services that sustain local populations. This connectivity is increasingly being disrupted by the construction of dams, mining, land-cover changes, and global climate change. This review analyzes these drivers of degradation, evaluates their impacts on hydrological connectivity, and identifies policy deficiencies that hinder freshwater ecosystem protection. There are 154 large hydroelectric dams in operation today, and 21 dams under construction. The current trajectory of dam construction will leave only three free-flowing tributaries in the next few decades if all 277 planned dams are completed. Land-cover changes driven by mining, dam and road construction, agriculture and cattle ranching have already affected similar to 20% of the Basin and up to similar to 50% of riparian forests in some regions. Global climate change will likely exacerbate these impacts by creating warmer and dryer conditions, with less predictable rainfall and more extreme events (e.g., droughts and floods). The resulting hydrological alterations are rapidly degrading freshwater ecosystems, both independently and via complex feedbacks and synergistic interactions. The ecosystem impacts include biodiversity loss, warmer stream temperatures, stronger and more frequent floodplain fires, and changes to biogeochemical cycles, transport of organic and inorganic materials, and freshwater community structure and function. The impacts also include reductions in water quality, fish yields, and availability of water for navigation, power generation, and human use. This degradation of Amazonian freshwater ecosystems cannot be curbed presently because existing policies are inconsistent across the Basin, ignore cumulative effects, and overlook the hydrological connectivity of freshwater ecosystems. Maintaining the integrity of these freshwater ecosystems requires a basinwide research and policy framework to understand and manage hydrological connectivity across multiple spatial scales and jurisdictional boundaries.","container-title":"Global Change Biology","DOI":"10.1111/gcb.13173","ISSN":"1354-1013, 1365-2486","issue":"3","journalAbbreviation":"Glob. Change Biol.","language":"English","note":"number-of-pages: 18\npublisher-place: Hoboken\nWeb of Science ID: WOS:000370491400005","page":"990-1007","publisher":"Wiley","source":"Clarivate Analytics Web of Science","title":"Large-scale degradation of Amazonian freshwater ecosystems","volume":"22","author":[{"family":"Castello","given":"Leandro"},{"family":"Macedo","given":"Marcia N."}],"issued":{"date-parts":[["2016",3]]}}},{"id":6048,"uris":["http://zotero.org/users/8421274/items/7GIZ8JXZ"],"itemData":{"id":6048,"type":"article-journal","abstract":"Loss of connectivity caused by anthropogenic barriers is a key threat for migratory freshwater species. The anadromous life history of salmonids means that barriers on streams can decrease the amount of habitat available for spawning and rearing. To set appropriate targets for restoration, it is important to know how different populations have been impacted in terms of the location and extent of historically available habitat that has been lost or has become inaccessible. Using mapped and predicted barriers to fish passage in streams and diking infrastructure, the amount of both floodplain and linear stream habitat that remains accessible today was estimated for 14 populations of salmon in the Lower Fraser River, British Columbia, Canada’s most productive salmon river. To place these estimates within a historical context, the floodplain area was estimated using vegetation records from the 1850s, and lost streams were estimated using a digital elevation model-derived stream network. To bolster areas where little mapping has been done, current barrier data were used to predict locations likely to have barriers. Accessibility to floodplain was poor across the entire region with only 15% of the historical floodplain remaining accessible. Linear stream habitat ranged in accessibility from 28% to 99% across populations based on mapped barriers. Inclusion of predicted barriers revealed an additional 33 km of potentially inaccessible stream habitat and the modeled stream network located approximately 1700 km of stream length that has been completely lost. Comparing habitat accessibility and barrier density against the assessed status of populations revealed insights useful for understanding the impact of barriers on spawning and rearing and guiding the allocation of restoration effort. Applying methods for addressing missing data, such as lost streams and unmapped barriers, was essential for estimating the accessibility of habitat within a historical context. While much emphasis has been placed on the role of marine conditions in wild Pacific salmon recovery, the magnitude of habitat loss in the Fraser cannot be ignored and suggests it is a major driver of observed salmon declines.","container-title":"Ecosphere","DOI":"10.1002/ecs2.3646","ISSN":"2150-8925","issue":"7","language":"en","license":"© 2021 The Authors.","note":"_eprint: https://esajournals.onlinelibrary.wiley.com/doi/pdf/10.1002/ecs2.3646","page":"e03646","source":"Wiley Online Library","title":"Quantifying lost and inaccessible habitat for Pacific salmon in Canada’s Lower Fraser River","volume":"12","author":[{"family":"Finn","given":"Riley J. R."},{"family":"Chalifour","given":"Lia"},{"family":"Gergel","given":"Sarah E."},{"family":"Hinch","given":"Scott G."},{"family":"Scott","given":"David C."},{"family":"Martin","given":"Tara G."}],"issued":{"date-parts":[["2021"]]}}}],"schema":"https://github.com/citation-style-language/schema/raw/master/csl-citation.json"} </w:instrText>
       </w:r>
       <w:r>
         <w:rPr>
@@ -233,7 +233,7 @@
         <w:rPr>
           <w:rFonts w:ascii="Garamond" w:hAnsi="Garamond"/>
         </w:rPr>
-        <w:instrText xml:space="preserve"> ADDIN ZOTERO_ITEM CSL_CITATION {"citationID":"owk5iFbj","properties":{"formattedCitation":"(Dudgeon et al., 2006; Reid et al., 2019)","plainCitation":"(Dudgeon et al., 2006; Reid et al., 2019)","noteIndex":0},"citationItems":[{"id":6036,"uris":["http://zotero.org/users/8421274/items/VTFP5ZZE"],"itemData":{"id":6036,"type":"article-journal","abstract":"Freshwater biodiversity is the over-riding conservation priority during the International Decade for Action – ‘Water for Life’ – 2005 to 2015. Fresh water makes up only 0.01% of the World's water and approximately 0.8% of the Earth's surface, yet this tiny fraction of global water supports at least 100000 species out of approximately 1.8 million – almost 6% of all described species. Inland waters and freshwater biodiversity constitute a valuable natural resource, in economic, cultural, aesthetic, scientific and educational terms. Their conservation and management are critical to the interests of all humans, nations and governments. Yet this precious heritage is in crisis. Fresh waters are experiencing declines in biodiversity far greater than those in the most affected terrestrial ecosystems, and if trends in human demands for water remain unaltered and species losses continue at current rates, the opportunity to conserve much of the remaining biodiversity in fresh water will vanish before the ‘Water for Life’ decade ends in 2015. Why is this so, and what is being done about it? This article explores the special features of freshwater habitats and the biodiversity they support that makes them especially vulnerable to human activities. We document threats to global freshwater biodiversity under five headings: overexploitation; water pollution; flow modification; destruction or degradation of habitat; and invasion by exotic species. Their combined and interacting influences have resulted in population declines and range reduction of freshwater biodiversity worldwide. Conservation of biodiversity is complicated by the landscape position of rivers and wetlands as ‘receivers’ of land-use effluents, and the problems posed by endemism and thus non-substitutability. In addition, in many parts of the world, fresh water is subject to severe competition among multiple human stakeholders. Protection of freshwater biodiversity is perhaps the ultimate conservation challenge because it is influenced by the upstream drainage network, the surrounding land, the riparian zone, and – in the case of migrating aquatic fauna – downstream reaches. Such prerequisites are hardly ever met. Immediate action is needed where opportunities exist to set aside intact lake and river ecosystems within large protected areas. For most of the global land surface, trade-offs between conservation of freshwater biodiversity and human use of ecosystem goods and services are necessary. We advocate continuing attempts to check species loss but, in many situations, urge adoption of a compromise position of management for biodiversity conservation, ecosystem functioning and resilience, and human livelihoods in order to provide a viable long-term basis for freshwater conservation. Recognition of this need will require adoption of a new paradigm for biodiversity protection and freshwater ecosystem management – one that has been appropriately termed ‘reconciliation ecology’.","container-title":"Biological Reviews","DOI":"10.1017/S1464793105006950","ISSN":"1469-185X, 1464-7931","issue":"2","language":"en","page":"163-182","source":"Cambridge University Press","title":"Freshwater biodiversity: importance, threats, status and conservation challenges","title-short":"Freshwater biodiversity","volume":"81","author":[{"family":"Dudgeon","given":"David"},{"family":"Arthington","given":"Angela H."},{"family":"Gessner","given":"Mark O."},{"family":"Kawabata","given":"Zen-Ichiro"},{"family":"Knowler","given":"Duncan J."},{"family":"Lévêque","given":"Christian"},{"family":"Naiman","given":"Robert J."},{"family":"Prieur-Richard","given":"Anne-Hélène"},{"family":"Soto","given":"Doris"},{"family":"Stiassny","given":"Melanie L. J."},{"family":"Sullivan","given":"Caroline A."}],"issued":{"date-parts":[["2006",5]]}}},{"id":6037,"uris":["http://zotero.org/users/8421274/items/7AHZ6K4K"],"itemData":{"id":6037,"type":"article-journal","abstract":"In the 12 years since Dudgeon et al. (2006) reviewed major pressures on freshwater ecosystems, the biodiversity crisis in the world's lakes, reservoirs, rivers, streams and wetlands has deepened. While lakes, reservoirs and rivers cover only 2.3% of the Earth's surface, these ecosystems host at least 9.5% of the Earth's described animal species. Furthermore, using the World Wide Fund for Nature's Living Planet Index, freshwater population declines (83% between 1970 and 2014) continue to outpace contemporaneous declines in marine or terrestrial systems. The Anthropocene has brought multiple new and varied threats that disproportionately impact freshwater systems. We document 12 emerging threats to freshwater biodiversity that are either entirely new since 2006 or have since intensified: (i) changing climates; (ii) e-commerce and invasions; (iii) infectious diseases; (iv) harmful algal blooms; (v) expanding hydropower; (vi) emerging contaminants; (vii) engineered nanomaterials; (viii) microplastic pollution; (ix) light and noise; (x) freshwater salinisation; (xi) declining calcium; and (xii) cumulative stressors. Effects are evidenced for amphibians, fishes, invertebrates, microbes, plants, turtles and waterbirds, with potential for ecosystem-level changes through bottom-up and top-down processes. In our highly uncertain future, the net effects of these threats raise serious concerns for freshwater ecosystems. However, we also highlight opportunities for conservation gains as a result of novel management tools (e.g. environmental flows, environmental DNA) and specific conservation-oriented actions (e.g. dam removal, habitat protection policies, managed relocation of species) that have been met with varying levels of success. Moving forward, we advocate hybrid approaches that manage fresh waters as crucial ecosystems for human life support as well as essential hotspots of biodiversity and ecological function. Efforts to reverse global trends in freshwater degradation now depend on bridging an immense gap between the aspirations of conservation biologists and the accelerating rate of species endangerment.","container-title":"Biological Reviews","DOI":"10.1111/brv.12480","ISSN":"1464-7931, 1469-185X","issue":"3","journalAbbreviation":"Biol. Rev.","language":"English","note":"number-of-pages: 25\npublisher-place: Hoboken\npublisher: Wiley\nWeb of Science ID: WOS:000467422400006","page":"849-873","source":"Clarivate Analytics Web of Science","title":"Emerging threats and persistent conservation challenges for freshwater biodiversity","volume":"94","author":[{"family":"Reid","given":"Andrea J."},{"family":"Carlson","given":"Andrew K."},{"family":"Creed","given":"Irena F."},{"family":"Eliason","given":"Erika J."},{"family":"Gell","given":"Peter A."},{"family":"Johnson","given":"Pieter T. J."},{"family":"Kidd","given":"Karen A."},{"family":"MacCormack","given":"Tyson J."},{"family":"Olden","given":"Julian D."},{"family":"Ormerod","given":"Steve J."},{"family":"Smol","given":"John P."},{"family":"Taylor","given":"William W."},{"family":"Tockner","given":"Klement"},{"family":"Vermaire","given":"Jesse C."},{"family":"Dudgeon","given":"David"},{"family":"Cooke","given":"Steven J."}],"issued":{"date-parts":[["2019",6]]}}}],"schema":"https://github.com/citation-style-language/schema/raw/master/csl-citation.json"} </w:instrText>
+        <w:instrText xml:space="preserve"> ADDIN ZOTERO_ITEM CSL_CITATION {"citationID":"owk5iFbj","properties":{"formattedCitation":"(Dudgeon et al., 2006; Reid et al., 2019)","plainCitation":"(Dudgeon et al., 2006; Reid et al., 2019)","noteIndex":0},"citationItems":[{"id":6036,"uris":["http://zotero.org/users/8421274/items/VTFP5ZZE"],"itemData":{"id":6036,"type":"article-journal","abstract":"Freshwater biodiversity is the over-riding conservation priority during the International Decade for Action – ‘Water for Life’ – 2005 to 2015. Fresh water makes up only 0.01% of the World's water and approximately 0.8% of the Earth's surface, yet this tiny fraction of global water supports at least 100000 species out of approximately 1.8 million – almost 6% of all described species. Inland waters and freshwater biodiversity constitute a valuable natural resource, in economic, cultural, aesthetic, scientific and educational terms. Their conservation and management are critical to the interests of all humans, nations and governments. Yet this precious heritage is in crisis. Fresh waters are experiencing declines in biodiversity far greater than those in the most affected terrestrial ecosystems, and if trends in human demands for water remain unaltered and species losses continue at current rates, the opportunity to conserve much of the remaining biodiversity in fresh water will vanish before the ‘Water for Life’ decade ends in 2015. Why is this so, and what is being done about it? This article explores the special features of freshwater habitats and the biodiversity they support that makes them especially vulnerable to human activities. We document threats to global freshwater biodiversity under five headings: overexploitation; water pollution; flow modification; destruction or degradation of habitat; and invasion by exotic species. Their combined and interacting influences have resulted in population declines and range reduction of freshwater biodiversity worldwide. Conservation of biodiversity is complicated by the landscape position of rivers and wetlands as ‘receivers’ of land-use effluents, and the problems posed by endemism and thus non-substitutability. In addition, in many parts of the world, fresh water is subject to severe competition among multiple human stakeholders. Protection of freshwater biodiversity is perhaps the ultimate conservation challenge because it is influenced by the upstream drainage network, the surrounding land, the riparian zone, and – in the case of migrating aquatic fauna – downstream reaches. Such prerequisites are hardly ever met. Immediate action is needed where opportunities exist to set aside intact lake and river ecosystems within large protected areas. For most of the global land surface, trade-offs between conservation of freshwater biodiversity and human use of ecosystem goods and services are necessary. We advocate continuing attempts to check species loss but, in many situations, urge adoption of a compromise position of management for biodiversity conservation, ecosystem functioning and resilience, and human livelihoods in order to provide a viable long-term basis for freshwater conservation. Recognition of this need will require adoption of a new paradigm for biodiversity protection and freshwater ecosystem management – one that has been appropriately termed ‘reconciliation ecology’.","container-title":"Biological Reviews","DOI":"10.1017/S1464793105006950","ISSN":"1469-185X, 1464-7931","issue":"2","language":"en","page":"163-182","source":"Cambridge University Press","title":"Freshwater biodiversity: importance, threats, status and conservation challenges","title-short":"Freshwater biodiversity","volume":"81","author":[{"family":"Dudgeon","given":"David"},{"family":"Arthington","given":"Angela H."},{"family":"Gessner","given":"Mark O."},{"family":"Kawabata","given":"Zen-Ichiro"},{"family":"Knowler","given":"Duncan J."},{"family":"Lévêque","given":"Christian"},{"family":"Naiman","given":"Robert J."},{"family":"Prieur-Richard","given":"Anne-Hélène"},{"family":"Soto","given":"Doris"},{"family":"Stiassny","given":"Melanie L. J."},{"family":"Sullivan","given":"Caroline A."}],"issued":{"date-parts":[["2006",5]]}}},{"id":6037,"uris":["http://zotero.org/users/8421274/items/7AHZ6K4K"],"itemData":{"id":6037,"type":"article-journal","abstract":"In the 12 years since Dudgeon et al. (2006) reviewed major pressures on freshwater ecosystems, the biodiversity crisis in the world's lakes, reservoirs, rivers, streams and wetlands has deepened. While lakes, reservoirs and rivers cover only 2.3% of the Earth's surface, these ecosystems host at least 9.5% of the Earth's described animal species. Furthermore, using the World Wide Fund for Nature's Living Planet Index, freshwater population declines (83% between 1970 and 2014) continue to outpace contemporaneous declines in marine or terrestrial systems. The Anthropocene has brought multiple new and varied threats that disproportionately impact freshwater systems. We document 12 emerging threats to freshwater biodiversity that are either entirely new since 2006 or have since intensified: (i) changing climates; (ii) e-commerce and invasions; (iii) infectious diseases; (iv) harmful algal blooms; (v) expanding hydropower; (vi) emerging contaminants; (vii) engineered nanomaterials; (viii) microplastic pollution; (ix) light and noise; (x) freshwater salinisation; (xi) declining calcium; and (xii) cumulative stressors. Effects are evidenced for amphibians, fishes, invertebrates, microbes, plants, turtles and waterbirds, with potential for ecosystem-level changes through bottom-up and top-down processes. In our highly uncertain future, the net effects of these threats raise serious concerns for freshwater ecosystems. However, we also highlight opportunities for conservation gains as a result of novel management tools (e.g. environmental flows, environmental DNA) and specific conservation-oriented actions (e.g. dam removal, habitat protection policies, managed relocation of species) that have been met with varying levels of success. Moving forward, we advocate hybrid approaches that manage fresh waters as crucial ecosystems for human life support as well as essential hotspots of biodiversity and ecological function. Efforts to reverse global trends in freshwater degradation now depend on bridging an immense gap between the aspirations of conservation biologists and the accelerating rate of species endangerment.","container-title":"Biological Reviews","DOI":"10.1111/brv.12480","ISSN":"1464-7931, 1469-185X","issue":"3","journalAbbreviation":"Biol. Rev.","language":"English","note":"number-of-pages: 25\npublisher-place: Hoboken\nWeb of Science ID: WOS:000467422400006","page":"849-873","publisher":"Wiley","source":"Clarivate Analytics Web of Science","title":"Emerging threats and persistent conservation challenges for freshwater biodiversity","volume":"94","author":[{"family":"Reid","given":"Andrea J."},{"family":"Carlson","given":"Andrew K."},{"family":"Creed","given":"Irena F."},{"family":"Eliason","given":"Erika J."},{"family":"Gell","given":"Peter A."},{"family":"Johnson","given":"Pieter T. J."},{"family":"Kidd","given":"Karen A."},{"family":"MacCormack","given":"Tyson J."},{"family":"Olden","given":"Julian D."},{"family":"Ormerod","given":"Steve J."},{"family":"Smol","given":"John P."},{"family":"Taylor","given":"William W."},{"family":"Tockner","given":"Klement"},{"family":"Vermaire","given":"Jesse C."},{"family":"Dudgeon","given":"David"},{"family":"Cooke","given":"Steven J."}],"issued":{"date-parts":[["2019",6]]}}}],"schema":"https://github.com/citation-style-language/schema/raw/master/csl-citation.json"} </w:instrText>
       </w:r>
       <w:r>
         <w:rPr>
@@ -264,35 +264,7 @@
         <w:rPr>
           <w:rFonts w:ascii="Garamond" w:hAnsi="Garamond"/>
         </w:rPr>
-        <w:t xml:space="preserve">Pacific salmon </w:t>
-      </w:r>
-      <w:r>
-        <w:rPr>
-          <w:rFonts w:ascii="Garamond" w:hAnsi="Garamond"/>
-          <w:highlight w:val="yellow"/>
-        </w:rPr>
-        <w:t>(</w:t>
-      </w:r>
-      <w:r>
-        <w:rPr>
-          <w:rStyle w:val="Emphasis"/>
-          <w:rFonts w:ascii="Garamond" w:eastAsiaTheme="majorEastAsia" w:hAnsi="Garamond"/>
-          <w:highlight w:val="yellow"/>
-        </w:rPr>
-        <w:t>spp.</w:t>
-      </w:r>
-      <w:r>
-        <w:rPr>
-          <w:rFonts w:ascii="Garamond" w:hAnsi="Garamond"/>
-          <w:highlight w:val="yellow"/>
-        </w:rPr>
-        <w:t>)</w:t>
-      </w:r>
-      <w:r>
-        <w:rPr>
-          <w:rFonts w:ascii="Garamond" w:hAnsi="Garamond"/>
-        </w:rPr>
-        <w:t xml:space="preserve"> are particularly vulnerable to changes in habitat quality and connectivity because they depend on access to multiple, distinct habitat types within fully connected river networks to complete their life cycle</w:t>
+        <w:t>Pacific salmon are particularly vulnerable to changes in habitat quality and connectivity because they depend on access to multiple, distinct habitat types within fully connected river networks to complete their life cycle</w:t>
       </w:r>
       <w:r>
         <w:rPr>
@@ -310,7 +282,7 @@
         <w:rPr>
           <w:rFonts w:ascii="Garamond" w:hAnsi="Garamond"/>
         </w:rPr>
-        <w:instrText xml:space="preserve"> ADDIN ZOTERO_ITEM CSL_CITATION {"citationID":"aBTCoXji","properties":{"formattedCitation":"(Quinn, 2018; Robinson et al., 2009; Waldman &amp; Quinn, 2022)","plainCitation":"(Quinn, 2018; Robinson et al., 2009; Waldman &amp; Quinn, 2022)","noteIndex":0},"citationItems":[{"id":5568,"uris":["http://zotero.org/users/8421274/items/TBWE7PX7"],"itemData":{"id":5568,"type":"book","publisher":"American Fisheries Society, University of Washington Press","title":"The Behavior and Ecology of Pacific Salmon and Trout","author":[{"family":"Quinn","given":"Thomas P"}],"issued":{"date-parts":[["2018",10]]}}},{"id":3518,"uris":["http://zotero.org/users/8421274/items/LJAKI7SR"],"itemData":{"id":3518,"type":"article-journal","abstract":"Long-distance migrations are among the wonders of the natural world, but this multitaxon review shows that the characteristics of species that undertake such movements appear to make them particularly vulnerable to detrimental impacts of climate change. Migrants are key components of biological systems in high latitude regions, where the speed and magnitude of climate change impacts are greatest. They also rely on highly productive seasonal habitats, including wetlands and ocean upwellings that, with climate change, may become less food-rich and predictable in space and time. While migrants are adapted to adjust their behaviour with annual changes in the weather, the decoupling of climatic variables between geographically separate breeding and nonbreeding grounds is beginning to result in mistimed migration. Furthermore, human land-use and activity patterns will constrain the ability of many species to modify their migratory routes and may increase the stress induced by climate change. Adapting conservation strategies for migrants in the light of climate change will require substantial shifts in site designation policies, flexibility of management strategies and the integration of forward planning for both people and wildlife. While adaptation to changes may be feasible for some terrestrial systems, wildlife in the marine ecosystem may be more dependent on the degree of climate change mitigation that is achievable.","container-title":"Endangered Species Research","DOI":"10.3354/esr00095","ISSN":"1863-5407, 1613-4796","journalAbbreviation":"Endang. Species. Res.","language":"en","page":"87-99","source":"DOI.org (Crossref)","title":"Travelling through a warming world: climate change and migratory species","title-short":"Travelling through a warming world","volume":"7","author":[{"family":"Robinson","given":"Ra"},{"family":"Crick","given":"Hqp"},{"family":"Learmonth","given":"Ja"},{"family":"Maclean","given":"Imd"},{"family":"Thomas","given":"Cd"},{"family":"Bairlein","given":"F"},{"family":"Forchhammer","given":"Mc"},{"family":"Francis","given":"Cm"},{"family":"Gill","given":"Ja"},{"family":"Godley","given":"Bj"},{"family":"Harwood","given":"J"},{"family":"Hays","given":"Gc"},{"family":"Huntley","given":"B"},{"family":"Hutson","given":"Am"},{"family":"Pierce","given":"Gj"},{"family":"Rehfisch","given":"Mm"},{"family":"Sims","given":"Dw"},{"family":"Santos","given":"Bm"},{"family":"Sparks","given":"Th"},{"family":"Stroud","given":"Da"},{"family":"Visser","given":"Me"}],"issued":{"date-parts":[["2009",6,17]]}}},{"id":6038,"uris":["http://zotero.org/users/8421274/items/XVWURZLC"],"itemData":{"id":6038,"type":"article-journal","abstract":"Diadromous fishes migrate between freshwater and marine habitats to complete their life cycle, a complexity that makes them vulnerable to the adverse effects of current and past human activities on land and in the oceans. Many North American species are critically endangered, and entire populations have been lost. Major factors driving declines include overfishing, pollution, water withdrawals, aquaculture, non-native species, habitat degradation, over-zealous application of hatcheries designed to mitigate effects of other factors, and effects of climate change. Perhaps, the most broadly tractable and effective factors affecting diadromous fishes are removals of the dams that prevent or hinder their migrations, alter their environment, and often favor non-native biotic communities. Future survival of many diadromous fish populations may depend on this.","container-title":"Science Advances","DOI":"10.1126/sciadv.abl5486","issue":"4","note":"publisher: American Association for the Advancement of Science","page":"eabl5486","source":"science.org (Atypon)","title":"North American diadromous fishes: Drivers of decline and potential for recovery in the Anthropocene","title-short":"North American diadromous fishes","volume":"8","author":[{"family":"Waldman","given":"John R."},{"family":"Quinn","given":"Thomas P."}],"issued":{"date-parts":[["2022",1,28]]}}}],"schema":"https://github.com/citation-style-language/schema/raw/master/csl-citation.json"} </w:instrText>
+        <w:instrText xml:space="preserve"> ADDIN ZOTERO_ITEM CSL_CITATION {"citationID":"aBTCoXji","properties":{"formattedCitation":"(Quinn, 2018; Robinson et al., 2009; Waldman &amp; Quinn, 2022)","plainCitation":"(Quinn, 2018; Robinson et al., 2009; Waldman &amp; Quinn, 2022)","noteIndex":0},"citationItems":[{"id":5568,"uris":["http://zotero.org/users/8421274/items/TBWE7PX7"],"itemData":{"id":5568,"type":"book","publisher":"American Fisheries Society, University of Washington Press","title":"The Behavior and Ecology of Pacific Salmon and Trout","author":[{"family":"Quinn","given":"Thomas P"}],"issued":{"date-parts":[["2018",10]]}}},{"id":3518,"uris":["http://zotero.org/users/8421274/items/LJAKI7SR"],"itemData":{"id":3518,"type":"article-journal","abstract":"Long-distance migrations are among the wonders of the natural world, but this multitaxon review shows that the characteristics of species that undertake such movements appear to make them particularly vulnerable to detrimental impacts of climate change. Migrants are key components of biological systems in high latitude regions, where the speed and magnitude of climate change impacts are greatest. They also rely on highly productive seasonal habitats, including wetlands and ocean upwellings that, with climate change, may become less food-rich and predictable in space and time. While migrants are adapted to adjust their behaviour with annual changes in the weather, the decoupling of climatic variables between geographically separate breeding and nonbreeding grounds is beginning to result in mistimed migration. Furthermore, human land-use and activity patterns will constrain the ability of many species to modify their migratory routes and may increase the stress induced by climate change. Adapting conservation strategies for migrants in the light of climate change will require substantial shifts in site designation policies, flexibility of management strategies and the integration of forward planning for both people and wildlife. While adaptation to changes may be feasible for some terrestrial systems, wildlife in the marine ecosystem may be more dependent on the degree of climate change mitigation that is achievable.","container-title":"Endangered Species Research","DOI":"10.3354/esr00095","ISSN":"1863-5407, 1613-4796","journalAbbreviation":"Endang. Species. Res.","language":"en","page":"87-99","source":"DOI.org (Crossref)","title":"Travelling through a warming world: climate change and migratory species","title-short":"Travelling through a warming world","volume":"7","author":[{"family":"Robinson","given":"Ra"},{"family":"Crick","given":"Hqp"},{"family":"Learmonth","given":"Ja"},{"family":"Maclean","given":"Imd"},{"family":"Thomas","given":"Cd"},{"family":"Bairlein","given":"F"},{"family":"Forchhammer","given":"Mc"},{"family":"Francis","given":"Cm"},{"family":"Gill","given":"Ja"},{"family":"Godley","given":"Bj"},{"family":"Harwood","given":"J"},{"family":"Hays","given":"Gc"},{"family":"Huntley","given":"B"},{"family":"Hutson","given":"Am"},{"family":"Pierce","given":"Gj"},{"family":"Rehfisch","given":"Mm"},{"family":"Sims","given":"Dw"},{"family":"Santos","given":"Bm"},{"family":"Sparks","given":"Th"},{"family":"Stroud","given":"Da"},{"family":"Visser","given":"Me"}],"issued":{"date-parts":[["2009",6,17]]}}},{"id":6038,"uris":["http://zotero.org/users/8421274/items/XVWURZLC"],"itemData":{"id":6038,"type":"article-journal","abstract":"Diadromous fishes migrate between freshwater and marine habitats to complete their life cycle, a complexity that makes them vulnerable to the adverse effects of current and past human activities on land and in the oceans. Many North American species are critically endangered, and entire populations have been lost. Major factors driving declines include overfishing, pollution, water withdrawals, aquaculture, non-native species, habitat degradation, over-zealous application of hatcheries designed to mitigate effects of other factors, and effects of climate change. Perhaps, the most broadly tractable and effective factors affecting diadromous fishes are removals of the dams that prevent or hinder their migrations, alter their environment, and often favor non-native biotic communities. Future survival of many diadromous fish populations may depend on this.","container-title":"Science Advances","DOI":"10.1126/sciadv.abl5486","issue":"4","page":"eabl5486","publisher":"American Association for the Advancement of Science","source":"science.org (Atypon)","title":"North American diadromous fishes: Drivers of decline and potential for recovery in the Anthropocene","title-short":"North American diadromous fishes","volume":"8","author":[{"family":"Waldman","given":"John R."},{"family":"Quinn","given":"Thomas P."}],"issued":{"date-parts":[["2022",1,28]]}}}],"schema":"https://github.com/citation-style-language/schema/raw/master/csl-citation.json"} </w:instrText>
       </w:r>
       <w:r>
         <w:rPr>
@@ -347,43 +319,43 @@
         <w:rPr>
           <w:rFonts w:ascii="Garamond" w:hAnsi="Garamond"/>
         </w:rPr>
-        <w:t>However,</w:t>
-      </w:r>
-      <w:r>
-        <w:rPr>
-          <w:rFonts w:ascii="Garamond" w:hAnsi="Garamond"/>
-        </w:rPr>
-        <w:t xml:space="preserve"> these species </w:t>
-      </w:r>
-      <w:r>
-        <w:rPr>
-          <w:rFonts w:ascii="Garamond" w:hAnsi="Garamond"/>
-        </w:rPr>
-        <w:t xml:space="preserve">are </w:t>
-      </w:r>
-      <w:r>
-        <w:rPr>
-          <w:rFonts w:ascii="Garamond" w:hAnsi="Garamond"/>
-        </w:rPr>
-        <w:t xml:space="preserve">critically </w:t>
-      </w:r>
-      <w:r>
-        <w:rPr>
-          <w:rFonts w:ascii="Garamond" w:hAnsi="Garamond"/>
-        </w:rPr>
-        <w:t>important cultural, subsistence, and economic resource</w:t>
-      </w:r>
-      <w:r>
-        <w:rPr>
-          <w:rFonts w:ascii="Garamond" w:hAnsi="Garamond"/>
-        </w:rPr>
-        <w:t xml:space="preserve">s </w:t>
-      </w:r>
-      <w:r>
-        <w:rPr>
-          <w:rFonts w:ascii="Garamond" w:hAnsi="Garamond"/>
-        </w:rPr>
-        <w:t>to many</w:t>
+        <w:t xml:space="preserve">As accelerating human development has accelerated, many salmon populations have experienced sustained declines over several decades across much of their range [ref]. Widespread </w:t>
+      </w:r>
+      <w:r>
+        <w:rPr>
+          <w:rFonts w:ascii="Garamond" w:hAnsi="Garamond"/>
+        </w:rPr>
+        <w:t xml:space="preserve">efforts </w:t>
+      </w:r>
+      <w:r>
+        <w:rPr>
+          <w:rFonts w:ascii="Garamond" w:hAnsi="Garamond"/>
+        </w:rPr>
+        <w:t xml:space="preserve">have been undertaken </w:t>
+      </w:r>
+      <w:r>
+        <w:rPr>
+          <w:rFonts w:ascii="Garamond" w:hAnsi="Garamond"/>
+        </w:rPr>
+        <w:t xml:space="preserve">to restore </w:t>
+      </w:r>
+      <w:r>
+        <w:rPr>
+          <w:rFonts w:ascii="Garamond" w:hAnsi="Garamond"/>
+        </w:rPr>
+        <w:t xml:space="preserve">aquatic </w:t>
+      </w:r>
+      <w:r>
+        <w:rPr>
+          <w:rFonts w:ascii="Garamond" w:hAnsi="Garamond"/>
+        </w:rPr>
+        <w:t>habitat</w:t>
+      </w:r>
+      <w:r>
+        <w:rPr>
+          <w:rFonts w:ascii="Garamond" w:hAnsi="Garamond"/>
+        </w:rPr>
+        <w:t>s</w:t>
       </w:r>
       <w:r>
         <w:rPr>
@@ -395,7 +367,25 @@
         <w:rPr>
           <w:rFonts w:ascii="Garamond" w:hAnsi="Garamond"/>
         </w:rPr>
-        <w:t>communities</w:t>
+        <w:t xml:space="preserve">and </w:t>
+      </w:r>
+      <w:r>
+        <w:rPr>
+          <w:rFonts w:ascii="Garamond" w:hAnsi="Garamond"/>
+        </w:rPr>
+        <w:t xml:space="preserve">to </w:t>
+      </w:r>
+      <w:r>
+        <w:rPr>
+          <w:rFonts w:ascii="Garamond" w:hAnsi="Garamond"/>
+        </w:rPr>
+        <w:t>recover healthy salmon populations</w:t>
+      </w:r>
+      <w:r>
+        <w:rPr>
+          <w:rFonts w:ascii="Garamond" w:hAnsi="Garamond"/>
+        </w:rPr>
+        <w:t xml:space="preserve"> in degraded ecosystems</w:t>
       </w:r>
       <w:r>
         <w:rPr>
@@ -407,7 +397,68 @@
         <w:rPr>
           <w:rFonts w:ascii="Garamond" w:hAnsi="Garamond"/>
         </w:rPr>
-        <w:t>and play an important ecological role in both freshwater and marine ecosystems</w:t>
+        <w:fldChar w:fldCharType="begin"/>
+      </w:r>
+      <w:r>
+        <w:rPr>
+          <w:rFonts w:ascii="Garamond" w:hAnsi="Garamond"/>
+        </w:rPr>
+        <w:instrText xml:space="preserve"> ADDIN ZOTERO_ITEM CSL_CITATION {"citationID":"CYzx2Nyz","properties":{"formattedCitation":"(Cordoleani et al., 2024; Rahr et al., 2025)","plainCitation":"(Cordoleani et al., 2024; Rahr et al., 2025)","noteIndex":0},"citationItems":[{"id":5990,"uris":["http://zotero.org/users/8421274/items/BGVZ7ZLQ"],"itemData":{"id":5990,"type":"article-journal","abstract":"Phenotypic diversity and abundance drive salmon resilience in the face of increasing environmental variability. But what happens when human activities fundamentally alter the habitat complexity that drives this diversity? And how can we restore habitats to recover both diversity and abundance to support salmon persistence in a warming climate? Here, we looked at the impact of a large watershed restoration effort on the abundance and climate resilience of the three remaining core natural spring-run Chinook Salmon populations in the California Central Valley (Butte, Mill, and Deer Creek). Butte Creek fish, which have floodplain access, had higher overall productivity and faster juvenile growth compared with Mill and Deer Creek populations, and the proportion of floodplain inundation was positively correlated with Butte Creek adult abundance two years later. While Butte Creek exhibited significant increases in abundance post-restoration (similar to 000%), it generally exhibited lower phenotypic diversity and only a marginal increase in population stability after restoration based on the coefficient of variation (CV). In particular, Butte Creek salmon tended to exhibit larger drops in escapement following dry years (e.g., return years 2010, 2017) compared with Mill and Deer Creek populations, presumably due to limited inundation of its downstream floodplain. The late-migrating juvenile strategy (i.e., yearling), which disproportionately supported Mill and Deer Creek populations during droughts, was uncommon among Butte Creek adults (averaging 60% of returns for Mill and Deer Creek vs. 0.3% for Butte Creek). Increased spring-run stock complex stability was found, post-restoration, when combining the three spring-run populations (i.e., lower aggregate CV). However, among-river pairwise correlations also suggested increased synchronization in population abundances post-restoration, potentially due to increasing frequency and severity of extreme climatic events (e.g., droughts and ocean warming). This study underscores the importance of restoring a connected mosaic of aquatic habitats across modified landscapes, such as cold water refugia and floodplains, to preserve multiple (across-population) life history pathways for increasing salmon stock complex stability and abundance. These landscape-scale process-based habitat restoration efforts are likely to be crucial for the successful long-term recovery of vulnerable species in a rapidly changing climate.","container-title":"Ecosphere","DOI":"10.1002/ecs2.4803","ISSN":"2150-8925","issue":"3","journalAbbreviation":"Ecosphere","language":"English","note":"number-of-pages: 18\npublisher-place: Hoboken\nWeb of Science ID: WOS:001182186400001","page":"e4803","publisher":"Wiley","source":"Clarivate Analytics Web of Science","title":"Restoring freshwater habitat mosaics to promote resilience of vulnerable salmon populations","volume":"15","author":[{"family":"Cordoleani","given":"Flora"},{"family":"Phillis","given":"Corey C."},{"family":"Sturrock","given":"Anna M."},{"family":"Willmes","given":"Malte"},{"family":"Whitman","given":"George"},{"family":"Holmes","given":"Eric"},{"family":"Weber","given":"Peter K."},{"family":"Jeffres","given":"Carson"},{"family":"Johnson","given":"Rachel C."}],"issued":{"date-parts":[["2024",3]]}}},{"id":6043,"uris":["http://zotero.org/users/8421274/items/C2HKLHLY"],"itemData":{"id":6043,"type":"article-journal","abstract":"Nested within the linked global crises of biodiversity loss and climate change are threats to cultural and ecological keystones such as Pacific salmon Oncorhynchus spp., a group of species with widespread ecological, cultural, and economic value. Wild salmon can rally public support for ecosystem protection and link place-based conservation efforts to global biodiversity and climate benefits. Realizing these benefits depends on leveraging broad support for salmon conservation to advance forward-looking approaches that safeguard food security, biodiversity, and climate resilience. Here we provide insights from the multidecadal implementation of a proactive wild salmon ecosystem conservation strategy at the scale of the North Pacific Rim. This approach is a necessary complement to policies focused on preventing species extinction after populations and habitats are degraded and it provides globally significant contributions to biodiversity and climate targets including recent 30 × 30 goals of the Convention on Biological Diversity.","container-title":"Fisheries","DOI":"10.1093/fshmag/vuaf011","ISSN":"0363-2415","issue":"9","page":"399-415","source":"Silverchair","title":"Strongholds for Pacific salmon: A proactive conservation strategy for ecosystem health, food security, biodiversity, and climate resilience","title-short":"Strongholds for Pacific salmon","volume":"50","author":[{"family":"Rahr","given":"Guido R","suffix":"III"},{"family":"Sloat","given":"Matthew R"},{"family":"Atlas","given":"William I"},{"family":"Hart","given":"Jonathan L"}],"issued":{"date-parts":[["2025",9,1]]}}}],"schema":"https://github.com/citation-style-language/schema/raw/master/csl-citation.json"} </w:instrText>
+      </w:r>
+      <w:r>
+        <w:rPr>
+          <w:rFonts w:ascii="Garamond" w:hAnsi="Garamond"/>
+        </w:rPr>
+        <w:fldChar w:fldCharType="separate"/>
+      </w:r>
+      <w:r>
+        <w:rPr>
+          <w:rFonts w:ascii="Garamond" w:hAnsi="Garamond"/>
+          <w:noProof/>
+        </w:rPr>
+        <w:t>(Cordoleani et al., 2024; Rahr et al., 2025)</w:t>
+      </w:r>
+      <w:r>
+        <w:rPr>
+          <w:rFonts w:ascii="Garamond" w:hAnsi="Garamond"/>
+        </w:rPr>
+        <w:fldChar w:fldCharType="end"/>
+      </w:r>
+      <w:r>
+        <w:rPr>
+          <w:rFonts w:ascii="Garamond" w:hAnsi="Garamond"/>
+        </w:rPr>
+        <w:t xml:space="preserve">. </w:t>
+      </w:r>
+      <w:r>
+        <w:rPr>
+          <w:rFonts w:ascii="Garamond" w:hAnsi="Garamond"/>
+        </w:rPr>
+        <w:t xml:space="preserve">Because decades of development have imposed cumulative and confounding impacts to </w:t>
+      </w:r>
+      <w:r>
+        <w:rPr>
+          <w:rFonts w:ascii="Garamond" w:hAnsi="Garamond"/>
+        </w:rPr>
+        <w:t xml:space="preserve">many </w:t>
+      </w:r>
+      <w:r>
+        <w:rPr>
+          <w:rFonts w:ascii="Garamond" w:hAnsi="Garamond"/>
+        </w:rPr>
+        <w:t xml:space="preserve">salmon </w:t>
+      </w:r>
+      <w:r>
+        <w:rPr>
+          <w:rFonts w:ascii="Garamond" w:hAnsi="Garamond"/>
+        </w:rPr>
+        <w:t xml:space="preserve">watersheds, </w:t>
+      </w:r>
+      <w:r>
+        <w:rPr>
+          <w:rFonts w:ascii="Garamond" w:hAnsi="Garamond"/>
+        </w:rPr>
+        <w:t>it remains difficult to characterize their baseline function and to establish reference points for restoration efforts.</w:t>
       </w:r>
       <w:r>
         <w:rPr>
@@ -415,6 +466,106 @@
         </w:rPr>
         <w:t xml:space="preserve"> </w:t>
       </w:r>
+    </w:p>
+    <w:p>
+      <w:pPr>
+        <w:pStyle w:val="font-claude-response-body"/>
+        <w:spacing w:line="360" w:lineRule="auto"/>
+        <w:ind w:firstLine="360"/>
+        <w:rPr>
+          <w:rFonts w:ascii="Garamond" w:hAnsi="Garamond"/>
+        </w:rPr>
+      </w:pPr>
+      <w:r>
+        <w:rPr>
+          <w:rFonts w:ascii="Garamond" w:hAnsi="Garamond"/>
+        </w:rPr>
+        <w:t>Alaska watersheds,</w:t>
+      </w:r>
+      <w:r>
+        <w:rPr>
+          <w:rFonts w:ascii="Garamond" w:hAnsi="Garamond"/>
+        </w:rPr>
+        <w:t xml:space="preserve"> at the northernmost extent of the</w:t>
+      </w:r>
+      <w:r>
+        <w:rPr>
+          <w:rFonts w:ascii="Garamond" w:hAnsi="Garamond"/>
+        </w:rPr>
+        <w:t xml:space="preserve"> natural range of pacific</w:t>
+      </w:r>
+      <w:r>
+        <w:rPr>
+          <w:rFonts w:ascii="Garamond" w:hAnsi="Garamond"/>
+        </w:rPr>
+        <w:t xml:space="preserve"> salmon</w:t>
+      </w:r>
+      <w:r>
+        <w:rPr>
+          <w:rFonts w:ascii="Garamond" w:hAnsi="Garamond"/>
+        </w:rPr>
+        <w:t>,</w:t>
+      </w:r>
+      <w:r>
+        <w:rPr>
+          <w:rFonts w:ascii="Garamond" w:hAnsi="Garamond"/>
+        </w:rPr>
+        <w:t xml:space="preserve"> have experienced substantially</w:t>
+      </w:r>
+      <w:r>
+        <w:rPr>
+          <w:rFonts w:ascii="Garamond" w:hAnsi="Garamond"/>
+        </w:rPr>
+        <w:t xml:space="preserve"> </w:t>
+      </w:r>
+      <w:r>
+        <w:rPr>
+          <w:rFonts w:ascii="Garamond" w:hAnsi="Garamond"/>
+        </w:rPr>
+        <w:t xml:space="preserve">less anthropogenic </w:t>
+      </w:r>
+      <w:r>
+        <w:rPr>
+          <w:rFonts w:ascii="Garamond" w:hAnsi="Garamond"/>
+        </w:rPr>
+        <w:t xml:space="preserve">impacts </w:t>
+      </w:r>
+      <w:r>
+        <w:rPr>
+          <w:rFonts w:ascii="Garamond" w:hAnsi="Garamond"/>
+        </w:rPr>
+        <w:t xml:space="preserve">and habitat fragmentation </w:t>
+      </w:r>
+      <w:r>
+        <w:rPr>
+          <w:rFonts w:ascii="Garamond" w:hAnsi="Garamond"/>
+        </w:rPr>
+        <w:t xml:space="preserve">than </w:t>
+      </w:r>
+      <w:r>
+        <w:rPr>
+          <w:rFonts w:ascii="Garamond" w:hAnsi="Garamond"/>
+        </w:rPr>
+        <w:t xml:space="preserve">those </w:t>
+      </w:r>
+      <w:r>
+        <w:rPr>
+          <w:rFonts w:ascii="Garamond" w:hAnsi="Garamond"/>
+        </w:rPr>
+        <w:t>in the Pacific Northwest</w:t>
+      </w:r>
+      <w:r>
+        <w:rPr>
+          <w:rFonts w:ascii="Garamond" w:hAnsi="Garamond"/>
+        </w:rPr>
+        <w:t xml:space="preserve"> and California</w:t>
+      </w:r>
+      <w:r>
+        <w:rPr>
+          <w:rFonts w:ascii="Garamond" w:hAnsi="Garamond"/>
+        </w:rPr>
+        <w:t xml:space="preserve"> </w:t>
+      </w:r>
       <w:r>
         <w:rPr>
           <w:rFonts w:ascii="Garamond" w:hAnsi="Garamond"/>
@@ -425,7 +576,103 @@
         <w:rPr>
           <w:rFonts w:ascii="Garamond" w:hAnsi="Garamond"/>
         </w:rPr>
-        <w:instrText xml:space="preserve"> ADDIN ZOTERO_ITEM CSL_CITATION {"citationID":"jlKlHXQ7","properties":{"formattedCitation":"(Reid et al., 2022; Schindler et al., 2003)","plainCitation":"(Reid et al., 2022; Schindler et al., 2003)","noteIndex":0},"citationItems":[{"id":6046,"uris":["http://zotero.org/users/8421274/items/TNPTITZA"],"itemData":{"id":6046,"type":"article-journal","abstract":"In response to colonial research paradigms that have subjugated Indigenous Peoples, knowledges, lands, and waters, Indigenous research methodologies have emerged to center Indigenous visions and voices in research practice. Here, we employ such methodologies to improve collective understanding of the state and future of wild Pacific salmon (Oncorhynchus spp.) and fish–people–place relationships across British Columbia’s three largest salmon-producing rivers: the Fraser, Skeena, and Nass. Through partnerships with 18 communities of “Salmon People” and semi-structured interviews with 48 knowledge holders (i.e., Elders), we learned that, on average, Elders spent more than half of a century actively engaged in salmon fishing and processing. Modern salmon catches are reported to be approximately one-sixth of what they were estimated to be five to seven decades ago, and the top five threats to salmon identified by Elders included (i) aquaculture, (ii) climate change, (iii) contaminants, (iv) industrial development, and (v) infectious diseases. Threat priorities varied regionally, reflecting distinct lived experiences and regional variation in the prevalence and impact of different threats. Elders perceived threats to salmon equally as threats to aquatic health and human well-being, with evidence that the relationships between people and water, and salmon and people, are being profoundly transformed.","container-title":"FACETS","DOI":"10.1139/facets-2021-0089","note":"publisher: Canadian Science Publishing","page":"718-740","source":"facetsjournal.com (Atypon)","title":"Learning from Indigenous knowledge holders on the state and future of wild Pacific salmon","volume":"7","author":[{"family":"Reid","given":"Andrea J."},{"family":"Young","given":"Nathan"},{"family":"Hinch","given":"Scott G."},{"family":"Cooke","given":"Steven J."}],"issued":{"date-parts":[["2022",1]]}}},{"id":6040,"uris":["http://zotero.org/users/8421274/items/NXKCYMTT"],"itemData":{"id":6040,"type":"article-journal","abstract":"One of the most spectacular phenomena in nature is the annual return of millions of salmon to spawn in their natal streams and lakes along the Pacific coast of North America. The salmon die after spawning, and the nutrients and energy in their bodies, derived almost entirely from marine sources, are deposited in the freshwater ecosystems. This represents a vital input to the ecosystems used as spawning grounds. Salmon-derived nutrients make up a substantial fraction of the plants and animals in aquatic and terrestrial habitats associated with healthy salmon populations. The decline of salmon numbers throughout much of their southern range in North America has prompted concern that the elimination of this “conveyor belt” of nutrients and energy may fundamentally change the productivity of these coastal freshwater and terrestrial ecosystems, and consequently their ability to support wildlife, including salmon. If progress is to be made towards understanding and conserving the connection between migratory salmon and coastal ecosystems, scientists and decision-makers must explore and understand the vast temporal and spatial scales that characterize this relationship.","container-title":"Frontiers in Ecology and the Environment","DOI":"10.1890/1540-9295(2003)001[0031:PSATEO]2.0.CO;2","ISSN":"1540-9309","issue":"1","language":"en","license":"© The Ecological Society of America","note":"_eprint: https://esajournals.onlinelibrary.wiley.com/doi/pdf/10.1890/1540-9295%282003%29001%5B0031%3APSATEO%5D2.0.CO%3B2","page":"31-37","source":"Wiley Online Library","title":"Pacific salmon and the ecology of coastal ecosystems","volume":"1","author":[{"family":"Schindler","given":"Daniel E."},{"family":"Scheuerell","given":"Mark D."},{"family":"Moore","given":"Jonathan W."},{"family":"Gende","given":"Scott M."},{"family":"Francis","given":"Tessa B."},{"family":"Palen","given":"Wendy J."}],"issued":{"date-parts":[["2003"]]}}}],"schema":"https://github.com/citation-style-language/schema/raw/master/csl-citation.json"} </w:instrText>
+        <w:instrText xml:space="preserve"> ADDIN ZOTERO_ITEM CSL_CITATION {"citationID":"xRsa1svq","properties":{"formattedCitation":"(Schoen et al., 2017; Williams, 2006; Yoshiyama et al., 1998)","plainCitation":"(Schoen et al., 2017; Williams, 2006; Yoshiyama et al., 1998)","noteIndex":0},"citationItems":[{"id":6051,"uris":["http://zotero.org/users/8421274/items/UPNXXHTQ"],"itemData":{"id":6051,"type":"article-journal","abstract":"Pacific salmon Oncorhynchus spp. face serious challenges from climate and landscape change, particularly in the southern portion of their native range. Conversely, climate warming appears to be allowing salmon to expand northwards into the Arctic. Between these geographic extremes, in the Gulf of Alaska region, salmon are at historically high abundances but face an uncertain future due to rapid environmental change. We examined changes in climate, hydrology, land cover, salmon populations, and fisheries over the past 30–70 years in this region. We focused on the Kenai River, which supports world-famous fisheries but where Chinook Salmon O. tshawytscha populations have declined, raising concerns about their future resilience. The region is warming and experiencing drier summers and wetter autumns. The landscape is also changing, with melting glaciers, wetland loss, wildfires, and human development. This environmental transformation will likely harm some salmon populations while benefiting others. Lowland salmon streams are especially vulnerable, but retreating glaciers may allow production gains in other streams. Some fishing communities harvest a diverse portfolio of fluctuating resources, whereas others have specialized over time, potentially limiting their resilience. Maintaining diverse habitats and salmon runs may allow ecosystems and fisheries to continue to thrive amidst these changes.","container-title":"Fisheries","DOI":"10.1080/03632415.2017.1374251","ISSN":"0363-2415","issue":"10","note":"_eprint: https://doi.org/10.1080/03632415.2017.1374251","page":"538-553","publisher":"Taylor &amp; Francis","source":"Taylor and Francis+NEJM","title":"Future of Pacific Salmon in the Face of Environmental Change: Lessons from One of the World's Remaining Productive Salmon Regions","title-short":"Future of Pacific Salmon in the Face of Environmental Change","volume":"42","author":[{"family":"Schoen","given":"Erik R."},{"family":"Wipfli","given":"Mark S."},{"family":"Trammell","given":"E. Jamie"},{"family":"Rinella","given":"Daniel J."},{"family":"Floyd","given":"Angelica L."},{"family":"Grunblatt","given":"Jess"},{"family":"McCarthy","given":"Molly D."},{"family":"Meyer","given":"Benjamin E."},{"family":"Morton","given":"John M."},{"family":"Powell","given":"James E."},{"family":"Prakash","given":"Anupma"},{"family":"Reimer","given":"Matthew N."},{"family":"Stuefer","given":"Svetlana L."},{"family":"Toniolo","given":"Horacio"},{"family":"Wells","given":"Brett M."},{"family":"Witmer","given":"Frank D. W."}],"issued":{"date-parts":[["2017",10,3]]}}},{"id":6057,"uris":["http://zotero.org/users/8421274/items/MWDVQVR3"],"itemData":{"id":6057,"type":"article-journal","abstract":"This monograph presents an extensive review of the biology and management of Chinook salmon and steelhead in the Central Valley of California. Relevant data and publications on these populations are summarized and discussed in the context of the wider professional literature, with emphasis on the importance of evolutionary considerations in the assessment of populations and in their management, the need to manage populations together with their environments, and the contradiction between maintaining a major hatchery program to support a mixed-stock ocean fishery and trying to maintain or restore populations adapted to natural or semi-natural habitats. Recommendations are presented for management and monitoring—for example for a thorough review of hatchery operations, for more emphasis on monitoring individual-based factors such the physiological condition and growth rates of juveniles, and for simulation of major restoration actions and monitoring programs. The 17 chapters cover major conceptsin salmon biology and conceptual foundations for management, and Central Valley Chinook and steelhead populations and their habitat, growth and migration, habitat use, harvest, hatcheries, modeling, monitoring, and management.","container-title":"San Francisco Estuary and Watershed Science","DOI":"10.15447/sfews.2006v4iss3art2","issue":"3","language":"en","source":"escholarship.org","title":"Central Valley Salmon: A Perspective on Chinook and Steelhead in the Central Valley of California","title-short":"Central Valley Salmon","URL":"https://escholarship.org/uc/item/21v9x1t7","volume":"4","author":[{"family":"Williams","given":"John G."}],"accessed":{"date-parts":[["2026",1,5]]},"issued":{"date-parts":[["2006"]]}}},{"id":5348,"uris":["http://zotero.org/users/8421274/items/VU4C5NC2"],"itemData":{"id":5348,"type":"article-journal","abstract":"The Central Valley drainage of California formerly produced immense numbers of chinook salmon Oncorhynchus tshawytscha. Four seasonal runs occur in this system—fall, late</w:instrText>
+      </w:r>
+      <w:r>
+        <w:rPr>
+          <w:rFonts w:ascii="Cambria Math" w:hAnsi="Cambria Math" w:cs="Cambria Math"/>
+        </w:rPr>
+        <w:instrText>‐</w:instrText>
+      </w:r>
+      <w:r>
+        <w:rPr>
+          <w:rFonts w:ascii="Garamond" w:hAnsi="Garamond"/>
+        </w:rPr>
+        <w:instrText>fall, winter, and spring runs. Differences in life history timing and spatial distribution enabled the four runs to use the drainage to the fullest possible extent and once made it one of the richest regions in the world for chinook salmon production. Native American fishers within the Central Valley drainage harvested chinook salmon at estimated levels that reached 8.5 million pounds or more annually. Native harvests, therefore, were roughly comparable to the peak commercial harvests taken later by Euro</w:instrText>
+      </w:r>
+      <w:r>
+        <w:rPr>
+          <w:rFonts w:ascii="Cambria Math" w:hAnsi="Cambria Math" w:cs="Cambria Math"/>
+        </w:rPr>
+        <w:instrText>‐</w:instrText>
+      </w:r>
+      <w:r>
+        <w:rPr>
+          <w:rFonts w:ascii="Garamond" w:hAnsi="Garamond"/>
+        </w:rPr>
+        <w:instrText>American fishers, but whether or not native fishing depressed the productive capacities of the salmon populations to any substantial degree is not known. The commercial chinook salmon fishery in California started about 1850 in the San Francisco Bay and Sacramento–San Joaquin Delta region, where it formed the nucleus of the first major fishery conducted by Euro</w:instrText>
+      </w:r>
+      <w:r>
+        <w:rPr>
+          <w:rFonts w:ascii="Cambria Math" w:hAnsi="Cambria Math" w:cs="Cambria Math"/>
+        </w:rPr>
+        <w:instrText>‐</w:instrText>
+      </w:r>
+      <w:r>
+        <w:rPr>
+          <w:rFonts w:ascii="Garamond" w:hAnsi="Garamond"/>
+        </w:rPr>
+        <w:instrText>American immigrants in the state. This fishery was one of the important early industries that supported the Euro</w:instrText>
+      </w:r>
+      <w:r>
+        <w:rPr>
+          <w:rFonts w:ascii="Cambria Math" w:hAnsi="Cambria Math" w:cs="Cambria Math"/>
+        </w:rPr>
+        <w:instrText>‐</w:instrText>
+      </w:r>
+      <w:r>
+        <w:rPr>
+          <w:rFonts w:ascii="Garamond" w:hAnsi="Garamond"/>
+        </w:rPr>
+        <w:instrText>American settlement of the Central Valley region. The salmon fishery remained centered there until the early 1900s, when ocean salmon fishing began to expand and eventually came to dominate the fishery. Annual catches by the early Sacramento–San Joaquin in</w:instrText>
+      </w:r>
+      <w:r>
+        <w:rPr>
+          <w:rFonts w:ascii="Cambria Math" w:hAnsi="Cambria Math" w:cs="Cambria Math"/>
+        </w:rPr>
+        <w:instrText>‐</w:instrText>
+      </w:r>
+      <w:r>
+        <w:rPr>
+          <w:rFonts w:ascii="Garamond" w:hAnsi="Garamond"/>
+        </w:rPr>
+        <w:instrText>river fishery commonly reached 4–10 million pounds and generally were higher than the total statewide catches made during the most recent several decades. The historical abundances of Central Valley chinook salmon before large</w:instrText>
+      </w:r>
+      <w:r>
+        <w:rPr>
+          <w:rFonts w:ascii="Cambria Math" w:hAnsi="Cambria Math" w:cs="Cambria Math"/>
+        </w:rPr>
+        <w:instrText>‐</w:instrText>
+      </w:r>
+      <w:r>
+        <w:rPr>
+          <w:rFonts w:ascii="Garamond" w:hAnsi="Garamond"/>
+        </w:rPr>
+        <w:instrText>scale commercial exploitation and depletion of the runs cannot be determined with certainty. However, on the basis of early commercial catch records, the maximal production levels of the Central Valley chinook salmon stocks in aggregate may be conservatively estimated to have reached approximately 1–2 million spawners annually. Although substantial investment has been made by the state of California in managing the chinook salmon resource since the early years of the commercial fishery, chinook salmon have declined over the decades to small fractions of their previous numbers. The decline of the Central Valley chinook salmon resource was caused by several factors: overfishing, blockage and degradation of streams by mining activities, and reduction of salmon habitat and streamflows by dams and water diversions. Differences between the four chinook salmon runs in life history timing and habitat requirements partly account for their different population histories; the winter run is now threatened with extinction, the spring run recently has approached a similarly imperiled state, and the late</w:instrText>
+      </w:r>
+      <w:r>
+        <w:rPr>
+          <w:rFonts w:ascii="Cambria Math" w:hAnsi="Cambria Math" w:cs="Cambria Math"/>
+        </w:rPr>
+        <w:instrText>‐</w:instrText>
+      </w:r>
+      <w:r>
+        <w:rPr>
+          <w:rFonts w:ascii="Garamond" w:hAnsi="Garamond"/>
+        </w:rPr>
+        <w:instrText>fall run has been at moderately low population levels for the past two decades. Only the fall run, in aggregate, can be regarded as secure, but it too has undergone substantial reductions in abundance. Fall</w:instrText>
+      </w:r>
+      <w:r>
+        <w:rPr>
+          <w:rFonts w:ascii="Cambria Math" w:hAnsi="Cambria Math" w:cs="Cambria Math"/>
+        </w:rPr>
+        <w:instrText>‐</w:instrText>
+      </w:r>
+      <w:r>
+        <w:rPr>
+          <w:rFonts w:ascii="Garamond" w:hAnsi="Garamond"/>
+        </w:rPr>
+        <w:instrText xml:space="preserve">run spawner numbers were especially low in the San Joaquin River basin in recent years, and in Sacramento River basin streams their numbers have been heavily influenced by production of hatchery fish.","container-title":"North American Journal of Fisheries Management","DOI":"10.1577/1548-8675(1998)018&lt;0487:HAADOC&gt;2.0.CO;2","ISSN":"0275-5947","issue":"3","journalAbbreviation":"North American Journal of Fisheries Management","page":"487-521","source":"Silverchair","title":"Historical Abundance and Decline of Chinook Salmon in the Central Valley Region of California","volume":"18","author":[{"family":"Yoshiyama","given":"Ronald M."},{"family":"Fisher","given":"Frank W."},{"family":"Moyle","given":"Peter B."}],"issued":{"date-parts":[["1998",8,1]]}}}],"schema":"https://github.com/citation-style-language/schema/raw/master/csl-citation.json"} </w:instrText>
       </w:r>
       <w:r>
         <w:rPr>
@@ -438,7 +685,7 @@
           <w:rFonts w:ascii="Garamond" w:hAnsi="Garamond"/>
           <w:noProof/>
         </w:rPr>
-        <w:t>(Reid et al., 2022; Schindler et al., 2003)</w:t>
+        <w:t>(Schoen et al., 2017; Williams, 2006; Yoshiyama et al., 1998)</w:t>
       </w:r>
       <w:r>
         <w:rPr>
@@ -450,37 +697,332 @@
         <w:rPr>
           <w:rFonts w:ascii="Garamond" w:hAnsi="Garamond"/>
         </w:rPr>
-        <w:t xml:space="preserve">. As </w:t>
-      </w:r>
-      <w:r>
-        <w:rPr>
-          <w:rFonts w:ascii="Garamond" w:hAnsi="Garamond"/>
-        </w:rPr>
-        <w:t xml:space="preserve">such, </w:t>
-      </w:r>
-      <w:r>
-        <w:rPr>
-          <w:rFonts w:ascii="Garamond" w:hAnsi="Garamond"/>
-        </w:rPr>
-        <w:t xml:space="preserve">widespread efforts </w:t>
-      </w:r>
-      <w:r>
-        <w:rPr>
-          <w:rFonts w:ascii="Garamond" w:hAnsi="Garamond"/>
-        </w:rPr>
-        <w:t xml:space="preserve">have been undertaken </w:t>
-      </w:r>
-      <w:r>
-        <w:rPr>
-          <w:rFonts w:ascii="Garamond" w:hAnsi="Garamond"/>
-        </w:rPr>
-        <w:t xml:space="preserve">to restore </w:t>
-      </w:r>
-      <w:r>
-        <w:rPr>
-          <w:rFonts w:ascii="Garamond" w:hAnsi="Garamond"/>
-        </w:rPr>
-        <w:t xml:space="preserve">aquatic </w:t>
+        <w:t xml:space="preserve">. </w:t>
+      </w:r>
+      <w:r>
+        <w:rPr>
+          <w:rFonts w:ascii="Garamond" w:hAnsi="Garamond"/>
+        </w:rPr>
+        <w:t xml:space="preserve">Large, relatively free-flowing watersheds in Alaska support the largest remaining </w:t>
+      </w:r>
+      <w:r>
+        <w:rPr>
+          <w:rFonts w:ascii="Garamond" w:hAnsi="Garamond"/>
+        </w:rPr>
+        <w:t xml:space="preserve">pacific salmon populations </w:t>
+      </w:r>
+      <w:r>
+        <w:rPr>
+          <w:rFonts w:ascii="Garamond" w:hAnsi="Garamond"/>
+        </w:rPr>
+        <w:t>and contain some of the last remaining pristine habitats</w:t>
+      </w:r>
+      <w:r>
+        <w:rPr>
+          <w:rFonts w:ascii="Garamond" w:hAnsi="Garamond"/>
+        </w:rPr>
+        <w:t xml:space="preserve"> </w:t>
+      </w:r>
+      <w:r>
+        <w:rPr>
+          <w:rFonts w:ascii="Garamond" w:hAnsi="Garamond"/>
+        </w:rPr>
+        <w:t xml:space="preserve">which are </w:t>
+      </w:r>
+      <w:r>
+        <w:rPr>
+          <w:rFonts w:ascii="Garamond" w:hAnsi="Garamond"/>
+        </w:rPr>
+        <w:t xml:space="preserve">expected to </w:t>
+      </w:r>
+      <w:r>
+        <w:rPr>
+          <w:rFonts w:ascii="Garamond" w:hAnsi="Garamond"/>
+        </w:rPr>
+        <w:t xml:space="preserve">function in ways that </w:t>
+      </w:r>
+      <w:r>
+        <w:rPr>
+          <w:rFonts w:ascii="Garamond" w:hAnsi="Garamond"/>
+        </w:rPr>
+        <w:t xml:space="preserve">closely </w:t>
+      </w:r>
+      <w:r>
+        <w:rPr>
+          <w:rFonts w:ascii="Garamond" w:hAnsi="Garamond"/>
+        </w:rPr>
+        <w:t xml:space="preserve">reflect the natural processes of healthy </w:t>
+      </w:r>
+      <w:r>
+        <w:rPr>
+          <w:rFonts w:ascii="Garamond" w:hAnsi="Garamond"/>
+        </w:rPr>
+        <w:t xml:space="preserve">ecosystems </w:t>
+      </w:r>
+      <w:r>
+        <w:rPr>
+          <w:rFonts w:ascii="Garamond" w:hAnsi="Garamond"/>
+        </w:rPr>
+        <w:fldChar w:fldCharType="begin"/>
+      </w:r>
+      <w:r>
+        <w:rPr>
+          <w:rFonts w:ascii="Garamond" w:hAnsi="Garamond"/>
+        </w:rPr>
+        <w:instrText xml:space="preserve"> ADDIN ZOTERO_ITEM CSL_CITATION {"citationID":"OBNj6FQs","properties":{"formattedCitation":"(Schoen et al., 2017)","plainCitation":"(Schoen et al., 2017)","noteIndex":0},"citationItems":[{"id":6051,"uris":["http://zotero.org/users/8421274/items/UPNXXHTQ"],"itemData":{"id":6051,"type":"article-journal","abstract":"Pacific salmon Oncorhynchus spp. face serious challenges from climate and landscape change, particularly in the southern portion of their native range. Conversely, climate warming appears to be allowing salmon to expand northwards into the Arctic. Between these geographic extremes, in the Gulf of Alaska region, salmon are at historically high abundances but face an uncertain future due to rapid environmental change. We examined changes in climate, hydrology, land cover, salmon populations, and fisheries over the past 30–70 years in this region. We focused on the Kenai River, which supports world-famous fisheries but where Chinook Salmon O. tshawytscha populations have declined, raising concerns about their future resilience. The region is warming and experiencing drier summers and wetter autumns. The landscape is also changing, with melting glaciers, wetland loss, wildfires, and human development. This environmental transformation will likely harm some salmon populations while benefiting others. Lowland salmon streams are especially vulnerable, but retreating glaciers may allow production gains in other streams. Some fishing communities harvest a diverse portfolio of fluctuating resources, whereas others have specialized over time, potentially limiting their resilience. Maintaining diverse habitats and salmon runs may allow ecosystems and fisheries to continue to thrive amidst these changes.","container-title":"Fisheries","DOI":"10.1080/03632415.2017.1374251","ISSN":"0363-2415","issue":"10","note":"_eprint: https://doi.org/10.1080/03632415.2017.1374251","page":"538-553","publisher":"Taylor &amp; Francis","source":"Taylor and Francis+NEJM","title":"Future of Pacific Salmon in the Face of Environmental Change: Lessons from One of the World's Remaining Productive Salmon Regions","title-short":"Future of Pacific Salmon in the Face of Environmental Change","volume":"42","author":[{"family":"Schoen","given":"Erik R."},{"family":"Wipfli","given":"Mark S."},{"family":"Trammell","given":"E. Jamie"},{"family":"Rinella","given":"Daniel J."},{"family":"Floyd","given":"Angelica L."},{"family":"Grunblatt","given":"Jess"},{"family":"McCarthy","given":"Molly D."},{"family":"Meyer","given":"Benjamin E."},{"family":"Morton","given":"John M."},{"family":"Powell","given":"James E."},{"family":"Prakash","given":"Anupma"},{"family":"Reimer","given":"Matthew N."},{"family":"Stuefer","given":"Svetlana L."},{"family":"Toniolo","given":"Horacio"},{"family":"Wells","given":"Brett M."},{"family":"Witmer","given":"Frank D. W."}],"issued":{"date-parts":[["2017",10,3]]}}}],"schema":"https://github.com/citation-style-language/schema/raw/master/csl-citation.json"} </w:instrText>
+      </w:r>
+      <w:r>
+        <w:rPr>
+          <w:rFonts w:ascii="Garamond" w:hAnsi="Garamond"/>
+        </w:rPr>
+        <w:fldChar w:fldCharType="separate"/>
+      </w:r>
+      <w:r>
+        <w:rPr>
+          <w:rFonts w:ascii="Garamond" w:hAnsi="Garamond"/>
+          <w:noProof/>
+        </w:rPr>
+        <w:t>(Schoen et al., 2017)</w:t>
+      </w:r>
+      <w:r>
+        <w:rPr>
+          <w:rFonts w:ascii="Garamond" w:hAnsi="Garamond"/>
+        </w:rPr>
+        <w:fldChar w:fldCharType="end"/>
+      </w:r>
+      <w:r>
+        <w:rPr>
+          <w:rFonts w:ascii="Garamond" w:hAnsi="Garamond"/>
+        </w:rPr>
+        <w:t>.</w:t>
+      </w:r>
+      <w:r>
+        <w:rPr>
+          <w:rFonts w:ascii="Garamond" w:hAnsi="Garamond"/>
+        </w:rPr>
+        <w:t xml:space="preserve"> </w:t>
+      </w:r>
+      <w:r>
+        <w:rPr>
+          <w:rFonts w:ascii="Garamond" w:hAnsi="Garamond"/>
+        </w:rPr>
+        <w:t xml:space="preserve">As a result, these </w:t>
+      </w:r>
+      <w:r>
+        <w:rPr>
+          <w:rFonts w:ascii="Garamond" w:hAnsi="Garamond"/>
+        </w:rPr>
+        <w:lastRenderedPageBreak/>
+        <w:t>systems offer a</w:t>
+      </w:r>
+      <w:r>
+        <w:rPr>
+          <w:rFonts w:ascii="Garamond" w:hAnsi="Garamond"/>
+        </w:rPr>
+        <w:t xml:space="preserve">n </w:t>
+      </w:r>
+      <w:r>
+        <w:rPr>
+          <w:rFonts w:ascii="Garamond" w:hAnsi="Garamond"/>
+        </w:rPr>
+        <w:t xml:space="preserve">opportunity to </w:t>
+      </w:r>
+      <w:r>
+        <w:rPr>
+          <w:rFonts w:ascii="Garamond" w:hAnsi="Garamond"/>
+        </w:rPr>
+        <w:t>investigate</w:t>
+      </w:r>
+      <w:r>
+        <w:rPr>
+          <w:rFonts w:ascii="Garamond" w:hAnsi="Garamond"/>
+        </w:rPr>
+        <w:t xml:space="preserve"> the ecological processes which govern </w:t>
+      </w:r>
+      <w:r>
+        <w:rPr>
+          <w:rFonts w:ascii="Garamond" w:hAnsi="Garamond"/>
+        </w:rPr>
+        <w:t>wil</w:t>
+      </w:r>
+      <w:r>
+        <w:rPr>
+          <w:rFonts w:ascii="Garamond" w:hAnsi="Garamond"/>
+        </w:rPr>
+        <w:t>d salmon populations</w:t>
+      </w:r>
+      <w:r>
+        <w:rPr>
+          <w:rFonts w:ascii="Garamond" w:hAnsi="Garamond"/>
+        </w:rPr>
+        <w:t xml:space="preserve">, </w:t>
+      </w:r>
+      <w:r>
+        <w:rPr>
+          <w:rFonts w:ascii="Garamond" w:hAnsi="Garamond"/>
+        </w:rPr>
+        <w:t>provid</w:t>
+      </w:r>
+      <w:r>
+        <w:rPr>
+          <w:rFonts w:ascii="Garamond" w:hAnsi="Garamond"/>
+        </w:rPr>
+        <w:t xml:space="preserve">ing </w:t>
+      </w:r>
+      <w:r>
+        <w:rPr>
+          <w:rFonts w:ascii="Garamond" w:hAnsi="Garamond"/>
+        </w:rPr>
+        <w:t>a baseline for restoring impacted watersheds</w:t>
+      </w:r>
+      <w:r>
+        <w:rPr>
+          <w:rFonts w:ascii="Garamond" w:hAnsi="Garamond"/>
+        </w:rPr>
+        <w:t xml:space="preserve"> elsewhere. </w:t>
+      </w:r>
+    </w:p>
+    <w:p>
+      <w:pPr>
+        <w:pStyle w:val="font-claude-response-body"/>
+        <w:spacing w:line="360" w:lineRule="auto"/>
+        <w:ind w:firstLine="360"/>
+        <w:rPr>
+          <w:rFonts w:ascii="Garamond" w:hAnsi="Garamond"/>
+        </w:rPr>
+      </w:pPr>
+      <w:r>
+        <w:rPr>
+          <w:rFonts w:ascii="Garamond" w:hAnsi="Garamond"/>
+        </w:rPr>
+        <w:t xml:space="preserve">Insights over the past decade have </w:t>
+      </w:r>
+      <w:r>
+        <w:rPr>
+          <w:rFonts w:ascii="Garamond" w:hAnsi="Garamond"/>
+        </w:rPr>
+        <w:t xml:space="preserve">emphasized </w:t>
+      </w:r>
+      <w:r>
+        <w:rPr>
+          <w:rFonts w:ascii="Garamond" w:hAnsi="Garamond"/>
+        </w:rPr>
+        <w:t>the</w:t>
+      </w:r>
+      <w:r>
+        <w:rPr>
+          <w:rFonts w:ascii="Garamond" w:hAnsi="Garamond"/>
+        </w:rPr>
+        <w:t xml:space="preserve"> </w:t>
+      </w:r>
+      <w:r>
+        <w:rPr>
+          <w:rFonts w:ascii="Garamond" w:hAnsi="Garamond"/>
+        </w:rPr>
+        <w:t>importance of landscape heterogeneity</w:t>
+      </w:r>
+      <w:r>
+        <w:rPr>
+          <w:rFonts w:ascii="Garamond" w:hAnsi="Garamond"/>
+        </w:rPr>
+        <w:t xml:space="preserve"> </w:t>
+      </w:r>
+      <w:r>
+        <w:rPr>
+          <w:rFonts w:ascii="Garamond" w:hAnsi="Garamond"/>
+        </w:rPr>
+        <w:t xml:space="preserve">to the long-term stability of </w:t>
+      </w:r>
+      <w:r>
+        <w:rPr>
+          <w:rFonts w:ascii="Garamond" w:hAnsi="Garamond"/>
+        </w:rPr>
+        <w:t xml:space="preserve">ecosystems </w:t>
+      </w:r>
+      <w:r>
+        <w:rPr>
+          <w:rFonts w:ascii="Garamond" w:hAnsi="Garamond"/>
+        </w:rPr>
+        <w:fldChar w:fldCharType="begin"/>
+      </w:r>
+      <w:r>
+        <w:rPr>
+          <w:rFonts w:ascii="Garamond" w:hAnsi="Garamond"/>
+        </w:rPr>
+        <w:instrText xml:space="preserve"> ADDIN ZOTERO_ITEM CSL_CITATION {"citationID":"5XM4O6pO","properties":{"formattedCitation":"(Cordoleani et al., 2024; Rahr et al., 2025)","plainCitation":"(Cordoleani et al., 2024; Rahr et al., 2025)","noteIndex":0},"citationItems":[{"id":5990,"uris":["http://zotero.org/users/8421274/items/BGVZ7ZLQ"],"itemData":{"id":5990,"type":"article-journal","abstract":"Phenotypic diversity and abundance drive salmon resilience in the face of increasing environmental variability. But what happens when human activities fundamentally alter the habitat complexity that drives this diversity? And how can we restore habitats to recover both diversity and abundance to support salmon persistence in a warming climate? Here, we looked at the impact of a large watershed restoration effort on the abundance and climate resilience of the three remaining core natural spring-run Chinook Salmon populations in the California Central Valley (Butte, Mill, and Deer Creek). Butte Creek fish, which have floodplain access, had higher overall productivity and faster juvenile growth compared with Mill and Deer Creek populations, and the proportion of floodplain inundation was positively correlated with Butte Creek adult abundance two years later. While Butte Creek exhibited significant increases in abundance post-restoration (similar to 000%), it generally exhibited lower phenotypic diversity and only a marginal increase in population stability after restoration based on the coefficient of variation (CV). In particular, Butte Creek salmon tended to exhibit larger drops in escapement following dry years (e.g., return years 2010, 2017) compared with Mill and Deer Creek populations, presumably due to limited inundation of its downstream floodplain. The late-migrating juvenile strategy (i.e., yearling), which disproportionately supported Mill and Deer Creek populations during droughts, was uncommon among Butte Creek adults (averaging 60% of returns for Mill and Deer Creek vs. 0.3% for Butte Creek). Increased spring-run stock complex stability was found, post-restoration, when combining the three spring-run populations (i.e., lower aggregate CV). However, among-river pairwise correlations also suggested increased synchronization in population abundances post-restoration, potentially due to increasing frequency and severity of extreme climatic events (e.g., droughts and ocean warming). This study underscores the importance of restoring a connected mosaic of aquatic habitats across modified landscapes, such as cold water refugia and floodplains, to preserve multiple (across-population) life history pathways for increasing salmon stock complex stability and abundance. These landscape-scale process-based habitat restoration efforts are likely to be crucial for the successful long-term recovery of vulnerable species in a rapidly changing climate.","container-title":"Ecosphere","DOI":"10.1002/ecs2.4803","ISSN":"2150-8925","issue":"3","journalAbbreviation":"Ecosphere","language":"English","note":"number-of-pages: 18\npublisher-place: Hoboken\nWeb of Science ID: WOS:001182186400001","page":"e4803","publisher":"Wiley","source":"Clarivate Analytics Web of Science","title":"Restoring freshwater habitat mosaics to promote resilience of vulnerable salmon populations","volume":"15","author":[{"family":"Cordoleani","given":"Flora"},{"family":"Phillis","given":"Corey C."},{"family":"Sturrock","given":"Anna M."},{"family":"Willmes","given":"Malte"},{"family":"Whitman","given":"George"},{"family":"Holmes","given":"Eric"},{"family":"Weber","given":"Peter K."},{"family":"Jeffres","given":"Carson"},{"family":"Johnson","given":"Rachel C."}],"issued":{"date-parts":[["2024",3]]}}},{"id":6043,"uris":["http://zotero.org/users/8421274/items/C2HKLHLY"],"itemData":{"id":6043,"type":"article-journal","abstract":"Nested within the linked global crises of biodiversity loss and climate change are threats to cultural and ecological keystones such as Pacific salmon Oncorhynchus spp., a group of species with widespread ecological, cultural, and economic value. Wild salmon can rally public support for ecosystem protection and link place-based conservation efforts to global biodiversity and climate benefits. Realizing these benefits depends on leveraging broad support for salmon conservation to advance forward-looking approaches that safeguard food security, biodiversity, and climate resilience. Here we provide insights from the multidecadal implementation of a proactive wild salmon ecosystem conservation strategy at the scale of the North Pacific Rim. This approach is a necessary complement to policies focused on preventing species extinction after populations and habitats are degraded and it provides globally significant contributions to biodiversity and climate targets including recent 30 × 30 goals of the Convention on Biological Diversity.","container-title":"Fisheries","DOI":"10.1093/fshmag/vuaf011","ISSN":"0363-2415","issue":"9","page":"399-415","source":"Silverchair","title":"Strongholds for Pacific salmon: A proactive conservation strategy for ecosystem health, food security, biodiversity, and climate resilience","title-short":"Strongholds for Pacific salmon","volume":"50","author":[{"family":"Rahr","given":"Guido R","suffix":"III"},{"family":"Sloat","given":"Matthew R"},{"family":"Atlas","given":"William I"},{"family":"Hart","given":"Jonathan L"}],"issued":{"date-parts":[["2025",9,1]]}}}],"schema":"https://github.com/citation-style-language/schema/raw/master/csl-citation.json"} </w:instrText>
+      </w:r>
+      <w:r>
+        <w:rPr>
+          <w:rFonts w:ascii="Garamond" w:hAnsi="Garamond"/>
+        </w:rPr>
+        <w:fldChar w:fldCharType="separate"/>
+      </w:r>
+      <w:r>
+        <w:rPr>
+          <w:rFonts w:ascii="Garamond" w:hAnsi="Garamond"/>
+          <w:noProof/>
+        </w:rPr>
+        <w:t>(Cordoleani et al., 2024; Rahr et al., 2025)</w:t>
+      </w:r>
+      <w:r>
+        <w:rPr>
+          <w:rFonts w:ascii="Garamond" w:hAnsi="Garamond"/>
+        </w:rPr>
+        <w:fldChar w:fldCharType="end"/>
+      </w:r>
+      <w:r>
+        <w:rPr>
+          <w:rFonts w:ascii="Garamond" w:hAnsi="Garamond"/>
+        </w:rPr>
+        <w:t xml:space="preserve">. </w:t>
+      </w:r>
+      <w:r>
+        <w:rPr>
+          <w:rFonts w:ascii="Garamond" w:hAnsi="Garamond"/>
+        </w:rPr>
+        <w:t xml:space="preserve">In well-functioning systems, variation in </w:t>
+      </w:r>
+      <w:r>
+        <w:rPr>
+          <w:rFonts w:ascii="Garamond" w:hAnsi="Garamond"/>
+        </w:rPr>
+        <w:t xml:space="preserve">local </w:t>
+      </w:r>
+      <w:r>
+        <w:rPr>
+          <w:rFonts w:ascii="Garamond" w:hAnsi="Garamond"/>
+        </w:rPr>
+        <w:t>biophysical conditions (e.g., hydrology, temperature) filter broad environmental drivers (e.g., precipitation, air temperature)</w:t>
+      </w:r>
+      <w:r>
+        <w:rPr>
+          <w:rFonts w:ascii="Garamond" w:hAnsi="Garamond"/>
+        </w:rPr>
+        <w:t xml:space="preserve"> to </w:t>
+      </w:r>
+      <w:r>
+        <w:rPr>
+          <w:rFonts w:ascii="Garamond" w:hAnsi="Garamond"/>
+        </w:rPr>
+        <w:t>produc</w:t>
+      </w:r>
+      <w:r>
+        <w:rPr>
+          <w:rFonts w:ascii="Garamond" w:hAnsi="Garamond"/>
+        </w:rPr>
+        <w:t>e</w:t>
+      </w:r>
+      <w:r>
+        <w:rPr>
+          <w:rFonts w:ascii="Garamond" w:hAnsi="Garamond"/>
+        </w:rPr>
+        <w:t xml:space="preserve"> </w:t>
+      </w:r>
+      <w:r>
+        <w:rPr>
+          <w:rFonts w:ascii="Garamond" w:hAnsi="Garamond"/>
+        </w:rPr>
+        <w:t xml:space="preserve">a continuum of </w:t>
       </w:r>
       <w:r>
         <w:rPr>
@@ -492,7 +1034,31 @@
         <w:rPr>
           <w:rFonts w:ascii="Garamond" w:hAnsi="Garamond"/>
         </w:rPr>
-        <w:t>s</w:t>
+        <w:t xml:space="preserve"> types and</w:t>
+      </w:r>
+      <w:r>
+        <w:rPr>
+          <w:rFonts w:ascii="Garamond" w:hAnsi="Garamond"/>
+        </w:rPr>
+        <w:t xml:space="preserve"> conditions </w:t>
+      </w:r>
+      <w:r>
+        <w:rPr>
+          <w:rFonts w:ascii="Garamond" w:hAnsi="Garamond"/>
+        </w:rPr>
+        <w:t>across the landscape</w:t>
+      </w:r>
+      <w:r>
+        <w:rPr>
+          <w:rFonts w:ascii="Garamond" w:hAnsi="Garamond"/>
+        </w:rPr>
+        <w:t xml:space="preserve">. </w:t>
+      </w:r>
+      <w:r>
+        <w:rPr>
+          <w:rFonts w:ascii="Garamond" w:hAnsi="Garamond"/>
+        </w:rPr>
+        <w:t>As these interactions shift across space and time, habitat conditions are reconfigured across the landscape</w:t>
       </w:r>
       <w:r>
         <w:rPr>
@@ -504,25 +1070,56 @@
         <w:rPr>
           <w:rFonts w:ascii="Garamond" w:hAnsi="Garamond"/>
         </w:rPr>
-        <w:t xml:space="preserve">and </w:t>
-      </w:r>
-      <w:r>
-        <w:rPr>
-          <w:rFonts w:ascii="Garamond" w:hAnsi="Garamond"/>
-        </w:rPr>
-        <w:t xml:space="preserve">to </w:t>
-      </w:r>
-      <w:r>
-        <w:rPr>
-          <w:rFonts w:ascii="Garamond" w:hAnsi="Garamond"/>
-        </w:rPr>
-        <w:t>recover healthy salmon populations</w:t>
-      </w:r>
-      <w:r>
-        <w:rPr>
-          <w:rFonts w:ascii="Garamond" w:hAnsi="Garamond"/>
-        </w:rPr>
-        <w:t xml:space="preserve"> in degraded ecosystems</w:t>
+        <w:t>driv</w:t>
+      </w:r>
+      <w:r>
+        <w:rPr>
+          <w:rFonts w:ascii="Garamond" w:hAnsi="Garamond"/>
+        </w:rPr>
+        <w:t>ing</w:t>
+      </w:r>
+      <w:r>
+        <w:rPr>
+          <w:rFonts w:ascii="Garamond" w:hAnsi="Garamond"/>
+        </w:rPr>
+        <w:t xml:space="preserve"> corresponding shifts in fishery production as locally adapted subpopulations respond to the changing distribution of optimal habitat </w:t>
+      </w:r>
+      <w:r>
+        <w:rPr>
+          <w:rFonts w:ascii="Garamond" w:hAnsi="Garamond"/>
+        </w:rPr>
+        <w:fldChar w:fldCharType="begin"/>
+      </w:r>
+      <w:r>
+        <w:rPr>
+          <w:rFonts w:ascii="Garamond" w:hAnsi="Garamond"/>
+        </w:rPr>
+        <w:instrText xml:space="preserve"> ADDIN ZOTERO_ITEM CSL_CITATION {"citationID":"zdQcn8TC","properties":{"formattedCitation":"(Brennan et al., 2019; Stanford et al., 2005)","plainCitation":"(Brennan et al., 2019; Stanford et al., 2005)","noteIndex":0},"citationItems":[{"id":3844,"uris":["http://zotero.org/users/8421274/items/RXD5IA9D"],"itemData":{"id":3844,"type":"article-journal","abstract":"Watersheds are complex mosaics of habitats whose conditions vary across space and time as landscape features filter overriding climate forcing, yet the extent to which the reliability of ecosystem services depends on these dynamics remains unknown. We quantified how shifting habitat mosaics are expressed across a range of spatial scales within a large, free-flowing river, and how they stabilize the production of Pacific salmon that support valuable fisheries. The strontium isotope records of ear stones (otoliths) show that the relative productivity of locations across the river network, as both natal- and juvenile-rearing habitat, varies widely among years and that this variability is expressed across a broad range of spatial scales, ultimately stabilizing the interannual production of fish at the scale of the entire basin.","container-title":"Science","DOI":"10.1126/science.aav4313","issue":"6442","page":"783-786","publisher":"American Association for the Advancement of Science","source":"science.org (Atypon)","title":"Shifting habitat mosaics and fish production across river basins","volume":"364","author":[{"family":"Brennan","given":"Sean R."},{"family":"Schindler","given":"Daniel E."},{"family":"Cline","given":"Timothy J."},{"family":"Walsworth","given":"Timothy E."},{"family":"Buck","given":"Greg"},{"family":"Fernandez","given":"Diego P."}],"issued":{"date-parts":[["2019"]]}}},{"id":116,"uris":["http://zotero.org/users/8421274/items/RCTHFEMR"],"itemData":{"id":116,"type":"article-journal","container-title":"SIL Proceedings, 1922-2010","DOI":"10.1080/03680770.2005.11901979","ISSN":"0368-0770","issue":"1","note":"_eprint: https://doi.org/10.1080/03680770.2005.11901979","page":"123-136","publisher":"Taylor &amp; Francis","source":"Taylor and Francis+NEJM","title":"The shifting habitat mosaic of river ecosystems","volume":"29","author":[{"family":"Stanford","given":"J. A."},{"family":"Lorang","given":"M. S."},{"family":"Hauer","given":"F. R."}],"issued":{"date-parts":[["2005",3,1]]}}}],"schema":"https://github.com/citation-style-language/schema/raw/master/csl-citation.json"} </w:instrText>
+      </w:r>
+      <w:r>
+        <w:rPr>
+          <w:rFonts w:ascii="Garamond" w:hAnsi="Garamond"/>
+        </w:rPr>
+        <w:fldChar w:fldCharType="separate"/>
+      </w:r>
+      <w:r>
+        <w:rPr>
+          <w:rFonts w:ascii="Garamond" w:hAnsi="Garamond"/>
+          <w:noProof/>
+        </w:rPr>
+        <w:t>(Brennan et al., 2019; Stanford et al., 2005)</w:t>
+      </w:r>
+      <w:r>
+        <w:rPr>
+          <w:rFonts w:ascii="Garamond" w:hAnsi="Garamond"/>
+        </w:rPr>
+        <w:fldChar w:fldCharType="end"/>
+      </w:r>
+      <w:r>
+        <w:rPr>
+          <w:rFonts w:ascii="Garamond" w:hAnsi="Garamond"/>
+        </w:rPr>
+        <w:t>.</w:t>
       </w:r>
       <w:r>
         <w:rPr>
@@ -534,13 +1131,47 @@
         <w:rPr>
           <w:rFonts w:ascii="Garamond" w:hAnsi="Garamond"/>
         </w:rPr>
+        <w:t>This “shifting habitat mosaic” is expected to stabilize watershed performance (e.g., salmon returns) by maximizing the potential for optimal conditions to arise somewhere in the watershed under a range of prevailing environmental conditions. Although the spatial distribution of production shifts over time, hydrological connectivity links asynchronous upstream components, integrating sub-basin dynamics and reducing variability in ecosystem-scale performance.</w:t>
+      </w:r>
+    </w:p>
+    <w:p>
+      <w:pPr>
+        <w:pStyle w:val="font-claude-response-body"/>
+        <w:spacing w:line="360" w:lineRule="auto"/>
+        <w:ind w:firstLine="360"/>
+        <w:rPr>
+          <w:rFonts w:ascii="Garamond" w:hAnsi="Garamond"/>
+        </w:rPr>
+      </w:pPr>
+      <w:r>
+        <w:rPr>
+          <w:rFonts w:ascii="Garamond" w:hAnsi="Garamond"/>
+        </w:rPr>
+        <w:t xml:space="preserve">This pattern been reconstructed in </w:t>
+      </w:r>
+      <w:r>
+        <w:rPr>
+          <w:rFonts w:ascii="Garamond" w:hAnsi="Garamond"/>
+        </w:rPr>
+        <w:t>relatively small ecosystems</w:t>
+      </w:r>
+      <w:r>
+        <w:rPr>
+          <w:rFonts w:ascii="Garamond" w:hAnsi="Garamond"/>
+        </w:rPr>
+        <w:t xml:space="preserve"> </w:t>
+      </w:r>
+      <w:r>
+        <w:rPr>
+          <w:rFonts w:ascii="Garamond" w:hAnsi="Garamond"/>
+        </w:rPr>
         <w:fldChar w:fldCharType="begin"/>
       </w:r>
       <w:r>
         <w:rPr>
           <w:rFonts w:ascii="Garamond" w:hAnsi="Garamond"/>
         </w:rPr>
-        <w:instrText xml:space="preserve"> ADDIN ZOTERO_ITEM CSL_CITATION {"citationID":"CYzx2Nyz","properties":{"formattedCitation":"(Cordoleani et al., 2024; Rahr et al., 2025)","plainCitation":"(Cordoleani et al., 2024; Rahr et al., 2025)","noteIndex":0},"citationItems":[{"id":5990,"uris":["http://zotero.org/users/8421274/items/BGVZ7ZLQ"],"itemData":{"id":5990,"type":"article-journal","abstract":"Phenotypic diversity and abundance drive salmon resilience in the face of increasing environmental variability. But what happens when human activities fundamentally alter the habitat complexity that drives this diversity? And how can we restore habitats to recover both diversity and abundance to support salmon persistence in a warming climate? Here, we looked at the impact of a large watershed restoration effort on the abundance and climate resilience of the three remaining core natural spring-run Chinook Salmon populations in the California Central Valley (Butte, Mill, and Deer Creek). Butte Creek fish, which have floodplain access, had higher overall productivity and faster juvenile growth compared with Mill and Deer Creek populations, and the proportion of floodplain inundation was positively correlated with Butte Creek adult abundance two years later. While Butte Creek exhibited significant increases in abundance post-restoration (similar to 000%), it generally exhibited lower phenotypic diversity and only a marginal increase in population stability after restoration based on the coefficient of variation (CV). In particular, Butte Creek salmon tended to exhibit larger drops in escapement following dry years (e.g., return years 2010, 2017) compared with Mill and Deer Creek populations, presumably due to limited inundation of its downstream floodplain. The late-migrating juvenile strategy (i.e., yearling), which disproportionately supported Mill and Deer Creek populations during droughts, was uncommon among Butte Creek adults (averaging 60% of returns for Mill and Deer Creek vs. 0.3% for Butte Creek). Increased spring-run stock complex stability was found, post-restoration, when combining the three spring-run populations (i.e., lower aggregate CV). However, among-river pairwise correlations also suggested increased synchronization in population abundances post-restoration, potentially due to increasing frequency and severity of extreme climatic events (e.g., droughts and ocean warming). This study underscores the importance of restoring a connected mosaic of aquatic habitats across modified landscapes, such as cold water refugia and floodplains, to preserve multiple (across-population) life history pathways for increasing salmon stock complex stability and abundance. These landscape-scale process-based habitat restoration efforts are likely to be crucial for the successful long-term recovery of vulnerable species in a rapidly changing climate.","container-title":"Ecosphere","DOI":"10.1002/ecs2.4803","ISSN":"2150-8925","issue":"3","journalAbbreviation":"Ecosphere","language":"English","note":"number-of-pages: 18\npublisher-place: Hoboken\npublisher: Wiley\nWeb of Science ID: WOS:001182186400001","page":"e4803","source":"Clarivate Analytics Web of Science","title":"Restoring freshwater habitat mosaics to promote resilience of vulnerable salmon populations","volume":"15","author":[{"family":"Cordoleani","given":"Flora"},{"family":"Phillis","given":"Corey C."},{"family":"Sturrock","given":"Anna M."},{"family":"Willmes","given":"Malte"},{"family":"Whitman","given":"George"},{"family":"Holmes","given":"Eric"},{"family":"Weber","given":"Peter K."},{"family":"Jeffres","given":"Carson"},{"family":"Johnson","given":"Rachel C."}],"issued":{"date-parts":[["2024",3]]}}},{"id":6043,"uris":["http://zotero.org/users/8421274/items/C2HKLHLY"],"itemData":{"id":6043,"type":"article-journal","abstract":"Nested within the linked global crises of biodiversity loss and climate change are threats to cultural and ecological keystones such as Pacific salmon Oncorhynchus spp., a group of species with widespread ecological, cultural, and economic value. Wild salmon can rally public support for ecosystem protection and link place-based conservation efforts to global biodiversity and climate benefits. Realizing these benefits depends on leveraging broad support for salmon conservation to advance forward-looking approaches that safeguard food security, biodiversity, and climate resilience. Here we provide insights from the multidecadal implementation of a proactive wild salmon ecosystem conservation strategy at the scale of the North Pacific Rim. This approach is a necessary complement to policies focused on preventing species extinction after populations and habitats are degraded and it provides globally significant contributions to biodiversity and climate targets including recent 30 × 30 goals of the Convention on Biological Diversity.","container-title":"Fisheries","DOI":"10.1093/fshmag/vuaf011","ISSN":"0363-2415","issue":"9","page":"399-415","source":"Silverchair","title":"Strongholds for Pacific salmon: A proactive conservation strategy for ecosystem health, food security, biodiversity, and climate resilience","title-short":"Strongholds for Pacific salmon","volume":"50","author":[{"family":"Rahr","given":"Guido R","suffix":"III"},{"family":"Sloat","given":"Matthew R"},{"family":"Atlas","given":"William I"},{"family":"Hart","given":"Jonathan L"}],"issued":{"date-parts":[["2025",9,1]]}}}],"schema":"https://github.com/citation-style-language/schema/raw/master/csl-citation.json"} </w:instrText>
+        <w:instrText xml:space="preserve"> ADDIN ZOTERO_ITEM CSL_CITATION {"citationID":"651DcBk0","properties":{"formattedCitation":"(Armstrong &amp; Schindler, 2013; Baldock et al., 2016)","plainCitation":"(Armstrong &amp; Schindler, 2013; Baldock et al., 2016)","noteIndex":0},"citationItems":[{"id":65,"uris":["http://zotero.org/users/8421274/items/UPNH69YA"],"itemData":{"id":65,"type":"article-journal","abstract":"A critical challenge for ecologists is to understand the functional significance of habitat heterogeneity and connectivity for mobile animals. Here, we explore how a thermo-regulating fish responds to annual variation in the spatial patterning of thermal and trophic resources. In a third-order stream in coastal Alaska, juvenile coho salmon forage on sockeye salmon eggs at night in cold water and then move to warmer water to increase their digestive capacity. We mapped the spatial distributions of water temperature, juvenile coho salmon, and spawning sockeye salmon across a 5-year period during which summer discharge varied by greater than fivefold. In low flow years, warm water (9–12°C) was only available in thalweg (that is, main-channel) habitat at least approximately 400 m upstream of the cooler habitat (3–7°C) where sockeye salmon spawned. In high flow years, the entire stream thalweg was isothermal at 7–8°C, but inundated off-channel areas generated warm habitats (9–12°C) laterally adjacent to the downstream regions where sockeye salmon spawned. The daytime spatial distribution of juvenile coho salmon shifted from headwater thalweg habitats in low flow years, to downstream off-channel habitats in high flow years. In all years, the majority of juvenile coho salmon sampled during the daytime were found in warm habitat units without sockeye salmon present, yet they exhibited diet contents comprised virtually entirely of sockeye salmon eggs. Thus, thermoregulatory movements by coho salmon were able to track an annually shifting mosaic of water temperature. Our results demonstrate how the spatial habitat heterogeneity and connectivity of intact floodplains can in turn buffer aquatic organisms from high levels of temporal variation in habitat conditions and resource abundance.","container-title":"Ecosystems","DOI":"10.1007/s10021-013-9693-9","ISSN":"1435-0629","issue":"8","journalAbbreviation":"Ecosystems","language":"en","page":"1429-1441","source":"Springer Link","title":"Going with the Flow: Spatial Distributions of Juvenile Coho Salmon Track an Annually Shifting Mosaic of Water Temperature","title-short":"Going with the Flow","volume":"16","author":[{"family":"Armstrong","given":"Jonathan B."},{"family":"Schindler","given":"Daniel E."}],"issued":{"date-parts":[["2013",12,1]]}}},{"id":171,"uris":["http://zotero.org/users/8421274/items/WD6RF39R"],"itemData":{"id":171,"type":"article-journal","abstract":"Seasonal variation in river water levels creates a shifting mosaic of habitat conditions associated with variables such as water temperature, chemistry and prey availability to consumers. Previous work has shown that fishes can exploit spatial variation in water temperature, but less is known about how they respond to shifts in the spatial arrangement of habitat conditions through time. Juvenile coho salmon (Oncorhynchus kisutch) are the numerically dominant fish species in many southwest Alaskan streams, which exhibit seasonal variation in water level and temperature due to changes in precipitation and snowmelt. We assessed the degree to which juvenile coho salmon exploit the associated shifting mosaic of water temperature by monitoring the spatial distribution of water temperatures and juvenile coho salmon in the lake-influenced reaches of a southwest Alaskan stream. We also monitored the diets of juvenile coho salmon relative to the spatial distribution of prey taxa. Juvenile coho salmon exhibited two scales of movement to track spatiotemporal variation in habitat conditions. First, over the course of 6 weeks, individuals moved among off-channel units, tracking shifts in the location of warm water habitat caused by receding water level. Second, individuals moved at diel time scales, foraging on benthic macroinvertebrates in the cold thalweg of the stream at night and then digesting prey in warmer off-channel habitats during the day. Seasonally asynchronous variation in water temperature among off-channel habitat units produced portfolio effects in habitat conditions, such that coho salmon had continual access to warm habitat for digestion despite its ephemeral availability at discrete locations. Our study demonstrates that behavioural thermoregulation by juvenile fishes can be important throughout the growing season and is not restricted to ephemeral events such as resource pulses or heat stress. Our results have implications for the conservation of highly connected, heterogeneous landscapes, and their ability to support economically and ecologically important species such as coho salmon.","container-title":"Freshwater Biology","DOI":"10.1111/fwb.12784","ISSN":"1365-2427","issue":"9","language":"en","note":"_eprint: https://onlinelibrary.wiley.com/doi/pdf/10.1111/fwb.12784","page":"1454-1465","source":"Wiley Online Library","title":"Juvenile coho salmon track a seasonally shifting thermal mosaic across a river floodplain","volume":"61","author":[{"family":"Baldock","given":"Jeffrey R."},{"family":"Armstrong","given":"Jonathan B."},{"family":"Schindler","given":"Daniel E."},{"family":"Carter","given":"Jackie L."}],"issued":{"date-parts":[["2016"]]}}}],"schema":"https://github.com/citation-style-language/schema/raw/master/csl-citation.json"} </w:instrText>
       </w:r>
       <w:r>
         <w:rPr>
@@ -553,7 +1184,7 @@
           <w:rFonts w:ascii="Garamond" w:hAnsi="Garamond"/>
           <w:noProof/>
         </w:rPr>
-        <w:t>(Cordoleani et al., 2024; Rahr et al., 2025)</w:t>
+        <w:t>(Armstrong &amp; Schindler, 2013; Baldock et al., 2016)</w:t>
       </w:r>
       <w:r>
         <w:rPr>
@@ -561,6 +1192,42 @@
         </w:rPr>
         <w:fldChar w:fldCharType="end"/>
       </w:r>
+      <w:r>
+        <w:rPr>
+          <w:rFonts w:ascii="Garamond" w:hAnsi="Garamond"/>
+        </w:rPr>
+        <w:t xml:space="preserve"> </w:t>
+      </w:r>
+      <w:r>
+        <w:rPr>
+          <w:rFonts w:ascii="Garamond" w:hAnsi="Garamond"/>
+        </w:rPr>
+        <w:t xml:space="preserve">and at the watershed scale in Alaska </w:t>
+      </w:r>
+      <w:r>
+        <w:rPr>
+          <w:rFonts w:ascii="Garamond" w:hAnsi="Garamond"/>
+        </w:rPr>
+        <w:t xml:space="preserve">at relatively short timescales (&lt; 3 years). However, the spatial ecology of Alaska’s largest salmon baring watersheds, the Yukon and Kuskokwim river-basins, are poorly understood, and it has not been explored to what extend this pattern plays out at much larger spatial scales or over longer temporal scales. </w:t>
+      </w:r>
+      <w:r>
+        <w:rPr>
+          <w:rFonts w:ascii="Garamond" w:hAnsi="Garamond"/>
+        </w:rPr>
+        <w:t xml:space="preserve">Here, we reconstruct spatiotemporal patterns of </w:t>
+      </w:r>
+      <w:r>
+        <w:rPr>
+          <w:rFonts w:ascii="Garamond" w:hAnsi="Garamond"/>
+        </w:rPr>
+        <w:t xml:space="preserve">natal origin habitat for Chinook salmon (sp.) in the Yukon and Kuskokwim river-basins using otolith microchemistry. In doing so, we explore the </w:t>
+      </w:r>
+      <w:r>
+        <w:rPr>
+          <w:rFonts w:ascii="Garamond" w:hAnsi="Garamond"/>
+        </w:rPr>
+        <w:t xml:space="preserve">natural spatial ecology of Chinook salmon in a pristine, free flowing watershed and explore the potential of a shifting habitat mosaic to produce variability in the spatial distribution of life histories and to buffer watershed production across this variability across the basin. </w:t>
+      </w:r>
     </w:p>
     <w:p>
       <w:pPr>
@@ -571,393 +1238,6 @@
           <w:rFonts w:ascii="Garamond" w:hAnsi="Garamond"/>
         </w:rPr>
       </w:pPr>
-      <w:r>
-        <w:rPr>
-          <w:rFonts w:ascii="Garamond" w:hAnsi="Garamond"/>
-        </w:rPr>
-        <w:t>Alaska watersheds,</w:t>
-      </w:r>
-      <w:r>
-        <w:rPr>
-          <w:rFonts w:ascii="Garamond" w:hAnsi="Garamond"/>
-        </w:rPr>
-        <w:t xml:space="preserve"> at the northernmost extent of the</w:t>
-      </w:r>
-      <w:r>
-        <w:rPr>
-          <w:rFonts w:ascii="Garamond" w:hAnsi="Garamond"/>
-        </w:rPr>
-        <w:t xml:space="preserve"> natural range of pacific</w:t>
-      </w:r>
-      <w:r>
-        <w:rPr>
-          <w:rFonts w:ascii="Garamond" w:hAnsi="Garamond"/>
-        </w:rPr>
-        <w:t xml:space="preserve"> salmon</w:t>
-      </w:r>
-      <w:r>
-        <w:rPr>
-          <w:rFonts w:ascii="Garamond" w:hAnsi="Garamond"/>
-        </w:rPr>
-        <w:t>,</w:t>
-      </w:r>
-      <w:r>
-        <w:rPr>
-          <w:rFonts w:ascii="Garamond" w:hAnsi="Garamond"/>
-        </w:rPr>
-        <w:t xml:space="preserve"> have experienced substantially</w:t>
-      </w:r>
-      <w:r>
-        <w:rPr>
-          <w:rFonts w:ascii="Garamond" w:hAnsi="Garamond"/>
-        </w:rPr>
-        <w:t xml:space="preserve"> </w:t>
-      </w:r>
-      <w:r>
-        <w:rPr>
-          <w:rFonts w:ascii="Garamond" w:hAnsi="Garamond"/>
-        </w:rPr>
-        <w:t xml:space="preserve">less anthropogenic </w:t>
-      </w:r>
-      <w:r>
-        <w:rPr>
-          <w:rFonts w:ascii="Garamond" w:hAnsi="Garamond"/>
-        </w:rPr>
-        <w:t xml:space="preserve">impacts to salmon ecosystems </w:t>
-      </w:r>
-      <w:r>
-        <w:rPr>
-          <w:rFonts w:ascii="Garamond" w:hAnsi="Garamond"/>
-        </w:rPr>
-        <w:t xml:space="preserve">than </w:t>
-      </w:r>
-      <w:r>
-        <w:rPr>
-          <w:rFonts w:ascii="Garamond" w:hAnsi="Garamond"/>
-        </w:rPr>
-        <w:t xml:space="preserve">those </w:t>
-      </w:r>
-      <w:r>
-        <w:rPr>
-          <w:rFonts w:ascii="Garamond" w:hAnsi="Garamond"/>
-        </w:rPr>
-        <w:t>in the Pacific Northwest</w:t>
-      </w:r>
-      <w:r>
-        <w:rPr>
-          <w:rFonts w:ascii="Garamond" w:hAnsi="Garamond"/>
-        </w:rPr>
-        <w:t xml:space="preserve"> and California</w:t>
-      </w:r>
-      <w:r>
-        <w:rPr>
-          <w:rFonts w:ascii="Garamond" w:hAnsi="Garamond"/>
-        </w:rPr>
-        <w:t xml:space="preserve"> </w:t>
-      </w:r>
-      <w:r>
-        <w:rPr>
-          <w:rFonts w:ascii="Garamond" w:hAnsi="Garamond"/>
-        </w:rPr>
-        <w:fldChar w:fldCharType="begin"/>
-      </w:r>
-      <w:r>
-        <w:rPr>
-          <w:rFonts w:ascii="Garamond" w:hAnsi="Garamond"/>
-        </w:rPr>
-        <w:instrText xml:space="preserve"> ADDIN ZOTERO_ITEM CSL_CITATION {"citationID":"xRsa1svq","properties":{"formattedCitation":"(Schoen et al., 2017; Williams, 2006; Yoshiyama et al., 1998)","plainCitation":"(Schoen et al., 2017; Williams, 2006; Yoshiyama et al., 1998)","noteIndex":0},"citationItems":[{"id":6051,"uris":["http://zotero.org/users/8421274/items/UPNXXHTQ"],"itemData":{"id":6051,"type":"article-journal","abstract":"Pacific salmon Oncorhynchus spp. face serious challenges from climate and landscape change, particularly in the southern portion of their native range. Conversely, climate warming appears to be allowing salmon to expand northwards into the Arctic. Between these geographic extremes, in the Gulf of Alaska region, salmon are at historically high abundances but face an uncertain future due to rapid environmental change. We examined changes in climate, hydrology, land cover, salmon populations, and fisheries over the past 30–70 years in this region. We focused on the Kenai River, which supports world-famous fisheries but where Chinook Salmon O. tshawytscha populations have declined, raising concerns about their future resilience. The region is warming and experiencing drier summers and wetter autumns. The landscape is also changing, with melting glaciers, wetland loss, wildfires, and human development. This environmental transformation will likely harm some salmon populations while benefiting others. Lowland salmon streams are especially vulnerable, but retreating glaciers may allow production gains in other streams. Some fishing communities harvest a diverse portfolio of fluctuating resources, whereas others have specialized over time, potentially limiting their resilience. Maintaining diverse habitats and salmon runs may allow ecosystems and fisheries to continue to thrive amidst these changes.","container-title":"Fisheries","DOI":"10.1080/03632415.2017.1374251","ISSN":"0363-2415","issue":"10","note":"publisher: Taylor &amp; Francis\n_eprint: https://doi.org/10.1080/03632415.2017.1374251","page":"538-553","source":"Taylor and Francis+NEJM","title":"Future of Pacific Salmon in the Face of Environmental Change: Lessons from One of the World's Remaining Productive Salmon Regions","title-short":"Future of Pacific Salmon in the Face of Environmental Change","volume":"42","author":[{"family":"Schoen","given":"Erik R."},{"family":"Wipfli","given":"Mark S."},{"family":"Trammell","given":"E. Jamie"},{"family":"Rinella","given":"Daniel J."},{"family":"Floyd","given":"Angelica L."},{"family":"Grunblatt","given":"Jess"},{"family":"McCarthy","given":"Molly D."},{"family":"Meyer","given":"Benjamin E."},{"family":"Morton","given":"John M."},{"family":"Powell","given":"James E."},{"family":"Prakash","given":"Anupma"},{"family":"Reimer","given":"Matthew N."},{"family":"Stuefer","given":"Svetlana L."},{"family":"Toniolo","given":"Horacio"},{"family":"Wells","given":"Brett M."},{"family":"Witmer","given":"Frank D. W."}],"issued":{"date-parts":[["2017",10,3]]}}},{"id":6057,"uris":["http://zotero.org/users/8421274/items/MWDVQVR3"],"itemData":{"id":6057,"type":"article-journal","abstract":"This monograph presents an extensive review of the biology and management of Chinook salmon and steelhead in the Central Valley of California. Relevant data and publications on these populations are summarized and discussed in the context of the wider professional literature, with emphasis on the importance of evolutionary considerations in the assessment of populations and in their management, the need to manage populations together with their environments, and the contradiction between maintaining a major hatchery program to support a mixed-stock ocean fishery and trying to maintain or restore populations adapted to natural or semi-natural habitats. Recommendations are presented for management and monitoring—for example for a thorough review of hatchery operations, for more emphasis on monitoring individual-based factors such the physiological condition and growth rates of juveniles, and for simulation of major restoration actions and monitoring programs. The 17 chapters cover major conceptsin salmon biology and conceptual foundations for management, and Central Valley Chinook and steelhead populations and their habitat, growth and migration, habitat use, harvest, hatcheries, modeling, monitoring, and management.","container-title":"San Francisco Estuary and Watershed Science","DOI":"10.15447/sfews.2006v4iss3art2","issue":"3","language":"en","source":"escholarship.org","title":"Central Valley Salmon: A Perspective on Chinook and Steelhead in the Central Valley of California","title-short":"Central Valley Salmon","URL":"https://escholarship.org/uc/item/21v9x1t7","volume":"4","author":[{"family":"Williams","given":"John G."}],"accessed":{"date-parts":[["2026",1,5]]},"issued":{"date-parts":[["2006"]]}}},{"id":5348,"uris":["http://zotero.org/users/8421274/items/VU4C5NC2"],"itemData":{"id":5348,"type":"article-journal","abstract":"The Central Valley drainage of California formerly produced immense numbers of chinook salmon Oncorhynchus tshawytscha. Four seasonal runs occur in this system—fall, late</w:instrText>
-      </w:r>
-      <w:r>
-        <w:rPr>
-          <w:rFonts w:ascii="Cambria Math" w:hAnsi="Cambria Math" w:cs="Cambria Math"/>
-        </w:rPr>
-        <w:instrText>‐</w:instrText>
-      </w:r>
-      <w:r>
-        <w:rPr>
-          <w:rFonts w:ascii="Garamond" w:hAnsi="Garamond"/>
-        </w:rPr>
-        <w:instrText>fall, winter, and spring runs. Differences in life history timing and spatial distribution enabled the four runs to use the drainage to the fullest possible extent and once made it one of the richest regions in the world for chinook salmon production. Native American fishers within the Central Valley drainage harvested chinook salmon at estimated levels that reached 8.5 million pounds or more annually. Native harvests, therefore, were roughly comparable to the peak commercial harvests taken later by Euro</w:instrText>
-      </w:r>
-      <w:r>
-        <w:rPr>
-          <w:rFonts w:ascii="Cambria Math" w:hAnsi="Cambria Math" w:cs="Cambria Math"/>
-        </w:rPr>
-        <w:instrText>‐</w:instrText>
-      </w:r>
-      <w:r>
-        <w:rPr>
-          <w:rFonts w:ascii="Garamond" w:hAnsi="Garamond"/>
-        </w:rPr>
-        <w:instrText>American fishers, but whether or not native fishing depressed the productive capacities of the salmon populations to any substantial degree is not known. The commercial chinook salmon fishery in California started about 1850 in the San Francisco Bay and Sacramento–San Joaquin Delta region, where it formed the nucleus of the first major fishery conducted by Euro</w:instrText>
-      </w:r>
-      <w:r>
-        <w:rPr>
-          <w:rFonts w:ascii="Cambria Math" w:hAnsi="Cambria Math" w:cs="Cambria Math"/>
-        </w:rPr>
-        <w:instrText>‐</w:instrText>
-      </w:r>
-      <w:r>
-        <w:rPr>
-          <w:rFonts w:ascii="Garamond" w:hAnsi="Garamond"/>
-        </w:rPr>
-        <w:instrText>American immigrants in the state. This fishery was one of the important early industries that supported the Euro</w:instrText>
-      </w:r>
-      <w:r>
-        <w:rPr>
-          <w:rFonts w:ascii="Cambria Math" w:hAnsi="Cambria Math" w:cs="Cambria Math"/>
-        </w:rPr>
-        <w:instrText>‐</w:instrText>
-      </w:r>
-      <w:r>
-        <w:rPr>
-          <w:rFonts w:ascii="Garamond" w:hAnsi="Garamond"/>
-        </w:rPr>
-        <w:instrText>American settlement of the Central Valley region. The salmon fishery remained centered there until the early 1900s, when ocean salmon fishing began to expand and eventually came to dominate the fishery. Annual catches by the early Sacramento–San Joaquin in</w:instrText>
-      </w:r>
-      <w:r>
-        <w:rPr>
-          <w:rFonts w:ascii="Cambria Math" w:hAnsi="Cambria Math" w:cs="Cambria Math"/>
-        </w:rPr>
-        <w:instrText>‐</w:instrText>
-      </w:r>
-      <w:r>
-        <w:rPr>
-          <w:rFonts w:ascii="Garamond" w:hAnsi="Garamond"/>
-        </w:rPr>
-        <w:instrText>river fishery commonly reached 4–10 million pounds and generally were higher than the total statewide catches made during the most recent several decades. The historical abundances of Central Valley chinook salmon before large</w:instrText>
-      </w:r>
-      <w:r>
-        <w:rPr>
-          <w:rFonts w:ascii="Cambria Math" w:hAnsi="Cambria Math" w:cs="Cambria Math"/>
-        </w:rPr>
-        <w:instrText>‐</w:instrText>
-      </w:r>
-      <w:r>
-        <w:rPr>
-          <w:rFonts w:ascii="Garamond" w:hAnsi="Garamond"/>
-        </w:rPr>
-        <w:instrText>scale commercial exploitation and depletion of the runs cannot be determined with certainty. However, on the basis of early commercial catch records, the maximal production levels of the Central Valley chinook salmon stocks in aggregate may be conservatively estimated to have reached approximately 1–2 million spawners annually. Although substantial investment has been made by the state of California in managing the chinook salmon resource since the early years of the commercial fishery, chinook salmon have declined over the decades to small fractions of their previous numbers. The decline of the Central Valley chinook salmon resource was caused by several factors: overfishing, blockage and degradation of streams by mining activities, and reduction of salmon habitat and streamflows by dams and water diversions. Differences between the four chinook salmon runs in life history timing and habitat requirements partly account for their different population histories; the winter run is now threatened with extinction, the spring run recently has approached a similarly imperiled state, and the late</w:instrText>
-      </w:r>
-      <w:r>
-        <w:rPr>
-          <w:rFonts w:ascii="Cambria Math" w:hAnsi="Cambria Math" w:cs="Cambria Math"/>
-        </w:rPr>
-        <w:instrText>‐</w:instrText>
-      </w:r>
-      <w:r>
-        <w:rPr>
-          <w:rFonts w:ascii="Garamond" w:hAnsi="Garamond"/>
-        </w:rPr>
-        <w:instrText>fall run has been at moderately low population levels for the past two decades. Only the fall run, in aggregate, can be regarded as secure, but it too has undergone substantial reductions in abundance. Fall</w:instrText>
-      </w:r>
-      <w:r>
-        <w:rPr>
-          <w:rFonts w:ascii="Cambria Math" w:hAnsi="Cambria Math" w:cs="Cambria Math"/>
-        </w:rPr>
-        <w:instrText>‐</w:instrText>
-      </w:r>
-      <w:r>
-        <w:rPr>
-          <w:rFonts w:ascii="Garamond" w:hAnsi="Garamond"/>
-        </w:rPr>
-        <w:instrText xml:space="preserve">run spawner numbers were especially low in the San Joaquin River basin in recent years, and in Sacramento River basin streams their numbers have been heavily influenced by production of hatchery fish.","container-title":"North American Journal of Fisheries Management","DOI":"10.1577/1548-8675(1998)018&lt;0487:HAADOC&gt;2.0.CO;2","ISSN":"0275-5947","issue":"3","journalAbbreviation":"North American Journal of Fisheries Management","page":"487-521","source":"Silverchair","title":"Historical Abundance and Decline of Chinook Salmon in the Central Valley Region of California","volume":"18","author":[{"family":"Yoshiyama","given":"Ronald M."},{"family":"Fisher","given":"Frank W."},{"family":"Moyle","given":"Peter B."}],"issued":{"date-parts":[["1998",8,1]]}}}],"schema":"https://github.com/citation-style-language/schema/raw/master/csl-citation.json"} </w:instrText>
-      </w:r>
-      <w:r>
-        <w:rPr>
-          <w:rFonts w:ascii="Garamond" w:hAnsi="Garamond"/>
-        </w:rPr>
-        <w:fldChar w:fldCharType="separate"/>
-      </w:r>
-      <w:r>
-        <w:rPr>
-          <w:rFonts w:ascii="Garamond" w:hAnsi="Garamond"/>
-          <w:noProof/>
-        </w:rPr>
-        <w:t>(Schoen et al., 2017; Williams, 2006; Yoshiyama et al., 1998)</w:t>
-      </w:r>
-      <w:r>
-        <w:rPr>
-          <w:rFonts w:ascii="Garamond" w:hAnsi="Garamond"/>
-        </w:rPr>
-        <w:fldChar w:fldCharType="end"/>
-      </w:r>
-      <w:r>
-        <w:rPr>
-          <w:rFonts w:ascii="Garamond" w:hAnsi="Garamond"/>
-        </w:rPr>
-        <w:t xml:space="preserve">. </w:t>
-      </w:r>
-      <w:r>
-        <w:rPr>
-          <w:rFonts w:ascii="Garamond" w:hAnsi="Garamond"/>
-        </w:rPr>
-        <w:t xml:space="preserve">Large, relatively free-flowing watersheds in Alaska support the largest remaining </w:t>
-      </w:r>
-      <w:r>
-        <w:rPr>
-          <w:rFonts w:ascii="Garamond" w:hAnsi="Garamond"/>
-        </w:rPr>
-        <w:t xml:space="preserve">pacific salmon populations </w:t>
-      </w:r>
-      <w:r>
-        <w:rPr>
-          <w:rFonts w:ascii="Garamond" w:hAnsi="Garamond"/>
-        </w:rPr>
-        <w:t>and contain some of the last remaining pristine habitats</w:t>
-      </w:r>
-      <w:r>
-        <w:rPr>
-          <w:rFonts w:ascii="Garamond" w:hAnsi="Garamond"/>
-        </w:rPr>
-        <w:t xml:space="preserve">, which are </w:t>
-      </w:r>
-      <w:r>
-        <w:rPr>
-          <w:rFonts w:ascii="Garamond" w:hAnsi="Garamond"/>
-        </w:rPr>
-        <w:t xml:space="preserve">expected to </w:t>
-      </w:r>
-      <w:r>
-        <w:rPr>
-          <w:rFonts w:ascii="Garamond" w:hAnsi="Garamond"/>
-        </w:rPr>
-        <w:t xml:space="preserve">function in ways that </w:t>
-      </w:r>
-      <w:r>
-        <w:rPr>
-          <w:rFonts w:ascii="Garamond" w:hAnsi="Garamond"/>
-        </w:rPr>
-        <w:t xml:space="preserve">more closely </w:t>
-      </w:r>
-      <w:r>
-        <w:rPr>
-          <w:rFonts w:ascii="Garamond" w:hAnsi="Garamond"/>
-        </w:rPr>
-        <w:t xml:space="preserve">reflect the natural ecological processes of healthy </w:t>
-      </w:r>
-      <w:r>
-        <w:rPr>
-          <w:rFonts w:ascii="Garamond" w:hAnsi="Garamond"/>
-        </w:rPr>
-        <w:t>populations</w:t>
-      </w:r>
-      <w:r>
-        <w:rPr>
-          <w:rFonts w:ascii="Garamond" w:hAnsi="Garamond"/>
-        </w:rPr>
-        <w:t xml:space="preserve"> </w:t>
-      </w:r>
-      <w:r>
-        <w:rPr>
-          <w:rFonts w:ascii="Garamond" w:hAnsi="Garamond"/>
-        </w:rPr>
-        <w:fldChar w:fldCharType="begin"/>
-      </w:r>
-      <w:r>
-        <w:rPr>
-          <w:rFonts w:ascii="Garamond" w:hAnsi="Garamond"/>
-        </w:rPr>
-        <w:instrText xml:space="preserve"> ADDIN ZOTERO_ITEM CSL_CITATION {"citationID":"OBNj6FQs","properties":{"formattedCitation":"(Schoen et al., 2017)","plainCitation":"(Schoen et al., 2017)","noteIndex":0},"citationItems":[{"id":6051,"uris":["http://zotero.org/users/8421274/items/UPNXXHTQ"],"itemData":{"id":6051,"type":"article-journal","abstract":"Pacific salmon Oncorhynchus spp. face serious challenges from climate and landscape change, particularly in the southern portion of their native range. Conversely, climate warming appears to be allowing salmon to expand northwards into the Arctic. Between these geographic extremes, in the Gulf of Alaska region, salmon are at historically high abundances but face an uncertain future due to rapid environmental change. We examined changes in climate, hydrology, land cover, salmon populations, and fisheries over the past 30–70 years in this region. We focused on the Kenai River, which supports world-famous fisheries but where Chinook Salmon O. tshawytscha populations have declined, raising concerns about their future resilience. The region is warming and experiencing drier summers and wetter autumns. The landscape is also changing, with melting glaciers, wetland loss, wildfires, and human development. This environmental transformation will likely harm some salmon populations while benefiting others. Lowland salmon streams are especially vulnerable, but retreating glaciers may allow production gains in other streams. Some fishing communities harvest a diverse portfolio of fluctuating resources, whereas others have specialized over time, potentially limiting their resilience. Maintaining diverse habitats and salmon runs may allow ecosystems and fisheries to continue to thrive amidst these changes.","container-title":"Fisheries","DOI":"10.1080/03632415.2017.1374251","ISSN":"0363-2415","issue":"10","note":"publisher: Taylor &amp; Francis\n_eprint: https://doi.org/10.1080/03632415.2017.1374251","page":"538-553","source":"Taylor and Francis+NEJM","title":"Future of Pacific Salmon in the Face of Environmental Change: Lessons from One of the World's Remaining Productive Salmon Regions","title-short":"Future of Pacific Salmon in the Face of Environmental Change","volume":"42","author":[{"family":"Schoen","given":"Erik R."},{"family":"Wipfli","given":"Mark S."},{"family":"Trammell","given":"E. Jamie"},{"family":"Rinella","given":"Daniel J."},{"family":"Floyd","given":"Angelica L."},{"family":"Grunblatt","given":"Jess"},{"family":"McCarthy","given":"Molly D."},{"family":"Meyer","given":"Benjamin E."},{"family":"Morton","given":"John M."},{"family":"Powell","given":"James E."},{"family":"Prakash","given":"Anupma"},{"family":"Reimer","given":"Matthew N."},{"family":"Stuefer","given":"Svetlana L."},{"family":"Toniolo","given":"Horacio"},{"family":"Wells","given":"Brett M."},{"family":"Witmer","given":"Frank D. W."}],"issued":{"date-parts":[["2017",10,3]]}}}],"schema":"https://github.com/citation-style-language/schema/raw/master/csl-citation.json"} </w:instrText>
-      </w:r>
-      <w:r>
-        <w:rPr>
-          <w:rFonts w:ascii="Garamond" w:hAnsi="Garamond"/>
-        </w:rPr>
-        <w:fldChar w:fldCharType="separate"/>
-      </w:r>
-      <w:r>
-        <w:rPr>
-          <w:rFonts w:ascii="Garamond" w:hAnsi="Garamond"/>
-          <w:noProof/>
-        </w:rPr>
-        <w:t>(Schoen et al., 2017)</w:t>
-      </w:r>
-      <w:r>
-        <w:rPr>
-          <w:rFonts w:ascii="Garamond" w:hAnsi="Garamond"/>
-        </w:rPr>
-        <w:fldChar w:fldCharType="end"/>
-      </w:r>
-      <w:r>
-        <w:rPr>
-          <w:rFonts w:ascii="Garamond" w:hAnsi="Garamond"/>
-        </w:rPr>
-        <w:t>.</w:t>
-      </w:r>
-      <w:r>
-        <w:rPr>
-          <w:rFonts w:ascii="Garamond" w:hAnsi="Garamond"/>
-        </w:rPr>
-        <w:t>These systems therefore offer a</w:t>
-      </w:r>
-      <w:r>
-        <w:rPr>
-          <w:rFonts w:ascii="Garamond" w:hAnsi="Garamond"/>
-        </w:rPr>
-        <w:t xml:space="preserve">n </w:t>
-      </w:r>
-      <w:r>
-        <w:rPr>
-          <w:rFonts w:ascii="Garamond" w:hAnsi="Garamond"/>
-        </w:rPr>
-        <w:t xml:space="preserve">opportunity to </w:t>
-      </w:r>
-      <w:r>
-        <w:rPr>
-          <w:rFonts w:ascii="Garamond" w:hAnsi="Garamond"/>
-        </w:rPr>
-        <w:t xml:space="preserve">explore the ecological processes which </w:t>
-      </w:r>
-      <w:r>
-        <w:rPr>
-          <w:rFonts w:ascii="Garamond" w:hAnsi="Garamond"/>
-        </w:rPr>
-        <w:lastRenderedPageBreak/>
-        <w:t xml:space="preserve">govern </w:t>
-      </w:r>
-      <w:r>
-        <w:rPr>
-          <w:rFonts w:ascii="Garamond" w:hAnsi="Garamond"/>
-        </w:rPr>
-        <w:t>wil</w:t>
-      </w:r>
-      <w:r>
-        <w:rPr>
-          <w:rFonts w:ascii="Garamond" w:hAnsi="Garamond"/>
-        </w:rPr>
-        <w:t>d salmon populations</w:t>
-      </w:r>
-      <w:r>
-        <w:rPr>
-          <w:rFonts w:ascii="Garamond" w:hAnsi="Garamond"/>
-        </w:rPr>
-        <w:t xml:space="preserve">, </w:t>
-      </w:r>
-      <w:r>
-        <w:rPr>
-          <w:rFonts w:ascii="Garamond" w:hAnsi="Garamond"/>
-        </w:rPr>
-        <w:t xml:space="preserve">which may </w:t>
-      </w:r>
-      <w:r>
-        <w:rPr>
-          <w:rFonts w:ascii="Garamond" w:hAnsi="Garamond"/>
-        </w:rPr>
-        <w:t>provide</w:t>
-      </w:r>
-      <w:r>
-        <w:rPr>
-          <w:rFonts w:ascii="Garamond" w:hAnsi="Garamond"/>
-        </w:rPr>
-        <w:t xml:space="preserve"> a baseline for restoring impacted watersheds</w:t>
-      </w:r>
-      <w:r>
-        <w:rPr>
-          <w:rFonts w:ascii="Garamond" w:hAnsi="Garamond"/>
-        </w:rPr>
-        <w:t xml:space="preserve"> elsewhere. </w:t>
-      </w:r>
     </w:p>
     <w:p>
       <w:pPr>
@@ -968,437 +1248,12 @@
           <w:rFonts w:ascii="Garamond" w:hAnsi="Garamond"/>
         </w:rPr>
       </w:pPr>
-      <w:r>
-        <w:rPr>
-          <w:rFonts w:ascii="Garamond" w:hAnsi="Garamond"/>
-        </w:rPr>
-        <w:t xml:space="preserve">In recent years, </w:t>
-      </w:r>
-      <w:r>
-        <w:rPr>
-          <w:rFonts w:ascii="Garamond" w:hAnsi="Garamond"/>
-        </w:rPr>
-        <w:t xml:space="preserve">the role of </w:t>
-      </w:r>
-      <w:r>
-        <w:rPr>
-          <w:rFonts w:ascii="Garamond" w:hAnsi="Garamond"/>
-        </w:rPr>
-        <w:t xml:space="preserve">landscape heterogeneity and </w:t>
-      </w:r>
-      <w:r>
-        <w:rPr>
-          <w:rFonts w:ascii="Garamond" w:hAnsi="Garamond"/>
-        </w:rPr>
-        <w:t xml:space="preserve">hydrological </w:t>
-      </w:r>
-      <w:r>
-        <w:rPr>
-          <w:rFonts w:ascii="Garamond" w:hAnsi="Garamond"/>
-        </w:rPr>
-        <w:t xml:space="preserve">connectivity have emerged as key factors underlying the </w:t>
-      </w:r>
-      <w:proofErr w:type="gramStart"/>
-      <w:r>
-        <w:rPr>
-          <w:rFonts w:ascii="Garamond" w:hAnsi="Garamond"/>
-        </w:rPr>
-        <w:t>long term</w:t>
-      </w:r>
-      <w:proofErr w:type="gramEnd"/>
-      <w:r>
-        <w:rPr>
-          <w:rFonts w:ascii="Garamond" w:hAnsi="Garamond"/>
-        </w:rPr>
-        <w:t xml:space="preserve"> </w:t>
-      </w:r>
-      <w:r>
-        <w:rPr>
-          <w:rFonts w:ascii="Garamond" w:hAnsi="Garamond"/>
-        </w:rPr>
-        <w:t xml:space="preserve">stability of salmon </w:t>
-      </w:r>
-      <w:r>
-        <w:rPr>
-          <w:rFonts w:ascii="Garamond" w:hAnsi="Garamond"/>
-        </w:rPr>
-        <w:t xml:space="preserve">in freshwater ecosystems. In </w:t>
-      </w:r>
-      <w:proofErr w:type="spellStart"/>
-      <w:r>
-        <w:rPr>
-          <w:rFonts w:ascii="Garamond" w:hAnsi="Garamond"/>
-        </w:rPr>
-        <w:t>well functioning</w:t>
-      </w:r>
-      <w:proofErr w:type="spellEnd"/>
-      <w:r>
-        <w:rPr>
-          <w:rFonts w:ascii="Garamond" w:hAnsi="Garamond"/>
-        </w:rPr>
-        <w:t xml:space="preserve"> systems processed which generate landscape </w:t>
-      </w:r>
-      <w:r>
-        <w:rPr>
-          <w:rFonts w:ascii="Garamond" w:hAnsi="Garamond"/>
-        </w:rPr>
-        <w:t>heterogeneity (</w:t>
-      </w:r>
-      <w:r>
-        <w:rPr>
-          <w:rFonts w:ascii="Garamond" w:hAnsi="Garamond"/>
-        </w:rPr>
-        <w:t xml:space="preserve">e.g. </w:t>
-      </w:r>
-      <w:r>
-        <w:rPr>
-          <w:rFonts w:ascii="Garamond" w:hAnsi="Garamond"/>
-        </w:rPr>
-        <w:t>G</w:t>
-      </w:r>
-      <w:r>
-        <w:rPr>
-          <w:rFonts w:ascii="Garamond" w:hAnsi="Garamond"/>
-        </w:rPr>
-        <w:t>eomorphological and successional processes</w:t>
-      </w:r>
-      <w:r>
-        <w:rPr>
-          <w:rFonts w:ascii="Garamond" w:hAnsi="Garamond"/>
-        </w:rPr>
-        <w:t>)</w:t>
-      </w:r>
-      <w:r>
-        <w:rPr>
-          <w:rFonts w:ascii="Garamond" w:hAnsi="Garamond"/>
-        </w:rPr>
-        <w:t xml:space="preserve"> </w:t>
-      </w:r>
-      <w:r>
-        <w:rPr>
-          <w:rFonts w:ascii="Garamond" w:hAnsi="Garamond"/>
-        </w:rPr>
-        <w:t xml:space="preserve">operate at several spatial and temporal scales to </w:t>
-      </w:r>
-      <w:r>
-        <w:rPr>
-          <w:rFonts w:ascii="Garamond" w:hAnsi="Garamond"/>
-        </w:rPr>
-        <w:t xml:space="preserve">generate </w:t>
-      </w:r>
-      <w:r>
-        <w:rPr>
-          <w:rFonts w:ascii="Garamond" w:hAnsi="Garamond"/>
-        </w:rPr>
-        <w:t xml:space="preserve">a </w:t>
-      </w:r>
-      <w:proofErr w:type="gramStart"/>
-      <w:r>
-        <w:rPr>
-          <w:rFonts w:ascii="Garamond" w:hAnsi="Garamond"/>
-        </w:rPr>
-        <w:t xml:space="preserve">variable </w:t>
-      </w:r>
-      <w:r>
-        <w:rPr>
-          <w:rFonts w:ascii="Garamond" w:hAnsi="Garamond"/>
-        </w:rPr>
-        <w:t>biophysical conditions</w:t>
-      </w:r>
-      <w:proofErr w:type="gramEnd"/>
-      <w:r>
-        <w:rPr>
-          <w:rFonts w:ascii="Garamond" w:hAnsi="Garamond"/>
-        </w:rPr>
-        <w:t xml:space="preserve"> (e.g., variation in hydrology, temperature, and depth) across multiple spatial scales</w:t>
-      </w:r>
-      <w:r>
-        <w:rPr>
-          <w:rFonts w:ascii="Garamond" w:hAnsi="Garamond"/>
-        </w:rPr>
-        <w:t xml:space="preserve">. </w:t>
-      </w:r>
     </w:p>
     <w:p>
       <w:pPr>
         <w:pStyle w:val="font-claude-response-body"/>
         <w:spacing w:line="360" w:lineRule="auto"/>
         <w:ind w:firstLine="360"/>
-        <w:rPr>
-          <w:rFonts w:ascii="Garamond" w:hAnsi="Garamond"/>
-        </w:rPr>
-      </w:pPr>
-    </w:p>
-    <w:p>
-      <w:pPr>
-        <w:pStyle w:val="font-claude-response-body"/>
-        <w:spacing w:line="360" w:lineRule="auto"/>
-        <w:ind w:firstLine="360"/>
-      </w:pPr>
-      <w:r>
-        <w:rPr>
-          <w:rFonts w:ascii="Garamond" w:hAnsi="Garamond"/>
-        </w:rPr>
-        <w:t xml:space="preserve">These local conditions differentially filter the prevailing local environmental conditions </w:t>
-      </w:r>
-      <w:r>
-        <w:rPr>
-          <w:rFonts w:ascii="Garamond" w:hAnsi="Garamond"/>
-        </w:rPr>
-        <w:t>(e.g., precipitation, temperature)</w:t>
-      </w:r>
-      <w:r>
-        <w:rPr>
-          <w:rFonts w:ascii="Garamond" w:hAnsi="Garamond"/>
-        </w:rPr>
-        <w:t xml:space="preserve"> to </w:t>
-      </w:r>
-      <w:r>
-        <w:rPr>
-          <w:rFonts w:ascii="Garamond" w:hAnsi="Garamond"/>
-        </w:rPr>
-        <w:t>produc</w:t>
-      </w:r>
-      <w:r>
-        <w:rPr>
-          <w:rFonts w:ascii="Garamond" w:hAnsi="Garamond"/>
-        </w:rPr>
-        <w:t>e</w:t>
-      </w:r>
-      <w:r>
-        <w:rPr>
-          <w:rFonts w:ascii="Garamond" w:hAnsi="Garamond"/>
-        </w:rPr>
-        <w:t xml:space="preserve"> a </w:t>
-      </w:r>
-      <w:r>
-        <w:rPr>
-          <w:rFonts w:ascii="Garamond" w:hAnsi="Garamond"/>
-        </w:rPr>
-        <w:t xml:space="preserve">continuum </w:t>
-      </w:r>
-      <w:r>
-        <w:rPr>
-          <w:rFonts w:ascii="Garamond" w:hAnsi="Garamond"/>
-        </w:rPr>
-        <w:t>of habitat types</w:t>
-      </w:r>
-      <w:r>
-        <w:rPr>
-          <w:rFonts w:ascii="Garamond" w:hAnsi="Garamond"/>
-        </w:rPr>
-        <w:t xml:space="preserve"> </w:t>
-      </w:r>
-      <w:r>
-        <w:rPr>
-          <w:rFonts w:ascii="Garamond" w:hAnsi="Garamond"/>
-        </w:rPr>
-        <w:t>throughout the basin.</w:t>
-      </w:r>
-      <w:r>
-        <w:rPr>
-          <w:rFonts w:ascii="Garamond" w:hAnsi="Garamond"/>
-        </w:rPr>
-        <w:t xml:space="preserve"> </w:t>
-      </w:r>
-    </w:p>
-    <w:p>
-      <w:pPr>
-        <w:pStyle w:val="font-claude-response-body"/>
-        <w:spacing w:line="360" w:lineRule="auto"/>
-        <w:ind w:firstLine="360"/>
-        <w:rPr>
-          <w:rFonts w:ascii="Garamond" w:hAnsi="Garamond"/>
-        </w:rPr>
-      </w:pPr>
-    </w:p>
-    <w:p>
-      <w:pPr>
-        <w:pStyle w:val="font-claude-response-body"/>
-        <w:spacing w:line="360" w:lineRule="auto"/>
-        <w:ind w:firstLine="360"/>
-        <w:rPr>
-          <w:rFonts w:ascii="Garamond" w:hAnsi="Garamond"/>
-        </w:rPr>
-      </w:pPr>
-    </w:p>
-    <w:p>
-      <w:pPr>
-        <w:pStyle w:val="font-claude-response-body"/>
-        <w:spacing w:line="360" w:lineRule="auto"/>
-        <w:ind w:firstLine="360"/>
-        <w:rPr>
-          <w:rFonts w:ascii="Garamond" w:hAnsi="Garamond"/>
-        </w:rPr>
-      </w:pPr>
-      <w:r>
-        <w:rPr>
-          <w:rFonts w:ascii="Garamond" w:hAnsi="Garamond"/>
-        </w:rPr>
-        <w:t>T</w:t>
-      </w:r>
-      <w:r>
-        <w:rPr>
-          <w:rFonts w:ascii="Garamond" w:hAnsi="Garamond"/>
-        </w:rPr>
-        <w:t>he dynamic interplay between environmental conditions and landscape features</w:t>
-      </w:r>
-      <w:r>
-        <w:rPr>
-          <w:rFonts w:ascii="Garamond" w:hAnsi="Garamond"/>
-        </w:rPr>
-        <w:t xml:space="preserve"> over time</w:t>
-      </w:r>
-      <w:r>
-        <w:rPr>
-          <w:rFonts w:ascii="Garamond" w:hAnsi="Garamond"/>
-        </w:rPr>
-        <w:t xml:space="preserve"> produces a</w:t>
-      </w:r>
-      <w:r>
-        <w:rPr>
-          <w:rFonts w:ascii="Garamond" w:hAnsi="Garamond"/>
-        </w:rPr>
-        <w:t xml:space="preserve"> shifting</w:t>
-      </w:r>
-      <w:r>
-        <w:rPr>
-          <w:rStyle w:val="Emphasis"/>
-          <w:rFonts w:ascii="Garamond" w:eastAsiaTheme="majorEastAsia" w:hAnsi="Garamond"/>
-        </w:rPr>
-        <w:t xml:space="preserve"> </w:t>
-      </w:r>
-      <w:r>
-        <w:rPr>
-          <w:rStyle w:val="Emphasis"/>
-          <w:rFonts w:ascii="Garamond" w:eastAsiaTheme="majorEastAsia" w:hAnsi="Garamond"/>
-          <w:i w:val="0"/>
-          <w:iCs w:val="0"/>
-        </w:rPr>
-        <w:t>mosaic</w:t>
-      </w:r>
-      <w:r>
-        <w:rPr>
-          <w:rFonts w:ascii="Garamond" w:hAnsi="Garamond"/>
-        </w:rPr>
-        <w:t xml:space="preserve"> of </w:t>
-      </w:r>
-      <w:r>
-        <w:rPr>
-          <w:rFonts w:ascii="Garamond" w:hAnsi="Garamond"/>
-        </w:rPr>
-        <w:t xml:space="preserve">habitat types </w:t>
-      </w:r>
-      <w:r>
-        <w:rPr>
-          <w:rFonts w:ascii="Garamond" w:hAnsi="Garamond"/>
-        </w:rPr>
-        <w:t xml:space="preserve">across </w:t>
-      </w:r>
-      <w:r>
-        <w:rPr>
-          <w:rFonts w:ascii="Garamond" w:hAnsi="Garamond"/>
-        </w:rPr>
-        <w:t xml:space="preserve">the watershed which </w:t>
-      </w:r>
-      <w:r>
-        <w:rPr>
-          <w:rFonts w:ascii="Garamond" w:hAnsi="Garamond"/>
-        </w:rPr>
-        <w:t xml:space="preserve">differ in </w:t>
-      </w:r>
-      <w:r>
-        <w:rPr>
-          <w:rFonts w:ascii="Garamond" w:hAnsi="Garamond"/>
-        </w:rPr>
-        <w:t>suitability a</w:t>
-      </w:r>
-      <w:r>
-        <w:rPr>
-          <w:rFonts w:ascii="Garamond" w:hAnsi="Garamond"/>
-        </w:rPr>
-        <w:t xml:space="preserve">nd spatial arrangement and are continually reorganized across multiple spatial and temporal scales. </w:t>
-      </w:r>
-      <w:r>
-        <w:rPr>
-          <w:rFonts w:ascii="Garamond" w:hAnsi="Garamond"/>
-        </w:rPr>
-        <w:t xml:space="preserve">In healthy, well-functioning watersheds, this process is expected to produce spatially heterogeneous patterns of ecological performance (e.g., growth and production) </w:t>
-      </w:r>
-      <w:r>
-        <w:rPr>
-          <w:rFonts w:ascii="Garamond" w:hAnsi="Garamond"/>
-        </w:rPr>
-        <w:t xml:space="preserve">that shift in their spatial configuration </w:t>
-      </w:r>
-      <w:r>
-        <w:rPr>
-          <w:rFonts w:ascii="Garamond" w:hAnsi="Garamond"/>
-        </w:rPr>
-        <w:t xml:space="preserve">as </w:t>
-      </w:r>
-      <w:r>
-        <w:rPr>
-          <w:rFonts w:ascii="Garamond" w:hAnsi="Garamond"/>
-        </w:rPr>
-        <w:t xml:space="preserve">locally adapted subpopulations </w:t>
-      </w:r>
-      <w:r>
-        <w:rPr>
-          <w:rFonts w:ascii="Garamond" w:hAnsi="Garamond"/>
-        </w:rPr>
-        <w:t>interact with variable</w:t>
-      </w:r>
-      <w:r>
-        <w:rPr>
-          <w:rFonts w:ascii="Garamond" w:hAnsi="Garamond"/>
-        </w:rPr>
-        <w:t xml:space="preserve"> habitat suitability through space and time</w:t>
-      </w:r>
-      <w:r>
-        <w:rPr>
-          <w:rFonts w:ascii="Garamond" w:hAnsi="Garamond"/>
-        </w:rPr>
-        <w:t xml:space="preserve">. </w:t>
-      </w:r>
-      <w:r>
-        <w:rPr>
-          <w:rFonts w:ascii="Garamond" w:hAnsi="Garamond"/>
-        </w:rPr>
-        <w:t>Despite variability among tributaries and sub-basin regions, this pattern is expected to stabilize ecosystem-scale performance (i.e., total salmon returns) by maintaining a diverse set of habitat conditions whose performance is weakly or negatively correlated under varying environmental conditions.</w:t>
-      </w:r>
-    </w:p>
-    <w:p>
-      <w:pPr>
-        <w:pStyle w:val="font-claude-response-body"/>
-        <w:spacing w:line="360" w:lineRule="auto"/>
-        <w:ind w:firstLine="360"/>
-        <w:rPr>
-          <w:rFonts w:ascii="Garamond" w:hAnsi="Garamond"/>
-        </w:rPr>
-      </w:pPr>
-      <w:r>
-        <w:rPr>
-          <w:rFonts w:ascii="Garamond" w:hAnsi="Garamond"/>
-        </w:rPr>
-        <w:t xml:space="preserve">Although the “shifting habitat mosaic” has been extensively described in relatively small ecosystems, it has only recently been empirically tested at the watershed scale in salmon systems, and then over relatively short timeframes (≤3 years; Brennan et al., 2019). To date, this pattern has not been examined in the world’s largest salmon-bearing watersheds or over longer temporal scales. </w:t>
-      </w:r>
-      <w:r>
-        <w:rPr>
-          <w:rFonts w:ascii="Garamond" w:hAnsi="Garamond"/>
-        </w:rPr>
-        <w:lastRenderedPageBreak/>
-        <w:t>Here, we reconstruct spatiotemporal patterns of watershed-scale production in the Yukon and Kuskokwim river basins—the largest salmon-bearing watersheds in North America—over a six-year period using otolith microchemistry, providing a framework for evaluating shifting habitat mosaics across large spatial extents and multi-year timescales.</w:t>
-      </w:r>
-    </w:p>
-    <w:p>
-      <w:pPr>
-        <w:pStyle w:val="font-claude-response-body"/>
-        <w:numPr>
-          <w:ilvl w:val="0"/>
-          <w:numId w:val="2"/>
-        </w:numPr>
-        <w:spacing w:line="360" w:lineRule="auto"/>
         <w:rPr>
           <w:rFonts w:ascii="Garamond" w:hAnsi="Garamond"/>
         </w:rPr>
@@ -1415,39 +1270,37 @@
           <w:u w:val="single"/>
         </w:rPr>
       </w:pPr>
-    </w:p>
-    <w:p>
-      <w:pPr>
-        <w:pStyle w:val="font-claude-response-body"/>
-        <w:spacing w:line="360" w:lineRule="auto"/>
+      <w:r>
         <w:rPr>
           <w:rFonts w:ascii="Garamond" w:hAnsi="Garamond"/>
           <w:b/>
           <w:bCs/>
           <w:u w:val="single"/>
         </w:rPr>
-      </w:pPr>
-    </w:p>
-    <w:p>
-      <w:pPr>
-        <w:pStyle w:val="font-claude-response-body"/>
-        <w:spacing w:line="360" w:lineRule="auto"/>
+        <w:lastRenderedPageBreak/>
+        <w:t>Methods</w:t>
+      </w:r>
+      <w:r>
         <w:rPr>
           <w:rFonts w:ascii="Garamond" w:hAnsi="Garamond"/>
           <w:b/>
           <w:bCs/>
           <w:u w:val="single"/>
         </w:rPr>
-      </w:pPr>
-      <w:r>
+        <w:t xml:space="preserve">: </w:t>
+      </w:r>
+    </w:p>
+    <w:p>
+      <w:pPr>
+        <w:pStyle w:val="font-claude-response-body"/>
+        <w:spacing w:line="360" w:lineRule="auto"/>
         <w:rPr>
           <w:rFonts w:ascii="Garamond" w:hAnsi="Garamond"/>
           <w:b/>
           <w:bCs/>
           <w:u w:val="single"/>
         </w:rPr>
-        <w:t>Methods</w:t>
-      </w:r>
+      </w:pPr>
       <w:r>
         <w:rPr>
           <w:rFonts w:ascii="Garamond" w:hAnsi="Garamond"/>
@@ -1455,7 +1308,131 @@
           <w:bCs/>
           <w:u w:val="single"/>
         </w:rPr>
-        <w:t xml:space="preserve">: </w:t>
+        <w:t xml:space="preserve">Otolith and Genetic Data: </w:t>
+      </w:r>
+    </w:p>
+    <w:p>
+      <w:pPr>
+        <w:pStyle w:val="font-claude-response-body"/>
+        <w:spacing w:line="360" w:lineRule="auto"/>
+        <w:ind w:firstLine="720"/>
+        <w:rPr>
+          <w:rFonts w:ascii="Garamond" w:hAnsi="Garamond"/>
+        </w:rPr>
+      </w:pPr>
+      <w:r>
+        <w:rPr>
+          <w:rFonts w:ascii="Garamond" w:hAnsi="Garamond"/>
+        </w:rPr>
+        <w:t xml:space="preserve">Chinook salmon otoliths were collected from the Yukon (2015, 2016, 2019–2021) and Kuskokwim (2017–2022) rivers over several years from the downstream terminus of both rivers. Yukon otoliths were collected from the Lower Yukon Test Fishery (LYTF) operated by the Alaska Department of Fish and Game near Emmonok, Ak and Kuskokwim otoliths were collected by collaborators at the Orutsararmiut Native Council at the Bethel Test Fishery (BTF) near Bethel, AK (Figure _). It is assumed that fish caught in each test fishery reared in their respective river and were therefore returning to their natal spawning grounds on capture. Both test fisheries are designed to </w:t>
+      </w:r>
+      <w:r>
+        <w:rPr>
+          <w:rFonts w:ascii="Garamond" w:hAnsi="Garamond"/>
+        </w:rPr>
+        <w:t xml:space="preserve">sample throughout the run to gain insight on the timing of individual stocks throughout the basin. </w:t>
+      </w:r>
+      <w:r>
+        <w:rPr>
+          <w:rFonts w:ascii="Garamond" w:hAnsi="Garamond"/>
+        </w:rPr>
+        <w:t>Roughly 500 otoliths were collected from each sample site and in each year, with the exception of</w:t>
+      </w:r>
+      <w:commentRangeStart w:id="0"/>
+      <w:r>
+        <w:rPr>
+          <w:rFonts w:ascii="Garamond" w:hAnsi="Garamond"/>
+        </w:rPr>
+        <w:t xml:space="preserve"> ________________. </w:t>
+      </w:r>
+      <w:commentRangeEnd w:id="0"/>
+      <w:r>
+        <w:rPr>
+          <w:rStyle w:val="CommentReference"/>
+          <w:rFonts w:ascii="Garamond" w:hAnsi="Garamond"/>
+          <w:sz w:val="24"/>
+          <w:szCs w:val="24"/>
+        </w:rPr>
+        <w:commentReference w:id="0"/>
+      </w:r>
+      <w:r>
+        <w:rPr>
+          <w:rFonts w:ascii="Garamond" w:hAnsi="Garamond"/>
+        </w:rPr>
+        <w:t xml:space="preserve">From these, ~250 otoliths per river and per year were selected for further analysis, ensuring relatively equal representation relative to CPUE across the full year. </w:t>
+      </w:r>
+      <w:r>
+        <w:rPr>
+          <w:rFonts w:ascii="Garamond" w:hAnsi="Garamond"/>
+        </w:rPr>
+        <w:t>Selected otoliths wer</w:t>
+      </w:r>
+      <w:r>
+        <w:rPr>
+          <w:rFonts w:ascii="Garamond" w:hAnsi="Garamond"/>
+        </w:rPr>
+        <w:t xml:space="preserve">e cut along the transverse plane using a low speed isomet saw to reveal the core and growth structure of the otolith, mounted on a microscope slide, and polished. </w:t>
+      </w:r>
+      <w:r>
+        <w:rPr>
+          <w:rFonts w:ascii="Garamond" w:hAnsi="Garamond"/>
+        </w:rPr>
+        <w:fldChar w:fldCharType="begin"/>
+      </w:r>
+      <w:r>
+        <w:rPr>
+          <w:rFonts w:ascii="Garamond" w:hAnsi="Garamond"/>
+        </w:rPr>
+        <w:instrText xml:space="preserve"> ADDIN ZOTERO_ITEM CSL_CITATION {"citationID":"UdeDBfeN","properties":{"formattedCitation":"(Donohoe &amp; Zimmerman, 2010; Zimmerman &amp; Reeves, 2002)","plainCitation":"(Donohoe &amp; Zimmerman, 2010; Zimmerman &amp; Reeves, 2002)","noteIndex":0},"citationItems":[{"id":4778,"uris":["http://zotero.org/users/8421274/items/QJZIBTQC"],"itemData":{"id":4778,"type":"article-journal","abstract":"Beam-based analytical methods are widely used to measure the concentrations of elements and isotopes in otoliths. These methods usually require that otoliths be individually mounted and prepared to properly expose the desired growth region to the analytical beam. Most analytical instruments, such as LA-ICPMS and ion and electron microprobes, have sample holders that will accept only one to six slides or mounts at a time. We describe a method of mounting otoliths that allows for easy transfer of many otoliths to a single mount after they have been prepared. Such an approach increases the number of otoliths that can be analyzed in a single session by reducing the need open the sample chamber to exchange slides—a particularly time consuming step on instruments that operate under vacuum. For ion and electron microprobes, the method also greatly reduces the number of slides that must be coated with an electrical conductor prior to analysis. In this method, a narrow strip of cover glass is first glued at one end to a standard microscope slide. The otolith is then mounted in thermoplastic resin on the opposite, free end of the strip. The otolith can then be ground and flipped, if needed, by reheating the mounting medium. After otolith preparation is complete, the cover glass is cut with a scribe to free the otolith and up to 20 small otoliths can be arranged on a single petrographic slide.","container-title":"Environmental Biology of Fishes","DOI":"10.1007/s10641-010-9680-3","ISSN":"1573-5133","issue":"3","journalAbbreviation":"Environ Biol Fish","language":"en","page":"473-477","source":"Springer Link","title":"A method of mounting multiple otoliths for beam-based microchemical analyses","volume":"89","author":[{"family":"Donohoe","given":"Christopher J."},{"family":"Zimmerman","given":"Christian E."}],"issued":{"date-parts":[["2010",11,1]]}}},{"id":4132,"uris":["http://zotero.org/users/8421274/items/5YINANGC"],"itemData":{"id":4132,"type":"article-journal","abstract":"Comparisons of strontium:calcium (Sr: Ca) ratios in otolith primordia and freshwater growth regions were used to identify the progeny of steelhead Oncorhynchus mykiss (anadromous rainbow trout) and resident rainbow trout in the Deschutes River, Oregon. We cultured progeny of known adult steelhead and resident rainbow trout to confirm the relationship between Sr:Ca ratios in otolith primordia and the life history of the maternal parent. The mean (±SD) Sr:Ca ratio was significantly higher in the otolith primordia of the progeny of steelhead (0.001461 ± 0.00029; n = 100) than in those of the progeny of resident rainbow trout (0.000829 ± 0.000012; n = 100). We used comparisons of Sr:Ca ratios in the primordia and first-summer growth regions of otoliths to determine the maternal origin of unknown O. mykiss juveniles (n = 272) collected from rearing habitats within the main-stem Deschutes River and tributary rearing habitats and thus to ascertain the relative proportion of each life history morph in each rearing habitat. Resident rainbow trout fry dominated the bimonthly samples collected from main-stem rearing habitats between May and November 1995. Steelhead fry dominated samples collected from below waterfalls on two tributaries in 1996 and 1998.","container-title":"Transactions of the American Fisheries Society","DOI":"10.1577/1548-8659(2002)131&lt;0986:IOSARR&gt;2.0.CO;2","ISSN":"0002-8487","issue":"5","note":"_eprint: https://doi.org/10.1577/1548-8659(2002)131&lt;0986:IOSARR&gt;2.0.CO;2","page":"986-993","publisher":"Taylor &amp; Francis","source":"Taylor and Francis+NEJM","title":"Identification of Steelhead and Resident Rainbow Trout Progeny in the Deschutes River, Oregon, Revealed with Otolith Microchemistry","volume":"131","author":[{"family":"Zimmerman","given":"Christian E."},{"family":"Reeves","given":"Gordon H."}],"issued":{"date-parts":[["2002",9,1]]}}}],"schema":"https://github.com/citation-style-language/schema/raw/master/csl-citation.json"} </w:instrText>
+      </w:r>
+      <w:r>
+        <w:rPr>
+          <w:rFonts w:ascii="Garamond" w:hAnsi="Garamond"/>
+        </w:rPr>
+        <w:fldChar w:fldCharType="separate"/>
+      </w:r>
+      <w:r>
+        <w:rPr>
+          <w:rFonts w:ascii="Garamond" w:hAnsi="Garamond"/>
+          <w:noProof/>
+        </w:rPr>
+        <w:t>(Donohoe &amp; Zimmerman, 2010; Zimmerman &amp; Reeves, 2002)</w:t>
+      </w:r>
+      <w:r>
+        <w:rPr>
+          <w:rFonts w:ascii="Garamond" w:hAnsi="Garamond"/>
+        </w:rPr>
+        <w:fldChar w:fldCharType="end"/>
+      </w:r>
+      <w:r>
+        <w:rPr>
+          <w:rFonts w:ascii="Garamond" w:hAnsi="Garamond"/>
+        </w:rPr>
+        <w:t xml:space="preserve">. Samples were then analyzed for Sr8786 and Sr88 using Laser Ablation Inductively Coupled Plasma Mass Spectrometry (LA-ICP-MS) at the University of Utah Strontium Metals Lab. Laser ablation was performed from the otolith core to just after the onset of the marine signature along the dorsal lobe scanning at 2 microns/second. </w:t>
+      </w:r>
+      <w:r>
+        <w:rPr>
+          <w:rFonts w:ascii="Garamond" w:hAnsi="Garamond"/>
+        </w:rPr>
+        <w:t xml:space="preserve">The Sr87/Sr86 value from the natal rearing location was identified manually by examining the first stable value following the rapid decrease from that of the core, which was identified both by examining the position of the ablation transect relative to the visible core region on the otolith as well as a general </w:t>
+      </w:r>
+      <w:r>
+        <w:rPr>
+          <w:rFonts w:ascii="Garamond" w:hAnsi="Garamond"/>
+        </w:rPr>
+        <w:t>convergence</w:t>
+      </w:r>
+      <w:r>
+        <w:rPr>
+          <w:rFonts w:ascii="Garamond" w:hAnsi="Garamond"/>
+        </w:rPr>
+        <w:t xml:space="preserve"> towards the global marine Sr8786 value (0.70819</w:t>
+      </w:r>
+      <w:r>
+        <w:rPr>
+          <w:rFonts w:ascii="Garamond" w:hAnsi="Garamond"/>
+        </w:rPr>
+        <w:t xml:space="preserve">). Fin clip samples were taken from as many Yukon individuals as possible and genetic stock identification (GSI) assignments were estimated based on methods in Makhlouf et al., 2025 using X genetic baselines ( cites from there here). </w:t>
       </w:r>
     </w:p>
     <w:p>
@@ -1469,212 +1446,18 @@
           <w:u w:val="single"/>
         </w:rPr>
       </w:pPr>
-      <w:r>
+    </w:p>
+    <w:p>
+      <w:pPr>
+        <w:pStyle w:val="font-claude-response-body"/>
+        <w:spacing w:line="360" w:lineRule="auto"/>
         <w:rPr>
           <w:rFonts w:ascii="Garamond" w:hAnsi="Garamond"/>
           <w:b/>
           <w:bCs/>
           <w:u w:val="single"/>
         </w:rPr>
-        <w:t xml:space="preserve">Otolith and Genetic Data: </w:t>
-      </w:r>
-    </w:p>
-    <w:p>
-      <w:pPr>
-        <w:pStyle w:val="font-claude-response-body"/>
-        <w:spacing w:line="360" w:lineRule="auto"/>
-        <w:ind w:firstLine="720"/>
-        <w:rPr>
-          <w:rFonts w:ascii="Garamond" w:hAnsi="Garamond"/>
-        </w:rPr>
-      </w:pPr>
-      <w:r>
-        <w:rPr>
-          <w:rFonts w:ascii="Garamond" w:hAnsi="Garamond"/>
-        </w:rPr>
-        <w:t xml:space="preserve">Chinook salmon otoliths were collected from the Yukon (2015, 2016, 2019–2021) and Kuskokwim (2017–2022) rivers over several years from the downstream terminus of both rivers. Yukon otoliths were collected from the Lower Yukon Test Fishery (LYTF) operated by the Alaska Department of Fish and Game near </w:t>
-      </w:r>
-      <w:proofErr w:type="spellStart"/>
-      <w:r>
-        <w:rPr>
-          <w:rFonts w:ascii="Garamond" w:hAnsi="Garamond"/>
-        </w:rPr>
-        <w:t>Emmonok</w:t>
-      </w:r>
-      <w:proofErr w:type="spellEnd"/>
-      <w:r>
-        <w:rPr>
-          <w:rFonts w:ascii="Garamond" w:hAnsi="Garamond"/>
-        </w:rPr>
-        <w:t xml:space="preserve">, Ak and Kuskokwim otoliths were collected by collaborators at the </w:t>
-      </w:r>
-      <w:proofErr w:type="spellStart"/>
-      <w:r>
-        <w:rPr>
-          <w:rFonts w:ascii="Garamond" w:hAnsi="Garamond"/>
-        </w:rPr>
-        <w:t>Orutsararmiut</w:t>
-      </w:r>
-      <w:proofErr w:type="spellEnd"/>
-      <w:r>
-        <w:rPr>
-          <w:rFonts w:ascii="Garamond" w:hAnsi="Garamond"/>
-        </w:rPr>
-        <w:t xml:space="preserve"> Native Council at the Bethel Test Fishery (BTF) near Bethel, AK (Figure _). It is assumed that fish caught in each test fishery reared in their respective river and were therefore returning to their natal spawning grounds on capture. Both test fisheries are designed to </w:t>
-      </w:r>
-      <w:r>
-        <w:rPr>
-          <w:rFonts w:ascii="Garamond" w:hAnsi="Garamond"/>
-        </w:rPr>
-        <w:t xml:space="preserve">sample throughout the run to gain insight on the timing of individual stocks throughout the basin. </w:t>
-      </w:r>
-      <w:r>
-        <w:rPr>
-          <w:rFonts w:ascii="Garamond" w:hAnsi="Garamond"/>
-        </w:rPr>
-        <w:t xml:space="preserve">Roughly 500 otoliths were collected from each sample site and in each year, </w:t>
-      </w:r>
-      <w:proofErr w:type="gramStart"/>
-      <w:r>
-        <w:rPr>
-          <w:rFonts w:ascii="Garamond" w:hAnsi="Garamond"/>
-        </w:rPr>
-        <w:t>with the exception of</w:t>
-      </w:r>
-      <w:commentRangeStart w:id="0"/>
-      <w:proofErr w:type="gramEnd"/>
-      <w:r>
-        <w:rPr>
-          <w:rFonts w:ascii="Garamond" w:hAnsi="Garamond"/>
-        </w:rPr>
-        <w:t xml:space="preserve"> ________________. </w:t>
-      </w:r>
-      <w:commentRangeEnd w:id="0"/>
-      <w:r>
-        <w:rPr>
-          <w:rStyle w:val="CommentReference"/>
-          <w:rFonts w:ascii="Garamond" w:eastAsiaTheme="minorHAnsi" w:hAnsi="Garamond" w:cstheme="minorBidi"/>
-          <w:kern w:val="2"/>
-          <w:sz w:val="24"/>
-          <w:szCs w:val="24"/>
-          <w14:ligatures w14:val="standardContextual"/>
-        </w:rPr>
-        <w:commentReference w:id="0"/>
-      </w:r>
-      <w:r>
-        <w:rPr>
-          <w:rFonts w:ascii="Garamond" w:hAnsi="Garamond"/>
-        </w:rPr>
-        <w:t xml:space="preserve">From these, ~250 otoliths per river and per year were selected for further analysis, ensuring relatively equal representation relative to CPUE across the full year. </w:t>
-      </w:r>
-      <w:r>
-        <w:rPr>
-          <w:rFonts w:ascii="Garamond" w:hAnsi="Garamond"/>
-        </w:rPr>
-        <w:t>Selected otoliths wer</w:t>
-      </w:r>
-      <w:r>
-        <w:rPr>
-          <w:rFonts w:ascii="Garamond" w:hAnsi="Garamond"/>
-        </w:rPr>
-        <w:t xml:space="preserve">e cut along the transverse plane using a low speed </w:t>
-      </w:r>
-      <w:proofErr w:type="spellStart"/>
-      <w:r>
-        <w:rPr>
-          <w:rFonts w:ascii="Garamond" w:hAnsi="Garamond"/>
-        </w:rPr>
-        <w:t>isomet</w:t>
-      </w:r>
-      <w:proofErr w:type="spellEnd"/>
-      <w:r>
-        <w:rPr>
-          <w:rFonts w:ascii="Garamond" w:hAnsi="Garamond"/>
-        </w:rPr>
-        <w:t xml:space="preserve"> saw to reveal the core and growth structure of the otolith, mounted on a microscope slide, and polished. </w:t>
-      </w:r>
-      <w:r>
-        <w:rPr>
-          <w:rFonts w:ascii="Garamond" w:hAnsi="Garamond"/>
-        </w:rPr>
-        <w:fldChar w:fldCharType="begin"/>
-      </w:r>
-      <w:r>
-        <w:rPr>
-          <w:rFonts w:ascii="Garamond" w:hAnsi="Garamond"/>
-        </w:rPr>
-        <w:instrText xml:space="preserve"> ADDIN ZOTERO_ITEM CSL_CITATION {"citationID":"UdeDBfeN","properties":{"formattedCitation":"(Donohoe &amp; Zimmerman, 2010; Zimmerman &amp; Reeves, 2002)","plainCitation":"(Donohoe &amp; Zimmerman, 2010; Zimmerman &amp; Reeves, 2002)","noteIndex":0},"citationItems":[{"id":4778,"uris":["http://zotero.org/users/8421274/items/QJZIBTQC"],"itemData":{"id":4778,"type":"article-journal","abstract":"Beam-based analytical methods are widely used to measure the concentrations of elements and isotopes in otoliths. These methods usually require that otoliths be individually mounted and prepared to properly expose the desired growth region to the analytical beam. Most analytical instruments, such as LA-ICPMS and ion and electron microprobes, have sample holders that will accept only one to six slides or mounts at a time. We describe a method of mounting otoliths that allows for easy transfer of many otoliths to a single mount after they have been prepared. Such an approach increases the number of otoliths that can be analyzed in a single session by reducing the need open the sample chamber to exchange slides—a particularly time consuming step on instruments that operate under vacuum. For ion and electron microprobes, the method also greatly reduces the number of slides that must be coated with an electrical conductor prior to analysis. In this method, a narrow strip of cover glass is first glued at one end to a standard microscope slide. The otolith is then mounted in thermoplastic resin on the opposite, free end of the strip. The otolith can then be ground and flipped, if needed, by reheating the mounting medium. After otolith preparation is complete, the cover glass is cut with a scribe to free the otolith and up to 20 small otoliths can be arranged on a single petrographic slide.","container-title":"Environmental Biology of Fishes","DOI":"10.1007/s10641-010-9680-3","ISSN":"1573-5133","issue":"3","journalAbbreviation":"Environ Biol Fish","language":"en","page":"473-477","source":"Springer Link","title":"A method of mounting multiple otoliths for beam-based microchemical analyses","volume":"89","author":[{"family":"Donohoe","given":"Christopher J."},{"family":"Zimmerman","given":"Christian E."}],"issued":{"date-parts":[["2010",11,1]]}}},{"id":4132,"uris":["http://zotero.org/users/8421274/items/5YINANGC"],"itemData":{"id":4132,"type":"article-journal","abstract":"Comparisons of strontium:calcium (Sr: Ca) ratios in otolith primordia and freshwater growth regions were used to identify the progeny of steelhead Oncorhynchus mykiss (anadromous rainbow trout) and resident rainbow trout in the Deschutes River, Oregon. We cultured progeny of known adult steelhead and resident rainbow trout to confirm the relationship between Sr:Ca ratios in otolith primordia and the life history of the maternal parent. The mean (±SD) Sr:Ca ratio was significantly higher in the otolith primordia of the progeny of steelhead (0.001461 ± 0.00029; n = 100) than in those of the progeny of resident rainbow trout (0.000829 ± 0.000012; n = 100). We used comparisons of Sr:Ca ratios in the primordia and first-summer growth regions of otoliths to determine the maternal origin of unknown O. mykiss juveniles (n = 272) collected from rearing habitats within the main-stem Deschutes River and tributary rearing habitats and thus to ascertain the relative proportion of each life history morph in each rearing habitat. Resident rainbow trout fry dominated the bimonthly samples collected from main-stem rearing habitats between May and November 1995. Steelhead fry dominated samples collected from below waterfalls on two tributaries in 1996 and 1998.","container-title":"Transactions of the American Fisheries Society","DOI":"10.1577/1548-8659(2002)131&lt;0986:IOSARR&gt;2.0.CO;2","ISSN":"0002-8487","issue":"5","note":"publisher: Taylor &amp; Francis\n_eprint: https://doi.org/10.1577/1548-8659(2002)131&lt;0986:IOSARR&gt;2.0.CO;2","page":"986-993","source":"Taylor and Francis+NEJM","title":"Identification of Steelhead and Resident Rainbow Trout Progeny in the Deschutes River, Oregon, Revealed with Otolith Microchemistry","volume":"131","author":[{"family":"Zimmerman","given":"Christian E."},{"family":"Reeves","given":"Gordon H."}],"issued":{"date-parts":[["2002",9,1]]}}}],"schema":"https://github.com/citation-style-language/schema/raw/master/csl-citation.json"} </w:instrText>
-      </w:r>
-      <w:r>
-        <w:rPr>
-          <w:rFonts w:ascii="Garamond" w:hAnsi="Garamond"/>
-        </w:rPr>
-        <w:fldChar w:fldCharType="separate"/>
-      </w:r>
-      <w:r>
-        <w:rPr>
-          <w:rFonts w:ascii="Garamond" w:hAnsi="Garamond"/>
-          <w:noProof/>
-        </w:rPr>
-        <w:t>(Donohoe &amp; Zimmerman, 2010; Zimmerman &amp; Reeves, 2002)</w:t>
-      </w:r>
-      <w:r>
-        <w:rPr>
-          <w:rFonts w:ascii="Garamond" w:hAnsi="Garamond"/>
-        </w:rPr>
-        <w:fldChar w:fldCharType="end"/>
-      </w:r>
-      <w:r>
-        <w:rPr>
-          <w:rFonts w:ascii="Garamond" w:hAnsi="Garamond"/>
-        </w:rPr>
-        <w:t xml:space="preserve">. Samples were then analyzed for Sr8786 and Sr88 using Laser Ablation Inductively Coupled Plasma Mass Spectrometry (LA-ICP-MS) at the University of Utah Strontium Metals Lab. Laser ablation was performed from the otolith core to just after the onset of the marine signature along the dorsal lobe scanning at 2 microns/second. </w:t>
-      </w:r>
-      <w:r>
-        <w:rPr>
-          <w:rFonts w:ascii="Garamond" w:hAnsi="Garamond"/>
-        </w:rPr>
-        <w:t xml:space="preserve">The Sr87/Sr86 value from the natal rearing location was identified manually by examining the first stable value following the rapid decrease from that of the core, which was identified both by examining the </w:t>
-      </w:r>
-      <w:r>
-        <w:rPr>
-          <w:rFonts w:ascii="Garamond" w:hAnsi="Garamond"/>
-        </w:rPr>
-        <w:lastRenderedPageBreak/>
-        <w:t xml:space="preserve">position of the ablation transect relative to the visible core region on the otolith as well as a general </w:t>
-      </w:r>
-      <w:r>
-        <w:rPr>
-          <w:rFonts w:ascii="Garamond" w:hAnsi="Garamond"/>
-        </w:rPr>
-        <w:t>convergence</w:t>
-      </w:r>
-      <w:r>
-        <w:rPr>
-          <w:rFonts w:ascii="Garamond" w:hAnsi="Garamond"/>
-        </w:rPr>
-        <w:t xml:space="preserve"> towards the global marine Sr8786 value (0.70819</w:t>
-      </w:r>
-      <w:r>
-        <w:rPr>
-          <w:rFonts w:ascii="Garamond" w:hAnsi="Garamond"/>
-        </w:rPr>
-        <w:t xml:space="preserve">). Fin clip samples were taken from as many Yukon individuals as possible and genetic stock identification (GSI) assignments were estimated based on methods in Makhlouf et al., 2025 using X genetic baselines </w:t>
-      </w:r>
-      <w:proofErr w:type="gramStart"/>
-      <w:r>
-        <w:rPr>
-          <w:rFonts w:ascii="Garamond" w:hAnsi="Garamond"/>
-        </w:rPr>
-        <w:t>( cites</w:t>
-      </w:r>
-      <w:proofErr w:type="gramEnd"/>
-      <w:r>
-        <w:rPr>
-          <w:rFonts w:ascii="Garamond" w:hAnsi="Garamond"/>
-        </w:rPr>
-        <w:t xml:space="preserve"> from there here). </w:t>
-      </w:r>
+      </w:pPr>
     </w:p>
     <w:p>
       <w:pPr>
@@ -1687,23 +1470,22 @@
           <w:u w:val="single"/>
         </w:rPr>
       </w:pPr>
-    </w:p>
-    <w:p>
-      <w:pPr>
-        <w:pStyle w:val="font-claude-response-body"/>
-        <w:spacing w:line="360" w:lineRule="auto"/>
+      <w:r>
         <w:rPr>
           <w:rFonts w:ascii="Garamond" w:hAnsi="Garamond"/>
           <w:b/>
           <w:bCs/>
           <w:u w:val="single"/>
         </w:rPr>
-      </w:pPr>
-    </w:p>
-    <w:p>
-      <w:pPr>
-        <w:pStyle w:val="font-claude-response-body"/>
-        <w:spacing w:line="360" w:lineRule="auto"/>
+        <w:lastRenderedPageBreak/>
+        <w:t>Provenance estimates</w:t>
+      </w:r>
+    </w:p>
+    <w:p>
+      <w:pPr>
+        <w:pStyle w:val="font-claude-response-body"/>
+        <w:spacing w:line="360" w:lineRule="auto"/>
+        <w:ind w:firstLine="720"/>
         <w:rPr>
           <w:rFonts w:ascii="Garamond" w:hAnsi="Garamond"/>
           <w:b/>
@@ -1714,192 +1496,86 @@
       <w:r>
         <w:rPr>
           <w:rFonts w:ascii="Garamond" w:hAnsi="Garamond"/>
+        </w:rPr>
+        <w:t>Maps of the spatial distribution of ^87Sr/^86Sr (i.e., “isoscapes”) have been developed for both the Kuskokwim and Yukon river basins using spatial stream network modeling (SSNM). This approach accounts for both Euclidean and flow-connected spatial autocorrelation, as well as the influence of multiple reach-scale covariates on strontium isotope ratios (French et al., X; Makhlouf et al., 2025). Both isoscapes include reach-specific estimates of model uncertainty. Because the Yukon isoscape encompasses a substantially larger spatial extent and has lower sampling density per river kilometer, associated prediction error is considerably higher than in the Kuskokwim (add error range). In both systems, however, reaches with exceptionally low prediction error—typically those closest to sampling locations—are relatively rare and tend to receive a disproportionate number of assignments.</w:t>
+      </w:r>
+      <w:r>
+        <w:rPr>
+          <w:rFonts w:ascii="Garamond" w:hAnsi="Garamond"/>
+        </w:rPr>
+        <w:t xml:space="preserve"> To avoid this, minimum error values for each isoscape were adjusted to .003 and .00003 for the Yukon and Kuskokwim isoscape, respectively. All reaches with error values below this were assigned this value. </w:t>
+      </w:r>
+    </w:p>
+    <w:p>
+      <w:pPr>
+        <w:pStyle w:val="font-claude-response-body"/>
+        <w:spacing w:line="360" w:lineRule="auto"/>
+        <w:rPr>
+          <w:rFonts w:ascii="Garamond" w:hAnsi="Garamond"/>
+        </w:rPr>
+      </w:pPr>
+      <w:r>
+        <w:rPr>
+          <w:rFonts w:ascii="Garamond" w:hAnsi="Garamond"/>
+        </w:rPr>
+        <w:tab/>
+      </w:r>
+      <w:r>
+        <w:rPr>
+          <w:rFonts w:ascii="Garamond" w:hAnsi="Garamond"/>
+        </w:rPr>
+        <w:t xml:space="preserve">From the extracted natal-origin values, the likelihood of provenance was estimated for all reaches within each basin using a probabilistic Bayesian framework (Makhlouf et al., 2025). For Yukon samples, a genetic prior was incorporated based on posterior probabilities from genetic stock identification assignments (Makhlouf et al., 2025). In addition, three spatial priors were applied to reduce assignment to reaches with low likelihood of occupancy by spawning adult Chinook salmon. </w:t>
+      </w:r>
+      <w:r>
+        <w:rPr>
+          <w:rFonts w:ascii="Garamond" w:hAnsi="Garamond"/>
+        </w:rPr>
+        <w:t>Specifically, assignments were constrained to streams of order X or greater, and a habitat prior assigned zero probability to reaches with average channel gradients &gt; X. Together, these constraints reflect the preference of Chinook salmon for spawning in larger tributaries and the observed unsuitability of both extremely low-gradient and steep reaches. Finally, a “presence prior” was derived from USGS intrinsic potential mapping, which identifies reaches where spawning Chinook salmon have been observed based on multiple data sources [ref]. This prior was applied to mainstem tributaries in both river basins, assigning zero probability to reaches with no documented evidence of spawning Chinook salmon. We restricted application of this prior to mainstem reaches to avoid unduly limiting assignments in more remote tributaries where the absence of observations likely reflects limited sampling effort rather than true absence, while still incorporating available presence information into the assignment framework.</w:t>
+      </w:r>
+      <w:r>
+        <w:rPr>
+          <w:rFonts w:ascii="Garamond" w:hAnsi="Garamond"/>
+        </w:rPr>
+        <w:t xml:space="preserve"> </w:t>
+      </w:r>
+      <w:r>
+        <w:rPr>
+          <w:rFonts w:ascii="Garamond" w:hAnsi="Garamond"/>
+        </w:rPr>
+        <w:t xml:space="preserve">For each individual, the result is a posterior probability of provenance for all tributaries in the basin. These data were then normalized to sum to 1 across </w:t>
+      </w:r>
+      <w:r>
+        <w:rPr>
+          <w:rFonts w:ascii="Garamond" w:hAnsi="Garamond"/>
+        </w:rPr>
+        <w:lastRenderedPageBreak/>
+        <w:t xml:space="preserve">the basin and rescaled to range from 0-1, thereby indicating relative probability of provenance across the basin. </w:t>
+      </w:r>
+    </w:p>
+    <w:p>
+      <w:pPr>
+        <w:pStyle w:val="font-claude-response-body"/>
+        <w:spacing w:line="360" w:lineRule="auto"/>
+        <w:rPr>
+          <w:rFonts w:ascii="Garamond" w:hAnsi="Garamond"/>
+        </w:rPr>
+      </w:pPr>
+    </w:p>
+    <w:p>
+      <w:pPr>
+        <w:pStyle w:val="font-claude-response-body"/>
+        <w:spacing w:line="360" w:lineRule="auto"/>
+        <w:rPr>
+          <w:rFonts w:ascii="Garamond" w:hAnsi="Garamond"/>
           <w:b/>
           <w:bCs/>
-          <w:u w:val="single"/>
-        </w:rPr>
-        <w:t>Provenance estimates</w:t>
-      </w:r>
-    </w:p>
-    <w:p>
-      <w:pPr>
-        <w:pStyle w:val="font-claude-response-body"/>
-        <w:spacing w:line="360" w:lineRule="auto"/>
-        <w:ind w:firstLine="720"/>
+        </w:rPr>
+      </w:pPr>
+      <w:r>
         <w:rPr>
           <w:rFonts w:ascii="Garamond" w:hAnsi="Garamond"/>
           <w:b/>
           <w:bCs/>
-          <w:u w:val="single"/>
-        </w:rPr>
-      </w:pPr>
-      <w:r>
-        <w:rPr>
-          <w:rFonts w:ascii="Garamond" w:hAnsi="Garamond"/>
-        </w:rPr>
-        <w:t>Maps of the spatial distribution of ^87Sr/^86Sr (i.e., “</w:t>
-      </w:r>
-      <w:proofErr w:type="spellStart"/>
-      <w:r>
-        <w:rPr>
-          <w:rFonts w:ascii="Garamond" w:hAnsi="Garamond"/>
-        </w:rPr>
-        <w:t>isoscapes</w:t>
-      </w:r>
-      <w:proofErr w:type="spellEnd"/>
-      <w:r>
-        <w:rPr>
-          <w:rFonts w:ascii="Garamond" w:hAnsi="Garamond"/>
-        </w:rPr>
-        <w:t xml:space="preserve">”) have been developed for both the Kuskokwim and Yukon river basins using spatial stream network modeling (SSNM). This approach accounts for both Euclidean and flow-connected spatial autocorrelation, as well as the influence of multiple reach-scale covariates on strontium isotope ratios (French et al., X; Makhlouf et al., 2025). Both </w:t>
-      </w:r>
-      <w:proofErr w:type="spellStart"/>
-      <w:r>
-        <w:rPr>
-          <w:rFonts w:ascii="Garamond" w:hAnsi="Garamond"/>
-        </w:rPr>
-        <w:t>isoscapes</w:t>
-      </w:r>
-      <w:proofErr w:type="spellEnd"/>
-      <w:r>
-        <w:rPr>
-          <w:rFonts w:ascii="Garamond" w:hAnsi="Garamond"/>
-        </w:rPr>
-        <w:t xml:space="preserve"> include reach-specific estimates of model uncertainty. Because the Yukon </w:t>
-      </w:r>
-      <w:proofErr w:type="spellStart"/>
-      <w:r>
-        <w:rPr>
-          <w:rFonts w:ascii="Garamond" w:hAnsi="Garamond"/>
-        </w:rPr>
-        <w:t>isoscape</w:t>
-      </w:r>
-      <w:proofErr w:type="spellEnd"/>
-      <w:r>
-        <w:rPr>
-          <w:rFonts w:ascii="Garamond" w:hAnsi="Garamond"/>
-        </w:rPr>
-        <w:t xml:space="preserve"> encompasses a substantially larger spatial extent and has lower sampling density per river kilometer, associated prediction error is considerably higher than in the Kuskokwim (add error range). In both systems, however, reaches with exceptionally low prediction error—typically those closest to sampling locations—are relatively rare and tend to receive a disproportionate number of assignments.</w:t>
-      </w:r>
-      <w:r>
-        <w:rPr>
-          <w:rFonts w:ascii="Garamond" w:hAnsi="Garamond"/>
-        </w:rPr>
-        <w:t xml:space="preserve"> To avoid this, minimum error values for each </w:t>
-      </w:r>
-      <w:proofErr w:type="spellStart"/>
-      <w:r>
-        <w:rPr>
-          <w:rFonts w:ascii="Garamond" w:hAnsi="Garamond"/>
-        </w:rPr>
-        <w:t>isoscape</w:t>
-      </w:r>
-      <w:proofErr w:type="spellEnd"/>
-      <w:r>
-        <w:rPr>
-          <w:rFonts w:ascii="Garamond" w:hAnsi="Garamond"/>
-        </w:rPr>
-        <w:t xml:space="preserve"> were adjusted to .003 and .00003 for the Yukon and Kuskokwim </w:t>
-      </w:r>
-      <w:proofErr w:type="spellStart"/>
-      <w:r>
-        <w:rPr>
-          <w:rFonts w:ascii="Garamond" w:hAnsi="Garamond"/>
-        </w:rPr>
-        <w:t>isoscape</w:t>
-      </w:r>
-      <w:proofErr w:type="spellEnd"/>
-      <w:r>
-        <w:rPr>
-          <w:rFonts w:ascii="Garamond" w:hAnsi="Garamond"/>
-        </w:rPr>
-        <w:t xml:space="preserve">, respectively. All reaches with error values below this were assigned this value. </w:t>
-      </w:r>
-    </w:p>
-    <w:p>
-      <w:pPr>
-        <w:pStyle w:val="font-claude-response-body"/>
-        <w:spacing w:line="360" w:lineRule="auto"/>
-        <w:rPr>
-          <w:rFonts w:ascii="Garamond" w:hAnsi="Garamond"/>
-        </w:rPr>
-      </w:pPr>
-      <w:r>
-        <w:rPr>
-          <w:rFonts w:ascii="Garamond" w:hAnsi="Garamond"/>
-        </w:rPr>
-        <w:tab/>
-      </w:r>
-      <w:r>
-        <w:rPr>
-          <w:rFonts w:ascii="Garamond" w:hAnsi="Garamond"/>
-        </w:rPr>
-        <w:t xml:space="preserve">From the extracted natal-origin values, the likelihood of provenance was estimated for all reaches within each basin using a probabilistic Bayesian framework (Makhlouf et al., 2025). For Yukon samples, a genetic prior was incorporated based on posterior probabilities from genetic stock identification assignments (Makhlouf et al., 2025). In addition, three spatial priors were applied to reduce assignment to reaches with low likelihood of occupancy by spawning adult Chinook salmon. </w:t>
-      </w:r>
-      <w:r>
-        <w:rPr>
-          <w:rFonts w:ascii="Garamond" w:hAnsi="Garamond"/>
-        </w:rPr>
-        <w:t xml:space="preserve">Specifically, assignments were constrained to streams of order X or greater, and a habitat prior assigned zero probability to reaches with average channel gradients &gt; X. Together, these constraints reflect the preference of Chinook salmon for spawning in larger tributaries and the observed </w:t>
-      </w:r>
-      <w:r>
-        <w:rPr>
-          <w:rFonts w:ascii="Garamond" w:hAnsi="Garamond"/>
-        </w:rPr>
-        <w:lastRenderedPageBreak/>
-        <w:t>unsuitability of both extremely low-gradient and steep reaches. Finally, a “presence prior” was derived from USGS intrinsic potential mapping, which identifies reaches where spawning Chinook salmon have been observed based on multiple data sources [ref]. This prior was applied to mainstem tributaries in both river basins, assigning zero probability to reaches with no documented evidence of spawning Chinook salmon. We restricted application of this prior to mainstem reaches to avoid unduly limiting assignments in more remote tributaries where the absence of observations likely reflects limited sampling effort rather than true absence, while still incorporating available presence information into the assignment framework.</w:t>
-      </w:r>
-      <w:r>
-        <w:rPr>
-          <w:rFonts w:ascii="Garamond" w:hAnsi="Garamond"/>
-        </w:rPr>
-        <w:t xml:space="preserve"> </w:t>
-      </w:r>
-      <w:r>
-        <w:rPr>
-          <w:rFonts w:ascii="Garamond" w:hAnsi="Garamond"/>
-        </w:rPr>
-        <w:t xml:space="preserve">For </w:t>
-      </w:r>
-      <w:proofErr w:type="gramStart"/>
-      <w:r>
-        <w:rPr>
-          <w:rFonts w:ascii="Garamond" w:hAnsi="Garamond"/>
-        </w:rPr>
-        <w:t>each individual</w:t>
-      </w:r>
-      <w:proofErr w:type="gramEnd"/>
-      <w:r>
-        <w:rPr>
-          <w:rFonts w:ascii="Garamond" w:hAnsi="Garamond"/>
-        </w:rPr>
-        <w:t xml:space="preserve">, the result is a posterior probability of provenance for all tributaries in the basin. These data were then normalized to sum to 1 across the basin and rescaled to range from 0-1, thereby indicating relative probability of provenance across the basin. </w:t>
-      </w:r>
-    </w:p>
-    <w:p>
-      <w:pPr>
-        <w:pStyle w:val="font-claude-response-body"/>
-        <w:spacing w:line="360" w:lineRule="auto"/>
-        <w:rPr>
-          <w:rFonts w:ascii="Garamond" w:hAnsi="Garamond"/>
-        </w:rPr>
-      </w:pPr>
-    </w:p>
-    <w:p>
-      <w:pPr>
-        <w:pStyle w:val="font-claude-response-body"/>
-        <w:spacing w:line="360" w:lineRule="auto"/>
-        <w:rPr>
-          <w:rFonts w:ascii="Garamond" w:hAnsi="Garamond"/>
-          <w:b/>
-          <w:bCs/>
-        </w:rPr>
-      </w:pPr>
-      <w:r>
-        <w:rPr>
-          <w:rFonts w:ascii="Garamond" w:hAnsi="Garamond"/>
-          <w:b/>
-          <w:bCs/>
         </w:rPr>
         <w:t xml:space="preserve">Population scale provenance Estimates </w:t>
       </w:r>
@@ -1917,21 +1593,7 @@
         <w:rPr>
           <w:rFonts w:ascii="Garamond" w:hAnsi="Garamond"/>
         </w:rPr>
-        <w:t xml:space="preserve">To estimate the spatial distribution of natal origin locations across the full year, normalized individual probabilities were summed across all locations. Before summing, </w:t>
-      </w:r>
-      <w:proofErr w:type="gramStart"/>
-      <w:r>
-        <w:rPr>
-          <w:rFonts w:ascii="Garamond" w:hAnsi="Garamond"/>
-        </w:rPr>
-        <w:t>each individual’s</w:t>
-      </w:r>
-      <w:proofErr w:type="gramEnd"/>
-      <w:r>
-        <w:rPr>
-          <w:rFonts w:ascii="Garamond" w:hAnsi="Garamond"/>
-        </w:rPr>
-        <w:t xml:space="preserve"> normalized provenance assignment was weighted by the ratio of the catch-per-unit-effort (CPUE) proportion to the proportion of the total otolith dataset within five equally spaced seasonal strata. This weighting ensured that otolith-based assignments proportionally represented the number of fish entering the river throughout the season. Summed basin-scale estimates of natal origin were then rescaled to sum to 1 and normalized to range from 0 to 1, reflecting relative production across the basin. Finally, these rescaled basin-scale assignments were multiplied by </w:t>
+        <w:t xml:space="preserve">To estimate the spatial distribution of natal origin locations across the full year, normalized individual probabilities were summed across all locations. Before summing, each individual’s normalized provenance assignment was weighted by the ratio of the catch-per-unit-effort (CPUE) proportion to the proportion of the total otolith dataset within five equally spaced seasonal strata. This weighting ensured that otolith-based assignments proportionally represented the number of fish entering the river throughout the season. Summed basin-scale estimates of natal origin were then rescaled to sum to 1 and normalized to range from 0 to 1, reflecting relative production across the basin. Finally, these rescaled basin-scale assignments were multiplied by </w:t>
       </w:r>
       <w:r>
         <w:rPr>
@@ -2262,7 +1924,6 @@
           <w:szCs w:val="32"/>
           <w:u w:val="single"/>
         </w:rPr>
-        <w:lastRenderedPageBreak/>
         <w:t>Discussion</w:t>
       </w:r>
       <w:r>
@@ -4114,4 +3775,16 @@
     </a:ext>
   </a:extLst>
 </a:theme>
+</file>
+
+<file path=customXml/item1.xml><?xml version="1.0" encoding="utf-8"?>
+<b:Sources xmlns:b="http://schemas.openxmlformats.org/officeDocument/2006/bibliography" xmlns="http://schemas.openxmlformats.org/officeDocument/2006/bibliography" SelectedStyle="/APASixthEditionOfficeOnline.xsl" StyleName="APA" Version="6"/>
+</file>
+
+<file path=customXml/itemProps1.xml><?xml version="1.0" encoding="utf-8"?>
+<ds:datastoreItem xmlns:ds="http://schemas.openxmlformats.org/officeDocument/2006/customXml" ds:itemID="{9C14FA50-62A8-8843-B709-E437B34142D1}">
+  <ds:schemaRefs>
+    <ds:schemaRef ds:uri="http://schemas.openxmlformats.org/officeDocument/2006/bibliography"/>
+  </ds:schemaRefs>
+</ds:datastoreItem>
 </file>
</xml_diff>

<commit_message>
Update analysis and project outputs
</commit_message>
<xml_diff>
--- a/Docs/Working_SMH2.docx
+++ b/Docs/Working_SMH2.docx
@@ -1,6 +1,6 @@
 
 <file path=word/document.xml><?xml version="1.0" encoding="utf-8"?>
-<w:document xmlns:wpc="http://schemas.microsoft.com/office/word/2010/wordprocessingCanvas" xmlns:cx="http://schemas.microsoft.com/office/drawing/2014/chartex" xmlns:cx1="http://schemas.microsoft.com/office/drawing/2015/9/8/chartex" xmlns:cx2="http://schemas.microsoft.com/office/drawing/2015/10/21/chartex" xmlns:cx3="http://schemas.microsoft.com/office/drawing/2016/5/9/chartex" xmlns:cx4="http://schemas.microsoft.com/office/drawing/2016/5/10/chartex" xmlns:cx5="http://schemas.microsoft.com/office/drawing/2016/5/11/chartex" xmlns:cx6="http://schemas.microsoft.com/office/drawing/2016/5/12/chartex" xmlns:cx7="http://schemas.microsoft.com/office/drawing/2016/5/13/chartex" xmlns:cx8="http://schemas.microsoft.com/office/drawing/2016/5/14/chartex" xmlns:mc="http://schemas.openxmlformats.org/markup-compatibility/2006" xmlns:aink="http://schemas.microsoft.com/office/drawing/2016/ink" xmlns:am3d="http://schemas.microsoft.com/office/drawing/2017/model3d" xmlns:o="urn:schemas-microsoft-com:office:office" xmlns:oel="http://schemas.microsoft.com/office/2019/extlst" xmlns:r="http://schemas.openxmlformats.org/officeDocument/2006/relationships" xmlns:m="http://schemas.openxmlformats.org/officeDocument/2006/math" xmlns:v="urn:schemas-microsoft-com:vml" xmlns:wp14="http://schemas.microsoft.com/office/word/2010/wordprocessingDrawing" xmlns:wp="http://schemas.openxmlformats.org/drawingml/2006/wordprocessingDrawing" xmlns:w10="urn:schemas-microsoft-com:office:word" xmlns:w="http://schemas.openxmlformats.org/wordprocessingml/2006/main" xmlns:w14="http://schemas.microsoft.com/office/word/2010/wordml" xmlns:w15="http://schemas.microsoft.com/office/word/2012/wordml" xmlns:w16cex="http://schemas.microsoft.com/office/word/2018/wordml/cex" xmlns:w16cid="http://schemas.microsoft.com/office/word/2016/wordml/cid" xmlns:w16="http://schemas.microsoft.com/office/word/2018/wordml" xmlns:w16du="http://schemas.microsoft.com/office/word/2023/wordml/word16du" xmlns:w16sdtdh="http://schemas.microsoft.com/office/word/2020/wordml/sdtdatahash" xmlns:w16sdtfl="http://schemas.microsoft.com/office/word/2024/wordml/sdtformatlock" xmlns:w16se="http://schemas.microsoft.com/office/word/2015/wordml/symex" xmlns:wpg="http://schemas.microsoft.com/office/word/2010/wordprocessingGroup" xmlns:wpi="http://schemas.microsoft.com/office/word/2010/wordprocessingInk" xmlns:wne="http://schemas.microsoft.com/office/word/2006/wordml" xmlns:wps="http://schemas.microsoft.com/office/word/2010/wordprocessingShape" mc:Ignorable="w14 w15 w16se w16cid w16 w16cex w16sdtdh w16sdtfl w16du wp14">
+<w:document xmlns:wpc="http://schemas.microsoft.com/office/word/2010/wordprocessingCanvas" xmlns:cx="http://schemas.microsoft.com/office/drawing/2014/chartex" xmlns:cx1="http://schemas.microsoft.com/office/drawing/2015/9/8/chartex" xmlns:cx2="http://schemas.microsoft.com/office/drawing/2015/10/21/chartex" xmlns:cx3="http://schemas.microsoft.com/office/drawing/2016/5/9/chartex" xmlns:cx4="http://schemas.microsoft.com/office/drawing/2016/5/10/chartex" xmlns:cx5="http://schemas.microsoft.com/office/drawing/2016/5/11/chartex" xmlns:cx6="http://schemas.microsoft.com/office/drawing/2016/5/12/chartex" xmlns:cx7="http://schemas.microsoft.com/office/drawing/2016/5/13/chartex" xmlns:cx8="http://schemas.microsoft.com/office/drawing/2016/5/14/chartex" xmlns:mc="http://schemas.openxmlformats.org/markup-compatibility/2006" xmlns:aink="http://schemas.microsoft.com/office/drawing/2016/ink" xmlns:am3d="http://schemas.microsoft.com/office/drawing/2017/model3d" xmlns:o="urn:schemas-microsoft-com:office:office" xmlns:oel="http://schemas.microsoft.com/office/2019/extlst" xmlns:r="http://schemas.openxmlformats.org/officeDocument/2006/relationships" xmlns:m="http://schemas.openxmlformats.org/officeDocument/2006/math" xmlns:v="urn:schemas-microsoft-com:vml" xmlns:wp14="http://schemas.microsoft.com/office/word/2010/wordprocessingDrawing" xmlns:wp="http://schemas.openxmlformats.org/drawingml/2006/wordprocessingDrawing" xmlns:w10="urn:schemas-microsoft-com:office:word" xmlns:w="http://schemas.openxmlformats.org/wordprocessingml/2006/main" xmlns:w14="http://schemas.microsoft.com/office/word/2010/wordml" xmlns:w15="http://schemas.microsoft.com/office/word/2012/wordml" xmlns:w16cei="http://schemas.microsoft.com/office/word/2026/wordml/cei" xmlns:w16cex="http://schemas.microsoft.com/office/word/2018/wordml/cex" xmlns:w16cid="http://schemas.microsoft.com/office/word/2016/wordml/cid" xmlns:w16="http://schemas.microsoft.com/office/word/2018/wordml" xmlns:w16du="http://schemas.microsoft.com/office/word/2023/wordml/word16du" xmlns:w16sdtdh="http://schemas.microsoft.com/office/word/2020/wordml/sdtdatahash" xmlns:w16sdtfl="http://schemas.microsoft.com/office/word/2024/wordml/sdtformatlock" xmlns:w16se="http://schemas.microsoft.com/office/word/2015/wordml/symex" xmlns:wpg="http://schemas.microsoft.com/office/word/2010/wordprocessingGroup" xmlns:wpi="http://schemas.microsoft.com/office/word/2010/wordprocessingInk" xmlns:wne="http://schemas.microsoft.com/office/word/2006/wordml" xmlns:wps="http://schemas.microsoft.com/office/word/2010/wordprocessingShape" mc:Ignorable="w14 w15 w16se w16cid w16 w16cex w16sdtdh w16sdtfl w16du wp14">
   <w:body>
     <w:p>
       <w:pPr>
@@ -14,54 +14,1115 @@
     </w:p>
     <w:p>
       <w:pPr>
-        <w:spacing w:line="360" w:lineRule="auto"/>
+        <w:pStyle w:val="font-claude-response-body"/>
+        <w:ind w:firstLine="360"/>
         <w:jc w:val="center"/>
         <w:rPr>
           <w:rFonts w:ascii="Garamond" w:hAnsi="Garamond"/>
           <w:b/>
           <w:bCs/>
-          <w:sz w:val="32"/>
-          <w:szCs w:val="32"/>
-        </w:rPr>
-      </w:pPr>
+          <w:sz w:val="40"/>
+          <w:szCs w:val="40"/>
+        </w:rPr>
+      </w:pPr>
+      <w:commentRangeStart w:id="0"/>
+      <w:commentRangeStart w:id="1"/>
       <w:r>
         <w:rPr>
           <w:rFonts w:ascii="Garamond" w:hAnsi="Garamond"/>
           <w:b/>
           <w:bCs/>
-          <w:sz w:val="32"/>
-          <w:szCs w:val="32"/>
-        </w:rPr>
-        <w:t>Shifting Habitat Mosaics in Alaska’s largest river basins</w:t>
-      </w:r>
-    </w:p>
-    <w:p>
-      <w:pPr>
-        <w:spacing w:line="360" w:lineRule="auto"/>
-        <w:jc w:val="center"/>
-        <w:rPr>
-          <w:rFonts w:ascii="Garamond" w:hAnsi="Garamond"/>
-        </w:rPr>
-      </w:pPr>
-      <w:r>
-        <w:rPr>
-          <w:rFonts w:ascii="Garamond" w:hAnsi="Garamond"/>
-        </w:rPr>
-        <w:t>Ben Makhlouf, Daniel E. Schindler, Timothy J Cline</w:t>
-      </w:r>
-    </w:p>
-    <w:p>
-      <w:pPr>
-        <w:spacing w:line="360" w:lineRule="auto"/>
-        <w:rPr>
+          <w:sz w:val="40"/>
+          <w:szCs w:val="40"/>
+        </w:rPr>
+        <w:t>Biological and landscape complexity improve ecosystem resilience through a shifting habitat mosaic</w:t>
+      </w:r>
+      <w:commentRangeEnd w:id="0"/>
+      <w:r>
+        <w:rPr>
+          <w:rStyle w:val="CommentReference"/>
           <w:rFonts w:ascii="Garamond" w:hAnsi="Garamond"/>
           <w:b/>
           <w:bCs/>
-        </w:rPr>
-      </w:pPr>
-    </w:p>
-    <w:p>
-      <w:pPr>
+          <w:sz w:val="40"/>
+          <w:szCs w:val="40"/>
+        </w:rPr>
+        <w:commentReference w:id="0"/>
+      </w:r>
+      <w:commentRangeEnd w:id="1"/>
+      <w:r>
+        <w:rPr>
+          <w:rStyle w:val="CommentReference"/>
+          <w:rFonts w:ascii="Garamond" w:hAnsi="Garamond"/>
+          <w:b/>
+          <w:bCs/>
+          <w:sz w:val="40"/>
+          <w:szCs w:val="40"/>
+        </w:rPr>
+        <w:commentReference w:id="1"/>
+      </w:r>
+    </w:p>
+    <w:p>
+      <w:pPr>
+        <w:pStyle w:val="font-claude-response-body"/>
+        <w:ind w:firstLine="360"/>
+        <w:rPr>
+          <w:rFonts w:ascii="Garamond" w:hAnsi="Garamond"/>
+        </w:rPr>
+      </w:pPr>
+    </w:p>
+    <w:p>
+      <w:pPr>
+        <w:pStyle w:val="font-claude-response-body"/>
+        <w:ind w:firstLine="360"/>
+        <w:jc w:val="center"/>
+        <w:rPr>
+          <w:rFonts w:ascii="Garamond" w:hAnsi="Garamond"/>
+        </w:rPr>
+      </w:pPr>
+      <w:r>
+        <w:rPr>
+          <w:rFonts w:ascii="Garamond" w:hAnsi="Garamond"/>
+        </w:rPr>
+        <w:t>Ben Makhlouf, Daniel E. Schindler, Timothy J Cline, Diego Fernandez,.. others?</w:t>
+      </w:r>
+    </w:p>
+    <w:p>
+      <w:pPr>
+        <w:suppressLineNumbers/>
+        <w:spacing w:after="0" w:line="240" w:lineRule="auto"/>
+        <w:rPr>
+          <w:rFonts w:ascii="Garamond" w:eastAsia="Times New Roman" w:hAnsi="Garamond" w:cs="Times New Roman"/>
+          <w:b/>
+          <w:bCs/>
+          <w:kern w:val="0"/>
+          <w14:ligatures w14:val="none"/>
+        </w:rPr>
+      </w:pPr>
+    </w:p>
+    <w:p>
+      <w:pPr>
+        <w:spacing w:after="0" w:line="480" w:lineRule="auto"/>
+        <w:ind w:firstLine="720"/>
+        <w:rPr>
+          <w:rFonts w:ascii="Garamond" w:eastAsia="Times New Roman" w:hAnsi="Garamond" w:cs="Times New Roman"/>
+          <w:kern w:val="0"/>
+          <w14:ligatures w14:val="none"/>
+        </w:rPr>
+      </w:pPr>
+      <w:r>
+        <w:rPr>
+          <w:rFonts w:ascii="Garamond" w:eastAsia="Times New Roman" w:hAnsi="Garamond" w:cs="Times New Roman"/>
+          <w:kern w:val="0"/>
+          <w14:ligatures w14:val="none"/>
+        </w:rPr>
+        <w:t>Growing recognition of the role of ecological complexity in shaping ecosystem function has motivated efforts to conserve landscape heterogeneity, species diversity, and intrapopulation trait variability</w:t>
+      </w:r>
+      <w:r>
+        <w:rPr>
+          <w:rFonts w:ascii="Garamond" w:eastAsia="Times New Roman" w:hAnsi="Garamond" w:cs="Times New Roman"/>
+          <w:kern w:val="0"/>
+          <w14:ligatures w14:val="none"/>
+        </w:rPr>
+        <w:t xml:space="preserve"> across ecosystems and species</w:t>
+      </w:r>
+      <w:r>
+        <w:rPr>
+          <w:rFonts w:ascii="Garamond" w:eastAsia="Times New Roman" w:hAnsi="Garamond" w:cs="Times New Roman"/>
+          <w:kern w:val="0"/>
+          <w14:ligatures w14:val="none"/>
+        </w:rPr>
+        <w:t xml:space="preserve"> [ref, ref]</w:t>
+      </w:r>
+      <w:r>
+        <w:rPr>
+          <w:rFonts w:ascii="Garamond" w:eastAsia="Times New Roman" w:hAnsi="Garamond" w:cs="Times New Roman"/>
+          <w:kern w:val="0"/>
+          <w14:ligatures w14:val="none"/>
+        </w:rPr>
+        <w:t>. These efforts are grounded in an expanding understanding that complex ecosystems enhance the reliability of ecosystem service delivery and increase resilience to environmental change</w:t>
+      </w:r>
+      <w:r>
+        <w:rPr>
+          <w:rFonts w:ascii="Garamond" w:eastAsia="Times New Roman" w:hAnsi="Garamond" w:cs="Times New Roman"/>
+          <w:kern w:val="0"/>
+          <w14:ligatures w14:val="none"/>
+        </w:rPr>
+        <w:t xml:space="preserve"> [ref, ref, ref]</w:t>
+      </w:r>
+      <w:r>
+        <w:rPr>
+          <w:rFonts w:ascii="Garamond" w:eastAsia="Times New Roman" w:hAnsi="Garamond" w:cs="Times New Roman"/>
+          <w:kern w:val="0"/>
+          <w14:ligatures w14:val="none"/>
+        </w:rPr>
+        <w:t>. However, many ecosystems have been substantially altered by processes such as habitat fragmentation, land-use change, and overharvest, which erode this complexity</w:t>
+      </w:r>
+      <w:r>
+        <w:rPr>
+          <w:rFonts w:ascii="Garamond" w:eastAsia="Times New Roman" w:hAnsi="Garamond" w:cs="Times New Roman"/>
+          <w:kern w:val="0"/>
+          <w14:ligatures w14:val="none"/>
+        </w:rPr>
+        <w:t xml:space="preserve"> [ref., ref, ref]</w:t>
+      </w:r>
+      <w:r>
+        <w:rPr>
+          <w:rFonts w:ascii="Garamond" w:eastAsia="Times New Roman" w:hAnsi="Garamond" w:cs="Times New Roman"/>
+          <w:kern w:val="0"/>
+          <w14:ligatures w14:val="none"/>
+        </w:rPr>
+        <w:t xml:space="preserve">. As anthropogenic pressures continue to expand globally, these and other drivers are contributing to a widespread trend of ecosystem simplification despite an incomplete understanding of the functional role of ecological complexity and the consequences of its </w:t>
+      </w:r>
+      <w:commentRangeStart w:id="2"/>
+      <w:r>
+        <w:rPr>
+          <w:rFonts w:ascii="Garamond" w:eastAsia="Times New Roman" w:hAnsi="Garamond" w:cs="Times New Roman"/>
+          <w:kern w:val="0"/>
+          <w14:ligatures w14:val="none"/>
+        </w:rPr>
+        <w:t>loss</w:t>
+      </w:r>
+      <w:commentRangeEnd w:id="2"/>
+      <w:r>
+        <w:rPr>
+          <w:rStyle w:val="CommentReference"/>
+          <w:rFonts w:ascii="Garamond" w:eastAsia="Times New Roman" w:hAnsi="Garamond" w:cs="Times New Roman"/>
+          <w:kern w:val="0"/>
+          <w:sz w:val="24"/>
+          <w:szCs w:val="24"/>
+          <w14:ligatures w14:val="none"/>
+        </w:rPr>
+        <w:commentReference w:id="2"/>
+      </w:r>
+      <w:r>
+        <w:rPr>
+          <w:rFonts w:ascii="Garamond" w:eastAsia="Times New Roman" w:hAnsi="Garamond" w:cs="Times New Roman"/>
+          <w:kern w:val="0"/>
+          <w14:ligatures w14:val="none"/>
+        </w:rPr>
+        <w:t>.</w:t>
+      </w:r>
+    </w:p>
+    <w:p>
+      <w:pPr>
+        <w:spacing w:after="0" w:line="480" w:lineRule="auto"/>
+        <w:ind w:firstLine="720"/>
+        <w:rPr>
+          <w:rFonts w:ascii="Garamond" w:eastAsia="Times New Roman" w:hAnsi="Garamond" w:cs="Times New Roman"/>
+          <w:kern w:val="0"/>
+          <w14:ligatures w14:val="none"/>
+        </w:rPr>
+      </w:pPr>
+      <w:commentRangeStart w:id="3"/>
+      <w:r>
+        <w:rPr>
+          <w:rFonts w:ascii="Garamond" w:eastAsia="Times New Roman" w:hAnsi="Garamond" w:cs="Times New Roman"/>
+          <w:kern w:val="0"/>
+          <w14:ligatures w14:val="none"/>
+        </w:rPr>
+        <w:t>Biocomplexity</w:t>
+      </w:r>
+      <w:commentRangeEnd w:id="3"/>
+      <w:r>
+        <w:rPr>
+          <w:rStyle w:val="CommentReference"/>
+          <w:rFonts w:ascii="Garamond" w:eastAsia="Times New Roman" w:hAnsi="Garamond" w:cs="Times New Roman"/>
+          <w:kern w:val="0"/>
+          <w:sz w:val="24"/>
+          <w:szCs w:val="24"/>
+          <w14:ligatures w14:val="none"/>
+        </w:rPr>
+        <w:commentReference w:id="3"/>
+      </w:r>
+      <w:r>
+        <w:rPr>
+          <w:rFonts w:ascii="Garamond" w:eastAsia="Times New Roman" w:hAnsi="Garamond" w:cs="Times New Roman"/>
+          <w:kern w:val="0"/>
+          <w14:ligatures w14:val="none"/>
+        </w:rPr>
+        <w:t xml:space="preserve"> in ecosystems is generated by geological processes operating across a spectrum of timescales, from the formation of mountain ranges over geologic time to ongoing disturbance regimes such as glaciation, flooding, and erosion</w:t>
+      </w:r>
+      <w:r>
+        <w:rPr>
+          <w:rFonts w:ascii="Garamond" w:eastAsia="Times New Roman" w:hAnsi="Garamond" w:cs="Times New Roman"/>
+          <w:kern w:val="0"/>
+          <w14:ligatures w14:val="none"/>
+        </w:rPr>
+        <w:t xml:space="preserve"> [ref, ref]</w:t>
+      </w:r>
+      <w:r>
+        <w:rPr>
+          <w:rFonts w:ascii="Garamond" w:eastAsia="Times New Roman" w:hAnsi="Garamond" w:cs="Times New Roman"/>
+          <w:kern w:val="0"/>
+          <w14:ligatures w14:val="none"/>
+        </w:rPr>
+        <w:t>. Together, these processes generate a foundation of geomorphic features that vary across landscapes, often along topographic and elevational gradients. Aquatic habitats emerge from the interaction between this geomorphic template and hydrologic processes governing the generation, storage, and transport</w:t>
+      </w:r>
+      <w:r>
+        <w:rPr>
+          <w:rFonts w:ascii="Garamond" w:eastAsia="Times New Roman" w:hAnsi="Garamond" w:cs="Times New Roman"/>
+          <w:kern w:val="0"/>
+          <w14:ligatures w14:val="none"/>
+        </w:rPr>
+        <w:t xml:space="preserve"> </w:t>
+      </w:r>
+      <w:r>
+        <w:rPr>
+          <w:rFonts w:ascii="Garamond" w:eastAsia="Times New Roman" w:hAnsi="Garamond" w:cs="Times New Roman"/>
+          <w:kern w:val="0"/>
+          <w14:ligatures w14:val="none"/>
+        </w:rPr>
+        <w:t>of water</w:t>
+      </w:r>
+      <w:r>
+        <w:rPr>
+          <w:rFonts w:ascii="Garamond" w:eastAsia="Times New Roman" w:hAnsi="Garamond" w:cs="Times New Roman"/>
+          <w:kern w:val="0"/>
+          <w14:ligatures w14:val="none"/>
+        </w:rPr>
+        <w:t xml:space="preserve"> [ref, ref]. </w:t>
+      </w:r>
+      <w:r>
+        <w:rPr>
+          <w:rFonts w:ascii="Garamond" w:eastAsia="Times New Roman" w:hAnsi="Garamond" w:cs="Times New Roman"/>
+          <w:kern w:val="0"/>
+          <w14:ligatures w14:val="none"/>
+        </w:rPr>
+        <w:t xml:space="preserve">As regional climate signals that influence these dynamics (i.e. precipitation, temperature) are filtered through local geomorphic features, the resulting interaction produces a spatially </w:t>
+      </w:r>
+      <w:r>
+        <w:rPr>
+          <w:rFonts w:ascii="Garamond" w:eastAsia="Times New Roman" w:hAnsi="Garamond" w:cs="Times New Roman"/>
+          <w:kern w:val="0"/>
+          <w14:ligatures w14:val="none"/>
+        </w:rPr>
+        <w:lastRenderedPageBreak/>
+        <w:t xml:space="preserve">heterogeneous </w:t>
+      </w:r>
+      <w:r>
+        <w:rPr>
+          <w:rFonts w:ascii="Garamond" w:eastAsia="Times New Roman" w:hAnsi="Garamond" w:cs="Times New Roman"/>
+          <w:kern w:val="0"/>
+          <w14:ligatures w14:val="none"/>
+        </w:rPr>
+        <w:t xml:space="preserve">mosaic of biophysically distinct habitats across watersheds. </w:t>
+      </w:r>
+      <w:r>
+        <w:rPr>
+          <w:rFonts w:ascii="Garamond" w:eastAsia="Times New Roman" w:hAnsi="Garamond" w:cs="Times New Roman"/>
+          <w:kern w:val="0"/>
+          <w14:ligatures w14:val="none"/>
+        </w:rPr>
+        <w:t>As</w:t>
+      </w:r>
+      <w:r>
+        <w:rPr>
+          <w:rFonts w:ascii="Garamond" w:eastAsia="Times New Roman" w:hAnsi="Garamond" w:cs="Times New Roman"/>
+          <w:kern w:val="0"/>
+          <w14:ligatures w14:val="none"/>
+        </w:rPr>
+        <w:t xml:space="preserve"> climatic forcing shifts through time</w:t>
+      </w:r>
+      <w:r>
+        <w:rPr>
+          <w:rFonts w:ascii="Garamond" w:eastAsia="Times New Roman" w:hAnsi="Garamond" w:cs="Times New Roman"/>
+          <w:kern w:val="0"/>
+          <w14:ligatures w14:val="none"/>
+        </w:rPr>
+        <w:t>,</w:t>
+      </w:r>
+      <w:r>
+        <w:rPr>
+          <w:rFonts w:ascii="Garamond" w:eastAsia="Times New Roman" w:hAnsi="Garamond" w:cs="Times New Roman"/>
+          <w:kern w:val="0"/>
+          <w14:ligatures w14:val="none"/>
+        </w:rPr>
+        <w:t xml:space="preserve"> this mosaic is continually reorganized across the landscape. </w:t>
+      </w:r>
+      <w:r>
+        <w:rPr>
+          <w:rFonts w:ascii="Garamond" w:eastAsia="Times New Roman" w:hAnsi="Garamond" w:cs="Times New Roman"/>
+          <w:kern w:val="0"/>
+          <w14:ligatures w14:val="none"/>
+        </w:rPr>
+        <w:t>A</w:t>
+      </w:r>
+      <w:r>
+        <w:rPr>
+          <w:rFonts w:ascii="Garamond" w:eastAsia="Times New Roman" w:hAnsi="Garamond" w:cs="Times New Roman"/>
+          <w:kern w:val="0"/>
+          <w14:ligatures w14:val="none"/>
+        </w:rPr>
+        <w:t xml:space="preserve">quatic ecosystems can </w:t>
+      </w:r>
+      <w:r>
+        <w:rPr>
+          <w:rFonts w:ascii="Garamond" w:eastAsia="Times New Roman" w:hAnsi="Garamond" w:cs="Times New Roman"/>
+          <w:kern w:val="0"/>
+          <w14:ligatures w14:val="none"/>
+        </w:rPr>
+        <w:t xml:space="preserve">therefore </w:t>
+      </w:r>
+      <w:r>
+        <w:rPr>
+          <w:rFonts w:ascii="Garamond" w:eastAsia="Times New Roman" w:hAnsi="Garamond" w:cs="Times New Roman"/>
+          <w:kern w:val="0"/>
+          <w14:ligatures w14:val="none"/>
+        </w:rPr>
+        <w:t xml:space="preserve">be conceptualized as a “shifting habitat mosaic,” </w:t>
+      </w:r>
+      <w:commentRangeStart w:id="4"/>
+      <w:r>
+        <w:rPr>
+          <w:rFonts w:ascii="Garamond" w:eastAsia="Times New Roman" w:hAnsi="Garamond" w:cs="Times New Roman"/>
+          <w:kern w:val="0"/>
+          <w14:ligatures w14:val="none"/>
+        </w:rPr>
+        <w:t xml:space="preserve">[ref] </w:t>
+      </w:r>
+      <w:commentRangeEnd w:id="4"/>
+      <w:r>
+        <w:rPr>
+          <w:rStyle w:val="CommentReference"/>
+          <w:rFonts w:ascii="Garamond" w:eastAsia="Times New Roman" w:hAnsi="Garamond" w:cs="Times New Roman"/>
+          <w:kern w:val="0"/>
+          <w:sz w:val="24"/>
+          <w:szCs w:val="24"/>
+          <w14:ligatures w14:val="none"/>
+        </w:rPr>
+        <w:commentReference w:id="4"/>
+      </w:r>
+      <w:r>
+        <w:rPr>
+          <w:rFonts w:ascii="Garamond" w:eastAsia="Times New Roman" w:hAnsi="Garamond" w:cs="Times New Roman"/>
+          <w:kern w:val="0"/>
+          <w14:ligatures w14:val="none"/>
+        </w:rPr>
+        <w:t>in which</w:t>
+      </w:r>
+      <w:r>
+        <w:rPr>
+          <w:rFonts w:ascii="Garamond" w:eastAsia="Times New Roman" w:hAnsi="Garamond" w:cs="Times New Roman"/>
+          <w:kern w:val="0"/>
+          <w14:ligatures w14:val="none"/>
+        </w:rPr>
+        <w:t xml:space="preserve"> patches of local</w:t>
+      </w:r>
+      <w:r>
+        <w:rPr>
+          <w:rFonts w:ascii="Garamond" w:eastAsia="Times New Roman" w:hAnsi="Garamond" w:cs="Times New Roman"/>
+          <w:kern w:val="0"/>
+          <w14:ligatures w14:val="none"/>
+        </w:rPr>
+        <w:t xml:space="preserve"> habitat conditions are dynamically redistributed through space and time</w:t>
+      </w:r>
+      <w:r>
+        <w:rPr>
+          <w:rFonts w:ascii="Garamond" w:eastAsia="Times New Roman" w:hAnsi="Garamond" w:cs="Times New Roman"/>
+          <w:kern w:val="0"/>
+          <w14:ligatures w14:val="none"/>
+        </w:rPr>
+        <w:t xml:space="preserve">. </w:t>
+      </w:r>
+      <w:r>
+        <w:rPr>
+          <w:rFonts w:ascii="Garamond" w:eastAsia="Times New Roman" w:hAnsi="Garamond" w:cs="Times New Roman"/>
+          <w:kern w:val="0"/>
+          <w14:ligatures w14:val="none"/>
+        </w:rPr>
+        <w:t xml:space="preserve">In doing so, the shifting habitat mosaic continually reorganizes the ecological and evolutionary pressures experienced across the system, generating biocomplexity as populations </w:t>
+      </w:r>
+      <w:r>
+        <w:rPr>
+          <w:rFonts w:ascii="Garamond" w:eastAsia="Times New Roman" w:hAnsi="Garamond" w:cs="Times New Roman"/>
+          <w:kern w:val="0"/>
+          <w14:ligatures w14:val="none"/>
+        </w:rPr>
+        <w:t>respond</w:t>
+      </w:r>
+      <w:r>
+        <w:rPr>
+          <w:rFonts w:ascii="Garamond" w:eastAsia="Times New Roman" w:hAnsi="Garamond" w:cs="Times New Roman"/>
+          <w:kern w:val="0"/>
+          <w14:ligatures w14:val="none"/>
+        </w:rPr>
+        <w:t xml:space="preserve"> to changing local selective environments.</w:t>
+      </w:r>
+      <w:r>
+        <w:rPr>
+          <w:rFonts w:ascii="Garamond" w:eastAsia="Times New Roman" w:hAnsi="Garamond" w:cs="Times New Roman"/>
+          <w:kern w:val="0"/>
+          <w14:ligatures w14:val="none"/>
+        </w:rPr>
+        <w:t xml:space="preserve"> </w:t>
+      </w:r>
+      <w:r>
+        <w:rPr>
+          <w:rFonts w:ascii="Garamond" w:eastAsia="Times New Roman" w:hAnsi="Garamond" w:cs="Times New Roman"/>
+          <w:kern w:val="0"/>
+          <w14:ligatures w14:val="none"/>
+        </w:rPr>
+        <w:t>[ref, ref , ref]</w:t>
+      </w:r>
+      <w:r>
+        <w:rPr>
+          <w:rFonts w:ascii="Garamond" w:eastAsia="Times New Roman" w:hAnsi="Garamond" w:cs="Times New Roman"/>
+          <w:kern w:val="0"/>
+          <w14:ligatures w14:val="none"/>
+        </w:rPr>
+        <w:t xml:space="preserve">. </w:t>
+      </w:r>
+    </w:p>
+    <w:p>
+      <w:pPr>
+        <w:spacing w:after="0" w:line="480" w:lineRule="auto"/>
+        <w:ind w:firstLine="720"/>
+        <w:rPr>
+          <w:rFonts w:ascii="Garamond" w:eastAsia="Times New Roman" w:hAnsi="Garamond" w:cs="Times New Roman"/>
+          <w:kern w:val="0"/>
+          <w14:ligatures w14:val="none"/>
+        </w:rPr>
+      </w:pPr>
+      <w:r>
+        <w:rPr>
+          <w:rFonts w:ascii="Garamond" w:eastAsia="Times New Roman" w:hAnsi="Garamond" w:cs="Times New Roman"/>
+          <w:kern w:val="0"/>
+          <w14:ligatures w14:val="none"/>
+        </w:rPr>
+        <w:t>Salmon populations provide a well-documented example of ecological and evolutionary responses that emerge from ecosystem complexity</w:t>
+      </w:r>
+      <w:r>
+        <w:rPr>
+          <w:rFonts w:ascii="Garamond" w:eastAsia="Times New Roman" w:hAnsi="Garamond" w:cs="Times New Roman"/>
+          <w:kern w:val="0"/>
+          <w14:ligatures w14:val="none"/>
+        </w:rPr>
+        <w:t>. Salmon</w:t>
+      </w:r>
+      <w:r>
+        <w:rPr>
+          <w:rFonts w:ascii="Garamond" w:eastAsia="Times New Roman" w:hAnsi="Garamond" w:cs="Times New Roman"/>
+          <w:kern w:val="0"/>
+          <w14:ligatures w14:val="none"/>
+        </w:rPr>
+        <w:t xml:space="preserve"> ecosystems are structured as aggregates of subpopulations that differ in spatial patterns of habitat use, life-history strategies, and local morphological adaptations (Hilborn et al. 2003). </w:t>
+      </w:r>
+      <w:r>
+        <w:rPr>
+          <w:rFonts w:ascii="Garamond" w:eastAsia="Times New Roman" w:hAnsi="Garamond" w:cs="Times New Roman"/>
+          <w:kern w:val="0"/>
+          <w14:ligatures w14:val="none"/>
+        </w:rPr>
+        <w:t>Across</w:t>
+      </w:r>
+      <w:r>
+        <w:rPr>
+          <w:rFonts w:ascii="Garamond" w:eastAsia="Times New Roman" w:hAnsi="Garamond" w:cs="Times New Roman"/>
+          <w:kern w:val="0"/>
+          <w14:ligatures w14:val="none"/>
+        </w:rPr>
+        <w:t xml:space="preserve"> geologically diverse ecosystems, individuals experience variable selective pressures that act on flexible life-history traits, producing variation in their expression among </w:t>
+      </w:r>
+      <w:r>
+        <w:rPr>
+          <w:rFonts w:ascii="Garamond" w:eastAsia="Times New Roman" w:hAnsi="Garamond" w:cs="Times New Roman"/>
+          <w:kern w:val="0"/>
+          <w14:ligatures w14:val="none"/>
+        </w:rPr>
+        <w:t xml:space="preserve">the population </w:t>
+      </w:r>
+      <w:r>
+        <w:rPr>
+          <w:rFonts w:ascii="Garamond" w:eastAsia="Times New Roman" w:hAnsi="Garamond" w:cs="Times New Roman"/>
+          <w:kern w:val="0"/>
+          <w14:ligatures w14:val="none"/>
+        </w:rPr>
+        <w:t xml:space="preserve">(Schindler et al. 2010). </w:t>
+      </w:r>
+      <w:r>
+        <w:rPr>
+          <w:rFonts w:ascii="Garamond" w:eastAsia="Times New Roman" w:hAnsi="Garamond" w:cs="Times New Roman"/>
+          <w:kern w:val="0"/>
+          <w14:ligatures w14:val="none"/>
+        </w:rPr>
+        <w:t>The resulting trait diversity among subpopulations generates spatial variation in population performance (e.g., growth and productivity) through interactions between locally adapted traits and habitat conditions.</w:t>
+      </w:r>
+      <w:r>
+        <w:rPr>
+          <w:rFonts w:ascii="Garamond" w:eastAsia="Times New Roman" w:hAnsi="Garamond" w:cs="Times New Roman"/>
+          <w:kern w:val="0"/>
+          <w14:ligatures w14:val="none"/>
+        </w:rPr>
+        <w:t xml:space="preserve"> </w:t>
+      </w:r>
+      <w:r>
+        <w:rPr>
+          <w:rFonts w:ascii="Garamond" w:eastAsia="Times New Roman" w:hAnsi="Garamond" w:cs="Times New Roman"/>
+          <w:kern w:val="0"/>
+          <w14:ligatures w14:val="none"/>
+        </w:rPr>
+        <w:t>As the shifting habitat mosaic changes through time, the locations of favorable habitat conditions shift across the landscape, producing asynchronous population dynamics among subpopulations.</w:t>
+      </w:r>
+      <w:r>
+        <w:rPr>
+          <w:rFonts w:ascii="Garamond" w:eastAsia="Times New Roman" w:hAnsi="Garamond" w:cs="Times New Roman"/>
+          <w:kern w:val="0"/>
+          <w14:ligatures w14:val="none"/>
+        </w:rPr>
+        <w:t xml:space="preserve"> </w:t>
+      </w:r>
+      <w:r>
+        <w:rPr>
+          <w:rFonts w:ascii="Garamond" w:eastAsia="Times New Roman" w:hAnsi="Garamond" w:cs="Times New Roman"/>
+          <w:kern w:val="0"/>
+          <w14:ligatures w14:val="none"/>
+        </w:rPr>
+        <w:t>Because complex, hydrologically connected ecosystems generate a continuum of habitat conditions under the same climatic forcing, favorable conditions are likely to persist somewhere within the landscape despite changing environmental conditions.</w:t>
+      </w:r>
+      <w:r>
+        <w:rPr>
+          <w:rFonts w:ascii="Garamond" w:eastAsia="Times New Roman" w:hAnsi="Garamond" w:cs="Times New Roman"/>
+          <w:kern w:val="0"/>
+          <w14:ligatures w14:val="none"/>
+        </w:rPr>
+        <w:t xml:space="preserve"> As a result</w:t>
+      </w:r>
+      <w:r>
+        <w:rPr>
+          <w:rFonts w:ascii="Garamond" w:eastAsia="Times New Roman" w:hAnsi="Garamond" w:cs="Times New Roman"/>
+          <w:kern w:val="0"/>
+          <w14:ligatures w14:val="none"/>
+        </w:rPr>
+        <w:t>, ecosystem-level performance is buffered against localized declines as periods of poor performance in one region are offset by favorable conditions elsewhere in the watershed.</w:t>
+      </w:r>
+      <w:r>
+        <w:rPr>
+          <w:rFonts w:ascii="Garamond" w:eastAsia="Times New Roman" w:hAnsi="Garamond" w:cs="Times New Roman"/>
+          <w:kern w:val="0"/>
+          <w14:ligatures w14:val="none"/>
+        </w:rPr>
+        <w:t xml:space="preserve"> </w:t>
+      </w:r>
+      <w:r>
+        <w:rPr>
+          <w:rFonts w:ascii="Garamond" w:eastAsia="Times New Roman" w:hAnsi="Garamond" w:cs="Times New Roman"/>
+          <w:kern w:val="0"/>
+          <w14:ligatures w14:val="none"/>
+        </w:rPr>
+        <w:t>This pattern produces a portfolio effect, whereby ecosystem-scale performance (e.g., fishery returns) is buffered against climatic variability through asynchronous dynamics among subpopulations, analogous to diversification in a financial portfolio</w:t>
+      </w:r>
+      <w:r>
+        <w:rPr>
+          <w:rFonts w:ascii="Garamond" w:eastAsia="Times New Roman" w:hAnsi="Garamond" w:cs="Times New Roman"/>
+          <w:kern w:val="0"/>
+          <w14:ligatures w14:val="none"/>
+        </w:rPr>
+        <w:t xml:space="preserve"> </w:t>
+      </w:r>
+      <w:r>
+        <w:rPr>
+          <w:rFonts w:ascii="Garamond" w:eastAsia="Times New Roman" w:hAnsi="Garamond" w:cs="Times New Roman"/>
+          <w:kern w:val="0"/>
+          <w14:ligatures w14:val="none"/>
+        </w:rPr>
+        <w:t xml:space="preserve">(Schindler et </w:t>
+      </w:r>
+      <w:r>
+        <w:rPr>
+          <w:rFonts w:ascii="Garamond" w:eastAsia="Times New Roman" w:hAnsi="Garamond" w:cs="Times New Roman"/>
+          <w:kern w:val="0"/>
+          <w14:ligatures w14:val="none"/>
+        </w:rPr>
+        <w:lastRenderedPageBreak/>
+        <w:t xml:space="preserve">al., Moore et al.). </w:t>
+      </w:r>
+      <w:r>
+        <w:rPr>
+          <w:rFonts w:ascii="Garamond" w:eastAsia="Times New Roman" w:hAnsi="Garamond" w:cs="Times New Roman"/>
+          <w:kern w:val="0"/>
+          <w14:ligatures w14:val="none"/>
+        </w:rPr>
+        <w:t xml:space="preserve"> </w:t>
+      </w:r>
+      <w:r>
+        <w:rPr>
+          <w:rFonts w:ascii="Garamond" w:eastAsia="Times New Roman" w:hAnsi="Garamond" w:cs="Times New Roman"/>
+          <w:kern w:val="0"/>
+          <w14:ligatures w14:val="none"/>
+        </w:rPr>
+        <w:t>At the same time, shifting environmental conditions alter the relative success of locally adapted life-history strategies, maintaining biocomplexity within the population.</w:t>
+      </w:r>
+      <w:r>
+        <w:rPr>
+          <w:rFonts w:ascii="Garamond" w:eastAsia="Times New Roman" w:hAnsi="Garamond" w:cs="Times New Roman"/>
+          <w:kern w:val="0"/>
+          <w14:ligatures w14:val="none"/>
+        </w:rPr>
+        <w:t xml:space="preserve"> </w:t>
+      </w:r>
+      <w:r>
+        <w:rPr>
+          <w:rFonts w:ascii="Garamond" w:eastAsia="Times New Roman" w:hAnsi="Garamond" w:cs="Times New Roman"/>
+          <w:kern w:val="0"/>
+          <w14:ligatures w14:val="none"/>
+        </w:rPr>
+        <w:t>Landscape complexity therefore both generates and sustains the biocomplexity that underpins ecosystem resilience and reliable ecosystem functioning</w:t>
+      </w:r>
+      <w:r>
+        <w:rPr>
+          <w:rFonts w:ascii="Garamond" w:eastAsia="Times New Roman" w:hAnsi="Garamond" w:cs="Times New Roman"/>
+          <w:kern w:val="0"/>
+          <w14:ligatures w14:val="none"/>
+        </w:rPr>
+        <w:t xml:space="preserve">. </w:t>
+      </w:r>
+      <w:r>
+        <w:rPr>
+          <w:rFonts w:ascii="Garamond" w:eastAsia="Times New Roman" w:hAnsi="Garamond" w:cs="Times New Roman"/>
+          <w:kern w:val="0"/>
+          <w14:ligatures w14:val="none"/>
+        </w:rPr>
+        <w:t xml:space="preserve">The portfolio effect has been well documented in salmon populations across their </w:t>
+      </w:r>
+      <w:r>
+        <w:rPr>
+          <w:rFonts w:ascii="Garamond" w:eastAsia="Times New Roman" w:hAnsi="Garamond" w:cs="Times New Roman"/>
+          <w:kern w:val="0"/>
+          <w14:ligatures w14:val="none"/>
+        </w:rPr>
+        <w:t>range and</w:t>
+      </w:r>
+      <w:r>
+        <w:rPr>
+          <w:rFonts w:ascii="Garamond" w:eastAsia="Times New Roman" w:hAnsi="Garamond" w:cs="Times New Roman"/>
+          <w:kern w:val="0"/>
+          <w14:ligatures w14:val="none"/>
+        </w:rPr>
+        <w:t xml:space="preserve"> shifting habitat mosaics have been empirically demonstrated at the watershed scale in salmon ecosystems. However, less is understood about how temporal variation in population production is associated with the specific landscape features that generate biocomplexity, and how these relationships change through time.</w:t>
+      </w:r>
+    </w:p>
+    <w:p>
+      <w:pPr>
+        <w:spacing w:after="0" w:line="480" w:lineRule="auto"/>
+        <w:ind w:firstLine="720"/>
+        <w:rPr>
+          <w:rFonts w:ascii="Garamond" w:eastAsia="Times New Roman" w:hAnsi="Garamond" w:cs="Times New Roman"/>
+          <w:kern w:val="0"/>
+          <w14:ligatures w14:val="none"/>
+        </w:rPr>
+      </w:pPr>
+      <w:r>
+        <w:rPr>
+          <w:rFonts w:ascii="Garamond" w:eastAsia="Times New Roman" w:hAnsi="Garamond" w:cs="Times New Roman"/>
+          <w:kern w:val="0"/>
+          <w14:ligatures w14:val="none"/>
+        </w:rPr>
+        <w:t>Chinook salmon (</w:t>
+      </w:r>
+      <w:r>
+        <w:rPr>
+          <w:rFonts w:ascii="Garamond" w:eastAsia="Times New Roman" w:hAnsi="Garamond" w:cs="Times New Roman"/>
+          <w:i/>
+          <w:iCs/>
+          <w:kern w:val="0"/>
+          <w14:ligatures w14:val="none"/>
+        </w:rPr>
+        <w:t>Oncorhynchus tshawytscha</w:t>
+      </w:r>
+      <w:r>
+        <w:rPr>
+          <w:rFonts w:ascii="Garamond" w:eastAsia="Times New Roman" w:hAnsi="Garamond" w:cs="Times New Roman"/>
+          <w:kern w:val="0"/>
+          <w14:ligatures w14:val="none"/>
+        </w:rPr>
+        <w:t>) have experienced long-term declines across much of their range (Atlas et al.). In the southern portion of their range, these declines have been driven by the cumulative effects of declining hydrological connectivity, reduced habitat complexity, and changing climatic conditions over several decades. More recently, sustained declines have also been observed in western Alaska watersheds, which comprise a large proportion of the remaining global Chinook salmon habitat (ref). Chinook salmon populations in western Alaska's three major watersheds have historically sustained subsistence fisheries for dozens of rural Indigenous communities throughout the region, providing a critical source of food security and cultural continuity. In addition, these populations have supported lucrative commercial fisheries that contribute substantially to local and regional. Compared to ecosystems in British Columbia and the contiguous United States, western Alaska watersheds have experienced relatively limited anthropogenic impacts. As a result, these systems remain largely intact and exhibit greater landscape complexity and a stronger portfolio effect than lower-latitude systems (Griffiths)</w:t>
+      </w:r>
+      <w:r>
+        <w:rPr>
+          <w:rFonts w:ascii="Garamond" w:eastAsia="Times New Roman" w:hAnsi="Garamond" w:cs="Times New Roman"/>
+          <w:kern w:val="0"/>
+          <w14:ligatures w14:val="none"/>
+        </w:rPr>
+        <w:t xml:space="preserve">. </w:t>
+      </w:r>
+      <w:r>
+        <w:rPr>
+          <w:rFonts w:ascii="Garamond" w:eastAsia="Times New Roman" w:hAnsi="Garamond" w:cs="Times New Roman"/>
+          <w:kern w:val="0"/>
+          <w14:ligatures w14:val="none"/>
+        </w:rPr>
+        <w:t xml:space="preserve">However, increasing development and resource extraction in the region </w:t>
+      </w:r>
+      <w:r>
+        <w:rPr>
+          <w:rFonts w:ascii="Garamond" w:eastAsia="Times New Roman" w:hAnsi="Garamond" w:cs="Times New Roman"/>
+          <w:kern w:val="0"/>
+          <w14:ligatures w14:val="none"/>
+        </w:rPr>
+        <w:t>threatens</w:t>
+      </w:r>
+      <w:r>
+        <w:rPr>
+          <w:rFonts w:ascii="Garamond" w:eastAsia="Times New Roman" w:hAnsi="Garamond" w:cs="Times New Roman"/>
+          <w:kern w:val="0"/>
+          <w14:ligatures w14:val="none"/>
+        </w:rPr>
+        <w:t xml:space="preserve"> to degrade these functions. Coupled with recent changes to Chinook salmon demographic performance in Alaska, there is a </w:t>
+      </w:r>
+      <w:r>
+        <w:rPr>
+          <w:rFonts w:ascii="Garamond" w:eastAsia="Times New Roman" w:hAnsi="Garamond" w:cs="Times New Roman"/>
+          <w:kern w:val="0"/>
+          <w14:ligatures w14:val="none"/>
+        </w:rPr>
+        <w:lastRenderedPageBreak/>
+        <w:t xml:space="preserve">need to more completely understand how landscape complexity in these systems shape ecosystem performance to design effective conservation, management, and climate adaptation strategies. </w:t>
+      </w:r>
+    </w:p>
+    <w:p>
+      <w:pPr>
+        <w:spacing w:after="0" w:line="480" w:lineRule="auto"/>
+        <w:ind w:firstLine="720"/>
+        <w:rPr>
+          <w:rFonts w:ascii="Garamond" w:eastAsia="Times New Roman" w:hAnsi="Garamond" w:cs="Times New Roman"/>
+          <w:kern w:val="0"/>
+          <w14:ligatures w14:val="none"/>
+        </w:rPr>
+      </w:pPr>
+      <w:r>
+        <w:rPr>
+          <w:rFonts w:ascii="Garamond" w:eastAsia="Times New Roman" w:hAnsi="Garamond" w:cs="Times New Roman"/>
+          <w:kern w:val="0"/>
+          <w14:ligatures w14:val="none"/>
+        </w:rPr>
+        <w:t xml:space="preserve">Investigating basin-scale patterns in Alaska watersheds presents substantial challenges given their large spatial extent and </w:t>
+      </w:r>
+      <w:r>
+        <w:rPr>
+          <w:rFonts w:ascii="Garamond" w:eastAsia="Times New Roman" w:hAnsi="Garamond" w:cs="Times New Roman"/>
+          <w:kern w:val="0"/>
+          <w14:ligatures w14:val="none"/>
+        </w:rPr>
+        <w:t>isolation</w:t>
+      </w:r>
+      <w:r>
+        <w:rPr>
+          <w:rFonts w:ascii="Garamond" w:eastAsia="Times New Roman" w:hAnsi="Garamond" w:cs="Times New Roman"/>
+          <w:kern w:val="0"/>
+          <w14:ligatures w14:val="none"/>
+        </w:rPr>
+        <w:t>.</w:t>
+      </w:r>
+      <w:r>
+        <w:rPr>
+          <w:rFonts w:ascii="Garamond" w:eastAsia="Times New Roman" w:hAnsi="Garamond" w:cs="Times New Roman"/>
+          <w:kern w:val="0"/>
+          <w14:ligatures w14:val="none"/>
+        </w:rPr>
+        <w:t xml:space="preserve"> Given the lack of infrastructure relative to their scale, traditional monitoring methods such as telemetry or manual monitoring are limited in their ability to estimate basin-wide patterns of habitat use. Genetics based techniques such as genetic stock identification (GSI) </w:t>
+      </w:r>
+      <w:r>
+        <w:rPr>
+          <w:rFonts w:ascii="Garamond" w:eastAsia="Times New Roman" w:hAnsi="Garamond" w:cs="Times New Roman"/>
+          <w:kern w:val="0"/>
+          <w14:ligatures w14:val="none"/>
+        </w:rPr>
+        <w:t>a</w:t>
+      </w:r>
+      <w:r>
+        <w:rPr>
+          <w:rFonts w:ascii="Garamond" w:eastAsia="Times New Roman" w:hAnsi="Garamond" w:cs="Times New Roman"/>
+          <w:kern w:val="0"/>
+          <w14:ligatures w14:val="none"/>
+        </w:rPr>
+        <w:t>re a</w:t>
+      </w:r>
+      <w:r>
+        <w:rPr>
+          <w:rFonts w:ascii="Garamond" w:eastAsia="Times New Roman" w:hAnsi="Garamond" w:cs="Times New Roman"/>
+          <w:kern w:val="0"/>
+          <w14:ligatures w14:val="none"/>
+        </w:rPr>
+        <w:t xml:space="preserve"> popular tool for</w:t>
+      </w:r>
+      <w:r>
+        <w:rPr>
+          <w:rFonts w:ascii="Garamond" w:eastAsia="Times New Roman" w:hAnsi="Garamond" w:cs="Times New Roman"/>
+          <w:kern w:val="0"/>
+          <w14:ligatures w14:val="none"/>
+        </w:rPr>
+        <w:t xml:space="preserve"> estimating the spatial distribution of returning subpopulations for in-season management. However, these tools are limited by low genetic resolution for Chinook salmon in western Alaska watersheds and provide only a coarse estimate of provenance. </w:t>
+      </w:r>
+      <w:r>
+        <w:rPr>
+          <w:rFonts w:ascii="Garamond" w:eastAsia="Times New Roman" w:hAnsi="Garamond" w:cs="Times New Roman"/>
+          <w:kern w:val="0"/>
+          <w14:ligatures w14:val="none"/>
+        </w:rPr>
+        <w:t>An alternative approach to estimating provenance is the use of isotopic signatures recorded in ear stones (otoliths)</w:t>
+      </w:r>
+      <w:r>
+        <w:rPr>
+          <w:rFonts w:ascii="Garamond" w:eastAsia="Times New Roman" w:hAnsi="Garamond" w:cs="Times New Roman"/>
+          <w:kern w:val="0"/>
+          <w14:ligatures w14:val="none"/>
+        </w:rPr>
+        <w:t xml:space="preserve">. </w:t>
+      </w:r>
+      <w:r>
+        <w:rPr>
+          <w:rFonts w:ascii="Garamond" w:eastAsia="Times New Roman" w:hAnsi="Garamond" w:cs="Times New Roman"/>
+          <w:kern w:val="0"/>
+          <w14:ligatures w14:val="none"/>
+        </w:rPr>
+        <w:t xml:space="preserve">These structures incorporate environmental tracers from surrounding water into a metabolically inert calcium carbonate </w:t>
+      </w:r>
+      <w:r>
+        <w:rPr>
+          <w:rFonts w:ascii="Garamond" w:eastAsia="Times New Roman" w:hAnsi="Garamond" w:cs="Times New Roman"/>
+          <w:kern w:val="0"/>
+          <w14:ligatures w14:val="none"/>
+        </w:rPr>
+        <w:t>structure</w:t>
+      </w:r>
+      <w:r>
+        <w:rPr>
+          <w:rFonts w:ascii="Garamond" w:eastAsia="Times New Roman" w:hAnsi="Garamond" w:cs="Times New Roman"/>
+          <w:kern w:val="0"/>
+          <w14:ligatures w14:val="none"/>
+        </w:rPr>
+        <w:t xml:space="preserve"> that can be analyzed postmortem to reconstruct life-history characteristics. One such tracer is the strontium isotope ratio (</w:t>
+      </w:r>
+      <w:r>
+        <w:rPr>
+          <w:rFonts w:ascii="Cambria Math" w:eastAsia="Times New Roman" w:hAnsi="Cambria Math" w:cs="Cambria Math"/>
+          <w:kern w:val="0"/>
+          <w14:ligatures w14:val="none"/>
+        </w:rPr>
+        <w:t>⁸⁷</w:t>
+      </w:r>
+      <w:r>
+        <w:rPr>
+          <w:rFonts w:ascii="Garamond" w:eastAsia="Times New Roman" w:hAnsi="Garamond" w:cs="Times New Roman"/>
+          <w:kern w:val="0"/>
+          <w14:ligatures w14:val="none"/>
+        </w:rPr>
+        <w:t>Sr/</w:t>
+      </w:r>
+      <w:r>
+        <w:rPr>
+          <w:rFonts w:ascii="Cambria Math" w:eastAsia="Times New Roman" w:hAnsi="Cambria Math" w:cs="Cambria Math"/>
+          <w:kern w:val="0"/>
+          <w14:ligatures w14:val="none"/>
+        </w:rPr>
+        <w:t>⁸⁶</w:t>
+      </w:r>
+      <w:r>
+        <w:rPr>
+          <w:rFonts w:ascii="Garamond" w:eastAsia="Times New Roman" w:hAnsi="Garamond" w:cs="Times New Roman"/>
+          <w:kern w:val="0"/>
+          <w14:ligatures w14:val="none"/>
+        </w:rPr>
+        <w:t xml:space="preserve">Sr), which varies predictably across geologically diverse watersheds. </w:t>
+      </w:r>
+    </w:p>
+    <w:p>
+      <w:pPr>
+        <w:spacing w:after="0" w:line="480" w:lineRule="auto"/>
+        <w:ind w:firstLine="720"/>
+        <w:rPr>
+          <w:rFonts w:ascii="Garamond" w:eastAsia="Times New Roman" w:hAnsi="Garamond" w:cs="Times New Roman"/>
+          <w:kern w:val="0"/>
+          <w14:ligatures w14:val="none"/>
+        </w:rPr>
+      </w:pPr>
+    </w:p>
+    <w:p>
+      <w:pPr>
+        <w:spacing w:after="0" w:line="480" w:lineRule="auto"/>
+        <w:ind w:firstLine="720"/>
+        <w:rPr>
+          <w:rFonts w:ascii="Garamond" w:eastAsia="Times New Roman" w:hAnsi="Garamond" w:cs="Times New Roman"/>
+          <w:kern w:val="0"/>
+          <w14:ligatures w14:val="none"/>
+        </w:rPr>
+      </w:pPr>
+      <w:r>
+        <w:rPr>
+          <w:rFonts w:ascii="Garamond" w:eastAsia="Times New Roman" w:hAnsi="Garamond" w:cs="Times New Roman"/>
+          <w:kern w:val="0"/>
+          <w14:ligatures w14:val="none"/>
+        </w:rPr>
+        <w:t xml:space="preserve">Relating otolith </w:t>
+      </w:r>
+      <w:r>
+        <w:rPr>
+          <w:rFonts w:ascii="Cambria Math" w:eastAsia="Times New Roman" w:hAnsi="Cambria Math" w:cs="Cambria Math"/>
+          <w:kern w:val="0"/>
+          <w14:ligatures w14:val="none"/>
+        </w:rPr>
+        <w:t>⁸⁷</w:t>
+      </w:r>
+      <w:r>
+        <w:rPr>
+          <w:rFonts w:ascii="Garamond" w:eastAsia="Times New Roman" w:hAnsi="Garamond" w:cs="Times New Roman"/>
+          <w:kern w:val="0"/>
+          <w14:ligatures w14:val="none"/>
+        </w:rPr>
+        <w:t>Sr/</w:t>
+      </w:r>
+      <w:r>
+        <w:rPr>
+          <w:rFonts w:ascii="Cambria Math" w:eastAsia="Times New Roman" w:hAnsi="Cambria Math" w:cs="Cambria Math"/>
+          <w:kern w:val="0"/>
+          <w14:ligatures w14:val="none"/>
+        </w:rPr>
+        <w:t>⁸⁶</w:t>
+      </w:r>
+      <w:r>
+        <w:rPr>
+          <w:rFonts w:ascii="Garamond" w:eastAsia="Times New Roman" w:hAnsi="Garamond" w:cs="Times New Roman"/>
+          <w:kern w:val="0"/>
+          <w14:ligatures w14:val="none"/>
+        </w:rPr>
+        <w:t xml:space="preserve">Sr values to those measured or modeled across the landscape allows estimation of provenance based on this predictable relationship, enabling tributary-scale estimation of provenance without extensive sampling. </w:t>
+      </w:r>
+    </w:p>
+    <w:p>
+      <w:pPr>
+        <w:spacing w:after="0" w:line="480" w:lineRule="auto"/>
+        <w:ind w:firstLine="720"/>
+        <w:rPr>
+          <w:rFonts w:ascii="Garamond" w:eastAsia="Times New Roman" w:hAnsi="Garamond" w:cs="Times New Roman"/>
+          <w:kern w:val="0"/>
+          <w14:ligatures w14:val="none"/>
+        </w:rPr>
+      </w:pPr>
+    </w:p>
+    <w:p>
+      <w:pPr>
+        <w:spacing w:after="0" w:line="480" w:lineRule="auto"/>
+        <w:ind w:firstLine="720"/>
+        <w:rPr>
+          <w:rFonts w:ascii="Garamond" w:eastAsia="Times New Roman" w:hAnsi="Garamond" w:cs="Times New Roman"/>
+          <w:kern w:val="0"/>
+          <w14:ligatures w14:val="none"/>
+        </w:rPr>
+      </w:pPr>
+    </w:p>
+    <w:p>
+      <w:pPr>
+        <w:spacing w:after="0" w:line="480" w:lineRule="auto"/>
+        <w:ind w:firstLine="720"/>
+        <w:rPr>
+          <w:rFonts w:ascii="Garamond" w:eastAsia="Times New Roman" w:hAnsi="Garamond" w:cs="Times New Roman"/>
+          <w:kern w:val="0"/>
+          <w14:ligatures w14:val="none"/>
+        </w:rPr>
+      </w:pPr>
+      <w:r>
+        <w:rPr>
+          <w:rFonts w:ascii="Garamond" w:eastAsia="Times New Roman" w:hAnsi="Garamond" w:cs="Times New Roman"/>
+          <w:kern w:val="0"/>
+          <w14:ligatures w14:val="none"/>
+        </w:rPr>
+        <w:t>Because of the anadromous life history of salmon, otolith-based methods can be used to reconstruct freshwater habitat use from fish collected during their return migration in terminal fisheries, where they are readily sampled. As such, these approaches allow reconstruction of broad spatial patterns across river basins without the need for exhaustive sampling throughout the system.</w:t>
+      </w:r>
+    </w:p>
+    <w:p>
+      <w:pPr>
+        <w:spacing w:after="0" w:line="480" w:lineRule="auto"/>
+        <w:ind w:firstLine="720"/>
+        <w:rPr>
+          <w:rFonts w:ascii="Garamond" w:eastAsia="Times New Roman" w:hAnsi="Garamond" w:cs="Times New Roman"/>
+          <w:kern w:val="0"/>
+          <w14:ligatures w14:val="none"/>
+        </w:rPr>
+      </w:pPr>
+      <w:r>
+        <w:rPr>
+          <w:rFonts w:ascii="Garamond" w:eastAsia="Times New Roman" w:hAnsi="Garamond" w:cs="Times New Roman"/>
+          <w:kern w:val="0"/>
+          <w14:ligatures w14:val="none"/>
+        </w:rPr>
+        <w:lastRenderedPageBreak/>
+        <w:t>Here, we use otolith-based methods to estimate spatial patterns of natal habitat use by Chinook salmon in the Yukon, Kuskokwim, and (potentially) Nushagak river basins. From these data , collected over multiple years, we evaluate how spatial patterns of habitat use shift across spatial and temporal scales and how they relate to habitat and geomorphic features across the landscape. Finally, we examine how within-population complexity arising from this landscape heterogeneity contributes to ecosystem stability under environmental variability.</w:t>
+      </w:r>
+    </w:p>
+    <w:p>
+      <w:pPr>
+        <w:spacing w:after="0" w:line="240" w:lineRule="auto"/>
+        <w:rPr>
+          <w:rFonts w:ascii="Times New Roman" w:eastAsia="Times New Roman" w:hAnsi="Times New Roman" w:cs="Times New Roman"/>
+          <w:kern w:val="0"/>
+          <w14:ligatures w14:val="none"/>
+        </w:rPr>
+      </w:pPr>
+    </w:p>
+    <w:p>
+      <w:pPr>
+        <w:pStyle w:val="font-claude-response-body"/>
+        <w:spacing w:line="360" w:lineRule="auto"/>
+        <w:ind w:firstLine="360"/>
+        <w:rPr>
+          <w:rFonts w:ascii="Garamond" w:hAnsi="Garamond"/>
+        </w:rPr>
+      </w:pPr>
+    </w:p>
+    <w:p>
+      <w:pPr>
+        <w:pStyle w:val="font-claude-response-body"/>
+        <w:spacing w:line="360" w:lineRule="auto"/>
+        <w:ind w:firstLine="360"/>
+        <w:rPr>
+          <w:rFonts w:ascii="Garamond" w:hAnsi="Garamond"/>
+        </w:rPr>
+      </w:pPr>
+    </w:p>
+    <w:p>
+      <w:pPr>
+        <w:pStyle w:val="font-claude-response-body"/>
+        <w:spacing w:line="360" w:lineRule="auto"/>
+        <w:ind w:firstLine="360"/>
+        <w:rPr>
+          <w:rFonts w:ascii="Garamond" w:hAnsi="Garamond"/>
+        </w:rPr>
+      </w:pPr>
+    </w:p>
+    <w:p>
+      <w:pPr>
+        <w:pStyle w:val="font-claude-response-body"/>
+        <w:spacing w:line="360" w:lineRule="auto"/>
+        <w:ind w:firstLine="360"/>
+        <w:rPr>
+          <w:rFonts w:ascii="Garamond" w:hAnsi="Garamond"/>
+        </w:rPr>
+      </w:pPr>
+    </w:p>
+    <w:p>
+      <w:pPr>
+        <w:pStyle w:val="font-claude-response-body"/>
+        <w:spacing w:line="360" w:lineRule="auto"/>
+        <w:ind w:firstLine="360"/>
+        <w:rPr>
+          <w:rFonts w:ascii="Garamond" w:hAnsi="Garamond"/>
+        </w:rPr>
+      </w:pPr>
+    </w:p>
+    <w:p>
+      <w:pPr>
+        <w:pStyle w:val="font-claude-response-body"/>
+        <w:spacing w:line="360" w:lineRule="auto"/>
+        <w:ind w:firstLine="360"/>
+        <w:rPr>
+          <w:rFonts w:ascii="Garamond" w:hAnsi="Garamond"/>
+        </w:rPr>
+      </w:pPr>
+    </w:p>
+    <w:p>
+      <w:pPr>
+        <w:pStyle w:val="font-claude-response-body"/>
         <w:spacing w:line="360" w:lineRule="auto"/>
         <w:rPr>
           <w:rFonts w:ascii="Garamond" w:hAnsi="Garamond"/>
@@ -77,1209 +1138,29 @@
           <w:bCs/>
           <w:u w:val="single"/>
         </w:rPr>
-        <w:t xml:space="preserve">Introduction: </w:t>
-      </w:r>
-    </w:p>
-    <w:p>
-      <w:pPr>
-        <w:pStyle w:val="font-claude-response-body"/>
-        <w:spacing w:line="360" w:lineRule="auto"/>
-        <w:ind w:firstLine="360"/>
-        <w:rPr>
-          <w:rFonts w:ascii="Garamond" w:hAnsi="Garamond"/>
-        </w:rPr>
-      </w:pPr>
-      <w:r>
-        <w:rPr>
-          <w:rFonts w:ascii="Garamond" w:hAnsi="Garamond"/>
-        </w:rPr>
-        <w:t>Effective restoration of aquatic ecosystems depends on a clear understanding of the ecological processes that sustain healthy, intact systems</w:t>
-      </w:r>
-      <w:r>
-        <w:rPr>
-          <w:rFonts w:ascii="Garamond" w:hAnsi="Garamond"/>
-        </w:rPr>
-        <w:t xml:space="preserve"> </w:t>
-      </w:r>
-      <w:r>
-        <w:rPr>
-          <w:rFonts w:ascii="Garamond" w:hAnsi="Garamond"/>
-        </w:rPr>
-        <w:fldChar w:fldCharType="begin"/>
-      </w:r>
-      <w:r>
-        <w:rPr>
-          <w:rFonts w:ascii="Garamond" w:hAnsi="Garamond"/>
-        </w:rPr>
-        <w:instrText xml:space="preserve"> ADDIN ZOTERO_ITEM CSL_CITATION {"citationID":"qPxuaRiG","properties":{"formattedCitation":"(Jackson &amp; Hobbs, 2009; Menden-Deuer et al., 2023; Schoen et al., 2017; Wang et al., 2021)","plainCitation":"(Jackson &amp; Hobbs, 2009; Menden-Deuer et al., 2023; Schoen et al., 2017; Wang et al., 2021)","noteIndex":0},"citationItems":[{"id":6027,"uris":["http://zotero.org/users/8421274/items/QP3NBY2P"],"itemData":{"id":6027,"type":"article-journal","abstract":"Ecological history plays many roles in ecological restoration, most notably as a tool to identify and characterize appropriate targets for restoration efforts. However, ecological history also reveals deep human imprints on many ecological systems and indicates that secular climate change has kept many targets moving at centennial to millennial time scales. Past and ongoing environmental changes ensure that many historical restoration targets will be unsustainable in the coming decades. Ecological restoration efforts should aim to conserve and restore historical ecosystems where viable, while simultaneously preparing to design or steer emerging novel ecosystems to ensure maintenance of ecological goods and services.","container-title":"Science","DOI":"10.1126/science.1172977","issue":"5940","page":"567-569","publisher":"American Association for the Advancement of Science","source":"science.org (Atypon)","title":"Ecological Restoration in the Light of Ecological History","volume":"325","author":[{"family":"Jackson","given":"Stephen T."},{"family":"Hobbs","given":"Richard J."}],"issued":{"date-parts":[["2009",7,31]]}}},{"id":6032,"uris":["http://zotero.org/users/8421274/items/CCV5QFSN"],"itemData":{"id":6032,"type":"article-journal","abstract":"Climate-change is rapidly and intensively altering aquatic communities and habitats. While previous work has focused on direct effects of potential drivers, indirect and interactive effects on organisms and ecosystems have received less attention. Here, we give an overview of contributions to a special issue in Limnology and Oceanography that addresses this knowledge gap. Contributions covered diverse habitats, from polar to tropical regions, alpine streams to coral reefs. Several studies relied on time-series to identify indirect effects, thus emphasizing our need to maintain high-quality time-series data. Time-series are particularly crucial now that the pace of climate-change on aquatic-ecosystems is accelerating. Another common theme is the role of species-specific characteristics in physiology, behavior or genetics in aquatic ecosystem function. The addition of inter- and intra-specific variability to investigations of climate-change may be challenging particularly since ecosystem studies typically involve a large parameter space of environmental and biological variables across spatial and temporal scales. However, the results demonstrate that inclusion of species-specific dynamics, although challenging, can deliver mechanistic insights into aquatic ecosystem patterns and processes. Some contributions leverage habitat changes from disturbances or climate shifts to document capacity for resilience or recovery of pelagic and benthic communities. Jointly, the results in this special issue document fruitful approaches and provide urgent information needed for deciphering aquatic ecosystem responses to climate forcings. This information is foundational if we wish to tackle the combined effects of climate change and other human impacts with maximum efficacy and minimize unintended consequences for biodiversity and ecosystem functioning.","container-title":"Limnology and Oceanography","DOI":"10.1002/lno.12384","ISSN":"1939-5590","issue":"S1","language":"en","license":"© 2023 Association for the Sciences of Limnology and Oceanography.","note":"_eprint: https://aslopubs.onlinelibrary.wiley.com/doi/pdf/10.1002/lno.12384","page":"S1-S7","source":"Wiley Online Library","title":"Cascading, interactive, and indirect effects of climate change on aquatic communities, habitats, and ecosystems","volume":"68","author":[{"family":"Menden-Deuer","given":"Susanne"},{"family":"Mullarney","given":"Julia C."},{"family":"Boersma","given":"Maarten"},{"family":"Grossart","given":"Hans-Peter"},{"family":"Sponseller","given":"Ryan"},{"family":"Woodin","given":"Sarah Ann"}],"issued":{"date-parts":[["2023"]]}}},{"id":6051,"uris":["http://zotero.org/users/8421274/items/UPNXXHTQ"],"itemData":{"id":6051,"type":"article-journal","abstract":"Pacific salmon Oncorhynchus spp. face serious challenges from climate and landscape change, particularly in the southern portion of their native range. Conversely, climate warming appears to be allowing salmon to expand northwards into the Arctic. Between these geographic extremes, in the Gulf of Alaska region, salmon are at historically high abundances but face an uncertain future due to rapid environmental change. We examined changes in climate, hydrology, land cover, salmon populations, and fisheries over the past 30–70 years in this region. We focused on the Kenai River, which supports world-famous fisheries but where Chinook Salmon O. tshawytscha populations have declined, raising concerns about their future resilience. The region is warming and experiencing drier summers and wetter autumns. The landscape is also changing, with melting glaciers, wetland loss, wildfires, and human development. This environmental transformation will likely harm some salmon populations while benefiting others. Lowland salmon streams are especially vulnerable, but retreating glaciers may allow production gains in other streams. Some fishing communities harvest a diverse portfolio of fluctuating resources, whereas others have specialized over time, potentially limiting their resilience. Maintaining diverse habitats and salmon runs may allow ecosystems and fisheries to continue to thrive amidst these changes.","container-title":"Fisheries","DOI":"10.1080/03632415.2017.1374251","ISSN":"0363-2415","issue":"10","note":"_eprint: https://doi.org/10.1080/03632415.2017.1374251","page":"538-553","publisher":"Taylor &amp; Francis","source":"Taylor and Francis+NEJM","title":"Future of Pacific Salmon in the Face of Environmental Change: Lessons from One of the World's Remaining Productive Salmon Regions","title-short":"Future of Pacific Salmon in the Face of Environmental Change","volume":"42","author":[{"family":"Schoen","given":"Erik R."},{"family":"Wipfli","given":"Mark S."},{"family":"Trammell","given":"E. Jamie"},{"family":"Rinella","given":"Daniel J."},{"family":"Floyd","given":"Angelica L."},{"family":"Grunblatt","given":"Jess"},{"family":"McCarthy","given":"Molly D."},{"family":"Meyer","given":"Benjamin E."},{"family":"Morton","given":"John M."},{"family":"Powell","given":"James E."},{"family":"Prakash","given":"Anupma"},{"family":"Reimer","given":"Matthew N."},{"family":"Stuefer","given":"Svetlana L."},{"family":"Toniolo","given":"Horacio"},{"family":"Wells","given":"Brett M."},{"family":"Witmer","given":"Frank D. W."}],"issued":{"date-parts":[["2017",10,3]]}}},{"id":6029,"uris":["http://zotero.org/users/8421274/items/6FRQA8JV"],"itemData":{"id":6029,"type":"article-journal","abstract":"Inland aquatic ecosystems, such as streams, rivers, ponds and lakes, play an important role in maintaining global aquatic biodiversity and ecosystem services. They have been increasingly influenced by environmental change such as global warming, dam construction, habitat fragmentation, eutrophication and urbanization. However, our understanding of the impact of global change on aquatic biodiversity and ecosystem functions remains elusive. The aim of this special issue is to highlight the ecological indicators of aquatic biodiversity and ecosystem functions under global change. The special issue comprises 18 papers including both review and research articles. These papers cover a wide range of research topics, including testing ecological theory, environmental indicator development, biodiversity monitoring and bioassessment. By covering a broad taxonomic range from bacteria and phytoplankton to fish and spanning large spatial (much of Eurasia) and temporal scales (from one season to 25-years observations and 100-years paleo-reconstruction), these articles provide an overview of ecological phenomena from population and community perspectives. Several important implications emerged from these studies: (1) The studies of the long-term succession of biotic community provide important insights into the impacts of human activities and climatic changes on conservation and management of aquatic ecosystems; (2) Anthropogenic activities strongly affect aquatic biodiversity via modifying aquatic habitats and reducing habitat heterogeneity; (3) Biotic assemblages are valuable to for assessing the ecological status of freshwater ecosystems; (4) Aquatic ecosystems have unique characteristics different from other ecosystems, as the underlying drivers and assembly mechanisms of community structure in these ecosystems are highly distinct. Together, the selection of studies reinforces the importance of long-term monitoring, ecological indicator development, and applications of ecological theory in helping us to understand the response of aquatic biodiversity and ecosystem functioning to global change.","container-title":"Ecological Indicators","DOI":"10.1016/j.ecolind.2021.108250","ISSN":"1470-160X","journalAbbreviation":"Ecological Indicators","page":"108250","source":"ScienceDirect","title":"Ecological indicators for aquatic biodiversity, ecosystem functions, human activities and climate change","volume":"132","author":[{"family":"Wang","given":"Jianjun"},{"family":"Soininen","given":"Janne"},{"family":"Heino","given":"Jani"}],"issued":{"date-parts":[["2021",12,1]]}}}],"schema":"https://github.com/citation-style-language/schema/raw/master/csl-citation.json"} </w:instrText>
-      </w:r>
-      <w:r>
-        <w:rPr>
-          <w:rFonts w:ascii="Garamond" w:hAnsi="Garamond"/>
-        </w:rPr>
-        <w:fldChar w:fldCharType="separate"/>
-      </w:r>
-      <w:r>
-        <w:rPr>
-          <w:rFonts w:ascii="Garamond" w:hAnsi="Garamond"/>
-          <w:noProof/>
-        </w:rPr>
-        <w:t>(Jackson &amp; Hobbs, 2009; Menden-Deuer et al., 2023; Schoen et al., 2017; Wang et al., 2021)</w:t>
-      </w:r>
-      <w:r>
-        <w:rPr>
-          <w:rFonts w:ascii="Garamond" w:hAnsi="Garamond"/>
-        </w:rPr>
-        <w:fldChar w:fldCharType="end"/>
-      </w:r>
-      <w:r>
-        <w:rPr>
-          <w:rFonts w:ascii="Garamond" w:hAnsi="Garamond"/>
-        </w:rPr>
-        <w:t>.</w:t>
-      </w:r>
-      <w:r>
-        <w:rPr>
-          <w:rFonts w:ascii="Garamond" w:hAnsi="Garamond"/>
-        </w:rPr>
-        <w:t xml:space="preserve"> However, as the effects of human resource use and climate change intensify, healthy and fully functioning</w:t>
-      </w:r>
-      <w:r>
-        <w:rPr>
-          <w:rFonts w:ascii="Garamond" w:hAnsi="Garamond"/>
-        </w:rPr>
-        <w:t xml:space="preserve"> aquatic</w:t>
-      </w:r>
-      <w:r>
-        <w:rPr>
-          <w:rFonts w:ascii="Garamond" w:hAnsi="Garamond"/>
-        </w:rPr>
-        <w:t xml:space="preserve"> ecosystems are becoming increasingly rare as their global extent continues to decline</w:t>
-      </w:r>
-      <w:r>
-        <w:rPr>
-          <w:rFonts w:ascii="Garamond" w:hAnsi="Garamond"/>
-        </w:rPr>
-        <w:t xml:space="preserve"> </w:t>
-      </w:r>
-      <w:r>
-        <w:rPr>
-          <w:rFonts w:ascii="Garamond" w:hAnsi="Garamond"/>
-        </w:rPr>
-        <w:fldChar w:fldCharType="begin"/>
-      </w:r>
-      <w:r>
-        <w:rPr>
-          <w:rFonts w:ascii="Garamond" w:hAnsi="Garamond"/>
-        </w:rPr>
-        <w:instrText xml:space="preserve"> ADDIN ZOTERO_ITEM CSL_CITATION {"citationID":"5N2rvLcH","properties":{"formattedCitation":"(Castello &amp; Macedo, 2016; Finn et al., 2021)","plainCitation":"(Castello &amp; Macedo, 2016; Finn et al., 2021)","noteIndex":0},"citationItems":[{"id":6035,"uris":["http://zotero.org/users/8421274/items/868PSQ3D"],"itemData":{"id":6035,"type":"article-journal","abstract":"Hydrological connectivity regulates the structure and function of Amazonian freshwater ecosystems and the provisioning of services that sustain local populations. This connectivity is increasingly being disrupted by the construction of dams, mining, land-cover changes, and global climate change. This review analyzes these drivers of degradation, evaluates their impacts on hydrological connectivity, and identifies policy deficiencies that hinder freshwater ecosystem protection. There are 154 large hydroelectric dams in operation today, and 21 dams under construction. The current trajectory of dam construction will leave only three free-flowing tributaries in the next few decades if all 277 planned dams are completed. Land-cover changes driven by mining, dam and road construction, agriculture and cattle ranching have already affected similar to 20% of the Basin and up to similar to 50% of riparian forests in some regions. Global climate change will likely exacerbate these impacts by creating warmer and dryer conditions, with less predictable rainfall and more extreme events (e.g., droughts and floods). The resulting hydrological alterations are rapidly degrading freshwater ecosystems, both independently and via complex feedbacks and synergistic interactions. The ecosystem impacts include biodiversity loss, warmer stream temperatures, stronger and more frequent floodplain fires, and changes to biogeochemical cycles, transport of organic and inorganic materials, and freshwater community structure and function. The impacts also include reductions in water quality, fish yields, and availability of water for navigation, power generation, and human use. This degradation of Amazonian freshwater ecosystems cannot be curbed presently because existing policies are inconsistent across the Basin, ignore cumulative effects, and overlook the hydrological connectivity of freshwater ecosystems. Maintaining the integrity of these freshwater ecosystems requires a basinwide research and policy framework to understand and manage hydrological connectivity across multiple spatial scales and jurisdictional boundaries.","container-title":"Global Change Biology","DOI":"10.1111/gcb.13173","ISSN":"1354-1013, 1365-2486","issue":"3","journalAbbreviation":"Glob. Change Biol.","language":"English","note":"number-of-pages: 18\npublisher-place: Hoboken\nWeb of Science ID: WOS:000370491400005","page":"990-1007","publisher":"Wiley","source":"Clarivate Analytics Web of Science","title":"Large-scale degradation of Amazonian freshwater ecosystems","volume":"22","author":[{"family":"Castello","given":"Leandro"},{"family":"Macedo","given":"Marcia N."}],"issued":{"date-parts":[["2016",3]]}}},{"id":6048,"uris":["http://zotero.org/users/8421274/items/7GIZ8JXZ"],"itemData":{"id":6048,"type":"article-journal","abstract":"Loss of connectivity caused by anthropogenic barriers is a key threat for migratory freshwater species. The anadromous life history of salmonids means that barriers on streams can decrease the amount of habitat available for spawning and rearing. To set appropriate targets for restoration, it is important to know how different populations have been impacted in terms of the location and extent of historically available habitat that has been lost or has become inaccessible. Using mapped and predicted barriers to fish passage in streams and diking infrastructure, the amount of both floodplain and linear stream habitat that remains accessible today was estimated for 14 populations of salmon in the Lower Fraser River, British Columbia, Canada’s most productive salmon river. To place these estimates within a historical context, the floodplain area was estimated using vegetation records from the 1850s, and lost streams were estimated using a digital elevation model-derived stream network. To bolster areas where little mapping has been done, current barrier data were used to predict locations likely to have barriers. Accessibility to floodplain was poor across the entire region with only 15% of the historical floodplain remaining accessible. Linear stream habitat ranged in accessibility from 28% to 99% across populations based on mapped barriers. Inclusion of predicted barriers revealed an additional 33 km of potentially inaccessible stream habitat and the modeled stream network located approximately 1700 km of stream length that has been completely lost. Comparing habitat accessibility and barrier density against the assessed status of populations revealed insights useful for understanding the impact of barriers on spawning and rearing and guiding the allocation of restoration effort. Applying methods for addressing missing data, such as lost streams and unmapped barriers, was essential for estimating the accessibility of habitat within a historical context. While much emphasis has been placed on the role of marine conditions in wild Pacific salmon recovery, the magnitude of habitat loss in the Fraser cannot be ignored and suggests it is a major driver of observed salmon declines.","container-title":"Ecosphere","DOI":"10.1002/ecs2.3646","ISSN":"2150-8925","issue":"7","language":"en","license":"© 2021 The Authors.","note":"_eprint: https://esajournals.onlinelibrary.wiley.com/doi/pdf/10.1002/ecs2.3646","page":"e03646","source":"Wiley Online Library","title":"Quantifying lost and inaccessible habitat for Pacific salmon in Canada’s Lower Fraser River","volume":"12","author":[{"family":"Finn","given":"Riley J. R."},{"family":"Chalifour","given":"Lia"},{"family":"Gergel","given":"Sarah E."},{"family":"Hinch","given":"Scott G."},{"family":"Scott","given":"David C."},{"family":"Martin","given":"Tara G."}],"issued":{"date-parts":[["2021"]]}}}],"schema":"https://github.com/citation-style-language/schema/raw/master/csl-citation.json"} </w:instrText>
-      </w:r>
-      <w:r>
-        <w:rPr>
-          <w:rFonts w:ascii="Garamond" w:hAnsi="Garamond"/>
-        </w:rPr>
-        <w:fldChar w:fldCharType="separate"/>
-      </w:r>
-      <w:r>
-        <w:rPr>
-          <w:rFonts w:ascii="Garamond" w:hAnsi="Garamond"/>
-          <w:noProof/>
-        </w:rPr>
-        <w:t>(Castello &amp; Macedo, 2016; Finn et al., 2021)</w:t>
-      </w:r>
-      <w:r>
-        <w:rPr>
-          <w:rFonts w:ascii="Garamond" w:hAnsi="Garamond"/>
-        </w:rPr>
-        <w:fldChar w:fldCharType="end"/>
-      </w:r>
-      <w:r>
-        <w:rPr>
-          <w:rFonts w:ascii="Garamond" w:hAnsi="Garamond"/>
-        </w:rPr>
-        <w:t>.</w:t>
-      </w:r>
-      <w:r>
-        <w:rPr>
-          <w:rFonts w:ascii="Garamond" w:hAnsi="Garamond"/>
-        </w:rPr>
-        <w:t xml:space="preserve"> North America freshwater ecosystems have been affected by widespread changes to habitat quality and hydrological connectivity in recent decades, leading to </w:t>
-      </w:r>
-      <w:r>
-        <w:rPr>
-          <w:rFonts w:ascii="Garamond" w:hAnsi="Garamond"/>
-        </w:rPr>
-        <w:t xml:space="preserve">population </w:t>
-      </w:r>
-      <w:r>
-        <w:rPr>
-          <w:rFonts w:ascii="Garamond" w:hAnsi="Garamond"/>
-        </w:rPr>
-        <w:t>declines in species that rely on healthy, free-flowing systems</w:t>
-      </w:r>
-      <w:r>
-        <w:rPr>
-          <w:rFonts w:ascii="Garamond" w:hAnsi="Garamond"/>
-        </w:rPr>
-        <w:t xml:space="preserve"> </w:t>
-      </w:r>
-      <w:r>
-        <w:rPr>
-          <w:rFonts w:ascii="Garamond" w:hAnsi="Garamond"/>
-        </w:rPr>
-        <w:fldChar w:fldCharType="begin"/>
-      </w:r>
-      <w:r>
-        <w:rPr>
-          <w:rFonts w:ascii="Garamond" w:hAnsi="Garamond"/>
-        </w:rPr>
-        <w:instrText xml:space="preserve"> ADDIN ZOTERO_ITEM CSL_CITATION {"citationID":"owk5iFbj","properties":{"formattedCitation":"(Dudgeon et al., 2006; Reid et al., 2019)","plainCitation":"(Dudgeon et al., 2006; Reid et al., 2019)","noteIndex":0},"citationItems":[{"id":6036,"uris":["http://zotero.org/users/8421274/items/VTFP5ZZE"],"itemData":{"id":6036,"type":"article-journal","abstract":"Freshwater biodiversity is the over-riding conservation priority during the International Decade for Action – ‘Water for Life’ – 2005 to 2015. Fresh water makes up only 0.01% of the World's water and approximately 0.8% of the Earth's surface, yet this tiny fraction of global water supports at least 100000 species out of approximately 1.8 million – almost 6% of all described species. Inland waters and freshwater biodiversity constitute a valuable natural resource, in economic, cultural, aesthetic, scientific and educational terms. Their conservation and management are critical to the interests of all humans, nations and governments. Yet this precious heritage is in crisis. Fresh waters are experiencing declines in biodiversity far greater than those in the most affected terrestrial ecosystems, and if trends in human demands for water remain unaltered and species losses continue at current rates, the opportunity to conserve much of the remaining biodiversity in fresh water will vanish before the ‘Water for Life’ decade ends in 2015. Why is this so, and what is being done about it? This article explores the special features of freshwater habitats and the biodiversity they support that makes them especially vulnerable to human activities. We document threats to global freshwater biodiversity under five headings: overexploitation; water pollution; flow modification; destruction or degradation of habitat; and invasion by exotic species. Their combined and interacting influences have resulted in population declines and range reduction of freshwater biodiversity worldwide. Conservation of biodiversity is complicated by the landscape position of rivers and wetlands as ‘receivers’ of land-use effluents, and the problems posed by endemism and thus non-substitutability. In addition, in many parts of the world, fresh water is subject to severe competition among multiple human stakeholders. Protection of freshwater biodiversity is perhaps the ultimate conservation challenge because it is influenced by the upstream drainage network, the surrounding land, the riparian zone, and – in the case of migrating aquatic fauna – downstream reaches. Such prerequisites are hardly ever met. Immediate action is needed where opportunities exist to set aside intact lake and river ecosystems within large protected areas. For most of the global land surface, trade-offs between conservation of freshwater biodiversity and human use of ecosystem goods and services are necessary. We advocate continuing attempts to check species loss but, in many situations, urge adoption of a compromise position of management for biodiversity conservation, ecosystem functioning and resilience, and human livelihoods in order to provide a viable long-term basis for freshwater conservation. Recognition of this need will require adoption of a new paradigm for biodiversity protection and freshwater ecosystem management – one that has been appropriately termed ‘reconciliation ecology’.","container-title":"Biological Reviews","DOI":"10.1017/S1464793105006950","ISSN":"1469-185X, 1464-7931","issue":"2","language":"en","page":"163-182","source":"Cambridge University Press","title":"Freshwater biodiversity: importance, threats, status and conservation challenges","title-short":"Freshwater biodiversity","volume":"81","author":[{"family":"Dudgeon","given":"David"},{"family":"Arthington","given":"Angela H."},{"family":"Gessner","given":"Mark O."},{"family":"Kawabata","given":"Zen-Ichiro"},{"family":"Knowler","given":"Duncan J."},{"family":"Lévêque","given":"Christian"},{"family":"Naiman","given":"Robert J."},{"family":"Prieur-Richard","given":"Anne-Hélène"},{"family":"Soto","given":"Doris"},{"family":"Stiassny","given":"Melanie L. J."},{"family":"Sullivan","given":"Caroline A."}],"issued":{"date-parts":[["2006",5]]}}},{"id":6037,"uris":["http://zotero.org/users/8421274/items/7AHZ6K4K"],"itemData":{"id":6037,"type":"article-journal","abstract":"In the 12 years since Dudgeon et al. (2006) reviewed major pressures on freshwater ecosystems, the biodiversity crisis in the world's lakes, reservoirs, rivers, streams and wetlands has deepened. While lakes, reservoirs and rivers cover only 2.3% of the Earth's surface, these ecosystems host at least 9.5% of the Earth's described animal species. Furthermore, using the World Wide Fund for Nature's Living Planet Index, freshwater population declines (83% between 1970 and 2014) continue to outpace contemporaneous declines in marine or terrestrial systems. The Anthropocene has brought multiple new and varied threats that disproportionately impact freshwater systems. We document 12 emerging threats to freshwater biodiversity that are either entirely new since 2006 or have since intensified: (i) changing climates; (ii) e-commerce and invasions; (iii) infectious diseases; (iv) harmful algal blooms; (v) expanding hydropower; (vi) emerging contaminants; (vii) engineered nanomaterials; (viii) microplastic pollution; (ix) light and noise; (x) freshwater salinisation; (xi) declining calcium; and (xii) cumulative stressors. Effects are evidenced for amphibians, fishes, invertebrates, microbes, plants, turtles and waterbirds, with potential for ecosystem-level changes through bottom-up and top-down processes. In our highly uncertain future, the net effects of these threats raise serious concerns for freshwater ecosystems. However, we also highlight opportunities for conservation gains as a result of novel management tools (e.g. environmental flows, environmental DNA) and specific conservation-oriented actions (e.g. dam removal, habitat protection policies, managed relocation of species) that have been met with varying levels of success. Moving forward, we advocate hybrid approaches that manage fresh waters as crucial ecosystems for human life support as well as essential hotspots of biodiversity and ecological function. Efforts to reverse global trends in freshwater degradation now depend on bridging an immense gap between the aspirations of conservation biologists and the accelerating rate of species endangerment.","container-title":"Biological Reviews","DOI":"10.1111/brv.12480","ISSN":"1464-7931, 1469-185X","issue":"3","journalAbbreviation":"Biol. Rev.","language":"English","note":"number-of-pages: 25\npublisher-place: Hoboken\nWeb of Science ID: WOS:000467422400006","page":"849-873","publisher":"Wiley","source":"Clarivate Analytics Web of Science","title":"Emerging threats and persistent conservation challenges for freshwater biodiversity","volume":"94","author":[{"family":"Reid","given":"Andrea J."},{"family":"Carlson","given":"Andrew K."},{"family":"Creed","given":"Irena F."},{"family":"Eliason","given":"Erika J."},{"family":"Gell","given":"Peter A."},{"family":"Johnson","given":"Pieter T. J."},{"family":"Kidd","given":"Karen A."},{"family":"MacCormack","given":"Tyson J."},{"family":"Olden","given":"Julian D."},{"family":"Ormerod","given":"Steve J."},{"family":"Smol","given":"John P."},{"family":"Taylor","given":"William W."},{"family":"Tockner","given":"Klement"},{"family":"Vermaire","given":"Jesse C."},{"family":"Dudgeon","given":"David"},{"family":"Cooke","given":"Steven J."}],"issued":{"date-parts":[["2019",6]]}}}],"schema":"https://github.com/citation-style-language/schema/raw/master/csl-citation.json"} </w:instrText>
-      </w:r>
-      <w:r>
-        <w:rPr>
-          <w:rFonts w:ascii="Garamond" w:hAnsi="Garamond"/>
-        </w:rPr>
-        <w:fldChar w:fldCharType="separate"/>
-      </w:r>
-      <w:r>
-        <w:rPr>
-          <w:rFonts w:ascii="Garamond" w:hAnsi="Garamond"/>
-          <w:noProof/>
-        </w:rPr>
-        <w:t>(Dudgeon et al., 2006; Reid et al., 2019)</w:t>
-      </w:r>
-      <w:r>
-        <w:rPr>
-          <w:rFonts w:ascii="Garamond" w:hAnsi="Garamond"/>
-        </w:rPr>
-        <w:fldChar w:fldCharType="end"/>
-      </w:r>
-      <w:r>
-        <w:rPr>
-          <w:rFonts w:ascii="Garamond" w:hAnsi="Garamond"/>
-        </w:rPr>
-        <w:t xml:space="preserve">. Migratory species such as </w:t>
-      </w:r>
-      <w:r>
-        <w:rPr>
-          <w:rFonts w:ascii="Garamond" w:hAnsi="Garamond"/>
-        </w:rPr>
-        <w:t>Pacific salmon are particularly vulnerable to changes in habitat quality and connectivity because they depend on access to multiple, distinct habitat types within fully connected river networks to complete their life cycle</w:t>
-      </w:r>
-      <w:r>
-        <w:rPr>
-          <w:rFonts w:ascii="Garamond" w:hAnsi="Garamond"/>
-        </w:rPr>
-        <w:t xml:space="preserve"> </w:t>
-      </w:r>
-      <w:r>
-        <w:rPr>
-          <w:rFonts w:ascii="Garamond" w:hAnsi="Garamond"/>
-        </w:rPr>
-        <w:fldChar w:fldCharType="begin"/>
-      </w:r>
-      <w:r>
-        <w:rPr>
-          <w:rFonts w:ascii="Garamond" w:hAnsi="Garamond"/>
-        </w:rPr>
-        <w:instrText xml:space="preserve"> ADDIN ZOTERO_ITEM CSL_CITATION {"citationID":"aBTCoXji","properties":{"formattedCitation":"(Quinn, 2018; Robinson et al., 2009; Waldman &amp; Quinn, 2022)","plainCitation":"(Quinn, 2018; Robinson et al., 2009; Waldman &amp; Quinn, 2022)","noteIndex":0},"citationItems":[{"id":5568,"uris":["http://zotero.org/users/8421274/items/TBWE7PX7"],"itemData":{"id":5568,"type":"book","publisher":"American Fisheries Society, University of Washington Press","title":"The Behavior and Ecology of Pacific Salmon and Trout","author":[{"family":"Quinn","given":"Thomas P"}],"issued":{"date-parts":[["2018",10]]}}},{"id":3518,"uris":["http://zotero.org/users/8421274/items/LJAKI7SR"],"itemData":{"id":3518,"type":"article-journal","abstract":"Long-distance migrations are among the wonders of the natural world, but this multitaxon review shows that the characteristics of species that undertake such movements appear to make them particularly vulnerable to detrimental impacts of climate change. Migrants are key components of biological systems in high latitude regions, where the speed and magnitude of climate change impacts are greatest. They also rely on highly productive seasonal habitats, including wetlands and ocean upwellings that, with climate change, may become less food-rich and predictable in space and time. While migrants are adapted to adjust their behaviour with annual changes in the weather, the decoupling of climatic variables between geographically separate breeding and nonbreeding grounds is beginning to result in mistimed migration. Furthermore, human land-use and activity patterns will constrain the ability of many species to modify their migratory routes and may increase the stress induced by climate change. Adapting conservation strategies for migrants in the light of climate change will require substantial shifts in site designation policies, flexibility of management strategies and the integration of forward planning for both people and wildlife. While adaptation to changes may be feasible for some terrestrial systems, wildlife in the marine ecosystem may be more dependent on the degree of climate change mitigation that is achievable.","container-title":"Endangered Species Research","DOI":"10.3354/esr00095","ISSN":"1863-5407, 1613-4796","journalAbbreviation":"Endang. Species. Res.","language":"en","page":"87-99","source":"DOI.org (Crossref)","title":"Travelling through a warming world: climate change and migratory species","title-short":"Travelling through a warming world","volume":"7","author":[{"family":"Robinson","given":"Ra"},{"family":"Crick","given":"Hqp"},{"family":"Learmonth","given":"Ja"},{"family":"Maclean","given":"Imd"},{"family":"Thomas","given":"Cd"},{"family":"Bairlein","given":"F"},{"family":"Forchhammer","given":"Mc"},{"family":"Francis","given":"Cm"},{"family":"Gill","given":"Ja"},{"family":"Godley","given":"Bj"},{"family":"Harwood","given":"J"},{"family":"Hays","given":"Gc"},{"family":"Huntley","given":"B"},{"family":"Hutson","given":"Am"},{"family":"Pierce","given":"Gj"},{"family":"Rehfisch","given":"Mm"},{"family":"Sims","given":"Dw"},{"family":"Santos","given":"Bm"},{"family":"Sparks","given":"Th"},{"family":"Stroud","given":"Da"},{"family":"Visser","given":"Me"}],"issued":{"date-parts":[["2009",6,17]]}}},{"id":6038,"uris":["http://zotero.org/users/8421274/items/XVWURZLC"],"itemData":{"id":6038,"type":"article-journal","abstract":"Diadromous fishes migrate between freshwater and marine habitats to complete their life cycle, a complexity that makes them vulnerable to the adverse effects of current and past human activities on land and in the oceans. Many North American species are critically endangered, and entire populations have been lost. Major factors driving declines include overfishing, pollution, water withdrawals, aquaculture, non-native species, habitat degradation, over-zealous application of hatcheries designed to mitigate effects of other factors, and effects of climate change. Perhaps, the most broadly tractable and effective factors affecting diadromous fishes are removals of the dams that prevent or hinder their migrations, alter their environment, and often favor non-native biotic communities. Future survival of many diadromous fish populations may depend on this.","container-title":"Science Advances","DOI":"10.1126/sciadv.abl5486","issue":"4","page":"eabl5486","publisher":"American Association for the Advancement of Science","source":"science.org (Atypon)","title":"North American diadromous fishes: Drivers of decline and potential for recovery in the Anthropocene","title-short":"North American diadromous fishes","volume":"8","author":[{"family":"Waldman","given":"John R."},{"family":"Quinn","given":"Thomas P."}],"issued":{"date-parts":[["2022",1,28]]}}}],"schema":"https://github.com/citation-style-language/schema/raw/master/csl-citation.json"} </w:instrText>
-      </w:r>
-      <w:r>
-        <w:rPr>
-          <w:rFonts w:ascii="Garamond" w:hAnsi="Garamond"/>
-        </w:rPr>
-        <w:fldChar w:fldCharType="separate"/>
-      </w:r>
-      <w:r>
-        <w:rPr>
-          <w:rFonts w:ascii="Garamond" w:hAnsi="Garamond"/>
-          <w:noProof/>
-        </w:rPr>
-        <w:t>(Quinn, 2018; Robinson et al., 2009; Waldman &amp; Quinn, 2022)</w:t>
-      </w:r>
-      <w:r>
-        <w:rPr>
-          <w:rFonts w:ascii="Garamond" w:hAnsi="Garamond"/>
-        </w:rPr>
-        <w:fldChar w:fldCharType="end"/>
-      </w:r>
-      <w:r>
-        <w:rPr>
-          <w:rFonts w:ascii="Garamond" w:hAnsi="Garamond"/>
-        </w:rPr>
-        <w:t>.</w:t>
-      </w:r>
-      <w:r>
-        <w:rPr>
-          <w:rFonts w:ascii="Garamond" w:hAnsi="Garamond"/>
-        </w:rPr>
-        <w:t xml:space="preserve"> </w:t>
-      </w:r>
-      <w:r>
-        <w:rPr>
-          <w:rFonts w:ascii="Garamond" w:hAnsi="Garamond"/>
-        </w:rPr>
-        <w:t xml:space="preserve">As accelerating human development has accelerated, many salmon populations have experienced sustained declines over several decades across much of their range [ref]. Widespread </w:t>
-      </w:r>
-      <w:r>
-        <w:rPr>
-          <w:rFonts w:ascii="Garamond" w:hAnsi="Garamond"/>
-        </w:rPr>
-        <w:t xml:space="preserve">efforts </w:t>
-      </w:r>
-      <w:r>
-        <w:rPr>
-          <w:rFonts w:ascii="Garamond" w:hAnsi="Garamond"/>
-        </w:rPr>
-        <w:t xml:space="preserve">have been undertaken </w:t>
-      </w:r>
-      <w:r>
-        <w:rPr>
-          <w:rFonts w:ascii="Garamond" w:hAnsi="Garamond"/>
-        </w:rPr>
-        <w:t xml:space="preserve">to restore </w:t>
-      </w:r>
-      <w:r>
-        <w:rPr>
-          <w:rFonts w:ascii="Garamond" w:hAnsi="Garamond"/>
-        </w:rPr>
-        <w:t xml:space="preserve">aquatic </w:t>
-      </w:r>
-      <w:r>
-        <w:rPr>
-          <w:rFonts w:ascii="Garamond" w:hAnsi="Garamond"/>
-        </w:rPr>
-        <w:t>habitat</w:t>
-      </w:r>
-      <w:r>
-        <w:rPr>
-          <w:rFonts w:ascii="Garamond" w:hAnsi="Garamond"/>
-        </w:rPr>
-        <w:t>s</w:t>
-      </w:r>
-      <w:r>
-        <w:rPr>
-          <w:rFonts w:ascii="Garamond" w:hAnsi="Garamond"/>
-        </w:rPr>
-        <w:t xml:space="preserve"> </w:t>
-      </w:r>
-      <w:r>
-        <w:rPr>
-          <w:rFonts w:ascii="Garamond" w:hAnsi="Garamond"/>
-        </w:rPr>
-        <w:t xml:space="preserve">and </w:t>
-      </w:r>
-      <w:r>
-        <w:rPr>
-          <w:rFonts w:ascii="Garamond" w:hAnsi="Garamond"/>
-        </w:rPr>
-        <w:t xml:space="preserve">to </w:t>
-      </w:r>
-      <w:r>
-        <w:rPr>
-          <w:rFonts w:ascii="Garamond" w:hAnsi="Garamond"/>
-        </w:rPr>
-        <w:t>recover healthy salmon populations</w:t>
-      </w:r>
-      <w:r>
-        <w:rPr>
-          <w:rFonts w:ascii="Garamond" w:hAnsi="Garamond"/>
-        </w:rPr>
-        <w:t xml:space="preserve"> in degraded ecosystems</w:t>
-      </w:r>
-      <w:r>
-        <w:rPr>
-          <w:rFonts w:ascii="Garamond" w:hAnsi="Garamond"/>
-        </w:rPr>
-        <w:t xml:space="preserve"> </w:t>
-      </w:r>
-      <w:r>
-        <w:rPr>
-          <w:rFonts w:ascii="Garamond" w:hAnsi="Garamond"/>
-        </w:rPr>
-        <w:fldChar w:fldCharType="begin"/>
-      </w:r>
-      <w:r>
-        <w:rPr>
-          <w:rFonts w:ascii="Garamond" w:hAnsi="Garamond"/>
-        </w:rPr>
-        <w:instrText xml:space="preserve"> ADDIN ZOTERO_ITEM CSL_CITATION {"citationID":"CYzx2Nyz","properties":{"formattedCitation":"(Cordoleani et al., 2024; Rahr et al., 2025)","plainCitation":"(Cordoleani et al., 2024; Rahr et al., 2025)","noteIndex":0},"citationItems":[{"id":5990,"uris":["http://zotero.org/users/8421274/items/BGVZ7ZLQ"],"itemData":{"id":5990,"type":"article-journal","abstract":"Phenotypic diversity and abundance drive salmon resilience in the face of increasing environmental variability. But what happens when human activities fundamentally alter the habitat complexity that drives this diversity? And how can we restore habitats to recover both diversity and abundance to support salmon persistence in a warming climate? Here, we looked at the impact of a large watershed restoration effort on the abundance and climate resilience of the three remaining core natural spring-run Chinook Salmon populations in the California Central Valley (Butte, Mill, and Deer Creek). Butte Creek fish, which have floodplain access, had higher overall productivity and faster juvenile growth compared with Mill and Deer Creek populations, and the proportion of floodplain inundation was positively correlated with Butte Creek adult abundance two years later. While Butte Creek exhibited significant increases in abundance post-restoration (similar to 000%), it generally exhibited lower phenotypic diversity and only a marginal increase in population stability after restoration based on the coefficient of variation (CV). In particular, Butte Creek salmon tended to exhibit larger drops in escapement following dry years (e.g., return years 2010, 2017) compared with Mill and Deer Creek populations, presumably due to limited inundation of its downstream floodplain. The late-migrating juvenile strategy (i.e., yearling), which disproportionately supported Mill and Deer Creek populations during droughts, was uncommon among Butte Creek adults (averaging 60% of returns for Mill and Deer Creek vs. 0.3% for Butte Creek). Increased spring-run stock complex stability was found, post-restoration, when combining the three spring-run populations (i.e., lower aggregate CV). However, among-river pairwise correlations also suggested increased synchronization in population abundances post-restoration, potentially due to increasing frequency and severity of extreme climatic events (e.g., droughts and ocean warming). This study underscores the importance of restoring a connected mosaic of aquatic habitats across modified landscapes, such as cold water refugia and floodplains, to preserve multiple (across-population) life history pathways for increasing salmon stock complex stability and abundance. These landscape-scale process-based habitat restoration efforts are likely to be crucial for the successful long-term recovery of vulnerable species in a rapidly changing climate.","container-title":"Ecosphere","DOI":"10.1002/ecs2.4803","ISSN":"2150-8925","issue":"3","journalAbbreviation":"Ecosphere","language":"English","note":"number-of-pages: 18\npublisher-place: Hoboken\nWeb of Science ID: WOS:001182186400001","page":"e4803","publisher":"Wiley","source":"Clarivate Analytics Web of Science","title":"Restoring freshwater habitat mosaics to promote resilience of vulnerable salmon populations","volume":"15","author":[{"family":"Cordoleani","given":"Flora"},{"family":"Phillis","given":"Corey C."},{"family":"Sturrock","given":"Anna M."},{"family":"Willmes","given":"Malte"},{"family":"Whitman","given":"George"},{"family":"Holmes","given":"Eric"},{"family":"Weber","given":"Peter K."},{"family":"Jeffres","given":"Carson"},{"family":"Johnson","given":"Rachel C."}],"issued":{"date-parts":[["2024",3]]}}},{"id":6043,"uris":["http://zotero.org/users/8421274/items/C2HKLHLY"],"itemData":{"id":6043,"type":"article-journal","abstract":"Nested within the linked global crises of biodiversity loss and climate change are threats to cultural and ecological keystones such as Pacific salmon Oncorhynchus spp., a group of species with widespread ecological, cultural, and economic value. Wild salmon can rally public support for ecosystem protection and link place-based conservation efforts to global biodiversity and climate benefits. Realizing these benefits depends on leveraging broad support for salmon conservation to advance forward-looking approaches that safeguard food security, biodiversity, and climate resilience. Here we provide insights from the multidecadal implementation of a proactive wild salmon ecosystem conservation strategy at the scale of the North Pacific Rim. This approach is a necessary complement to policies focused on preventing species extinction after populations and habitats are degraded and it provides globally significant contributions to biodiversity and climate targets including recent 30 × 30 goals of the Convention on Biological Diversity.","container-title":"Fisheries","DOI":"10.1093/fshmag/vuaf011","ISSN":"0363-2415","issue":"9","page":"399-415","source":"Silverchair","title":"Strongholds for Pacific salmon: A proactive conservation strategy for ecosystem health, food security, biodiversity, and climate resilience","title-short":"Strongholds for Pacific salmon","volume":"50","author":[{"family":"Rahr","given":"Guido R","suffix":"III"},{"family":"Sloat","given":"Matthew R"},{"family":"Atlas","given":"William I"},{"family":"Hart","given":"Jonathan L"}],"issued":{"date-parts":[["2025",9,1]]}}}],"schema":"https://github.com/citation-style-language/schema/raw/master/csl-citation.json"} </w:instrText>
-      </w:r>
-      <w:r>
-        <w:rPr>
-          <w:rFonts w:ascii="Garamond" w:hAnsi="Garamond"/>
-        </w:rPr>
-        <w:fldChar w:fldCharType="separate"/>
-      </w:r>
-      <w:r>
-        <w:rPr>
-          <w:rFonts w:ascii="Garamond" w:hAnsi="Garamond"/>
-          <w:noProof/>
-        </w:rPr>
-        <w:t>(Cordoleani et al., 2024; Rahr et al., 2025)</w:t>
-      </w:r>
-      <w:r>
-        <w:rPr>
-          <w:rFonts w:ascii="Garamond" w:hAnsi="Garamond"/>
-        </w:rPr>
-        <w:fldChar w:fldCharType="end"/>
-      </w:r>
-      <w:r>
-        <w:rPr>
-          <w:rFonts w:ascii="Garamond" w:hAnsi="Garamond"/>
-        </w:rPr>
-        <w:t xml:space="preserve">. </w:t>
-      </w:r>
-      <w:r>
-        <w:rPr>
-          <w:rFonts w:ascii="Garamond" w:hAnsi="Garamond"/>
-        </w:rPr>
-        <w:t xml:space="preserve">Because decades of development have imposed cumulative and confounding impacts to </w:t>
-      </w:r>
-      <w:r>
-        <w:rPr>
-          <w:rFonts w:ascii="Garamond" w:hAnsi="Garamond"/>
-        </w:rPr>
-        <w:t xml:space="preserve">many </w:t>
-      </w:r>
-      <w:r>
-        <w:rPr>
-          <w:rFonts w:ascii="Garamond" w:hAnsi="Garamond"/>
-        </w:rPr>
-        <w:t xml:space="preserve">salmon </w:t>
-      </w:r>
-      <w:r>
-        <w:rPr>
-          <w:rFonts w:ascii="Garamond" w:hAnsi="Garamond"/>
-        </w:rPr>
-        <w:t xml:space="preserve">watersheds, </w:t>
-      </w:r>
-      <w:r>
-        <w:rPr>
-          <w:rFonts w:ascii="Garamond" w:hAnsi="Garamond"/>
-        </w:rPr>
-        <w:t>it remains difficult to characterize their baseline function and to establish reference points for restoration efforts.</w:t>
-      </w:r>
-      <w:r>
-        <w:rPr>
-          <w:rFonts w:ascii="Garamond" w:hAnsi="Garamond"/>
-        </w:rPr>
-        <w:t xml:space="preserve"> </w:t>
-      </w:r>
-    </w:p>
-    <w:p>
-      <w:pPr>
-        <w:pStyle w:val="font-claude-response-body"/>
-        <w:spacing w:line="360" w:lineRule="auto"/>
-        <w:ind w:firstLine="360"/>
-        <w:rPr>
-          <w:rFonts w:ascii="Garamond" w:hAnsi="Garamond"/>
-        </w:rPr>
-      </w:pPr>
-      <w:r>
-        <w:rPr>
-          <w:rFonts w:ascii="Garamond" w:hAnsi="Garamond"/>
-        </w:rPr>
-        <w:t>Alaska watersheds,</w:t>
-      </w:r>
-      <w:r>
-        <w:rPr>
-          <w:rFonts w:ascii="Garamond" w:hAnsi="Garamond"/>
-        </w:rPr>
-        <w:t xml:space="preserve"> at the northernmost extent of the</w:t>
-      </w:r>
-      <w:r>
-        <w:rPr>
-          <w:rFonts w:ascii="Garamond" w:hAnsi="Garamond"/>
-        </w:rPr>
-        <w:t xml:space="preserve"> natural range of pacific</w:t>
-      </w:r>
-      <w:r>
-        <w:rPr>
-          <w:rFonts w:ascii="Garamond" w:hAnsi="Garamond"/>
-        </w:rPr>
-        <w:t xml:space="preserve"> salmon</w:t>
-      </w:r>
-      <w:r>
-        <w:rPr>
-          <w:rFonts w:ascii="Garamond" w:hAnsi="Garamond"/>
-        </w:rPr>
-        <w:t>,</w:t>
-      </w:r>
-      <w:r>
-        <w:rPr>
-          <w:rFonts w:ascii="Garamond" w:hAnsi="Garamond"/>
-        </w:rPr>
-        <w:t xml:space="preserve"> have experienced substantially</w:t>
-      </w:r>
-      <w:r>
-        <w:rPr>
-          <w:rFonts w:ascii="Garamond" w:hAnsi="Garamond"/>
-        </w:rPr>
-        <w:t xml:space="preserve"> </w:t>
-      </w:r>
-      <w:r>
-        <w:rPr>
-          <w:rFonts w:ascii="Garamond" w:hAnsi="Garamond"/>
-        </w:rPr>
-        <w:t xml:space="preserve">less anthropogenic </w:t>
-      </w:r>
-      <w:r>
-        <w:rPr>
-          <w:rFonts w:ascii="Garamond" w:hAnsi="Garamond"/>
-        </w:rPr>
-        <w:t xml:space="preserve">impacts </w:t>
-      </w:r>
-      <w:r>
-        <w:rPr>
-          <w:rFonts w:ascii="Garamond" w:hAnsi="Garamond"/>
-        </w:rPr>
-        <w:t xml:space="preserve">and habitat fragmentation </w:t>
-      </w:r>
-      <w:r>
-        <w:rPr>
-          <w:rFonts w:ascii="Garamond" w:hAnsi="Garamond"/>
-        </w:rPr>
-        <w:t xml:space="preserve">than </w:t>
-      </w:r>
-      <w:r>
-        <w:rPr>
-          <w:rFonts w:ascii="Garamond" w:hAnsi="Garamond"/>
-        </w:rPr>
-        <w:t xml:space="preserve">those </w:t>
-      </w:r>
-      <w:r>
-        <w:rPr>
-          <w:rFonts w:ascii="Garamond" w:hAnsi="Garamond"/>
-        </w:rPr>
-        <w:t>in the Pacific Northwest</w:t>
-      </w:r>
-      <w:r>
-        <w:rPr>
-          <w:rFonts w:ascii="Garamond" w:hAnsi="Garamond"/>
-        </w:rPr>
-        <w:t xml:space="preserve"> and California</w:t>
-      </w:r>
-      <w:r>
-        <w:rPr>
-          <w:rFonts w:ascii="Garamond" w:hAnsi="Garamond"/>
-        </w:rPr>
-        <w:t xml:space="preserve"> </w:t>
-      </w:r>
-      <w:r>
-        <w:rPr>
-          <w:rFonts w:ascii="Garamond" w:hAnsi="Garamond"/>
-        </w:rPr>
-        <w:fldChar w:fldCharType="begin"/>
-      </w:r>
-      <w:r>
-        <w:rPr>
-          <w:rFonts w:ascii="Garamond" w:hAnsi="Garamond"/>
-        </w:rPr>
-        <w:instrText xml:space="preserve"> ADDIN ZOTERO_ITEM CSL_CITATION {"citationID":"xRsa1svq","properties":{"formattedCitation":"(Schoen et al., 2017; Williams, 2006; Yoshiyama et al., 1998)","plainCitation":"(Schoen et al., 2017; Williams, 2006; Yoshiyama et al., 1998)","noteIndex":0},"citationItems":[{"id":6051,"uris":["http://zotero.org/users/8421274/items/UPNXXHTQ"],"itemData":{"id":6051,"type":"article-journal","abstract":"Pacific salmon Oncorhynchus spp. face serious challenges from climate and landscape change, particularly in the southern portion of their native range. Conversely, climate warming appears to be allowing salmon to expand northwards into the Arctic. Between these geographic extremes, in the Gulf of Alaska region, salmon are at historically high abundances but face an uncertain future due to rapid environmental change. We examined changes in climate, hydrology, land cover, salmon populations, and fisheries over the past 30–70 years in this region. We focused on the Kenai River, which supports world-famous fisheries but where Chinook Salmon O. tshawytscha populations have declined, raising concerns about their future resilience. The region is warming and experiencing drier summers and wetter autumns. The landscape is also changing, with melting glaciers, wetland loss, wildfires, and human development. This environmental transformation will likely harm some salmon populations while benefiting others. Lowland salmon streams are especially vulnerable, but retreating glaciers may allow production gains in other streams. Some fishing communities harvest a diverse portfolio of fluctuating resources, whereas others have specialized over time, potentially limiting their resilience. Maintaining diverse habitats and salmon runs may allow ecosystems and fisheries to continue to thrive amidst these changes.","container-title":"Fisheries","DOI":"10.1080/03632415.2017.1374251","ISSN":"0363-2415","issue":"10","note":"_eprint: https://doi.org/10.1080/03632415.2017.1374251","page":"538-553","publisher":"Taylor &amp; Francis","source":"Taylor and Francis+NEJM","title":"Future of Pacific Salmon in the Face of Environmental Change: Lessons from One of the World's Remaining Productive Salmon Regions","title-short":"Future of Pacific Salmon in the Face of Environmental Change","volume":"42","author":[{"family":"Schoen","given":"Erik R."},{"family":"Wipfli","given":"Mark S."},{"family":"Trammell","given":"E. Jamie"},{"family":"Rinella","given":"Daniel J."},{"family":"Floyd","given":"Angelica L."},{"family":"Grunblatt","given":"Jess"},{"family":"McCarthy","given":"Molly D."},{"family":"Meyer","given":"Benjamin E."},{"family":"Morton","given":"John M."},{"family":"Powell","given":"James E."},{"family":"Prakash","given":"Anupma"},{"family":"Reimer","given":"Matthew N."},{"family":"Stuefer","given":"Svetlana L."},{"family":"Toniolo","given":"Horacio"},{"family":"Wells","given":"Brett M."},{"family":"Witmer","given":"Frank D. W."}],"issued":{"date-parts":[["2017",10,3]]}}},{"id":6057,"uris":["http://zotero.org/users/8421274/items/MWDVQVR3"],"itemData":{"id":6057,"type":"article-journal","abstract":"This monograph presents an extensive review of the biology and management of Chinook salmon and steelhead in the Central Valley of California. Relevant data and publications on these populations are summarized and discussed in the context of the wider professional literature, with emphasis on the importance of evolutionary considerations in the assessment of populations and in their management, the need to manage populations together with their environments, and the contradiction between maintaining a major hatchery program to support a mixed-stock ocean fishery and trying to maintain or restore populations adapted to natural or semi-natural habitats. Recommendations are presented for management and monitoring—for example for a thorough review of hatchery operations, for more emphasis on monitoring individual-based factors such the physiological condition and growth rates of juveniles, and for simulation of major restoration actions and monitoring programs. The 17 chapters cover major conceptsin salmon biology and conceptual foundations for management, and Central Valley Chinook and steelhead populations and their habitat, growth and migration, habitat use, harvest, hatcheries, modeling, monitoring, and management.","container-title":"San Francisco Estuary and Watershed Science","DOI":"10.15447/sfews.2006v4iss3art2","issue":"3","language":"en","source":"escholarship.org","title":"Central Valley Salmon: A Perspective on Chinook and Steelhead in the Central Valley of California","title-short":"Central Valley Salmon","URL":"https://escholarship.org/uc/item/21v9x1t7","volume":"4","author":[{"family":"Williams","given":"John G."}],"accessed":{"date-parts":[["2026",1,5]]},"issued":{"date-parts":[["2006"]]}}},{"id":5348,"uris":["http://zotero.org/users/8421274/items/VU4C5NC2"],"itemData":{"id":5348,"type":"article-journal","abstract":"The Central Valley drainage of California formerly produced immense numbers of chinook salmon Oncorhynchus tshawytscha. Four seasonal runs occur in this system—fall, late</w:instrText>
-      </w:r>
-      <w:r>
-        <w:rPr>
-          <w:rFonts w:ascii="Cambria Math" w:hAnsi="Cambria Math" w:cs="Cambria Math"/>
-        </w:rPr>
-        <w:instrText>‐</w:instrText>
-      </w:r>
-      <w:r>
-        <w:rPr>
-          <w:rFonts w:ascii="Garamond" w:hAnsi="Garamond"/>
-        </w:rPr>
-        <w:instrText>fall, winter, and spring runs. Differences in life history timing and spatial distribution enabled the four runs to use the drainage to the fullest possible extent and once made it one of the richest regions in the world for chinook salmon production. Native American fishers within the Central Valley drainage harvested chinook salmon at estimated levels that reached 8.5 million pounds or more annually. Native harvests, therefore, were roughly comparable to the peak commercial harvests taken later by Euro</w:instrText>
-      </w:r>
-      <w:r>
-        <w:rPr>
-          <w:rFonts w:ascii="Cambria Math" w:hAnsi="Cambria Math" w:cs="Cambria Math"/>
-        </w:rPr>
-        <w:instrText>‐</w:instrText>
-      </w:r>
-      <w:r>
-        <w:rPr>
-          <w:rFonts w:ascii="Garamond" w:hAnsi="Garamond"/>
-        </w:rPr>
-        <w:instrText>American fishers, but whether or not native fishing depressed the productive capacities of the salmon populations to any substantial degree is not known. The commercial chinook salmon fishery in California started about 1850 in the San Francisco Bay and Sacramento–San Joaquin Delta region, where it formed the nucleus of the first major fishery conducted by Euro</w:instrText>
-      </w:r>
-      <w:r>
-        <w:rPr>
-          <w:rFonts w:ascii="Cambria Math" w:hAnsi="Cambria Math" w:cs="Cambria Math"/>
-        </w:rPr>
-        <w:instrText>‐</w:instrText>
-      </w:r>
-      <w:r>
-        <w:rPr>
-          <w:rFonts w:ascii="Garamond" w:hAnsi="Garamond"/>
-        </w:rPr>
-        <w:instrText>American immigrants in the state. This fishery was one of the important early industries that supported the Euro</w:instrText>
-      </w:r>
-      <w:r>
-        <w:rPr>
-          <w:rFonts w:ascii="Cambria Math" w:hAnsi="Cambria Math" w:cs="Cambria Math"/>
-        </w:rPr>
-        <w:instrText>‐</w:instrText>
-      </w:r>
-      <w:r>
-        <w:rPr>
-          <w:rFonts w:ascii="Garamond" w:hAnsi="Garamond"/>
-        </w:rPr>
-        <w:instrText>American settlement of the Central Valley region. The salmon fishery remained centered there until the early 1900s, when ocean salmon fishing began to expand and eventually came to dominate the fishery. Annual catches by the early Sacramento–San Joaquin in</w:instrText>
-      </w:r>
-      <w:r>
-        <w:rPr>
-          <w:rFonts w:ascii="Cambria Math" w:hAnsi="Cambria Math" w:cs="Cambria Math"/>
-        </w:rPr>
-        <w:instrText>‐</w:instrText>
-      </w:r>
-      <w:r>
-        <w:rPr>
-          <w:rFonts w:ascii="Garamond" w:hAnsi="Garamond"/>
-        </w:rPr>
-        <w:instrText>river fishery commonly reached 4–10 million pounds and generally were higher than the total statewide catches made during the most recent several decades. The historical abundances of Central Valley chinook salmon before large</w:instrText>
-      </w:r>
-      <w:r>
-        <w:rPr>
-          <w:rFonts w:ascii="Cambria Math" w:hAnsi="Cambria Math" w:cs="Cambria Math"/>
-        </w:rPr>
-        <w:instrText>‐</w:instrText>
-      </w:r>
-      <w:r>
-        <w:rPr>
-          <w:rFonts w:ascii="Garamond" w:hAnsi="Garamond"/>
-        </w:rPr>
-        <w:instrText>scale commercial exploitation and depletion of the runs cannot be determined with certainty. However, on the basis of early commercial catch records, the maximal production levels of the Central Valley chinook salmon stocks in aggregate may be conservatively estimated to have reached approximately 1–2 million spawners annually. Although substantial investment has been made by the state of California in managing the chinook salmon resource since the early years of the commercial fishery, chinook salmon have declined over the decades to small fractions of their previous numbers. The decline of the Central Valley chinook salmon resource was caused by several factors: overfishing, blockage and degradation of streams by mining activities, and reduction of salmon habitat and streamflows by dams and water diversions. Differences between the four chinook salmon runs in life history timing and habitat requirements partly account for their different population histories; the winter run is now threatened with extinction, the spring run recently has approached a similarly imperiled state, and the late</w:instrText>
-      </w:r>
-      <w:r>
-        <w:rPr>
-          <w:rFonts w:ascii="Cambria Math" w:hAnsi="Cambria Math" w:cs="Cambria Math"/>
-        </w:rPr>
-        <w:instrText>‐</w:instrText>
-      </w:r>
-      <w:r>
-        <w:rPr>
-          <w:rFonts w:ascii="Garamond" w:hAnsi="Garamond"/>
-        </w:rPr>
-        <w:instrText>fall run has been at moderately low population levels for the past two decades. Only the fall run, in aggregate, can be regarded as secure, but it too has undergone substantial reductions in abundance. Fall</w:instrText>
-      </w:r>
-      <w:r>
-        <w:rPr>
-          <w:rFonts w:ascii="Cambria Math" w:hAnsi="Cambria Math" w:cs="Cambria Math"/>
-        </w:rPr>
-        <w:instrText>‐</w:instrText>
-      </w:r>
-      <w:r>
-        <w:rPr>
-          <w:rFonts w:ascii="Garamond" w:hAnsi="Garamond"/>
-        </w:rPr>
-        <w:instrText xml:space="preserve">run spawner numbers were especially low in the San Joaquin River basin in recent years, and in Sacramento River basin streams their numbers have been heavily influenced by production of hatchery fish.","container-title":"North American Journal of Fisheries Management","DOI":"10.1577/1548-8675(1998)018&lt;0487:HAADOC&gt;2.0.CO;2","ISSN":"0275-5947","issue":"3","journalAbbreviation":"North American Journal of Fisheries Management","page":"487-521","source":"Silverchair","title":"Historical Abundance and Decline of Chinook Salmon in the Central Valley Region of California","volume":"18","author":[{"family":"Yoshiyama","given":"Ronald M."},{"family":"Fisher","given":"Frank W."},{"family":"Moyle","given":"Peter B."}],"issued":{"date-parts":[["1998",8,1]]}}}],"schema":"https://github.com/citation-style-language/schema/raw/master/csl-citation.json"} </w:instrText>
-      </w:r>
-      <w:r>
-        <w:rPr>
-          <w:rFonts w:ascii="Garamond" w:hAnsi="Garamond"/>
-        </w:rPr>
-        <w:fldChar w:fldCharType="separate"/>
-      </w:r>
-      <w:r>
-        <w:rPr>
-          <w:rFonts w:ascii="Garamond" w:hAnsi="Garamond"/>
-          <w:noProof/>
-        </w:rPr>
-        <w:t>(Schoen et al., 2017; Williams, 2006; Yoshiyama et al., 1998)</w:t>
-      </w:r>
-      <w:r>
-        <w:rPr>
-          <w:rFonts w:ascii="Garamond" w:hAnsi="Garamond"/>
-        </w:rPr>
-        <w:fldChar w:fldCharType="end"/>
-      </w:r>
-      <w:r>
-        <w:rPr>
-          <w:rFonts w:ascii="Garamond" w:hAnsi="Garamond"/>
-        </w:rPr>
-        <w:t xml:space="preserve">. </w:t>
-      </w:r>
-      <w:r>
-        <w:rPr>
-          <w:rFonts w:ascii="Garamond" w:hAnsi="Garamond"/>
-        </w:rPr>
-        <w:t xml:space="preserve">Large, relatively free-flowing watersheds in Alaska support the largest remaining </w:t>
-      </w:r>
-      <w:r>
-        <w:rPr>
-          <w:rFonts w:ascii="Garamond" w:hAnsi="Garamond"/>
-        </w:rPr>
-        <w:t xml:space="preserve">pacific salmon populations </w:t>
-      </w:r>
-      <w:r>
-        <w:rPr>
-          <w:rFonts w:ascii="Garamond" w:hAnsi="Garamond"/>
-        </w:rPr>
-        <w:t>and contain some of the last remaining pristine habitats</w:t>
-      </w:r>
-      <w:r>
-        <w:rPr>
-          <w:rFonts w:ascii="Garamond" w:hAnsi="Garamond"/>
-        </w:rPr>
-        <w:t xml:space="preserve"> </w:t>
-      </w:r>
-      <w:r>
-        <w:rPr>
-          <w:rFonts w:ascii="Garamond" w:hAnsi="Garamond"/>
-        </w:rPr>
-        <w:t xml:space="preserve">which are </w:t>
-      </w:r>
-      <w:r>
-        <w:rPr>
-          <w:rFonts w:ascii="Garamond" w:hAnsi="Garamond"/>
-        </w:rPr>
-        <w:t xml:space="preserve">expected to </w:t>
-      </w:r>
-      <w:r>
-        <w:rPr>
-          <w:rFonts w:ascii="Garamond" w:hAnsi="Garamond"/>
-        </w:rPr>
-        <w:t xml:space="preserve">function in ways that </w:t>
-      </w:r>
-      <w:r>
-        <w:rPr>
-          <w:rFonts w:ascii="Garamond" w:hAnsi="Garamond"/>
-        </w:rPr>
-        <w:t xml:space="preserve">closely </w:t>
-      </w:r>
-      <w:r>
-        <w:rPr>
-          <w:rFonts w:ascii="Garamond" w:hAnsi="Garamond"/>
-        </w:rPr>
-        <w:t xml:space="preserve">reflect the natural processes of healthy </w:t>
-      </w:r>
-      <w:r>
-        <w:rPr>
-          <w:rFonts w:ascii="Garamond" w:hAnsi="Garamond"/>
-        </w:rPr>
-        <w:t xml:space="preserve">ecosystems </w:t>
-      </w:r>
-      <w:r>
-        <w:rPr>
-          <w:rFonts w:ascii="Garamond" w:hAnsi="Garamond"/>
-        </w:rPr>
-        <w:fldChar w:fldCharType="begin"/>
-      </w:r>
-      <w:r>
-        <w:rPr>
-          <w:rFonts w:ascii="Garamond" w:hAnsi="Garamond"/>
-        </w:rPr>
-        <w:instrText xml:space="preserve"> ADDIN ZOTERO_ITEM CSL_CITATION {"citationID":"OBNj6FQs","properties":{"formattedCitation":"(Schoen et al., 2017)","plainCitation":"(Schoen et al., 2017)","noteIndex":0},"citationItems":[{"id":6051,"uris":["http://zotero.org/users/8421274/items/UPNXXHTQ"],"itemData":{"id":6051,"type":"article-journal","abstract":"Pacific salmon Oncorhynchus spp. face serious challenges from climate and landscape change, particularly in the southern portion of their native range. Conversely, climate warming appears to be allowing salmon to expand northwards into the Arctic. Between these geographic extremes, in the Gulf of Alaska region, salmon are at historically high abundances but face an uncertain future due to rapid environmental change. We examined changes in climate, hydrology, land cover, salmon populations, and fisheries over the past 30–70 years in this region. We focused on the Kenai River, which supports world-famous fisheries but where Chinook Salmon O. tshawytscha populations have declined, raising concerns about their future resilience. The region is warming and experiencing drier summers and wetter autumns. The landscape is also changing, with melting glaciers, wetland loss, wildfires, and human development. This environmental transformation will likely harm some salmon populations while benefiting others. Lowland salmon streams are especially vulnerable, but retreating glaciers may allow production gains in other streams. Some fishing communities harvest a diverse portfolio of fluctuating resources, whereas others have specialized over time, potentially limiting their resilience. Maintaining diverse habitats and salmon runs may allow ecosystems and fisheries to continue to thrive amidst these changes.","container-title":"Fisheries","DOI":"10.1080/03632415.2017.1374251","ISSN":"0363-2415","issue":"10","note":"_eprint: https://doi.org/10.1080/03632415.2017.1374251","page":"538-553","publisher":"Taylor &amp; Francis","source":"Taylor and Francis+NEJM","title":"Future of Pacific Salmon in the Face of Environmental Change: Lessons from One of the World's Remaining Productive Salmon Regions","title-short":"Future of Pacific Salmon in the Face of Environmental Change","volume":"42","author":[{"family":"Schoen","given":"Erik R."},{"family":"Wipfli","given":"Mark S."},{"family":"Trammell","given":"E. Jamie"},{"family":"Rinella","given":"Daniel J."},{"family":"Floyd","given":"Angelica L."},{"family":"Grunblatt","given":"Jess"},{"family":"McCarthy","given":"Molly D."},{"family":"Meyer","given":"Benjamin E."},{"family":"Morton","given":"John M."},{"family":"Powell","given":"James E."},{"family":"Prakash","given":"Anupma"},{"family":"Reimer","given":"Matthew N."},{"family":"Stuefer","given":"Svetlana L."},{"family":"Toniolo","given":"Horacio"},{"family":"Wells","given":"Brett M."},{"family":"Witmer","given":"Frank D. W."}],"issued":{"date-parts":[["2017",10,3]]}}}],"schema":"https://github.com/citation-style-language/schema/raw/master/csl-citation.json"} </w:instrText>
-      </w:r>
-      <w:r>
-        <w:rPr>
-          <w:rFonts w:ascii="Garamond" w:hAnsi="Garamond"/>
-        </w:rPr>
-        <w:fldChar w:fldCharType="separate"/>
-      </w:r>
-      <w:r>
-        <w:rPr>
-          <w:rFonts w:ascii="Garamond" w:hAnsi="Garamond"/>
-          <w:noProof/>
-        </w:rPr>
-        <w:t>(Schoen et al., 2017)</w:t>
-      </w:r>
-      <w:r>
-        <w:rPr>
-          <w:rFonts w:ascii="Garamond" w:hAnsi="Garamond"/>
-        </w:rPr>
-        <w:fldChar w:fldCharType="end"/>
-      </w:r>
-      <w:r>
-        <w:rPr>
-          <w:rFonts w:ascii="Garamond" w:hAnsi="Garamond"/>
-        </w:rPr>
-        <w:t>.</w:t>
-      </w:r>
-      <w:r>
-        <w:rPr>
-          <w:rFonts w:ascii="Garamond" w:hAnsi="Garamond"/>
-        </w:rPr>
-        <w:t xml:space="preserve"> </w:t>
-      </w:r>
-      <w:r>
-        <w:rPr>
-          <w:rFonts w:ascii="Garamond" w:hAnsi="Garamond"/>
-        </w:rPr>
-        <w:t xml:space="preserve">As a result, these </w:t>
-      </w:r>
-      <w:r>
-        <w:rPr>
-          <w:rFonts w:ascii="Garamond" w:hAnsi="Garamond"/>
-        </w:rPr>
-        <w:lastRenderedPageBreak/>
-        <w:t>systems offer a</w:t>
-      </w:r>
-      <w:r>
-        <w:rPr>
-          <w:rFonts w:ascii="Garamond" w:hAnsi="Garamond"/>
-        </w:rPr>
-        <w:t xml:space="preserve">n </w:t>
-      </w:r>
-      <w:r>
-        <w:rPr>
-          <w:rFonts w:ascii="Garamond" w:hAnsi="Garamond"/>
-        </w:rPr>
-        <w:t xml:space="preserve">opportunity to </w:t>
-      </w:r>
-      <w:r>
-        <w:rPr>
-          <w:rFonts w:ascii="Garamond" w:hAnsi="Garamond"/>
-        </w:rPr>
-        <w:t>investigate</w:t>
-      </w:r>
-      <w:r>
-        <w:rPr>
-          <w:rFonts w:ascii="Garamond" w:hAnsi="Garamond"/>
-        </w:rPr>
-        <w:t xml:space="preserve"> the ecological processes which govern </w:t>
-      </w:r>
-      <w:r>
-        <w:rPr>
-          <w:rFonts w:ascii="Garamond" w:hAnsi="Garamond"/>
-        </w:rPr>
-        <w:t>wil</w:t>
-      </w:r>
-      <w:r>
-        <w:rPr>
-          <w:rFonts w:ascii="Garamond" w:hAnsi="Garamond"/>
-        </w:rPr>
-        <w:t>d salmon populations</w:t>
-      </w:r>
-      <w:r>
-        <w:rPr>
-          <w:rFonts w:ascii="Garamond" w:hAnsi="Garamond"/>
-        </w:rPr>
-        <w:t xml:space="preserve">, </w:t>
-      </w:r>
-      <w:r>
-        <w:rPr>
-          <w:rFonts w:ascii="Garamond" w:hAnsi="Garamond"/>
-        </w:rPr>
-        <w:t>provid</w:t>
-      </w:r>
-      <w:r>
-        <w:rPr>
-          <w:rFonts w:ascii="Garamond" w:hAnsi="Garamond"/>
-        </w:rPr>
-        <w:t xml:space="preserve">ing </w:t>
-      </w:r>
-      <w:r>
-        <w:rPr>
-          <w:rFonts w:ascii="Garamond" w:hAnsi="Garamond"/>
-        </w:rPr>
-        <w:t>a baseline for restoring impacted watersheds</w:t>
-      </w:r>
-      <w:r>
-        <w:rPr>
-          <w:rFonts w:ascii="Garamond" w:hAnsi="Garamond"/>
-        </w:rPr>
-        <w:t xml:space="preserve"> elsewhere. </w:t>
-      </w:r>
-    </w:p>
-    <w:p>
-      <w:pPr>
-        <w:pStyle w:val="font-claude-response-body"/>
-        <w:spacing w:line="360" w:lineRule="auto"/>
-        <w:ind w:firstLine="360"/>
-        <w:rPr>
-          <w:rFonts w:ascii="Garamond" w:hAnsi="Garamond"/>
-        </w:rPr>
-      </w:pPr>
-      <w:r>
-        <w:rPr>
-          <w:rFonts w:ascii="Garamond" w:hAnsi="Garamond"/>
-        </w:rPr>
-        <w:t xml:space="preserve">Insights over the past decade have </w:t>
-      </w:r>
-      <w:r>
-        <w:rPr>
-          <w:rFonts w:ascii="Garamond" w:hAnsi="Garamond"/>
-        </w:rPr>
-        <w:t xml:space="preserve">emphasized </w:t>
-      </w:r>
-      <w:r>
-        <w:rPr>
-          <w:rFonts w:ascii="Garamond" w:hAnsi="Garamond"/>
-        </w:rPr>
-        <w:t>the</w:t>
-      </w:r>
-      <w:r>
-        <w:rPr>
-          <w:rFonts w:ascii="Garamond" w:hAnsi="Garamond"/>
-        </w:rPr>
-        <w:t xml:space="preserve"> </w:t>
-      </w:r>
-      <w:r>
-        <w:rPr>
-          <w:rFonts w:ascii="Garamond" w:hAnsi="Garamond"/>
-        </w:rPr>
-        <w:t>importance of landscape heterogeneity</w:t>
-      </w:r>
-      <w:r>
-        <w:rPr>
-          <w:rFonts w:ascii="Garamond" w:hAnsi="Garamond"/>
-        </w:rPr>
-        <w:t xml:space="preserve"> </w:t>
-      </w:r>
-      <w:r>
-        <w:rPr>
-          <w:rFonts w:ascii="Garamond" w:hAnsi="Garamond"/>
-        </w:rPr>
-        <w:t xml:space="preserve">to the long-term stability of </w:t>
-      </w:r>
-      <w:r>
-        <w:rPr>
-          <w:rFonts w:ascii="Garamond" w:hAnsi="Garamond"/>
-        </w:rPr>
-        <w:t xml:space="preserve">ecosystems </w:t>
-      </w:r>
-      <w:r>
-        <w:rPr>
-          <w:rFonts w:ascii="Garamond" w:hAnsi="Garamond"/>
-        </w:rPr>
-        <w:fldChar w:fldCharType="begin"/>
-      </w:r>
-      <w:r>
-        <w:rPr>
-          <w:rFonts w:ascii="Garamond" w:hAnsi="Garamond"/>
-        </w:rPr>
-        <w:instrText xml:space="preserve"> ADDIN ZOTERO_ITEM CSL_CITATION {"citationID":"5XM4O6pO","properties":{"formattedCitation":"(Cordoleani et al., 2024; Rahr et al., 2025)","plainCitation":"(Cordoleani et al., 2024; Rahr et al., 2025)","noteIndex":0},"citationItems":[{"id":5990,"uris":["http://zotero.org/users/8421274/items/BGVZ7ZLQ"],"itemData":{"id":5990,"type":"article-journal","abstract":"Phenotypic diversity and abundance drive salmon resilience in the face of increasing environmental variability. But what happens when human activities fundamentally alter the habitat complexity that drives this diversity? And how can we restore habitats to recover both diversity and abundance to support salmon persistence in a warming climate? Here, we looked at the impact of a large watershed restoration effort on the abundance and climate resilience of the three remaining core natural spring-run Chinook Salmon populations in the California Central Valley (Butte, Mill, and Deer Creek). Butte Creek fish, which have floodplain access, had higher overall productivity and faster juvenile growth compared with Mill and Deer Creek populations, and the proportion of floodplain inundation was positively correlated with Butte Creek adult abundance two years later. While Butte Creek exhibited significant increases in abundance post-restoration (similar to 000%), it generally exhibited lower phenotypic diversity and only a marginal increase in population stability after restoration based on the coefficient of variation (CV). In particular, Butte Creek salmon tended to exhibit larger drops in escapement following dry years (e.g., return years 2010, 2017) compared with Mill and Deer Creek populations, presumably due to limited inundation of its downstream floodplain. The late-migrating juvenile strategy (i.e., yearling), which disproportionately supported Mill and Deer Creek populations during droughts, was uncommon among Butte Creek adults (averaging 60% of returns for Mill and Deer Creek vs. 0.3% for Butte Creek). Increased spring-run stock complex stability was found, post-restoration, when combining the three spring-run populations (i.e., lower aggregate CV). However, among-river pairwise correlations also suggested increased synchronization in population abundances post-restoration, potentially due to increasing frequency and severity of extreme climatic events (e.g., droughts and ocean warming). This study underscores the importance of restoring a connected mosaic of aquatic habitats across modified landscapes, such as cold water refugia and floodplains, to preserve multiple (across-population) life history pathways for increasing salmon stock complex stability and abundance. These landscape-scale process-based habitat restoration efforts are likely to be crucial for the successful long-term recovery of vulnerable species in a rapidly changing climate.","container-title":"Ecosphere","DOI":"10.1002/ecs2.4803","ISSN":"2150-8925","issue":"3","journalAbbreviation":"Ecosphere","language":"English","note":"number-of-pages: 18\npublisher-place: Hoboken\nWeb of Science ID: WOS:001182186400001","page":"e4803","publisher":"Wiley","source":"Clarivate Analytics Web of Science","title":"Restoring freshwater habitat mosaics to promote resilience of vulnerable salmon populations","volume":"15","author":[{"family":"Cordoleani","given":"Flora"},{"family":"Phillis","given":"Corey C."},{"family":"Sturrock","given":"Anna M."},{"family":"Willmes","given":"Malte"},{"family":"Whitman","given":"George"},{"family":"Holmes","given":"Eric"},{"family":"Weber","given":"Peter K."},{"family":"Jeffres","given":"Carson"},{"family":"Johnson","given":"Rachel C."}],"issued":{"date-parts":[["2024",3]]}}},{"id":6043,"uris":["http://zotero.org/users/8421274/items/C2HKLHLY"],"itemData":{"id":6043,"type":"article-journal","abstract":"Nested within the linked global crises of biodiversity loss and climate change are threats to cultural and ecological keystones such as Pacific salmon Oncorhynchus spp., a group of species with widespread ecological, cultural, and economic value. Wild salmon can rally public support for ecosystem protection and link place-based conservation efforts to global biodiversity and climate benefits. Realizing these benefits depends on leveraging broad support for salmon conservation to advance forward-looking approaches that safeguard food security, biodiversity, and climate resilience. Here we provide insights from the multidecadal implementation of a proactive wild salmon ecosystem conservation strategy at the scale of the North Pacific Rim. This approach is a necessary complement to policies focused on preventing species extinction after populations and habitats are degraded and it provides globally significant contributions to biodiversity and climate targets including recent 30 × 30 goals of the Convention on Biological Diversity.","container-title":"Fisheries","DOI":"10.1093/fshmag/vuaf011","ISSN":"0363-2415","issue":"9","page":"399-415","source":"Silverchair","title":"Strongholds for Pacific salmon: A proactive conservation strategy for ecosystem health, food security, biodiversity, and climate resilience","title-short":"Strongholds for Pacific salmon","volume":"50","author":[{"family":"Rahr","given":"Guido R","suffix":"III"},{"family":"Sloat","given":"Matthew R"},{"family":"Atlas","given":"William I"},{"family":"Hart","given":"Jonathan L"}],"issued":{"date-parts":[["2025",9,1]]}}}],"schema":"https://github.com/citation-style-language/schema/raw/master/csl-citation.json"} </w:instrText>
-      </w:r>
-      <w:r>
-        <w:rPr>
-          <w:rFonts w:ascii="Garamond" w:hAnsi="Garamond"/>
-        </w:rPr>
-        <w:fldChar w:fldCharType="separate"/>
-      </w:r>
-      <w:r>
-        <w:rPr>
-          <w:rFonts w:ascii="Garamond" w:hAnsi="Garamond"/>
-          <w:noProof/>
-        </w:rPr>
-        <w:t>(Cordoleani et al., 2024; Rahr et al., 2025)</w:t>
-      </w:r>
-      <w:r>
-        <w:rPr>
-          <w:rFonts w:ascii="Garamond" w:hAnsi="Garamond"/>
-        </w:rPr>
-        <w:fldChar w:fldCharType="end"/>
-      </w:r>
-      <w:r>
-        <w:rPr>
-          <w:rFonts w:ascii="Garamond" w:hAnsi="Garamond"/>
-        </w:rPr>
-        <w:t xml:space="preserve">. </w:t>
-      </w:r>
-      <w:r>
-        <w:rPr>
-          <w:rFonts w:ascii="Garamond" w:hAnsi="Garamond"/>
-        </w:rPr>
-        <w:t xml:space="preserve">In well-functioning systems, variation in </w:t>
-      </w:r>
-      <w:r>
-        <w:rPr>
-          <w:rFonts w:ascii="Garamond" w:hAnsi="Garamond"/>
-        </w:rPr>
-        <w:t xml:space="preserve">local </w:t>
-      </w:r>
-      <w:r>
-        <w:rPr>
-          <w:rFonts w:ascii="Garamond" w:hAnsi="Garamond"/>
-        </w:rPr>
-        <w:t>biophysical conditions (e.g., hydrology, temperature) filter broad environmental drivers (e.g., precipitation, air temperature)</w:t>
-      </w:r>
-      <w:r>
-        <w:rPr>
-          <w:rFonts w:ascii="Garamond" w:hAnsi="Garamond"/>
-        </w:rPr>
-        <w:t xml:space="preserve"> to </w:t>
-      </w:r>
-      <w:r>
-        <w:rPr>
-          <w:rFonts w:ascii="Garamond" w:hAnsi="Garamond"/>
-        </w:rPr>
-        <w:t>produc</w:t>
-      </w:r>
-      <w:r>
-        <w:rPr>
-          <w:rFonts w:ascii="Garamond" w:hAnsi="Garamond"/>
-        </w:rPr>
-        <w:t>e</w:t>
-      </w:r>
-      <w:r>
-        <w:rPr>
-          <w:rFonts w:ascii="Garamond" w:hAnsi="Garamond"/>
-        </w:rPr>
-        <w:t xml:space="preserve"> </w:t>
-      </w:r>
-      <w:r>
-        <w:rPr>
-          <w:rFonts w:ascii="Garamond" w:hAnsi="Garamond"/>
-        </w:rPr>
-        <w:t xml:space="preserve">a continuum of </w:t>
-      </w:r>
-      <w:r>
-        <w:rPr>
-          <w:rFonts w:ascii="Garamond" w:hAnsi="Garamond"/>
-        </w:rPr>
-        <w:t>habitat</w:t>
-      </w:r>
-      <w:r>
-        <w:rPr>
-          <w:rFonts w:ascii="Garamond" w:hAnsi="Garamond"/>
-        </w:rPr>
-        <w:t xml:space="preserve"> types and</w:t>
-      </w:r>
-      <w:r>
-        <w:rPr>
-          <w:rFonts w:ascii="Garamond" w:hAnsi="Garamond"/>
-        </w:rPr>
-        <w:t xml:space="preserve"> conditions </w:t>
-      </w:r>
-      <w:r>
-        <w:rPr>
-          <w:rFonts w:ascii="Garamond" w:hAnsi="Garamond"/>
-        </w:rPr>
-        <w:t>across the landscape</w:t>
-      </w:r>
-      <w:r>
-        <w:rPr>
-          <w:rFonts w:ascii="Garamond" w:hAnsi="Garamond"/>
-        </w:rPr>
-        <w:t xml:space="preserve">. </w:t>
-      </w:r>
-      <w:r>
-        <w:rPr>
-          <w:rFonts w:ascii="Garamond" w:hAnsi="Garamond"/>
-        </w:rPr>
-        <w:t>As these interactions shift across space and time, habitat conditions are reconfigured across the landscape</w:t>
-      </w:r>
-      <w:r>
-        <w:rPr>
-          <w:rFonts w:ascii="Garamond" w:hAnsi="Garamond"/>
-        </w:rPr>
-        <w:t xml:space="preserve"> </w:t>
-      </w:r>
-      <w:r>
-        <w:rPr>
-          <w:rFonts w:ascii="Garamond" w:hAnsi="Garamond"/>
-        </w:rPr>
-        <w:t>driv</w:t>
-      </w:r>
-      <w:r>
-        <w:rPr>
-          <w:rFonts w:ascii="Garamond" w:hAnsi="Garamond"/>
-        </w:rPr>
-        <w:t>ing</w:t>
-      </w:r>
-      <w:r>
-        <w:rPr>
-          <w:rFonts w:ascii="Garamond" w:hAnsi="Garamond"/>
-        </w:rPr>
-        <w:t xml:space="preserve"> corresponding shifts in fishery production as locally adapted subpopulations respond to the changing distribution of optimal habitat </w:t>
-      </w:r>
-      <w:r>
-        <w:rPr>
-          <w:rFonts w:ascii="Garamond" w:hAnsi="Garamond"/>
-        </w:rPr>
-        <w:fldChar w:fldCharType="begin"/>
-      </w:r>
-      <w:r>
-        <w:rPr>
-          <w:rFonts w:ascii="Garamond" w:hAnsi="Garamond"/>
-        </w:rPr>
-        <w:instrText xml:space="preserve"> ADDIN ZOTERO_ITEM CSL_CITATION {"citationID":"zdQcn8TC","properties":{"formattedCitation":"(Brennan et al., 2019; Stanford et al., 2005)","plainCitation":"(Brennan et al., 2019; Stanford et al., 2005)","noteIndex":0},"citationItems":[{"id":3844,"uris":["http://zotero.org/users/8421274/items/RXD5IA9D"],"itemData":{"id":3844,"type":"article-journal","abstract":"Watersheds are complex mosaics of habitats whose conditions vary across space and time as landscape features filter overriding climate forcing, yet the extent to which the reliability of ecosystem services depends on these dynamics remains unknown. We quantified how shifting habitat mosaics are expressed across a range of spatial scales within a large, free-flowing river, and how they stabilize the production of Pacific salmon that support valuable fisheries. The strontium isotope records of ear stones (otoliths) show that the relative productivity of locations across the river network, as both natal- and juvenile-rearing habitat, varies widely among years and that this variability is expressed across a broad range of spatial scales, ultimately stabilizing the interannual production of fish at the scale of the entire basin.","container-title":"Science","DOI":"10.1126/science.aav4313","issue":"6442","page":"783-786","publisher":"American Association for the Advancement of Science","source":"science.org (Atypon)","title":"Shifting habitat mosaics and fish production across river basins","volume":"364","author":[{"family":"Brennan","given":"Sean R."},{"family":"Schindler","given":"Daniel E."},{"family":"Cline","given":"Timothy J."},{"family":"Walsworth","given":"Timothy E."},{"family":"Buck","given":"Greg"},{"family":"Fernandez","given":"Diego P."}],"issued":{"date-parts":[["2019"]]}}},{"id":116,"uris":["http://zotero.org/users/8421274/items/RCTHFEMR"],"itemData":{"id":116,"type":"article-journal","container-title":"SIL Proceedings, 1922-2010","DOI":"10.1080/03680770.2005.11901979","ISSN":"0368-0770","issue":"1","note":"_eprint: https://doi.org/10.1080/03680770.2005.11901979","page":"123-136","publisher":"Taylor &amp; Francis","source":"Taylor and Francis+NEJM","title":"The shifting habitat mosaic of river ecosystems","volume":"29","author":[{"family":"Stanford","given":"J. A."},{"family":"Lorang","given":"M. S."},{"family":"Hauer","given":"F. R."}],"issued":{"date-parts":[["2005",3,1]]}}}],"schema":"https://github.com/citation-style-language/schema/raw/master/csl-citation.json"} </w:instrText>
-      </w:r>
-      <w:r>
-        <w:rPr>
-          <w:rFonts w:ascii="Garamond" w:hAnsi="Garamond"/>
-        </w:rPr>
-        <w:fldChar w:fldCharType="separate"/>
-      </w:r>
-      <w:r>
-        <w:rPr>
-          <w:rFonts w:ascii="Garamond" w:hAnsi="Garamond"/>
-          <w:noProof/>
-        </w:rPr>
-        <w:t>(Brennan et al., 2019; Stanford et al., 2005)</w:t>
-      </w:r>
-      <w:r>
-        <w:rPr>
-          <w:rFonts w:ascii="Garamond" w:hAnsi="Garamond"/>
-        </w:rPr>
-        <w:fldChar w:fldCharType="end"/>
-      </w:r>
-      <w:r>
-        <w:rPr>
-          <w:rFonts w:ascii="Garamond" w:hAnsi="Garamond"/>
-        </w:rPr>
-        <w:t>.</w:t>
-      </w:r>
-      <w:r>
-        <w:rPr>
-          <w:rFonts w:ascii="Garamond" w:hAnsi="Garamond"/>
-        </w:rPr>
-        <w:t xml:space="preserve"> </w:t>
-      </w:r>
-      <w:r>
-        <w:rPr>
-          <w:rFonts w:ascii="Garamond" w:hAnsi="Garamond"/>
-        </w:rPr>
-        <w:t>This “shifting habitat mosaic” is expected to stabilize watershed performance (e.g., salmon returns) by maximizing the potential for optimal conditions to arise somewhere in the watershed under a range of prevailing environmental conditions. Although the spatial distribution of production shifts over time, hydrological connectivity links asynchronous upstream components, integrating sub-basin dynamics and reducing variability in ecosystem-scale performance.</w:t>
-      </w:r>
-    </w:p>
-    <w:p>
-      <w:pPr>
-        <w:pStyle w:val="font-claude-response-body"/>
-        <w:spacing w:line="360" w:lineRule="auto"/>
-        <w:ind w:firstLine="360"/>
-        <w:rPr>
-          <w:rFonts w:ascii="Garamond" w:hAnsi="Garamond"/>
-        </w:rPr>
-      </w:pPr>
-      <w:r>
-        <w:rPr>
-          <w:rFonts w:ascii="Garamond" w:hAnsi="Garamond"/>
-        </w:rPr>
-        <w:t xml:space="preserve">This pattern been reconstructed in </w:t>
-      </w:r>
-      <w:r>
-        <w:rPr>
-          <w:rFonts w:ascii="Garamond" w:hAnsi="Garamond"/>
-        </w:rPr>
-        <w:t>relatively small ecosystems</w:t>
-      </w:r>
-      <w:r>
-        <w:rPr>
-          <w:rFonts w:ascii="Garamond" w:hAnsi="Garamond"/>
-        </w:rPr>
-        <w:t xml:space="preserve"> </w:t>
-      </w:r>
-      <w:r>
-        <w:rPr>
-          <w:rFonts w:ascii="Garamond" w:hAnsi="Garamond"/>
-        </w:rPr>
-        <w:fldChar w:fldCharType="begin"/>
-      </w:r>
-      <w:r>
-        <w:rPr>
-          <w:rFonts w:ascii="Garamond" w:hAnsi="Garamond"/>
-        </w:rPr>
-        <w:instrText xml:space="preserve"> ADDIN ZOTERO_ITEM CSL_CITATION {"citationID":"651DcBk0","properties":{"formattedCitation":"(Armstrong &amp; Schindler, 2013; Baldock et al., 2016)","plainCitation":"(Armstrong &amp; Schindler, 2013; Baldock et al., 2016)","noteIndex":0},"citationItems":[{"id":65,"uris":["http://zotero.org/users/8421274/items/UPNH69YA"],"itemData":{"id":65,"type":"article-journal","abstract":"A critical challenge for ecologists is to understand the functional significance of habitat heterogeneity and connectivity for mobile animals. Here, we explore how a thermo-regulating fish responds to annual variation in the spatial patterning of thermal and trophic resources. In a third-order stream in coastal Alaska, juvenile coho salmon forage on sockeye salmon eggs at night in cold water and then move to warmer water to increase their digestive capacity. We mapped the spatial distributions of water temperature, juvenile coho salmon, and spawning sockeye salmon across a 5-year period during which summer discharge varied by greater than fivefold. In low flow years, warm water (9–12°C) was only available in thalweg (that is, main-channel) habitat at least approximately 400 m upstream of the cooler habitat (3–7°C) where sockeye salmon spawned. In high flow years, the entire stream thalweg was isothermal at 7–8°C, but inundated off-channel areas generated warm habitats (9–12°C) laterally adjacent to the downstream regions where sockeye salmon spawned. The daytime spatial distribution of juvenile coho salmon shifted from headwater thalweg habitats in low flow years, to downstream off-channel habitats in high flow years. In all years, the majority of juvenile coho salmon sampled during the daytime were found in warm habitat units without sockeye salmon present, yet they exhibited diet contents comprised virtually entirely of sockeye salmon eggs. Thus, thermoregulatory movements by coho salmon were able to track an annually shifting mosaic of water temperature. Our results demonstrate how the spatial habitat heterogeneity and connectivity of intact floodplains can in turn buffer aquatic organisms from high levels of temporal variation in habitat conditions and resource abundance.","container-title":"Ecosystems","DOI":"10.1007/s10021-013-9693-9","ISSN":"1435-0629","issue":"8","journalAbbreviation":"Ecosystems","language":"en","page":"1429-1441","source":"Springer Link","title":"Going with the Flow: Spatial Distributions of Juvenile Coho Salmon Track an Annually Shifting Mosaic of Water Temperature","title-short":"Going with the Flow","volume":"16","author":[{"family":"Armstrong","given":"Jonathan B."},{"family":"Schindler","given":"Daniel E."}],"issued":{"date-parts":[["2013",12,1]]}}},{"id":171,"uris":["http://zotero.org/users/8421274/items/WD6RF39R"],"itemData":{"id":171,"type":"article-journal","abstract":"Seasonal variation in river water levels creates a shifting mosaic of habitat conditions associated with variables such as water temperature, chemistry and prey availability to consumers. Previous work has shown that fishes can exploit spatial variation in water temperature, but less is known about how they respond to shifts in the spatial arrangement of habitat conditions through time. Juvenile coho salmon (Oncorhynchus kisutch) are the numerically dominant fish species in many southwest Alaskan streams, which exhibit seasonal variation in water level and temperature due to changes in precipitation and snowmelt. We assessed the degree to which juvenile coho salmon exploit the associated shifting mosaic of water temperature by monitoring the spatial distribution of water temperatures and juvenile coho salmon in the lake-influenced reaches of a southwest Alaskan stream. We also monitored the diets of juvenile coho salmon relative to the spatial distribution of prey taxa. Juvenile coho salmon exhibited two scales of movement to track spatiotemporal variation in habitat conditions. First, over the course of 6 weeks, individuals moved among off-channel units, tracking shifts in the location of warm water habitat caused by receding water level. Second, individuals moved at diel time scales, foraging on benthic macroinvertebrates in the cold thalweg of the stream at night and then digesting prey in warmer off-channel habitats during the day. Seasonally asynchronous variation in water temperature among off-channel habitat units produced portfolio effects in habitat conditions, such that coho salmon had continual access to warm habitat for digestion despite its ephemeral availability at discrete locations. Our study demonstrates that behavioural thermoregulation by juvenile fishes can be important throughout the growing season and is not restricted to ephemeral events such as resource pulses or heat stress. Our results have implications for the conservation of highly connected, heterogeneous landscapes, and their ability to support economically and ecologically important species such as coho salmon.","container-title":"Freshwater Biology","DOI":"10.1111/fwb.12784","ISSN":"1365-2427","issue":"9","language":"en","note":"_eprint: https://onlinelibrary.wiley.com/doi/pdf/10.1111/fwb.12784","page":"1454-1465","source":"Wiley Online Library","title":"Juvenile coho salmon track a seasonally shifting thermal mosaic across a river floodplain","volume":"61","author":[{"family":"Baldock","given":"Jeffrey R."},{"family":"Armstrong","given":"Jonathan B."},{"family":"Schindler","given":"Daniel E."},{"family":"Carter","given":"Jackie L."}],"issued":{"date-parts":[["2016"]]}}}],"schema":"https://github.com/citation-style-language/schema/raw/master/csl-citation.json"} </w:instrText>
-      </w:r>
-      <w:r>
-        <w:rPr>
-          <w:rFonts w:ascii="Garamond" w:hAnsi="Garamond"/>
-        </w:rPr>
-        <w:fldChar w:fldCharType="separate"/>
-      </w:r>
-      <w:r>
-        <w:rPr>
-          <w:rFonts w:ascii="Garamond" w:hAnsi="Garamond"/>
-          <w:noProof/>
-        </w:rPr>
-        <w:t>(Armstrong &amp; Schindler, 2013; Baldock et al., 2016)</w:t>
-      </w:r>
-      <w:r>
-        <w:rPr>
-          <w:rFonts w:ascii="Garamond" w:hAnsi="Garamond"/>
-        </w:rPr>
-        <w:fldChar w:fldCharType="end"/>
-      </w:r>
-      <w:r>
-        <w:rPr>
-          <w:rFonts w:ascii="Garamond" w:hAnsi="Garamond"/>
-        </w:rPr>
-        <w:t xml:space="preserve"> </w:t>
-      </w:r>
-      <w:r>
-        <w:rPr>
-          <w:rFonts w:ascii="Garamond" w:hAnsi="Garamond"/>
-        </w:rPr>
-        <w:t xml:space="preserve">and at the watershed scale in Alaska </w:t>
-      </w:r>
-      <w:r>
-        <w:rPr>
-          <w:rFonts w:ascii="Garamond" w:hAnsi="Garamond"/>
-        </w:rPr>
-        <w:t xml:space="preserve">at relatively short timescales (&lt; 3 years). However, the spatial ecology of Alaska’s largest salmon baring watersheds, the Yukon and Kuskokwim river-basins, are poorly understood, and it has not been explored to what extend this pattern plays out at much larger spatial scales or over longer temporal scales. </w:t>
-      </w:r>
-      <w:r>
-        <w:rPr>
-          <w:rFonts w:ascii="Garamond" w:hAnsi="Garamond"/>
-        </w:rPr>
-        <w:t xml:space="preserve">Here, we reconstruct spatiotemporal patterns of </w:t>
-      </w:r>
-      <w:r>
-        <w:rPr>
-          <w:rFonts w:ascii="Garamond" w:hAnsi="Garamond"/>
-        </w:rPr>
-        <w:t xml:space="preserve">natal origin habitat for Chinook salmon (sp.) in the Yukon and Kuskokwim river-basins using otolith microchemistry. In doing so, we explore the </w:t>
-      </w:r>
-      <w:r>
-        <w:rPr>
-          <w:rFonts w:ascii="Garamond" w:hAnsi="Garamond"/>
-        </w:rPr>
-        <w:t xml:space="preserve">natural spatial ecology of Chinook salmon in a pristine, free flowing watershed and explore the potential of a shifting habitat mosaic to produce variability in the spatial distribution of life histories and to buffer watershed production across this variability across the basin. </w:t>
-      </w:r>
-    </w:p>
-    <w:p>
-      <w:pPr>
-        <w:pStyle w:val="font-claude-response-body"/>
-        <w:spacing w:line="360" w:lineRule="auto"/>
-        <w:ind w:firstLine="360"/>
-        <w:rPr>
-          <w:rFonts w:ascii="Garamond" w:hAnsi="Garamond"/>
-        </w:rPr>
-      </w:pPr>
-    </w:p>
-    <w:p>
-      <w:pPr>
-        <w:pStyle w:val="font-claude-response-body"/>
-        <w:spacing w:line="360" w:lineRule="auto"/>
-        <w:ind w:firstLine="360"/>
-        <w:rPr>
-          <w:rFonts w:ascii="Garamond" w:hAnsi="Garamond"/>
-        </w:rPr>
-      </w:pPr>
-    </w:p>
-    <w:p>
-      <w:pPr>
-        <w:pStyle w:val="font-claude-response-body"/>
-        <w:spacing w:line="360" w:lineRule="auto"/>
-        <w:ind w:firstLine="360"/>
-        <w:rPr>
-          <w:rFonts w:ascii="Garamond" w:hAnsi="Garamond"/>
-        </w:rPr>
-      </w:pPr>
-    </w:p>
-    <w:p>
-      <w:pPr>
-        <w:pStyle w:val="font-claude-response-body"/>
-        <w:spacing w:line="360" w:lineRule="auto"/>
+        <w:t>Methods</w:t>
+      </w:r>
+      <w:r>
         <w:rPr>
           <w:rFonts w:ascii="Garamond" w:hAnsi="Garamond"/>
           <w:b/>
           <w:bCs/>
           <w:u w:val="single"/>
         </w:rPr>
-      </w:pPr>
-      <w:r>
+        <w:t xml:space="preserve">: </w:t>
+      </w:r>
+    </w:p>
+    <w:p>
+      <w:pPr>
+        <w:pStyle w:val="font-claude-response-body"/>
+        <w:spacing w:line="360" w:lineRule="auto"/>
         <w:rPr>
           <w:rFonts w:ascii="Garamond" w:hAnsi="Garamond"/>
           <w:b/>
           <w:bCs/>
           <w:u w:val="single"/>
         </w:rPr>
-        <w:lastRenderedPageBreak/>
-        <w:t>Methods</w:t>
-      </w:r>
+      </w:pPr>
       <w:r>
         <w:rPr>
           <w:rFonts w:ascii="Garamond" w:hAnsi="Garamond"/>
@@ -1287,7 +1168,138 @@
           <w:bCs/>
           <w:u w:val="single"/>
         </w:rPr>
-        <w:t xml:space="preserve">: </w:t>
+        <w:t xml:space="preserve">Otolith and Genetic Data: </w:t>
+      </w:r>
+    </w:p>
+    <w:p>
+      <w:pPr>
+        <w:pStyle w:val="font-claude-response-body"/>
+        <w:spacing w:line="360" w:lineRule="auto"/>
+        <w:ind w:firstLine="720"/>
+        <w:rPr>
+          <w:rFonts w:ascii="Garamond" w:hAnsi="Garamond"/>
+        </w:rPr>
+      </w:pPr>
+      <w:r>
+        <w:rPr>
+          <w:rFonts w:ascii="Garamond" w:hAnsi="Garamond"/>
+        </w:rPr>
+        <w:t xml:space="preserve">Chinook salmon otoliths were collected from the Yukon (2015, 2016, 2019–2021) and Kuskokwim (2017–2022) rivers over several years from the downstream terminus of both rivers. Yukon otoliths were collected from the Lower Yukon Test Fishery (LYTF) operated by the Alaska Department of Fish and Game near Emmonok, Ak and Kuskokwim otoliths were collected by collaborators at the Orutsararmiut Native Council at the Bethel Test Fishery (BTF) near Bethel, AK (Figure _). It is assumed that fish caught in each test fishery reared in their respective river and were therefore returning to their natal spawning grounds on capture. Both test fisheries are designed to </w:t>
+      </w:r>
+      <w:r>
+        <w:rPr>
+          <w:rFonts w:ascii="Garamond" w:hAnsi="Garamond"/>
+        </w:rPr>
+        <w:t xml:space="preserve">sample throughout the run to gain insight on the timing of individual stocks throughout the basin. </w:t>
+      </w:r>
+      <w:r>
+        <w:rPr>
+          <w:rFonts w:ascii="Garamond" w:hAnsi="Garamond"/>
+        </w:rPr>
+        <w:t>Roughly 500 otoliths were collected from each sample site and in each year, with the exception of</w:t>
+      </w:r>
+      <w:commentRangeStart w:id="5"/>
+      <w:r>
+        <w:rPr>
+          <w:rFonts w:ascii="Garamond" w:hAnsi="Garamond"/>
+        </w:rPr>
+        <w:t xml:space="preserve"> ________________. </w:t>
+      </w:r>
+      <w:commentRangeEnd w:id="5"/>
+      <w:r>
+        <w:rPr>
+          <w:rStyle w:val="CommentReference"/>
+          <w:rFonts w:ascii="Garamond" w:hAnsi="Garamond"/>
+          <w:sz w:val="24"/>
+          <w:szCs w:val="24"/>
+        </w:rPr>
+        <w:commentReference w:id="5"/>
+      </w:r>
+      <w:r>
+        <w:rPr>
+          <w:rFonts w:ascii="Garamond" w:hAnsi="Garamond"/>
+        </w:rPr>
+        <w:t xml:space="preserve">From these, ~250 otoliths per river and per year were selected for further analysis, ensuring relatively equal representation relative to CPUE across the full year. </w:t>
+      </w:r>
+      <w:r>
+        <w:rPr>
+          <w:rFonts w:ascii="Garamond" w:hAnsi="Garamond"/>
+        </w:rPr>
+        <w:t>Selected otoliths wer</w:t>
+      </w:r>
+      <w:r>
+        <w:rPr>
+          <w:rFonts w:ascii="Garamond" w:hAnsi="Garamond"/>
+        </w:rPr>
+        <w:t xml:space="preserve">e cut along the transverse plane using a low speed isomet saw to reveal the core and growth structure of the otolith, mounted on a microscope slide, and polished. </w:t>
+      </w:r>
+      <w:r>
+        <w:rPr>
+          <w:rFonts w:ascii="Garamond" w:hAnsi="Garamond"/>
+        </w:rPr>
+        <w:fldChar w:fldCharType="begin"/>
+      </w:r>
+      <w:r>
+        <w:rPr>
+          <w:rFonts w:ascii="Garamond" w:hAnsi="Garamond"/>
+        </w:rPr>
+        <w:instrText xml:space="preserve"> ADDIN ZOTERO_ITEM CSL_CITATION {"citationID":"UdeDBfeN","properties":{"formattedCitation":"(Donohoe &amp; Zimmerman, 2010; Zimmerman &amp; Reeves, 2002)","plainCitation":"(Donohoe &amp; Zimmerman, 2010; Zimmerman &amp; Reeves, 2002)","noteIndex":0},"citationItems":[{"id":4778,"uris":["http://zotero.org/users/8421274/items/QJZIBTQC"],"itemData":{"id":4778,"type":"article-journal","abstract":"Beam-based analytical methods are widely used to measure the concentrations of elements and isotopes in otoliths. These methods usually require that otoliths be individually mounted and prepared to properly expose the desired growth region to the analytical beam. Most analytical instruments, such as LA-ICPMS and ion and electron microprobes, have sample holders that will accept only one to six slides or mounts at a time. We describe a method of mounting otoliths that allows for easy transfer of many otoliths to a single mount after they have been prepared. Such an approach increases the number of otoliths that can be analyzed in a single session by reducing the need open the sample chamber to exchange slides—a particularly time consuming step on instruments that operate under vacuum. For ion and electron microprobes, the method also greatly reduces the number of slides that must be coated with an electrical conductor prior to analysis. In this method, a narrow strip of cover glass is first glued at one end to a standard microscope slide. The otolith is then mounted in thermoplastic resin on the opposite, free end of the strip. The otolith can then be ground and flipped, if needed, by reheating the mounting medium. After otolith preparation is complete, the cover glass is cut with a scribe to free the otolith and up to 20 small otoliths can be arranged on a single petrographic slide.","container-title":"Environmental Biology of Fishes","DOI":"10.1007/s10641-010-9680-3","ISSN":"1573-5133","issue":"3","journalAbbreviation":"Environ Biol Fish","language":"en","page":"473-477","source":"Springer Link","title":"A method of mounting multiple otoliths for beam-based microchemical analyses","volume":"89","author":[{"family":"Donohoe","given":"Christopher J."},{"family":"Zimmerman","given":"Christian E."}],"issued":{"date-parts":[["2010",11,1]]}}},{"id":4132,"uris":["http://zotero.org/users/8421274/items/5YINANGC"],"itemData":{"id":4132,"type":"article-journal","abstract":"Comparisons of strontium:calcium (Sr: Ca) ratios in otolith primordia and freshwater growth regions were used to identify the progeny of steelhead Oncorhynchus mykiss (anadromous rainbow trout) and resident rainbow trout in the Deschutes River, Oregon. We cultured progeny of known adult steelhead and resident rainbow trout to confirm the relationship between Sr:Ca ratios in otolith primordia and the life history of the maternal parent. The mean (±SD) Sr:Ca ratio was significantly higher in the otolith primordia of the progeny of steelhead (0.001461 ± 0.00029; n = 100) than in those of the progeny of resident rainbow trout (0.000829 ± 0.000012; n = 100). We used comparisons of Sr:Ca ratios in the primordia and first-summer growth regions of otoliths to determine the maternal origin of unknown O. mykiss juveniles (n = 272) collected from rearing habitats within the main-stem Deschutes River and tributary rearing habitats and thus to ascertain the relative proportion of each life history morph in each rearing habitat. Resident rainbow trout fry dominated the bimonthly samples collected from main-stem rearing habitats between May and November 1995. Steelhead fry dominated samples collected from below waterfalls on two tributaries in 1996 and 1998.","container-title":"Transactions of the American Fisheries Society","DOI":"10.1577/1548-8659(2002)131&lt;0986:IOSARR&gt;2.0.CO;2","ISSN":"0002-8487","issue":"5","note":"_eprint: https://doi.org/10.1577/1548-8659(2002)131&lt;0986:IOSARR&gt;2.0.CO;2","page":"986-993","publisher":"Taylor &amp; Francis","source":"Taylor and Francis+NEJM","title":"Identification of Steelhead and Resident Rainbow Trout Progeny in the Deschutes River, Oregon, Revealed with Otolith Microchemistry","volume":"131","author":[{"family":"Zimmerman","given":"Christian E."},{"family":"Reeves","given":"Gordon H."}],"issued":{"date-parts":[["2002",9,1]]}}}],"schema":"https://github.com/citation-style-language/schema/raw/master/csl-citation.json"} </w:instrText>
+      </w:r>
+      <w:r>
+        <w:rPr>
+          <w:rFonts w:ascii="Garamond" w:hAnsi="Garamond"/>
+        </w:rPr>
+        <w:fldChar w:fldCharType="separate"/>
+      </w:r>
+      <w:r>
+        <w:rPr>
+          <w:rFonts w:ascii="Garamond" w:hAnsi="Garamond"/>
+          <w:noProof/>
+        </w:rPr>
+        <w:t>(Donohoe &amp; Zimmerman, 2010; Zimmerman &amp; Reeves, 2002)</w:t>
+      </w:r>
+      <w:r>
+        <w:rPr>
+          <w:rFonts w:ascii="Garamond" w:hAnsi="Garamond"/>
+        </w:rPr>
+        <w:fldChar w:fldCharType="end"/>
+      </w:r>
+      <w:r>
+        <w:rPr>
+          <w:rFonts w:ascii="Garamond" w:hAnsi="Garamond"/>
+        </w:rPr>
+        <w:t xml:space="preserve">. Samples were then analyzed for Sr8786 and Sr88 using Laser Ablation Inductively Coupled Plasma Mass Spectrometry (LA-ICP-MS) at the University of Utah Strontium Metals Lab. Laser ablation was performed from the otolith core to just after the onset of the marine signature along the dorsal lobe scanning at 2 microns/second. </w:t>
+      </w:r>
+      <w:r>
+        <w:rPr>
+          <w:rFonts w:ascii="Garamond" w:hAnsi="Garamond"/>
+        </w:rPr>
+        <w:t xml:space="preserve">The Sr87/Sr86 value from the natal rearing location was identified manually by examining the first stable value following the rapid decrease from that of the core, which was identified both by examining the position of the ablation transect relative to the visible core region on the otolith as well as a general </w:t>
+      </w:r>
+      <w:r>
+        <w:rPr>
+          <w:rFonts w:ascii="Garamond" w:hAnsi="Garamond"/>
+        </w:rPr>
+        <w:t>convergence</w:t>
+      </w:r>
+      <w:r>
+        <w:rPr>
+          <w:rFonts w:ascii="Garamond" w:hAnsi="Garamond"/>
+        </w:rPr>
+        <w:t xml:space="preserve"> towards the global marine Sr8786 value (0.70819</w:t>
+      </w:r>
+      <w:r>
+        <w:rPr>
+          <w:rFonts w:ascii="Garamond" w:hAnsi="Garamond"/>
+        </w:rPr>
+        <w:t xml:space="preserve">). Fin clip samples were taken from as many Yukon individuals as possible and genetic stock identification (GSI) assignments were </w:t>
+      </w:r>
+      <w:r>
+        <w:rPr>
+          <w:rFonts w:ascii="Garamond" w:hAnsi="Garamond"/>
+        </w:rPr>
+        <w:lastRenderedPageBreak/>
+        <w:t xml:space="preserve">estimated based on methods in Makhlouf et al., 2025 using X genetic baselines ( cites from there here). </w:t>
       </w:r>
     </w:p>
     <w:p>
@@ -1301,139 +1313,18 @@
           <w:u w:val="single"/>
         </w:rPr>
       </w:pPr>
-      <w:r>
+    </w:p>
+    <w:p>
+      <w:pPr>
+        <w:pStyle w:val="font-claude-response-body"/>
+        <w:spacing w:line="360" w:lineRule="auto"/>
         <w:rPr>
           <w:rFonts w:ascii="Garamond" w:hAnsi="Garamond"/>
           <w:b/>
           <w:bCs/>
           <w:u w:val="single"/>
         </w:rPr>
-        <w:t xml:space="preserve">Otolith and Genetic Data: </w:t>
-      </w:r>
-    </w:p>
-    <w:p>
-      <w:pPr>
-        <w:pStyle w:val="font-claude-response-body"/>
-        <w:spacing w:line="360" w:lineRule="auto"/>
-        <w:ind w:firstLine="720"/>
-        <w:rPr>
-          <w:rFonts w:ascii="Garamond" w:hAnsi="Garamond"/>
-        </w:rPr>
-      </w:pPr>
-      <w:r>
-        <w:rPr>
-          <w:rFonts w:ascii="Garamond" w:hAnsi="Garamond"/>
-        </w:rPr>
-        <w:t xml:space="preserve">Chinook salmon otoliths were collected from the Yukon (2015, 2016, 2019–2021) and Kuskokwim (2017–2022) rivers over several years from the downstream terminus of both rivers. Yukon otoliths were collected from the Lower Yukon Test Fishery (LYTF) operated by the Alaska Department of Fish and Game near Emmonok, Ak and Kuskokwim otoliths were collected by collaborators at the Orutsararmiut Native Council at the Bethel Test Fishery (BTF) near Bethel, AK (Figure _). It is assumed that fish caught in each test fishery reared in their respective river and were therefore returning to their natal spawning grounds on capture. Both test fisheries are designed to </w:t>
-      </w:r>
-      <w:r>
-        <w:rPr>
-          <w:rFonts w:ascii="Garamond" w:hAnsi="Garamond"/>
-        </w:rPr>
-        <w:t xml:space="preserve">sample throughout the run to gain insight on the timing of individual stocks throughout the basin. </w:t>
-      </w:r>
-      <w:r>
-        <w:rPr>
-          <w:rFonts w:ascii="Garamond" w:hAnsi="Garamond"/>
-        </w:rPr>
-        <w:t>Roughly 500 otoliths were collected from each sample site and in each year, with the exception of</w:t>
-      </w:r>
-      <w:commentRangeStart w:id="0"/>
-      <w:r>
-        <w:rPr>
-          <w:rFonts w:ascii="Garamond" w:hAnsi="Garamond"/>
-        </w:rPr>
-        <w:t xml:space="preserve"> ________________. </w:t>
-      </w:r>
-      <w:commentRangeEnd w:id="0"/>
-      <w:r>
-        <w:rPr>
-          <w:rStyle w:val="CommentReference"/>
-          <w:rFonts w:ascii="Garamond" w:hAnsi="Garamond"/>
-          <w:sz w:val="24"/>
-          <w:szCs w:val="24"/>
-        </w:rPr>
-        <w:commentReference w:id="0"/>
-      </w:r>
-      <w:r>
-        <w:rPr>
-          <w:rFonts w:ascii="Garamond" w:hAnsi="Garamond"/>
-        </w:rPr>
-        <w:t xml:space="preserve">From these, ~250 otoliths per river and per year were selected for further analysis, ensuring relatively equal representation relative to CPUE across the full year. </w:t>
-      </w:r>
-      <w:r>
-        <w:rPr>
-          <w:rFonts w:ascii="Garamond" w:hAnsi="Garamond"/>
-        </w:rPr>
-        <w:t>Selected otoliths wer</w:t>
-      </w:r>
-      <w:r>
-        <w:rPr>
-          <w:rFonts w:ascii="Garamond" w:hAnsi="Garamond"/>
-        </w:rPr>
-        <w:t xml:space="preserve">e cut along the transverse plane using a low speed isomet saw to reveal the core and growth structure of the otolith, mounted on a microscope slide, and polished. </w:t>
-      </w:r>
-      <w:r>
-        <w:rPr>
-          <w:rFonts w:ascii="Garamond" w:hAnsi="Garamond"/>
-        </w:rPr>
-        <w:fldChar w:fldCharType="begin"/>
-      </w:r>
-      <w:r>
-        <w:rPr>
-          <w:rFonts w:ascii="Garamond" w:hAnsi="Garamond"/>
-        </w:rPr>
-        <w:instrText xml:space="preserve"> ADDIN ZOTERO_ITEM CSL_CITATION {"citationID":"UdeDBfeN","properties":{"formattedCitation":"(Donohoe &amp; Zimmerman, 2010; Zimmerman &amp; Reeves, 2002)","plainCitation":"(Donohoe &amp; Zimmerman, 2010; Zimmerman &amp; Reeves, 2002)","noteIndex":0},"citationItems":[{"id":4778,"uris":["http://zotero.org/users/8421274/items/QJZIBTQC"],"itemData":{"id":4778,"type":"article-journal","abstract":"Beam-based analytical methods are widely used to measure the concentrations of elements and isotopes in otoliths. These methods usually require that otoliths be individually mounted and prepared to properly expose the desired growth region to the analytical beam. Most analytical instruments, such as LA-ICPMS and ion and electron microprobes, have sample holders that will accept only one to six slides or mounts at a time. We describe a method of mounting otoliths that allows for easy transfer of many otoliths to a single mount after they have been prepared. Such an approach increases the number of otoliths that can be analyzed in a single session by reducing the need open the sample chamber to exchange slides—a particularly time consuming step on instruments that operate under vacuum. For ion and electron microprobes, the method also greatly reduces the number of slides that must be coated with an electrical conductor prior to analysis. In this method, a narrow strip of cover glass is first glued at one end to a standard microscope slide. The otolith is then mounted in thermoplastic resin on the opposite, free end of the strip. The otolith can then be ground and flipped, if needed, by reheating the mounting medium. After otolith preparation is complete, the cover glass is cut with a scribe to free the otolith and up to 20 small otoliths can be arranged on a single petrographic slide.","container-title":"Environmental Biology of Fishes","DOI":"10.1007/s10641-010-9680-3","ISSN":"1573-5133","issue":"3","journalAbbreviation":"Environ Biol Fish","language":"en","page":"473-477","source":"Springer Link","title":"A method of mounting multiple otoliths for beam-based microchemical analyses","volume":"89","author":[{"family":"Donohoe","given":"Christopher J."},{"family":"Zimmerman","given":"Christian E."}],"issued":{"date-parts":[["2010",11,1]]}}},{"id":4132,"uris":["http://zotero.org/users/8421274/items/5YINANGC"],"itemData":{"id":4132,"type":"article-journal","abstract":"Comparisons of strontium:calcium (Sr: Ca) ratios in otolith primordia and freshwater growth regions were used to identify the progeny of steelhead Oncorhynchus mykiss (anadromous rainbow trout) and resident rainbow trout in the Deschutes River, Oregon. We cultured progeny of known adult steelhead and resident rainbow trout to confirm the relationship between Sr:Ca ratios in otolith primordia and the life history of the maternal parent. The mean (±SD) Sr:Ca ratio was significantly higher in the otolith primordia of the progeny of steelhead (0.001461 ± 0.00029; n = 100) than in those of the progeny of resident rainbow trout (0.000829 ± 0.000012; n = 100). We used comparisons of Sr:Ca ratios in the primordia and first-summer growth regions of otoliths to determine the maternal origin of unknown O. mykiss juveniles (n = 272) collected from rearing habitats within the main-stem Deschutes River and tributary rearing habitats and thus to ascertain the relative proportion of each life history morph in each rearing habitat. Resident rainbow trout fry dominated the bimonthly samples collected from main-stem rearing habitats between May and November 1995. Steelhead fry dominated samples collected from below waterfalls on two tributaries in 1996 and 1998.","container-title":"Transactions of the American Fisheries Society","DOI":"10.1577/1548-8659(2002)131&lt;0986:IOSARR&gt;2.0.CO;2","ISSN":"0002-8487","issue":"5","note":"_eprint: https://doi.org/10.1577/1548-8659(2002)131&lt;0986:IOSARR&gt;2.0.CO;2","page":"986-993","publisher":"Taylor &amp; Francis","source":"Taylor and Francis+NEJM","title":"Identification of Steelhead and Resident Rainbow Trout Progeny in the Deschutes River, Oregon, Revealed with Otolith Microchemistry","volume":"131","author":[{"family":"Zimmerman","given":"Christian E."},{"family":"Reeves","given":"Gordon H."}],"issued":{"date-parts":[["2002",9,1]]}}}],"schema":"https://github.com/citation-style-language/schema/raw/master/csl-citation.json"} </w:instrText>
-      </w:r>
-      <w:r>
-        <w:rPr>
-          <w:rFonts w:ascii="Garamond" w:hAnsi="Garamond"/>
-        </w:rPr>
-        <w:fldChar w:fldCharType="separate"/>
-      </w:r>
-      <w:r>
-        <w:rPr>
-          <w:rFonts w:ascii="Garamond" w:hAnsi="Garamond"/>
-          <w:noProof/>
-        </w:rPr>
-        <w:t>(Donohoe &amp; Zimmerman, 2010; Zimmerman &amp; Reeves, 2002)</w:t>
-      </w:r>
-      <w:r>
-        <w:rPr>
-          <w:rFonts w:ascii="Garamond" w:hAnsi="Garamond"/>
-        </w:rPr>
-        <w:fldChar w:fldCharType="end"/>
-      </w:r>
-      <w:r>
-        <w:rPr>
-          <w:rFonts w:ascii="Garamond" w:hAnsi="Garamond"/>
-        </w:rPr>
-        <w:t xml:space="preserve">. Samples were then analyzed for Sr8786 and Sr88 using Laser Ablation Inductively Coupled Plasma Mass Spectrometry (LA-ICP-MS) at the University of Utah Strontium Metals Lab. Laser ablation was performed from the otolith core to just after the onset of the marine signature along the dorsal lobe scanning at 2 microns/second. </w:t>
-      </w:r>
-      <w:r>
-        <w:rPr>
-          <w:rFonts w:ascii="Garamond" w:hAnsi="Garamond"/>
-        </w:rPr>
-        <w:t xml:space="preserve">The Sr87/Sr86 value from the natal rearing location was identified manually by examining the first stable value following the rapid decrease from that of the core, which was identified both by examining the position of the ablation transect relative to the visible core region on the otolith as well as a general </w:t>
-      </w:r>
-      <w:r>
-        <w:rPr>
-          <w:rFonts w:ascii="Garamond" w:hAnsi="Garamond"/>
-        </w:rPr>
-        <w:t>convergence</w:t>
-      </w:r>
-      <w:r>
-        <w:rPr>
-          <w:rFonts w:ascii="Garamond" w:hAnsi="Garamond"/>
-        </w:rPr>
-        <w:t xml:space="preserve"> towards the global marine Sr8786 value (0.70819</w:t>
-      </w:r>
-      <w:r>
-        <w:rPr>
-          <w:rFonts w:ascii="Garamond" w:hAnsi="Garamond"/>
-        </w:rPr>
-        <w:t xml:space="preserve">). Fin clip samples were taken from as many Yukon individuals as possible and genetic stock identification (GSI) assignments were estimated based on methods in Makhlouf et al., 2025 using X genetic baselines ( cites from there here). </w:t>
-      </w:r>
+      </w:pPr>
     </w:p>
     <w:p>
       <w:pPr>
@@ -1446,23 +1337,21 @@
           <w:u w:val="single"/>
         </w:rPr>
       </w:pPr>
-    </w:p>
-    <w:p>
-      <w:pPr>
-        <w:pStyle w:val="font-claude-response-body"/>
-        <w:spacing w:line="360" w:lineRule="auto"/>
+      <w:r>
         <w:rPr>
           <w:rFonts w:ascii="Garamond" w:hAnsi="Garamond"/>
           <w:b/>
           <w:bCs/>
           <w:u w:val="single"/>
         </w:rPr>
-      </w:pPr>
-    </w:p>
-    <w:p>
-      <w:pPr>
-        <w:pStyle w:val="font-claude-response-body"/>
-        <w:spacing w:line="360" w:lineRule="auto"/>
+        <w:t>Provenance estimates</w:t>
+      </w:r>
+    </w:p>
+    <w:p>
+      <w:pPr>
+        <w:pStyle w:val="font-claude-response-body"/>
+        <w:spacing w:line="360" w:lineRule="auto"/>
+        <w:ind w:firstLine="720"/>
         <w:rPr>
           <w:rFonts w:ascii="Garamond" w:hAnsi="Garamond"/>
           <w:b/>
@@ -1473,64 +1362,48 @@
       <w:r>
         <w:rPr>
           <w:rFonts w:ascii="Garamond" w:hAnsi="Garamond"/>
-          <w:b/>
-          <w:bCs/>
-          <w:u w:val="single"/>
+        </w:rPr>
+        <w:t>Maps of the spatial distribution of ^87Sr/^86Sr (i.e., “isoscapes”) have been developed for both the Kuskokwim and Yukon river basins using spatial stream network modeling (SSNM). This approach accounts for both Euclidean and flow-connected spatial autocorrelation, as well as the influence of multiple reach-scale covariates on strontium isotope ratios (French et al., X; Makhlouf et al., 2025). Both isoscapes include reach-specific estimates of model uncertainty. Because the Yukon isoscape encompasses a substantially larger spatial extent and has lower sampling density per river kilometer, associated prediction error is considerably higher than in the Kuskokwim (add error range). In both systems, however, reaches with exceptionally low prediction error—typically those closest to sampling locations—are relatively rare and tend to receive a disproportionate number of assignments.</w:t>
+      </w:r>
+      <w:r>
+        <w:rPr>
+          <w:rFonts w:ascii="Garamond" w:hAnsi="Garamond"/>
+        </w:rPr>
+        <w:t xml:space="preserve"> To avoid this, minimum error values for each isoscape were adjusted to .003 and .00003 for the Yukon and Kuskokwim isoscape, respectively. All reaches with error values below this were assigned this value. </w:t>
+      </w:r>
+    </w:p>
+    <w:p>
+      <w:pPr>
+        <w:pStyle w:val="font-claude-response-body"/>
+        <w:spacing w:line="360" w:lineRule="auto"/>
+        <w:rPr>
+          <w:rFonts w:ascii="Garamond" w:hAnsi="Garamond"/>
+        </w:rPr>
+      </w:pPr>
+      <w:r>
+        <w:rPr>
+          <w:rFonts w:ascii="Garamond" w:hAnsi="Garamond"/>
+        </w:rPr>
+        <w:tab/>
+      </w:r>
+      <w:r>
+        <w:rPr>
+          <w:rFonts w:ascii="Garamond" w:hAnsi="Garamond"/>
+        </w:rPr>
+        <w:t xml:space="preserve">From the extracted natal-origin values, the likelihood of provenance was estimated for all reaches within each basin using a probabilistic Bayesian framework (Makhlouf et al., 2025). For Yukon samples, a genetic prior was incorporated based on posterior probabilities from genetic stock identification assignments (Makhlouf et al., 2025). In addition, three spatial priors were applied to reduce assignment to reaches with low likelihood of occupancy by spawning adult Chinook salmon. </w:t>
+      </w:r>
+      <w:r>
+        <w:rPr>
+          <w:rFonts w:ascii="Garamond" w:hAnsi="Garamond"/>
+        </w:rPr>
+        <w:t xml:space="preserve">Specifically, assignments were constrained to streams of order X or greater, and a habitat prior assigned zero probability to reaches with average channel gradients &gt; X. Together, these constraints reflect the preference of Chinook salmon for spawning in larger tributaries and the observed unsuitability of both extremely low-gradient and steep reaches. Finally, a “presence prior” was derived from USGS intrinsic potential mapping, which identifies reaches where spawning Chinook salmon have been observed based on multiple data sources [ref]. This prior was applied to mainstem </w:t>
+      </w:r>
+      <w:r>
+        <w:rPr>
+          <w:rFonts w:ascii="Garamond" w:hAnsi="Garamond"/>
         </w:rPr>
         <w:lastRenderedPageBreak/>
-        <w:t>Provenance estimates</w:t>
-      </w:r>
-    </w:p>
-    <w:p>
-      <w:pPr>
-        <w:pStyle w:val="font-claude-response-body"/>
-        <w:spacing w:line="360" w:lineRule="auto"/>
-        <w:ind w:firstLine="720"/>
-        <w:rPr>
-          <w:rFonts w:ascii="Garamond" w:hAnsi="Garamond"/>
-          <w:b/>
-          <w:bCs/>
-          <w:u w:val="single"/>
-        </w:rPr>
-      </w:pPr>
-      <w:r>
-        <w:rPr>
-          <w:rFonts w:ascii="Garamond" w:hAnsi="Garamond"/>
-        </w:rPr>
-        <w:t>Maps of the spatial distribution of ^87Sr/^86Sr (i.e., “isoscapes”) have been developed for both the Kuskokwim and Yukon river basins using spatial stream network modeling (SSNM). This approach accounts for both Euclidean and flow-connected spatial autocorrelation, as well as the influence of multiple reach-scale covariates on strontium isotope ratios (French et al., X; Makhlouf et al., 2025). Both isoscapes include reach-specific estimates of model uncertainty. Because the Yukon isoscape encompasses a substantially larger spatial extent and has lower sampling density per river kilometer, associated prediction error is considerably higher than in the Kuskokwim (add error range). In both systems, however, reaches with exceptionally low prediction error—typically those closest to sampling locations—are relatively rare and tend to receive a disproportionate number of assignments.</w:t>
-      </w:r>
-      <w:r>
-        <w:rPr>
-          <w:rFonts w:ascii="Garamond" w:hAnsi="Garamond"/>
-        </w:rPr>
-        <w:t xml:space="preserve"> To avoid this, minimum error values for each isoscape were adjusted to .003 and .00003 for the Yukon and Kuskokwim isoscape, respectively. All reaches with error values below this were assigned this value. </w:t>
-      </w:r>
-    </w:p>
-    <w:p>
-      <w:pPr>
-        <w:pStyle w:val="font-claude-response-body"/>
-        <w:spacing w:line="360" w:lineRule="auto"/>
-        <w:rPr>
-          <w:rFonts w:ascii="Garamond" w:hAnsi="Garamond"/>
-        </w:rPr>
-      </w:pPr>
-      <w:r>
-        <w:rPr>
-          <w:rFonts w:ascii="Garamond" w:hAnsi="Garamond"/>
-        </w:rPr>
-        <w:tab/>
-      </w:r>
-      <w:r>
-        <w:rPr>
-          <w:rFonts w:ascii="Garamond" w:hAnsi="Garamond"/>
-        </w:rPr>
-        <w:t xml:space="preserve">From the extracted natal-origin values, the likelihood of provenance was estimated for all reaches within each basin using a probabilistic Bayesian framework (Makhlouf et al., 2025). For Yukon samples, a genetic prior was incorporated based on posterior probabilities from genetic stock identification assignments (Makhlouf et al., 2025). In addition, three spatial priors were applied to reduce assignment to reaches with low likelihood of occupancy by spawning adult Chinook salmon. </w:t>
-      </w:r>
-      <w:r>
-        <w:rPr>
-          <w:rFonts w:ascii="Garamond" w:hAnsi="Garamond"/>
-        </w:rPr>
-        <w:t>Specifically, assignments were constrained to streams of order X or greater, and a habitat prior assigned zero probability to reaches with average channel gradients &gt; X. Together, these constraints reflect the preference of Chinook salmon for spawning in larger tributaries and the observed unsuitability of both extremely low-gradient and steep reaches. Finally, a “presence prior” was derived from USGS intrinsic potential mapping, which identifies reaches where spawning Chinook salmon have been observed based on multiple data sources [ref]. This prior was applied to mainstem tributaries in both river basins, assigning zero probability to reaches with no documented evidence of spawning Chinook salmon. We restricted application of this prior to mainstem reaches to avoid unduly limiting assignments in more remote tributaries where the absence of observations likely reflects limited sampling effort rather than true absence, while still incorporating available presence information into the assignment framework.</w:t>
+        <w:t>tributaries in both river basins, assigning zero probability to reaches with no documented evidence of spawning Chinook salmon. We restricted application of this prior to mainstem reaches to avoid unduly limiting assignments in more remote tributaries where the absence of observations likely reflects limited sampling effort rather than true absence, while still incorporating available presence information into the assignment framework.</w:t>
       </w:r>
       <w:r>
         <w:rPr>
@@ -1542,14 +1415,7 @@
         <w:rPr>
           <w:rFonts w:ascii="Garamond" w:hAnsi="Garamond"/>
         </w:rPr>
-        <w:t xml:space="preserve">For each individual, the result is a posterior probability of provenance for all tributaries in the basin. These data were then normalized to sum to 1 across </w:t>
-      </w:r>
-      <w:r>
-        <w:rPr>
-          <w:rFonts w:ascii="Garamond" w:hAnsi="Garamond"/>
-        </w:rPr>
-        <w:lastRenderedPageBreak/>
-        <w:t xml:space="preserve">the basin and rescaled to range from 0-1, thereby indicating relative probability of provenance across the basin. </w:t>
+        <w:t xml:space="preserve">For each individual, the result is a posterior probability of provenance for all tributaries in the basin. These data were then normalized to sum to 1 across the basin and rescaled to range from 0-1, thereby indicating relative probability of provenance across the basin. </w:t>
       </w:r>
     </w:p>
     <w:p>
@@ -1950,8 +1816,89 @@
 </file>
 
 <file path=word/comments.xml><?xml version="1.0" encoding="utf-8"?>
-<w:comments xmlns:wpc="http://schemas.microsoft.com/office/word/2010/wordprocessingCanvas" xmlns:cx="http://schemas.microsoft.com/office/drawing/2014/chartex" xmlns:cx1="http://schemas.microsoft.com/office/drawing/2015/9/8/chartex" xmlns:cx2="http://schemas.microsoft.com/office/drawing/2015/10/21/chartex" xmlns:cx3="http://schemas.microsoft.com/office/drawing/2016/5/9/chartex" xmlns:cx4="http://schemas.microsoft.com/office/drawing/2016/5/10/chartex" xmlns:cx5="http://schemas.microsoft.com/office/drawing/2016/5/11/chartex" xmlns:cx6="http://schemas.microsoft.com/office/drawing/2016/5/12/chartex" xmlns:cx7="http://schemas.microsoft.com/office/drawing/2016/5/13/chartex" xmlns:cx8="http://schemas.microsoft.com/office/drawing/2016/5/14/chartex" xmlns:mc="http://schemas.openxmlformats.org/markup-compatibility/2006" xmlns:aink="http://schemas.microsoft.com/office/drawing/2016/ink" xmlns:am3d="http://schemas.microsoft.com/office/drawing/2017/model3d" xmlns:o="urn:schemas-microsoft-com:office:office" xmlns:oel="http://schemas.microsoft.com/office/2019/extlst" xmlns:r="http://schemas.openxmlformats.org/officeDocument/2006/relationships" xmlns:m="http://schemas.openxmlformats.org/officeDocument/2006/math" xmlns:v="urn:schemas-microsoft-com:vml" xmlns:wp14="http://schemas.microsoft.com/office/word/2010/wordprocessingDrawing" xmlns:wp="http://schemas.openxmlformats.org/drawingml/2006/wordprocessingDrawing" xmlns:w10="urn:schemas-microsoft-com:office:word" xmlns:w="http://schemas.openxmlformats.org/wordprocessingml/2006/main" xmlns:w14="http://schemas.microsoft.com/office/word/2010/wordml" xmlns:w15="http://schemas.microsoft.com/office/word/2012/wordml" xmlns:w16cex="http://schemas.microsoft.com/office/word/2018/wordml/cex" xmlns:w16cid="http://schemas.microsoft.com/office/word/2016/wordml/cid" xmlns:w16="http://schemas.microsoft.com/office/word/2018/wordml" xmlns:w16du="http://schemas.microsoft.com/office/word/2023/wordml/word16du" xmlns:w16sdtdh="http://schemas.microsoft.com/office/word/2020/wordml/sdtdatahash" xmlns:w16sdtfl="http://schemas.microsoft.com/office/word/2024/wordml/sdtformatlock" xmlns:w16se="http://schemas.microsoft.com/office/word/2015/wordml/symex" xmlns:wpg="http://schemas.microsoft.com/office/word/2010/wordprocessingGroup" xmlns:wpi="http://schemas.microsoft.com/office/word/2010/wordprocessingInk" xmlns:wne="http://schemas.microsoft.com/office/word/2006/wordml" xmlns:wps="http://schemas.microsoft.com/office/word/2010/wordprocessingShape" mc:Ignorable="w14 w15 w16se w16cid w16 w16cex w16sdtdh w16sdtfl w16du wp14">
-  <w:comment w:id="0" w:author="bmak29" w:date="2025-12-24T12:30:00Z" w:initials="b">
+<w:comments xmlns:wpc="http://schemas.microsoft.com/office/word/2010/wordprocessingCanvas" xmlns:cx="http://schemas.microsoft.com/office/drawing/2014/chartex" xmlns:cx1="http://schemas.microsoft.com/office/drawing/2015/9/8/chartex" xmlns:cx2="http://schemas.microsoft.com/office/drawing/2015/10/21/chartex" xmlns:cx3="http://schemas.microsoft.com/office/drawing/2016/5/9/chartex" xmlns:cx4="http://schemas.microsoft.com/office/drawing/2016/5/10/chartex" xmlns:cx5="http://schemas.microsoft.com/office/drawing/2016/5/11/chartex" xmlns:cx6="http://schemas.microsoft.com/office/drawing/2016/5/12/chartex" xmlns:cx7="http://schemas.microsoft.com/office/drawing/2016/5/13/chartex" xmlns:cx8="http://schemas.microsoft.com/office/drawing/2016/5/14/chartex" xmlns:mc="http://schemas.openxmlformats.org/markup-compatibility/2006" xmlns:aink="http://schemas.microsoft.com/office/drawing/2016/ink" xmlns:am3d="http://schemas.microsoft.com/office/drawing/2017/model3d" xmlns:o="urn:schemas-microsoft-com:office:office" xmlns:oel="http://schemas.microsoft.com/office/2019/extlst" xmlns:r="http://schemas.openxmlformats.org/officeDocument/2006/relationships" xmlns:m="http://schemas.openxmlformats.org/officeDocument/2006/math" xmlns:v="urn:schemas-microsoft-com:vml" xmlns:wp14="http://schemas.microsoft.com/office/word/2010/wordprocessingDrawing" xmlns:wp="http://schemas.openxmlformats.org/drawingml/2006/wordprocessingDrawing" xmlns:w10="urn:schemas-microsoft-com:office:word" xmlns:w="http://schemas.openxmlformats.org/wordprocessingml/2006/main" xmlns:w14="http://schemas.microsoft.com/office/word/2010/wordml" xmlns:w15="http://schemas.microsoft.com/office/word/2012/wordml" xmlns:w16cei="http://schemas.microsoft.com/office/word/2026/wordml/cei" xmlns:w16cex="http://schemas.microsoft.com/office/word/2018/wordml/cex" xmlns:w16cid="http://schemas.microsoft.com/office/word/2016/wordml/cid" xmlns:w16="http://schemas.microsoft.com/office/word/2018/wordml" xmlns:w16du="http://schemas.microsoft.com/office/word/2023/wordml/word16du" xmlns:w16sdtdh="http://schemas.microsoft.com/office/word/2020/wordml/sdtdatahash" xmlns:w16sdtfl="http://schemas.microsoft.com/office/word/2024/wordml/sdtformatlock" xmlns:w16se="http://schemas.microsoft.com/office/word/2015/wordml/symex" xmlns:wpg="http://schemas.microsoft.com/office/word/2010/wordprocessingGroup" xmlns:wpi="http://schemas.microsoft.com/office/word/2010/wordprocessingInk" xmlns:wne="http://schemas.microsoft.com/office/word/2006/wordml" xmlns:wps="http://schemas.microsoft.com/office/word/2010/wordprocessingShape" mc:Ignorable="w14 w15 w16se w16cid w16 w16cex w16sdtdh w16sdtfl w16du wp14">
+  <w:comment w:id="0" w:author="Benjamin J. Makhlouf" w:date="2026-04-23T11:48:00Z" w:initials="b">
+    <w:p>
+      <w:r>
+        <w:rPr>
+          <w:rStyle w:val="CommentReference"/>
+        </w:rPr>
+        <w:annotationRef/>
+      </w:r>
+      <w:r>
+        <w:rPr>
+          <w:sz w:val="20"/>
+          <w:szCs w:val="20"/>
+        </w:rPr>
+        <w:t>No solid thoughts on this, suggestions welcome</w:t>
+      </w:r>
+    </w:p>
+  </w:comment>
+  <w:comment w:id="1" w:author="Daniel Schindler" w:date="2026-04-26T10:49:00Z" w:initials="DS">
+    <w:p>
+      <w:pPr>
+        <w:pStyle w:val="CommentText"/>
+      </w:pPr>
+      <w:r>
+        <w:rPr>
+          <w:rStyle w:val="CommentReference"/>
+        </w:rPr>
+        <w:annotationRef/>
+      </w:r>
+      <w:r>
+        <w:t>Lets see what the final results look like</w:t>
+      </w:r>
+    </w:p>
+  </w:comment>
+  <w:comment w:id="2" w:author="Daniel Schindler" w:date="2026-04-25T09:25:00Z" w:initials="DS">
+    <w:p>
+      <w:pPr>
+        <w:pStyle w:val="CommentText"/>
+      </w:pPr>
+      <w:r>
+        <w:rPr>
+          <w:rStyle w:val="CommentReference"/>
+        </w:rPr>
+        <w:annotationRef/>
+      </w:r>
+      <w:r>
+        <w:t>Very nice intro paragraph!</w:t>
+      </w:r>
+    </w:p>
+  </w:comment>
+  <w:comment w:id="3" w:author="Benjamin J. Makhlouf" w:date="2026-07-26T16:28:00Z" w:initials="BM">
+    <w:p>
+      <w:pPr>
+        <w:pStyle w:val="CommentText"/>
+      </w:pPr>
+      <w:r>
+        <w:rPr>
+          <w:rStyle w:val="CommentReference"/>
+        </w:rPr>
+        <w:annotationRef/>
+      </w:r>
+      <w:r>
+        <w:t xml:space="preserve">Should I define biocomplexity here, or is this better noted as landscape complexity which then drives biological complexity </w:t>
+      </w:r>
+    </w:p>
+  </w:comment>
+  <w:comment w:id="4" w:author="Benjamin J. Makhlouf" w:date="2026-07-27T06:34:00Z" w:initials="BM">
+    <w:p>
+      <w:pPr>
+        <w:pStyle w:val="CommentText"/>
+      </w:pPr>
+      <w:r>
+        <w:rPr>
+          <w:rStyle w:val="CommentReference"/>
+        </w:rPr>
+        <w:annotationRef/>
+      </w:r>
+      <w:r>
+        <w:t>Sanford et al</w:t>
+      </w:r>
+    </w:p>
+  </w:comment>
+  <w:comment w:id="5" w:author="bmak29" w:date="2025-12-24T12:30:00Z" w:initials="b">
     <w:p>
       <w:r>
         <w:rPr>
@@ -1972,25 +1919,40 @@
 </file>
 
 <file path=word/commentsExtended.xml><?xml version="1.0" encoding="utf-8"?>
-<w15:commentsEx xmlns:wpc="http://schemas.microsoft.com/office/word/2010/wordprocessingCanvas" xmlns:cx="http://schemas.microsoft.com/office/drawing/2014/chartex" xmlns:cx1="http://schemas.microsoft.com/office/drawing/2015/9/8/chartex" xmlns:cx2="http://schemas.microsoft.com/office/drawing/2015/10/21/chartex" xmlns:cx3="http://schemas.microsoft.com/office/drawing/2016/5/9/chartex" xmlns:cx4="http://schemas.microsoft.com/office/drawing/2016/5/10/chartex" xmlns:cx5="http://schemas.microsoft.com/office/drawing/2016/5/11/chartex" xmlns:cx6="http://schemas.microsoft.com/office/drawing/2016/5/12/chartex" xmlns:cx7="http://schemas.microsoft.com/office/drawing/2016/5/13/chartex" xmlns:cx8="http://schemas.microsoft.com/office/drawing/2016/5/14/chartex" xmlns:mc="http://schemas.openxmlformats.org/markup-compatibility/2006" xmlns:aink="http://schemas.microsoft.com/office/drawing/2016/ink" xmlns:am3d="http://schemas.microsoft.com/office/drawing/2017/model3d" xmlns:o="urn:schemas-microsoft-com:office:office" xmlns:oel="http://schemas.microsoft.com/office/2019/extlst" xmlns:r="http://schemas.openxmlformats.org/officeDocument/2006/relationships" xmlns:m="http://schemas.openxmlformats.org/officeDocument/2006/math" xmlns:v="urn:schemas-microsoft-com:vml" xmlns:wp14="http://schemas.microsoft.com/office/word/2010/wordprocessingDrawing" xmlns:wp="http://schemas.openxmlformats.org/drawingml/2006/wordprocessingDrawing" xmlns:w10="urn:schemas-microsoft-com:office:word" xmlns:w="http://schemas.openxmlformats.org/wordprocessingml/2006/main" xmlns:w14="http://schemas.microsoft.com/office/word/2010/wordml" xmlns:w15="http://schemas.microsoft.com/office/word/2012/wordml" xmlns:w16cex="http://schemas.microsoft.com/office/word/2018/wordml/cex" xmlns:w16cid="http://schemas.microsoft.com/office/word/2016/wordml/cid" xmlns:w16="http://schemas.microsoft.com/office/word/2018/wordml" xmlns:w16du="http://schemas.microsoft.com/office/word/2023/wordml/word16du" xmlns:w16sdtdh="http://schemas.microsoft.com/office/word/2020/wordml/sdtdatahash" xmlns:w16sdtfl="http://schemas.microsoft.com/office/word/2024/wordml/sdtformatlock" xmlns:w16se="http://schemas.microsoft.com/office/word/2015/wordml/symex" xmlns:wpg="http://schemas.microsoft.com/office/word/2010/wordprocessingGroup" xmlns:wpi="http://schemas.microsoft.com/office/word/2010/wordprocessingInk" xmlns:wne="http://schemas.microsoft.com/office/word/2006/wordml" xmlns:wps="http://schemas.microsoft.com/office/word/2010/wordprocessingShape" mc:Ignorable="w14 w15 w16se w16cid w16 w16cex w16sdtdh w16sdtfl w16du wp14">
+<w15:commentsEx xmlns:wpc="http://schemas.microsoft.com/office/word/2010/wordprocessingCanvas" xmlns:cx="http://schemas.microsoft.com/office/drawing/2014/chartex" xmlns:cx1="http://schemas.microsoft.com/office/drawing/2015/9/8/chartex" xmlns:cx2="http://schemas.microsoft.com/office/drawing/2015/10/21/chartex" xmlns:cx3="http://schemas.microsoft.com/office/drawing/2016/5/9/chartex" xmlns:cx4="http://schemas.microsoft.com/office/drawing/2016/5/10/chartex" xmlns:cx5="http://schemas.microsoft.com/office/drawing/2016/5/11/chartex" xmlns:cx6="http://schemas.microsoft.com/office/drawing/2016/5/12/chartex" xmlns:cx7="http://schemas.microsoft.com/office/drawing/2016/5/13/chartex" xmlns:cx8="http://schemas.microsoft.com/office/drawing/2016/5/14/chartex" xmlns:mc="http://schemas.openxmlformats.org/markup-compatibility/2006" xmlns:aink="http://schemas.microsoft.com/office/drawing/2016/ink" xmlns:am3d="http://schemas.microsoft.com/office/drawing/2017/model3d" xmlns:o="urn:schemas-microsoft-com:office:office" xmlns:oel="http://schemas.microsoft.com/office/2019/extlst" xmlns:r="http://schemas.openxmlformats.org/officeDocument/2006/relationships" xmlns:m="http://schemas.openxmlformats.org/officeDocument/2006/math" xmlns:v="urn:schemas-microsoft-com:vml" xmlns:wp14="http://schemas.microsoft.com/office/word/2010/wordprocessingDrawing" xmlns:wp="http://schemas.openxmlformats.org/drawingml/2006/wordprocessingDrawing" xmlns:w10="urn:schemas-microsoft-com:office:word" xmlns:w="http://schemas.openxmlformats.org/wordprocessingml/2006/main" xmlns:w14="http://schemas.microsoft.com/office/word/2010/wordml" xmlns:w15="http://schemas.microsoft.com/office/word/2012/wordml" xmlns:w16cei="http://schemas.microsoft.com/office/word/2026/wordml/cei" xmlns:w16cex="http://schemas.microsoft.com/office/word/2018/wordml/cex" xmlns:w16cid="http://schemas.microsoft.com/office/word/2016/wordml/cid" xmlns:w16="http://schemas.microsoft.com/office/word/2018/wordml" xmlns:w16du="http://schemas.microsoft.com/office/word/2023/wordml/word16du" xmlns:w16sdtdh="http://schemas.microsoft.com/office/word/2020/wordml/sdtdatahash" xmlns:w16sdtfl="http://schemas.microsoft.com/office/word/2024/wordml/sdtformatlock" xmlns:w16se="http://schemas.microsoft.com/office/word/2015/wordml/symex" xmlns:wpg="http://schemas.microsoft.com/office/word/2010/wordprocessingGroup" xmlns:wpi="http://schemas.microsoft.com/office/word/2010/wordprocessingInk" xmlns:wne="http://schemas.microsoft.com/office/word/2006/wordml" xmlns:wps="http://schemas.microsoft.com/office/word/2010/wordprocessingShape" mc:Ignorable="w14 w15 w16se w16cid w16 w16cex w16sdtdh w16sdtfl w16du wp14">
+  <w15:commentEx w15:paraId="7DEEFB2E" w15:done="1"/>
+  <w15:commentEx w15:paraId="542714BD" w15:paraIdParent="7DEEFB2E" w15:done="1"/>
+  <w15:commentEx w15:paraId="09A47300" w15:done="1"/>
+  <w15:commentEx w15:paraId="07D7E237" w15:done="0"/>
+  <w15:commentEx w15:paraId="71A5CE04" w15:done="0"/>
   <w15:commentEx w15:paraId="137C340C" w15:done="0"/>
 </w15:commentsEx>
 </file>
 
 <file path=word/commentsExtensible.xml><?xml version="1.0" encoding="utf-8"?>
-<w16cex:commentsExtensible xmlns:wpc="http://schemas.microsoft.com/office/word/2010/wordprocessingCanvas" xmlns:cx="http://schemas.microsoft.com/office/drawing/2014/chartex" xmlns:cx1="http://schemas.microsoft.com/office/drawing/2015/9/8/chartex" xmlns:cx2="http://schemas.microsoft.com/office/drawing/2015/10/21/chartex" xmlns:cx3="http://schemas.microsoft.com/office/drawing/2016/5/9/chartex" xmlns:cx4="http://schemas.microsoft.com/office/drawing/2016/5/10/chartex" xmlns:cx5="http://schemas.microsoft.com/office/drawing/2016/5/11/chartex" xmlns:cx6="http://schemas.microsoft.com/office/drawing/2016/5/12/chartex" xmlns:cx7="http://schemas.microsoft.com/office/drawing/2016/5/13/chartex" xmlns:cx8="http://schemas.microsoft.com/office/drawing/2016/5/14/chartex" xmlns:cr="http://schemas.microsoft.com/office/comments/2020/reactions" xmlns:mc="http://schemas.openxmlformats.org/markup-compatibility/2006" xmlns:aink="http://schemas.microsoft.com/office/drawing/2016/ink" xmlns:am3d="http://schemas.microsoft.com/office/drawing/2017/model3d" xmlns:o="urn:schemas-microsoft-com:office:office" xmlns:oel="http://schemas.microsoft.com/office/2019/extlst" xmlns:r="http://schemas.openxmlformats.org/officeDocument/2006/relationships" xmlns:m="http://schemas.openxmlformats.org/officeDocument/2006/math" xmlns:v="urn:schemas-microsoft-com:vml" xmlns:wp14="http://schemas.microsoft.com/office/word/2010/wordprocessingDrawing" xmlns:wp="http://schemas.openxmlformats.org/drawingml/2006/wordprocessingDrawing" xmlns:w10="urn:schemas-microsoft-com:office:word" xmlns:w="http://schemas.openxmlformats.org/wordprocessingml/2006/main" xmlns:w14="http://schemas.microsoft.com/office/word/2010/wordml" xmlns:w15="http://schemas.microsoft.com/office/word/2012/wordml" xmlns:w16cex="http://schemas.microsoft.com/office/word/2018/wordml/cex" xmlns:w16cid="http://schemas.microsoft.com/office/word/2016/wordml/cid" xmlns:w16="http://schemas.microsoft.com/office/word/2018/wordml" xmlns:w16du="http://schemas.microsoft.com/office/word/2023/wordml/word16du" xmlns:w16sdtdh="http://schemas.microsoft.com/office/word/2020/wordml/sdtdatahash" xmlns:w16sdtfl="http://schemas.microsoft.com/office/word/2024/wordml/sdtformatlock" xmlns:w16se="http://schemas.microsoft.com/office/word/2015/wordml/symex" xmlns:wpg="http://schemas.microsoft.com/office/word/2010/wordprocessingGroup" xmlns:wpi="http://schemas.microsoft.com/office/word/2010/wordprocessingInk" xmlns:wne="http://schemas.microsoft.com/office/word/2006/wordml" xmlns:wps="http://schemas.microsoft.com/office/word/2010/wordprocessingShape" mc:Ignorable="w14 w15 w16se w16cid w16 w16cex w16sdtdh w16sdtfl cr w16du wp14">
+<w16cex:commentsExtensible xmlns:wpc="http://schemas.microsoft.com/office/word/2010/wordprocessingCanvas" xmlns:cx="http://schemas.microsoft.com/office/drawing/2014/chartex" xmlns:cx1="http://schemas.microsoft.com/office/drawing/2015/9/8/chartex" xmlns:cx2="http://schemas.microsoft.com/office/drawing/2015/10/21/chartex" xmlns:cx3="http://schemas.microsoft.com/office/drawing/2016/5/9/chartex" xmlns:cx4="http://schemas.microsoft.com/office/drawing/2016/5/10/chartex" xmlns:cx5="http://schemas.microsoft.com/office/drawing/2016/5/11/chartex" xmlns:cx6="http://schemas.microsoft.com/office/drawing/2016/5/12/chartex" xmlns:cx7="http://schemas.microsoft.com/office/drawing/2016/5/13/chartex" xmlns:cx8="http://schemas.microsoft.com/office/drawing/2016/5/14/chartex" xmlns:cr="http://schemas.microsoft.com/office/comments/2020/reactions" xmlns:mc="http://schemas.openxmlformats.org/markup-compatibility/2006" xmlns:aink="http://schemas.microsoft.com/office/drawing/2016/ink" xmlns:am3d="http://schemas.microsoft.com/office/drawing/2017/model3d" xmlns:o="urn:schemas-microsoft-com:office:office" xmlns:oel="http://schemas.microsoft.com/office/2019/extlst" xmlns:r="http://schemas.openxmlformats.org/officeDocument/2006/relationships" xmlns:m="http://schemas.openxmlformats.org/officeDocument/2006/math" xmlns:v="urn:schemas-microsoft-com:vml" xmlns:wp14="http://schemas.microsoft.com/office/word/2010/wordprocessingDrawing" xmlns:wp="http://schemas.openxmlformats.org/drawingml/2006/wordprocessingDrawing" xmlns:w10="urn:schemas-microsoft-com:office:word" xmlns:w="http://schemas.openxmlformats.org/wordprocessingml/2006/main" xmlns:w14="http://schemas.microsoft.com/office/word/2010/wordml" xmlns:w15="http://schemas.microsoft.com/office/word/2012/wordml" xmlns:w16cei="http://schemas.microsoft.com/office/word/2026/wordml/cei" xmlns:w16cex="http://schemas.microsoft.com/office/word/2018/wordml/cex" xmlns:w16cid="http://schemas.microsoft.com/office/word/2016/wordml/cid" xmlns:w16="http://schemas.microsoft.com/office/word/2018/wordml" xmlns:w16du="http://schemas.microsoft.com/office/word/2023/wordml/word16du" xmlns:w16sdtdh="http://schemas.microsoft.com/office/word/2020/wordml/sdtdatahash" xmlns:w16sdtfl="http://schemas.microsoft.com/office/word/2024/wordml/sdtformatlock" xmlns:w16se="http://schemas.microsoft.com/office/word/2015/wordml/symex" xmlns:wpg="http://schemas.microsoft.com/office/word/2010/wordprocessingGroup" xmlns:wpi="http://schemas.microsoft.com/office/word/2010/wordprocessingInk" xmlns:wne="http://schemas.microsoft.com/office/word/2006/wordml" xmlns:wps="http://schemas.microsoft.com/office/word/2010/wordprocessingShape" mc:Ignorable="w14 w15 w16se w16cid w16 w16cex w16sdtdh w16sdtfl cr w16du wp14">
+  <w16cex:commentExtensible w16cex:durableId="6D7F18A2" w16cex:dateUtc="2026-07-26T23:24:00Z"/>
+  <w16cex:commentExtensible w16cex:durableId="1AD85383" w16cex:dateUtc="2026-07-26T23:24:00Z"/>
+  <w16cex:commentExtensible w16cex:durableId="45EA59AC" w16cex:dateUtc="2026-07-26T23:25:00Z"/>
+  <w16cex:commentExtensible w16cex:durableId="3C0D9BFD" w16cex:dateUtc="2026-07-26T23:28:00Z"/>
+  <w16cex:commentExtensible w16cex:durableId="32DEFAEB" w16cex:dateUtc="2026-07-27T13:34:00Z"/>
   <w16cex:commentExtensible w16cex:durableId="77977636" w16cex:dateUtc="2025-12-24T18:30:00Z"/>
 </w16cex:commentsExtensible>
 </file>
 
 <file path=word/commentsIds.xml><?xml version="1.0" encoding="utf-8"?>
-<w16cid:commentsIds xmlns:wpc="http://schemas.microsoft.com/office/word/2010/wordprocessingCanvas" xmlns:cx="http://schemas.microsoft.com/office/drawing/2014/chartex" xmlns:cx1="http://schemas.microsoft.com/office/drawing/2015/9/8/chartex" xmlns:cx2="http://schemas.microsoft.com/office/drawing/2015/10/21/chartex" xmlns:cx3="http://schemas.microsoft.com/office/drawing/2016/5/9/chartex" xmlns:cx4="http://schemas.microsoft.com/office/drawing/2016/5/10/chartex" xmlns:cx5="http://schemas.microsoft.com/office/drawing/2016/5/11/chartex" xmlns:cx6="http://schemas.microsoft.com/office/drawing/2016/5/12/chartex" xmlns:cx7="http://schemas.microsoft.com/office/drawing/2016/5/13/chartex" xmlns:cx8="http://schemas.microsoft.com/office/drawing/2016/5/14/chartex" xmlns:mc="http://schemas.openxmlformats.org/markup-compatibility/2006" xmlns:aink="http://schemas.microsoft.com/office/drawing/2016/ink" xmlns:am3d="http://schemas.microsoft.com/office/drawing/2017/model3d" xmlns:o="urn:schemas-microsoft-com:office:office" xmlns:oel="http://schemas.microsoft.com/office/2019/extlst" xmlns:r="http://schemas.openxmlformats.org/officeDocument/2006/relationships" xmlns:m="http://schemas.openxmlformats.org/officeDocument/2006/math" xmlns:v="urn:schemas-microsoft-com:vml" xmlns:wp14="http://schemas.microsoft.com/office/word/2010/wordprocessingDrawing" xmlns:wp="http://schemas.openxmlformats.org/drawingml/2006/wordprocessingDrawing" xmlns:w10="urn:schemas-microsoft-com:office:word" xmlns:w="http://schemas.openxmlformats.org/wordprocessingml/2006/main" xmlns:w14="http://schemas.microsoft.com/office/word/2010/wordml" xmlns:w15="http://schemas.microsoft.com/office/word/2012/wordml" xmlns:w16cex="http://schemas.microsoft.com/office/word/2018/wordml/cex" xmlns:w16cid="http://schemas.microsoft.com/office/word/2016/wordml/cid" xmlns:w16="http://schemas.microsoft.com/office/word/2018/wordml" xmlns:w16du="http://schemas.microsoft.com/office/word/2023/wordml/word16du" xmlns:w16sdtdh="http://schemas.microsoft.com/office/word/2020/wordml/sdtdatahash" xmlns:w16sdtfl="http://schemas.microsoft.com/office/word/2024/wordml/sdtformatlock" xmlns:w16se="http://schemas.microsoft.com/office/word/2015/wordml/symex" xmlns:wpg="http://schemas.microsoft.com/office/word/2010/wordprocessingGroup" xmlns:wpi="http://schemas.microsoft.com/office/word/2010/wordprocessingInk" xmlns:wne="http://schemas.microsoft.com/office/word/2006/wordml" xmlns:wps="http://schemas.microsoft.com/office/word/2010/wordprocessingShape" mc:Ignorable="w14 w15 w16se w16cid w16 w16cex w16sdtdh w16sdtfl w16du wp14">
+<w16cid:commentsIds xmlns:wpc="http://schemas.microsoft.com/office/word/2010/wordprocessingCanvas" xmlns:cx="http://schemas.microsoft.com/office/drawing/2014/chartex" xmlns:cx1="http://schemas.microsoft.com/office/drawing/2015/9/8/chartex" xmlns:cx2="http://schemas.microsoft.com/office/drawing/2015/10/21/chartex" xmlns:cx3="http://schemas.microsoft.com/office/drawing/2016/5/9/chartex" xmlns:cx4="http://schemas.microsoft.com/office/drawing/2016/5/10/chartex" xmlns:cx5="http://schemas.microsoft.com/office/drawing/2016/5/11/chartex" xmlns:cx6="http://schemas.microsoft.com/office/drawing/2016/5/12/chartex" xmlns:cx7="http://schemas.microsoft.com/office/drawing/2016/5/13/chartex" xmlns:cx8="http://schemas.microsoft.com/office/drawing/2016/5/14/chartex" xmlns:mc="http://schemas.openxmlformats.org/markup-compatibility/2006" xmlns:aink="http://schemas.microsoft.com/office/drawing/2016/ink" xmlns:am3d="http://schemas.microsoft.com/office/drawing/2017/model3d" xmlns:o="urn:schemas-microsoft-com:office:office" xmlns:oel="http://schemas.microsoft.com/office/2019/extlst" xmlns:r="http://schemas.openxmlformats.org/officeDocument/2006/relationships" xmlns:m="http://schemas.openxmlformats.org/officeDocument/2006/math" xmlns:v="urn:schemas-microsoft-com:vml" xmlns:wp14="http://schemas.microsoft.com/office/word/2010/wordprocessingDrawing" xmlns:wp="http://schemas.openxmlformats.org/drawingml/2006/wordprocessingDrawing" xmlns:w10="urn:schemas-microsoft-com:office:word" xmlns:w="http://schemas.openxmlformats.org/wordprocessingml/2006/main" xmlns:w14="http://schemas.microsoft.com/office/word/2010/wordml" xmlns:w15="http://schemas.microsoft.com/office/word/2012/wordml" xmlns:w16cei="http://schemas.microsoft.com/office/word/2026/wordml/cei" xmlns:w16cex="http://schemas.microsoft.com/office/word/2018/wordml/cex" xmlns:w16cid="http://schemas.microsoft.com/office/word/2016/wordml/cid" xmlns:w16="http://schemas.microsoft.com/office/word/2018/wordml" xmlns:w16du="http://schemas.microsoft.com/office/word/2023/wordml/word16du" xmlns:w16sdtdh="http://schemas.microsoft.com/office/word/2020/wordml/sdtdatahash" xmlns:w16sdtfl="http://schemas.microsoft.com/office/word/2024/wordml/sdtformatlock" xmlns:w16se="http://schemas.microsoft.com/office/word/2015/wordml/symex" xmlns:wpg="http://schemas.microsoft.com/office/word/2010/wordprocessingGroup" xmlns:wpi="http://schemas.microsoft.com/office/word/2010/wordprocessingInk" xmlns:wne="http://schemas.microsoft.com/office/word/2006/wordml" xmlns:wps="http://schemas.microsoft.com/office/word/2010/wordprocessingShape" mc:Ignorable="w14 w15 w16se w16cid w16 w16cex w16sdtdh w16sdtfl w16du wp14">
+  <w16cid:commentId w16cid:paraId="7DEEFB2E" w16cid:durableId="6D7F18A2"/>
+  <w16cid:commentId w16cid:paraId="542714BD" w16cid:durableId="1AD85383"/>
+  <w16cid:commentId w16cid:paraId="09A47300" w16cid:durableId="45EA59AC"/>
+  <w16cid:commentId w16cid:paraId="07D7E237" w16cid:durableId="3C0D9BFD"/>
+  <w16cid:commentId w16cid:paraId="71A5CE04" w16cid:durableId="32DEFAEB"/>
   <w16cid:commentId w16cid:paraId="137C340C" w16cid:durableId="77977636"/>
 </w16cid:commentsIds>
 </file>
 
 <file path=word/numbering.xml><?xml version="1.0" encoding="utf-8"?>
-<w:numbering xmlns:wpc="http://schemas.microsoft.com/office/word/2010/wordprocessingCanvas" xmlns:cx="http://schemas.microsoft.com/office/drawing/2014/chartex" xmlns:cx1="http://schemas.microsoft.com/office/drawing/2015/9/8/chartex" xmlns:cx2="http://schemas.microsoft.com/office/drawing/2015/10/21/chartex" xmlns:cx3="http://schemas.microsoft.com/office/drawing/2016/5/9/chartex" xmlns:cx4="http://schemas.microsoft.com/office/drawing/2016/5/10/chartex" xmlns:cx5="http://schemas.microsoft.com/office/drawing/2016/5/11/chartex" xmlns:cx6="http://schemas.microsoft.com/office/drawing/2016/5/12/chartex" xmlns:cx7="http://schemas.microsoft.com/office/drawing/2016/5/13/chartex" xmlns:cx8="http://schemas.microsoft.com/office/drawing/2016/5/14/chartex" xmlns:mc="http://schemas.openxmlformats.org/markup-compatibility/2006" xmlns:aink="http://schemas.microsoft.com/office/drawing/2016/ink" xmlns:am3d="http://schemas.microsoft.com/office/drawing/2017/model3d" xmlns:o="urn:schemas-microsoft-com:office:office" xmlns:oel="http://schemas.microsoft.com/office/2019/extlst" xmlns:r="http://schemas.openxmlformats.org/officeDocument/2006/relationships" xmlns:m="http://schemas.openxmlformats.org/officeDocument/2006/math" xmlns:v="urn:schemas-microsoft-com:vml" xmlns:wp14="http://schemas.microsoft.com/office/word/2010/wordprocessingDrawing" xmlns:wp="http://schemas.openxmlformats.org/drawingml/2006/wordprocessingDrawing" xmlns:w10="urn:schemas-microsoft-com:office:word" xmlns:w="http://schemas.openxmlformats.org/wordprocessingml/2006/main" xmlns:w14="http://schemas.microsoft.com/office/word/2010/wordml" xmlns:w15="http://schemas.microsoft.com/office/word/2012/wordml" xmlns:w16cex="http://schemas.microsoft.com/office/word/2018/wordml/cex" xmlns:w16cid="http://schemas.microsoft.com/office/word/2016/wordml/cid" xmlns:w16="http://schemas.microsoft.com/office/word/2018/wordml" xmlns:w16du="http://schemas.microsoft.com/office/word/2023/wordml/word16du" xmlns:w16sdtdh="http://schemas.microsoft.com/office/word/2020/wordml/sdtdatahash" xmlns:w16sdtfl="http://schemas.microsoft.com/office/word/2024/wordml/sdtformatlock" xmlns:w16se="http://schemas.microsoft.com/office/word/2015/wordml/symex" xmlns:wpg="http://schemas.microsoft.com/office/word/2010/wordprocessingGroup" xmlns:wpi="http://schemas.microsoft.com/office/word/2010/wordprocessingInk" xmlns:wne="http://schemas.microsoft.com/office/word/2006/wordml" xmlns:wps="http://schemas.microsoft.com/office/word/2010/wordprocessingShape" mc:Ignorable="w14 w15 w16se w16cid w16 w16cex w16sdtdh w16sdtfl w16du wp14">
+<w:numbering xmlns:wpc="http://schemas.microsoft.com/office/word/2010/wordprocessingCanvas" xmlns:cx="http://schemas.microsoft.com/office/drawing/2014/chartex" xmlns:cx1="http://schemas.microsoft.com/office/drawing/2015/9/8/chartex" xmlns:cx2="http://schemas.microsoft.com/office/drawing/2015/10/21/chartex" xmlns:cx3="http://schemas.microsoft.com/office/drawing/2016/5/9/chartex" xmlns:cx4="http://schemas.microsoft.com/office/drawing/2016/5/10/chartex" xmlns:cx5="http://schemas.microsoft.com/office/drawing/2016/5/11/chartex" xmlns:cx6="http://schemas.microsoft.com/office/drawing/2016/5/12/chartex" xmlns:cx7="http://schemas.microsoft.com/office/drawing/2016/5/13/chartex" xmlns:cx8="http://schemas.microsoft.com/office/drawing/2016/5/14/chartex" xmlns:mc="http://schemas.openxmlformats.org/markup-compatibility/2006" xmlns:aink="http://schemas.microsoft.com/office/drawing/2016/ink" xmlns:am3d="http://schemas.microsoft.com/office/drawing/2017/model3d" xmlns:o="urn:schemas-microsoft-com:office:office" xmlns:oel="http://schemas.microsoft.com/office/2019/extlst" xmlns:r="http://schemas.openxmlformats.org/officeDocument/2006/relationships" xmlns:m="http://schemas.openxmlformats.org/officeDocument/2006/math" xmlns:v="urn:schemas-microsoft-com:vml" xmlns:wp14="http://schemas.microsoft.com/office/word/2010/wordprocessingDrawing" xmlns:wp="http://schemas.openxmlformats.org/drawingml/2006/wordprocessingDrawing" xmlns:w10="urn:schemas-microsoft-com:office:word" xmlns:w="http://schemas.openxmlformats.org/wordprocessingml/2006/main" xmlns:w14="http://schemas.microsoft.com/office/word/2010/wordml" xmlns:w15="http://schemas.microsoft.com/office/word/2012/wordml" xmlns:w16cei="http://schemas.microsoft.com/office/word/2026/wordml/cei" xmlns:w16cex="http://schemas.microsoft.com/office/word/2018/wordml/cex" xmlns:w16cid="http://schemas.microsoft.com/office/word/2016/wordml/cid" xmlns:w16="http://schemas.microsoft.com/office/word/2018/wordml" xmlns:w16du="http://schemas.microsoft.com/office/word/2023/wordml/word16du" xmlns:w16sdtdh="http://schemas.microsoft.com/office/word/2020/wordml/sdtdatahash" xmlns:w16sdtfl="http://schemas.microsoft.com/office/word/2024/wordml/sdtformatlock" xmlns:w16se="http://schemas.microsoft.com/office/word/2015/wordml/symex" xmlns:wpg="http://schemas.microsoft.com/office/word/2010/wordprocessingGroup" xmlns:wpi="http://schemas.microsoft.com/office/word/2010/wordprocessingInk" xmlns:wne="http://schemas.microsoft.com/office/word/2006/wordml" xmlns:wps="http://schemas.microsoft.com/office/word/2010/wordprocessingShape" mc:Ignorable="w14 w15 w16se w16cid w16 w16cex w16sdtdh w16sdtfl w16du wp14">
   <w:abstractNum w:abstractNumId="0" w15:restartNumberingAfterBreak="0">
     <w:nsid w:val="05A40BB6"/>
     <w:multiLevelType w:val="hybridMultilevel"/>
@@ -2455,7 +2417,13 @@
 </file>
 
 <file path=word/people.xml><?xml version="1.0" encoding="utf-8"?>
-<w15:people xmlns:wpc="http://schemas.microsoft.com/office/word/2010/wordprocessingCanvas" xmlns:cx="http://schemas.microsoft.com/office/drawing/2014/chartex" xmlns:cx1="http://schemas.microsoft.com/office/drawing/2015/9/8/chartex" xmlns:cx2="http://schemas.microsoft.com/office/drawing/2015/10/21/chartex" xmlns:cx3="http://schemas.microsoft.com/office/drawing/2016/5/9/chartex" xmlns:cx4="http://schemas.microsoft.com/office/drawing/2016/5/10/chartex" xmlns:cx5="http://schemas.microsoft.com/office/drawing/2016/5/11/chartex" xmlns:cx6="http://schemas.microsoft.com/office/drawing/2016/5/12/chartex" xmlns:cx7="http://schemas.microsoft.com/office/drawing/2016/5/13/chartex" xmlns:cx8="http://schemas.microsoft.com/office/drawing/2016/5/14/chartex" xmlns:mc="http://schemas.openxmlformats.org/markup-compatibility/2006" xmlns:aink="http://schemas.microsoft.com/office/drawing/2016/ink" xmlns:am3d="http://schemas.microsoft.com/office/drawing/2017/model3d" xmlns:o="urn:schemas-microsoft-com:office:office" xmlns:oel="http://schemas.microsoft.com/office/2019/extlst" xmlns:r="http://schemas.openxmlformats.org/officeDocument/2006/relationships" xmlns:m="http://schemas.openxmlformats.org/officeDocument/2006/math" xmlns:v="urn:schemas-microsoft-com:vml" xmlns:wp14="http://schemas.microsoft.com/office/word/2010/wordprocessingDrawing" xmlns:wp="http://schemas.openxmlformats.org/drawingml/2006/wordprocessingDrawing" xmlns:w10="urn:schemas-microsoft-com:office:word" xmlns:w="http://schemas.openxmlformats.org/wordprocessingml/2006/main" xmlns:w14="http://schemas.microsoft.com/office/word/2010/wordml" xmlns:w15="http://schemas.microsoft.com/office/word/2012/wordml" xmlns:w16cex="http://schemas.microsoft.com/office/word/2018/wordml/cex" xmlns:w16cid="http://schemas.microsoft.com/office/word/2016/wordml/cid" xmlns:w16="http://schemas.microsoft.com/office/word/2018/wordml" xmlns:w16du="http://schemas.microsoft.com/office/word/2023/wordml/word16du" xmlns:w16sdtdh="http://schemas.microsoft.com/office/word/2020/wordml/sdtdatahash" xmlns:w16sdtfl="http://schemas.microsoft.com/office/word/2024/wordml/sdtformatlock" xmlns:w16se="http://schemas.microsoft.com/office/word/2015/wordml/symex" xmlns:wpg="http://schemas.microsoft.com/office/word/2010/wordprocessingGroup" xmlns:wpi="http://schemas.microsoft.com/office/word/2010/wordprocessingInk" xmlns:wne="http://schemas.microsoft.com/office/word/2006/wordml" xmlns:wps="http://schemas.microsoft.com/office/word/2010/wordprocessingShape" mc:Ignorable="w14 w15 w16se w16cid w16 w16cex w16sdtdh w16sdtfl w16du wp14">
+<w15:people xmlns:wpc="http://schemas.microsoft.com/office/word/2010/wordprocessingCanvas" xmlns:cx="http://schemas.microsoft.com/office/drawing/2014/chartex" xmlns:cx1="http://schemas.microsoft.com/office/drawing/2015/9/8/chartex" xmlns:cx2="http://schemas.microsoft.com/office/drawing/2015/10/21/chartex" xmlns:cx3="http://schemas.microsoft.com/office/drawing/2016/5/9/chartex" xmlns:cx4="http://schemas.microsoft.com/office/drawing/2016/5/10/chartex" xmlns:cx5="http://schemas.microsoft.com/office/drawing/2016/5/11/chartex" xmlns:cx6="http://schemas.microsoft.com/office/drawing/2016/5/12/chartex" xmlns:cx7="http://schemas.microsoft.com/office/drawing/2016/5/13/chartex" xmlns:cx8="http://schemas.microsoft.com/office/drawing/2016/5/14/chartex" xmlns:mc="http://schemas.openxmlformats.org/markup-compatibility/2006" xmlns:aink="http://schemas.microsoft.com/office/drawing/2016/ink" xmlns:am3d="http://schemas.microsoft.com/office/drawing/2017/model3d" xmlns:o="urn:schemas-microsoft-com:office:office" xmlns:oel="http://schemas.microsoft.com/office/2019/extlst" xmlns:r="http://schemas.openxmlformats.org/officeDocument/2006/relationships" xmlns:m="http://schemas.openxmlformats.org/officeDocument/2006/math" xmlns:v="urn:schemas-microsoft-com:vml" xmlns:wp14="http://schemas.microsoft.com/office/word/2010/wordprocessingDrawing" xmlns:wp="http://schemas.openxmlformats.org/drawingml/2006/wordprocessingDrawing" xmlns:w10="urn:schemas-microsoft-com:office:word" xmlns:w="http://schemas.openxmlformats.org/wordprocessingml/2006/main" xmlns:w14="http://schemas.microsoft.com/office/word/2010/wordml" xmlns:w15="http://schemas.microsoft.com/office/word/2012/wordml" xmlns:w16cei="http://schemas.microsoft.com/office/word/2026/wordml/cei" xmlns:w16cex="http://schemas.microsoft.com/office/word/2018/wordml/cex" xmlns:w16cid="http://schemas.microsoft.com/office/word/2016/wordml/cid" xmlns:w16="http://schemas.microsoft.com/office/word/2018/wordml" xmlns:w16du="http://schemas.microsoft.com/office/word/2023/wordml/word16du" xmlns:w16sdtdh="http://schemas.microsoft.com/office/word/2020/wordml/sdtdatahash" xmlns:w16sdtfl="http://schemas.microsoft.com/office/word/2024/wordml/sdtformatlock" xmlns:w16se="http://schemas.microsoft.com/office/word/2015/wordml/symex" xmlns:wpg="http://schemas.microsoft.com/office/word/2010/wordprocessingGroup" xmlns:wpi="http://schemas.microsoft.com/office/word/2010/wordprocessingInk" xmlns:wne="http://schemas.microsoft.com/office/word/2006/wordml" xmlns:wps="http://schemas.microsoft.com/office/word/2010/wordprocessingShape" mc:Ignorable="w14 w15 w16se w16cid w16 w16cex w16sdtdh w16sdtfl w16du wp14">
+  <w15:person w15:author="Benjamin J. Makhlouf">
+    <w15:presenceInfo w15:providerId="AD" w15:userId="S::bmak29@uw.edu::e2d819b1-db99-41fc-888c-ad60b4d561ad"/>
+  </w15:person>
+  <w15:person w15:author="Daniel Schindler">
+    <w15:presenceInfo w15:providerId="AD" w15:userId="S::deschind@uw.edu::638f7977-a89c-40df-b85e-dc804ddb30d9"/>
+  </w15:person>
   <w15:person w15:author="bmak29">
     <w15:presenceInfo w15:providerId="AD" w15:userId="S::bmak29@uw.edu::e2d819b1-db99-41fc-888c-ad60b4d561ad"/>
   </w15:person>
@@ -3065,7 +3033,6 @@
   <w:style w:type="character" w:default="1" w:styleId="DefaultParagraphFont">
     <w:name w:val="Default Paragraph Font"/>
     <w:uiPriority w:val="1"/>
-    <w:semiHidden/>
     <w:unhideWhenUsed/>
   </w:style>
   <w:style w:type="table" w:default="1" w:styleId="TableNormal">
@@ -3428,7 +3395,6 @@
     <w:basedOn w:val="Normal"/>
     <w:link w:val="CommentTextChar"/>
     <w:uiPriority w:val="99"/>
-    <w:semiHidden/>
     <w:unhideWhenUsed/>
     <w:rsid w:val="00E225FA"/>
     <w:pPr>
@@ -3444,7 +3410,6 @@
     <w:basedOn w:val="DefaultParagraphFont"/>
     <w:link w:val="CommentText"/>
     <w:uiPriority w:val="99"/>
-    <w:semiHidden/>
     <w:rsid w:val="00E225FA"/>
     <w:rPr>
       <w:sz w:val="20"/>

</xml_diff>